<commit_message>
Add first version of <include> in mbc file. User manual TOC links now work (bug in Word, just switch to another view, then back to normal views, then save as PDF).
git-svn-id: http://visualsvn.edna.local/EDNA/ModbusControl/V2@3978 03c8d257-35a7-c645-9f01-50f27e98b9e6
</commit_message>
<xml_diff>
--- a/Manuals/ModbusControl - Release notes.docx
+++ b/Manuals/ModbusControl - Release notes.docx
@@ -1804,7 +1804,15 @@
       </w:r>
       <w:proofErr w:type="spellEnd"/>
       <w:r>
-        <w:t xml:space="preserve"> wordt ook nog aanvaard. Bij errors in </w:t>
+        <w:t xml:space="preserve"> wordt ook nog aanvaard. Bij </w:t>
+      </w:r>
+      <w:proofErr w:type="spellStart"/>
+      <w:r>
+        <w:t>errors</w:t>
+      </w:r>
+      <w:proofErr w:type="spellEnd"/>
+      <w:r>
+        <w:t xml:space="preserve"> in </w:t>
       </w:r>
       <w:proofErr w:type="spellStart"/>
       <w:r>
@@ -1873,1360 +1881,6 @@
       <w:proofErr w:type="spellEnd"/>
       <w:r>
         <w:t xml:space="preserve"> file toegevoegd.</w:t>
-      </w:r>
-    </w:p>
-    <w:p>
-      <w:pPr>
-        <w:pStyle w:val="Kop1"/>
-        <w:rPr>
-          <w:rFonts w:hint="eastAsia"/>
-        </w:rPr>
-      </w:pPr>
-      <w:r>
-        <w:t>v1.8.12 * 2018-01-22</w:t>
-      </w:r>
-    </w:p>
-    <w:p>
-      <w:pPr>
-        <w:pStyle w:val="Kop3"/>
-        <w:rPr>
-          <w:rFonts w:hint="eastAsia"/>
-        </w:rPr>
-      </w:pPr>
-      <w:r>
-        <w:t>Features</w:t>
-      </w:r>
-    </w:p>
-    <w:p>
-      <w:pPr>
-        <w:numPr>
-          <w:ilvl w:val="0"/>
-          <w:numId w:val="12"/>
-        </w:numPr>
-        <w:rPr>
-          <w:rFonts w:hint="eastAsia"/>
-        </w:rPr>
-      </w:pPr>
-      <w:r>
-        <w:t xml:space="preserve">XML tag &lt;autostart&gt; kan nu ook in </w:t>
-      </w:r>
-      <w:proofErr w:type="spellStart"/>
-      <w:r>
-        <w:t>localoverrides</w:t>
-      </w:r>
-      <w:proofErr w:type="spellEnd"/>
-      <w:r>
-        <w:t xml:space="preserve"> gebruikt worden.</w:t>
-      </w:r>
-    </w:p>
-    <w:p>
-      <w:pPr>
-        <w:pStyle w:val="Kop3"/>
-        <w:rPr>
-          <w:rFonts w:hint="eastAsia"/>
-        </w:rPr>
-      </w:pPr>
-      <w:proofErr w:type="spellStart"/>
-      <w:r>
-        <w:t>Fixes</w:t>
-      </w:r>
-      <w:proofErr w:type="spellEnd"/>
-    </w:p>
-    <w:p>
-      <w:pPr>
-        <w:numPr>
-          <w:ilvl w:val="0"/>
-          <w:numId w:val="12"/>
-        </w:numPr>
-        <w:rPr>
-          <w:rFonts w:hint="eastAsia"/>
-        </w:rPr>
-      </w:pPr>
-      <w:r>
-        <w:t xml:space="preserve">Er trad een </w:t>
-      </w:r>
-      <w:proofErr w:type="spellStart"/>
-      <w:r>
-        <w:t>exception</w:t>
-      </w:r>
-      <w:proofErr w:type="spellEnd"/>
-      <w:r>
-        <w:t xml:space="preserve"> op als je een &lt;autostart&gt; configureerde met ongeldige &lt;page&gt; naam.</w:t>
-      </w:r>
-    </w:p>
-    <w:p>
-      <w:pPr>
-        <w:pStyle w:val="Kop1"/>
-        <w:rPr>
-          <w:rFonts w:hint="eastAsia"/>
-        </w:rPr>
-      </w:pPr>
-      <w:r>
-        <w:t>V1.8.11 * 2018-01-20</w:t>
-      </w:r>
-    </w:p>
-    <w:p>
-      <w:pPr>
-        <w:pStyle w:val="Kop3"/>
-        <w:rPr>
-          <w:rFonts w:hint="eastAsia"/>
-        </w:rPr>
-      </w:pPr>
-      <w:r>
-        <w:t>Features</w:t>
-      </w:r>
-    </w:p>
-    <w:p>
-      <w:pPr>
-        <w:numPr>
-          <w:ilvl w:val="0"/>
-          <w:numId w:val="12"/>
-        </w:numPr>
-        <w:rPr>
-          <w:rFonts w:hint="eastAsia"/>
-        </w:rPr>
-      </w:pPr>
-      <w:proofErr w:type="spellStart"/>
-      <w:r>
-        <w:t>Interframedelay</w:t>
-      </w:r>
-      <w:proofErr w:type="spellEnd"/>
-      <w:r>
-        <w:t xml:space="preserve"> toegevoegd. Alleen in </w:t>
-      </w:r>
-      <w:proofErr w:type="spellStart"/>
-      <w:r>
-        <w:t>mbc</w:t>
-      </w:r>
-      <w:proofErr w:type="spellEnd"/>
-      <w:r>
-        <w:t xml:space="preserve"> file, &lt;</w:t>
-      </w:r>
-      <w:proofErr w:type="spellStart"/>
-      <w:r>
-        <w:t>Modbus</w:t>
-      </w:r>
-      <w:proofErr w:type="spellEnd"/>
-      <w:r>
-        <w:t>&gt; &lt;</w:t>
-      </w:r>
-      <w:proofErr w:type="spellStart"/>
-      <w:r>
-        <w:t>interframedelay</w:t>
-      </w:r>
-      <w:proofErr w:type="spellEnd"/>
-      <w:r>
-        <w:t>&gt;0&lt;/</w:t>
-      </w:r>
-      <w:proofErr w:type="spellStart"/>
-      <w:r>
-        <w:t>interframedelay</w:t>
-      </w:r>
-      <w:proofErr w:type="spellEnd"/>
-      <w:r>
-        <w:t xml:space="preserve">&gt;. 0 of niet opgegeven is 4 </w:t>
-      </w:r>
-      <w:proofErr w:type="spellStart"/>
-      <w:r>
-        <w:t>charactertijden</w:t>
-      </w:r>
-      <w:proofErr w:type="spellEnd"/>
-      <w:r>
-        <w:t xml:space="preserve"> delay, &gt;0 is aantal milliseconden.</w:t>
-      </w:r>
-    </w:p>
-    <w:p>
-      <w:pPr>
-        <w:pStyle w:val="Kop1"/>
-        <w:rPr>
-          <w:rFonts w:hint="eastAsia"/>
-        </w:rPr>
-      </w:pPr>
-      <w:r>
-        <w:t>V1.8.10 * 2017-07-26</w:t>
-      </w:r>
-    </w:p>
-    <w:p>
-      <w:pPr>
-        <w:pStyle w:val="Kop3"/>
-        <w:rPr>
-          <w:rFonts w:hint="eastAsia"/>
-        </w:rPr>
-      </w:pPr>
-      <w:r>
-        <w:t>Features</w:t>
-      </w:r>
-    </w:p>
-    <w:p>
-      <w:pPr>
-        <w:numPr>
-          <w:ilvl w:val="0"/>
-          <w:numId w:val="12"/>
-        </w:numPr>
-        <w:rPr>
-          <w:rFonts w:hint="eastAsia"/>
-        </w:rPr>
-      </w:pPr>
-      <w:r>
-        <w:t>Auto-</w:t>
-      </w:r>
-      <w:proofErr w:type="spellStart"/>
-      <w:r>
-        <w:t>updater</w:t>
-      </w:r>
-      <w:proofErr w:type="spellEnd"/>
-      <w:r>
-        <w:t xml:space="preserve"> toegevoegd.</w:t>
-      </w:r>
-    </w:p>
-    <w:p>
-      <w:pPr>
-        <w:pStyle w:val="Kop1"/>
-        <w:rPr>
-          <w:rFonts w:hint="eastAsia"/>
-        </w:rPr>
-      </w:pPr>
-      <w:r>
-        <w:t>V1.8.9 * 2017-05-31</w:t>
-      </w:r>
-    </w:p>
-    <w:p>
-      <w:pPr>
-        <w:pStyle w:val="Kop3"/>
-        <w:rPr>
-          <w:rFonts w:hint="eastAsia"/>
-        </w:rPr>
-      </w:pPr>
-      <w:r>
-        <w:t>Features</w:t>
-      </w:r>
-    </w:p>
-    <w:p>
-      <w:pPr>
-        <w:numPr>
-          <w:ilvl w:val="0"/>
-          <w:numId w:val="12"/>
-        </w:numPr>
-        <w:rPr>
-          <w:rFonts w:hint="eastAsia"/>
-        </w:rPr>
-      </w:pPr>
-      <w:r>
-        <w:t>Drag &amp; drop support: je kan nu een .</w:t>
-      </w:r>
-      <w:proofErr w:type="spellStart"/>
-      <w:r>
-        <w:t>mbc</w:t>
-      </w:r>
-      <w:proofErr w:type="spellEnd"/>
-      <w:r>
-        <w:t xml:space="preserve"> file op de app droppen.</w:t>
-      </w:r>
-    </w:p>
-    <w:p>
-      <w:pPr>
-        <w:pStyle w:val="Kop3"/>
-        <w:rPr>
-          <w:rFonts w:hint="eastAsia"/>
-        </w:rPr>
-      </w:pPr>
-      <w:proofErr w:type="spellStart"/>
-      <w:r>
-        <w:t>Fixes</w:t>
-      </w:r>
-      <w:proofErr w:type="spellEnd"/>
-    </w:p>
-    <w:p>
-      <w:pPr>
-        <w:numPr>
-          <w:ilvl w:val="0"/>
-          <w:numId w:val="12"/>
-        </w:numPr>
-        <w:rPr>
-          <w:rFonts w:hint="eastAsia"/>
-        </w:rPr>
-      </w:pPr>
-      <w:r>
-        <w:t xml:space="preserve">Import en export is nu netjes </w:t>
-      </w:r>
-      <w:proofErr w:type="spellStart"/>
-      <w:r>
-        <w:t>dmv</w:t>
-      </w:r>
-      <w:proofErr w:type="spellEnd"/>
-      <w:r>
-        <w:t xml:space="preserve"> een class </w:t>
-      </w:r>
-      <w:proofErr w:type="spellStart"/>
-      <w:r>
-        <w:t>CsvProcessor</w:t>
-      </w:r>
-      <w:proofErr w:type="spellEnd"/>
-      <w:r>
-        <w:t xml:space="preserve"> (is wel compatible)</w:t>
-      </w:r>
-    </w:p>
-    <w:p>
-      <w:pPr>
-        <w:numPr>
-          <w:ilvl w:val="0"/>
-          <w:numId w:val="12"/>
-        </w:numPr>
-        <w:rPr>
-          <w:rFonts w:hint="eastAsia"/>
-        </w:rPr>
-      </w:pPr>
-      <w:r>
-        <w:t>Project startup/load/</w:t>
-      </w:r>
-      <w:proofErr w:type="spellStart"/>
-      <w:r>
-        <w:t>reload</w:t>
-      </w:r>
-      <w:proofErr w:type="spellEnd"/>
-      <w:r>
-        <w:t xml:space="preserve"> is nu uniformer</w:t>
-      </w:r>
-    </w:p>
-    <w:p>
-      <w:pPr>
-        <w:pStyle w:val="Kop1"/>
-        <w:rPr>
-          <w:rFonts w:hint="eastAsia"/>
-        </w:rPr>
-      </w:pPr>
-      <w:r>
-        <w:t>v1.8.8 * 2017-05-18</w:t>
-      </w:r>
-    </w:p>
-    <w:p>
-      <w:pPr>
-        <w:pStyle w:val="Kop3"/>
-        <w:rPr>
-          <w:rFonts w:hint="eastAsia"/>
-        </w:rPr>
-      </w:pPr>
-      <w:r>
-        <w:t>Features</w:t>
-      </w:r>
-    </w:p>
-    <w:p>
-      <w:pPr>
-        <w:numPr>
-          <w:ilvl w:val="0"/>
-          <w:numId w:val="13"/>
-        </w:numPr>
-        <w:rPr>
-          <w:rFonts w:hint="eastAsia"/>
-        </w:rPr>
-      </w:pPr>
-      <w:r>
-        <w:t>Nu kan &lt;</w:t>
-      </w:r>
-      <w:proofErr w:type="spellStart"/>
-      <w:r>
-        <w:t>bcol</w:t>
-      </w:r>
-      <w:proofErr w:type="spellEnd"/>
-      <w:r>
-        <w:t xml:space="preserve">&gt; </w:t>
-      </w:r>
-      <w:proofErr w:type="spellStart"/>
-      <w:r>
-        <w:t>backgroundcolor</w:t>
-      </w:r>
-      <w:proofErr w:type="spellEnd"/>
-      <w:r>
-        <w:t xml:space="preserve"> ook per </w:t>
-      </w:r>
-      <w:proofErr w:type="spellStart"/>
-      <w:r>
-        <w:t>bitfield</w:t>
-      </w:r>
-      <w:proofErr w:type="spellEnd"/>
-      <w:r>
-        <w:t xml:space="preserve"> ingesteld worden.</w:t>
-      </w:r>
-    </w:p>
-    <w:p>
-      <w:pPr>
-        <w:numPr>
-          <w:ilvl w:val="0"/>
-          <w:numId w:val="13"/>
-        </w:numPr>
-        <w:rPr>
-          <w:rFonts w:hint="eastAsia"/>
-        </w:rPr>
-      </w:pPr>
-      <w:r>
-        <w:t>Nu kan met &lt;</w:t>
-      </w:r>
-      <w:proofErr w:type="spellStart"/>
-      <w:r>
-        <w:t>fcol</w:t>
-      </w:r>
-      <w:proofErr w:type="spellEnd"/>
-      <w:r>
-        <w:t xml:space="preserve">&gt; de </w:t>
-      </w:r>
-      <w:proofErr w:type="spellStart"/>
-      <w:r>
-        <w:t>foregroundcolor</w:t>
-      </w:r>
-      <w:proofErr w:type="spellEnd"/>
-      <w:r>
-        <w:t xml:space="preserve"> ingesteld worden bij registers en </w:t>
-      </w:r>
-      <w:proofErr w:type="spellStart"/>
-      <w:r>
-        <w:t>bitfields</w:t>
-      </w:r>
-      <w:proofErr w:type="spellEnd"/>
-      <w:r>
-        <w:t>.</w:t>
-      </w:r>
-    </w:p>
-    <w:p>
-      <w:pPr>
-        <w:numPr>
-          <w:ilvl w:val="0"/>
-          <w:numId w:val="13"/>
-        </w:numPr>
-        <w:rPr>
-          <w:rFonts w:hint="eastAsia"/>
-        </w:rPr>
-      </w:pPr>
-      <w:r>
-        <w:lastRenderedPageBreak/>
-        <w:t xml:space="preserve">Nieuwe XML tag &lt;autostart&gt; toegevoegd in </w:t>
-      </w:r>
-      <w:proofErr w:type="spellStart"/>
-      <w:r>
-        <w:t>mbc</w:t>
-      </w:r>
-      <w:proofErr w:type="spellEnd"/>
-      <w:r>
-        <w:t xml:space="preserve"> file.</w:t>
-      </w:r>
-    </w:p>
-    <w:p>
-      <w:pPr>
-        <w:numPr>
-          <w:ilvl w:val="0"/>
-          <w:numId w:val="13"/>
-        </w:numPr>
-        <w:rPr>
-          <w:rFonts w:hint="eastAsia"/>
-        </w:rPr>
-      </w:pPr>
-      <w:proofErr w:type="spellStart"/>
-      <w:r>
-        <w:t>Logging</w:t>
-      </w:r>
-      <w:proofErr w:type="spellEnd"/>
-      <w:r>
-        <w:t xml:space="preserve">: </w:t>
-      </w:r>
-      <w:proofErr w:type="spellStart"/>
-      <w:r>
-        <w:t>Pause</w:t>
-      </w:r>
-      <w:proofErr w:type="spellEnd"/>
-      <w:r>
-        <w:t xml:space="preserve"> van scrollen afgevoerd wegens verwarrend. Heeft nu Record en Stop knoppen die de logger </w:t>
-      </w:r>
-      <w:proofErr w:type="spellStart"/>
-      <w:r>
-        <w:t>enablen</w:t>
-      </w:r>
-      <w:proofErr w:type="spellEnd"/>
-      <w:r>
-        <w:t>/</w:t>
-      </w:r>
-      <w:proofErr w:type="spellStart"/>
-      <w:r>
-        <w:t>disablen</w:t>
-      </w:r>
-      <w:proofErr w:type="spellEnd"/>
-      <w:r>
-        <w:t>.</w:t>
-      </w:r>
-    </w:p>
-    <w:p>
-      <w:pPr>
-        <w:numPr>
-          <w:ilvl w:val="0"/>
-          <w:numId w:val="13"/>
-        </w:numPr>
-        <w:rPr>
-          <w:rFonts w:hint="eastAsia"/>
-        </w:rPr>
-      </w:pPr>
-      <w:proofErr w:type="spellStart"/>
-      <w:r>
-        <w:t>Logging</w:t>
-      </w:r>
-      <w:proofErr w:type="spellEnd"/>
-      <w:r>
-        <w:t xml:space="preserve">: Nu kan de communicatie met de seriële </w:t>
-      </w:r>
-      <w:proofErr w:type="spellStart"/>
-      <w:r>
-        <w:t>slave</w:t>
-      </w:r>
-      <w:proofErr w:type="spellEnd"/>
-      <w:r>
-        <w:t xml:space="preserve"> en met de </w:t>
-      </w:r>
-      <w:proofErr w:type="spellStart"/>
-      <w:r>
-        <w:t>Modbus</w:t>
-      </w:r>
-      <w:proofErr w:type="spellEnd"/>
-      <w:r>
-        <w:t xml:space="preserve">/TCP server gelogd worden, </w:t>
-      </w:r>
-      <w:proofErr w:type="spellStart"/>
-      <w:r>
-        <w:t>dmv</w:t>
-      </w:r>
-      <w:proofErr w:type="spellEnd"/>
-      <w:r>
-        <w:t xml:space="preserve"> het "</w:t>
-      </w:r>
-      <w:proofErr w:type="spellStart"/>
-      <w:r>
-        <w:t>Trace</w:t>
-      </w:r>
-      <w:proofErr w:type="spellEnd"/>
-      <w:r>
-        <w:t xml:space="preserve"> TX/RX" item in '</w:t>
-      </w:r>
-      <w:proofErr w:type="spellStart"/>
-      <w:r>
-        <w:t>What</w:t>
-      </w:r>
-      <w:proofErr w:type="spellEnd"/>
-      <w:r>
-        <w:t xml:space="preserve"> </w:t>
-      </w:r>
-      <w:proofErr w:type="spellStart"/>
-      <w:r>
-        <w:t>to</w:t>
-      </w:r>
-      <w:proofErr w:type="spellEnd"/>
-      <w:r>
-        <w:t xml:space="preserve"> log'.</w:t>
-      </w:r>
-    </w:p>
-    <w:p>
-      <w:pPr>
-        <w:numPr>
-          <w:ilvl w:val="0"/>
-          <w:numId w:val="13"/>
-        </w:numPr>
-        <w:rPr>
-          <w:rFonts w:hint="eastAsia"/>
-        </w:rPr>
-      </w:pPr>
-      <w:proofErr w:type="spellStart"/>
-      <w:r>
-        <w:t>Logging</w:t>
-      </w:r>
-      <w:proofErr w:type="spellEnd"/>
-      <w:r>
-        <w:t xml:space="preserve">: TCP verbinding logt nu "Connection lost, </w:t>
-      </w:r>
-      <w:proofErr w:type="spellStart"/>
-      <w:r>
-        <w:t>reconnecting</w:t>
-      </w:r>
-      <w:proofErr w:type="spellEnd"/>
-      <w:r>
-        <w:t>"</w:t>
-      </w:r>
-    </w:p>
-    <w:p>
-      <w:pPr>
-        <w:numPr>
-          <w:ilvl w:val="0"/>
-          <w:numId w:val="13"/>
-        </w:numPr>
-        <w:rPr>
-          <w:rFonts w:hint="eastAsia"/>
-        </w:rPr>
-      </w:pPr>
-      <w:proofErr w:type="spellStart"/>
-      <w:r>
-        <w:t>Logging</w:t>
-      </w:r>
-      <w:proofErr w:type="spellEnd"/>
-      <w:r>
-        <w:t xml:space="preserve">: TCP verbinding logt nu "Connection </w:t>
-      </w:r>
-      <w:proofErr w:type="spellStart"/>
-      <w:r>
-        <w:t>closed</w:t>
-      </w:r>
-      <w:proofErr w:type="spellEnd"/>
-      <w:r>
-        <w:t xml:space="preserve"> </w:t>
-      </w:r>
-      <w:proofErr w:type="spellStart"/>
-      <w:r>
-        <w:t>because</w:t>
-      </w:r>
-      <w:proofErr w:type="spellEnd"/>
-      <w:r>
-        <w:t xml:space="preserve"> of response error"</w:t>
-      </w:r>
-    </w:p>
-    <w:p>
-      <w:pPr>
-        <w:numPr>
-          <w:ilvl w:val="0"/>
-          <w:numId w:val="13"/>
-        </w:numPr>
-        <w:rPr>
-          <w:rFonts w:hint="eastAsia"/>
-        </w:rPr>
-      </w:pPr>
-      <w:proofErr w:type="spellStart"/>
-      <w:r>
-        <w:t>Logging</w:t>
-      </w:r>
-      <w:proofErr w:type="spellEnd"/>
-      <w:r>
-        <w:t xml:space="preserve">: Serieel </w:t>
-      </w:r>
-      <w:proofErr w:type="spellStart"/>
-      <w:r>
-        <w:t>channel</w:t>
-      </w:r>
-      <w:proofErr w:type="spellEnd"/>
-      <w:r>
-        <w:t xml:space="preserve"> toont nu ook “</w:t>
-      </w:r>
-      <w:proofErr w:type="spellStart"/>
-      <w:r>
-        <w:t>Received</w:t>
-      </w:r>
-      <w:proofErr w:type="spellEnd"/>
-      <w:r>
-        <w:t xml:space="preserve"> … </w:t>
-      </w:r>
-      <w:proofErr w:type="spellStart"/>
-      <w:r>
-        <w:t>unexpected</w:t>
-      </w:r>
-      <w:proofErr w:type="spellEnd"/>
-      <w:r>
-        <w:t xml:space="preserve"> bytes"</w:t>
-      </w:r>
-    </w:p>
-    <w:p>
-      <w:pPr>
-        <w:pStyle w:val="Kop3"/>
-        <w:rPr>
-          <w:rFonts w:hint="eastAsia"/>
-        </w:rPr>
-      </w:pPr>
-      <w:proofErr w:type="spellStart"/>
-      <w:r>
-        <w:t>Fixes</w:t>
-      </w:r>
-      <w:proofErr w:type="spellEnd"/>
-    </w:p>
-    <w:p>
-      <w:pPr>
-        <w:numPr>
-          <w:ilvl w:val="0"/>
-          <w:numId w:val="14"/>
-        </w:numPr>
-        <w:rPr>
-          <w:rFonts w:hint="eastAsia"/>
-        </w:rPr>
-      </w:pPr>
-      <w:proofErr w:type="spellStart"/>
-      <w:r>
-        <w:t>Logging</w:t>
-      </w:r>
-      <w:proofErr w:type="spellEnd"/>
-      <w:r>
-        <w:t xml:space="preserve">: </w:t>
-      </w:r>
-      <w:proofErr w:type="spellStart"/>
-      <w:r>
-        <w:t>Sort</w:t>
-      </w:r>
-      <w:proofErr w:type="spellEnd"/>
-      <w:r>
-        <w:t>-functie op log headers nu uitgeschakeld.</w:t>
-      </w:r>
-    </w:p>
-    <w:p>
-      <w:pPr>
-        <w:numPr>
-          <w:ilvl w:val="0"/>
-          <w:numId w:val="14"/>
-        </w:numPr>
-        <w:rPr>
-          <w:rFonts w:hint="eastAsia"/>
-        </w:rPr>
-      </w:pPr>
-      <w:proofErr w:type="spellStart"/>
-      <w:r>
-        <w:t>Modbus</w:t>
-      </w:r>
-      <w:proofErr w:type="spellEnd"/>
-      <w:r>
-        <w:t>/TCP bridge server: Alle connecties werden aan een list toegevoegd maar werden nooit verwijderd. Dat kon geheugen vreten.</w:t>
-      </w:r>
-    </w:p>
-    <w:p>
-      <w:pPr>
-        <w:numPr>
-          <w:ilvl w:val="0"/>
-          <w:numId w:val="14"/>
-        </w:numPr>
-        <w:rPr>
-          <w:rFonts w:hint="eastAsia"/>
-        </w:rPr>
-      </w:pPr>
-      <w:proofErr w:type="spellStart"/>
-      <w:r>
-        <w:t>Modbus</w:t>
-      </w:r>
-      <w:proofErr w:type="spellEnd"/>
-      <w:r>
-        <w:t xml:space="preserve">/TCP bridge server: Wanneer clients tientallen connecties maakten en veel registers opvroegen en de </w:t>
-      </w:r>
-      <w:proofErr w:type="spellStart"/>
-      <w:r>
-        <w:t>modbus</w:t>
-      </w:r>
-      <w:proofErr w:type="spellEnd"/>
-      <w:r>
-        <w:t xml:space="preserve"> </w:t>
-      </w:r>
-      <w:proofErr w:type="spellStart"/>
-      <w:r>
-        <w:t>slave</w:t>
-      </w:r>
-      <w:proofErr w:type="spellEnd"/>
-      <w:r>
-        <w:t xml:space="preserve"> niet antwoordde, kon het heel lang duren om </w:t>
-      </w:r>
-      <w:proofErr w:type="spellStart"/>
-      <w:r>
-        <w:t>Modbuscontrol</w:t>
-      </w:r>
-      <w:proofErr w:type="spellEnd"/>
-      <w:r>
-        <w:t xml:space="preserve"> af te sluiten. Is nu opgelost.</w:t>
-      </w:r>
-    </w:p>
-    <w:p>
-      <w:pPr>
-        <w:numPr>
-          <w:ilvl w:val="0"/>
-          <w:numId w:val="14"/>
-        </w:numPr>
-        <w:rPr>
-          <w:rFonts w:hint="eastAsia"/>
-        </w:rPr>
-      </w:pPr>
-      <w:proofErr w:type="spellStart"/>
-      <w:r>
-        <w:t>Modbus</w:t>
-      </w:r>
-      <w:proofErr w:type="spellEnd"/>
-      <w:r>
-        <w:t xml:space="preserve">/TCP bridge server: Wanneer clients heel veel (&gt;1020) connecties maakten en de </w:t>
-      </w:r>
-      <w:proofErr w:type="spellStart"/>
-      <w:r>
-        <w:t>modbus</w:t>
-      </w:r>
-      <w:proofErr w:type="spellEnd"/>
-      <w:r>
-        <w:t xml:space="preserve"> </w:t>
-      </w:r>
-      <w:proofErr w:type="spellStart"/>
-      <w:r>
-        <w:t>slave</w:t>
-      </w:r>
-      <w:proofErr w:type="spellEnd"/>
-      <w:r>
-        <w:t xml:space="preserve"> niet antwoordde gingen threads </w:t>
-      </w:r>
-      <w:proofErr w:type="spellStart"/>
-      <w:r>
-        <w:t>blocken</w:t>
-      </w:r>
-      <w:proofErr w:type="spellEnd"/>
-      <w:r>
-        <w:t xml:space="preserve"> en kon je </w:t>
-      </w:r>
-      <w:proofErr w:type="spellStart"/>
-      <w:r>
-        <w:t>Modbuscontrol</w:t>
-      </w:r>
-      <w:proofErr w:type="spellEnd"/>
-      <w:r>
-        <w:t xml:space="preserve"> daardoor niet afsluiten. Is nu opgelost.</w:t>
-      </w:r>
-    </w:p>
-    <w:p>
-      <w:pPr>
-        <w:pStyle w:val="Kop1"/>
-        <w:rPr>
-          <w:rFonts w:hint="eastAsia"/>
-        </w:rPr>
-      </w:pPr>
-      <w:r>
-        <w:t>V1.8.5 * 2016-11-12</w:t>
-      </w:r>
-    </w:p>
-    <w:p>
-      <w:pPr>
-        <w:pStyle w:val="Kop3"/>
-        <w:rPr>
-          <w:rFonts w:hint="eastAsia"/>
-        </w:rPr>
-      </w:pPr>
-      <w:r>
-        <w:t>Features</w:t>
-      </w:r>
-    </w:p>
-    <w:p>
-      <w:pPr>
-        <w:numPr>
-          <w:ilvl w:val="0"/>
-          <w:numId w:val="15"/>
-        </w:numPr>
-        <w:rPr>
-          <w:rFonts w:hint="eastAsia"/>
-        </w:rPr>
-      </w:pPr>
-      <w:r>
-        <w:t xml:space="preserve">Open project file: default filter toont alleen </w:t>
-      </w:r>
-      <w:proofErr w:type="spellStart"/>
-      <w:r>
-        <w:t>mbc</w:t>
-      </w:r>
-      <w:proofErr w:type="spellEnd"/>
-      <w:r>
-        <w:t xml:space="preserve"> files. Geen </w:t>
-      </w:r>
-      <w:proofErr w:type="spellStart"/>
-      <w:r>
-        <w:t>xml</w:t>
-      </w:r>
-      <w:proofErr w:type="spellEnd"/>
-      <w:r>
-        <w:t xml:space="preserve"> files meer.</w:t>
-      </w:r>
-    </w:p>
-    <w:p>
-      <w:pPr>
-        <w:numPr>
-          <w:ilvl w:val="0"/>
-          <w:numId w:val="15"/>
-        </w:numPr>
-        <w:rPr>
-          <w:rFonts w:hint="eastAsia"/>
-        </w:rPr>
-      </w:pPr>
-      <w:proofErr w:type="spellStart"/>
-      <w:r>
-        <w:t>Mbc</w:t>
-      </w:r>
-      <w:proofErr w:type="spellEnd"/>
-      <w:r>
-        <w:t xml:space="preserve"> file: toevoeging &lt;</w:t>
-      </w:r>
-      <w:proofErr w:type="spellStart"/>
-      <w:r>
-        <w:t>expandfields</w:t>
-      </w:r>
-      <w:proofErr w:type="spellEnd"/>
-      <w:r>
-        <w:t xml:space="preserve">&gt; element om </w:t>
-      </w:r>
-      <w:proofErr w:type="spellStart"/>
-      <w:r>
-        <w:t>bitfields</w:t>
-      </w:r>
-      <w:proofErr w:type="spellEnd"/>
-      <w:r>
-        <w:t xml:space="preserve"> ineens geopend te tonen.</w:t>
-      </w:r>
-    </w:p>
-    <w:p>
-      <w:pPr>
-        <w:pStyle w:val="Kop3"/>
-        <w:rPr>
-          <w:rFonts w:hint="eastAsia"/>
-        </w:rPr>
-      </w:pPr>
-      <w:proofErr w:type="spellStart"/>
-      <w:r>
-        <w:t>Fixes</w:t>
-      </w:r>
-      <w:proofErr w:type="spellEnd"/>
-    </w:p>
-    <w:p>
-      <w:pPr>
-        <w:numPr>
-          <w:ilvl w:val="0"/>
-          <w:numId w:val="16"/>
-        </w:numPr>
-        <w:rPr>
-          <w:rFonts w:hint="eastAsia"/>
-        </w:rPr>
-      </w:pPr>
-      <w:r>
-        <w:t xml:space="preserve">Export: is nu met </w:t>
-      </w:r>
-      <w:proofErr w:type="spellStart"/>
-      <w:r>
-        <w:t>SaveFileDialog</w:t>
-      </w:r>
-      <w:proofErr w:type="spellEnd"/>
-      <w:r>
-        <w:t xml:space="preserve"> </w:t>
-      </w:r>
-      <w:proofErr w:type="spellStart"/>
-      <w:r>
-        <w:t>ipv</w:t>
-      </w:r>
-      <w:proofErr w:type="spellEnd"/>
-      <w:r>
-        <w:t xml:space="preserve"> </w:t>
-      </w:r>
-      <w:proofErr w:type="spellStart"/>
-      <w:r>
-        <w:t>OpenFileDialog</w:t>
-      </w:r>
-      <w:proofErr w:type="spellEnd"/>
-      <w:r>
-        <w:t>.</w:t>
-      </w:r>
-    </w:p>
-    <w:p>
-      <w:pPr>
-        <w:numPr>
-          <w:ilvl w:val="0"/>
-          <w:numId w:val="16"/>
-        </w:numPr>
-        <w:rPr>
-          <w:rFonts w:hint="eastAsia"/>
-        </w:rPr>
-      </w:pPr>
-      <w:r>
-        <w:t xml:space="preserve">Import/Export: betere afhandeling van filenamen zonder </w:t>
-      </w:r>
-      <w:proofErr w:type="spellStart"/>
-      <w:r>
-        <w:t>extentie</w:t>
-      </w:r>
-      <w:proofErr w:type="spellEnd"/>
-      <w:r>
-        <w:t xml:space="preserve">, filenaamveld </w:t>
-      </w:r>
-      <w:proofErr w:type="spellStart"/>
-      <w:r>
-        <w:t>readonly</w:t>
-      </w:r>
-      <w:proofErr w:type="spellEnd"/>
-      <w:r>
-        <w:t xml:space="preserve"> gemaakt zodat je de </w:t>
-      </w:r>
-      <w:proofErr w:type="spellStart"/>
-      <w:r>
-        <w:t>SaveFileDialog</w:t>
-      </w:r>
-      <w:proofErr w:type="spellEnd"/>
-      <w:r>
-        <w:t xml:space="preserve"> moet gebruiken en de file normaal een .</w:t>
-      </w:r>
-      <w:proofErr w:type="spellStart"/>
-      <w:r>
-        <w:t>csv</w:t>
-      </w:r>
-      <w:proofErr w:type="spellEnd"/>
-      <w:r>
-        <w:t xml:space="preserve"> </w:t>
-      </w:r>
-      <w:proofErr w:type="spellStart"/>
-      <w:r>
-        <w:t>extentie</w:t>
-      </w:r>
-      <w:proofErr w:type="spellEnd"/>
-      <w:r>
-        <w:t xml:space="preserve"> krijgt.</w:t>
-      </w:r>
-    </w:p>
-    <w:p>
-      <w:pPr>
-        <w:numPr>
-          <w:ilvl w:val="0"/>
-          <w:numId w:val="16"/>
-        </w:numPr>
-        <w:rPr>
-          <w:rFonts w:hint="eastAsia"/>
-        </w:rPr>
-      </w:pPr>
-      <w:r>
-        <w:t>Import: fix: schrijven van 16-bit registers met 32-bit word order = high-low was fout, schreef altijd 0.</w:t>
-      </w:r>
-    </w:p>
-    <w:p>
-      <w:pPr>
-        <w:numPr>
-          <w:ilvl w:val="0"/>
-          <w:numId w:val="16"/>
-        </w:numPr>
-        <w:rPr>
-          <w:rFonts w:hint="eastAsia"/>
-        </w:rPr>
-      </w:pPr>
-      <w:r>
-        <w:t xml:space="preserve">Fix in verwerken van XML tags bij laden </w:t>
-      </w:r>
-      <w:proofErr w:type="spellStart"/>
-      <w:r>
-        <w:t>mbc</w:t>
-      </w:r>
-      <w:proofErr w:type="spellEnd"/>
-      <w:r>
-        <w:t xml:space="preserve"> file en </w:t>
-      </w:r>
-      <w:proofErr w:type="spellStart"/>
-      <w:r>
-        <w:t>override</w:t>
-      </w:r>
-      <w:proofErr w:type="spellEnd"/>
-      <w:r>
-        <w:t xml:space="preserve"> file: Dit voorkomt </w:t>
-      </w:r>
-      <w:proofErr w:type="spellStart"/>
-      <w:r>
-        <w:t>bvb</w:t>
-      </w:r>
-      <w:proofErr w:type="spellEnd"/>
-      <w:r>
-        <w:t xml:space="preserve"> </w:t>
-      </w:r>
-      <w:r>
-        <w:br/>
-        <w:t>dat &lt;</w:t>
-      </w:r>
-      <w:proofErr w:type="spellStart"/>
-      <w:r>
-        <w:t>bcol</w:t>
-      </w:r>
-      <w:proofErr w:type="spellEnd"/>
-      <w:r>
-        <w:t>&gt; gevonden wordt in &lt;var&gt; in volgend voorbeeld:</w:t>
-      </w:r>
-      <w:r>
-        <w:br/>
-      </w:r>
-      <w:r>
-        <w:rPr>
-          <w:rFonts w:ascii="Courier New" w:hAnsi="Courier New" w:cs="Courier New"/>
-          <w:sz w:val="20"/>
-          <w:szCs w:val="20"/>
-        </w:rPr>
-        <w:t>&lt;var&gt;&lt;reg&gt;40001&lt;/reg&gt;</w:t>
-      </w:r>
-      <w:r>
-        <w:rPr>
-          <w:rFonts w:ascii="Courier New" w:hAnsi="Courier New" w:cs="Courier New"/>
-          <w:sz w:val="20"/>
-          <w:szCs w:val="20"/>
-        </w:rPr>
-        <w:br/>
-        <w:t xml:space="preserve">   &lt;field&gt;&lt;pos&gt;0&lt;/pos&gt;&lt;</w:t>
-      </w:r>
-      <w:proofErr w:type="spellStart"/>
-      <w:r>
-        <w:rPr>
-          <w:rFonts w:ascii="Courier New" w:hAnsi="Courier New" w:cs="Courier New"/>
-          <w:sz w:val="20"/>
-          <w:szCs w:val="20"/>
-        </w:rPr>
-        <w:t>text</w:t>
-      </w:r>
-      <w:proofErr w:type="spellEnd"/>
-      <w:r>
-        <w:rPr>
-          <w:rFonts w:ascii="Courier New" w:hAnsi="Courier New" w:cs="Courier New"/>
-          <w:sz w:val="20"/>
-          <w:szCs w:val="20"/>
-        </w:rPr>
-        <w:t>&gt;K1&lt;/</w:t>
-      </w:r>
-      <w:proofErr w:type="spellStart"/>
-      <w:r>
-        <w:rPr>
-          <w:rFonts w:ascii="Courier New" w:hAnsi="Courier New" w:cs="Courier New"/>
-          <w:sz w:val="20"/>
-          <w:szCs w:val="20"/>
-        </w:rPr>
-        <w:t>text</w:t>
-      </w:r>
-      <w:proofErr w:type="spellEnd"/>
-      <w:r>
-        <w:rPr>
-          <w:rFonts w:ascii="Courier New" w:hAnsi="Courier New" w:cs="Courier New"/>
-          <w:sz w:val="20"/>
-          <w:szCs w:val="20"/>
-        </w:rPr>
-        <w:t>&gt;&lt;/field&gt;</w:t>
-      </w:r>
-      <w:r>
-        <w:rPr>
-          <w:rFonts w:ascii="Courier New" w:hAnsi="Courier New" w:cs="Courier New"/>
-          <w:sz w:val="20"/>
-          <w:szCs w:val="20"/>
-        </w:rPr>
-        <w:br/>
-        <w:t xml:space="preserve">   &lt;field&gt;&lt;pos&gt;1&lt;/pos&gt;&lt;</w:t>
-      </w:r>
-      <w:proofErr w:type="spellStart"/>
-      <w:r>
-        <w:rPr>
-          <w:rFonts w:ascii="Courier New" w:hAnsi="Courier New" w:cs="Courier New"/>
-          <w:sz w:val="20"/>
-          <w:szCs w:val="20"/>
-        </w:rPr>
-        <w:t>text</w:t>
-      </w:r>
-      <w:proofErr w:type="spellEnd"/>
-      <w:r>
-        <w:rPr>
-          <w:rFonts w:ascii="Courier New" w:hAnsi="Courier New" w:cs="Courier New"/>
-          <w:sz w:val="20"/>
-          <w:szCs w:val="20"/>
-        </w:rPr>
-        <w:t>&gt;K2&lt;/</w:t>
-      </w:r>
-      <w:proofErr w:type="spellStart"/>
-      <w:r>
-        <w:rPr>
-          <w:rFonts w:ascii="Courier New" w:hAnsi="Courier New" w:cs="Courier New"/>
-          <w:sz w:val="20"/>
-          <w:szCs w:val="20"/>
-        </w:rPr>
-        <w:t>text</w:t>
-      </w:r>
-      <w:proofErr w:type="spellEnd"/>
-      <w:r>
-        <w:rPr>
-          <w:rFonts w:ascii="Courier New" w:hAnsi="Courier New" w:cs="Courier New"/>
-          <w:sz w:val="20"/>
-          <w:szCs w:val="20"/>
-        </w:rPr>
-        <w:t>&gt;&lt;</w:t>
-      </w:r>
-      <w:proofErr w:type="spellStart"/>
-      <w:r>
-        <w:rPr>
-          <w:rFonts w:ascii="Courier New" w:hAnsi="Courier New" w:cs="Courier New"/>
-          <w:sz w:val="20"/>
-          <w:szCs w:val="20"/>
-        </w:rPr>
-        <w:t>bcol</w:t>
-      </w:r>
-      <w:proofErr w:type="spellEnd"/>
-      <w:r>
-        <w:rPr>
-          <w:rFonts w:ascii="Courier New" w:hAnsi="Courier New" w:cs="Courier New"/>
-          <w:sz w:val="20"/>
-          <w:szCs w:val="20"/>
-        </w:rPr>
-        <w:t>&gt;#ffffa0&lt;/bcol&gt;&lt;/field&gt;</w:t>
-      </w:r>
-      <w:r>
-        <w:rPr>
-          <w:rFonts w:ascii="Courier New" w:hAnsi="Courier New" w:cs="Courier New"/>
-          <w:sz w:val="20"/>
-          <w:szCs w:val="20"/>
-        </w:rPr>
-        <w:br/>
-        <w:t>&lt;/var&gt;</w:t>
-      </w:r>
-    </w:p>
-    <w:p>
-      <w:pPr>
-        <w:numPr>
-          <w:ilvl w:val="0"/>
-          <w:numId w:val="16"/>
-        </w:numPr>
-        <w:rPr>
-          <w:rFonts w:hint="eastAsia"/>
-        </w:rPr>
-      </w:pPr>
-      <w:proofErr w:type="spellStart"/>
-      <w:r>
-        <w:t>CustomModbusCommand</w:t>
-      </w:r>
-      <w:proofErr w:type="spellEnd"/>
-      <w:r>
-        <w:t xml:space="preserve">, </w:t>
-      </w:r>
-      <w:proofErr w:type="spellStart"/>
-      <w:r>
-        <w:t>CustomRead</w:t>
-      </w:r>
-      <w:proofErr w:type="spellEnd"/>
-      <w:r>
-        <w:t xml:space="preserve"> en </w:t>
-      </w:r>
-      <w:proofErr w:type="spellStart"/>
-      <w:r>
-        <w:t>CustomWrite</w:t>
-      </w:r>
-      <w:proofErr w:type="spellEnd"/>
-      <w:r>
-        <w:t xml:space="preserve"> "Enable </w:t>
-      </w:r>
-      <w:proofErr w:type="spellStart"/>
-      <w:r>
-        <w:t>main</w:t>
-      </w:r>
-      <w:proofErr w:type="spellEnd"/>
-      <w:r>
-        <w:t xml:space="preserve"> form </w:t>
-      </w:r>
-      <w:proofErr w:type="spellStart"/>
-      <w:r>
-        <w:t>polling</w:t>
-      </w:r>
-      <w:proofErr w:type="spellEnd"/>
-      <w:r>
-        <w:t>" checkboxen gelijk gepositioneerd.</w:t>
-      </w:r>
-    </w:p>
-    <w:p>
-      <w:pPr>
-        <w:numPr>
-          <w:ilvl w:val="0"/>
-          <w:numId w:val="16"/>
-        </w:numPr>
-        <w:rPr>
-          <w:rFonts w:hint="eastAsia"/>
-        </w:rPr>
-      </w:pPr>
-      <w:r>
-        <w:t>Geeft nu een error als XML tag &lt;</w:t>
-      </w:r>
-      <w:proofErr w:type="spellStart"/>
-      <w:r>
-        <w:t>modbuscontrol</w:t>
-      </w:r>
-      <w:proofErr w:type="spellEnd"/>
-      <w:r>
-        <w:t xml:space="preserve">&gt; niet gevonden wordt in </w:t>
-      </w:r>
-      <w:proofErr w:type="spellStart"/>
-      <w:r>
-        <w:t>xml</w:t>
-      </w:r>
-      <w:proofErr w:type="spellEnd"/>
-      <w:r>
-        <w:t xml:space="preserve"> project file.</w:t>
-      </w:r>
-    </w:p>
-    <w:p>
-      <w:pPr>
-        <w:numPr>
-          <w:ilvl w:val="0"/>
-          <w:numId w:val="16"/>
-        </w:numPr>
-        <w:rPr>
-          <w:rFonts w:hint="eastAsia"/>
-        </w:rPr>
-      </w:pPr>
-      <w:r>
-        <w:t>Controleert nu dat LocalOverrides.xml een &lt;</w:t>
-      </w:r>
-      <w:proofErr w:type="spellStart"/>
-      <w:r>
-        <w:t>LocalOverrides</w:t>
-      </w:r>
-      <w:proofErr w:type="spellEnd"/>
-      <w:r>
-        <w:t xml:space="preserve">&gt; </w:t>
-      </w:r>
-      <w:proofErr w:type="spellStart"/>
-      <w:r>
-        <w:t>parent</w:t>
-      </w:r>
-      <w:proofErr w:type="spellEnd"/>
-      <w:r>
-        <w:t xml:space="preserve"> element heeft.</w:t>
-      </w:r>
-    </w:p>
-    <w:p>
-      <w:pPr>
-        <w:numPr>
-          <w:ilvl w:val="0"/>
-          <w:numId w:val="16"/>
-        </w:numPr>
-        <w:rPr>
-          <w:rFonts w:hint="eastAsia"/>
-        </w:rPr>
-      </w:pPr>
-      <w:r>
-        <w:t>Accepteert nu ook type "</w:t>
-      </w:r>
-      <w:proofErr w:type="spellStart"/>
-      <w:r>
-        <w:t>ascii</w:t>
-      </w:r>
-      <w:proofErr w:type="spellEnd"/>
-      <w:r>
-        <w:t xml:space="preserve">" voor </w:t>
-      </w:r>
-      <w:proofErr w:type="spellStart"/>
-      <w:r>
-        <w:t>bitvelden</w:t>
-      </w:r>
-      <w:proofErr w:type="spellEnd"/>
-      <w:r>
-        <w:t>.</w:t>
-      </w:r>
-    </w:p>
-    <w:p>
-      <w:pPr>
-        <w:numPr>
-          <w:ilvl w:val="0"/>
-          <w:numId w:val="16"/>
-        </w:numPr>
-        <w:rPr>
-          <w:rFonts w:hint="eastAsia"/>
-        </w:rPr>
-      </w:pPr>
-      <w:proofErr w:type="spellStart"/>
-      <w:r>
-        <w:t>Bitvelden</w:t>
-      </w:r>
-      <w:proofErr w:type="spellEnd"/>
-      <w:r>
-        <w:t xml:space="preserve"> waarvan de breedte niet 16 of 32 is en format=</w:t>
-      </w:r>
-      <w:proofErr w:type="spellStart"/>
-      <w:r>
-        <w:t>ascii</w:t>
-      </w:r>
-      <w:proofErr w:type="spellEnd"/>
-      <w:r>
-        <w:t xml:space="preserve"> worden nu beter getoond.</w:t>
       </w:r>
     </w:p>
     <w:p>

</xml_diff>

<commit_message>
User manual updated. Release notes updated. Updated MbcValidate.xsd for <longdescr> and <include>. Removed some unnecessary TODOs. Release v2.0.14.1280.
git-svn-id: http://visualsvn.edna.local/EDNA/ModbusControl/V2@3984 03c8d257-35a7-c645-9f01-50f27e98b9e6
</commit_message>
<xml_diff>
--- a/Manuals/ModbusControl - Release notes.docx
+++ b/Manuals/ModbusControl - Release notes.docx
@@ -40,6 +40,654 @@
         </w:rPr>
       </w:pPr>
       <w:r>
+        <w:t xml:space="preserve">v2.0.14 * </w:t>
+      </w:r>
+      <w:r>
+        <w:t>2022-11-08</w:t>
+      </w:r>
+    </w:p>
+    <w:p>
+      <w:pPr>
+        <w:pStyle w:val="Kop3"/>
+        <w:rPr>
+          <w:rFonts w:hint="eastAsia"/>
+        </w:rPr>
+      </w:pPr>
+      <w:r>
+        <w:t>Features</w:t>
+      </w:r>
+    </w:p>
+    <w:p>
+      <w:pPr>
+        <w:numPr>
+          <w:ilvl w:val="0"/>
+          <w:numId w:val="4"/>
+        </w:numPr>
+        <w:rPr>
+          <w:rFonts w:hint="eastAsia"/>
+        </w:rPr>
+      </w:pPr>
+      <w:proofErr w:type="spellStart"/>
+      <w:r>
+        <w:rPr>
+          <w:rFonts w:hint="eastAsia"/>
+        </w:rPr>
+        <w:t>Command</w:t>
+      </w:r>
+      <w:proofErr w:type="spellEnd"/>
+      <w:r>
+        <w:rPr>
+          <w:rFonts w:hint="eastAsia"/>
+        </w:rPr>
+        <w:t xml:space="preserve"> line </w:t>
+      </w:r>
+      <w:r>
+        <w:t xml:space="preserve">parameters </w:t>
+      </w:r>
+      <w:r>
+        <w:rPr>
+          <w:rFonts w:hint="eastAsia"/>
+        </w:rPr>
+        <w:t xml:space="preserve">toegevoegd. Vervangt </w:t>
+      </w:r>
+      <w:proofErr w:type="spellStart"/>
+      <w:r>
+        <w:rPr>
+          <w:rFonts w:hint="eastAsia"/>
+        </w:rPr>
+        <w:t>LocalOverrides</w:t>
+      </w:r>
+      <w:proofErr w:type="spellEnd"/>
+      <w:r>
+        <w:t>.</w:t>
+      </w:r>
+    </w:p>
+    <w:p>
+      <w:pPr>
+        <w:numPr>
+          <w:ilvl w:val="0"/>
+          <w:numId w:val="4"/>
+        </w:numPr>
+        <w:rPr>
+          <w:rFonts w:hint="eastAsia"/>
+        </w:rPr>
+      </w:pPr>
+      <w:proofErr w:type="spellStart"/>
+      <w:r>
+        <w:rPr>
+          <w:rFonts w:hint="eastAsia"/>
+        </w:rPr>
+        <w:t>LocalOverrides</w:t>
+      </w:r>
+      <w:proofErr w:type="spellEnd"/>
+      <w:r>
+        <w:rPr>
+          <w:rFonts w:hint="eastAsia"/>
+        </w:rPr>
+        <w:t xml:space="preserve"> afgevoerd.</w:t>
+      </w:r>
+    </w:p>
+    <w:p>
+      <w:pPr>
+        <w:numPr>
+          <w:ilvl w:val="0"/>
+          <w:numId w:val="4"/>
+        </w:numPr>
+        <w:rPr>
+          <w:rFonts w:hint="eastAsia"/>
+        </w:rPr>
+      </w:pPr>
+      <w:r>
+        <w:rPr>
+          <w:rFonts w:hint="eastAsia"/>
+        </w:rPr>
+        <w:t xml:space="preserve">Save project file: </w:t>
+      </w:r>
+      <w:r>
+        <w:t>de [</w:t>
+      </w:r>
+      <w:r>
+        <w:rPr>
+          <w:rFonts w:hint="eastAsia"/>
+        </w:rPr>
+        <w:t>Update</w:t>
+      </w:r>
+      <w:r>
+        <w:t xml:space="preserve"> </w:t>
+      </w:r>
+      <w:r>
+        <w:rPr>
+          <w:rFonts w:hint="eastAsia"/>
+        </w:rPr>
+        <w:t xml:space="preserve">XML </w:t>
+      </w:r>
+      <w:proofErr w:type="spellStart"/>
+      <w:r>
+        <w:t>to</w:t>
+      </w:r>
+      <w:proofErr w:type="spellEnd"/>
+      <w:r>
+        <w:t xml:space="preserve"> </w:t>
+      </w:r>
+      <w:proofErr w:type="spellStart"/>
+      <w:r>
+        <w:t>current</w:t>
+      </w:r>
+      <w:proofErr w:type="spellEnd"/>
+      <w:r>
+        <w:t xml:space="preserve"> </w:t>
+      </w:r>
+      <w:proofErr w:type="spellStart"/>
+      <w:r>
+        <w:t>version</w:t>
+      </w:r>
+      <w:proofErr w:type="spellEnd"/>
+      <w:r>
+        <w:t xml:space="preserve">] </w:t>
+      </w:r>
+      <w:proofErr w:type="spellStart"/>
+      <w:r>
+        <w:rPr>
+          <w:rFonts w:hint="eastAsia"/>
+        </w:rPr>
+        <w:t>checkbox</w:t>
+      </w:r>
+      <w:proofErr w:type="spellEnd"/>
+      <w:r>
+        <w:t xml:space="preserve"> </w:t>
+      </w:r>
+      <w:r>
+        <w:rPr>
+          <w:rFonts w:hint="eastAsia"/>
+        </w:rPr>
+        <w:t>is nu default aan.</w:t>
+      </w:r>
+    </w:p>
+    <w:p>
+      <w:pPr>
+        <w:numPr>
+          <w:ilvl w:val="0"/>
+          <w:numId w:val="4"/>
+        </w:numPr>
+        <w:rPr>
+          <w:rFonts w:hint="eastAsia"/>
+        </w:rPr>
+      </w:pPr>
+      <w:r>
+        <w:rPr>
+          <w:rFonts w:hint="eastAsia"/>
+        </w:rPr>
+        <w:t>Options form: tooltips verbeterd.</w:t>
+      </w:r>
+    </w:p>
+    <w:p>
+      <w:pPr>
+        <w:numPr>
+          <w:ilvl w:val="0"/>
+          <w:numId w:val="4"/>
+        </w:numPr>
+        <w:rPr>
+          <w:rFonts w:hint="eastAsia"/>
+        </w:rPr>
+      </w:pPr>
+      <w:proofErr w:type="spellStart"/>
+      <w:r>
+        <w:t>Grid</w:t>
+      </w:r>
+      <w:proofErr w:type="spellEnd"/>
+      <w:r>
+        <w:t xml:space="preserve">: </w:t>
+      </w:r>
+      <w:r>
+        <w:rPr>
+          <w:rFonts w:hint="eastAsia"/>
+        </w:rPr>
+        <w:t xml:space="preserve">Register kolom </w:t>
+      </w:r>
+      <w:r>
+        <w:t xml:space="preserve">menu </w:t>
+      </w:r>
+      <w:r>
+        <w:rPr>
+          <w:rFonts w:hint="eastAsia"/>
+        </w:rPr>
+        <w:t xml:space="preserve">heeft nu </w:t>
+      </w:r>
+      <w:r>
+        <w:t>[</w:t>
+      </w:r>
+      <w:proofErr w:type="spellStart"/>
+      <w:r>
+        <w:rPr>
+          <w:rFonts w:hint="eastAsia"/>
+        </w:rPr>
+        <w:t>Expand</w:t>
+      </w:r>
+      <w:proofErr w:type="spellEnd"/>
+      <w:r>
+        <w:rPr>
+          <w:rFonts w:hint="eastAsia"/>
+        </w:rPr>
+        <w:t xml:space="preserve"> </w:t>
+      </w:r>
+      <w:proofErr w:type="spellStart"/>
+      <w:r>
+        <w:rPr>
+          <w:rFonts w:hint="eastAsia"/>
+        </w:rPr>
+        <w:t>all</w:t>
+      </w:r>
+      <w:proofErr w:type="spellEnd"/>
+      <w:r>
+        <w:t>]</w:t>
+      </w:r>
+      <w:r>
+        <w:rPr>
+          <w:rFonts w:hint="eastAsia"/>
+        </w:rPr>
+        <w:t xml:space="preserve"> en </w:t>
+      </w:r>
+      <w:r>
+        <w:t>[</w:t>
+      </w:r>
+      <w:proofErr w:type="spellStart"/>
+      <w:r>
+        <w:rPr>
+          <w:rFonts w:hint="eastAsia"/>
+        </w:rPr>
+        <w:t>Collapse</w:t>
+      </w:r>
+      <w:proofErr w:type="spellEnd"/>
+      <w:r>
+        <w:rPr>
+          <w:rFonts w:hint="eastAsia"/>
+        </w:rPr>
+        <w:t xml:space="preserve"> </w:t>
+      </w:r>
+      <w:proofErr w:type="spellStart"/>
+      <w:r>
+        <w:rPr>
+          <w:rFonts w:hint="eastAsia"/>
+        </w:rPr>
+        <w:t>all</w:t>
+      </w:r>
+      <w:proofErr w:type="spellEnd"/>
+      <w:r>
+        <w:t>]</w:t>
+      </w:r>
+      <w:r>
+        <w:rPr>
+          <w:rFonts w:hint="eastAsia"/>
+        </w:rPr>
+        <w:t>.</w:t>
+      </w:r>
+    </w:p>
+    <w:p>
+      <w:pPr>
+        <w:numPr>
+          <w:ilvl w:val="0"/>
+          <w:numId w:val="4"/>
+        </w:numPr>
+        <w:rPr>
+          <w:rFonts w:hint="eastAsia"/>
+        </w:rPr>
+      </w:pPr>
+      <w:proofErr w:type="spellStart"/>
+      <w:r>
+        <w:t>Mbc</w:t>
+      </w:r>
+      <w:proofErr w:type="spellEnd"/>
+      <w:r>
+        <w:t xml:space="preserve"> project file: &lt;</w:t>
+      </w:r>
+      <w:proofErr w:type="spellStart"/>
+      <w:r>
+        <w:t>longdescr</w:t>
+      </w:r>
+      <w:proofErr w:type="spellEnd"/>
+      <w:r>
+        <w:t>&gt; toegevoegd.</w:t>
+      </w:r>
+      <w:r>
+        <w:rPr>
+          <w:rFonts w:hint="eastAsia"/>
+        </w:rPr>
+        <w:t xml:space="preserve"> </w:t>
+      </w:r>
+      <w:r>
+        <w:t xml:space="preserve">Werkt in de </w:t>
+      </w:r>
+      <w:proofErr w:type="spellStart"/>
+      <w:r>
+        <w:t>grid</w:t>
+      </w:r>
+      <w:proofErr w:type="spellEnd"/>
+      <w:r>
+        <w:t xml:space="preserve"> op de [</w:t>
+      </w:r>
+      <w:proofErr w:type="spellStart"/>
+      <w:r>
+        <w:t>Description</w:t>
+      </w:r>
+      <w:proofErr w:type="spellEnd"/>
+      <w:r>
+        <w:t xml:space="preserve">] kolom als </w:t>
+      </w:r>
+      <w:proofErr w:type="spellStart"/>
+      <w:r>
+        <w:t>tooltip</w:t>
+      </w:r>
+      <w:proofErr w:type="spellEnd"/>
+      <w:r>
+        <w:t xml:space="preserve"> met lange </w:t>
+      </w:r>
+      <w:proofErr w:type="spellStart"/>
+      <w:r>
+        <w:t>multi</w:t>
+      </w:r>
+      <w:proofErr w:type="spellEnd"/>
+      <w:r>
+        <w:t>-line tekst.</w:t>
+      </w:r>
+    </w:p>
+    <w:p>
+      <w:pPr>
+        <w:numPr>
+          <w:ilvl w:val="0"/>
+          <w:numId w:val="4"/>
+        </w:numPr>
+        <w:rPr>
+          <w:rFonts w:hint="eastAsia"/>
+        </w:rPr>
+      </w:pPr>
+      <w:proofErr w:type="spellStart"/>
+      <w:r>
+        <w:t>Mbc</w:t>
+      </w:r>
+      <w:proofErr w:type="spellEnd"/>
+      <w:r>
+        <w:t xml:space="preserve"> project file: </w:t>
+      </w:r>
+      <w:r>
+        <w:rPr>
+          <w:rFonts w:hint="eastAsia"/>
+        </w:rPr>
+        <w:t>&lt;</w:t>
+      </w:r>
+      <w:proofErr w:type="spellStart"/>
+      <w:r>
+        <w:rPr>
+          <w:rFonts w:hint="eastAsia"/>
+        </w:rPr>
+        <w:t>include</w:t>
+      </w:r>
+      <w:proofErr w:type="spellEnd"/>
+      <w:r>
+        <w:rPr>
+          <w:rFonts w:hint="eastAsia"/>
+        </w:rPr>
+        <w:t xml:space="preserve">&gt; </w:t>
+      </w:r>
+      <w:r>
+        <w:t>element toegevoegd.</w:t>
+      </w:r>
+    </w:p>
+    <w:p>
+      <w:pPr>
+        <w:pStyle w:val="Kop3"/>
+        <w:numPr>
+          <w:ilvl w:val="0"/>
+          <w:numId w:val="0"/>
+        </w:numPr>
+        <w:ind w:left="680" w:hanging="431"/>
+        <w:rPr>
+          <w:rFonts w:hint="eastAsia"/>
+        </w:rPr>
+      </w:pPr>
+      <w:proofErr w:type="spellStart"/>
+      <w:r>
+        <w:t>Fixes</w:t>
+      </w:r>
+      <w:proofErr w:type="spellEnd"/>
+    </w:p>
+    <w:p>
+      <w:pPr>
+        <w:numPr>
+          <w:ilvl w:val="0"/>
+          <w:numId w:val="4"/>
+        </w:numPr>
+        <w:rPr>
+          <w:rFonts w:hint="eastAsia"/>
+        </w:rPr>
+      </w:pPr>
+      <w:r>
+        <w:t>[</w:t>
+      </w:r>
+      <w:r>
+        <w:rPr>
+          <w:rFonts w:hint="eastAsia"/>
+        </w:rPr>
+        <w:t xml:space="preserve">Open project file </w:t>
+      </w:r>
+      <w:proofErr w:type="spellStart"/>
+      <w:r>
+        <w:rPr>
+          <w:rFonts w:hint="eastAsia"/>
+        </w:rPr>
+        <w:t>location</w:t>
+      </w:r>
+      <w:proofErr w:type="spellEnd"/>
+      <w:r>
+        <w:rPr>
+          <w:rFonts w:hint="eastAsia"/>
+        </w:rPr>
+        <w:t xml:space="preserve"> in Explorer</w:t>
+      </w:r>
+      <w:r>
+        <w:t>]</w:t>
+      </w:r>
+      <w:r>
+        <w:rPr>
+          <w:rFonts w:hint="eastAsia"/>
+        </w:rPr>
+        <w:t xml:space="preserve"> </w:t>
+      </w:r>
+      <w:r>
+        <w:t xml:space="preserve">werkt nu als je op de </w:t>
+      </w:r>
+      <w:proofErr w:type="spellStart"/>
+      <w:r>
+        <w:t>command</w:t>
+      </w:r>
+      <w:proofErr w:type="spellEnd"/>
+      <w:r>
+        <w:t xml:space="preserve"> line een </w:t>
+      </w:r>
+      <w:proofErr w:type="spellStart"/>
+      <w:r>
+        <w:t>filename</w:t>
+      </w:r>
+      <w:proofErr w:type="spellEnd"/>
+      <w:r>
+        <w:t xml:space="preserve"> zonder pad </w:t>
+      </w:r>
+      <w:r>
+        <w:t>gaf</w:t>
+      </w:r>
+      <w:r>
+        <w:t>.</w:t>
+      </w:r>
+    </w:p>
+    <w:p>
+      <w:pPr>
+        <w:numPr>
+          <w:ilvl w:val="0"/>
+          <w:numId w:val="4"/>
+        </w:numPr>
+        <w:rPr>
+          <w:rFonts w:hint="eastAsia"/>
+        </w:rPr>
+      </w:pPr>
+      <w:r>
+        <w:t xml:space="preserve">Het tijdelijk rood kleuren van het </w:t>
+      </w:r>
+      <w:proofErr w:type="spellStart"/>
+      <w:r>
+        <w:t>value</w:t>
+      </w:r>
+      <w:proofErr w:type="spellEnd"/>
+      <w:r>
+        <w:t xml:space="preserve"> veld na invoer van fou</w:t>
+      </w:r>
+      <w:r>
+        <w:rPr>
+          <w:rFonts w:hint="eastAsia"/>
+        </w:rPr>
+        <w:t>te waarde</w:t>
+      </w:r>
+      <w:r>
+        <w:t xml:space="preserve"> is verbeterd.</w:t>
+      </w:r>
+    </w:p>
+    <w:p>
+      <w:pPr>
+        <w:numPr>
+          <w:ilvl w:val="0"/>
+          <w:numId w:val="4"/>
+        </w:numPr>
+        <w:rPr>
+          <w:rFonts w:hint="eastAsia"/>
+        </w:rPr>
+      </w:pPr>
+      <w:proofErr w:type="spellStart"/>
+      <w:r>
+        <w:t>E</w:t>
+      </w:r>
+      <w:r>
+        <w:rPr>
+          <w:rFonts w:hint="eastAsia"/>
+        </w:rPr>
+        <w:t>dit</w:t>
+      </w:r>
+      <w:proofErr w:type="spellEnd"/>
+      <w:r>
+        <w:rPr>
+          <w:rFonts w:hint="eastAsia"/>
+        </w:rPr>
+        <w:t xml:space="preserve"> enter/escape wordt nu beter gedetecteerd (</w:t>
+      </w:r>
+      <w:r>
+        <w:t xml:space="preserve">Case: </w:t>
+      </w:r>
+      <w:r>
+        <w:rPr>
+          <w:rFonts w:hint="eastAsia"/>
+        </w:rPr>
+        <w:t xml:space="preserve">druk F2 </w:t>
+      </w:r>
+      <w:proofErr w:type="spellStart"/>
+      <w:r>
+        <w:rPr>
+          <w:rFonts w:hint="eastAsia"/>
+        </w:rPr>
+        <w:t>edit</w:t>
+      </w:r>
+      <w:proofErr w:type="spellEnd"/>
+      <w:r>
+        <w:rPr>
+          <w:rFonts w:hint="eastAsia"/>
+        </w:rPr>
+        <w:t>, druk enter, waarde w</w:t>
+      </w:r>
+      <w:r>
+        <w:t>erd</w:t>
+      </w:r>
+      <w:r>
+        <w:rPr>
+          <w:rFonts w:hint="eastAsia"/>
+        </w:rPr>
+        <w:t xml:space="preserve"> niet geschreven, h</w:t>
+      </w:r>
+      <w:r>
+        <w:t>ing</w:t>
+      </w:r>
+      <w:r>
+        <w:rPr>
+          <w:rFonts w:hint="eastAsia"/>
+        </w:rPr>
+        <w:t xml:space="preserve"> ook af van </w:t>
+      </w:r>
+      <w:r>
+        <w:t xml:space="preserve">de </w:t>
+      </w:r>
+      <w:proofErr w:type="spellStart"/>
+      <w:r>
+        <w:rPr>
+          <w:rFonts w:hint="eastAsia"/>
+        </w:rPr>
+        <w:t>MoveToNextRowOnEnte</w:t>
+      </w:r>
+      <w:r>
+        <w:t>r</w:t>
+      </w:r>
+      <w:proofErr w:type="spellEnd"/>
+      <w:r>
+        <w:t xml:space="preserve"> optie</w:t>
+      </w:r>
+      <w:r>
+        <w:t>).</w:t>
+      </w:r>
+    </w:p>
+    <w:p>
+      <w:pPr>
+        <w:numPr>
+          <w:ilvl w:val="0"/>
+          <w:numId w:val="4"/>
+        </w:numPr>
+        <w:rPr>
+          <w:rFonts w:hint="eastAsia"/>
+        </w:rPr>
+      </w:pPr>
+      <w:r>
+        <w:t xml:space="preserve">In het meldingsscherm dat de seriële poort niet kon geopend worden: de </w:t>
+      </w:r>
+      <w:r>
+        <w:t>[</w:t>
+      </w:r>
+      <w:r>
+        <w:t>Port</w:t>
+      </w:r>
+      <w:r>
+        <w:t>]</w:t>
+      </w:r>
+      <w:r>
+        <w:t xml:space="preserve"> </w:t>
+      </w:r>
+      <w:proofErr w:type="spellStart"/>
+      <w:r>
+        <w:t>combobox</w:t>
+      </w:r>
+      <w:proofErr w:type="spellEnd"/>
+      <w:r>
+        <w:t xml:space="preserve"> doet nu automatisch een </w:t>
+      </w:r>
+      <w:proofErr w:type="spellStart"/>
+      <w:r>
+        <w:t>refresh</w:t>
+      </w:r>
+      <w:proofErr w:type="spellEnd"/>
+      <w:r>
+        <w:t xml:space="preserve"> van de lijst van seriële poorten.</w:t>
+      </w:r>
+    </w:p>
+    <w:p>
+      <w:pPr>
+        <w:pStyle w:val="Kop1"/>
+        <w:rPr>
+          <w:rFonts w:hint="eastAsia"/>
+        </w:rPr>
+      </w:pPr>
+      <w:r>
         <w:t>v2.0.13 * 2022-07-11</w:t>
       </w:r>
     </w:p>
@@ -407,21 +1055,12 @@
           <w:rFonts w:hint="eastAsia"/>
         </w:rPr>
       </w:pPr>
-      <w:proofErr w:type="spellStart"/>
-      <w:r>
-        <w:t>Mbc</w:t>
-      </w:r>
-      <w:proofErr w:type="spellEnd"/>
-      <w:r>
-        <w:t xml:space="preserve"> project file validatie met XSD schema toegevoegd. Als er bij het laden van een </w:t>
-      </w:r>
-      <w:proofErr w:type="spellStart"/>
-      <w:r>
-        <w:t>mbc</w:t>
-      </w:r>
-      <w:proofErr w:type="spellEnd"/>
-      <w:r>
-        <w:t xml:space="preserve"> project file een validatiefout optreedt kan je ervoor kiezen om dit te negeren en toch de file te laden. De validatie kan afgezet worden in Options. </w:t>
+      <w:r>
+        <w:t xml:space="preserve">Mbc project file validatie met XSD schema toegevoegd. Als er bij het laden van een mbc </w:t>
+      </w:r>
+      <w:r>
+        <w:lastRenderedPageBreak/>
+        <w:t xml:space="preserve">project file een validatiefout optreedt kan je ervoor kiezen om dit te negeren en toch de file te laden. De validatie kan afgezet worden in Options. </w:t>
       </w:r>
       <w:r>
         <w:br/>
@@ -433,15 +1072,7 @@
       </w:r>
       <w:proofErr w:type="spellEnd"/>
       <w:r>
-        <w:t xml:space="preserve">-case XML tags toe. En laat alleen de XML elementen toe die in deze versie ondersteund worden. Het is de bedoeling dat mettertijd alle </w:t>
-      </w:r>
-      <w:proofErr w:type="spellStart"/>
-      <w:r>
-        <w:t>mbc</w:t>
-      </w:r>
-      <w:proofErr w:type="spellEnd"/>
-      <w:r>
-        <w:t xml:space="preserve"> files worden aangepast om aan de validatie te voldoen.</w:t>
+        <w:t>-case XML tags toe. En laat alleen de XML elementen toe die in deze versie ondersteund worden. Het is de bedoeling dat mettertijd alle mbc files worden aangepast om aan de validatie te voldoen.</w:t>
       </w:r>
     </w:p>
     <w:p>
@@ -507,7 +1138,137 @@
         </w:rPr>
       </w:pPr>
       <w:r>
-        <w:t xml:space="preserve">Als je </w:t>
+        <w:t xml:space="preserve">Als je ModbusControl start door een mbc file te dubbelklikken en de file verwijst naar een onbestaande COM poort, dan verschijnt de error </w:t>
+      </w:r>
+      <w:proofErr w:type="spellStart"/>
+      <w:r>
+        <w:t>dialog</w:t>
+      </w:r>
+      <w:proofErr w:type="spellEnd"/>
+      <w:r>
+        <w:t xml:space="preserve"> “Error opening </w:t>
+      </w:r>
+      <w:proofErr w:type="spellStart"/>
+      <w:r>
+        <w:t>serial</w:t>
+      </w:r>
+      <w:proofErr w:type="spellEnd"/>
+      <w:r>
+        <w:t xml:space="preserve"> port </w:t>
+      </w:r>
+      <w:proofErr w:type="spellStart"/>
+      <w:r>
+        <w:t>COMx</w:t>
+      </w:r>
+      <w:proofErr w:type="spellEnd"/>
+      <w:r>
+        <w:t>” nu nadat het ModbusControl programma verschijnt.</w:t>
+      </w:r>
+    </w:p>
+    <w:p>
+      <w:pPr>
+        <w:numPr>
+          <w:ilvl w:val="0"/>
+          <w:numId w:val="6"/>
+        </w:numPr>
+        <w:rPr>
+          <w:rFonts w:hint="eastAsia"/>
+        </w:rPr>
+      </w:pPr>
+      <w:r>
+        <w:t xml:space="preserve">Bij de eerste start na een update wordt gemeld dat het programma </w:t>
+      </w:r>
+      <w:proofErr w:type="spellStart"/>
+      <w:r>
+        <w:t>geupdate</w:t>
+      </w:r>
+      <w:proofErr w:type="spellEnd"/>
+      <w:r>
+        <w:t xml:space="preserve"> is en wordt gevraagd of de gebruiker de ‘Release </w:t>
+      </w:r>
+      <w:proofErr w:type="spellStart"/>
+      <w:r>
+        <w:t>notes</w:t>
+      </w:r>
+      <w:proofErr w:type="spellEnd"/>
+      <w:r>
+        <w:t>’ wil zien.</w:t>
+      </w:r>
+    </w:p>
+    <w:p>
+      <w:pPr>
+        <w:numPr>
+          <w:ilvl w:val="0"/>
+          <w:numId w:val="6"/>
+        </w:numPr>
+        <w:rPr>
+          <w:rFonts w:hint="eastAsia"/>
+        </w:rPr>
+      </w:pPr>
+      <w:r>
+        <w:t xml:space="preserve">Programma </w:t>
+      </w:r>
+      <w:proofErr w:type="spellStart"/>
+      <w:r>
+        <w:t>settings</w:t>
+      </w:r>
+      <w:proofErr w:type="spellEnd"/>
+      <w:r>
+        <w:t xml:space="preserve"> gesplitst in user-afhankelijk deel en PC-afhankelijk deel. De oude </w:t>
+      </w:r>
+      <w:proofErr w:type="spellStart"/>
+      <w:r>
+        <w:t>settings</w:t>
+      </w:r>
+      <w:proofErr w:type="spellEnd"/>
+      <w:r>
+        <w:t xml:space="preserve"> worden 1 keer gemigreerd naar de nieuwe </w:t>
+      </w:r>
+      <w:proofErr w:type="spellStart"/>
+      <w:r>
+        <w:t>settings</w:t>
+      </w:r>
+      <w:proofErr w:type="spellEnd"/>
+      <w:r>
+        <w:t xml:space="preserve"> files, dan wordt oude nieuwe </w:t>
+      </w:r>
+      <w:proofErr w:type="spellStart"/>
+      <w:r>
+        <w:t>settings</w:t>
+      </w:r>
+      <w:proofErr w:type="spellEnd"/>
+      <w:r>
+        <w:t xml:space="preserve"> file </w:t>
+      </w:r>
+      <w:proofErr w:type="spellStart"/>
+      <w:r>
+        <w:t>gedelete</w:t>
+      </w:r>
+      <w:proofErr w:type="spellEnd"/>
+      <w:r>
+        <w:t>.</w:t>
+      </w:r>
+    </w:p>
+    <w:p>
+      <w:pPr>
+        <w:numPr>
+          <w:ilvl w:val="0"/>
+          <w:numId w:val="6"/>
+        </w:numPr>
+        <w:rPr>
+          <w:rFonts w:hint="eastAsia"/>
+        </w:rPr>
+      </w:pPr>
+      <w:r>
+        <w:t>LocalOverrides.xml verplaatst van &lt;</w:t>
+      </w:r>
+      <w:proofErr w:type="spellStart"/>
+      <w:r>
+        <w:t>mydocuments</w:t>
+      </w:r>
+      <w:proofErr w:type="spellEnd"/>
+      <w:r>
+        <w:t>&gt;\</w:t>
       </w:r>
       <w:proofErr w:type="spellStart"/>
       <w:r>
@@ -515,23 +1276,218 @@
       </w:r>
       <w:proofErr w:type="spellEnd"/>
       <w:r>
-        <w:t xml:space="preserve"> start door een </w:t>
-      </w:r>
-      <w:proofErr w:type="spellStart"/>
-      <w:r>
-        <w:t>mbc</w:t>
-      </w:r>
-      <w:proofErr w:type="spellEnd"/>
-      <w:r>
-        <w:t xml:space="preserve"> file te dubbelklikken en de file verwijst naar een onbestaande COM poort, dan verschijnt de error </w:t>
-      </w:r>
-      <w:proofErr w:type="spellStart"/>
-      <w:r>
-        <w:t>dialog</w:t>
-      </w:r>
-      <w:proofErr w:type="spellEnd"/>
-      <w:r>
-        <w:t xml:space="preserve"> “Error opening </w:t>
+        <w:t xml:space="preserve"> naar %</w:t>
+      </w:r>
+      <w:proofErr w:type="spellStart"/>
+      <w:r>
+        <w:t>AppData</w:t>
+      </w:r>
+      <w:proofErr w:type="spellEnd"/>
+      <w:r>
+        <w:t>%\</w:t>
+      </w:r>
+      <w:proofErr w:type="spellStart"/>
+      <w:r>
+        <w:t>Roaming</w:t>
+      </w:r>
+      <w:proofErr w:type="spellEnd"/>
+      <w:r>
+        <w:t>\E.D.&amp;A\</w:t>
+      </w:r>
+      <w:proofErr w:type="spellStart"/>
+      <w:r>
+        <w:t>ModbusControl</w:t>
+      </w:r>
+      <w:proofErr w:type="spellEnd"/>
+      <w:r>
+        <w:t xml:space="preserve">. Content van oude wordt niet gemigreerd naar nieuwe. Oude wordt </w:t>
+      </w:r>
+      <w:proofErr w:type="spellStart"/>
+      <w:r>
+        <w:t>renamed</w:t>
+      </w:r>
+      <w:proofErr w:type="spellEnd"/>
+      <w:r>
+        <w:t xml:space="preserve"> met '.</w:t>
+      </w:r>
+      <w:proofErr w:type="spellStart"/>
+      <w:r>
+        <w:t>old</w:t>
+      </w:r>
+      <w:proofErr w:type="spellEnd"/>
+      <w:r>
+        <w:t xml:space="preserve">' en naar de locatie van de nieuwe gemoved. Als er </w:t>
+      </w:r>
+      <w:proofErr w:type="spellStart"/>
+      <w:r>
+        <w:t>overrides</w:t>
+      </w:r>
+      <w:proofErr w:type="spellEnd"/>
+      <w:r>
+        <w:t xml:space="preserve"> gebruikt werden krijgt de user wel éénmalig een melding hiervan.</w:t>
+      </w:r>
+    </w:p>
+    <w:p>
+      <w:pPr>
+        <w:numPr>
+          <w:ilvl w:val="0"/>
+          <w:numId w:val="6"/>
+        </w:numPr>
+        <w:rPr>
+          <w:rFonts w:hint="eastAsia"/>
+        </w:rPr>
+      </w:pPr>
+      <w:r>
+        <w:t>&lt;user&gt;\</w:t>
+      </w:r>
+      <w:proofErr w:type="spellStart"/>
+      <w:r>
+        <w:t>Documents</w:t>
+      </w:r>
+      <w:proofErr w:type="spellEnd"/>
+      <w:r>
+        <w:t>\</w:t>
+      </w:r>
+      <w:proofErr w:type="spellStart"/>
+      <w:r>
+        <w:t>ModbusControl</w:t>
+      </w:r>
+      <w:proofErr w:type="spellEnd"/>
+      <w:r>
+        <w:t xml:space="preserve"> wordt niet meer gebruikt.</w:t>
+      </w:r>
+    </w:p>
+    <w:p>
+      <w:pPr>
+        <w:pStyle w:val="Kop3"/>
+        <w:rPr>
+          <w:rFonts w:hint="eastAsia"/>
+        </w:rPr>
+      </w:pPr>
+      <w:proofErr w:type="spellStart"/>
+      <w:r>
+        <w:t>Fixes</w:t>
+      </w:r>
+      <w:proofErr w:type="spellEnd"/>
+    </w:p>
+    <w:p>
+      <w:pPr>
+        <w:numPr>
+          <w:ilvl w:val="0"/>
+          <w:numId w:val="7"/>
+        </w:numPr>
+        <w:rPr>
+          <w:rFonts w:hint="eastAsia"/>
+        </w:rPr>
+      </w:pPr>
+      <w:r>
+        <w:t xml:space="preserve">De import/export </w:t>
+      </w:r>
+      <w:proofErr w:type="spellStart"/>
+      <w:r>
+        <w:t>dialogs</w:t>
+      </w:r>
+      <w:proofErr w:type="spellEnd"/>
+      <w:r>
+        <w:t xml:space="preserve"> tonen nu ‘*.CSV’ </w:t>
+      </w:r>
+      <w:proofErr w:type="spellStart"/>
+      <w:r>
+        <w:t>ipv</w:t>
+      </w:r>
+      <w:proofErr w:type="spellEnd"/>
+      <w:r>
+        <w:t xml:space="preserve"> ‘*.</w:t>
+      </w:r>
+      <w:proofErr w:type="spellStart"/>
+      <w:r>
+        <w:t>Csv</w:t>
+      </w:r>
+      <w:proofErr w:type="spellEnd"/>
+      <w:r>
+        <w:t>’.</w:t>
+      </w:r>
+    </w:p>
+    <w:p>
+      <w:pPr>
+        <w:numPr>
+          <w:ilvl w:val="0"/>
+          <w:numId w:val="7"/>
+        </w:numPr>
+        <w:rPr>
+          <w:rFonts w:hint="eastAsia"/>
+        </w:rPr>
+      </w:pPr>
+      <w:r>
+        <w:t>Mbc file wordt nu gesaved zonder BOM (</w:t>
+      </w:r>
+      <w:proofErr w:type="spellStart"/>
+      <w:r>
+        <w:t>unicode</w:t>
+      </w:r>
+      <w:proofErr w:type="spellEnd"/>
+      <w:r>
+        <w:t xml:space="preserve"> byte order mark).</w:t>
+      </w:r>
+    </w:p>
+    <w:p>
+      <w:pPr>
+        <w:numPr>
+          <w:ilvl w:val="0"/>
+          <w:numId w:val="7"/>
+        </w:numPr>
+        <w:rPr>
+          <w:rFonts w:hint="eastAsia"/>
+        </w:rPr>
+      </w:pPr>
+      <w:r>
+        <w:t>Betere verwerking als een andere user of niet-</w:t>
+      </w:r>
+      <w:proofErr w:type="spellStart"/>
+      <w:r>
+        <w:t>admin</w:t>
+      </w:r>
+      <w:proofErr w:type="spellEnd"/>
+      <w:r>
+        <w:t xml:space="preserve"> user op de PC inlogt en ModbusControl gebruikt.</w:t>
+      </w:r>
+    </w:p>
+    <w:p>
+      <w:pPr>
+        <w:pStyle w:val="Kop1"/>
+        <w:rPr>
+          <w:rFonts w:hint="eastAsia"/>
+        </w:rPr>
+      </w:pPr>
+      <w:r>
+        <w:t>v2.0.11 * 2019-11-18</w:t>
+      </w:r>
+    </w:p>
+    <w:p>
+      <w:pPr>
+        <w:pStyle w:val="Kop3"/>
+        <w:rPr>
+          <w:rFonts w:hint="eastAsia"/>
+        </w:rPr>
+      </w:pPr>
+      <w:proofErr w:type="spellStart"/>
+      <w:r>
+        <w:t>Fixes</w:t>
+      </w:r>
+      <w:proofErr w:type="spellEnd"/>
+    </w:p>
+    <w:p>
+      <w:pPr>
+        <w:numPr>
+          <w:ilvl w:val="0"/>
+          <w:numId w:val="8"/>
+        </w:numPr>
+        <w:rPr>
+          <w:rFonts w:hint="eastAsia"/>
+        </w:rPr>
+      </w:pPr>
+      <w:r>
+        <w:t>Betere afhandeling als de USB/</w:t>
       </w:r>
       <w:proofErr w:type="spellStart"/>
       <w:r>
@@ -539,67 +1495,789 @@
       </w:r>
       <w:proofErr w:type="spellEnd"/>
       <w:r>
-        <w:t xml:space="preserve"> port </w:t>
-      </w:r>
-      <w:proofErr w:type="spellStart"/>
-      <w:r>
-        <w:t>COMx</w:t>
-      </w:r>
-      <w:proofErr w:type="spellEnd"/>
-      <w:r>
-        <w:t xml:space="preserve">” nu nadat het </w:t>
-      </w:r>
-      <w:proofErr w:type="spellStart"/>
-      <w:r>
-        <w:t>ModbusControl</w:t>
-      </w:r>
-      <w:proofErr w:type="spellEnd"/>
-      <w:r>
-        <w:t xml:space="preserve"> programma verschijnt.</w:t>
-      </w:r>
-    </w:p>
-    <w:p>
-      <w:pPr>
-        <w:numPr>
-          <w:ilvl w:val="0"/>
-          <w:numId w:val="6"/>
-        </w:numPr>
-        <w:rPr>
-          <w:rFonts w:hint="eastAsia"/>
-        </w:rPr>
-      </w:pPr>
-      <w:r>
-        <w:t xml:space="preserve">Bij de eerste start na een update wordt gemeld dat het programma </w:t>
-      </w:r>
-      <w:proofErr w:type="spellStart"/>
-      <w:r>
-        <w:t>geupdate</w:t>
-      </w:r>
-      <w:proofErr w:type="spellEnd"/>
-      <w:r>
-        <w:t xml:space="preserve"> is en wordt gevraagd of de gebruiker de ‘Release </w:t>
-      </w:r>
-      <w:proofErr w:type="spellStart"/>
-      <w:r>
-        <w:t>notes</w:t>
-      </w:r>
-      <w:proofErr w:type="spellEnd"/>
-      <w:r>
-        <w:t>’ wil zien.</w:t>
-      </w:r>
-    </w:p>
-    <w:p>
-      <w:pPr>
-        <w:numPr>
-          <w:ilvl w:val="0"/>
-          <w:numId w:val="6"/>
-        </w:numPr>
-        <w:rPr>
-          <w:rFonts w:hint="eastAsia"/>
-        </w:rPr>
-      </w:pPr>
-      <w:r>
-        <w:t xml:space="preserve">Programma </w:t>
+        <w:t xml:space="preserve"> connectie verbroken wordt. Vroeger ging het CPU-verbruik dan naar maximum en reageerde het programma niet goed meer.</w:t>
+      </w:r>
+    </w:p>
+    <w:p>
+      <w:pPr>
+        <w:pStyle w:val="Kop1"/>
+        <w:rPr>
+          <w:rFonts w:hint="eastAsia"/>
+        </w:rPr>
+      </w:pPr>
+      <w:r>
+        <w:t>v2.0.10 * 2019-03-11</w:t>
+      </w:r>
+    </w:p>
+    <w:p>
+      <w:pPr>
+        <w:pStyle w:val="Kop3"/>
+        <w:rPr>
+          <w:rFonts w:hint="eastAsia"/>
+        </w:rPr>
+      </w:pPr>
+      <w:r>
+        <w:t>Features</w:t>
+      </w:r>
+    </w:p>
+    <w:p>
+      <w:pPr>
+        <w:numPr>
+          <w:ilvl w:val="0"/>
+          <w:numId w:val="8"/>
+        </w:numPr>
+        <w:rPr>
+          <w:rFonts w:hint="eastAsia"/>
+        </w:rPr>
+      </w:pPr>
+      <w:r>
+        <w:t xml:space="preserve">Weergave van </w:t>
+      </w:r>
+      <w:proofErr w:type="spellStart"/>
+      <w:r>
+        <w:t>enums</w:t>
+      </w:r>
+      <w:proofErr w:type="spellEnd"/>
+      <w:r>
+        <w:t xml:space="preserve"> in de </w:t>
+      </w:r>
+      <w:proofErr w:type="spellStart"/>
+      <w:r>
+        <w:t>value</w:t>
+      </w:r>
+      <w:proofErr w:type="spellEnd"/>
+      <w:r>
+        <w:t xml:space="preserve"> kolom toegevoegd. </w:t>
+      </w:r>
+    </w:p>
+    <w:p>
+      <w:pPr>
+        <w:pStyle w:val="Kop3"/>
+        <w:rPr>
+          <w:rFonts w:hint="eastAsia"/>
+        </w:rPr>
+      </w:pPr>
+      <w:proofErr w:type="spellStart"/>
+      <w:r>
+        <w:t>Fixes</w:t>
+      </w:r>
+      <w:proofErr w:type="spellEnd"/>
+    </w:p>
+    <w:p>
+      <w:pPr>
+        <w:numPr>
+          <w:ilvl w:val="0"/>
+          <w:numId w:val="8"/>
+        </w:numPr>
+        <w:rPr>
+          <w:rFonts w:hint="eastAsia"/>
+        </w:rPr>
+      </w:pPr>
+      <w:r>
+        <w:t>Menu “</w:t>
+      </w:r>
+      <w:proofErr w:type="spellStart"/>
+      <w:r>
+        <w:t>Edit</w:t>
+      </w:r>
+      <w:proofErr w:type="spellEnd"/>
+      <w:r>
+        <w:t xml:space="preserve"> project file” werkte niet als er een spatie in het </w:t>
+      </w:r>
+      <w:proofErr w:type="spellStart"/>
+      <w:r>
+        <w:t>path</w:t>
+      </w:r>
+      <w:proofErr w:type="spellEnd"/>
+      <w:r>
+        <w:t xml:space="preserve"> was.</w:t>
+      </w:r>
+    </w:p>
+    <w:p>
+      <w:pPr>
+        <w:numPr>
+          <w:ilvl w:val="0"/>
+          <w:numId w:val="8"/>
+        </w:numPr>
+        <w:rPr>
+          <w:rFonts w:hint="eastAsia"/>
+        </w:rPr>
+      </w:pPr>
+      <w:r>
+        <w:t xml:space="preserve">Logger: </w:t>
+      </w:r>
+      <w:proofErr w:type="spellStart"/>
+      <w:r>
+        <w:t>Clear</w:t>
+      </w:r>
+      <w:proofErr w:type="spellEnd"/>
+      <w:r>
+        <w:t xml:space="preserve"> knop wiste aantal logs in de status balk niet.</w:t>
+      </w:r>
+    </w:p>
+    <w:p>
+      <w:pPr>
+        <w:numPr>
+          <w:ilvl w:val="0"/>
+          <w:numId w:val="8"/>
+        </w:numPr>
+        <w:rPr>
+          <w:rFonts w:hint="eastAsia"/>
+        </w:rPr>
+      </w:pPr>
+      <w:proofErr w:type="spellStart"/>
+      <w:r>
+        <w:t>Send</w:t>
+      </w:r>
+      <w:proofErr w:type="spellEnd"/>
+      <w:r>
+        <w:t xml:space="preserve"> </w:t>
+      </w:r>
+      <w:proofErr w:type="spellStart"/>
+      <w:r>
+        <w:t>Custom</w:t>
+      </w:r>
+      <w:proofErr w:type="spellEnd"/>
+      <w:r>
+        <w:t xml:space="preserve"> </w:t>
+      </w:r>
+      <w:proofErr w:type="spellStart"/>
+      <w:r>
+        <w:t>Modbus</w:t>
+      </w:r>
+      <w:proofErr w:type="spellEnd"/>
+      <w:r>
+        <w:t xml:space="preserve"> </w:t>
+      </w:r>
+      <w:proofErr w:type="spellStart"/>
+      <w:r>
+        <w:t>Command</w:t>
+      </w:r>
+      <w:proofErr w:type="spellEnd"/>
+      <w:r>
+        <w:t xml:space="preserve">: laat nu ook tabs en CR/LF toe in de string. Geeft error bij lege </w:t>
+      </w:r>
+      <w:proofErr w:type="spellStart"/>
+      <w:r>
+        <w:t>command</w:t>
+      </w:r>
+      <w:proofErr w:type="spellEnd"/>
+      <w:r>
+        <w:t xml:space="preserve"> string. </w:t>
+      </w:r>
+    </w:p>
+    <w:p>
+      <w:pPr>
+        <w:numPr>
+          <w:ilvl w:val="0"/>
+          <w:numId w:val="8"/>
+        </w:numPr>
+        <w:rPr>
+          <w:rFonts w:hint="eastAsia"/>
+        </w:rPr>
+      </w:pPr>
+      <w:proofErr w:type="spellStart"/>
+      <w:r>
+        <w:t>Send</w:t>
+      </w:r>
+      <w:proofErr w:type="spellEnd"/>
+      <w:r>
+        <w:t xml:space="preserve"> </w:t>
+      </w:r>
+      <w:proofErr w:type="spellStart"/>
+      <w:r>
+        <w:t>Custom</w:t>
+      </w:r>
+      <w:proofErr w:type="spellEnd"/>
+      <w:r>
+        <w:t xml:space="preserve"> </w:t>
+      </w:r>
+      <w:proofErr w:type="spellStart"/>
+      <w:r>
+        <w:t>Modbus</w:t>
+      </w:r>
+      <w:proofErr w:type="spellEnd"/>
+      <w:r>
+        <w:t xml:space="preserve"> </w:t>
+      </w:r>
+      <w:proofErr w:type="spellStart"/>
+      <w:r>
+        <w:t>Command</w:t>
+      </w:r>
+      <w:proofErr w:type="spellEnd"/>
+      <w:r>
+        <w:t xml:space="preserve">: Geeft error bij te kort </w:t>
+      </w:r>
+      <w:proofErr w:type="spellStart"/>
+      <w:r>
+        <w:t>command</w:t>
+      </w:r>
+      <w:proofErr w:type="spellEnd"/>
+      <w:r>
+        <w:t>, moet minstens 2 bytes zijn.</w:t>
+      </w:r>
+    </w:p>
+    <w:p>
+      <w:pPr>
+        <w:numPr>
+          <w:ilvl w:val="0"/>
+          <w:numId w:val="8"/>
+        </w:numPr>
+        <w:rPr>
+          <w:rFonts w:hint="eastAsia"/>
+        </w:rPr>
+      </w:pPr>
+      <w:r>
+        <w:t>Fix backgroundkleur van registers.</w:t>
+      </w:r>
+    </w:p>
+    <w:p>
+      <w:pPr>
+        <w:pStyle w:val="Kop1"/>
+        <w:rPr>
+          <w:rFonts w:hint="eastAsia"/>
+        </w:rPr>
+      </w:pPr>
+      <w:r>
+        <w:lastRenderedPageBreak/>
+        <w:t>v2.0.9 * 2018-10-20</w:t>
+      </w:r>
+    </w:p>
+    <w:p>
+      <w:pPr>
+        <w:pStyle w:val="Kop3"/>
+        <w:rPr>
+          <w:rFonts w:hint="eastAsia"/>
+        </w:rPr>
+      </w:pPr>
+      <w:r>
+        <w:t>Features</w:t>
+      </w:r>
+    </w:p>
+    <w:p>
+      <w:pPr>
+        <w:numPr>
+          <w:ilvl w:val="0"/>
+          <w:numId w:val="9"/>
+        </w:numPr>
+        <w:rPr>
+          <w:rFonts w:hint="eastAsia"/>
+        </w:rPr>
+      </w:pPr>
+      <w:r>
+        <w:t xml:space="preserve">Nieuwe optie: “Move </w:t>
+      </w:r>
+      <w:proofErr w:type="spellStart"/>
+      <w:r>
+        <w:t>to</w:t>
+      </w:r>
+      <w:proofErr w:type="spellEnd"/>
+      <w:r>
+        <w:t xml:space="preserve"> next </w:t>
+      </w:r>
+      <w:proofErr w:type="spellStart"/>
+      <w:r>
+        <w:t>row</w:t>
+      </w:r>
+      <w:proofErr w:type="spellEnd"/>
+      <w:r>
+        <w:t xml:space="preserve"> on Enter”.</w:t>
+      </w:r>
+    </w:p>
+    <w:p>
+      <w:pPr>
+        <w:numPr>
+          <w:ilvl w:val="0"/>
+          <w:numId w:val="9"/>
+        </w:numPr>
+        <w:rPr>
+          <w:rFonts w:hint="eastAsia"/>
+        </w:rPr>
+      </w:pPr>
+      <w:r>
+        <w:t xml:space="preserve">Nieuwe optie: “Auto-start </w:t>
+      </w:r>
+      <w:proofErr w:type="spellStart"/>
+      <w:r>
+        <w:t>edit</w:t>
+      </w:r>
+      <w:proofErr w:type="spellEnd"/>
+      <w:r>
+        <w:t xml:space="preserve"> mode on </w:t>
+      </w:r>
+      <w:proofErr w:type="spellStart"/>
+      <w:r>
+        <w:t>typing</w:t>
+      </w:r>
+      <w:proofErr w:type="spellEnd"/>
+      <w:r>
+        <w:t xml:space="preserve">”. </w:t>
+      </w:r>
+    </w:p>
+    <w:p>
+      <w:pPr>
+        <w:numPr>
+          <w:ilvl w:val="0"/>
+          <w:numId w:val="9"/>
+        </w:numPr>
+        <w:rPr>
+          <w:rFonts w:hint="eastAsia"/>
+        </w:rPr>
+      </w:pPr>
+      <w:r>
+        <w:t>Nieuwe optie: “</w:t>
+      </w:r>
+      <w:proofErr w:type="spellStart"/>
+      <w:r>
+        <w:t>Use</w:t>
+      </w:r>
+      <w:proofErr w:type="spellEnd"/>
+      <w:r>
+        <w:t xml:space="preserve"> </w:t>
+      </w:r>
+      <w:proofErr w:type="spellStart"/>
+      <w:r>
+        <w:t>custom</w:t>
+      </w:r>
+      <w:proofErr w:type="spellEnd"/>
+      <w:r>
+        <w:t xml:space="preserve"> editor”. </w:t>
+      </w:r>
+    </w:p>
+    <w:p>
+      <w:pPr>
+        <w:numPr>
+          <w:ilvl w:val="0"/>
+          <w:numId w:val="9"/>
+        </w:numPr>
+        <w:rPr>
+          <w:rFonts w:hint="eastAsia"/>
+        </w:rPr>
+      </w:pPr>
+      <w:r>
+        <w:t>Nieuwe optie: “</w:t>
+      </w:r>
+      <w:proofErr w:type="spellStart"/>
+      <w:r>
+        <w:t>Ignore</w:t>
+      </w:r>
+      <w:proofErr w:type="spellEnd"/>
+      <w:r>
+        <w:t xml:space="preserve"> form </w:t>
+      </w:r>
+      <w:proofErr w:type="spellStart"/>
+      <w:r>
+        <w:t>size</w:t>
+      </w:r>
+      <w:proofErr w:type="spellEnd"/>
+      <w:r>
+        <w:t xml:space="preserve"> on project </w:t>
+      </w:r>
+      <w:proofErr w:type="spellStart"/>
+      <w:r>
+        <w:t>reload</w:t>
+      </w:r>
+      <w:proofErr w:type="spellEnd"/>
+      <w:r>
+        <w:t>”.</w:t>
+      </w:r>
+    </w:p>
+    <w:p>
+      <w:pPr>
+        <w:numPr>
+          <w:ilvl w:val="0"/>
+          <w:numId w:val="9"/>
+        </w:numPr>
+        <w:rPr>
+          <w:rFonts w:hint="eastAsia"/>
+        </w:rPr>
+      </w:pPr>
+      <w:proofErr w:type="spellStart"/>
+      <w:r>
+        <w:t>Config</w:t>
+      </w:r>
+      <w:proofErr w:type="spellEnd"/>
+      <w:r>
+        <w:t xml:space="preserve"> form heeft nu een </w:t>
+      </w:r>
+      <w:proofErr w:type="spellStart"/>
+      <w:r>
+        <w:t>Apply</w:t>
+      </w:r>
+      <w:proofErr w:type="spellEnd"/>
+      <w:r>
+        <w:t xml:space="preserve"> button.</w:t>
+      </w:r>
+    </w:p>
+    <w:p>
+      <w:pPr>
+        <w:numPr>
+          <w:ilvl w:val="0"/>
+          <w:numId w:val="9"/>
+        </w:numPr>
+        <w:rPr>
+          <w:rFonts w:hint="eastAsia"/>
+        </w:rPr>
+      </w:pPr>
+      <w:r>
+        <w:t xml:space="preserve">Aparte line-copy en </w:t>
+      </w:r>
+      <w:proofErr w:type="spellStart"/>
+      <w:r>
+        <w:t>value</w:t>
+      </w:r>
+      <w:proofErr w:type="spellEnd"/>
+      <w:r>
+        <w:t xml:space="preserve">-copy in </w:t>
+      </w:r>
+      <w:proofErr w:type="spellStart"/>
+      <w:r>
+        <w:t>grid</w:t>
+      </w:r>
+      <w:proofErr w:type="spellEnd"/>
+      <w:r>
+        <w:t>, via control-C en context menu.</w:t>
+      </w:r>
+    </w:p>
+    <w:p>
+      <w:pPr>
+        <w:numPr>
+          <w:ilvl w:val="0"/>
+          <w:numId w:val="9"/>
+        </w:numPr>
+        <w:rPr>
+          <w:rFonts w:hint="eastAsia"/>
+        </w:rPr>
+      </w:pPr>
+      <w:r>
+        <w:t xml:space="preserve">De statusbar wordt nu blauw gekleurd als er geen connectie is of geen </w:t>
+      </w:r>
+      <w:proofErr w:type="spellStart"/>
+      <w:r>
+        <w:t>polling</w:t>
+      </w:r>
+      <w:proofErr w:type="spellEnd"/>
+      <w:r>
+        <w:t xml:space="preserve"> wordt gedaan.</w:t>
+      </w:r>
+    </w:p>
+    <w:p>
+      <w:pPr>
+        <w:numPr>
+          <w:ilvl w:val="0"/>
+          <w:numId w:val="9"/>
+        </w:numPr>
+        <w:rPr>
+          <w:rFonts w:hint="eastAsia"/>
+        </w:rPr>
+      </w:pPr>
+      <w:r>
+        <w:t>De statusbar wordt nu rood gekleurd bij errors.</w:t>
+      </w:r>
+    </w:p>
+    <w:p>
+      <w:pPr>
+        <w:numPr>
+          <w:ilvl w:val="0"/>
+          <w:numId w:val="9"/>
+        </w:numPr>
+        <w:rPr>
+          <w:rFonts w:hint="eastAsia"/>
+        </w:rPr>
+      </w:pPr>
+      <w:r>
+        <w:t xml:space="preserve">Geeft nu een </w:t>
+      </w:r>
+      <w:proofErr w:type="spellStart"/>
+      <w:r>
+        <w:t>warning</w:t>
+      </w:r>
+      <w:proofErr w:type="spellEnd"/>
+      <w:r>
+        <w:t xml:space="preserve"> in de “Save </w:t>
+      </w:r>
+      <w:proofErr w:type="spellStart"/>
+      <w:r>
+        <w:t>configuration</w:t>
+      </w:r>
+      <w:proofErr w:type="spellEnd"/>
+      <w:r>
+        <w:t xml:space="preserve"> </w:t>
+      </w:r>
+      <w:proofErr w:type="spellStart"/>
+      <w:r>
+        <w:t>to</w:t>
+      </w:r>
+      <w:proofErr w:type="spellEnd"/>
+      <w:r>
+        <w:t xml:space="preserve"> project file” en “Project </w:t>
+      </w:r>
+      <w:proofErr w:type="spellStart"/>
+      <w:r>
+        <w:t>configuration</w:t>
+      </w:r>
+      <w:proofErr w:type="spellEnd"/>
+      <w:r>
+        <w:t xml:space="preserve">” schermen als er </w:t>
+      </w:r>
+      <w:proofErr w:type="spellStart"/>
+      <w:r>
+        <w:t>localoverrides</w:t>
+      </w:r>
+      <w:proofErr w:type="spellEnd"/>
+      <w:r>
+        <w:t xml:space="preserve"> gebruikt zijn.</w:t>
+      </w:r>
+    </w:p>
+    <w:p>
+      <w:pPr>
+        <w:pStyle w:val="Kop3"/>
+        <w:rPr>
+          <w:rFonts w:hint="eastAsia"/>
+        </w:rPr>
+      </w:pPr>
+      <w:proofErr w:type="spellStart"/>
+      <w:r>
+        <w:t>Fixes</w:t>
+      </w:r>
+      <w:proofErr w:type="spellEnd"/>
+    </w:p>
+    <w:p>
+      <w:pPr>
+        <w:numPr>
+          <w:ilvl w:val="0"/>
+          <w:numId w:val="10"/>
+        </w:numPr>
+        <w:rPr>
+          <w:rFonts w:hint="eastAsia"/>
+        </w:rPr>
+      </w:pPr>
+      <w:r>
+        <w:t>Geeft een melding als Settings.xml bij het opstarten niet geladen kon worden.</w:t>
+      </w:r>
+    </w:p>
+    <w:p>
+      <w:pPr>
+        <w:numPr>
+          <w:ilvl w:val="0"/>
+          <w:numId w:val="10"/>
+        </w:numPr>
+        <w:rPr>
+          <w:rFonts w:hint="eastAsia"/>
+        </w:rPr>
+      </w:pPr>
+      <w:r>
+        <w:t>Settings.xml schrijven herzien: schrijven update/</w:t>
+      </w:r>
+      <w:proofErr w:type="spellStart"/>
+      <w:r>
+        <w:t>insert</w:t>
+      </w:r>
+      <w:proofErr w:type="spellEnd"/>
+      <w:r>
+        <w:t xml:space="preserve"> nu alle tags in de gelezen file, </w:t>
+      </w:r>
+      <w:proofErr w:type="spellStart"/>
+      <w:r>
+        <w:t>ipv</w:t>
+      </w:r>
+      <w:proofErr w:type="spellEnd"/>
+      <w:r>
+        <w:t xml:space="preserve"> een volledig nieuwe file te schrijven, zodat eventuele nieuwere tags van een nieuwere versie blijven staan.</w:t>
+      </w:r>
+    </w:p>
+    <w:p>
+      <w:pPr>
+        <w:numPr>
+          <w:ilvl w:val="0"/>
+          <w:numId w:val="10"/>
+        </w:numPr>
+        <w:rPr>
+          <w:rFonts w:hint="eastAsia"/>
+        </w:rPr>
+      </w:pPr>
+      <w:r>
+        <w:t xml:space="preserve">Project </w:t>
+      </w:r>
+      <w:proofErr w:type="spellStart"/>
+      <w:r>
+        <w:t>Configuration</w:t>
+      </w:r>
+      <w:proofErr w:type="spellEnd"/>
+      <w:r>
+        <w:t xml:space="preserve">: </w:t>
+      </w:r>
+      <w:proofErr w:type="spellStart"/>
+      <w:r>
+        <w:t>Interframe</w:t>
+      </w:r>
+      <w:proofErr w:type="spellEnd"/>
+      <w:r>
+        <w:t>-delay: toont nu "0 (auto)" bij instelling 0.</w:t>
+      </w:r>
+    </w:p>
+    <w:p>
+      <w:pPr>
+        <w:numPr>
+          <w:ilvl w:val="0"/>
+          <w:numId w:val="10"/>
+        </w:numPr>
+        <w:rPr>
+          <w:rFonts w:hint="eastAsia"/>
+        </w:rPr>
+      </w:pPr>
+      <w:proofErr w:type="spellStart"/>
+      <w:r>
+        <w:t>Local</w:t>
+      </w:r>
+      <w:proofErr w:type="spellEnd"/>
+      <w:r>
+        <w:t xml:space="preserve"> </w:t>
+      </w:r>
+      <w:proofErr w:type="spellStart"/>
+      <w:r>
+        <w:t>override</w:t>
+      </w:r>
+      <w:proofErr w:type="spellEnd"/>
+      <w:r>
+        <w:t xml:space="preserve"> project moet nu geen &lt;modbus&gt; element meer bevatten, is nu optioneel.</w:t>
+      </w:r>
+    </w:p>
+    <w:p>
+      <w:pPr>
+        <w:numPr>
+          <w:ilvl w:val="0"/>
+          <w:numId w:val="10"/>
+        </w:numPr>
+        <w:rPr>
+          <w:rFonts w:hint="eastAsia"/>
+        </w:rPr>
+      </w:pPr>
+      <w:proofErr w:type="spellStart"/>
+      <w:r>
+        <w:t>Dialog</w:t>
+      </w:r>
+      <w:proofErr w:type="spellEnd"/>
+      <w:r>
+        <w:t xml:space="preserve"> </w:t>
+      </w:r>
+      <w:proofErr w:type="spellStart"/>
+      <w:r>
+        <w:t>forms</w:t>
+      </w:r>
+      <w:proofErr w:type="spellEnd"/>
+      <w:r>
+        <w:t xml:space="preserve"> kan je nu sluiten met de Enter toets.</w:t>
+      </w:r>
+    </w:p>
+    <w:p>
+      <w:pPr>
+        <w:numPr>
+          <w:ilvl w:val="0"/>
+          <w:numId w:val="10"/>
+        </w:numPr>
+        <w:rPr>
+          <w:rFonts w:hint="eastAsia"/>
+        </w:rPr>
+      </w:pPr>
+      <w:r>
+        <w:t xml:space="preserve">Een project laden wist nu de checkboxen van de ‘Save </w:t>
+      </w:r>
+      <w:proofErr w:type="spellStart"/>
+      <w:r>
+        <w:t>configuration</w:t>
+      </w:r>
+      <w:proofErr w:type="spellEnd"/>
+      <w:r>
+        <w:t xml:space="preserve"> </w:t>
+      </w:r>
+      <w:proofErr w:type="spellStart"/>
+      <w:r>
+        <w:t>to</w:t>
+      </w:r>
+      <w:proofErr w:type="spellEnd"/>
+      <w:r>
+        <w:t xml:space="preserve"> project file” form.</w:t>
+      </w:r>
+    </w:p>
+    <w:p>
+      <w:pPr>
+        <w:numPr>
+          <w:ilvl w:val="0"/>
+          <w:numId w:val="10"/>
+        </w:numPr>
+        <w:rPr>
+          <w:rFonts w:hint="eastAsia"/>
+        </w:rPr>
+      </w:pPr>
+      <w:r>
+        <w:t xml:space="preserve">Buttons die onderaan op de </w:t>
+      </w:r>
+      <w:proofErr w:type="spellStart"/>
+      <w:r>
+        <w:t>forms</w:t>
+      </w:r>
+      <w:proofErr w:type="spellEnd"/>
+      <w:r>
+        <w:t xml:space="preserve"> staan hebben nu wat meer ruimte onder de button.</w:t>
+      </w:r>
+    </w:p>
+    <w:p>
+      <w:pPr>
+        <w:pStyle w:val="Kop1"/>
+        <w:rPr>
+          <w:rFonts w:hint="eastAsia"/>
+        </w:rPr>
+      </w:pPr>
+      <w:r>
+        <w:t>v2.0.8 * 2018-08-02</w:t>
+      </w:r>
+    </w:p>
+    <w:p>
+      <w:pPr>
+        <w:pStyle w:val="Kop3"/>
+        <w:rPr>
+          <w:rFonts w:hint="eastAsia"/>
+        </w:rPr>
+      </w:pPr>
+      <w:r>
+        <w:t>Features</w:t>
+      </w:r>
+    </w:p>
+    <w:p>
+      <w:pPr>
+        <w:numPr>
+          <w:ilvl w:val="0"/>
+          <w:numId w:val="11"/>
+        </w:numPr>
+        <w:rPr>
+          <w:rFonts w:hint="eastAsia"/>
+        </w:rPr>
+      </w:pPr>
+      <w:r>
+        <w:t xml:space="preserve">Volledige </w:t>
+      </w:r>
+      <w:proofErr w:type="spellStart"/>
+      <w:r>
+        <w:t>rewrite</w:t>
+      </w:r>
+      <w:proofErr w:type="spellEnd"/>
+      <w:r>
+        <w:t>, met menu’s en toolbar.</w:t>
+      </w:r>
+    </w:p>
+    <w:p>
+      <w:pPr>
+        <w:numPr>
+          <w:ilvl w:val="0"/>
+          <w:numId w:val="11"/>
+        </w:numPr>
+        <w:rPr>
+          <w:rFonts w:hint="eastAsia"/>
+        </w:rPr>
+      </w:pPr>
+      <w:r>
+        <w:t xml:space="preserve">Kan project configuratie, bridge </w:t>
       </w:r>
       <w:proofErr w:type="spellStart"/>
       <w:r>
@@ -607,35 +2285,33 @@
       </w:r>
       <w:proofErr w:type="spellEnd"/>
       <w:r>
-        <w:t xml:space="preserve"> gesplitst in user-afhankelijk deel en PC-afhankelijk deel. De oude </w:t>
-      </w:r>
-      <w:proofErr w:type="spellStart"/>
-      <w:r>
-        <w:t>settings</w:t>
-      </w:r>
-      <w:proofErr w:type="spellEnd"/>
-      <w:r>
-        <w:t xml:space="preserve"> worden 1 keer gemigreerd naar de nieuwe </w:t>
-      </w:r>
-      <w:proofErr w:type="spellStart"/>
-      <w:r>
-        <w:t>settings</w:t>
-      </w:r>
-      <w:proofErr w:type="spellEnd"/>
-      <w:r>
-        <w:t xml:space="preserve"> files, dan wordt oude nieuwe </w:t>
-      </w:r>
-      <w:proofErr w:type="spellStart"/>
-      <w:r>
-        <w:t>settings</w:t>
-      </w:r>
-      <w:proofErr w:type="spellEnd"/>
-      <w:r>
-        <w:t xml:space="preserve"> file </w:t>
-      </w:r>
-      <w:proofErr w:type="spellStart"/>
-      <w:r>
-        <w:t>gedelete</w:t>
+        <w:t xml:space="preserve"> en form </w:t>
+      </w:r>
+      <w:proofErr w:type="spellStart"/>
+      <w:r>
+        <w:t>size</w:t>
+      </w:r>
+      <w:proofErr w:type="spellEnd"/>
+      <w:r>
+        <w:t xml:space="preserve"> in mbc file saven. </w:t>
+      </w:r>
+    </w:p>
+    <w:p>
+      <w:pPr>
+        <w:numPr>
+          <w:ilvl w:val="0"/>
+          <w:numId w:val="11"/>
+        </w:numPr>
+        <w:rPr>
+          <w:rFonts w:hint="eastAsia"/>
+        </w:rPr>
+      </w:pPr>
+      <w:r>
+        <w:t>Communicatie pauze en poll-</w:t>
+      </w:r>
+      <w:proofErr w:type="spellStart"/>
+      <w:r>
+        <w:t>once</w:t>
       </w:r>
       <w:proofErr w:type="spellEnd"/>
       <w:r>
@@ -646,1026 +2322,6 @@
       <w:pPr>
         <w:numPr>
           <w:ilvl w:val="0"/>
-          <w:numId w:val="6"/>
-        </w:numPr>
-        <w:rPr>
-          <w:rFonts w:hint="eastAsia"/>
-        </w:rPr>
-      </w:pPr>
-      <w:r>
-        <w:t>LocalOverrides.xml verplaatst van &lt;</w:t>
-      </w:r>
-      <w:proofErr w:type="spellStart"/>
-      <w:r>
-        <w:t>mydocuments</w:t>
-      </w:r>
-      <w:proofErr w:type="spellEnd"/>
-      <w:r>
-        <w:t>&gt;\</w:t>
-      </w:r>
-      <w:proofErr w:type="spellStart"/>
-      <w:r>
-        <w:t>ModbusControl</w:t>
-      </w:r>
-      <w:proofErr w:type="spellEnd"/>
-      <w:r>
-        <w:t xml:space="preserve"> naar %</w:t>
-      </w:r>
-      <w:proofErr w:type="spellStart"/>
-      <w:r>
-        <w:t>AppData</w:t>
-      </w:r>
-      <w:proofErr w:type="spellEnd"/>
-      <w:r>
-        <w:t>%\</w:t>
-      </w:r>
-      <w:proofErr w:type="spellStart"/>
-      <w:r>
-        <w:t>Roaming</w:t>
-      </w:r>
-      <w:proofErr w:type="spellEnd"/>
-      <w:r>
-        <w:t>\E.D.&amp;A\</w:t>
-      </w:r>
-      <w:proofErr w:type="spellStart"/>
-      <w:r>
-        <w:t>ModbusControl</w:t>
-      </w:r>
-      <w:proofErr w:type="spellEnd"/>
-      <w:r>
-        <w:t xml:space="preserve">. Content van oude wordt niet gemigreerd naar nieuwe. Oude wordt </w:t>
-      </w:r>
-      <w:proofErr w:type="spellStart"/>
-      <w:r>
-        <w:t>renamed</w:t>
-      </w:r>
-      <w:proofErr w:type="spellEnd"/>
-      <w:r>
-        <w:t xml:space="preserve"> met '.</w:t>
-      </w:r>
-      <w:proofErr w:type="spellStart"/>
-      <w:r>
-        <w:t>old</w:t>
-      </w:r>
-      <w:proofErr w:type="spellEnd"/>
-      <w:r>
-        <w:t xml:space="preserve">' en naar de locatie van de </w:t>
-      </w:r>
-      <w:r>
-        <w:lastRenderedPageBreak/>
-        <w:t xml:space="preserve">nieuwe gemoved. Als er </w:t>
-      </w:r>
-      <w:proofErr w:type="spellStart"/>
-      <w:r>
-        <w:t>overrides</w:t>
-      </w:r>
-      <w:proofErr w:type="spellEnd"/>
-      <w:r>
-        <w:t xml:space="preserve"> gebruikt werden krijgt de user wel éénmalig een melding hiervan.</w:t>
-      </w:r>
-    </w:p>
-    <w:p>
-      <w:pPr>
-        <w:numPr>
-          <w:ilvl w:val="0"/>
-          <w:numId w:val="6"/>
-        </w:numPr>
-        <w:rPr>
-          <w:rFonts w:hint="eastAsia"/>
-        </w:rPr>
-      </w:pPr>
-      <w:r>
-        <w:t>&lt;user&gt;\</w:t>
-      </w:r>
-      <w:proofErr w:type="spellStart"/>
-      <w:r>
-        <w:t>Documents</w:t>
-      </w:r>
-      <w:proofErr w:type="spellEnd"/>
-      <w:r>
-        <w:t>\</w:t>
-      </w:r>
-      <w:proofErr w:type="spellStart"/>
-      <w:r>
-        <w:t>ModbusControl</w:t>
-      </w:r>
-      <w:proofErr w:type="spellEnd"/>
-      <w:r>
-        <w:t xml:space="preserve"> wordt niet meer gebruikt.</w:t>
-      </w:r>
-    </w:p>
-    <w:p>
-      <w:pPr>
-        <w:pStyle w:val="Kop3"/>
-        <w:rPr>
-          <w:rFonts w:hint="eastAsia"/>
-        </w:rPr>
-      </w:pPr>
-      <w:proofErr w:type="spellStart"/>
-      <w:r>
-        <w:t>Fixes</w:t>
-      </w:r>
-      <w:proofErr w:type="spellEnd"/>
-    </w:p>
-    <w:p>
-      <w:pPr>
-        <w:numPr>
-          <w:ilvl w:val="0"/>
-          <w:numId w:val="7"/>
-        </w:numPr>
-        <w:rPr>
-          <w:rFonts w:hint="eastAsia"/>
-        </w:rPr>
-      </w:pPr>
-      <w:r>
-        <w:t xml:space="preserve">De import/export </w:t>
-      </w:r>
-      <w:proofErr w:type="spellStart"/>
-      <w:r>
-        <w:t>dialogs</w:t>
-      </w:r>
-      <w:proofErr w:type="spellEnd"/>
-      <w:r>
-        <w:t xml:space="preserve"> tonen nu ‘*.CSV’ </w:t>
-      </w:r>
-      <w:proofErr w:type="spellStart"/>
-      <w:r>
-        <w:t>ipv</w:t>
-      </w:r>
-      <w:proofErr w:type="spellEnd"/>
-      <w:r>
-        <w:t xml:space="preserve"> ‘*.</w:t>
-      </w:r>
-      <w:proofErr w:type="spellStart"/>
-      <w:r>
-        <w:t>Csv</w:t>
-      </w:r>
-      <w:proofErr w:type="spellEnd"/>
-      <w:r>
-        <w:t>’.</w:t>
-      </w:r>
-    </w:p>
-    <w:p>
-      <w:pPr>
-        <w:numPr>
-          <w:ilvl w:val="0"/>
-          <w:numId w:val="7"/>
-        </w:numPr>
-        <w:rPr>
-          <w:rFonts w:hint="eastAsia"/>
-        </w:rPr>
-      </w:pPr>
-      <w:proofErr w:type="spellStart"/>
-      <w:r>
-        <w:t>Mbc</w:t>
-      </w:r>
-      <w:proofErr w:type="spellEnd"/>
-      <w:r>
-        <w:t xml:space="preserve"> file wordt nu gesaved zonder BOM (</w:t>
-      </w:r>
-      <w:proofErr w:type="spellStart"/>
-      <w:r>
-        <w:t>unicode</w:t>
-      </w:r>
-      <w:proofErr w:type="spellEnd"/>
-      <w:r>
-        <w:t xml:space="preserve"> byte order mark).</w:t>
-      </w:r>
-    </w:p>
-    <w:p>
-      <w:pPr>
-        <w:numPr>
-          <w:ilvl w:val="0"/>
-          <w:numId w:val="7"/>
-        </w:numPr>
-        <w:rPr>
-          <w:rFonts w:hint="eastAsia"/>
-        </w:rPr>
-      </w:pPr>
-      <w:r>
-        <w:t>Betere verwerking als een andere user of niet-</w:t>
-      </w:r>
-      <w:proofErr w:type="spellStart"/>
-      <w:r>
-        <w:t>admin</w:t>
-      </w:r>
-      <w:proofErr w:type="spellEnd"/>
-      <w:r>
-        <w:t xml:space="preserve"> user op de PC inlogt en </w:t>
-      </w:r>
-      <w:proofErr w:type="spellStart"/>
-      <w:r>
-        <w:t>ModbusControl</w:t>
-      </w:r>
-      <w:proofErr w:type="spellEnd"/>
-      <w:r>
-        <w:t xml:space="preserve"> gebruikt.</w:t>
-      </w:r>
-    </w:p>
-    <w:p>
-      <w:pPr>
-        <w:pStyle w:val="Kop1"/>
-        <w:rPr>
-          <w:rFonts w:hint="eastAsia"/>
-        </w:rPr>
-      </w:pPr>
-      <w:r>
-        <w:t>v2.0.11 * 2019-11-18</w:t>
-      </w:r>
-    </w:p>
-    <w:p>
-      <w:pPr>
-        <w:pStyle w:val="Kop3"/>
-        <w:rPr>
-          <w:rFonts w:hint="eastAsia"/>
-        </w:rPr>
-      </w:pPr>
-      <w:proofErr w:type="spellStart"/>
-      <w:r>
-        <w:t>Fixes</w:t>
-      </w:r>
-      <w:proofErr w:type="spellEnd"/>
-    </w:p>
-    <w:p>
-      <w:pPr>
-        <w:numPr>
-          <w:ilvl w:val="0"/>
-          <w:numId w:val="8"/>
-        </w:numPr>
-        <w:rPr>
-          <w:rFonts w:hint="eastAsia"/>
-        </w:rPr>
-      </w:pPr>
-      <w:r>
-        <w:t>Betere afhandeling als de USB/</w:t>
-      </w:r>
-      <w:proofErr w:type="spellStart"/>
-      <w:r>
-        <w:t>serial</w:t>
-      </w:r>
-      <w:proofErr w:type="spellEnd"/>
-      <w:r>
-        <w:t xml:space="preserve"> connectie verbroken wordt. Vroeger ging het CPU-verbruik dan naar maximum en reageerde het programma niet goed meer.</w:t>
-      </w:r>
-    </w:p>
-    <w:p>
-      <w:pPr>
-        <w:pStyle w:val="Kop1"/>
-        <w:rPr>
-          <w:rFonts w:hint="eastAsia"/>
-        </w:rPr>
-      </w:pPr>
-      <w:r>
-        <w:t>v2.0.10 * 2019-03-11</w:t>
-      </w:r>
-    </w:p>
-    <w:p>
-      <w:pPr>
-        <w:pStyle w:val="Kop3"/>
-        <w:rPr>
-          <w:rFonts w:hint="eastAsia"/>
-        </w:rPr>
-      </w:pPr>
-      <w:r>
-        <w:t>Features</w:t>
-      </w:r>
-    </w:p>
-    <w:p>
-      <w:pPr>
-        <w:numPr>
-          <w:ilvl w:val="0"/>
-          <w:numId w:val="8"/>
-        </w:numPr>
-        <w:rPr>
-          <w:rFonts w:hint="eastAsia"/>
-        </w:rPr>
-      </w:pPr>
-      <w:r>
-        <w:t xml:space="preserve">Weergave van </w:t>
-      </w:r>
-      <w:proofErr w:type="spellStart"/>
-      <w:r>
-        <w:t>enums</w:t>
-      </w:r>
-      <w:proofErr w:type="spellEnd"/>
-      <w:r>
-        <w:t xml:space="preserve"> in de </w:t>
-      </w:r>
-      <w:proofErr w:type="spellStart"/>
-      <w:r>
-        <w:t>value</w:t>
-      </w:r>
-      <w:proofErr w:type="spellEnd"/>
-      <w:r>
-        <w:t xml:space="preserve"> kolom toegevoegd. </w:t>
-      </w:r>
-    </w:p>
-    <w:p>
-      <w:pPr>
-        <w:pStyle w:val="Kop3"/>
-        <w:rPr>
-          <w:rFonts w:hint="eastAsia"/>
-        </w:rPr>
-      </w:pPr>
-      <w:proofErr w:type="spellStart"/>
-      <w:r>
-        <w:t>Fixes</w:t>
-      </w:r>
-      <w:proofErr w:type="spellEnd"/>
-    </w:p>
-    <w:p>
-      <w:pPr>
-        <w:numPr>
-          <w:ilvl w:val="0"/>
-          <w:numId w:val="8"/>
-        </w:numPr>
-        <w:rPr>
-          <w:rFonts w:hint="eastAsia"/>
-        </w:rPr>
-      </w:pPr>
-      <w:r>
-        <w:t>Menu “</w:t>
-      </w:r>
-      <w:proofErr w:type="spellStart"/>
-      <w:r>
-        <w:t>Edit</w:t>
-      </w:r>
-      <w:proofErr w:type="spellEnd"/>
-      <w:r>
-        <w:t xml:space="preserve"> project file” werkte niet als er een spatie in het </w:t>
-      </w:r>
-      <w:proofErr w:type="spellStart"/>
-      <w:r>
-        <w:t>path</w:t>
-      </w:r>
-      <w:proofErr w:type="spellEnd"/>
-      <w:r>
-        <w:t xml:space="preserve"> was.</w:t>
-      </w:r>
-    </w:p>
-    <w:p>
-      <w:pPr>
-        <w:numPr>
-          <w:ilvl w:val="0"/>
-          <w:numId w:val="8"/>
-        </w:numPr>
-        <w:rPr>
-          <w:rFonts w:hint="eastAsia"/>
-        </w:rPr>
-      </w:pPr>
-      <w:r>
-        <w:t xml:space="preserve">Logger: </w:t>
-      </w:r>
-      <w:proofErr w:type="spellStart"/>
-      <w:r>
-        <w:t>Clear</w:t>
-      </w:r>
-      <w:proofErr w:type="spellEnd"/>
-      <w:r>
-        <w:t xml:space="preserve"> knop wiste aantal logs in de status balk niet.</w:t>
-      </w:r>
-    </w:p>
-    <w:p>
-      <w:pPr>
-        <w:numPr>
-          <w:ilvl w:val="0"/>
-          <w:numId w:val="8"/>
-        </w:numPr>
-        <w:rPr>
-          <w:rFonts w:hint="eastAsia"/>
-        </w:rPr>
-      </w:pPr>
-      <w:proofErr w:type="spellStart"/>
-      <w:r>
-        <w:t>Send</w:t>
-      </w:r>
-      <w:proofErr w:type="spellEnd"/>
-      <w:r>
-        <w:t xml:space="preserve"> </w:t>
-      </w:r>
-      <w:proofErr w:type="spellStart"/>
-      <w:r>
-        <w:t>Custom</w:t>
-      </w:r>
-      <w:proofErr w:type="spellEnd"/>
-      <w:r>
-        <w:t xml:space="preserve"> </w:t>
-      </w:r>
-      <w:proofErr w:type="spellStart"/>
-      <w:r>
-        <w:t>Modbus</w:t>
-      </w:r>
-      <w:proofErr w:type="spellEnd"/>
-      <w:r>
-        <w:t xml:space="preserve"> </w:t>
-      </w:r>
-      <w:proofErr w:type="spellStart"/>
-      <w:r>
-        <w:t>Command</w:t>
-      </w:r>
-      <w:proofErr w:type="spellEnd"/>
-      <w:r>
-        <w:t xml:space="preserve">: laat nu ook tabs en CR/LF toe in de string. Geeft error bij lege </w:t>
-      </w:r>
-      <w:proofErr w:type="spellStart"/>
-      <w:r>
-        <w:t>command</w:t>
-      </w:r>
-      <w:proofErr w:type="spellEnd"/>
-      <w:r>
-        <w:t xml:space="preserve"> string. </w:t>
-      </w:r>
-    </w:p>
-    <w:p>
-      <w:pPr>
-        <w:numPr>
-          <w:ilvl w:val="0"/>
-          <w:numId w:val="8"/>
-        </w:numPr>
-        <w:rPr>
-          <w:rFonts w:hint="eastAsia"/>
-        </w:rPr>
-      </w:pPr>
-      <w:proofErr w:type="spellStart"/>
-      <w:r>
-        <w:t>Send</w:t>
-      </w:r>
-      <w:proofErr w:type="spellEnd"/>
-      <w:r>
-        <w:t xml:space="preserve"> </w:t>
-      </w:r>
-      <w:proofErr w:type="spellStart"/>
-      <w:r>
-        <w:t>Custom</w:t>
-      </w:r>
-      <w:proofErr w:type="spellEnd"/>
-      <w:r>
-        <w:t xml:space="preserve"> </w:t>
-      </w:r>
-      <w:proofErr w:type="spellStart"/>
-      <w:r>
-        <w:t>Modbus</w:t>
-      </w:r>
-      <w:proofErr w:type="spellEnd"/>
-      <w:r>
-        <w:t xml:space="preserve"> </w:t>
-      </w:r>
-      <w:proofErr w:type="spellStart"/>
-      <w:r>
-        <w:t>Command</w:t>
-      </w:r>
-      <w:proofErr w:type="spellEnd"/>
-      <w:r>
-        <w:t xml:space="preserve">: Geeft error bij te kort </w:t>
-      </w:r>
-      <w:proofErr w:type="spellStart"/>
-      <w:r>
-        <w:t>command</w:t>
-      </w:r>
-      <w:proofErr w:type="spellEnd"/>
-      <w:r>
-        <w:t>, moet minstens 2 bytes zijn.</w:t>
-      </w:r>
-    </w:p>
-    <w:p>
-      <w:pPr>
-        <w:numPr>
-          <w:ilvl w:val="0"/>
-          <w:numId w:val="8"/>
-        </w:numPr>
-        <w:rPr>
-          <w:rFonts w:hint="eastAsia"/>
-        </w:rPr>
-      </w:pPr>
-      <w:r>
-        <w:t>Fix backgroundkleur van registers.</w:t>
-      </w:r>
-    </w:p>
-    <w:p>
-      <w:pPr>
-        <w:pStyle w:val="Kop1"/>
-        <w:rPr>
-          <w:rFonts w:hint="eastAsia"/>
-        </w:rPr>
-      </w:pPr>
-      <w:r>
-        <w:t>v2.0.9 * 2018-10-20</w:t>
-      </w:r>
-    </w:p>
-    <w:p>
-      <w:pPr>
-        <w:pStyle w:val="Kop3"/>
-        <w:rPr>
-          <w:rFonts w:hint="eastAsia"/>
-        </w:rPr>
-      </w:pPr>
-      <w:r>
-        <w:t>Features</w:t>
-      </w:r>
-    </w:p>
-    <w:p>
-      <w:pPr>
-        <w:numPr>
-          <w:ilvl w:val="0"/>
-          <w:numId w:val="9"/>
-        </w:numPr>
-        <w:rPr>
-          <w:rFonts w:hint="eastAsia"/>
-        </w:rPr>
-      </w:pPr>
-      <w:r>
-        <w:t xml:space="preserve">Nieuwe optie: “Move </w:t>
-      </w:r>
-      <w:proofErr w:type="spellStart"/>
-      <w:r>
-        <w:t>to</w:t>
-      </w:r>
-      <w:proofErr w:type="spellEnd"/>
-      <w:r>
-        <w:t xml:space="preserve"> next </w:t>
-      </w:r>
-      <w:proofErr w:type="spellStart"/>
-      <w:r>
-        <w:t>row</w:t>
-      </w:r>
-      <w:proofErr w:type="spellEnd"/>
-      <w:r>
-        <w:t xml:space="preserve"> on Enter”.</w:t>
-      </w:r>
-    </w:p>
-    <w:p>
-      <w:pPr>
-        <w:numPr>
-          <w:ilvl w:val="0"/>
-          <w:numId w:val="9"/>
-        </w:numPr>
-        <w:rPr>
-          <w:rFonts w:hint="eastAsia"/>
-        </w:rPr>
-      </w:pPr>
-      <w:r>
-        <w:t xml:space="preserve">Nieuwe optie: “Auto-start </w:t>
-      </w:r>
-      <w:proofErr w:type="spellStart"/>
-      <w:r>
-        <w:t>edit</w:t>
-      </w:r>
-      <w:proofErr w:type="spellEnd"/>
-      <w:r>
-        <w:t xml:space="preserve"> mode on </w:t>
-      </w:r>
-      <w:proofErr w:type="spellStart"/>
-      <w:r>
-        <w:t>typing</w:t>
-      </w:r>
-      <w:proofErr w:type="spellEnd"/>
-      <w:r>
-        <w:t xml:space="preserve">”. </w:t>
-      </w:r>
-    </w:p>
-    <w:p>
-      <w:pPr>
-        <w:numPr>
-          <w:ilvl w:val="0"/>
-          <w:numId w:val="9"/>
-        </w:numPr>
-        <w:rPr>
-          <w:rFonts w:hint="eastAsia"/>
-        </w:rPr>
-      </w:pPr>
-      <w:r>
-        <w:t>Nieuwe optie: “</w:t>
-      </w:r>
-      <w:proofErr w:type="spellStart"/>
-      <w:r>
-        <w:t>Use</w:t>
-      </w:r>
-      <w:proofErr w:type="spellEnd"/>
-      <w:r>
-        <w:t xml:space="preserve"> </w:t>
-      </w:r>
-      <w:proofErr w:type="spellStart"/>
-      <w:r>
-        <w:t>custom</w:t>
-      </w:r>
-      <w:proofErr w:type="spellEnd"/>
-      <w:r>
-        <w:t xml:space="preserve"> editor”. </w:t>
-      </w:r>
-    </w:p>
-    <w:p>
-      <w:pPr>
-        <w:numPr>
-          <w:ilvl w:val="0"/>
-          <w:numId w:val="9"/>
-        </w:numPr>
-        <w:rPr>
-          <w:rFonts w:hint="eastAsia"/>
-        </w:rPr>
-      </w:pPr>
-      <w:r>
-        <w:t>Nieuwe optie: “</w:t>
-      </w:r>
-      <w:proofErr w:type="spellStart"/>
-      <w:r>
-        <w:t>Ignore</w:t>
-      </w:r>
-      <w:proofErr w:type="spellEnd"/>
-      <w:r>
-        <w:t xml:space="preserve"> form </w:t>
-      </w:r>
-      <w:proofErr w:type="spellStart"/>
-      <w:r>
-        <w:t>size</w:t>
-      </w:r>
-      <w:proofErr w:type="spellEnd"/>
-      <w:r>
-        <w:t xml:space="preserve"> on project </w:t>
-      </w:r>
-      <w:proofErr w:type="spellStart"/>
-      <w:r>
-        <w:t>reload</w:t>
-      </w:r>
-      <w:proofErr w:type="spellEnd"/>
-      <w:r>
-        <w:t>”.</w:t>
-      </w:r>
-    </w:p>
-    <w:p>
-      <w:pPr>
-        <w:numPr>
-          <w:ilvl w:val="0"/>
-          <w:numId w:val="9"/>
-        </w:numPr>
-        <w:rPr>
-          <w:rFonts w:hint="eastAsia"/>
-        </w:rPr>
-      </w:pPr>
-      <w:proofErr w:type="spellStart"/>
-      <w:r>
-        <w:t>Config</w:t>
-      </w:r>
-      <w:proofErr w:type="spellEnd"/>
-      <w:r>
-        <w:t xml:space="preserve"> form heeft nu een </w:t>
-      </w:r>
-      <w:proofErr w:type="spellStart"/>
-      <w:r>
-        <w:t>Apply</w:t>
-      </w:r>
-      <w:proofErr w:type="spellEnd"/>
-      <w:r>
-        <w:t xml:space="preserve"> button.</w:t>
-      </w:r>
-    </w:p>
-    <w:p>
-      <w:pPr>
-        <w:numPr>
-          <w:ilvl w:val="0"/>
-          <w:numId w:val="9"/>
-        </w:numPr>
-        <w:rPr>
-          <w:rFonts w:hint="eastAsia"/>
-        </w:rPr>
-      </w:pPr>
-      <w:r>
-        <w:t xml:space="preserve">Aparte line-copy en </w:t>
-      </w:r>
-      <w:proofErr w:type="spellStart"/>
-      <w:r>
-        <w:t>value</w:t>
-      </w:r>
-      <w:proofErr w:type="spellEnd"/>
-      <w:r>
-        <w:t xml:space="preserve">-copy in </w:t>
-      </w:r>
-      <w:proofErr w:type="spellStart"/>
-      <w:r>
-        <w:t>grid</w:t>
-      </w:r>
-      <w:proofErr w:type="spellEnd"/>
-      <w:r>
-        <w:t>, via control-C en context menu.</w:t>
-      </w:r>
-    </w:p>
-    <w:p>
-      <w:pPr>
-        <w:numPr>
-          <w:ilvl w:val="0"/>
-          <w:numId w:val="9"/>
-        </w:numPr>
-        <w:rPr>
-          <w:rFonts w:hint="eastAsia"/>
-        </w:rPr>
-      </w:pPr>
-      <w:r>
-        <w:t xml:space="preserve">De statusbar wordt nu blauw gekleurd als er geen connectie is of geen </w:t>
-      </w:r>
-      <w:proofErr w:type="spellStart"/>
-      <w:r>
-        <w:t>polling</w:t>
-      </w:r>
-      <w:proofErr w:type="spellEnd"/>
-      <w:r>
-        <w:t xml:space="preserve"> wordt gedaan.</w:t>
-      </w:r>
-    </w:p>
-    <w:p>
-      <w:pPr>
-        <w:numPr>
-          <w:ilvl w:val="0"/>
-          <w:numId w:val="9"/>
-        </w:numPr>
-        <w:rPr>
-          <w:rFonts w:hint="eastAsia"/>
-        </w:rPr>
-      </w:pPr>
-      <w:r>
-        <w:t>De statusbar wordt nu rood gekleurd bij errors.</w:t>
-      </w:r>
-    </w:p>
-    <w:p>
-      <w:pPr>
-        <w:numPr>
-          <w:ilvl w:val="0"/>
-          <w:numId w:val="9"/>
-        </w:numPr>
-        <w:rPr>
-          <w:rFonts w:hint="eastAsia"/>
-        </w:rPr>
-      </w:pPr>
-      <w:r>
-        <w:t xml:space="preserve">Geeft nu een </w:t>
-      </w:r>
-      <w:proofErr w:type="spellStart"/>
-      <w:r>
-        <w:t>warning</w:t>
-      </w:r>
-      <w:proofErr w:type="spellEnd"/>
-      <w:r>
-        <w:t xml:space="preserve"> in de “Save </w:t>
-      </w:r>
-      <w:proofErr w:type="spellStart"/>
-      <w:r>
-        <w:t>configuration</w:t>
-      </w:r>
-      <w:proofErr w:type="spellEnd"/>
-      <w:r>
-        <w:t xml:space="preserve"> </w:t>
-      </w:r>
-      <w:proofErr w:type="spellStart"/>
-      <w:r>
-        <w:t>to</w:t>
-      </w:r>
-      <w:proofErr w:type="spellEnd"/>
-      <w:r>
-        <w:t xml:space="preserve"> project file” en “Project </w:t>
-      </w:r>
-      <w:proofErr w:type="spellStart"/>
-      <w:r>
-        <w:t>configuration</w:t>
-      </w:r>
-      <w:proofErr w:type="spellEnd"/>
-      <w:r>
-        <w:t xml:space="preserve">” schermen als er </w:t>
-      </w:r>
-      <w:proofErr w:type="spellStart"/>
-      <w:r>
-        <w:t>localoverrides</w:t>
-      </w:r>
-      <w:proofErr w:type="spellEnd"/>
-      <w:r>
-        <w:t xml:space="preserve"> gebruikt zijn.</w:t>
-      </w:r>
-    </w:p>
-    <w:p>
-      <w:pPr>
-        <w:pStyle w:val="Kop3"/>
-        <w:rPr>
-          <w:rFonts w:hint="eastAsia"/>
-        </w:rPr>
-      </w:pPr>
-      <w:proofErr w:type="spellStart"/>
-      <w:r>
-        <w:t>Fixes</w:t>
-      </w:r>
-      <w:proofErr w:type="spellEnd"/>
-    </w:p>
-    <w:p>
-      <w:pPr>
-        <w:numPr>
-          <w:ilvl w:val="0"/>
-          <w:numId w:val="10"/>
-        </w:numPr>
-        <w:rPr>
-          <w:rFonts w:hint="eastAsia"/>
-        </w:rPr>
-      </w:pPr>
-      <w:r>
-        <w:t>Geeft een melding als Settings.xml bij het opstarten niet geladen kon worden.</w:t>
-      </w:r>
-    </w:p>
-    <w:p>
-      <w:pPr>
-        <w:numPr>
-          <w:ilvl w:val="0"/>
-          <w:numId w:val="10"/>
-        </w:numPr>
-        <w:rPr>
-          <w:rFonts w:hint="eastAsia"/>
-        </w:rPr>
-      </w:pPr>
-      <w:r>
-        <w:t>Settings.xml schrijven herzien: schrijven update/</w:t>
-      </w:r>
-      <w:proofErr w:type="spellStart"/>
-      <w:r>
-        <w:t>insert</w:t>
-      </w:r>
-      <w:proofErr w:type="spellEnd"/>
-      <w:r>
-        <w:t xml:space="preserve"> nu alle tags in de gelezen file, </w:t>
-      </w:r>
-      <w:proofErr w:type="spellStart"/>
-      <w:r>
-        <w:t>ipv</w:t>
-      </w:r>
-      <w:proofErr w:type="spellEnd"/>
-      <w:r>
-        <w:t xml:space="preserve"> een volledig nieuwe file te schrijven, zodat eventuele nieuwere tags van een nieuwere versie blijven staan.</w:t>
-      </w:r>
-    </w:p>
-    <w:p>
-      <w:pPr>
-        <w:numPr>
-          <w:ilvl w:val="0"/>
-          <w:numId w:val="10"/>
-        </w:numPr>
-        <w:rPr>
-          <w:rFonts w:hint="eastAsia"/>
-        </w:rPr>
-      </w:pPr>
-      <w:r>
-        <w:t xml:space="preserve">Project </w:t>
-      </w:r>
-      <w:proofErr w:type="spellStart"/>
-      <w:r>
-        <w:t>Configuration</w:t>
-      </w:r>
-      <w:proofErr w:type="spellEnd"/>
-      <w:r>
-        <w:t xml:space="preserve">: </w:t>
-      </w:r>
-      <w:proofErr w:type="spellStart"/>
-      <w:r>
-        <w:t>Interframe</w:t>
-      </w:r>
-      <w:proofErr w:type="spellEnd"/>
-      <w:r>
-        <w:t>-delay: toont nu "0 (auto)" bij instelling 0.</w:t>
-      </w:r>
-    </w:p>
-    <w:p>
-      <w:pPr>
-        <w:numPr>
-          <w:ilvl w:val="0"/>
-          <w:numId w:val="10"/>
-        </w:numPr>
-        <w:rPr>
-          <w:rFonts w:hint="eastAsia"/>
-        </w:rPr>
-      </w:pPr>
-      <w:proofErr w:type="spellStart"/>
-      <w:r>
-        <w:t>Local</w:t>
-      </w:r>
-      <w:proofErr w:type="spellEnd"/>
-      <w:r>
-        <w:t xml:space="preserve"> </w:t>
-      </w:r>
-      <w:proofErr w:type="spellStart"/>
-      <w:r>
-        <w:t>override</w:t>
-      </w:r>
-      <w:proofErr w:type="spellEnd"/>
-      <w:r>
-        <w:t xml:space="preserve"> project moet nu geen &lt;</w:t>
-      </w:r>
-      <w:proofErr w:type="spellStart"/>
-      <w:r>
-        <w:t>modbus</w:t>
-      </w:r>
-      <w:proofErr w:type="spellEnd"/>
-      <w:r>
-        <w:t>&gt; element meer bevatten, is nu optioneel.</w:t>
-      </w:r>
-    </w:p>
-    <w:p>
-      <w:pPr>
-        <w:numPr>
-          <w:ilvl w:val="0"/>
-          <w:numId w:val="10"/>
-        </w:numPr>
-        <w:rPr>
-          <w:rFonts w:hint="eastAsia"/>
-        </w:rPr>
-      </w:pPr>
-      <w:proofErr w:type="spellStart"/>
-      <w:r>
-        <w:t>Dialog</w:t>
-      </w:r>
-      <w:proofErr w:type="spellEnd"/>
-      <w:r>
-        <w:t xml:space="preserve"> </w:t>
-      </w:r>
-      <w:proofErr w:type="spellStart"/>
-      <w:r>
-        <w:t>forms</w:t>
-      </w:r>
-      <w:proofErr w:type="spellEnd"/>
-      <w:r>
-        <w:t xml:space="preserve"> kan je nu sluiten met de Enter toets.</w:t>
-      </w:r>
-    </w:p>
-    <w:p>
-      <w:pPr>
-        <w:numPr>
-          <w:ilvl w:val="0"/>
-          <w:numId w:val="10"/>
-        </w:numPr>
-        <w:rPr>
-          <w:rFonts w:hint="eastAsia"/>
-        </w:rPr>
-      </w:pPr>
-      <w:r>
-        <w:lastRenderedPageBreak/>
-        <w:t xml:space="preserve">Een project laden wist nu de checkboxen van de ‘Save </w:t>
-      </w:r>
-      <w:proofErr w:type="spellStart"/>
-      <w:r>
-        <w:t>configuration</w:t>
-      </w:r>
-      <w:proofErr w:type="spellEnd"/>
-      <w:r>
-        <w:t xml:space="preserve"> </w:t>
-      </w:r>
-      <w:proofErr w:type="spellStart"/>
-      <w:r>
-        <w:t>to</w:t>
-      </w:r>
-      <w:proofErr w:type="spellEnd"/>
-      <w:r>
-        <w:t xml:space="preserve"> project file” form.</w:t>
-      </w:r>
-    </w:p>
-    <w:p>
-      <w:pPr>
-        <w:numPr>
-          <w:ilvl w:val="0"/>
-          <w:numId w:val="10"/>
-        </w:numPr>
-        <w:rPr>
-          <w:rFonts w:hint="eastAsia"/>
-        </w:rPr>
-      </w:pPr>
-      <w:r>
-        <w:t xml:space="preserve">Buttons die onderaan op de </w:t>
-      </w:r>
-      <w:proofErr w:type="spellStart"/>
-      <w:r>
-        <w:t>forms</w:t>
-      </w:r>
-      <w:proofErr w:type="spellEnd"/>
-      <w:r>
-        <w:t xml:space="preserve"> staan hebben nu wat meer ruimte onder de button.</w:t>
-      </w:r>
-    </w:p>
-    <w:p>
-      <w:pPr>
-        <w:pStyle w:val="Kop1"/>
-        <w:rPr>
-          <w:rFonts w:hint="eastAsia"/>
-        </w:rPr>
-      </w:pPr>
-      <w:r>
-        <w:t>v2.0.8 * 2018-08-02</w:t>
-      </w:r>
-    </w:p>
-    <w:p>
-      <w:pPr>
-        <w:pStyle w:val="Kop3"/>
-        <w:rPr>
-          <w:rFonts w:hint="eastAsia"/>
-        </w:rPr>
-      </w:pPr>
-      <w:r>
-        <w:t>Features</w:t>
-      </w:r>
-    </w:p>
-    <w:p>
-      <w:pPr>
-        <w:numPr>
-          <w:ilvl w:val="0"/>
           <w:numId w:val="11"/>
         </w:numPr>
         <w:rPr>
@@ -1673,15 +2329,7 @@
         </w:rPr>
       </w:pPr>
       <w:r>
-        <w:t xml:space="preserve">Volledige </w:t>
-      </w:r>
-      <w:proofErr w:type="spellStart"/>
-      <w:r>
-        <w:t>rewrite</w:t>
-      </w:r>
-      <w:proofErr w:type="spellEnd"/>
-      <w:r>
-        <w:t>, met menu’s en toolbar.</w:t>
+        <w:t>Je kan nu de connectieparameters wijzigen zonder de poort te moeten sluiten en heropenen.</w:t>
       </w:r>
     </w:p>
     <w:p>
@@ -1695,31 +2343,7 @@
         </w:rPr>
       </w:pPr>
       <w:r>
-        <w:t xml:space="preserve">Kan project configuratie, bridge </w:t>
-      </w:r>
-      <w:proofErr w:type="spellStart"/>
-      <w:r>
-        <w:t>settings</w:t>
-      </w:r>
-      <w:proofErr w:type="spellEnd"/>
-      <w:r>
-        <w:t xml:space="preserve"> en form </w:t>
-      </w:r>
-      <w:proofErr w:type="spellStart"/>
-      <w:r>
-        <w:t>size</w:t>
-      </w:r>
-      <w:proofErr w:type="spellEnd"/>
-      <w:r>
-        <w:t xml:space="preserve"> in </w:t>
-      </w:r>
-      <w:proofErr w:type="spellStart"/>
-      <w:r>
-        <w:t>mbc</w:t>
-      </w:r>
-      <w:proofErr w:type="spellEnd"/>
-      <w:r>
-        <w:t xml:space="preserve"> file saven. </w:t>
+        <w:t>Als bij start de seriële poort niet beschikbaar is kan je ineens een andere kiezen.</w:t>
       </w:r>
     </w:p>
     <w:p>
@@ -1733,15 +2357,23 @@
         </w:rPr>
       </w:pPr>
       <w:r>
-        <w:t>Communicatie pauze en poll-</w:t>
-      </w:r>
-      <w:proofErr w:type="spellStart"/>
-      <w:r>
-        <w:t>once</w:t>
-      </w:r>
-      <w:proofErr w:type="spellEnd"/>
-      <w:r>
-        <w:t>.</w:t>
+        <w:t xml:space="preserve">mbc project file: XML tags nu bij voorkeur in </w:t>
+      </w:r>
+      <w:proofErr w:type="spellStart"/>
+      <w:r>
+        <w:t>lowercase</w:t>
+      </w:r>
+      <w:proofErr w:type="spellEnd"/>
+      <w:r>
+        <w:t xml:space="preserve">. De oude </w:t>
+      </w:r>
+      <w:proofErr w:type="spellStart"/>
+      <w:r>
+        <w:t>camelcase</w:t>
+      </w:r>
+      <w:proofErr w:type="spellEnd"/>
+      <w:r>
+        <w:t xml:space="preserve"> wordt ook nog aanvaard. Bij errors in mbc file wordt altijd lijnnummer getoond. </w:t>
       </w:r>
     </w:p>
     <w:p>
@@ -1754,8 +2386,13 @@
           <w:rFonts w:hint="eastAsia"/>
         </w:rPr>
       </w:pPr>
-      <w:r>
-        <w:t>Je kan nu de connectieparameters wijzigen zonder de poort te moeten sluiten en heropenen.</w:t>
+      <w:proofErr w:type="spellStart"/>
+      <w:r>
+        <w:t>Endians</w:t>
+      </w:r>
+      <w:proofErr w:type="spellEnd"/>
+      <w:r>
+        <w:t xml:space="preserve"> apart instelbaar voor int32 en float32. Lettervolgorde instelbaar voor ASCII. </w:t>
       </w:r>
     </w:p>
     <w:p>
@@ -1768,8 +2405,13 @@
           <w:rFonts w:hint="eastAsia"/>
         </w:rPr>
       </w:pPr>
-      <w:r>
-        <w:t>Als bij start de seriële poort niet beschikbaar is kan je ineens een andere kiezen.</w:t>
+      <w:proofErr w:type="spellStart"/>
+      <w:r>
+        <w:t>WriteHoldingregFunctionCode</w:t>
+      </w:r>
+      <w:proofErr w:type="spellEnd"/>
+      <w:r>
+        <w:t xml:space="preserve"> ondersteunt nu ook ‘auto'.</w:t>
       </w:r>
     </w:p>
     <w:p>
@@ -1782,105 +2424,8 @@
           <w:rFonts w:hint="eastAsia"/>
         </w:rPr>
       </w:pPr>
-      <w:proofErr w:type="spellStart"/>
-      <w:r>
-        <w:t>mbc</w:t>
-      </w:r>
-      <w:proofErr w:type="spellEnd"/>
-      <w:r>
-        <w:t xml:space="preserve"> project file: XML tags nu bij voorkeur in </w:t>
-      </w:r>
-      <w:proofErr w:type="spellStart"/>
-      <w:r>
-        <w:t>lowercase</w:t>
-      </w:r>
-      <w:proofErr w:type="spellEnd"/>
-      <w:r>
-        <w:t xml:space="preserve">. De oude </w:t>
-      </w:r>
-      <w:proofErr w:type="spellStart"/>
-      <w:r>
-        <w:t>camelcase</w:t>
-      </w:r>
-      <w:proofErr w:type="spellEnd"/>
-      <w:r>
-        <w:t xml:space="preserve"> wordt ook nog aanvaard. Bij </w:t>
-      </w:r>
-      <w:proofErr w:type="spellStart"/>
-      <w:r>
-        <w:t>errors</w:t>
-      </w:r>
-      <w:proofErr w:type="spellEnd"/>
-      <w:r>
-        <w:t xml:space="preserve"> in </w:t>
-      </w:r>
-      <w:proofErr w:type="spellStart"/>
-      <w:r>
-        <w:t>mbc</w:t>
-      </w:r>
-      <w:proofErr w:type="spellEnd"/>
-      <w:r>
-        <w:t xml:space="preserve"> file wordt altijd lijnnummer getoond. </w:t>
-      </w:r>
-    </w:p>
-    <w:p>
-      <w:pPr>
-        <w:numPr>
-          <w:ilvl w:val="0"/>
-          <w:numId w:val="11"/>
-        </w:numPr>
-        <w:rPr>
-          <w:rFonts w:hint="eastAsia"/>
-        </w:rPr>
-      </w:pPr>
-      <w:proofErr w:type="spellStart"/>
-      <w:r>
-        <w:t>Endians</w:t>
-      </w:r>
-      <w:proofErr w:type="spellEnd"/>
-      <w:r>
-        <w:t xml:space="preserve"> apart instelbaar voor int32 en float32. Lettervolgorde instelbaar voor ASCII. </w:t>
-      </w:r>
-    </w:p>
-    <w:p>
-      <w:pPr>
-        <w:numPr>
-          <w:ilvl w:val="0"/>
-          <w:numId w:val="11"/>
-        </w:numPr>
-        <w:rPr>
-          <w:rFonts w:hint="eastAsia"/>
-        </w:rPr>
-      </w:pPr>
-      <w:proofErr w:type="spellStart"/>
-      <w:r>
-        <w:t>WriteHoldingregFunctionCode</w:t>
-      </w:r>
-      <w:proofErr w:type="spellEnd"/>
-      <w:r>
-        <w:t xml:space="preserve"> ondersteunt nu ook ‘auto'.</w:t>
-      </w:r>
-    </w:p>
-    <w:p>
-      <w:pPr>
-        <w:numPr>
-          <w:ilvl w:val="0"/>
-          <w:numId w:val="11"/>
-        </w:numPr>
-        <w:rPr>
-          <w:rFonts w:hint="eastAsia"/>
-        </w:rPr>
-      </w:pPr>
-      <w:r>
-        <w:t xml:space="preserve">User manual met ook beschrijving van </w:t>
-      </w:r>
-      <w:proofErr w:type="spellStart"/>
-      <w:r>
-        <w:t>mbc</w:t>
-      </w:r>
-      <w:proofErr w:type="spellEnd"/>
-      <w:r>
-        <w:t xml:space="preserve"> file toegevoegd.</w:t>
+      <w:r>
+        <w:t>User manual met ook beschrijving van mbc file toegevoegd.</w:t>
       </w:r>
     </w:p>
     <w:p>
@@ -2795,6 +3340,119 @@
     </w:lvl>
   </w:abstractNum>
   <w:abstractNum w:abstractNumId="6" w15:restartNumberingAfterBreak="0">
+    <w:nsid w:val="16491B67"/>
+    <w:multiLevelType w:val="hybridMultilevel"/>
+    <w:tmpl w:val="DD48BBB0"/>
+    <w:lvl w:ilvl="0" w:tplc="08130001">
+      <w:start w:val="1"/>
+      <w:numFmt w:val="bullet"/>
+      <w:lvlText w:val=""/>
+      <w:lvlJc w:val="left"/>
+      <w:pPr>
+        <w:ind w:left="1040" w:hanging="360"/>
+      </w:pPr>
+      <w:rPr>
+        <w:rFonts w:ascii="Symbol" w:hAnsi="Symbol" w:hint="default"/>
+      </w:rPr>
+    </w:lvl>
+    <w:lvl w:ilvl="1" w:tplc="08130003" w:tentative="1">
+      <w:start w:val="1"/>
+      <w:numFmt w:val="bullet"/>
+      <w:lvlText w:val="o"/>
+      <w:lvlJc w:val="left"/>
+      <w:pPr>
+        <w:ind w:left="1760" w:hanging="360"/>
+      </w:pPr>
+      <w:rPr>
+        <w:rFonts w:ascii="Courier New" w:hAnsi="Courier New" w:cs="Courier New" w:hint="default"/>
+      </w:rPr>
+    </w:lvl>
+    <w:lvl w:ilvl="2" w:tplc="08130005" w:tentative="1">
+      <w:start w:val="1"/>
+      <w:numFmt w:val="bullet"/>
+      <w:lvlText w:val=""/>
+      <w:lvlJc w:val="left"/>
+      <w:pPr>
+        <w:ind w:left="2480" w:hanging="360"/>
+      </w:pPr>
+      <w:rPr>
+        <w:rFonts w:ascii="Wingdings" w:hAnsi="Wingdings" w:hint="default"/>
+      </w:rPr>
+    </w:lvl>
+    <w:lvl w:ilvl="3" w:tplc="08130001" w:tentative="1">
+      <w:start w:val="1"/>
+      <w:numFmt w:val="bullet"/>
+      <w:lvlText w:val=""/>
+      <w:lvlJc w:val="left"/>
+      <w:pPr>
+        <w:ind w:left="3200" w:hanging="360"/>
+      </w:pPr>
+      <w:rPr>
+        <w:rFonts w:ascii="Symbol" w:hAnsi="Symbol" w:hint="default"/>
+      </w:rPr>
+    </w:lvl>
+    <w:lvl w:ilvl="4" w:tplc="08130003" w:tentative="1">
+      <w:start w:val="1"/>
+      <w:numFmt w:val="bullet"/>
+      <w:lvlText w:val="o"/>
+      <w:lvlJc w:val="left"/>
+      <w:pPr>
+        <w:ind w:left="3920" w:hanging="360"/>
+      </w:pPr>
+      <w:rPr>
+        <w:rFonts w:ascii="Courier New" w:hAnsi="Courier New" w:cs="Courier New" w:hint="default"/>
+      </w:rPr>
+    </w:lvl>
+    <w:lvl w:ilvl="5" w:tplc="08130005" w:tentative="1">
+      <w:start w:val="1"/>
+      <w:numFmt w:val="bullet"/>
+      <w:lvlText w:val=""/>
+      <w:lvlJc w:val="left"/>
+      <w:pPr>
+        <w:ind w:left="4640" w:hanging="360"/>
+      </w:pPr>
+      <w:rPr>
+        <w:rFonts w:ascii="Wingdings" w:hAnsi="Wingdings" w:hint="default"/>
+      </w:rPr>
+    </w:lvl>
+    <w:lvl w:ilvl="6" w:tplc="08130001" w:tentative="1">
+      <w:start w:val="1"/>
+      <w:numFmt w:val="bullet"/>
+      <w:lvlText w:val=""/>
+      <w:lvlJc w:val="left"/>
+      <w:pPr>
+        <w:ind w:left="5360" w:hanging="360"/>
+      </w:pPr>
+      <w:rPr>
+        <w:rFonts w:ascii="Symbol" w:hAnsi="Symbol" w:hint="default"/>
+      </w:rPr>
+    </w:lvl>
+    <w:lvl w:ilvl="7" w:tplc="08130003" w:tentative="1">
+      <w:start w:val="1"/>
+      <w:numFmt w:val="bullet"/>
+      <w:lvlText w:val="o"/>
+      <w:lvlJc w:val="left"/>
+      <w:pPr>
+        <w:ind w:left="6080" w:hanging="360"/>
+      </w:pPr>
+      <w:rPr>
+        <w:rFonts w:ascii="Courier New" w:hAnsi="Courier New" w:cs="Courier New" w:hint="default"/>
+      </w:rPr>
+    </w:lvl>
+    <w:lvl w:ilvl="8" w:tplc="08130005" w:tentative="1">
+      <w:start w:val="1"/>
+      <w:numFmt w:val="bullet"/>
+      <w:lvlText w:val=""/>
+      <w:lvlJc w:val="left"/>
+      <w:pPr>
+        <w:ind w:left="6800" w:hanging="360"/>
+      </w:pPr>
+      <w:rPr>
+        <w:rFonts w:ascii="Wingdings" w:hAnsi="Wingdings" w:hint="default"/>
+      </w:rPr>
+    </w:lvl>
+  </w:abstractNum>
+  <w:abstractNum w:abstractNumId="7" w15:restartNumberingAfterBreak="0">
     <w:nsid w:val="19B15B93"/>
     <w:multiLevelType w:val="hybridMultilevel"/>
     <w:tmpl w:val="B21444D0"/>
@@ -2907,7 +3565,7 @@
       </w:rPr>
     </w:lvl>
   </w:abstractNum>
-  <w:abstractNum w:abstractNumId="7" w15:restartNumberingAfterBreak="0">
+  <w:abstractNum w:abstractNumId="8" w15:restartNumberingAfterBreak="0">
     <w:nsid w:val="1C616AFA"/>
     <w:multiLevelType w:val="hybridMultilevel"/>
     <w:tmpl w:val="A814883A"/>
@@ -3020,7 +3678,7 @@
       </w:rPr>
     </w:lvl>
   </w:abstractNum>
-  <w:abstractNum w:abstractNumId="8" w15:restartNumberingAfterBreak="0">
+  <w:abstractNum w:abstractNumId="9" w15:restartNumberingAfterBreak="0">
     <w:nsid w:val="22AE389B"/>
     <w:multiLevelType w:val="hybridMultilevel"/>
     <w:tmpl w:val="A50AEB9C"/>
@@ -3133,7 +3791,120 @@
       </w:rPr>
     </w:lvl>
   </w:abstractNum>
-  <w:abstractNum w:abstractNumId="9" w15:restartNumberingAfterBreak="0">
+  <w:abstractNum w:abstractNumId="10" w15:restartNumberingAfterBreak="0">
+    <w:nsid w:val="24306C67"/>
+    <w:multiLevelType w:val="hybridMultilevel"/>
+    <w:tmpl w:val="FEC69C5A"/>
+    <w:lvl w:ilvl="0" w:tplc="08130001">
+      <w:start w:val="1"/>
+      <w:numFmt w:val="bullet"/>
+      <w:lvlText w:val=""/>
+      <w:lvlJc w:val="left"/>
+      <w:pPr>
+        <w:ind w:left="720" w:hanging="360"/>
+      </w:pPr>
+      <w:rPr>
+        <w:rFonts w:ascii="Symbol" w:hAnsi="Symbol" w:hint="default"/>
+      </w:rPr>
+    </w:lvl>
+    <w:lvl w:ilvl="1" w:tplc="08130003" w:tentative="1">
+      <w:start w:val="1"/>
+      <w:numFmt w:val="bullet"/>
+      <w:lvlText w:val="o"/>
+      <w:lvlJc w:val="left"/>
+      <w:pPr>
+        <w:ind w:left="1440" w:hanging="360"/>
+      </w:pPr>
+      <w:rPr>
+        <w:rFonts w:ascii="Courier New" w:hAnsi="Courier New" w:cs="Courier New" w:hint="default"/>
+      </w:rPr>
+    </w:lvl>
+    <w:lvl w:ilvl="2" w:tplc="08130005" w:tentative="1">
+      <w:start w:val="1"/>
+      <w:numFmt w:val="bullet"/>
+      <w:lvlText w:val=""/>
+      <w:lvlJc w:val="left"/>
+      <w:pPr>
+        <w:ind w:left="2160" w:hanging="360"/>
+      </w:pPr>
+      <w:rPr>
+        <w:rFonts w:ascii="Wingdings" w:hAnsi="Wingdings" w:hint="default"/>
+      </w:rPr>
+    </w:lvl>
+    <w:lvl w:ilvl="3" w:tplc="08130001" w:tentative="1">
+      <w:start w:val="1"/>
+      <w:numFmt w:val="bullet"/>
+      <w:lvlText w:val=""/>
+      <w:lvlJc w:val="left"/>
+      <w:pPr>
+        <w:ind w:left="2880" w:hanging="360"/>
+      </w:pPr>
+      <w:rPr>
+        <w:rFonts w:ascii="Symbol" w:hAnsi="Symbol" w:hint="default"/>
+      </w:rPr>
+    </w:lvl>
+    <w:lvl w:ilvl="4" w:tplc="08130003" w:tentative="1">
+      <w:start w:val="1"/>
+      <w:numFmt w:val="bullet"/>
+      <w:lvlText w:val="o"/>
+      <w:lvlJc w:val="left"/>
+      <w:pPr>
+        <w:ind w:left="3600" w:hanging="360"/>
+      </w:pPr>
+      <w:rPr>
+        <w:rFonts w:ascii="Courier New" w:hAnsi="Courier New" w:cs="Courier New" w:hint="default"/>
+      </w:rPr>
+    </w:lvl>
+    <w:lvl w:ilvl="5" w:tplc="08130005" w:tentative="1">
+      <w:start w:val="1"/>
+      <w:numFmt w:val="bullet"/>
+      <w:lvlText w:val=""/>
+      <w:lvlJc w:val="left"/>
+      <w:pPr>
+        <w:ind w:left="4320" w:hanging="360"/>
+      </w:pPr>
+      <w:rPr>
+        <w:rFonts w:ascii="Wingdings" w:hAnsi="Wingdings" w:hint="default"/>
+      </w:rPr>
+    </w:lvl>
+    <w:lvl w:ilvl="6" w:tplc="08130001" w:tentative="1">
+      <w:start w:val="1"/>
+      <w:numFmt w:val="bullet"/>
+      <w:lvlText w:val=""/>
+      <w:lvlJc w:val="left"/>
+      <w:pPr>
+        <w:ind w:left="5040" w:hanging="360"/>
+      </w:pPr>
+      <w:rPr>
+        <w:rFonts w:ascii="Symbol" w:hAnsi="Symbol" w:hint="default"/>
+      </w:rPr>
+    </w:lvl>
+    <w:lvl w:ilvl="7" w:tplc="08130003" w:tentative="1">
+      <w:start w:val="1"/>
+      <w:numFmt w:val="bullet"/>
+      <w:lvlText w:val="o"/>
+      <w:lvlJc w:val="left"/>
+      <w:pPr>
+        <w:ind w:left="5760" w:hanging="360"/>
+      </w:pPr>
+      <w:rPr>
+        <w:rFonts w:ascii="Courier New" w:hAnsi="Courier New" w:cs="Courier New" w:hint="default"/>
+      </w:rPr>
+    </w:lvl>
+    <w:lvl w:ilvl="8" w:tplc="08130005" w:tentative="1">
+      <w:start w:val="1"/>
+      <w:numFmt w:val="bullet"/>
+      <w:lvlText w:val=""/>
+      <w:lvlJc w:val="left"/>
+      <w:pPr>
+        <w:ind w:left="6480" w:hanging="360"/>
+      </w:pPr>
+      <w:rPr>
+        <w:rFonts w:ascii="Wingdings" w:hAnsi="Wingdings" w:hint="default"/>
+      </w:rPr>
+    </w:lvl>
+  </w:abstractNum>
+  <w:abstractNum w:abstractNumId="11" w15:restartNumberingAfterBreak="0">
     <w:nsid w:val="3A132DC8"/>
     <w:multiLevelType w:val="hybridMultilevel"/>
     <w:tmpl w:val="FD8A1BD8"/>
@@ -3246,7 +4017,7 @@
       </w:rPr>
     </w:lvl>
   </w:abstractNum>
-  <w:abstractNum w:abstractNumId="10" w15:restartNumberingAfterBreak="0">
+  <w:abstractNum w:abstractNumId="12" w15:restartNumberingAfterBreak="0">
     <w:nsid w:val="4B820286"/>
     <w:multiLevelType w:val="hybridMultilevel"/>
     <w:tmpl w:val="1324B054"/>
@@ -3359,7 +4130,7 @@
       </w:rPr>
     </w:lvl>
   </w:abstractNum>
-  <w:abstractNum w:abstractNumId="11" w15:restartNumberingAfterBreak="0">
+  <w:abstractNum w:abstractNumId="13" w15:restartNumberingAfterBreak="0">
     <w:nsid w:val="4DAB5132"/>
     <w:multiLevelType w:val="hybridMultilevel"/>
     <w:tmpl w:val="C95C6250"/>
@@ -3472,7 +4243,7 @@
       </w:rPr>
     </w:lvl>
   </w:abstractNum>
-  <w:abstractNum w:abstractNumId="12" w15:restartNumberingAfterBreak="0">
+  <w:abstractNum w:abstractNumId="14" w15:restartNumberingAfterBreak="0">
     <w:nsid w:val="50FD3E19"/>
     <w:multiLevelType w:val="hybridMultilevel"/>
     <w:tmpl w:val="47EEFE78"/>
@@ -3585,7 +4356,7 @@
       </w:rPr>
     </w:lvl>
   </w:abstractNum>
-  <w:abstractNum w:abstractNumId="13" w15:restartNumberingAfterBreak="0">
+  <w:abstractNum w:abstractNumId="15" w15:restartNumberingAfterBreak="0">
     <w:nsid w:val="5A94222A"/>
     <w:multiLevelType w:val="hybridMultilevel"/>
     <w:tmpl w:val="B1FA5430"/>
@@ -3698,7 +4469,7 @@
       </w:rPr>
     </w:lvl>
   </w:abstractNum>
-  <w:abstractNum w:abstractNumId="14" w15:restartNumberingAfterBreak="0">
+  <w:abstractNum w:abstractNumId="16" w15:restartNumberingAfterBreak="0">
     <w:nsid w:val="647F23D0"/>
     <w:multiLevelType w:val="hybridMultilevel"/>
     <w:tmpl w:val="1B0841BE"/>
@@ -3811,7 +4582,7 @@
       </w:rPr>
     </w:lvl>
   </w:abstractNum>
-  <w:abstractNum w:abstractNumId="15" w15:restartNumberingAfterBreak="0">
+  <w:abstractNum w:abstractNumId="17" w15:restartNumberingAfterBreak="0">
     <w:nsid w:val="6D8607B7"/>
     <w:multiLevelType w:val="hybridMultilevel"/>
     <w:tmpl w:val="58DC4C56"/>
@@ -3937,40 +4708,46 @@
     <w:abstractNumId w:val="3"/>
   </w:num>
   <w:num w:numId="5" w16cid:durableId="893472193">
-    <w:abstractNumId w:val="7"/>
+    <w:abstractNumId w:val="8"/>
   </w:num>
   <w:num w:numId="6" w16cid:durableId="1755054948">
-    <w:abstractNumId w:val="10"/>
+    <w:abstractNumId w:val="12"/>
   </w:num>
   <w:num w:numId="7" w16cid:durableId="1495103662">
-    <w:abstractNumId w:val="15"/>
+    <w:abstractNumId w:val="17"/>
   </w:num>
   <w:num w:numId="8" w16cid:durableId="1462646248">
-    <w:abstractNumId w:val="11"/>
+    <w:abstractNumId w:val="13"/>
   </w:num>
   <w:num w:numId="9" w16cid:durableId="983697945">
     <w:abstractNumId w:val="5"/>
   </w:num>
   <w:num w:numId="10" w16cid:durableId="372198872">
-    <w:abstractNumId w:val="6"/>
+    <w:abstractNumId w:val="7"/>
   </w:num>
   <w:num w:numId="11" w16cid:durableId="1320037534">
-    <w:abstractNumId w:val="14"/>
+    <w:abstractNumId w:val="16"/>
   </w:num>
   <w:num w:numId="12" w16cid:durableId="872156676">
-    <w:abstractNumId w:val="12"/>
+    <w:abstractNumId w:val="14"/>
   </w:num>
   <w:num w:numId="13" w16cid:durableId="1717775439">
     <w:abstractNumId w:val="4"/>
   </w:num>
   <w:num w:numId="14" w16cid:durableId="74326497">
-    <w:abstractNumId w:val="13"/>
+    <w:abstractNumId w:val="15"/>
   </w:num>
   <w:num w:numId="15" w16cid:durableId="1591430736">
-    <w:abstractNumId w:val="8"/>
+    <w:abstractNumId w:val="9"/>
   </w:num>
   <w:num w:numId="16" w16cid:durableId="18285065">
-    <w:abstractNumId w:val="9"/>
+    <w:abstractNumId w:val="11"/>
+  </w:num>
+  <w:num w:numId="17" w16cid:durableId="1361200026">
+    <w:abstractNumId w:val="10"/>
+  </w:num>
+  <w:num w:numId="18" w16cid:durableId="1542326532">
+    <w:abstractNumId w:val="6"/>
   </w:num>
 </w:numbering>
 </file>

</xml_diff>

<commit_message>
Version number and manuals updated for release. Mbc folder added. Xsd folder added. v2.0.15.
git-svn-id: http://visualsvn.edna.local/EDNA/ModbusControl/V2@4000 03c8d257-35a7-c645-9f01-50f27e98b9e6
</commit_message>
<xml_diff>
--- a/Manuals/ModbusControl - Release notes.docx
+++ b/Manuals/ModbusControl - Release notes.docx
@@ -9,25 +9,17 @@
           <w:rFonts w:hint="eastAsia"/>
         </w:rPr>
       </w:pPr>
-      <w:proofErr w:type="spellStart"/>
       <w:r>
         <w:rPr>
           <w:u w:val="single"/>
         </w:rPr>
-        <w:t>ModbusControl</w:t>
-      </w:r>
-      <w:proofErr w:type="spellEnd"/>
+        <w:t xml:space="preserve">ModbusControl – Release </w:t>
+      </w:r>
+      <w:proofErr w:type="spellStart"/>
       <w:r>
         <w:rPr>
           <w:u w:val="single"/>
         </w:rPr>
-        <w:t xml:space="preserve"> – Release </w:t>
-      </w:r>
-      <w:proofErr w:type="spellStart"/>
-      <w:r>
-        <w:rPr>
-          <w:u w:val="single"/>
-        </w:rPr>
         <w:t>notes</w:t>
       </w:r>
       <w:proofErr w:type="spellEnd"/>
@@ -40,7 +32,567 @@
         </w:rPr>
       </w:pPr>
       <w:r>
-        <w:t xml:space="preserve">v2.0.14 * </w:t>
+        <w:t xml:space="preserve">v2.0.15 </w:t>
+      </w:r>
+      <w:r>
+        <w:t>– 2023-06-24</w:t>
+      </w:r>
+    </w:p>
+    <w:p>
+      <w:pPr>
+        <w:pStyle w:val="Kop3"/>
+        <w:rPr>
+          <w:rFonts w:hint="eastAsia"/>
+        </w:rPr>
+      </w:pPr>
+      <w:r>
+        <w:t>Features</w:t>
+      </w:r>
+    </w:p>
+    <w:p>
+      <w:pPr>
+        <w:numPr>
+          <w:ilvl w:val="0"/>
+          <w:numId w:val="4"/>
+        </w:numPr>
+        <w:rPr>
+          <w:rFonts w:hint="eastAsia"/>
+        </w:rPr>
+      </w:pPr>
+      <w:r>
+        <w:t>E</w:t>
+      </w:r>
+      <w:r>
+        <w:rPr>
+          <w:rFonts w:hint="eastAsia"/>
+        </w:rPr>
+        <w:t>num register</w:t>
+      </w:r>
+      <w:r>
+        <w:t xml:space="preserve"> </w:t>
+      </w:r>
+      <w:proofErr w:type="spellStart"/>
+      <w:r>
+        <w:t>editeren</w:t>
+      </w:r>
+      <w:proofErr w:type="spellEnd"/>
+      <w:r>
+        <w:t xml:space="preserve"> is nu met </w:t>
+      </w:r>
+      <w:proofErr w:type="spellStart"/>
+      <w:r>
+        <w:rPr>
+          <w:rFonts w:hint="eastAsia"/>
+        </w:rPr>
+        <w:t>combobox-dropdown</w:t>
+      </w:r>
+      <w:proofErr w:type="spellEnd"/>
+      <w:r>
+        <w:t>.</w:t>
+      </w:r>
+    </w:p>
+    <w:p>
+      <w:pPr>
+        <w:numPr>
+          <w:ilvl w:val="0"/>
+          <w:numId w:val="4"/>
+        </w:numPr>
+        <w:rPr>
+          <w:rFonts w:hint="eastAsia"/>
+        </w:rPr>
+      </w:pPr>
+      <w:r>
+        <w:rPr>
+          <w:rFonts w:hint="eastAsia"/>
+        </w:rPr>
+        <w:t xml:space="preserve">Bij &lt;enum&gt; is nu een </w:t>
+      </w:r>
+      <w:proofErr w:type="spellStart"/>
+      <w:r>
+        <w:t>custom</w:t>
+      </w:r>
+      <w:proofErr w:type="spellEnd"/>
+      <w:r>
+        <w:t xml:space="preserve"> </w:t>
+      </w:r>
+      <w:r>
+        <w:rPr>
+          <w:rFonts w:hint="eastAsia"/>
+        </w:rPr>
+        <w:t>&lt;</w:t>
+      </w:r>
+      <w:proofErr w:type="spellStart"/>
+      <w:r>
+        <w:rPr>
+          <w:rFonts w:hint="eastAsia"/>
+        </w:rPr>
+        <w:t>else</w:t>
+      </w:r>
+      <w:proofErr w:type="spellEnd"/>
+      <w:r>
+        <w:rPr>
+          <w:rFonts w:hint="eastAsia"/>
+        </w:rPr>
+        <w:t>&gt; tekst mogelijk. Kan leeg gelaten worden.</w:t>
+      </w:r>
+    </w:p>
+    <w:p>
+      <w:pPr>
+        <w:numPr>
+          <w:ilvl w:val="0"/>
+          <w:numId w:val="4"/>
+        </w:numPr>
+        <w:rPr>
+          <w:rFonts w:hint="eastAsia"/>
+        </w:rPr>
+      </w:pPr>
+      <w:r>
+        <w:rPr>
+          <w:rFonts w:hint="eastAsia"/>
+        </w:rPr>
+        <w:t>Je kan nu holdingregisters nummering</w:t>
+      </w:r>
+      <w:r>
+        <w:t>schema</w:t>
+      </w:r>
+      <w:r>
+        <w:rPr>
+          <w:rFonts w:hint="eastAsia"/>
+        </w:rPr>
+        <w:t xml:space="preserve"> 40001-49999 en 400001-465536 tegelijk gebruiken.</w:t>
+      </w:r>
+      <w:r>
+        <w:t xml:space="preserve"> Of </w:t>
+      </w:r>
+      <w:r>
+        <w:rPr>
+          <w:rFonts w:hint="eastAsia"/>
+        </w:rPr>
+        <w:t>nummering</w:t>
+      </w:r>
+      <w:r>
+        <w:t>schema</w:t>
+      </w:r>
+      <w:r>
+        <w:rPr>
+          <w:rFonts w:hint="eastAsia"/>
+        </w:rPr>
+        <w:t xml:space="preserve"> 40000-49999 en 400000</w:t>
+      </w:r>
+      <w:r>
+        <w:t>-</w:t>
+      </w:r>
+      <w:r>
+        <w:rPr>
+          <w:rFonts w:hint="eastAsia"/>
+        </w:rPr>
+        <w:t>465535</w:t>
+      </w:r>
+      <w:r>
+        <w:t>.</w:t>
+      </w:r>
+    </w:p>
+    <w:p>
+      <w:pPr>
+        <w:pStyle w:val="Kop3"/>
+        <w:numPr>
+          <w:ilvl w:val="0"/>
+          <w:numId w:val="0"/>
+        </w:numPr>
+        <w:ind w:left="680" w:hanging="431"/>
+        <w:rPr>
+          <w:rFonts w:hint="eastAsia"/>
+        </w:rPr>
+      </w:pPr>
+      <w:proofErr w:type="spellStart"/>
+      <w:r>
+        <w:t>Fixes</w:t>
+      </w:r>
+      <w:proofErr w:type="spellEnd"/>
+    </w:p>
+    <w:p>
+      <w:pPr>
+        <w:numPr>
+          <w:ilvl w:val="0"/>
+          <w:numId w:val="4"/>
+        </w:numPr>
+        <w:rPr>
+          <w:rFonts w:hint="eastAsia"/>
+        </w:rPr>
+      </w:pPr>
+      <w:r>
+        <w:t>A</w:t>
+      </w:r>
+      <w:r>
+        <w:rPr>
+          <w:rFonts w:hint="eastAsia"/>
+        </w:rPr>
+        <w:t xml:space="preserve">scii32 </w:t>
+      </w:r>
+      <w:r>
+        <w:t xml:space="preserve">register </w:t>
+      </w:r>
+      <w:r>
+        <w:rPr>
+          <w:rFonts w:hint="eastAsia"/>
+        </w:rPr>
+        <w:t>schrijven werkte niet</w:t>
+      </w:r>
+      <w:r>
+        <w:t xml:space="preserve"> goed</w:t>
+      </w:r>
+      <w:r>
+        <w:rPr>
+          <w:rFonts w:hint="eastAsia"/>
+        </w:rPr>
+        <w:t>, schreef alleen het eerste woord.</w:t>
+      </w:r>
+    </w:p>
+    <w:p>
+      <w:pPr>
+        <w:numPr>
+          <w:ilvl w:val="0"/>
+          <w:numId w:val="4"/>
+        </w:numPr>
+        <w:rPr>
+          <w:rFonts w:hint="eastAsia"/>
+        </w:rPr>
+      </w:pPr>
+      <w:proofErr w:type="spellStart"/>
+      <w:r>
+        <w:rPr>
+          <w:rFonts w:hint="eastAsia"/>
+        </w:rPr>
+        <w:t>Resizen</w:t>
+      </w:r>
+      <w:proofErr w:type="spellEnd"/>
+      <w:r>
+        <w:rPr>
+          <w:rFonts w:hint="eastAsia"/>
+        </w:rPr>
+        <w:t xml:space="preserve"> kolombreedte wordt nu </w:t>
+      </w:r>
+      <w:r>
+        <w:t>op de</w:t>
+      </w:r>
+      <w:r>
+        <w:rPr>
+          <w:rFonts w:hint="eastAsia"/>
+        </w:rPr>
+        <w:t xml:space="preserve"> andere tab</w:t>
+      </w:r>
+      <w:r>
+        <w:t xml:space="preserve">bladen </w:t>
+      </w:r>
+      <w:r>
+        <w:rPr>
+          <w:rFonts w:hint="eastAsia"/>
+        </w:rPr>
+        <w:t>overgenomen.</w:t>
+      </w:r>
+    </w:p>
+    <w:p>
+      <w:pPr>
+        <w:numPr>
+          <w:ilvl w:val="0"/>
+          <w:numId w:val="4"/>
+        </w:numPr>
+        <w:rPr>
+          <w:rFonts w:hint="eastAsia"/>
+        </w:rPr>
+      </w:pPr>
+      <w:r>
+        <w:rPr>
+          <w:rFonts w:hint="eastAsia"/>
+        </w:rPr>
+        <w:t>Bij zoomen</w:t>
+      </w:r>
+      <w:r>
+        <w:t xml:space="preserve"> wordt nu </w:t>
+      </w:r>
+      <w:r>
+        <w:rPr>
+          <w:rFonts w:hint="eastAsia"/>
+        </w:rPr>
+        <w:t xml:space="preserve">ook </w:t>
+      </w:r>
+      <w:r>
+        <w:t xml:space="preserve">de grootte van de </w:t>
+      </w:r>
+      <w:r>
+        <w:rPr>
+          <w:rFonts w:hint="eastAsia"/>
+        </w:rPr>
+        <w:t xml:space="preserve">kolomheaders </w:t>
+      </w:r>
+      <w:r>
+        <w:t>aangepast</w:t>
+      </w:r>
+      <w:r>
+        <w:rPr>
+          <w:rFonts w:hint="eastAsia"/>
+        </w:rPr>
+        <w:t>.</w:t>
+      </w:r>
+    </w:p>
+    <w:p>
+      <w:pPr>
+        <w:numPr>
+          <w:ilvl w:val="0"/>
+          <w:numId w:val="4"/>
+        </w:numPr>
+        <w:rPr>
+          <w:rFonts w:hint="eastAsia"/>
+        </w:rPr>
+      </w:pPr>
+      <w:r>
+        <w:rPr>
+          <w:rFonts w:hint="eastAsia"/>
+        </w:rPr>
+        <w:t xml:space="preserve">Ook de </w:t>
+      </w:r>
+      <w:r>
+        <w:t>[</w:t>
+      </w:r>
+      <w:proofErr w:type="spellStart"/>
+      <w:r>
+        <w:rPr>
+          <w:rFonts w:hint="eastAsia"/>
+        </w:rPr>
+        <w:t>Project_Configuration</w:t>
+      </w:r>
+      <w:proofErr w:type="spellEnd"/>
+      <w:r>
+        <w:t>]</w:t>
+      </w:r>
+      <w:r>
+        <w:rPr>
+          <w:rFonts w:hint="eastAsia"/>
+        </w:rPr>
+        <w:t xml:space="preserve">, </w:t>
+      </w:r>
+      <w:r>
+        <w:t>[</w:t>
+      </w:r>
+      <w:proofErr w:type="spellStart"/>
+      <w:r>
+        <w:rPr>
+          <w:rFonts w:hint="eastAsia"/>
+        </w:rPr>
+        <w:t>Save_project_file</w:t>
+      </w:r>
+      <w:proofErr w:type="spellEnd"/>
+      <w:r>
+        <w:t>]</w:t>
+      </w:r>
+      <w:r>
+        <w:rPr>
+          <w:rFonts w:hint="eastAsia"/>
+        </w:rPr>
+        <w:t xml:space="preserve"> en </w:t>
+      </w:r>
+      <w:r>
+        <w:t>[</w:t>
+      </w:r>
+      <w:proofErr w:type="spellStart"/>
+      <w:r>
+        <w:rPr>
+          <w:rFonts w:hint="eastAsia"/>
+        </w:rPr>
+        <w:t>About</w:t>
+      </w:r>
+      <w:proofErr w:type="spellEnd"/>
+      <w:r>
+        <w:t>]</w:t>
+      </w:r>
+      <w:r>
+        <w:rPr>
+          <w:rFonts w:hint="eastAsia"/>
+        </w:rPr>
+        <w:t xml:space="preserve"> </w:t>
+      </w:r>
+      <w:proofErr w:type="spellStart"/>
+      <w:r>
+        <w:rPr>
+          <w:rFonts w:hint="eastAsia"/>
+        </w:rPr>
+        <w:t>forms</w:t>
+      </w:r>
+      <w:proofErr w:type="spellEnd"/>
+      <w:r>
+        <w:rPr>
+          <w:rFonts w:hint="eastAsia"/>
+        </w:rPr>
+        <w:t xml:space="preserve"> kan je nu sluiten met de ESC knop.</w:t>
+      </w:r>
+    </w:p>
+    <w:p>
+      <w:pPr>
+        <w:numPr>
+          <w:ilvl w:val="0"/>
+          <w:numId w:val="4"/>
+        </w:numPr>
+        <w:rPr>
+          <w:rFonts w:hint="eastAsia"/>
+        </w:rPr>
+      </w:pPr>
+      <w:r>
+        <w:rPr>
+          <w:rFonts w:hint="eastAsia"/>
+        </w:rPr>
+        <w:t>D</w:t>
+      </w:r>
+      <w:r>
+        <w:t xml:space="preserve">e </w:t>
+      </w:r>
+      <w:proofErr w:type="spellStart"/>
+      <w:r>
+        <w:t>ex</w:t>
+      </w:r>
+      <w:r>
+        <w:t>pand</w:t>
+      </w:r>
+      <w:proofErr w:type="spellEnd"/>
+      <w:r>
+        <w:t>/</w:t>
+      </w:r>
+      <w:proofErr w:type="spellStart"/>
+      <w:r>
+        <w:t>collapse</w:t>
+      </w:r>
+      <w:proofErr w:type="spellEnd"/>
+      <w:r>
+        <w:t xml:space="preserve"> icon</w:t>
+      </w:r>
+      <w:r>
+        <w:t>en</w:t>
+      </w:r>
+      <w:r>
+        <w:t xml:space="preserve"> sc</w:t>
+      </w:r>
+      <w:r>
+        <w:t>h</w:t>
+      </w:r>
+      <w:r>
+        <w:t>alen mee met zoom.</w:t>
+      </w:r>
+    </w:p>
+    <w:p>
+      <w:pPr>
+        <w:numPr>
+          <w:ilvl w:val="0"/>
+          <w:numId w:val="4"/>
+        </w:numPr>
+        <w:rPr>
+          <w:rFonts w:hint="eastAsia"/>
+        </w:rPr>
+      </w:pPr>
+      <w:r>
+        <w:t>Als bij laden van een mbc file een error optreedt wordt geen auto-</w:t>
+      </w:r>
+      <w:proofErr w:type="spellStart"/>
+      <w:r>
+        <w:t>connect</w:t>
+      </w:r>
+      <w:proofErr w:type="spellEnd"/>
+      <w:r>
+        <w:t xml:space="preserve"> </w:t>
+      </w:r>
+      <w:r>
+        <w:t xml:space="preserve">met de </w:t>
+      </w:r>
+      <w:proofErr w:type="spellStart"/>
+      <w:r>
+        <w:t>slave</w:t>
+      </w:r>
+      <w:proofErr w:type="spellEnd"/>
+      <w:r>
+        <w:t xml:space="preserve">/server </w:t>
+      </w:r>
+      <w:r>
+        <w:t>meer gedaan.</w:t>
+      </w:r>
+    </w:p>
+    <w:p>
+      <w:pPr>
+        <w:numPr>
+          <w:ilvl w:val="0"/>
+          <w:numId w:val="4"/>
+        </w:numPr>
+        <w:rPr>
+          <w:rFonts w:hint="eastAsia"/>
+        </w:rPr>
+      </w:pPr>
+      <w:r>
+        <w:t xml:space="preserve">Bij </w:t>
+      </w:r>
+      <w:proofErr w:type="spellStart"/>
+      <w:r>
+        <w:t>Import_file</w:t>
+      </w:r>
+      <w:proofErr w:type="spellEnd"/>
+      <w:r>
+        <w:t xml:space="preserve"> en </w:t>
+      </w:r>
+      <w:proofErr w:type="spellStart"/>
+      <w:r>
+        <w:t>I</w:t>
+      </w:r>
+      <w:r>
+        <w:rPr>
+          <w:rFonts w:hint="eastAsia"/>
+        </w:rPr>
+        <w:t>mport</w:t>
+      </w:r>
+      <w:r>
+        <w:t>_</w:t>
+      </w:r>
+      <w:r>
+        <w:rPr>
+          <w:rFonts w:hint="eastAsia"/>
+        </w:rPr>
+        <w:t>compare</w:t>
+      </w:r>
+      <w:proofErr w:type="spellEnd"/>
+      <w:r>
+        <w:t xml:space="preserve">: </w:t>
+      </w:r>
+      <w:r>
+        <w:rPr>
+          <w:rFonts w:hint="eastAsia"/>
+        </w:rPr>
+        <w:t>schrijven</w:t>
+      </w:r>
+      <w:r>
+        <w:t>/</w:t>
+      </w:r>
+      <w:proofErr w:type="spellStart"/>
+      <w:r>
+        <w:t>comparen</w:t>
+      </w:r>
+      <w:proofErr w:type="spellEnd"/>
+      <w:r>
+        <w:rPr>
+          <w:rFonts w:hint="eastAsia"/>
+        </w:rPr>
+        <w:t xml:space="preserve"> van een float32 werkte niet meer.</w:t>
+      </w:r>
+    </w:p>
+    <w:p>
+      <w:pPr>
+        <w:pStyle w:val="Kop1"/>
+        <w:rPr>
+          <w:rFonts w:hint="eastAsia"/>
+        </w:rPr>
+      </w:pPr>
+      <w:r>
+        <w:t xml:space="preserve">v2.0.14 </w:t>
+      </w:r>
+      <w:r>
+        <w:t>--</w:t>
+      </w:r>
+      <w:r>
+        <w:t xml:space="preserve"> </w:t>
       </w:r>
       <w:r>
         <w:t>2022-11-08</w:t>
@@ -332,13 +884,8 @@
           <w:rFonts w:hint="eastAsia"/>
         </w:rPr>
       </w:pPr>
-      <w:proofErr w:type="spellStart"/>
-      <w:r>
-        <w:t>Mbc</w:t>
-      </w:r>
-      <w:proofErr w:type="spellEnd"/>
-      <w:r>
-        <w:t xml:space="preserve"> project file: &lt;</w:t>
+      <w:r>
+        <w:t>Mbc project file: &lt;</w:t>
       </w:r>
       <w:proofErr w:type="spellStart"/>
       <w:r>
@@ -400,13 +947,8 @@
           <w:rFonts w:hint="eastAsia"/>
         </w:rPr>
       </w:pPr>
-      <w:proofErr w:type="spellStart"/>
-      <w:r>
-        <w:t>Mbc</w:t>
-      </w:r>
-      <w:proofErr w:type="spellEnd"/>
-      <w:r>
-        <w:t xml:space="preserve"> project file: </w:t>
+      <w:r>
+        <w:t xml:space="preserve">Mbc project file: </w:t>
       </w:r>
       <w:r>
         <w:rPr>
@@ -688,7 +1230,13 @@
         </w:rPr>
       </w:pPr>
       <w:r>
-        <w:t>v2.0.13 * 2022-07-11</w:t>
+        <w:t xml:space="preserve">v2.0.13 </w:t>
+      </w:r>
+      <w:r>
+        <w:t>--</w:t>
+      </w:r>
+      <w:r>
+        <w:t xml:space="preserve"> 2022-07-11</w:t>
       </w:r>
     </w:p>
     <w:p>
@@ -772,7 +1320,11 @@
       </w:r>
       <w:proofErr w:type="spellEnd"/>
       <w:r>
-        <w:t xml:space="preserve"> in Options.</w:t>
+        <w:t xml:space="preserve"> in </w:t>
+      </w:r>
+      <w:r>
+        <w:lastRenderedPageBreak/>
+        <w:t>Options.</w:t>
       </w:r>
     </w:p>
     <w:p>
@@ -1031,7 +1583,13 @@
         </w:rPr>
       </w:pPr>
       <w:r>
-        <w:t>v2.0.12 * 2020-07-13</w:t>
+        <w:t xml:space="preserve">v2.0.12 </w:t>
+      </w:r>
+      <w:r>
+        <w:t>--</w:t>
+      </w:r>
+      <w:r>
+        <w:t xml:space="preserve"> 2020-07-13</w:t>
       </w:r>
     </w:p>
     <w:p>
@@ -1056,11 +1614,7 @@
         </w:rPr>
       </w:pPr>
       <w:r>
-        <w:t xml:space="preserve">Mbc project file validatie met XSD schema toegevoegd. Als er bij het laden van een mbc </w:t>
-      </w:r>
-      <w:r>
-        <w:lastRenderedPageBreak/>
-        <w:t xml:space="preserve">project file een validatiefout optreedt kan je ervoor kiezen om dit te negeren en toch de file te laden. De validatie kan afgezet worden in Options. </w:t>
+        <w:t xml:space="preserve">Mbc project file validatie met XSD schema toegevoegd. Als er bij het laden van een mbc project file een validatiefout optreedt kan je ervoor kiezen om dit te negeren en toch de file te laden. De validatie kan afgezet worden in Options. </w:t>
       </w:r>
       <w:r>
         <w:br/>
@@ -1268,15 +1822,7 @@
       </w:r>
       <w:proofErr w:type="spellEnd"/>
       <w:r>
-        <w:t>&gt;\</w:t>
-      </w:r>
-      <w:proofErr w:type="spellStart"/>
-      <w:r>
-        <w:t>ModbusControl</w:t>
-      </w:r>
-      <w:proofErr w:type="spellEnd"/>
-      <w:r>
-        <w:t xml:space="preserve"> naar %</w:t>
+        <w:t>&gt;\ModbusControl naar %</w:t>
       </w:r>
       <w:proofErr w:type="spellStart"/>
       <w:r>
@@ -1292,15 +1838,7 @@
       </w:r>
       <w:proofErr w:type="spellEnd"/>
       <w:r>
-        <w:t>\E.D.&amp;A\</w:t>
-      </w:r>
-      <w:proofErr w:type="spellStart"/>
-      <w:r>
-        <w:t>ModbusControl</w:t>
-      </w:r>
-      <w:proofErr w:type="spellEnd"/>
-      <w:r>
-        <w:t xml:space="preserve">. Content van oude wordt niet gemigreerd naar nieuwe. Oude wordt </w:t>
+        <w:t xml:space="preserve">\E.D.&amp;A\ModbusControl. Content van oude wordt niet gemigreerd naar nieuwe. Oude wordt </w:t>
       </w:r>
       <w:proofErr w:type="spellStart"/>
       <w:r>
@@ -1346,15 +1884,7 @@
       </w:r>
       <w:proofErr w:type="spellEnd"/>
       <w:r>
-        <w:t>\</w:t>
-      </w:r>
-      <w:proofErr w:type="spellStart"/>
-      <w:r>
-        <w:t>ModbusControl</w:t>
-      </w:r>
-      <w:proofErr w:type="spellEnd"/>
-      <w:r>
-        <w:t xml:space="preserve"> wordt niet meer gebruikt.</w:t>
+        <w:t>\ModbusControl wordt niet meer gebruikt.</w:t>
       </w:r>
     </w:p>
     <w:p>
@@ -1460,7 +1990,14 @@
         </w:rPr>
       </w:pPr>
       <w:r>
-        <w:t>v2.0.11 * 2019-11-18</w:t>
+        <w:lastRenderedPageBreak/>
+        <w:t xml:space="preserve">v2.0.11 </w:t>
+      </w:r>
+      <w:r>
+        <w:t>--</w:t>
+      </w:r>
+      <w:r>
+        <w:t xml:space="preserve"> 2019-11-18</w:t>
       </w:r>
     </w:p>
     <w:p>
@@ -1506,7 +2043,13 @@
         </w:rPr>
       </w:pPr>
       <w:r>
-        <w:t>v2.0.10 * 2019-03-11</w:t>
+        <w:t xml:space="preserve">v2.0.10 </w:t>
+      </w:r>
+      <w:r>
+        <w:t>--</w:t>
+      </w:r>
+      <w:r>
+        <w:t xml:space="preserve"> 2019-03-11</w:t>
       </w:r>
     </w:p>
     <w:p>
@@ -1639,11 +2182,186 @@
       </w:r>
       <w:proofErr w:type="spellEnd"/>
       <w:r>
+        <w:t xml:space="preserve"> Modbus </w:t>
+      </w:r>
+      <w:proofErr w:type="spellStart"/>
+      <w:r>
+        <w:t>Command</w:t>
+      </w:r>
+      <w:proofErr w:type="spellEnd"/>
+      <w:r>
+        <w:t xml:space="preserve">: laat nu ook tabs en CR/LF toe in de string. Geeft error bij lege </w:t>
+      </w:r>
+      <w:proofErr w:type="spellStart"/>
+      <w:r>
+        <w:t>command</w:t>
+      </w:r>
+      <w:proofErr w:type="spellEnd"/>
+      <w:r>
+        <w:t xml:space="preserve"> string. </w:t>
+      </w:r>
+    </w:p>
+    <w:p>
+      <w:pPr>
+        <w:numPr>
+          <w:ilvl w:val="0"/>
+          <w:numId w:val="8"/>
+        </w:numPr>
+        <w:rPr>
+          <w:rFonts w:hint="eastAsia"/>
+        </w:rPr>
+      </w:pPr>
+      <w:proofErr w:type="spellStart"/>
+      <w:r>
+        <w:t>Send</w:t>
+      </w:r>
+      <w:proofErr w:type="spellEnd"/>
+      <w:r>
         <w:t xml:space="preserve"> </w:t>
       </w:r>
       <w:proofErr w:type="spellStart"/>
       <w:r>
-        <w:t>Modbus</w:t>
+        <w:t>Custom</w:t>
+      </w:r>
+      <w:proofErr w:type="spellEnd"/>
+      <w:r>
+        <w:t xml:space="preserve"> Modbus </w:t>
+      </w:r>
+      <w:proofErr w:type="spellStart"/>
+      <w:r>
+        <w:t>Command</w:t>
+      </w:r>
+      <w:proofErr w:type="spellEnd"/>
+      <w:r>
+        <w:t xml:space="preserve">: Geeft error bij te kort </w:t>
+      </w:r>
+      <w:proofErr w:type="spellStart"/>
+      <w:r>
+        <w:t>command</w:t>
+      </w:r>
+      <w:proofErr w:type="spellEnd"/>
+      <w:r>
+        <w:t>, moet minstens 2 bytes zijn.</w:t>
+      </w:r>
+    </w:p>
+    <w:p>
+      <w:pPr>
+        <w:numPr>
+          <w:ilvl w:val="0"/>
+          <w:numId w:val="8"/>
+        </w:numPr>
+        <w:rPr>
+          <w:rFonts w:hint="eastAsia"/>
+        </w:rPr>
+      </w:pPr>
+      <w:r>
+        <w:t>Fix backgroundkleur van registers.</w:t>
+      </w:r>
+    </w:p>
+    <w:p>
+      <w:pPr>
+        <w:pStyle w:val="Kop1"/>
+        <w:rPr>
+          <w:rFonts w:hint="eastAsia"/>
+        </w:rPr>
+      </w:pPr>
+      <w:r>
+        <w:t xml:space="preserve">v2.0.9 </w:t>
+      </w:r>
+      <w:r>
+        <w:t>--</w:t>
+      </w:r>
+      <w:r>
+        <w:t xml:space="preserve"> 2018-10-20</w:t>
+      </w:r>
+    </w:p>
+    <w:p>
+      <w:pPr>
+        <w:pStyle w:val="Kop3"/>
+        <w:rPr>
+          <w:rFonts w:hint="eastAsia"/>
+        </w:rPr>
+      </w:pPr>
+      <w:r>
+        <w:t>Features</w:t>
+      </w:r>
+    </w:p>
+    <w:p>
+      <w:pPr>
+        <w:numPr>
+          <w:ilvl w:val="0"/>
+          <w:numId w:val="9"/>
+        </w:numPr>
+        <w:rPr>
+          <w:rFonts w:hint="eastAsia"/>
+        </w:rPr>
+      </w:pPr>
+      <w:r>
+        <w:t xml:space="preserve">Nieuwe optie: “Move </w:t>
+      </w:r>
+      <w:proofErr w:type="spellStart"/>
+      <w:r>
+        <w:t>to</w:t>
+      </w:r>
+      <w:proofErr w:type="spellEnd"/>
+      <w:r>
+        <w:t xml:space="preserve"> next </w:t>
+      </w:r>
+      <w:proofErr w:type="spellStart"/>
+      <w:r>
+        <w:t>row</w:t>
+      </w:r>
+      <w:proofErr w:type="spellEnd"/>
+      <w:r>
+        <w:t xml:space="preserve"> on Enter”.</w:t>
+      </w:r>
+    </w:p>
+    <w:p>
+      <w:pPr>
+        <w:numPr>
+          <w:ilvl w:val="0"/>
+          <w:numId w:val="9"/>
+        </w:numPr>
+        <w:rPr>
+          <w:rFonts w:hint="eastAsia"/>
+        </w:rPr>
+      </w:pPr>
+      <w:r>
+        <w:t xml:space="preserve">Nieuwe optie: “Auto-start </w:t>
+      </w:r>
+      <w:proofErr w:type="spellStart"/>
+      <w:r>
+        <w:t>edit</w:t>
+      </w:r>
+      <w:proofErr w:type="spellEnd"/>
+      <w:r>
+        <w:t xml:space="preserve"> mode on </w:t>
+      </w:r>
+      <w:proofErr w:type="spellStart"/>
+      <w:r>
+        <w:t>typing</w:t>
+      </w:r>
+      <w:proofErr w:type="spellEnd"/>
+      <w:r>
+        <w:t xml:space="preserve">”. </w:t>
+      </w:r>
+    </w:p>
+    <w:p>
+      <w:pPr>
+        <w:numPr>
+          <w:ilvl w:val="0"/>
+          <w:numId w:val="9"/>
+        </w:numPr>
+        <w:rPr>
+          <w:rFonts w:hint="eastAsia"/>
+        </w:rPr>
+      </w:pPr>
+      <w:r>
+        <w:t>Nieuwe optie: “</w:t>
+      </w:r>
+      <w:proofErr w:type="spellStart"/>
+      <w:r>
+        <w:t>Use</w:t>
       </w:r>
       <w:proofErr w:type="spellEnd"/>
       <w:r>
@@ -1651,34 +2369,168 @@
       </w:r>
       <w:proofErr w:type="spellStart"/>
       <w:r>
-        <w:t>Command</w:t>
-      </w:r>
-      <w:proofErr w:type="spellEnd"/>
-      <w:r>
-        <w:t xml:space="preserve">: laat nu ook tabs en CR/LF toe in de string. Geeft error bij lege </w:t>
-      </w:r>
-      <w:proofErr w:type="spellStart"/>
-      <w:r>
-        <w:t>command</w:t>
-      </w:r>
-      <w:proofErr w:type="spellEnd"/>
-      <w:r>
-        <w:t xml:space="preserve"> string. </w:t>
-      </w:r>
-    </w:p>
-    <w:p>
-      <w:pPr>
-        <w:numPr>
-          <w:ilvl w:val="0"/>
-          <w:numId w:val="8"/>
-        </w:numPr>
-        <w:rPr>
-          <w:rFonts w:hint="eastAsia"/>
-        </w:rPr>
-      </w:pPr>
-      <w:proofErr w:type="spellStart"/>
-      <w:r>
-        <w:t>Send</w:t>
+        <w:t>custom</w:t>
+      </w:r>
+      <w:proofErr w:type="spellEnd"/>
+      <w:r>
+        <w:t xml:space="preserve"> editor”. </w:t>
+      </w:r>
+    </w:p>
+    <w:p>
+      <w:pPr>
+        <w:numPr>
+          <w:ilvl w:val="0"/>
+          <w:numId w:val="9"/>
+        </w:numPr>
+        <w:rPr>
+          <w:rFonts w:hint="eastAsia"/>
+        </w:rPr>
+      </w:pPr>
+      <w:r>
+        <w:t>Nieuwe optie: “</w:t>
+      </w:r>
+      <w:proofErr w:type="spellStart"/>
+      <w:r>
+        <w:t>Ignore</w:t>
+      </w:r>
+      <w:proofErr w:type="spellEnd"/>
+      <w:r>
+        <w:t xml:space="preserve"> form </w:t>
+      </w:r>
+      <w:proofErr w:type="spellStart"/>
+      <w:r>
+        <w:t>size</w:t>
+      </w:r>
+      <w:proofErr w:type="spellEnd"/>
+      <w:r>
+        <w:t xml:space="preserve"> on project </w:t>
+      </w:r>
+      <w:proofErr w:type="spellStart"/>
+      <w:r>
+        <w:t>reload</w:t>
+      </w:r>
+      <w:proofErr w:type="spellEnd"/>
+      <w:r>
+        <w:t>”.</w:t>
+      </w:r>
+    </w:p>
+    <w:p>
+      <w:pPr>
+        <w:numPr>
+          <w:ilvl w:val="0"/>
+          <w:numId w:val="9"/>
+        </w:numPr>
+        <w:rPr>
+          <w:rFonts w:hint="eastAsia"/>
+        </w:rPr>
+      </w:pPr>
+      <w:proofErr w:type="spellStart"/>
+      <w:r>
+        <w:t>Config</w:t>
+      </w:r>
+      <w:proofErr w:type="spellEnd"/>
+      <w:r>
+        <w:t xml:space="preserve"> form heeft nu een </w:t>
+      </w:r>
+      <w:proofErr w:type="spellStart"/>
+      <w:r>
+        <w:t>Apply</w:t>
+      </w:r>
+      <w:proofErr w:type="spellEnd"/>
+      <w:r>
+        <w:t xml:space="preserve"> button.</w:t>
+      </w:r>
+    </w:p>
+    <w:p>
+      <w:pPr>
+        <w:numPr>
+          <w:ilvl w:val="0"/>
+          <w:numId w:val="9"/>
+        </w:numPr>
+        <w:rPr>
+          <w:rFonts w:hint="eastAsia"/>
+        </w:rPr>
+      </w:pPr>
+      <w:r>
+        <w:t xml:space="preserve">Aparte line-copy en </w:t>
+      </w:r>
+      <w:proofErr w:type="spellStart"/>
+      <w:r>
+        <w:t>value</w:t>
+      </w:r>
+      <w:proofErr w:type="spellEnd"/>
+      <w:r>
+        <w:t xml:space="preserve">-copy in </w:t>
+      </w:r>
+      <w:proofErr w:type="spellStart"/>
+      <w:r>
+        <w:t>grid</w:t>
+      </w:r>
+      <w:proofErr w:type="spellEnd"/>
+      <w:r>
+        <w:t>, via control-C en context menu.</w:t>
+      </w:r>
+    </w:p>
+    <w:p>
+      <w:pPr>
+        <w:numPr>
+          <w:ilvl w:val="0"/>
+          <w:numId w:val="9"/>
+        </w:numPr>
+        <w:rPr>
+          <w:rFonts w:hint="eastAsia"/>
+        </w:rPr>
+      </w:pPr>
+      <w:r>
+        <w:t xml:space="preserve">De statusbar wordt nu blauw gekleurd als er geen connectie is of geen </w:t>
+      </w:r>
+      <w:proofErr w:type="spellStart"/>
+      <w:r>
+        <w:t>polling</w:t>
+      </w:r>
+      <w:proofErr w:type="spellEnd"/>
+      <w:r>
+        <w:t xml:space="preserve"> wordt gedaan.</w:t>
+      </w:r>
+    </w:p>
+    <w:p>
+      <w:pPr>
+        <w:numPr>
+          <w:ilvl w:val="0"/>
+          <w:numId w:val="9"/>
+        </w:numPr>
+        <w:rPr>
+          <w:rFonts w:hint="eastAsia"/>
+        </w:rPr>
+      </w:pPr>
+      <w:r>
+        <w:t>De statusbar wordt nu rood gekleurd bij errors.</w:t>
+      </w:r>
+    </w:p>
+    <w:p>
+      <w:pPr>
+        <w:numPr>
+          <w:ilvl w:val="0"/>
+          <w:numId w:val="9"/>
+        </w:numPr>
+        <w:rPr>
+          <w:rFonts w:hint="eastAsia"/>
+        </w:rPr>
+      </w:pPr>
+      <w:r>
+        <w:t xml:space="preserve">Geeft nu een </w:t>
+      </w:r>
+      <w:proofErr w:type="spellStart"/>
+      <w:r>
+        <w:t>warning</w:t>
+      </w:r>
+      <w:proofErr w:type="spellEnd"/>
+      <w:r>
+        <w:t xml:space="preserve"> in de “Save </w:t>
+      </w:r>
+      <w:proofErr w:type="spellStart"/>
+      <w:r>
+        <w:t>configuration</w:t>
       </w:r>
       <w:proofErr w:type="spellEnd"/>
       <w:r>
@@ -1686,7 +2538,129 @@
       </w:r>
       <w:proofErr w:type="spellStart"/>
       <w:r>
-        <w:t>Custom</w:t>
+        <w:t>to</w:t>
+      </w:r>
+      <w:proofErr w:type="spellEnd"/>
+      <w:r>
+        <w:t xml:space="preserve"> project file” en “Project </w:t>
+      </w:r>
+      <w:proofErr w:type="spellStart"/>
+      <w:r>
+        <w:t>configuration</w:t>
+      </w:r>
+      <w:proofErr w:type="spellEnd"/>
+      <w:r>
+        <w:t xml:space="preserve">” schermen als er </w:t>
+      </w:r>
+      <w:proofErr w:type="spellStart"/>
+      <w:r>
+        <w:t>localoverrides</w:t>
+      </w:r>
+      <w:proofErr w:type="spellEnd"/>
+      <w:r>
+        <w:t xml:space="preserve"> gebruikt zijn.</w:t>
+      </w:r>
+    </w:p>
+    <w:p>
+      <w:pPr>
+        <w:pStyle w:val="Kop3"/>
+        <w:rPr>
+          <w:rFonts w:hint="eastAsia"/>
+        </w:rPr>
+      </w:pPr>
+      <w:proofErr w:type="spellStart"/>
+      <w:r>
+        <w:t>Fixes</w:t>
+      </w:r>
+      <w:proofErr w:type="spellEnd"/>
+    </w:p>
+    <w:p>
+      <w:pPr>
+        <w:numPr>
+          <w:ilvl w:val="0"/>
+          <w:numId w:val="10"/>
+        </w:numPr>
+        <w:rPr>
+          <w:rFonts w:hint="eastAsia"/>
+        </w:rPr>
+      </w:pPr>
+      <w:r>
+        <w:t>Geeft een melding als Settings.xml bij het opstarten niet geladen kon worden.</w:t>
+      </w:r>
+    </w:p>
+    <w:p>
+      <w:pPr>
+        <w:numPr>
+          <w:ilvl w:val="0"/>
+          <w:numId w:val="10"/>
+        </w:numPr>
+        <w:rPr>
+          <w:rFonts w:hint="eastAsia"/>
+        </w:rPr>
+      </w:pPr>
+      <w:r>
+        <w:t>Settings.xml schrijven herzien: schrijven update/</w:t>
+      </w:r>
+      <w:proofErr w:type="spellStart"/>
+      <w:r>
+        <w:t>insert</w:t>
+      </w:r>
+      <w:proofErr w:type="spellEnd"/>
+      <w:r>
+        <w:t xml:space="preserve"> nu alle tags in de gelezen file, </w:t>
+      </w:r>
+      <w:proofErr w:type="spellStart"/>
+      <w:r>
+        <w:t>ipv</w:t>
+      </w:r>
+      <w:proofErr w:type="spellEnd"/>
+      <w:r>
+        <w:t xml:space="preserve"> een volledig nieuwe file te schrijven, zodat eventuele nieuwere tags van een nieuwere versie blijven staan.</w:t>
+      </w:r>
+    </w:p>
+    <w:p>
+      <w:pPr>
+        <w:numPr>
+          <w:ilvl w:val="0"/>
+          <w:numId w:val="10"/>
+        </w:numPr>
+        <w:rPr>
+          <w:rFonts w:hint="eastAsia"/>
+        </w:rPr>
+      </w:pPr>
+      <w:r>
+        <w:t xml:space="preserve">Project </w:t>
+      </w:r>
+      <w:proofErr w:type="spellStart"/>
+      <w:r>
+        <w:t>Configuration</w:t>
+      </w:r>
+      <w:proofErr w:type="spellEnd"/>
+      <w:r>
+        <w:t xml:space="preserve">: </w:t>
+      </w:r>
+      <w:proofErr w:type="spellStart"/>
+      <w:r>
+        <w:t>Interframe</w:t>
+      </w:r>
+      <w:proofErr w:type="spellEnd"/>
+      <w:r>
+        <w:t>-delay: toont nu "0 (auto)" bij instelling 0.</w:t>
+      </w:r>
+    </w:p>
+    <w:p>
+      <w:pPr>
+        <w:numPr>
+          <w:ilvl w:val="0"/>
+          <w:numId w:val="10"/>
+        </w:numPr>
+        <w:rPr>
+          <w:rFonts w:hint="eastAsia"/>
+        </w:rPr>
+      </w:pPr>
+      <w:proofErr w:type="spellStart"/>
+      <w:r>
+        <w:t>Local</w:t>
       </w:r>
       <w:proofErr w:type="spellEnd"/>
       <w:r>
@@ -1694,7 +2668,26 @@
       </w:r>
       <w:proofErr w:type="spellStart"/>
       <w:r>
-        <w:t>Modbus</w:t>
+        <w:t>override</w:t>
+      </w:r>
+      <w:proofErr w:type="spellEnd"/>
+      <w:r>
+        <w:t xml:space="preserve"> project moet nu geen &lt;modbus&gt; element meer bevatten, is nu optioneel.</w:t>
+      </w:r>
+    </w:p>
+    <w:p>
+      <w:pPr>
+        <w:numPr>
+          <w:ilvl w:val="0"/>
+          <w:numId w:val="10"/>
+        </w:numPr>
+        <w:rPr>
+          <w:rFonts w:hint="eastAsia"/>
+        </w:rPr>
+      </w:pPr>
+      <w:proofErr w:type="spellStart"/>
+      <w:r>
+        <w:t>Dialog</w:t>
       </w:r>
       <w:proofErr w:type="spellEnd"/>
       <w:r>
@@ -1702,33 +2695,63 @@
       </w:r>
       <w:proofErr w:type="spellStart"/>
       <w:r>
-        <w:t>Command</w:t>
-      </w:r>
-      <w:proofErr w:type="spellEnd"/>
-      <w:r>
-        <w:t xml:space="preserve">: Geeft error bij te kort </w:t>
-      </w:r>
-      <w:proofErr w:type="spellStart"/>
-      <w:r>
-        <w:t>command</w:t>
-      </w:r>
-      <w:proofErr w:type="spellEnd"/>
-      <w:r>
-        <w:t>, moet minstens 2 bytes zijn.</w:t>
-      </w:r>
-    </w:p>
-    <w:p>
-      <w:pPr>
-        <w:numPr>
-          <w:ilvl w:val="0"/>
-          <w:numId w:val="8"/>
-        </w:numPr>
-        <w:rPr>
-          <w:rFonts w:hint="eastAsia"/>
-        </w:rPr>
-      </w:pPr>
-      <w:r>
-        <w:t>Fix backgroundkleur van registers.</w:t>
+        <w:t>forms</w:t>
+      </w:r>
+      <w:proofErr w:type="spellEnd"/>
+      <w:r>
+        <w:t xml:space="preserve"> kan je nu sluiten met de Enter toets.</w:t>
+      </w:r>
+    </w:p>
+    <w:p>
+      <w:pPr>
+        <w:numPr>
+          <w:ilvl w:val="0"/>
+          <w:numId w:val="10"/>
+        </w:numPr>
+        <w:rPr>
+          <w:rFonts w:hint="eastAsia"/>
+        </w:rPr>
+      </w:pPr>
+      <w:r>
+        <w:t xml:space="preserve">Een project laden wist nu de checkboxen van de ‘Save </w:t>
+      </w:r>
+      <w:proofErr w:type="spellStart"/>
+      <w:r>
+        <w:t>configuration</w:t>
+      </w:r>
+      <w:proofErr w:type="spellEnd"/>
+      <w:r>
+        <w:t xml:space="preserve"> </w:t>
+      </w:r>
+      <w:proofErr w:type="spellStart"/>
+      <w:r>
+        <w:t>to</w:t>
+      </w:r>
+      <w:proofErr w:type="spellEnd"/>
+      <w:r>
+        <w:t xml:space="preserve"> project file” form.</w:t>
+      </w:r>
+    </w:p>
+    <w:p>
+      <w:pPr>
+        <w:numPr>
+          <w:ilvl w:val="0"/>
+          <w:numId w:val="10"/>
+        </w:numPr>
+        <w:rPr>
+          <w:rFonts w:hint="eastAsia"/>
+        </w:rPr>
+      </w:pPr>
+      <w:r>
+        <w:t xml:space="preserve">Buttons die onderaan op de </w:t>
+      </w:r>
+      <w:proofErr w:type="spellStart"/>
+      <w:r>
+        <w:t>forms</w:t>
+      </w:r>
+      <w:proofErr w:type="spellEnd"/>
+      <w:r>
+        <w:t xml:space="preserve"> staan hebben nu wat meer ruimte onder de button.</w:t>
       </w:r>
     </w:p>
     <w:p>
@@ -1739,574 +2762,90 @@
         </w:rPr>
       </w:pPr>
       <w:r>
+        <w:t>v2.0.8</w:t>
+      </w:r>
+      <w:r>
+        <w:t xml:space="preserve"> --</w:t>
+      </w:r>
+      <w:r>
+        <w:t xml:space="preserve"> 2018-08-02</w:t>
+      </w:r>
+    </w:p>
+    <w:p>
+      <w:pPr>
+        <w:pStyle w:val="Kop3"/>
+        <w:rPr>
+          <w:rFonts w:hint="eastAsia"/>
+        </w:rPr>
+      </w:pPr>
+      <w:r>
+        <w:t>Features</w:t>
+      </w:r>
+    </w:p>
+    <w:p>
+      <w:pPr>
+        <w:numPr>
+          <w:ilvl w:val="0"/>
+          <w:numId w:val="11"/>
+        </w:numPr>
+        <w:rPr>
+          <w:rFonts w:hint="eastAsia"/>
+        </w:rPr>
+      </w:pPr>
+      <w:r>
+        <w:t xml:space="preserve">Volledige </w:t>
+      </w:r>
+      <w:proofErr w:type="spellStart"/>
+      <w:r>
+        <w:t>rewrite</w:t>
+      </w:r>
+      <w:proofErr w:type="spellEnd"/>
+      <w:r>
+        <w:t>, met menu’s en toolbar.</w:t>
+      </w:r>
+    </w:p>
+    <w:p>
+      <w:pPr>
+        <w:numPr>
+          <w:ilvl w:val="0"/>
+          <w:numId w:val="11"/>
+        </w:numPr>
+        <w:rPr>
+          <w:rFonts w:hint="eastAsia"/>
+        </w:rPr>
+      </w:pPr>
+      <w:r>
+        <w:t xml:space="preserve">Kan project configuratie, bridge </w:t>
+      </w:r>
+      <w:proofErr w:type="spellStart"/>
+      <w:r>
+        <w:t>settings</w:t>
+      </w:r>
+      <w:proofErr w:type="spellEnd"/>
+      <w:r>
+        <w:t xml:space="preserve"> en form </w:t>
+      </w:r>
+      <w:proofErr w:type="spellStart"/>
+      <w:r>
+        <w:t>size</w:t>
+      </w:r>
+      <w:proofErr w:type="spellEnd"/>
+      <w:r>
+        <w:t xml:space="preserve"> in mbc file saven. </w:t>
+      </w:r>
+    </w:p>
+    <w:p>
+      <w:pPr>
+        <w:numPr>
+          <w:ilvl w:val="0"/>
+          <w:numId w:val="11"/>
+        </w:numPr>
+        <w:rPr>
+          <w:rFonts w:hint="eastAsia"/>
+        </w:rPr>
+      </w:pPr>
+      <w:r>
         <w:lastRenderedPageBreak/>
-        <w:t>v2.0.9 * 2018-10-20</w:t>
-      </w:r>
-    </w:p>
-    <w:p>
-      <w:pPr>
-        <w:pStyle w:val="Kop3"/>
-        <w:rPr>
-          <w:rFonts w:hint="eastAsia"/>
-        </w:rPr>
-      </w:pPr>
-      <w:r>
-        <w:t>Features</w:t>
-      </w:r>
-    </w:p>
-    <w:p>
-      <w:pPr>
-        <w:numPr>
-          <w:ilvl w:val="0"/>
-          <w:numId w:val="9"/>
-        </w:numPr>
-        <w:rPr>
-          <w:rFonts w:hint="eastAsia"/>
-        </w:rPr>
-      </w:pPr>
-      <w:r>
-        <w:t xml:space="preserve">Nieuwe optie: “Move </w:t>
-      </w:r>
-      <w:proofErr w:type="spellStart"/>
-      <w:r>
-        <w:t>to</w:t>
-      </w:r>
-      <w:proofErr w:type="spellEnd"/>
-      <w:r>
-        <w:t xml:space="preserve"> next </w:t>
-      </w:r>
-      <w:proofErr w:type="spellStart"/>
-      <w:r>
-        <w:t>row</w:t>
-      </w:r>
-      <w:proofErr w:type="spellEnd"/>
-      <w:r>
-        <w:t xml:space="preserve"> on Enter”.</w:t>
-      </w:r>
-    </w:p>
-    <w:p>
-      <w:pPr>
-        <w:numPr>
-          <w:ilvl w:val="0"/>
-          <w:numId w:val="9"/>
-        </w:numPr>
-        <w:rPr>
-          <w:rFonts w:hint="eastAsia"/>
-        </w:rPr>
-      </w:pPr>
-      <w:r>
-        <w:t xml:space="preserve">Nieuwe optie: “Auto-start </w:t>
-      </w:r>
-      <w:proofErr w:type="spellStart"/>
-      <w:r>
-        <w:t>edit</w:t>
-      </w:r>
-      <w:proofErr w:type="spellEnd"/>
-      <w:r>
-        <w:t xml:space="preserve"> mode on </w:t>
-      </w:r>
-      <w:proofErr w:type="spellStart"/>
-      <w:r>
-        <w:t>typing</w:t>
-      </w:r>
-      <w:proofErr w:type="spellEnd"/>
-      <w:r>
-        <w:t xml:space="preserve">”. </w:t>
-      </w:r>
-    </w:p>
-    <w:p>
-      <w:pPr>
-        <w:numPr>
-          <w:ilvl w:val="0"/>
-          <w:numId w:val="9"/>
-        </w:numPr>
-        <w:rPr>
-          <w:rFonts w:hint="eastAsia"/>
-        </w:rPr>
-      </w:pPr>
-      <w:r>
-        <w:t>Nieuwe optie: “</w:t>
-      </w:r>
-      <w:proofErr w:type="spellStart"/>
-      <w:r>
-        <w:t>Use</w:t>
-      </w:r>
-      <w:proofErr w:type="spellEnd"/>
-      <w:r>
-        <w:t xml:space="preserve"> </w:t>
-      </w:r>
-      <w:proofErr w:type="spellStart"/>
-      <w:r>
-        <w:t>custom</w:t>
-      </w:r>
-      <w:proofErr w:type="spellEnd"/>
-      <w:r>
-        <w:t xml:space="preserve"> editor”. </w:t>
-      </w:r>
-    </w:p>
-    <w:p>
-      <w:pPr>
-        <w:numPr>
-          <w:ilvl w:val="0"/>
-          <w:numId w:val="9"/>
-        </w:numPr>
-        <w:rPr>
-          <w:rFonts w:hint="eastAsia"/>
-        </w:rPr>
-      </w:pPr>
-      <w:r>
-        <w:t>Nieuwe optie: “</w:t>
-      </w:r>
-      <w:proofErr w:type="spellStart"/>
-      <w:r>
-        <w:t>Ignore</w:t>
-      </w:r>
-      <w:proofErr w:type="spellEnd"/>
-      <w:r>
-        <w:t xml:space="preserve"> form </w:t>
-      </w:r>
-      <w:proofErr w:type="spellStart"/>
-      <w:r>
-        <w:t>size</w:t>
-      </w:r>
-      <w:proofErr w:type="spellEnd"/>
-      <w:r>
-        <w:t xml:space="preserve"> on project </w:t>
-      </w:r>
-      <w:proofErr w:type="spellStart"/>
-      <w:r>
-        <w:t>reload</w:t>
-      </w:r>
-      <w:proofErr w:type="spellEnd"/>
-      <w:r>
-        <w:t>”.</w:t>
-      </w:r>
-    </w:p>
-    <w:p>
-      <w:pPr>
-        <w:numPr>
-          <w:ilvl w:val="0"/>
-          <w:numId w:val="9"/>
-        </w:numPr>
-        <w:rPr>
-          <w:rFonts w:hint="eastAsia"/>
-        </w:rPr>
-      </w:pPr>
-      <w:proofErr w:type="spellStart"/>
-      <w:r>
-        <w:t>Config</w:t>
-      </w:r>
-      <w:proofErr w:type="spellEnd"/>
-      <w:r>
-        <w:t xml:space="preserve"> form heeft nu een </w:t>
-      </w:r>
-      <w:proofErr w:type="spellStart"/>
-      <w:r>
-        <w:t>Apply</w:t>
-      </w:r>
-      <w:proofErr w:type="spellEnd"/>
-      <w:r>
-        <w:t xml:space="preserve"> button.</w:t>
-      </w:r>
-    </w:p>
-    <w:p>
-      <w:pPr>
-        <w:numPr>
-          <w:ilvl w:val="0"/>
-          <w:numId w:val="9"/>
-        </w:numPr>
-        <w:rPr>
-          <w:rFonts w:hint="eastAsia"/>
-        </w:rPr>
-      </w:pPr>
-      <w:r>
-        <w:t xml:space="preserve">Aparte line-copy en </w:t>
-      </w:r>
-      <w:proofErr w:type="spellStart"/>
-      <w:r>
-        <w:t>value</w:t>
-      </w:r>
-      <w:proofErr w:type="spellEnd"/>
-      <w:r>
-        <w:t xml:space="preserve">-copy in </w:t>
-      </w:r>
-      <w:proofErr w:type="spellStart"/>
-      <w:r>
-        <w:t>grid</w:t>
-      </w:r>
-      <w:proofErr w:type="spellEnd"/>
-      <w:r>
-        <w:t>, via control-C en context menu.</w:t>
-      </w:r>
-    </w:p>
-    <w:p>
-      <w:pPr>
-        <w:numPr>
-          <w:ilvl w:val="0"/>
-          <w:numId w:val="9"/>
-        </w:numPr>
-        <w:rPr>
-          <w:rFonts w:hint="eastAsia"/>
-        </w:rPr>
-      </w:pPr>
-      <w:r>
-        <w:t xml:space="preserve">De statusbar wordt nu blauw gekleurd als er geen connectie is of geen </w:t>
-      </w:r>
-      <w:proofErr w:type="spellStart"/>
-      <w:r>
-        <w:t>polling</w:t>
-      </w:r>
-      <w:proofErr w:type="spellEnd"/>
-      <w:r>
-        <w:t xml:space="preserve"> wordt gedaan.</w:t>
-      </w:r>
-    </w:p>
-    <w:p>
-      <w:pPr>
-        <w:numPr>
-          <w:ilvl w:val="0"/>
-          <w:numId w:val="9"/>
-        </w:numPr>
-        <w:rPr>
-          <w:rFonts w:hint="eastAsia"/>
-        </w:rPr>
-      </w:pPr>
-      <w:r>
-        <w:t>De statusbar wordt nu rood gekleurd bij errors.</w:t>
-      </w:r>
-    </w:p>
-    <w:p>
-      <w:pPr>
-        <w:numPr>
-          <w:ilvl w:val="0"/>
-          <w:numId w:val="9"/>
-        </w:numPr>
-        <w:rPr>
-          <w:rFonts w:hint="eastAsia"/>
-        </w:rPr>
-      </w:pPr>
-      <w:r>
-        <w:t xml:space="preserve">Geeft nu een </w:t>
-      </w:r>
-      <w:proofErr w:type="spellStart"/>
-      <w:r>
-        <w:t>warning</w:t>
-      </w:r>
-      <w:proofErr w:type="spellEnd"/>
-      <w:r>
-        <w:t xml:space="preserve"> in de “Save </w:t>
-      </w:r>
-      <w:proofErr w:type="spellStart"/>
-      <w:r>
-        <w:t>configuration</w:t>
-      </w:r>
-      <w:proofErr w:type="spellEnd"/>
-      <w:r>
-        <w:t xml:space="preserve"> </w:t>
-      </w:r>
-      <w:proofErr w:type="spellStart"/>
-      <w:r>
-        <w:t>to</w:t>
-      </w:r>
-      <w:proofErr w:type="spellEnd"/>
-      <w:r>
-        <w:t xml:space="preserve"> project file” en “Project </w:t>
-      </w:r>
-      <w:proofErr w:type="spellStart"/>
-      <w:r>
-        <w:t>configuration</w:t>
-      </w:r>
-      <w:proofErr w:type="spellEnd"/>
-      <w:r>
-        <w:t xml:space="preserve">” schermen als er </w:t>
-      </w:r>
-      <w:proofErr w:type="spellStart"/>
-      <w:r>
-        <w:t>localoverrides</w:t>
-      </w:r>
-      <w:proofErr w:type="spellEnd"/>
-      <w:r>
-        <w:t xml:space="preserve"> gebruikt zijn.</w:t>
-      </w:r>
-    </w:p>
-    <w:p>
-      <w:pPr>
-        <w:pStyle w:val="Kop3"/>
-        <w:rPr>
-          <w:rFonts w:hint="eastAsia"/>
-        </w:rPr>
-      </w:pPr>
-      <w:proofErr w:type="spellStart"/>
-      <w:r>
-        <w:t>Fixes</w:t>
-      </w:r>
-      <w:proofErr w:type="spellEnd"/>
-    </w:p>
-    <w:p>
-      <w:pPr>
-        <w:numPr>
-          <w:ilvl w:val="0"/>
-          <w:numId w:val="10"/>
-        </w:numPr>
-        <w:rPr>
-          <w:rFonts w:hint="eastAsia"/>
-        </w:rPr>
-      </w:pPr>
-      <w:r>
-        <w:t>Geeft een melding als Settings.xml bij het opstarten niet geladen kon worden.</w:t>
-      </w:r>
-    </w:p>
-    <w:p>
-      <w:pPr>
-        <w:numPr>
-          <w:ilvl w:val="0"/>
-          <w:numId w:val="10"/>
-        </w:numPr>
-        <w:rPr>
-          <w:rFonts w:hint="eastAsia"/>
-        </w:rPr>
-      </w:pPr>
-      <w:r>
-        <w:t>Settings.xml schrijven herzien: schrijven update/</w:t>
-      </w:r>
-      <w:proofErr w:type="spellStart"/>
-      <w:r>
-        <w:t>insert</w:t>
-      </w:r>
-      <w:proofErr w:type="spellEnd"/>
-      <w:r>
-        <w:t xml:space="preserve"> nu alle tags in de gelezen file, </w:t>
-      </w:r>
-      <w:proofErr w:type="spellStart"/>
-      <w:r>
-        <w:t>ipv</w:t>
-      </w:r>
-      <w:proofErr w:type="spellEnd"/>
-      <w:r>
-        <w:t xml:space="preserve"> een volledig nieuwe file te schrijven, zodat eventuele nieuwere tags van een nieuwere versie blijven staan.</w:t>
-      </w:r>
-    </w:p>
-    <w:p>
-      <w:pPr>
-        <w:numPr>
-          <w:ilvl w:val="0"/>
-          <w:numId w:val="10"/>
-        </w:numPr>
-        <w:rPr>
-          <w:rFonts w:hint="eastAsia"/>
-        </w:rPr>
-      </w:pPr>
-      <w:r>
-        <w:t xml:space="preserve">Project </w:t>
-      </w:r>
-      <w:proofErr w:type="spellStart"/>
-      <w:r>
-        <w:t>Configuration</w:t>
-      </w:r>
-      <w:proofErr w:type="spellEnd"/>
-      <w:r>
-        <w:t xml:space="preserve">: </w:t>
-      </w:r>
-      <w:proofErr w:type="spellStart"/>
-      <w:r>
-        <w:t>Interframe</w:t>
-      </w:r>
-      <w:proofErr w:type="spellEnd"/>
-      <w:r>
-        <w:t>-delay: toont nu "0 (auto)" bij instelling 0.</w:t>
-      </w:r>
-    </w:p>
-    <w:p>
-      <w:pPr>
-        <w:numPr>
-          <w:ilvl w:val="0"/>
-          <w:numId w:val="10"/>
-        </w:numPr>
-        <w:rPr>
-          <w:rFonts w:hint="eastAsia"/>
-        </w:rPr>
-      </w:pPr>
-      <w:proofErr w:type="spellStart"/>
-      <w:r>
-        <w:t>Local</w:t>
-      </w:r>
-      <w:proofErr w:type="spellEnd"/>
-      <w:r>
-        <w:t xml:space="preserve"> </w:t>
-      </w:r>
-      <w:proofErr w:type="spellStart"/>
-      <w:r>
-        <w:t>override</w:t>
-      </w:r>
-      <w:proofErr w:type="spellEnd"/>
-      <w:r>
-        <w:t xml:space="preserve"> project moet nu geen &lt;modbus&gt; element meer bevatten, is nu optioneel.</w:t>
-      </w:r>
-    </w:p>
-    <w:p>
-      <w:pPr>
-        <w:numPr>
-          <w:ilvl w:val="0"/>
-          <w:numId w:val="10"/>
-        </w:numPr>
-        <w:rPr>
-          <w:rFonts w:hint="eastAsia"/>
-        </w:rPr>
-      </w:pPr>
-      <w:proofErr w:type="spellStart"/>
-      <w:r>
-        <w:t>Dialog</w:t>
-      </w:r>
-      <w:proofErr w:type="spellEnd"/>
-      <w:r>
-        <w:t xml:space="preserve"> </w:t>
-      </w:r>
-      <w:proofErr w:type="spellStart"/>
-      <w:r>
-        <w:t>forms</w:t>
-      </w:r>
-      <w:proofErr w:type="spellEnd"/>
-      <w:r>
-        <w:t xml:space="preserve"> kan je nu sluiten met de Enter toets.</w:t>
-      </w:r>
-    </w:p>
-    <w:p>
-      <w:pPr>
-        <w:numPr>
-          <w:ilvl w:val="0"/>
-          <w:numId w:val="10"/>
-        </w:numPr>
-        <w:rPr>
-          <w:rFonts w:hint="eastAsia"/>
-        </w:rPr>
-      </w:pPr>
-      <w:r>
-        <w:t xml:space="preserve">Een project laden wist nu de checkboxen van de ‘Save </w:t>
-      </w:r>
-      <w:proofErr w:type="spellStart"/>
-      <w:r>
-        <w:t>configuration</w:t>
-      </w:r>
-      <w:proofErr w:type="spellEnd"/>
-      <w:r>
-        <w:t xml:space="preserve"> </w:t>
-      </w:r>
-      <w:proofErr w:type="spellStart"/>
-      <w:r>
-        <w:t>to</w:t>
-      </w:r>
-      <w:proofErr w:type="spellEnd"/>
-      <w:r>
-        <w:t xml:space="preserve"> project file” form.</w:t>
-      </w:r>
-    </w:p>
-    <w:p>
-      <w:pPr>
-        <w:numPr>
-          <w:ilvl w:val="0"/>
-          <w:numId w:val="10"/>
-        </w:numPr>
-        <w:rPr>
-          <w:rFonts w:hint="eastAsia"/>
-        </w:rPr>
-      </w:pPr>
-      <w:r>
-        <w:t xml:space="preserve">Buttons die onderaan op de </w:t>
-      </w:r>
-      <w:proofErr w:type="spellStart"/>
-      <w:r>
-        <w:t>forms</w:t>
-      </w:r>
-      <w:proofErr w:type="spellEnd"/>
-      <w:r>
-        <w:t xml:space="preserve"> staan hebben nu wat meer ruimte onder de button.</w:t>
-      </w:r>
-    </w:p>
-    <w:p>
-      <w:pPr>
-        <w:pStyle w:val="Kop1"/>
-        <w:rPr>
-          <w:rFonts w:hint="eastAsia"/>
-        </w:rPr>
-      </w:pPr>
-      <w:r>
-        <w:t>v2.0.8 * 2018-08-02</w:t>
-      </w:r>
-    </w:p>
-    <w:p>
-      <w:pPr>
-        <w:pStyle w:val="Kop3"/>
-        <w:rPr>
-          <w:rFonts w:hint="eastAsia"/>
-        </w:rPr>
-      </w:pPr>
-      <w:r>
-        <w:t>Features</w:t>
-      </w:r>
-    </w:p>
-    <w:p>
-      <w:pPr>
-        <w:numPr>
-          <w:ilvl w:val="0"/>
-          <w:numId w:val="11"/>
-        </w:numPr>
-        <w:rPr>
-          <w:rFonts w:hint="eastAsia"/>
-        </w:rPr>
-      </w:pPr>
-      <w:r>
-        <w:t xml:space="preserve">Volledige </w:t>
-      </w:r>
-      <w:proofErr w:type="spellStart"/>
-      <w:r>
-        <w:t>rewrite</w:t>
-      </w:r>
-      <w:proofErr w:type="spellEnd"/>
-      <w:r>
-        <w:t>, met menu’s en toolbar.</w:t>
-      </w:r>
-    </w:p>
-    <w:p>
-      <w:pPr>
-        <w:numPr>
-          <w:ilvl w:val="0"/>
-          <w:numId w:val="11"/>
-        </w:numPr>
-        <w:rPr>
-          <w:rFonts w:hint="eastAsia"/>
-        </w:rPr>
-      </w:pPr>
-      <w:r>
-        <w:t xml:space="preserve">Kan project configuratie, bridge </w:t>
-      </w:r>
-      <w:proofErr w:type="spellStart"/>
-      <w:r>
-        <w:t>settings</w:t>
-      </w:r>
-      <w:proofErr w:type="spellEnd"/>
-      <w:r>
-        <w:t xml:space="preserve"> en form </w:t>
-      </w:r>
-      <w:proofErr w:type="spellStart"/>
-      <w:r>
-        <w:t>size</w:t>
-      </w:r>
-      <w:proofErr w:type="spellEnd"/>
-      <w:r>
-        <w:t xml:space="preserve"> in mbc file saven. </w:t>
-      </w:r>
-    </w:p>
-    <w:p>
-      <w:pPr>
-        <w:numPr>
-          <w:ilvl w:val="0"/>
-          <w:numId w:val="11"/>
-        </w:numPr>
-        <w:rPr>
-          <w:rFonts w:hint="eastAsia"/>
-        </w:rPr>
-      </w:pPr>
-      <w:r>
         <w:t>Communicatie pauze en poll-</w:t>
       </w:r>
       <w:proofErr w:type="spellStart"/>
@@ -3340,6 +3879,119 @@
     </w:lvl>
   </w:abstractNum>
   <w:abstractNum w:abstractNumId="6" w15:restartNumberingAfterBreak="0">
+    <w:nsid w:val="11A053D6"/>
+    <w:multiLevelType w:val="hybridMultilevel"/>
+    <w:tmpl w:val="FA808510"/>
+    <w:lvl w:ilvl="0" w:tplc="08130001">
+      <w:start w:val="1"/>
+      <w:numFmt w:val="bullet"/>
+      <w:lvlText w:val=""/>
+      <w:lvlJc w:val="left"/>
+      <w:pPr>
+        <w:ind w:left="1040" w:hanging="360"/>
+      </w:pPr>
+      <w:rPr>
+        <w:rFonts w:ascii="Symbol" w:hAnsi="Symbol" w:hint="default"/>
+      </w:rPr>
+    </w:lvl>
+    <w:lvl w:ilvl="1" w:tplc="08130003" w:tentative="1">
+      <w:start w:val="1"/>
+      <w:numFmt w:val="bullet"/>
+      <w:lvlText w:val="o"/>
+      <w:lvlJc w:val="left"/>
+      <w:pPr>
+        <w:ind w:left="1760" w:hanging="360"/>
+      </w:pPr>
+      <w:rPr>
+        <w:rFonts w:ascii="Courier New" w:hAnsi="Courier New" w:cs="Courier New" w:hint="default"/>
+      </w:rPr>
+    </w:lvl>
+    <w:lvl w:ilvl="2" w:tplc="08130005" w:tentative="1">
+      <w:start w:val="1"/>
+      <w:numFmt w:val="bullet"/>
+      <w:lvlText w:val=""/>
+      <w:lvlJc w:val="left"/>
+      <w:pPr>
+        <w:ind w:left="2480" w:hanging="360"/>
+      </w:pPr>
+      <w:rPr>
+        <w:rFonts w:ascii="Wingdings" w:hAnsi="Wingdings" w:hint="default"/>
+      </w:rPr>
+    </w:lvl>
+    <w:lvl w:ilvl="3" w:tplc="08130001" w:tentative="1">
+      <w:start w:val="1"/>
+      <w:numFmt w:val="bullet"/>
+      <w:lvlText w:val=""/>
+      <w:lvlJc w:val="left"/>
+      <w:pPr>
+        <w:ind w:left="3200" w:hanging="360"/>
+      </w:pPr>
+      <w:rPr>
+        <w:rFonts w:ascii="Symbol" w:hAnsi="Symbol" w:hint="default"/>
+      </w:rPr>
+    </w:lvl>
+    <w:lvl w:ilvl="4" w:tplc="08130003" w:tentative="1">
+      <w:start w:val="1"/>
+      <w:numFmt w:val="bullet"/>
+      <w:lvlText w:val="o"/>
+      <w:lvlJc w:val="left"/>
+      <w:pPr>
+        <w:ind w:left="3920" w:hanging="360"/>
+      </w:pPr>
+      <w:rPr>
+        <w:rFonts w:ascii="Courier New" w:hAnsi="Courier New" w:cs="Courier New" w:hint="default"/>
+      </w:rPr>
+    </w:lvl>
+    <w:lvl w:ilvl="5" w:tplc="08130005" w:tentative="1">
+      <w:start w:val="1"/>
+      <w:numFmt w:val="bullet"/>
+      <w:lvlText w:val=""/>
+      <w:lvlJc w:val="left"/>
+      <w:pPr>
+        <w:ind w:left="4640" w:hanging="360"/>
+      </w:pPr>
+      <w:rPr>
+        <w:rFonts w:ascii="Wingdings" w:hAnsi="Wingdings" w:hint="default"/>
+      </w:rPr>
+    </w:lvl>
+    <w:lvl w:ilvl="6" w:tplc="08130001" w:tentative="1">
+      <w:start w:val="1"/>
+      <w:numFmt w:val="bullet"/>
+      <w:lvlText w:val=""/>
+      <w:lvlJc w:val="left"/>
+      <w:pPr>
+        <w:ind w:left="5360" w:hanging="360"/>
+      </w:pPr>
+      <w:rPr>
+        <w:rFonts w:ascii="Symbol" w:hAnsi="Symbol" w:hint="default"/>
+      </w:rPr>
+    </w:lvl>
+    <w:lvl w:ilvl="7" w:tplc="08130003" w:tentative="1">
+      <w:start w:val="1"/>
+      <w:numFmt w:val="bullet"/>
+      <w:lvlText w:val="o"/>
+      <w:lvlJc w:val="left"/>
+      <w:pPr>
+        <w:ind w:left="6080" w:hanging="360"/>
+      </w:pPr>
+      <w:rPr>
+        <w:rFonts w:ascii="Courier New" w:hAnsi="Courier New" w:cs="Courier New" w:hint="default"/>
+      </w:rPr>
+    </w:lvl>
+    <w:lvl w:ilvl="8" w:tplc="08130005" w:tentative="1">
+      <w:start w:val="1"/>
+      <w:numFmt w:val="bullet"/>
+      <w:lvlText w:val=""/>
+      <w:lvlJc w:val="left"/>
+      <w:pPr>
+        <w:ind w:left="6800" w:hanging="360"/>
+      </w:pPr>
+      <w:rPr>
+        <w:rFonts w:ascii="Wingdings" w:hAnsi="Wingdings" w:hint="default"/>
+      </w:rPr>
+    </w:lvl>
+  </w:abstractNum>
+  <w:abstractNum w:abstractNumId="7" w15:restartNumberingAfterBreak="0">
     <w:nsid w:val="16491B67"/>
     <w:multiLevelType w:val="hybridMultilevel"/>
     <w:tmpl w:val="DD48BBB0"/>
@@ -3452,7 +4104,7 @@
       </w:rPr>
     </w:lvl>
   </w:abstractNum>
-  <w:abstractNum w:abstractNumId="7" w15:restartNumberingAfterBreak="0">
+  <w:abstractNum w:abstractNumId="8" w15:restartNumberingAfterBreak="0">
     <w:nsid w:val="19B15B93"/>
     <w:multiLevelType w:val="hybridMultilevel"/>
     <w:tmpl w:val="B21444D0"/>
@@ -3565,7 +4217,7 @@
       </w:rPr>
     </w:lvl>
   </w:abstractNum>
-  <w:abstractNum w:abstractNumId="8" w15:restartNumberingAfterBreak="0">
+  <w:abstractNum w:abstractNumId="9" w15:restartNumberingAfterBreak="0">
     <w:nsid w:val="1C616AFA"/>
     <w:multiLevelType w:val="hybridMultilevel"/>
     <w:tmpl w:val="A814883A"/>
@@ -3678,7 +4330,7 @@
       </w:rPr>
     </w:lvl>
   </w:abstractNum>
-  <w:abstractNum w:abstractNumId="9" w15:restartNumberingAfterBreak="0">
+  <w:abstractNum w:abstractNumId="10" w15:restartNumberingAfterBreak="0">
     <w:nsid w:val="22AE389B"/>
     <w:multiLevelType w:val="hybridMultilevel"/>
     <w:tmpl w:val="A50AEB9C"/>
@@ -3791,7 +4443,7 @@
       </w:rPr>
     </w:lvl>
   </w:abstractNum>
-  <w:abstractNum w:abstractNumId="10" w15:restartNumberingAfterBreak="0">
+  <w:abstractNum w:abstractNumId="11" w15:restartNumberingAfterBreak="0">
     <w:nsid w:val="24306C67"/>
     <w:multiLevelType w:val="hybridMultilevel"/>
     <w:tmpl w:val="FEC69C5A"/>
@@ -3904,7 +4556,120 @@
       </w:rPr>
     </w:lvl>
   </w:abstractNum>
-  <w:abstractNum w:abstractNumId="11" w15:restartNumberingAfterBreak="0">
+  <w:abstractNum w:abstractNumId="12" w15:restartNumberingAfterBreak="0">
+    <w:nsid w:val="29F2595A"/>
+    <w:multiLevelType w:val="hybridMultilevel"/>
+    <w:tmpl w:val="4DFC4C3E"/>
+    <w:lvl w:ilvl="0" w:tplc="08130001">
+      <w:start w:val="1"/>
+      <w:numFmt w:val="bullet"/>
+      <w:lvlText w:val=""/>
+      <w:lvlJc w:val="left"/>
+      <w:pPr>
+        <w:ind w:left="1040" w:hanging="360"/>
+      </w:pPr>
+      <w:rPr>
+        <w:rFonts w:ascii="Symbol" w:hAnsi="Symbol" w:hint="default"/>
+      </w:rPr>
+    </w:lvl>
+    <w:lvl w:ilvl="1" w:tplc="08130003" w:tentative="1">
+      <w:start w:val="1"/>
+      <w:numFmt w:val="bullet"/>
+      <w:lvlText w:val="o"/>
+      <w:lvlJc w:val="left"/>
+      <w:pPr>
+        <w:ind w:left="1760" w:hanging="360"/>
+      </w:pPr>
+      <w:rPr>
+        <w:rFonts w:ascii="Courier New" w:hAnsi="Courier New" w:cs="Courier New" w:hint="default"/>
+      </w:rPr>
+    </w:lvl>
+    <w:lvl w:ilvl="2" w:tplc="08130005" w:tentative="1">
+      <w:start w:val="1"/>
+      <w:numFmt w:val="bullet"/>
+      <w:lvlText w:val=""/>
+      <w:lvlJc w:val="left"/>
+      <w:pPr>
+        <w:ind w:left="2480" w:hanging="360"/>
+      </w:pPr>
+      <w:rPr>
+        <w:rFonts w:ascii="Wingdings" w:hAnsi="Wingdings" w:hint="default"/>
+      </w:rPr>
+    </w:lvl>
+    <w:lvl w:ilvl="3" w:tplc="08130001" w:tentative="1">
+      <w:start w:val="1"/>
+      <w:numFmt w:val="bullet"/>
+      <w:lvlText w:val=""/>
+      <w:lvlJc w:val="left"/>
+      <w:pPr>
+        <w:ind w:left="3200" w:hanging="360"/>
+      </w:pPr>
+      <w:rPr>
+        <w:rFonts w:ascii="Symbol" w:hAnsi="Symbol" w:hint="default"/>
+      </w:rPr>
+    </w:lvl>
+    <w:lvl w:ilvl="4" w:tplc="08130003" w:tentative="1">
+      <w:start w:val="1"/>
+      <w:numFmt w:val="bullet"/>
+      <w:lvlText w:val="o"/>
+      <w:lvlJc w:val="left"/>
+      <w:pPr>
+        <w:ind w:left="3920" w:hanging="360"/>
+      </w:pPr>
+      <w:rPr>
+        <w:rFonts w:ascii="Courier New" w:hAnsi="Courier New" w:cs="Courier New" w:hint="default"/>
+      </w:rPr>
+    </w:lvl>
+    <w:lvl w:ilvl="5" w:tplc="08130005" w:tentative="1">
+      <w:start w:val="1"/>
+      <w:numFmt w:val="bullet"/>
+      <w:lvlText w:val=""/>
+      <w:lvlJc w:val="left"/>
+      <w:pPr>
+        <w:ind w:left="4640" w:hanging="360"/>
+      </w:pPr>
+      <w:rPr>
+        <w:rFonts w:ascii="Wingdings" w:hAnsi="Wingdings" w:hint="default"/>
+      </w:rPr>
+    </w:lvl>
+    <w:lvl w:ilvl="6" w:tplc="08130001" w:tentative="1">
+      <w:start w:val="1"/>
+      <w:numFmt w:val="bullet"/>
+      <w:lvlText w:val=""/>
+      <w:lvlJc w:val="left"/>
+      <w:pPr>
+        <w:ind w:left="5360" w:hanging="360"/>
+      </w:pPr>
+      <w:rPr>
+        <w:rFonts w:ascii="Symbol" w:hAnsi="Symbol" w:hint="default"/>
+      </w:rPr>
+    </w:lvl>
+    <w:lvl w:ilvl="7" w:tplc="08130003" w:tentative="1">
+      <w:start w:val="1"/>
+      <w:numFmt w:val="bullet"/>
+      <w:lvlText w:val="o"/>
+      <w:lvlJc w:val="left"/>
+      <w:pPr>
+        <w:ind w:left="6080" w:hanging="360"/>
+      </w:pPr>
+      <w:rPr>
+        <w:rFonts w:ascii="Courier New" w:hAnsi="Courier New" w:cs="Courier New" w:hint="default"/>
+      </w:rPr>
+    </w:lvl>
+    <w:lvl w:ilvl="8" w:tplc="08130005" w:tentative="1">
+      <w:start w:val="1"/>
+      <w:numFmt w:val="bullet"/>
+      <w:lvlText w:val=""/>
+      <w:lvlJc w:val="left"/>
+      <w:pPr>
+        <w:ind w:left="6800" w:hanging="360"/>
+      </w:pPr>
+      <w:rPr>
+        <w:rFonts w:ascii="Wingdings" w:hAnsi="Wingdings" w:hint="default"/>
+      </w:rPr>
+    </w:lvl>
+  </w:abstractNum>
+  <w:abstractNum w:abstractNumId="13" w15:restartNumberingAfterBreak="0">
     <w:nsid w:val="3A132DC8"/>
     <w:multiLevelType w:val="hybridMultilevel"/>
     <w:tmpl w:val="FD8A1BD8"/>
@@ -4017,7 +4782,7 @@
       </w:rPr>
     </w:lvl>
   </w:abstractNum>
-  <w:abstractNum w:abstractNumId="12" w15:restartNumberingAfterBreak="0">
+  <w:abstractNum w:abstractNumId="14" w15:restartNumberingAfterBreak="0">
     <w:nsid w:val="4B820286"/>
     <w:multiLevelType w:val="hybridMultilevel"/>
     <w:tmpl w:val="1324B054"/>
@@ -4130,7 +4895,7 @@
       </w:rPr>
     </w:lvl>
   </w:abstractNum>
-  <w:abstractNum w:abstractNumId="13" w15:restartNumberingAfterBreak="0">
+  <w:abstractNum w:abstractNumId="15" w15:restartNumberingAfterBreak="0">
     <w:nsid w:val="4DAB5132"/>
     <w:multiLevelType w:val="hybridMultilevel"/>
     <w:tmpl w:val="C95C6250"/>
@@ -4243,7 +5008,7 @@
       </w:rPr>
     </w:lvl>
   </w:abstractNum>
-  <w:abstractNum w:abstractNumId="14" w15:restartNumberingAfterBreak="0">
+  <w:abstractNum w:abstractNumId="16" w15:restartNumberingAfterBreak="0">
     <w:nsid w:val="50FD3E19"/>
     <w:multiLevelType w:val="hybridMultilevel"/>
     <w:tmpl w:val="47EEFE78"/>
@@ -4356,7 +5121,7 @@
       </w:rPr>
     </w:lvl>
   </w:abstractNum>
-  <w:abstractNum w:abstractNumId="15" w15:restartNumberingAfterBreak="0">
+  <w:abstractNum w:abstractNumId="17" w15:restartNumberingAfterBreak="0">
     <w:nsid w:val="5A94222A"/>
     <w:multiLevelType w:val="hybridMultilevel"/>
     <w:tmpl w:val="B1FA5430"/>
@@ -4469,7 +5234,7 @@
       </w:rPr>
     </w:lvl>
   </w:abstractNum>
-  <w:abstractNum w:abstractNumId="16" w15:restartNumberingAfterBreak="0">
+  <w:abstractNum w:abstractNumId="18" w15:restartNumberingAfterBreak="0">
     <w:nsid w:val="647F23D0"/>
     <w:multiLevelType w:val="hybridMultilevel"/>
     <w:tmpl w:val="1B0841BE"/>
@@ -4582,7 +5347,7 @@
       </w:rPr>
     </w:lvl>
   </w:abstractNum>
-  <w:abstractNum w:abstractNumId="17" w15:restartNumberingAfterBreak="0">
+  <w:abstractNum w:abstractNumId="19" w15:restartNumberingAfterBreak="0">
     <w:nsid w:val="6D8607B7"/>
     <w:multiLevelType w:val="hybridMultilevel"/>
     <w:tmpl w:val="58DC4C56"/>
@@ -4708,46 +5473,52 @@
     <w:abstractNumId w:val="3"/>
   </w:num>
   <w:num w:numId="5" w16cid:durableId="893472193">
-    <w:abstractNumId w:val="8"/>
+    <w:abstractNumId w:val="9"/>
   </w:num>
   <w:num w:numId="6" w16cid:durableId="1755054948">
-    <w:abstractNumId w:val="12"/>
+    <w:abstractNumId w:val="14"/>
   </w:num>
   <w:num w:numId="7" w16cid:durableId="1495103662">
-    <w:abstractNumId w:val="17"/>
+    <w:abstractNumId w:val="19"/>
   </w:num>
   <w:num w:numId="8" w16cid:durableId="1462646248">
-    <w:abstractNumId w:val="13"/>
+    <w:abstractNumId w:val="15"/>
   </w:num>
   <w:num w:numId="9" w16cid:durableId="983697945">
     <w:abstractNumId w:val="5"/>
   </w:num>
   <w:num w:numId="10" w16cid:durableId="372198872">
-    <w:abstractNumId w:val="7"/>
+    <w:abstractNumId w:val="8"/>
   </w:num>
   <w:num w:numId="11" w16cid:durableId="1320037534">
-    <w:abstractNumId w:val="16"/>
+    <w:abstractNumId w:val="18"/>
   </w:num>
   <w:num w:numId="12" w16cid:durableId="872156676">
-    <w:abstractNumId w:val="14"/>
+    <w:abstractNumId w:val="16"/>
   </w:num>
   <w:num w:numId="13" w16cid:durableId="1717775439">
     <w:abstractNumId w:val="4"/>
   </w:num>
   <w:num w:numId="14" w16cid:durableId="74326497">
-    <w:abstractNumId w:val="15"/>
+    <w:abstractNumId w:val="17"/>
   </w:num>
   <w:num w:numId="15" w16cid:durableId="1591430736">
-    <w:abstractNumId w:val="9"/>
+    <w:abstractNumId w:val="10"/>
   </w:num>
   <w:num w:numId="16" w16cid:durableId="18285065">
+    <w:abstractNumId w:val="13"/>
+  </w:num>
+  <w:num w:numId="17" w16cid:durableId="1361200026">
     <w:abstractNumId w:val="11"/>
   </w:num>
-  <w:num w:numId="17" w16cid:durableId="1361200026">
-    <w:abstractNumId w:val="10"/>
+  <w:num w:numId="18" w16cid:durableId="1542326532">
+    <w:abstractNumId w:val="7"/>
   </w:num>
-  <w:num w:numId="18" w16cid:durableId="1542326532">
+  <w:num w:numId="19" w16cid:durableId="510729524">
     <w:abstractNumId w:val="6"/>
+  </w:num>
+  <w:num w:numId="20" w16cid:durableId="462889129">
+    <w:abstractNumId w:val="12"/>
   </w:num>
 </w:numbering>
 </file>

</xml_diff>

<commit_message>
Manuals updated. Release 2.0.16.1395.
git-svn-id: http://visualsvn.edna.local/EDNA/ModbusControl/V2@4034 03c8d257-35a7-c645-9f01-50f27e98b9e6
</commit_message>
<xml_diff>
--- a/Manuals/ModbusControl - Release notes.docx
+++ b/Manuals/ModbusControl - Release notes.docx
@@ -21,40 +21,35 @@
         <w:pStyle w:val="Kop1"/>
         <w:rPr>
           <w:rFonts w:hint="eastAsia"/>
-        </w:rPr>
-      </w:pPr>
-      <w:r>
-        <w:t>v2.0.1</w:t>
-      </w:r>
-      <w:r>
+          <w:color w:val="auto"/>
+        </w:rPr>
+      </w:pPr>
+      <w:r>
+        <w:t>v2.0.</w:t>
+      </w:r>
+      <w:r>
+        <w:rPr>
+          <w:color w:val="auto"/>
+        </w:rPr>
+        <w:t>1</w:t>
+      </w:r>
+      <w:r>
+        <w:rPr>
+          <w:color w:val="auto"/>
+        </w:rPr>
         <w:t>6</w:t>
       </w:r>
       <w:r>
-        <w:t xml:space="preserve"> – </w:t>
-      </w:r>
-      <w:r>
-        <w:rPr>
-          <w:highlight w:val="yellow"/>
-        </w:rPr>
-        <w:t>20</w:t>
-      </w:r>
-      <w:r>
-        <w:rPr>
-          <w:highlight w:val="yellow"/>
-        </w:rPr>
-        <w:t>23-</w:t>
-      </w:r>
-      <w:r>
-        <w:rPr>
-          <w:highlight w:val="yellow"/>
-        </w:rPr>
-        <w:t>XX-</w:t>
-      </w:r>
-      <w:r>
-        <w:rPr>
-          <w:highlight w:val="yellow"/>
-        </w:rPr>
-        <w:t>XX</w:t>
+        <w:rPr>
+          <w:color w:val="auto"/>
+        </w:rPr>
+        <w:t xml:space="preserve"> – 2023-</w:t>
+      </w:r>
+      <w:r>
+        <w:rPr>
+          <w:color w:val="auto"/>
+        </w:rPr>
+        <w:t>12-27</w:t>
       </w:r>
     </w:p>
     <w:p>
@@ -120,7 +115,27 @@
         </w:rPr>
       </w:pPr>
       <w:r>
-        <w:t xml:space="preserve">Modbuscontrol.exe now has more command line options. Use </w:t>
+        <w:t xml:space="preserve">Command line options can </w:t>
+      </w:r>
+      <w:r>
+        <w:t xml:space="preserve">now </w:t>
+      </w:r>
+      <w:r>
+        <w:t xml:space="preserve">start with – or /. </w:t>
+      </w:r>
+    </w:p>
+    <w:p>
+      <w:pPr>
+        <w:numPr>
+          <w:ilvl w:val="0"/>
+          <w:numId w:val="4"/>
+        </w:numPr>
+      </w:pPr>
+      <w:r>
+        <w:t>Added</w:t>
+      </w:r>
+      <w:r>
+        <w:t xml:space="preserve"> more command line options. Use </w:t>
       </w:r>
       <w:r>
         <w:t>-? -h -help /? /h or /help</w:t>
@@ -140,7 +155,15 @@
         </w:rPr>
       </w:pPr>
       <w:r>
-        <w:t xml:space="preserve">Command line options can start with – or /. </w:t>
+        <w:t>Mbc file: &lt;</w:t>
+      </w:r>
+      <w:proofErr w:type="spellStart"/>
+      <w:r>
+        <w:t>exportorder</w:t>
+      </w:r>
+      <w:proofErr w:type="spellEnd"/>
+      <w:r>
+        <w:t>&gt; element added.</w:t>
       </w:r>
     </w:p>
     <w:p>
@@ -168,6 +191,22 @@
     </w:p>
     <w:p>
       <w:pPr>
+        <w:pStyle w:val="Kop3"/>
+        <w:numPr>
+          <w:ilvl w:val="0"/>
+          <w:numId w:val="0"/>
+        </w:numPr>
+        <w:ind w:left="680" w:hanging="431"/>
+        <w:rPr>
+          <w:rFonts w:hint="eastAsia"/>
+        </w:rPr>
+      </w:pPr>
+      <w:r>
+        <w:t>Fixes</w:t>
+      </w:r>
+    </w:p>
+    <w:p>
+      <w:pPr>
         <w:numPr>
           <w:ilvl w:val="0"/>
           <w:numId w:val="4"/>
@@ -177,15 +216,809 @@
         </w:rPr>
       </w:pPr>
       <w:r>
-        <w:t>Mbc file: &lt;exportorder&gt; element added</w:t>
-      </w:r>
-      <w:r>
+        <w:t xml:space="preserve">Release notes </w:t>
+      </w:r>
+      <w:r>
+        <w:t xml:space="preserve">are now </w:t>
+      </w:r>
+      <w:r>
+        <w:t>in English.</w:t>
+      </w:r>
+    </w:p>
+    <w:p>
+      <w:pPr>
+        <w:pStyle w:val="Lijstalinea"/>
+        <w:numPr>
+          <w:ilvl w:val="0"/>
+          <w:numId w:val="4"/>
+        </w:numPr>
+        <w:rPr>
+          <w:rFonts w:hint="eastAsia"/>
+        </w:rPr>
+      </w:pPr>
+      <w:r>
+        <w:t xml:space="preserve">Crash fixed: an internal buffer overflow in the communications code </w:t>
+      </w:r>
+      <w:r>
+        <w:t xml:space="preserve">sometimes </w:t>
+      </w:r>
+      <w:r>
+        <w:t xml:space="preserve">caused an application crash. </w:t>
+      </w:r>
+    </w:p>
+    <w:p>
+      <w:pPr>
+        <w:pStyle w:val="Lijstalinea"/>
+        <w:numPr>
+          <w:ilvl w:val="0"/>
+          <w:numId w:val="4"/>
+        </w:numPr>
+        <w:rPr>
+          <w:rFonts w:hint="eastAsia"/>
+        </w:rPr>
+      </w:pPr>
+      <w:proofErr w:type="spellStart"/>
+      <w:r>
+        <w:rPr>
+          <w:rFonts w:hint="eastAsia"/>
+        </w:rPr>
+        <w:t>WriteHoldingregisterFC</w:t>
+      </w:r>
+      <w:proofErr w:type="spellEnd"/>
+      <w:r>
+        <w:t xml:space="preserve"> </w:t>
+      </w:r>
+      <w:r>
+        <w:rPr>
+          <w:rFonts w:hint="eastAsia"/>
+        </w:rPr>
+        <w:t>=</w:t>
+      </w:r>
+      <w:r>
+        <w:t xml:space="preserve"> ‘</w:t>
+      </w:r>
+      <w:r>
+        <w:rPr>
+          <w:rFonts w:hint="eastAsia"/>
+        </w:rPr>
+        <w:t>alternate</w:t>
+      </w:r>
+      <w:r>
+        <w:t>’</w:t>
+      </w:r>
+      <w:r>
+        <w:t xml:space="preserve"> is dropped because it was con</w:t>
+      </w:r>
+      <w:r>
+        <w:t>fusing. It is automatically replaced by ‘auto’ if found in an mbc project file.</w:t>
+      </w:r>
+    </w:p>
+    <w:p>
+      <w:pPr>
+        <w:numPr>
+          <w:ilvl w:val="0"/>
+          <w:numId w:val="4"/>
+        </w:numPr>
+      </w:pPr>
+      <w:r>
+        <w:t>Stop-on-error mechanism fix.</w:t>
+      </w:r>
+    </w:p>
+    <w:p>
+      <w:pPr>
+        <w:numPr>
+          <w:ilvl w:val="0"/>
+          <w:numId w:val="4"/>
+        </w:numPr>
+      </w:pPr>
+      <w:r>
+        <w:t xml:space="preserve">Import now processes the </w:t>
+      </w:r>
+      <w:r>
+        <w:t>CSV</w:t>
+      </w:r>
+      <w:r>
+        <w:t xml:space="preserve"> file in top-down order. </w:t>
+      </w:r>
+      <w:r>
+        <w:t>E</w:t>
+      </w:r>
+      <w:r>
+        <w:t xml:space="preserve">arlier versions </w:t>
+      </w:r>
+      <w:r>
+        <w:t xml:space="preserve">first scanned the file for errors, </w:t>
+      </w:r>
+      <w:r>
+        <w:t>then started import which could report more errors.</w:t>
+      </w:r>
+    </w:p>
+    <w:p>
+      <w:pPr>
+        <w:numPr>
+          <w:ilvl w:val="0"/>
+          <w:numId w:val="4"/>
+        </w:numPr>
+      </w:pPr>
+      <w:r>
+        <w:t>Import now also ignores lines that only have spaces and/or separators.</w:t>
+      </w:r>
+    </w:p>
+    <w:p>
+      <w:pPr>
+        <w:pStyle w:val="Kop1"/>
+        <w:rPr>
+          <w:rFonts w:hint="eastAsia"/>
+        </w:rPr>
+      </w:pPr>
+      <w:r>
+        <w:t>v2.0.15 – 2023-06-24</w:t>
+      </w:r>
+    </w:p>
+    <w:p>
+      <w:pPr>
+        <w:pStyle w:val="Kop3"/>
+        <w:numPr>
+          <w:ilvl w:val="0"/>
+          <w:numId w:val="0"/>
+        </w:numPr>
+        <w:ind w:left="680" w:hanging="431"/>
+        <w:rPr>
+          <w:rFonts w:hint="eastAsia"/>
+        </w:rPr>
+      </w:pPr>
+      <w:r>
+        <w:rPr>
+          <w:rFonts w:hint="eastAsia"/>
+        </w:rPr>
+        <w:t>Features</w:t>
+      </w:r>
+    </w:p>
+    <w:p>
+      <w:pPr>
+        <w:pStyle w:val="Lijstalinea"/>
+        <w:numPr>
+          <w:ilvl w:val="0"/>
+          <w:numId w:val="4"/>
+        </w:numPr>
+        <w:rPr>
+          <w:rFonts w:hint="eastAsia"/>
+        </w:rPr>
+      </w:pPr>
+      <w:r>
+        <w:rPr>
+          <w:rFonts w:hint="eastAsia"/>
+        </w:rPr>
+        <w:t xml:space="preserve">Enum registers editing now has a dropdown </w:t>
+      </w:r>
+      <w:proofErr w:type="spellStart"/>
+      <w:r>
+        <w:rPr>
+          <w:rFonts w:hint="eastAsia"/>
+        </w:rPr>
+        <w:t>combobox</w:t>
+      </w:r>
+      <w:proofErr w:type="spellEnd"/>
+      <w:r>
+        <w:rPr>
+          <w:rFonts w:hint="eastAsia"/>
+        </w:rPr>
+        <w:t xml:space="preserve"> with possible values.</w:t>
+      </w:r>
+    </w:p>
+    <w:p>
+      <w:pPr>
+        <w:pStyle w:val="Lijstalinea"/>
+        <w:numPr>
+          <w:ilvl w:val="0"/>
+          <w:numId w:val="4"/>
+        </w:numPr>
+        <w:rPr>
+          <w:rFonts w:hint="eastAsia"/>
+        </w:rPr>
+      </w:pPr>
+      <w:r>
+        <w:rPr>
+          <w:rFonts w:hint="eastAsia"/>
+        </w:rPr>
+        <w:t>Mbc file: Enum values now allow a cu</w:t>
+      </w:r>
+      <w:r>
+        <w:t>s</w:t>
+      </w:r>
+      <w:r>
+        <w:rPr>
+          <w:rFonts w:hint="eastAsia"/>
+        </w:rPr>
+        <w:t xml:space="preserve">tom &lt;else&gt; </w:t>
+      </w:r>
+      <w:r>
+        <w:t>text</w:t>
+      </w:r>
+      <w:r>
+        <w:rPr>
+          <w:rFonts w:hint="eastAsia"/>
+        </w:rPr>
+        <w:t xml:space="preserve"> that is shown if no value matches. </w:t>
+      </w:r>
+      <w:r>
+        <w:t>&lt;else&gt; text can be left empty to suppress the message.</w:t>
+      </w:r>
+    </w:p>
+    <w:p>
+      <w:pPr>
+        <w:pStyle w:val="Lijstalinea"/>
+        <w:numPr>
+          <w:ilvl w:val="0"/>
+          <w:numId w:val="4"/>
+        </w:numPr>
+        <w:rPr>
+          <w:rFonts w:hint="eastAsia"/>
+        </w:rPr>
+      </w:pPr>
+      <w:r>
+        <w:rPr>
+          <w:rFonts w:hint="eastAsia"/>
+        </w:rPr>
+        <w:t xml:space="preserve">You can now use </w:t>
+      </w:r>
+      <w:r>
+        <w:t xml:space="preserve">5 digits and 6 digits </w:t>
+      </w:r>
+      <w:r>
+        <w:rPr>
+          <w:rFonts w:hint="eastAsia"/>
+        </w:rPr>
+        <w:t>registers numbering scheme</w:t>
+      </w:r>
+      <w:r>
+        <w:t>,</w:t>
+      </w:r>
+      <w:r>
+        <w:rPr>
+          <w:rFonts w:hint="eastAsia"/>
+        </w:rPr>
+        <w:t xml:space="preserve"> 40001-49999 and 400001-465536</w:t>
+      </w:r>
+      <w:r>
+        <w:t xml:space="preserve">, or </w:t>
+      </w:r>
+      <w:r>
+        <w:rPr>
+          <w:rFonts w:hint="eastAsia"/>
+        </w:rPr>
+        <w:t>40000-49999 and 400000-465535</w:t>
+      </w:r>
+      <w:r>
+        <w:t xml:space="preserve">, </w:t>
+      </w:r>
+      <w:r>
+        <w:rPr>
+          <w:rFonts w:hint="eastAsia"/>
+        </w:rPr>
+        <w:t xml:space="preserve">at the same time. </w:t>
+      </w:r>
+    </w:p>
+    <w:p>
+      <w:pPr>
+        <w:pStyle w:val="Kop3"/>
+        <w:numPr>
+          <w:ilvl w:val="0"/>
+          <w:numId w:val="0"/>
+        </w:numPr>
+        <w:ind w:left="680" w:hanging="431"/>
+        <w:rPr>
+          <w:rFonts w:hint="eastAsia"/>
+        </w:rPr>
+      </w:pPr>
+      <w:r>
+        <w:rPr>
+          <w:rFonts w:hint="eastAsia"/>
+        </w:rPr>
+        <w:t>Fixes</w:t>
+      </w:r>
+    </w:p>
+    <w:p>
+      <w:pPr>
+        <w:pStyle w:val="Lijstalinea"/>
+        <w:numPr>
+          <w:ilvl w:val="0"/>
+          <w:numId w:val="4"/>
+        </w:numPr>
+        <w:rPr>
+          <w:rFonts w:hint="eastAsia"/>
+          <w:lang w:val="nl-BE"/>
+        </w:rPr>
+      </w:pPr>
+      <w:r>
+        <w:rPr>
+          <w:rFonts w:hint="eastAsia"/>
+          <w:lang w:val="nl-BE"/>
+        </w:rPr>
+        <w:t xml:space="preserve">Bij </w:t>
+      </w:r>
+      <w:proofErr w:type="spellStart"/>
+      <w:r>
+        <w:rPr>
+          <w:rFonts w:hint="eastAsia"/>
+          <w:lang w:val="nl-BE"/>
+        </w:rPr>
+        <w:t>Import_file</w:t>
+      </w:r>
+      <w:proofErr w:type="spellEnd"/>
+      <w:r>
+        <w:rPr>
+          <w:rFonts w:hint="eastAsia"/>
+          <w:lang w:val="nl-BE"/>
+        </w:rPr>
+        <w:t xml:space="preserve"> en </w:t>
+      </w:r>
+      <w:proofErr w:type="spellStart"/>
+      <w:r>
+        <w:rPr>
+          <w:rFonts w:hint="eastAsia"/>
+          <w:lang w:val="nl-BE"/>
+        </w:rPr>
+        <w:t>Import_compare</w:t>
+      </w:r>
+      <w:proofErr w:type="spellEnd"/>
+      <w:r>
+        <w:rPr>
+          <w:rFonts w:hint="eastAsia"/>
+          <w:lang w:val="nl-BE"/>
+        </w:rPr>
+        <w:t>: schrijven/</w:t>
+      </w:r>
+      <w:proofErr w:type="spellStart"/>
+      <w:r>
+        <w:rPr>
+          <w:rFonts w:hint="eastAsia"/>
+          <w:lang w:val="nl-BE"/>
+        </w:rPr>
+        <w:t>comparen</w:t>
+      </w:r>
+      <w:proofErr w:type="spellEnd"/>
+      <w:r>
+        <w:rPr>
+          <w:rFonts w:hint="eastAsia"/>
+          <w:lang w:val="nl-BE"/>
+        </w:rPr>
+        <w:t xml:space="preserve"> van een float32 werkte niet meer.</w:t>
+      </w:r>
+    </w:p>
+    <w:p>
+      <w:pPr>
+        <w:pStyle w:val="Lijstalinea"/>
+        <w:numPr>
+          <w:ilvl w:val="0"/>
+          <w:numId w:val="4"/>
+        </w:numPr>
+        <w:rPr>
+          <w:rFonts w:hint="eastAsia"/>
+        </w:rPr>
+      </w:pPr>
+      <w:r>
+        <w:rPr>
+          <w:rFonts w:hint="eastAsia"/>
+        </w:rPr>
+        <w:t xml:space="preserve">Ascii32 register writing </w:t>
+      </w:r>
+      <w:r>
+        <w:t>fixed.</w:t>
+      </w:r>
+    </w:p>
+    <w:p>
+      <w:pPr>
+        <w:pStyle w:val="Lijstalinea"/>
+        <w:numPr>
+          <w:ilvl w:val="0"/>
+          <w:numId w:val="4"/>
+        </w:numPr>
+        <w:rPr>
+          <w:rFonts w:hint="eastAsia"/>
+        </w:rPr>
+      </w:pPr>
+      <w:r>
+        <w:rPr>
+          <w:rFonts w:hint="eastAsia"/>
+        </w:rPr>
+        <w:t xml:space="preserve">Resizing column width is now </w:t>
+      </w:r>
+      <w:r>
+        <w:t>global for all tabs</w:t>
+      </w:r>
+      <w:r>
+        <w:rPr>
+          <w:rFonts w:hint="eastAsia"/>
+        </w:rPr>
         <w:t>.</w:t>
       </w:r>
     </w:p>
     <w:p>
       <w:pPr>
+        <w:pStyle w:val="Lijstalinea"/>
+        <w:numPr>
+          <w:ilvl w:val="0"/>
+          <w:numId w:val="4"/>
+        </w:numPr>
+        <w:rPr>
+          <w:rFonts w:hint="eastAsia"/>
+        </w:rPr>
+      </w:pPr>
+      <w:r>
+        <w:rPr>
+          <w:rFonts w:hint="eastAsia"/>
+        </w:rPr>
+        <w:t>Zoom</w:t>
+      </w:r>
+      <w:r>
+        <w:t>ing</w:t>
+      </w:r>
+      <w:r>
+        <w:rPr>
+          <w:rFonts w:hint="eastAsia"/>
+        </w:rPr>
+        <w:t xml:space="preserve"> now also adjusts the size of the column headers.</w:t>
+      </w:r>
+    </w:p>
+    <w:p>
+      <w:pPr>
+        <w:pStyle w:val="Lijstalinea"/>
+        <w:numPr>
+          <w:ilvl w:val="0"/>
+          <w:numId w:val="4"/>
+        </w:numPr>
+        <w:rPr>
+          <w:rFonts w:hint="eastAsia"/>
+        </w:rPr>
+      </w:pPr>
+      <w:r>
+        <w:rPr>
+          <w:rFonts w:hint="eastAsia"/>
+        </w:rPr>
+        <w:t>You can now close the [</w:t>
+      </w:r>
+      <w:proofErr w:type="spellStart"/>
+      <w:r>
+        <w:rPr>
+          <w:rFonts w:hint="eastAsia"/>
+        </w:rPr>
+        <w:t>Project_Configuration</w:t>
+      </w:r>
+      <w:proofErr w:type="spellEnd"/>
+      <w:r>
+        <w:rPr>
+          <w:rFonts w:hint="eastAsia"/>
+        </w:rPr>
+        <w:t>], [</w:t>
+      </w:r>
+      <w:proofErr w:type="spellStart"/>
+      <w:r>
+        <w:rPr>
+          <w:rFonts w:hint="eastAsia"/>
+        </w:rPr>
+        <w:t>Save_project_file</w:t>
+      </w:r>
+      <w:proofErr w:type="spellEnd"/>
+      <w:r>
+        <w:rPr>
+          <w:rFonts w:hint="eastAsia"/>
+        </w:rPr>
+        <w:t>] and [About] forms with the ESC button</w:t>
+      </w:r>
+      <w:r>
+        <w:t xml:space="preserve"> too</w:t>
+      </w:r>
+      <w:r>
+        <w:rPr>
+          <w:rFonts w:hint="eastAsia"/>
+        </w:rPr>
+        <w:t>.</w:t>
+      </w:r>
+    </w:p>
+    <w:p>
+      <w:pPr>
+        <w:pStyle w:val="Lijstalinea"/>
+        <w:numPr>
+          <w:ilvl w:val="0"/>
+          <w:numId w:val="4"/>
+        </w:numPr>
+        <w:rPr>
+          <w:rFonts w:hint="eastAsia"/>
+        </w:rPr>
+      </w:pPr>
+      <w:r>
+        <w:rPr>
+          <w:rFonts w:hint="eastAsia"/>
+        </w:rPr>
+        <w:t>The expand/collapse icons scale with zoom</w:t>
+      </w:r>
+      <w:r>
+        <w:t>ing</w:t>
+      </w:r>
+      <w:r>
+        <w:rPr>
+          <w:rFonts w:hint="eastAsia"/>
+        </w:rPr>
+        <w:t>.</w:t>
+      </w:r>
+    </w:p>
+    <w:p>
+      <w:pPr>
+        <w:pStyle w:val="Lijstalinea"/>
+        <w:numPr>
+          <w:ilvl w:val="0"/>
+          <w:numId w:val="4"/>
+        </w:numPr>
+        <w:rPr>
+          <w:rFonts w:hint="eastAsia"/>
+        </w:rPr>
+      </w:pPr>
+      <w:r>
+        <w:rPr>
+          <w:rFonts w:hint="eastAsia"/>
+        </w:rPr>
+        <w:t>If an error occurs when loading an mbc file, no auto-connect to the slave/server is done.</w:t>
+      </w:r>
+    </w:p>
+    <w:p>
+      <w:pPr>
+        <w:pStyle w:val="Lijstalinea"/>
+        <w:numPr>
+          <w:ilvl w:val="0"/>
+          <w:numId w:val="4"/>
+        </w:numPr>
+        <w:rPr>
+          <w:rFonts w:hint="eastAsia"/>
+        </w:rPr>
+      </w:pPr>
+      <w:r>
+        <w:rPr>
+          <w:rFonts w:hint="eastAsia"/>
+        </w:rPr>
+        <w:t xml:space="preserve">With </w:t>
+      </w:r>
+      <w:proofErr w:type="spellStart"/>
+      <w:r>
+        <w:rPr>
+          <w:rFonts w:hint="eastAsia"/>
+        </w:rPr>
+        <w:t>Import_file</w:t>
+      </w:r>
+      <w:proofErr w:type="spellEnd"/>
+      <w:r>
+        <w:rPr>
+          <w:rFonts w:hint="eastAsia"/>
+        </w:rPr>
+        <w:t xml:space="preserve"> and </w:t>
+      </w:r>
+      <w:proofErr w:type="spellStart"/>
+      <w:r>
+        <w:rPr>
+          <w:rFonts w:hint="eastAsia"/>
+        </w:rPr>
+        <w:t>Import_compare</w:t>
+      </w:r>
+      <w:proofErr w:type="spellEnd"/>
+      <w:r>
+        <w:rPr>
+          <w:rFonts w:hint="eastAsia"/>
+        </w:rPr>
+        <w:t>: writing/compar</w:t>
+      </w:r>
+      <w:r>
+        <w:t>ing</w:t>
+      </w:r>
+      <w:r>
+        <w:rPr>
+          <w:rFonts w:hint="eastAsia"/>
+        </w:rPr>
+        <w:t xml:space="preserve"> a float32 </w:t>
+      </w:r>
+      <w:r>
+        <w:t>is fixed</w:t>
+      </w:r>
+      <w:r>
+        <w:rPr>
+          <w:rFonts w:hint="eastAsia"/>
+        </w:rPr>
+        <w:t>.</w:t>
+      </w:r>
+    </w:p>
+    <w:p>
+      <w:pPr>
+        <w:pStyle w:val="Kop1"/>
+        <w:rPr>
+          <w:rFonts w:hint="eastAsia"/>
+        </w:rPr>
+      </w:pPr>
+      <w:r>
+        <w:lastRenderedPageBreak/>
+        <w:t>v2.0.14 -- 2022-11-08</w:t>
+      </w:r>
+    </w:p>
+    <w:p>
+      <w:pPr>
         <w:pStyle w:val="Kop3"/>
+        <w:rPr>
+          <w:rFonts w:hint="eastAsia"/>
+        </w:rPr>
+      </w:pPr>
+      <w:r>
+        <w:t>Features</w:t>
+      </w:r>
+    </w:p>
+    <w:p>
+      <w:pPr>
+        <w:numPr>
+          <w:ilvl w:val="0"/>
+          <w:numId w:val="4"/>
+        </w:numPr>
+        <w:rPr>
+          <w:rFonts w:hint="eastAsia"/>
+        </w:rPr>
+      </w:pPr>
+      <w:r>
+        <w:t xml:space="preserve">Added command line parameters. </w:t>
+      </w:r>
+      <w:r>
+        <w:t>These r</w:t>
+      </w:r>
+      <w:r>
+        <w:t xml:space="preserve">eplaces </w:t>
+      </w:r>
+      <w:r>
+        <w:t xml:space="preserve">the </w:t>
+      </w:r>
+      <w:r>
+        <w:t>LocalOverrides</w:t>
+      </w:r>
+      <w:r>
+        <w:t xml:space="preserve"> mechanism.</w:t>
+      </w:r>
+    </w:p>
+    <w:p>
+      <w:pPr>
+        <w:numPr>
+          <w:ilvl w:val="0"/>
+          <w:numId w:val="4"/>
+        </w:numPr>
+        <w:rPr>
+          <w:rFonts w:hint="eastAsia"/>
+        </w:rPr>
+      </w:pPr>
+      <w:r>
+        <w:t xml:space="preserve">LocalOverrides </w:t>
+      </w:r>
+      <w:r>
+        <w:t>mechanism removed.</w:t>
+      </w:r>
+    </w:p>
+    <w:p>
+      <w:pPr>
+        <w:numPr>
+          <w:ilvl w:val="0"/>
+          <w:numId w:val="4"/>
+        </w:numPr>
+        <w:rPr>
+          <w:rFonts w:hint="eastAsia"/>
+        </w:rPr>
+      </w:pPr>
+      <w:r>
+        <w:t>Save project file: the [Update XML to current version] checkbox is now enabled by default.</w:t>
+      </w:r>
+    </w:p>
+    <w:p>
+      <w:pPr>
+        <w:numPr>
+          <w:ilvl w:val="0"/>
+          <w:numId w:val="4"/>
+        </w:numPr>
+        <w:rPr>
+          <w:rFonts w:hint="eastAsia"/>
+        </w:rPr>
+      </w:pPr>
+      <w:r>
+        <w:t>Options form: tooltips improved.</w:t>
+      </w:r>
+    </w:p>
+    <w:p>
+      <w:pPr>
+        <w:numPr>
+          <w:ilvl w:val="0"/>
+          <w:numId w:val="4"/>
+        </w:numPr>
+        <w:rPr>
+          <w:rFonts w:hint="eastAsia"/>
+        </w:rPr>
+      </w:pPr>
+      <w:r>
+        <w:t>Grid: Regist</w:t>
+      </w:r>
+      <w:r>
+        <w:t>er</w:t>
+      </w:r>
+      <w:r>
+        <w:t xml:space="preserve"> </w:t>
+      </w:r>
+      <w:r>
+        <w:t xml:space="preserve">column menu now has </w:t>
+      </w:r>
+      <w:r>
+        <w:t xml:space="preserve"> [</w:t>
+      </w:r>
+      <w:r>
+        <w:t>Expand all]</w:t>
+      </w:r>
+      <w:r>
+        <w:t xml:space="preserve"> and </w:t>
+      </w:r>
+      <w:r>
+        <w:t>[</w:t>
+      </w:r>
+      <w:r>
+        <w:t>Collapse all</w:t>
+      </w:r>
+      <w:r>
+        <w:t>].</w:t>
+      </w:r>
+    </w:p>
+    <w:p>
+      <w:pPr>
+        <w:numPr>
+          <w:ilvl w:val="0"/>
+          <w:numId w:val="4"/>
+        </w:numPr>
+        <w:rPr>
+          <w:rFonts w:hint="eastAsia"/>
+        </w:rPr>
+      </w:pPr>
+      <w:r>
+        <w:t>Mbc project file: &lt;</w:t>
+      </w:r>
+      <w:proofErr w:type="spellStart"/>
+      <w:r>
+        <w:t>longdescr</w:t>
+      </w:r>
+      <w:proofErr w:type="spellEnd"/>
+      <w:r>
+        <w:t xml:space="preserve">&gt; </w:t>
+      </w:r>
+      <w:r>
+        <w:t xml:space="preserve">element </w:t>
+      </w:r>
+      <w:r>
+        <w:t xml:space="preserve">added. </w:t>
+      </w:r>
+      <w:r>
+        <w:t xml:space="preserve">Adds a long multiline text that is show when the mouse is hoovered over the register </w:t>
+      </w:r>
+      <w:proofErr w:type="spellStart"/>
+      <w:r>
+        <w:t>decription</w:t>
+      </w:r>
+      <w:proofErr w:type="spellEnd"/>
+      <w:r>
+        <w:t>.</w:t>
+      </w:r>
+    </w:p>
+    <w:p>
+      <w:pPr>
+        <w:numPr>
+          <w:ilvl w:val="0"/>
+          <w:numId w:val="4"/>
+        </w:numPr>
+        <w:rPr>
+          <w:rFonts w:hint="eastAsia"/>
+        </w:rPr>
+      </w:pPr>
+      <w:r>
+        <w:t>Mbc project file: &lt;include&gt; element added.</w:t>
+      </w:r>
+    </w:p>
+    <w:p>
+      <w:pPr>
+        <w:pStyle w:val="Kop3"/>
         <w:numPr>
           <w:ilvl w:val="0"/>
           <w:numId w:val="0"/>
@@ -201,7 +1034,6 @@
     </w:p>
     <w:p>
       <w:pPr>
-        <w:pStyle w:val="Lijstalinea"/>
         <w:numPr>
           <w:ilvl w:val="0"/>
           <w:numId w:val="4"/>
@@ -211,12 +1043,14 @@
         </w:rPr>
       </w:pPr>
       <w:r>
-        <w:t xml:space="preserve">Crash fixed: sometimes an internal buffer overflow in the communications code caused an application crash. </w:t>
-      </w:r>
-    </w:p>
-    <w:p>
-      <w:pPr>
-        <w:pStyle w:val="Lijstalinea"/>
+        <w:t>[</w:t>
+      </w:r>
+      <w:r>
+        <w:t>Open project file location in Explorer] now works if you gave a filename without a path on the command line.</w:t>
+      </w:r>
+    </w:p>
+    <w:p>
+      <w:pPr>
         <w:numPr>
           <w:ilvl w:val="0"/>
           <w:numId w:val="4"/>
@@ -226,71 +1060,694 @@
         </w:rPr>
       </w:pPr>
       <w:r>
-        <w:rPr>
-          <w:rFonts w:hint="eastAsia"/>
-        </w:rPr>
-        <w:t>WriteHoldingregisterFC</w:t>
+        <w:t xml:space="preserve">The temporary red </w:t>
+      </w:r>
+      <w:r>
+        <w:t>colouring</w:t>
+      </w:r>
+      <w:r>
+        <w:t xml:space="preserve"> of the value field after entering </w:t>
+      </w:r>
+      <w:r>
+        <w:t xml:space="preserve">an invalid value </w:t>
+      </w:r>
+      <w:r>
+        <w:t>has been improved.</w:t>
+      </w:r>
+    </w:p>
+    <w:p>
+      <w:pPr>
+        <w:numPr>
+          <w:ilvl w:val="0"/>
+          <w:numId w:val="4"/>
+        </w:numPr>
+        <w:rPr>
+          <w:rFonts w:hint="eastAsia"/>
+        </w:rPr>
+      </w:pPr>
+      <w:r>
+        <w:t>Edit</w:t>
+      </w:r>
+      <w:r>
+        <w:t xml:space="preserve"> enter/escape </w:t>
+      </w:r>
+      <w:r>
+        <w:t>handling is improved</w:t>
+      </w:r>
+      <w:r>
+        <w:t>.</w:t>
+      </w:r>
+    </w:p>
+    <w:p>
+      <w:pPr>
+        <w:numPr>
+          <w:ilvl w:val="0"/>
+          <w:numId w:val="4"/>
+        </w:numPr>
+        <w:rPr>
+          <w:rFonts w:hint="eastAsia"/>
+        </w:rPr>
+      </w:pPr>
+      <w:r>
+        <w:t xml:space="preserve">In the notification screen that the serial port could not be opened: the [Port] </w:t>
+      </w:r>
+      <w:r>
+        <w:t>combo box</w:t>
+      </w:r>
+      <w:r>
+        <w:t xml:space="preserve"> now automatically refreshes the list of serial ports.</w:t>
+      </w:r>
+    </w:p>
+    <w:p>
+      <w:pPr>
+        <w:pStyle w:val="Kop1"/>
+        <w:rPr>
+          <w:rFonts w:hint="eastAsia"/>
+        </w:rPr>
+      </w:pPr>
+      <w:r>
+        <w:t>v2.0.13 -- 2022-07-11</w:t>
+      </w:r>
+    </w:p>
+    <w:p>
+      <w:pPr>
+        <w:pStyle w:val="Kop3"/>
+        <w:rPr>
+          <w:rFonts w:hint="eastAsia"/>
+        </w:rPr>
+      </w:pPr>
+      <w:r>
+        <w:t>Features</w:t>
+      </w:r>
+    </w:p>
+    <w:p>
+      <w:pPr>
+        <w:numPr>
+          <w:ilvl w:val="0"/>
+          <w:numId w:val="4"/>
+        </w:numPr>
+        <w:rPr>
+          <w:rFonts w:hint="eastAsia"/>
+        </w:rPr>
+      </w:pPr>
+      <w:r>
+        <w:t xml:space="preserve">Added Find/Filter bar. </w:t>
+      </w:r>
+      <w:r>
+        <w:t>Open it using</w:t>
+      </w:r>
+      <w:r>
+        <w:t xml:space="preserve"> Control-F. There is also an option </w:t>
+      </w:r>
+      <w:r>
+        <w:t>“</w:t>
+      </w:r>
+      <w:r>
+        <w:t>Clear Find/Filter on tab change</w:t>
+      </w:r>
+      <w:r>
+        <w:t>”</w:t>
+      </w:r>
+      <w:r>
+        <w:t>.</w:t>
+      </w:r>
+    </w:p>
+    <w:p>
+      <w:pPr>
+        <w:numPr>
+          <w:ilvl w:val="0"/>
+          <w:numId w:val="4"/>
+        </w:numPr>
+        <w:rPr>
+          <w:rFonts w:hint="eastAsia"/>
+        </w:rPr>
+      </w:pPr>
+      <w:r>
+        <w:t>The properties of a register (</w:t>
+      </w:r>
+      <w:proofErr w:type="spellStart"/>
+      <w:r>
+        <w:t>rw</w:t>
+      </w:r>
+      <w:proofErr w:type="spellEnd"/>
+      <w:r>
+        <w:t xml:space="preserve">, int32, ...) are now displayed in a separate </w:t>
+      </w:r>
+      <w:r>
+        <w:t>[</w:t>
+      </w:r>
+      <w:r>
+        <w:t>Properties</w:t>
+      </w:r>
+      <w:r>
+        <w:t>]</w:t>
+      </w:r>
+      <w:r>
+        <w:t xml:space="preserve"> column</w:t>
+      </w:r>
+      <w:r>
+        <w:t xml:space="preserve"> instead of being added to </w:t>
+      </w:r>
+      <w:r>
+        <w:t xml:space="preserve">the </w:t>
+      </w:r>
+      <w:r>
+        <w:t>[</w:t>
+      </w:r>
+      <w:r>
+        <w:t>Description</w:t>
+      </w:r>
+      <w:r>
+        <w:t>]</w:t>
+      </w:r>
+      <w:r>
+        <w:t xml:space="preserve"> column. </w:t>
+      </w:r>
+      <w:r>
+        <w:t>The [Properties]  column can be e</w:t>
+      </w:r>
+      <w:r>
+        <w:t>nable/disable</w:t>
+      </w:r>
+      <w:r>
+        <w:t>d</w:t>
+      </w:r>
+      <w:r>
+        <w:t xml:space="preserve"> in Options.</w:t>
+      </w:r>
+    </w:p>
+    <w:p>
+      <w:pPr>
+        <w:numPr>
+          <w:ilvl w:val="0"/>
+          <w:numId w:val="4"/>
+        </w:numPr>
+        <w:rPr>
+          <w:rFonts w:hint="eastAsia"/>
+        </w:rPr>
+      </w:pPr>
+      <w:r>
+        <w:t>The Description text can now be multi-line</w:t>
+      </w:r>
+      <w:r>
+        <w:t>, i</w:t>
+      </w:r>
+      <w:r>
+        <w:t xml:space="preserve">f  the </w:t>
+      </w:r>
+      <w:r>
+        <w:t>“</w:t>
+      </w:r>
+      <w:r>
+        <w:t>Multiline rows with auto row size</w:t>
+      </w:r>
+      <w:r>
+        <w:t>”</w:t>
+      </w:r>
+      <w:r>
+        <w:t xml:space="preserve"> option </w:t>
+      </w:r>
+      <w:r>
+        <w:t>is enabled</w:t>
+      </w:r>
+      <w:r>
+        <w:t xml:space="preserve">. A </w:t>
+      </w:r>
+      <w:r>
+        <w:t xml:space="preserve">long </w:t>
+      </w:r>
+      <w:r>
+        <w:t xml:space="preserve">description </w:t>
+      </w:r>
+      <w:r>
+        <w:t>text is wrappe</w:t>
+      </w:r>
+      <w:r>
+        <w:t xml:space="preserve">d. </w:t>
+      </w:r>
+      <w:r>
+        <w:t>CR/LF</w:t>
+      </w:r>
+      <w:r>
+        <w:t xml:space="preserve">’s can be used in the description text. </w:t>
+      </w:r>
+      <w:r>
+        <w:t xml:space="preserve">The row height of the grid is automatically adjusted to the text. </w:t>
+      </w:r>
+    </w:p>
+    <w:p>
+      <w:pPr>
+        <w:numPr>
+          <w:ilvl w:val="0"/>
+          <w:numId w:val="4"/>
+        </w:numPr>
+        <w:rPr>
+          <w:rFonts w:hint="eastAsia"/>
+        </w:rPr>
+      </w:pPr>
+      <w:r>
+        <w:t>"Move to next row on Enter"</w:t>
+      </w:r>
+      <w:r>
+        <w:t xml:space="preserve"> option</w:t>
+      </w:r>
+      <w:r>
+        <w:t xml:space="preserve">: depending on this option, after entering a new value with the Enter key, the </w:t>
+      </w:r>
+      <w:r>
+        <w:t>cursor</w:t>
+      </w:r>
+      <w:r>
+        <w:t xml:space="preserve"> may or may not go to the next line. </w:t>
+      </w:r>
+      <w:r>
+        <w:t xml:space="preserve">Enter a value with </w:t>
+      </w:r>
+      <w:r>
+        <w:t>Control-Enter</w:t>
+      </w:r>
+      <w:r>
+        <w:t xml:space="preserve"> to get the</w:t>
+      </w:r>
+      <w:r>
+        <w:t xml:space="preserve"> opposite</w:t>
+      </w:r>
+      <w:r>
+        <w:t xml:space="preserve"> behaviour.</w:t>
+      </w:r>
+    </w:p>
+    <w:p>
+      <w:pPr>
+        <w:pStyle w:val="Kop3"/>
+        <w:numPr>
+          <w:ilvl w:val="0"/>
+          <w:numId w:val="0"/>
+        </w:numPr>
+        <w:ind w:left="680" w:hanging="431"/>
+        <w:rPr>
+          <w:rFonts w:hint="eastAsia"/>
+        </w:rPr>
+      </w:pPr>
+      <w:r>
+        <w:t>Fixes</w:t>
+      </w:r>
+    </w:p>
+    <w:p>
+      <w:pPr>
+        <w:numPr>
+          <w:ilvl w:val="0"/>
+          <w:numId w:val="5"/>
+        </w:numPr>
+        <w:rPr>
+          <w:rFonts w:hint="eastAsia"/>
+        </w:rPr>
+      </w:pPr>
+      <w:r>
+        <w:t>Control-0 for zoom reset now works globally on the form, not just when the focus is in the grid.</w:t>
+      </w:r>
+    </w:p>
+    <w:p>
+      <w:pPr>
+        <w:numPr>
+          <w:ilvl w:val="0"/>
+          <w:numId w:val="5"/>
+        </w:numPr>
+        <w:rPr>
+          <w:rFonts w:hint="eastAsia"/>
+        </w:rPr>
+      </w:pPr>
+      <w:r>
+        <w:t>R</w:t>
+      </w:r>
+      <w:r>
+        <w:t>ight-click</w:t>
+      </w:r>
+      <w:r>
+        <w:t>ing</w:t>
+      </w:r>
+      <w:r>
+        <w:t xml:space="preserve"> in the grid</w:t>
+      </w:r>
+      <w:r>
+        <w:t xml:space="preserve"> now moves the focus to that row, to </w:t>
+      </w:r>
+      <w:r>
+        <w:t>better see which row you are working on.</w:t>
+      </w:r>
+    </w:p>
+    <w:p>
+      <w:pPr>
+        <w:numPr>
+          <w:ilvl w:val="0"/>
+          <w:numId w:val="5"/>
+        </w:numPr>
+        <w:rPr>
+          <w:rFonts w:hint="eastAsia"/>
+        </w:rPr>
+      </w:pPr>
+      <w:r>
+        <w:t>Migrated</w:t>
+      </w:r>
+      <w:r>
+        <w:t xml:space="preserve"> to .NET framework 4.7.2.</w:t>
+      </w:r>
+    </w:p>
+    <w:p>
+      <w:pPr>
+        <w:pStyle w:val="Kop1"/>
+        <w:rPr>
+          <w:rFonts w:hint="eastAsia"/>
+        </w:rPr>
+      </w:pPr>
+      <w:r>
+        <w:t>v2.0.12 -- 2020-07-13</w:t>
+      </w:r>
+    </w:p>
+    <w:p>
+      <w:pPr>
+        <w:pStyle w:val="Kop3"/>
+        <w:rPr>
+          <w:rFonts w:hint="eastAsia"/>
+        </w:rPr>
+      </w:pPr>
+      <w:r>
+        <w:t>Features</w:t>
+      </w:r>
+    </w:p>
+    <w:p>
+      <w:pPr>
+        <w:numPr>
+          <w:ilvl w:val="0"/>
+          <w:numId w:val="6"/>
+        </w:numPr>
+        <w:rPr>
+          <w:rFonts w:hint="eastAsia"/>
+        </w:rPr>
+      </w:pPr>
+      <w:r>
+        <w:t>Added mbc project file validation with XSD schema</w:t>
+      </w:r>
+      <w:r>
+        <w:t xml:space="preserve"> file</w:t>
+      </w:r>
+      <w:r>
+        <w:t xml:space="preserve">. </w:t>
+      </w:r>
+      <w:r>
+        <w:t xml:space="preserve">Validation is optional. </w:t>
+      </w:r>
+      <w:r>
+        <w:t>The validation only allows lower-case XML tags</w:t>
+      </w:r>
+      <w:r>
+        <w:t>, a</w:t>
+      </w:r>
+      <w:r>
+        <w:t xml:space="preserve">nd only allows the XML elements that are supported in this version. The intention is that over time all mbc files will </w:t>
+      </w:r>
+      <w:r>
+        <w:t>migrate</w:t>
+      </w:r>
+      <w:r>
+        <w:t xml:space="preserve"> to meet the validation.</w:t>
+      </w:r>
+    </w:p>
+    <w:p>
+      <w:pPr>
+        <w:numPr>
+          <w:ilvl w:val="0"/>
+          <w:numId w:val="6"/>
+        </w:numPr>
+        <w:rPr>
+          <w:rFonts w:hint="eastAsia"/>
+        </w:rPr>
+      </w:pPr>
+      <w:r>
+        <w:lastRenderedPageBreak/>
+        <w:t>In</w:t>
       </w:r>
       <w:r>
         <w:t xml:space="preserve"> </w:t>
       </w:r>
       <w:r>
-        <w:rPr>
-          <w:rFonts w:hint="eastAsia"/>
-        </w:rPr>
-        <w:t>=</w:t>
-      </w:r>
-      <w:r>
-        <w:t xml:space="preserve"> ‘</w:t>
-      </w:r>
-      <w:r>
-        <w:rPr>
-          <w:rFonts w:hint="eastAsia"/>
-        </w:rPr>
-        <w:t>alternate</w:t>
-      </w:r>
-      <w:r>
-        <w:t>’</w:t>
-      </w:r>
-      <w:r>
-        <w:t xml:space="preserve"> is dropped because it was con</w:t>
-      </w:r>
-      <w:r>
-        <w:t>fusing to users. It is automatically replaced by ‘auto’ if found in an mbc project file.</w:t>
-      </w:r>
-    </w:p>
-    <w:p>
-      <w:pPr>
-        <w:numPr>
-          <w:ilvl w:val="0"/>
-          <w:numId w:val="4"/>
-        </w:numPr>
-        <w:rPr>
-          <w:rFonts w:hint="eastAsia"/>
-        </w:rPr>
-      </w:pPr>
-      <w:r>
-        <w:t>Stop-on-error mechanism fix.</w:t>
-      </w:r>
-    </w:p>
-    <w:p>
-      <w:pPr>
-        <w:numPr>
-          <w:ilvl w:val="0"/>
-          <w:numId w:val="4"/>
-        </w:numPr>
-        <w:rPr>
-          <w:rFonts w:hint="eastAsia"/>
-        </w:rPr>
-      </w:pPr>
-      <w:r>
-        <w:t xml:space="preserve">Release notes </w:t>
-      </w:r>
-      <w:r>
-        <w:t xml:space="preserve">are now </w:t>
-      </w:r>
-      <w:r>
-        <w:t>in English.</w:t>
+        <w:t xml:space="preserve">the </w:t>
+      </w:r>
+      <w:r>
+        <w:t xml:space="preserve">"Save project file" </w:t>
+      </w:r>
+      <w:r>
+        <w:t xml:space="preserve">form </w:t>
+      </w:r>
+      <w:r>
+        <w:t xml:space="preserve">you now have the option to update the XML with "Update XML to current version" so that it then passes the validation. </w:t>
+      </w:r>
+      <w:r>
+        <w:t>E</w:t>
+      </w:r>
+      <w:r>
+        <w:t>rrors must be corrected manually.</w:t>
+      </w:r>
+    </w:p>
+    <w:p>
+      <w:pPr>
+        <w:numPr>
+          <w:ilvl w:val="0"/>
+          <w:numId w:val="6"/>
+        </w:numPr>
+        <w:rPr>
+          <w:rFonts w:hint="eastAsia"/>
+        </w:rPr>
+      </w:pPr>
+      <w:r>
+        <w:t>In</w:t>
+      </w:r>
+      <w:r>
+        <w:t xml:space="preserve"> "Save project file" the project file is now saved with XML formatting.</w:t>
+      </w:r>
+    </w:p>
+    <w:p>
+      <w:pPr>
+        <w:numPr>
+          <w:ilvl w:val="0"/>
+          <w:numId w:val="6"/>
+        </w:numPr>
+        <w:rPr>
+          <w:rFonts w:hint="eastAsia"/>
+        </w:rPr>
+      </w:pPr>
+      <w:r>
+        <w:t xml:space="preserve">If you start ModbusControl by double-clicking an mbc file and the file points to a non-existent COM port, the error dialog "Error opening serial port </w:t>
+      </w:r>
+      <w:proofErr w:type="spellStart"/>
+      <w:r>
+        <w:t>COMx</w:t>
+      </w:r>
+      <w:proofErr w:type="spellEnd"/>
+      <w:r>
+        <w:t>" now appears after the ModbusControl program appears.</w:t>
+      </w:r>
+    </w:p>
+    <w:p>
+      <w:pPr>
+        <w:numPr>
+          <w:ilvl w:val="0"/>
+          <w:numId w:val="6"/>
+        </w:numPr>
+        <w:rPr>
+          <w:rFonts w:hint="eastAsia"/>
+        </w:rPr>
+      </w:pPr>
+      <w:r>
+        <w:t xml:space="preserve">At the first start </w:t>
+      </w:r>
+      <w:r>
+        <w:t xml:space="preserve">of the program </w:t>
+      </w:r>
+      <w:r>
+        <w:t xml:space="preserve">after an update, </w:t>
+      </w:r>
+      <w:r>
+        <w:t xml:space="preserve">an option is shown </w:t>
+      </w:r>
+      <w:r>
+        <w:t>to see the 'Release notes'.</w:t>
+      </w:r>
+    </w:p>
+    <w:p>
+      <w:pPr>
+        <w:numPr>
+          <w:ilvl w:val="0"/>
+          <w:numId w:val="6"/>
+        </w:numPr>
+        <w:rPr>
+          <w:rFonts w:hint="eastAsia"/>
+        </w:rPr>
+      </w:pPr>
+      <w:r>
+        <w:t xml:space="preserve">Program settings split into user-dependent part and </w:t>
+      </w:r>
+      <w:r>
+        <w:t>computer</w:t>
+      </w:r>
+      <w:r>
+        <w:t xml:space="preserve">-dependent part. The old settings are migrated to the new settings files, then </w:t>
+      </w:r>
+      <w:r>
+        <w:t xml:space="preserve">the </w:t>
+      </w:r>
+      <w:r>
+        <w:t>old settings file is deleted.</w:t>
+      </w:r>
+    </w:p>
+    <w:p>
+      <w:pPr>
+        <w:numPr>
+          <w:ilvl w:val="0"/>
+          <w:numId w:val="6"/>
+        </w:numPr>
+        <w:rPr>
+          <w:rFonts w:hint="eastAsia"/>
+        </w:rPr>
+      </w:pPr>
+      <w:r>
+        <w:t xml:space="preserve">LocalOverrides.xml </w:t>
+      </w:r>
+      <w:r>
+        <w:t xml:space="preserve">file is automatically </w:t>
+      </w:r>
+      <w:r>
+        <w:t>moved from &lt;</w:t>
+      </w:r>
+      <w:proofErr w:type="spellStart"/>
+      <w:r>
+        <w:t>mydocuments</w:t>
+      </w:r>
+      <w:proofErr w:type="spellEnd"/>
+      <w:r>
+        <w:t>&gt;\ModbusControl to %</w:t>
+      </w:r>
+      <w:proofErr w:type="spellStart"/>
+      <w:r>
+        <w:t>AppData</w:t>
+      </w:r>
+      <w:proofErr w:type="spellEnd"/>
+      <w:r>
+        <w:t xml:space="preserve">%\Roaming\E.D.&amp;A\ModbusControl. Content from old is not migrated. Old </w:t>
+      </w:r>
+      <w:r>
+        <w:t>file</w:t>
+      </w:r>
+      <w:r>
+        <w:t xml:space="preserve"> is renamed with '.old' and moved to the </w:t>
+      </w:r>
+      <w:r>
+        <w:t xml:space="preserve">new </w:t>
+      </w:r>
+      <w:r>
+        <w:t>location. If overrides were used, the user will receive a notification.</w:t>
+      </w:r>
+    </w:p>
+    <w:p>
+      <w:pPr>
+        <w:numPr>
+          <w:ilvl w:val="0"/>
+          <w:numId w:val="6"/>
+        </w:numPr>
+        <w:rPr>
+          <w:rFonts w:hint="eastAsia"/>
+        </w:rPr>
+      </w:pPr>
+      <w:r>
+        <w:t>&lt;user&gt;\Documents\ModbusControl is no longer used.</w:t>
+      </w:r>
+    </w:p>
+    <w:p>
+      <w:pPr>
+        <w:pStyle w:val="Kop3"/>
+        <w:rPr>
+          <w:rFonts w:hint="eastAsia"/>
+        </w:rPr>
+      </w:pPr>
+      <w:r>
+        <w:t>Fixes</w:t>
+      </w:r>
+    </w:p>
+    <w:p>
+      <w:pPr>
+        <w:numPr>
+          <w:ilvl w:val="0"/>
+          <w:numId w:val="7"/>
+        </w:numPr>
+        <w:rPr>
+          <w:rFonts w:hint="eastAsia"/>
+        </w:rPr>
+      </w:pPr>
+      <w:r>
+        <w:t>The import/export dialogs now show '*. CSV' instead of '*. C</w:t>
+      </w:r>
+      <w:r>
+        <w:t>VS</w:t>
+      </w:r>
+      <w:r>
+        <w:t>'.</w:t>
+      </w:r>
+    </w:p>
+    <w:p>
+      <w:pPr>
+        <w:numPr>
+          <w:ilvl w:val="0"/>
+          <w:numId w:val="7"/>
+        </w:numPr>
+        <w:rPr>
+          <w:rFonts w:hint="eastAsia"/>
+        </w:rPr>
+      </w:pPr>
+      <w:r>
+        <w:t>Mbc file is now saved without BOM (</w:t>
+      </w:r>
+      <w:r>
+        <w:t>Unicode</w:t>
+      </w:r>
+      <w:r>
+        <w:t xml:space="preserve"> byte order mark).</w:t>
+      </w:r>
+    </w:p>
+    <w:p>
+      <w:pPr>
+        <w:numPr>
+          <w:ilvl w:val="0"/>
+          <w:numId w:val="7"/>
+        </w:numPr>
+        <w:rPr>
+          <w:rFonts w:hint="eastAsia"/>
+        </w:rPr>
+      </w:pPr>
+      <w:r>
+        <w:t xml:space="preserve">Better </w:t>
+      </w:r>
+      <w:r>
+        <w:t>handling</w:t>
+      </w:r>
+      <w:r>
+        <w:t xml:space="preserve"> if </w:t>
+      </w:r>
+      <w:r>
+        <w:t>a</w:t>
+      </w:r>
+      <w:r>
+        <w:t xml:space="preserve"> non-admin</w:t>
+      </w:r>
+      <w:r>
+        <w:t>istrator</w:t>
+      </w:r>
+      <w:r>
+        <w:t xml:space="preserve"> user logs </w:t>
+      </w:r>
+      <w:r>
+        <w:t xml:space="preserve">on </w:t>
+      </w:r>
+      <w:r>
+        <w:t>and uses ModbusControl.</w:t>
       </w:r>
     </w:p>
     <w:p>
@@ -301,1840 +1758,769 @@
         </w:rPr>
       </w:pPr>
       <w:r>
-        <w:t>v2.0.15 – 2023-06-24</w:t>
+        <w:t>v2.0.11 -- 2019-11-18</w:t>
       </w:r>
     </w:p>
     <w:p>
       <w:pPr>
         <w:pStyle w:val="Kop3"/>
-        <w:numPr>
-          <w:ilvl w:val="0"/>
-          <w:numId w:val="0"/>
-        </w:numPr>
-        <w:ind w:left="680" w:hanging="431"/>
-        <w:rPr>
-          <w:rFonts w:hint="eastAsia"/>
-        </w:rPr>
-      </w:pPr>
-      <w:r>
-        <w:rPr>
-          <w:rFonts w:hint="eastAsia"/>
-        </w:rPr>
+        <w:rPr>
+          <w:rFonts w:hint="eastAsia"/>
+        </w:rPr>
+      </w:pPr>
+      <w:r>
+        <w:t>Fixes</w:t>
+      </w:r>
+    </w:p>
+    <w:p>
+      <w:pPr>
+        <w:numPr>
+          <w:ilvl w:val="0"/>
+          <w:numId w:val="8"/>
+        </w:numPr>
+        <w:rPr>
+          <w:rFonts w:hint="eastAsia"/>
+        </w:rPr>
+      </w:pPr>
+      <w:r>
+        <w:t xml:space="preserve">Better handling if the USB/serial connection is lost. In the past </w:t>
+      </w:r>
+      <w:r>
+        <w:t xml:space="preserve">the </w:t>
+      </w:r>
+      <w:r>
+        <w:t xml:space="preserve">program </w:t>
+      </w:r>
+      <w:r>
+        <w:t>could stop responding</w:t>
+      </w:r>
+      <w:r>
+        <w:t>.</w:t>
+      </w:r>
+    </w:p>
+    <w:p>
+      <w:pPr>
+        <w:pStyle w:val="Kop1"/>
+        <w:rPr>
+          <w:rFonts w:hint="eastAsia"/>
+        </w:rPr>
+      </w:pPr>
+      <w:r>
+        <w:t>v2.0.10 -- 2019-03-11</w:t>
+      </w:r>
+    </w:p>
+    <w:p>
+      <w:pPr>
+        <w:pStyle w:val="Kop3"/>
+        <w:rPr>
+          <w:rFonts w:hint="eastAsia"/>
+        </w:rPr>
+      </w:pPr>
+      <w:r>
         <w:t>Features</w:t>
       </w:r>
     </w:p>
     <w:p>
       <w:pPr>
-        <w:pStyle w:val="Lijstalinea"/>
-        <w:numPr>
-          <w:ilvl w:val="0"/>
-          <w:numId w:val="4"/>
-        </w:numPr>
-        <w:rPr>
-          <w:rFonts w:hint="eastAsia"/>
-        </w:rPr>
-      </w:pPr>
-      <w:r>
-        <w:rPr>
-          <w:rFonts w:hint="eastAsia"/>
-        </w:rPr>
-        <w:t>Enum registers editing now has a dropdown combobox with possible values.</w:t>
-      </w:r>
-    </w:p>
-    <w:p>
-      <w:pPr>
-        <w:pStyle w:val="Lijstalinea"/>
-        <w:numPr>
-          <w:ilvl w:val="0"/>
-          <w:numId w:val="4"/>
-        </w:numPr>
-        <w:rPr>
-          <w:rFonts w:hint="eastAsia"/>
-        </w:rPr>
-      </w:pPr>
-      <w:r>
-        <w:rPr>
-          <w:rFonts w:hint="eastAsia"/>
-        </w:rPr>
-        <w:t>Mbc file: Enum values now allow a cu</w:t>
+        <w:numPr>
+          <w:ilvl w:val="0"/>
+          <w:numId w:val="8"/>
+        </w:numPr>
+        <w:rPr>
+          <w:rFonts w:hint="eastAsia"/>
+        </w:rPr>
+      </w:pPr>
+      <w:r>
+        <w:t>Added display</w:t>
+      </w:r>
+      <w:r>
+        <w:t>ing</w:t>
+      </w:r>
+      <w:r>
+        <w:t xml:space="preserve"> of enum </w:t>
+      </w:r>
+      <w:r>
+        <w:t xml:space="preserve">values </w:t>
+      </w:r>
+      <w:r>
+        <w:t xml:space="preserve">in the value column. </w:t>
+      </w:r>
+    </w:p>
+    <w:p>
+      <w:pPr>
+        <w:pStyle w:val="Kop3"/>
+        <w:rPr>
+          <w:rFonts w:hint="eastAsia"/>
+        </w:rPr>
+      </w:pPr>
+      <w:r>
+        <w:t>Fixes</w:t>
+      </w:r>
+    </w:p>
+    <w:p>
+      <w:pPr>
+        <w:numPr>
+          <w:ilvl w:val="0"/>
+          <w:numId w:val="8"/>
+        </w:numPr>
+        <w:rPr>
+          <w:rFonts w:hint="eastAsia"/>
+        </w:rPr>
+      </w:pPr>
+      <w:r>
+        <w:t xml:space="preserve">Menu </w:t>
+      </w:r>
+      <w:r>
+        <w:t xml:space="preserve">item </w:t>
+      </w:r>
+      <w:r>
+        <w:t xml:space="preserve">"Edit project file" did not work </w:t>
+      </w:r>
+      <w:r>
+        <w:t xml:space="preserve">correctly </w:t>
+      </w:r>
+      <w:r>
+        <w:t>if there was a space in the path.</w:t>
+      </w:r>
+    </w:p>
+    <w:p>
+      <w:pPr>
+        <w:numPr>
+          <w:ilvl w:val="0"/>
+          <w:numId w:val="8"/>
+        </w:numPr>
+        <w:rPr>
+          <w:rFonts w:hint="eastAsia"/>
+        </w:rPr>
+      </w:pPr>
+      <w:r>
+        <w:t>Logger: Clear button did not clear number of logs in the status bar.</w:t>
+      </w:r>
+    </w:p>
+    <w:p>
+      <w:pPr>
+        <w:numPr>
+          <w:ilvl w:val="0"/>
+          <w:numId w:val="8"/>
+        </w:numPr>
+        <w:rPr>
+          <w:rFonts w:hint="eastAsia"/>
+        </w:rPr>
+      </w:pPr>
+      <w:r>
+        <w:t xml:space="preserve">Send Custom Modbus Command: allows tabs and CR/LF in the string. </w:t>
+      </w:r>
+      <w:r>
+        <w:t xml:space="preserve">Reports </w:t>
+      </w:r>
+      <w:r>
+        <w:t xml:space="preserve">error </w:t>
+      </w:r>
+      <w:r>
+        <w:t>for</w:t>
+      </w:r>
+      <w:r>
+        <w:t xml:space="preserve"> empty command string. </w:t>
+      </w:r>
+    </w:p>
+    <w:p>
+      <w:pPr>
+        <w:numPr>
+          <w:ilvl w:val="0"/>
+          <w:numId w:val="8"/>
+        </w:numPr>
+        <w:rPr>
+          <w:rFonts w:hint="eastAsia"/>
+        </w:rPr>
+      </w:pPr>
+      <w:r>
+        <w:t xml:space="preserve">Send Custom Modbus Command: </w:t>
+      </w:r>
+      <w:r>
+        <w:t>Reports</w:t>
+      </w:r>
+      <w:r>
+        <w:t xml:space="preserve"> error when command is too short, must be at least 2 bytes.</w:t>
+      </w:r>
+    </w:p>
+    <w:p>
+      <w:pPr>
+        <w:numPr>
+          <w:ilvl w:val="0"/>
+          <w:numId w:val="8"/>
+        </w:numPr>
+        <w:rPr>
+          <w:rFonts w:hint="eastAsia"/>
+        </w:rPr>
+      </w:pPr>
+      <w:r>
+        <w:t xml:space="preserve">Fix background </w:t>
+      </w:r>
+      <w:r>
+        <w:t>colour</w:t>
+      </w:r>
+      <w:r>
+        <w:t xml:space="preserve"> of registers.</w:t>
+      </w:r>
+    </w:p>
+    <w:p>
+      <w:pPr>
+        <w:pStyle w:val="Kop1"/>
+        <w:rPr>
+          <w:rFonts w:hint="eastAsia"/>
+        </w:rPr>
+      </w:pPr>
+      <w:r>
+        <w:t>v2.0.9 -- 2018-10-20</w:t>
+      </w:r>
+    </w:p>
+    <w:p>
+      <w:pPr>
+        <w:pStyle w:val="Kop3"/>
+        <w:rPr>
+          <w:rFonts w:hint="eastAsia"/>
+        </w:rPr>
+      </w:pPr>
+      <w:r>
+        <w:t>Features</w:t>
+      </w:r>
+    </w:p>
+    <w:p>
+      <w:pPr>
+        <w:numPr>
+          <w:ilvl w:val="0"/>
+          <w:numId w:val="9"/>
+        </w:numPr>
+        <w:rPr>
+          <w:rFonts w:hint="eastAsia"/>
+        </w:rPr>
+      </w:pPr>
+      <w:r>
+        <w:t>New option: "Move to next row on Enter".</w:t>
+      </w:r>
+    </w:p>
+    <w:p>
+      <w:pPr>
+        <w:numPr>
+          <w:ilvl w:val="0"/>
+          <w:numId w:val="9"/>
+        </w:numPr>
+        <w:rPr>
+          <w:rFonts w:hint="eastAsia"/>
+        </w:rPr>
+      </w:pPr>
+      <w:r>
+        <w:t xml:space="preserve">New option: "Auto-start edit mode on typing". </w:t>
+      </w:r>
+    </w:p>
+    <w:p>
+      <w:pPr>
+        <w:numPr>
+          <w:ilvl w:val="0"/>
+          <w:numId w:val="9"/>
+        </w:numPr>
+        <w:rPr>
+          <w:rFonts w:hint="eastAsia"/>
+        </w:rPr>
+      </w:pPr>
+      <w:r>
+        <w:t xml:space="preserve">New option: "Use custom editor". </w:t>
+      </w:r>
+    </w:p>
+    <w:p>
+      <w:pPr>
+        <w:numPr>
+          <w:ilvl w:val="0"/>
+          <w:numId w:val="9"/>
+        </w:numPr>
+        <w:rPr>
+          <w:rFonts w:hint="eastAsia"/>
+        </w:rPr>
+      </w:pPr>
+      <w:r>
+        <w:t>New option: "Ignore form size on project reload".</w:t>
+      </w:r>
+    </w:p>
+    <w:p>
+      <w:pPr>
+        <w:numPr>
+          <w:ilvl w:val="0"/>
+          <w:numId w:val="9"/>
+        </w:numPr>
+        <w:rPr>
+          <w:rFonts w:hint="eastAsia"/>
+        </w:rPr>
+      </w:pPr>
+      <w:r>
+        <w:t>Config</w:t>
+      </w:r>
+      <w:r>
+        <w:t>uration</w:t>
+      </w:r>
+      <w:r>
+        <w:t xml:space="preserve"> form now has an Apply button.</w:t>
+      </w:r>
+    </w:p>
+    <w:p>
+      <w:pPr>
+        <w:numPr>
+          <w:ilvl w:val="0"/>
+          <w:numId w:val="9"/>
+        </w:numPr>
+        <w:rPr>
+          <w:rFonts w:hint="eastAsia"/>
+        </w:rPr>
+      </w:pPr>
+      <w:r>
+        <w:lastRenderedPageBreak/>
+        <w:t xml:space="preserve">Separate line-copy and value-copy </w:t>
+      </w:r>
+      <w:r>
+        <w:t xml:space="preserve">capability </w:t>
+      </w:r>
+      <w:r>
+        <w:t xml:space="preserve">in grid, </w:t>
+      </w:r>
+      <w:r>
+        <w:t>using</w:t>
+      </w:r>
+      <w:r>
+        <w:t xml:space="preserve"> control-C and context menu.</w:t>
+      </w:r>
+    </w:p>
+    <w:p>
+      <w:pPr>
+        <w:numPr>
+          <w:ilvl w:val="0"/>
+          <w:numId w:val="9"/>
+        </w:numPr>
+        <w:rPr>
+          <w:rFonts w:hint="eastAsia"/>
+        </w:rPr>
+      </w:pPr>
+      <w:r>
+        <w:t xml:space="preserve">The status bar now </w:t>
+      </w:r>
+      <w:r>
+        <w:t xml:space="preserve">has </w:t>
+      </w:r>
+      <w:r>
+        <w:t xml:space="preserve">blue </w:t>
+      </w:r>
+      <w:r>
+        <w:t xml:space="preserve">colour </w:t>
+      </w:r>
+      <w:r>
+        <w:t>if there is no connection or no polling is done.</w:t>
+      </w:r>
+    </w:p>
+    <w:p>
+      <w:pPr>
+        <w:numPr>
+          <w:ilvl w:val="0"/>
+          <w:numId w:val="9"/>
+        </w:numPr>
+        <w:rPr>
+          <w:rFonts w:hint="eastAsia"/>
+        </w:rPr>
+      </w:pPr>
+      <w:r>
+        <w:t xml:space="preserve">The status bar </w:t>
+      </w:r>
+      <w:r>
+        <w:t xml:space="preserve">now has red colour </w:t>
+      </w:r>
+      <w:r>
+        <w:t>for errors.</w:t>
+      </w:r>
+    </w:p>
+    <w:p>
+      <w:pPr>
+        <w:numPr>
+          <w:ilvl w:val="0"/>
+          <w:numId w:val="9"/>
+        </w:numPr>
+        <w:rPr>
+          <w:rFonts w:hint="eastAsia"/>
+        </w:rPr>
+      </w:pPr>
+      <w:r>
+        <w:t xml:space="preserve">Now </w:t>
+      </w:r>
+      <w:r>
+        <w:t>shows</w:t>
+      </w:r>
+      <w:r>
+        <w:t xml:space="preserve"> a warning in the "Save configuration to project file" and "Project configuration" screens if localoverrides </w:t>
+      </w:r>
+      <w:r>
+        <w:t>were</w:t>
+      </w:r>
+      <w:r>
+        <w:t xml:space="preserve"> used.</w:t>
+      </w:r>
+    </w:p>
+    <w:p>
+      <w:pPr>
+        <w:pStyle w:val="Kop3"/>
+        <w:rPr>
+          <w:rFonts w:hint="eastAsia"/>
+        </w:rPr>
+      </w:pPr>
+      <w:r>
+        <w:t>Fixes</w:t>
+      </w:r>
+    </w:p>
+    <w:p>
+      <w:pPr>
+        <w:numPr>
+          <w:ilvl w:val="0"/>
+          <w:numId w:val="10"/>
+        </w:numPr>
+        <w:rPr>
+          <w:rFonts w:hint="eastAsia"/>
+        </w:rPr>
+      </w:pPr>
+      <w:r>
+        <w:t xml:space="preserve">Notification </w:t>
+      </w:r>
+      <w:r>
+        <w:t>if Settings.xml could not be loaded at startup.</w:t>
+      </w:r>
+    </w:p>
+    <w:p>
+      <w:pPr>
+        <w:numPr>
+          <w:ilvl w:val="0"/>
+          <w:numId w:val="10"/>
+        </w:numPr>
+        <w:rPr>
+          <w:rFonts w:hint="eastAsia"/>
+        </w:rPr>
+      </w:pPr>
+      <w:r>
+        <w:t xml:space="preserve">Settings.xml </w:t>
+      </w:r>
+      <w:r>
+        <w:t xml:space="preserve">writing now </w:t>
+      </w:r>
+      <w:r>
+        <w:t>update</w:t>
       </w:r>
       <w:r>
         <w:t>s</w:t>
       </w:r>
       <w:r>
-        <w:rPr>
-          <w:rFonts w:hint="eastAsia"/>
-        </w:rPr>
-        <w:t xml:space="preserve">tom &lt;else&gt; </w:t>
-      </w:r>
-      <w:r>
-        <w:t>text</w:t>
-      </w:r>
-      <w:r>
-        <w:rPr>
-          <w:rFonts w:hint="eastAsia"/>
-        </w:rPr>
-        <w:t xml:space="preserve"> that is shown if no value matches. </w:t>
-      </w:r>
-      <w:r>
-        <w:t>&lt;else&gt; text can be left empty to suppress the message.</w:t>
-      </w:r>
-    </w:p>
-    <w:p>
-      <w:pPr>
-        <w:pStyle w:val="Lijstalinea"/>
-        <w:numPr>
-          <w:ilvl w:val="0"/>
-          <w:numId w:val="4"/>
-        </w:numPr>
-        <w:rPr>
-          <w:rFonts w:hint="eastAsia"/>
-        </w:rPr>
-      </w:pPr>
-      <w:r>
-        <w:rPr>
-          <w:rFonts w:hint="eastAsia"/>
-        </w:rPr>
-        <w:t xml:space="preserve">You can now use </w:t>
-      </w:r>
-      <w:r>
-        <w:t xml:space="preserve">5 digits and 6 digits </w:t>
-      </w:r>
-      <w:r>
-        <w:rPr>
-          <w:rFonts w:hint="eastAsia"/>
-        </w:rPr>
-        <w:t>registers numbering scheme</w:t>
-      </w:r>
-      <w:r>
-        <w:t>,</w:t>
-      </w:r>
-      <w:r>
-        <w:rPr>
-          <w:rFonts w:hint="eastAsia"/>
-        </w:rPr>
-        <w:t xml:space="preserve"> 40001-49999 and 400001-465536</w:t>
-      </w:r>
-      <w:r>
-        <w:t xml:space="preserve">, or </w:t>
-      </w:r>
-      <w:r>
-        <w:rPr>
-          <w:rFonts w:hint="eastAsia"/>
-        </w:rPr>
-        <w:t>40000-49999 and 400000-465535</w:t>
-      </w:r>
-      <w:r>
-        <w:t xml:space="preserve">, </w:t>
-      </w:r>
-      <w:r>
-        <w:rPr>
-          <w:rFonts w:hint="eastAsia"/>
-        </w:rPr>
-        <w:t xml:space="preserve">at the same time. </w:t>
+        <w:t>/insert</w:t>
+      </w:r>
+      <w:r>
+        <w:t>s</w:t>
+      </w:r>
+      <w:r>
+        <w:t xml:space="preserve"> </w:t>
+      </w:r>
+      <w:r>
+        <w:t>al</w:t>
+      </w:r>
+      <w:r>
+        <w:t xml:space="preserve">l tags in the </w:t>
+      </w:r>
+      <w:r>
+        <w:t xml:space="preserve">existing </w:t>
+      </w:r>
+      <w:r>
+        <w:t>file instead of writing a completely new file, so that any newer tags from a newer version remain.</w:t>
+      </w:r>
+    </w:p>
+    <w:p>
+      <w:pPr>
+        <w:numPr>
+          <w:ilvl w:val="0"/>
+          <w:numId w:val="10"/>
+        </w:numPr>
+        <w:rPr>
+          <w:rFonts w:hint="eastAsia"/>
+        </w:rPr>
+      </w:pPr>
+      <w:r>
+        <w:t>Project Configuration: Interframe-delay: now shows "0 (auto)" at setting 0.</w:t>
+      </w:r>
+    </w:p>
+    <w:p>
+      <w:pPr>
+        <w:numPr>
+          <w:ilvl w:val="0"/>
+          <w:numId w:val="10"/>
+        </w:numPr>
+        <w:rPr>
+          <w:rFonts w:hint="eastAsia"/>
+        </w:rPr>
+      </w:pPr>
+      <w:r>
+        <w:t xml:space="preserve">Local override project </w:t>
+      </w:r>
+      <w:r>
+        <w:t xml:space="preserve">is </w:t>
+      </w:r>
+      <w:r>
+        <w:t xml:space="preserve">no longer </w:t>
+      </w:r>
+      <w:r>
+        <w:t xml:space="preserve">required to have a </w:t>
+      </w:r>
+      <w:r>
+        <w:t>&lt;modbus&gt; element.</w:t>
+      </w:r>
+    </w:p>
+    <w:p>
+      <w:pPr>
+        <w:numPr>
+          <w:ilvl w:val="0"/>
+          <w:numId w:val="10"/>
+        </w:numPr>
+        <w:rPr>
+          <w:rFonts w:hint="eastAsia"/>
+        </w:rPr>
+      </w:pPr>
+      <w:r>
+        <w:t>Dialog forms can now be closed with the Enter key.</w:t>
+      </w:r>
+    </w:p>
+    <w:p>
+      <w:pPr>
+        <w:numPr>
+          <w:ilvl w:val="0"/>
+          <w:numId w:val="10"/>
+        </w:numPr>
+        <w:rPr>
+          <w:rFonts w:hint="eastAsia"/>
+        </w:rPr>
+      </w:pPr>
+      <w:r>
+        <w:t xml:space="preserve">The </w:t>
+      </w:r>
+      <w:r>
+        <w:t>checkboxes of the "Save configuration to project file" form</w:t>
+      </w:r>
+      <w:r>
+        <w:t xml:space="preserve"> are now cleared when loading a project.</w:t>
+      </w:r>
+    </w:p>
+    <w:p>
+      <w:pPr>
+        <w:numPr>
+          <w:ilvl w:val="0"/>
+          <w:numId w:val="10"/>
+        </w:numPr>
+        <w:rPr>
+          <w:rFonts w:hint="eastAsia"/>
+        </w:rPr>
+      </w:pPr>
+      <w:r>
+        <w:t xml:space="preserve">Buttons at the bottom of the forms now have </w:t>
+      </w:r>
+      <w:r>
+        <w:t>better spacing</w:t>
+      </w:r>
+      <w:r>
+        <w:t>.</w:t>
+      </w:r>
+    </w:p>
+    <w:p>
+      <w:pPr>
+        <w:pStyle w:val="Kop1"/>
+        <w:rPr>
+          <w:rFonts w:hint="eastAsia"/>
+        </w:rPr>
+      </w:pPr>
+      <w:r>
+        <w:t>v2.0.8 -- 2018-08-02</w:t>
       </w:r>
     </w:p>
     <w:p>
       <w:pPr>
         <w:pStyle w:val="Kop3"/>
-        <w:numPr>
-          <w:ilvl w:val="0"/>
-          <w:numId w:val="0"/>
-        </w:numPr>
-        <w:ind w:left="680" w:hanging="431"/>
-        <w:rPr>
-          <w:rFonts w:hint="eastAsia"/>
-        </w:rPr>
-      </w:pPr>
-      <w:r>
-        <w:rPr>
-          <w:rFonts w:hint="eastAsia"/>
-        </w:rPr>
-        <w:t>Fixes</w:t>
-      </w:r>
-    </w:p>
-    <w:p>
-      <w:pPr>
-        <w:pStyle w:val="Lijstalinea"/>
-        <w:numPr>
-          <w:ilvl w:val="0"/>
-          <w:numId w:val="4"/>
-        </w:numPr>
-        <w:rPr>
-          <w:rFonts w:hint="eastAsia"/>
-          <w:lang w:val="nl-BE"/>
-        </w:rPr>
-      </w:pPr>
-      <w:r>
-        <w:rPr>
-          <w:rFonts w:hint="eastAsia"/>
-          <w:lang w:val="nl-BE"/>
-        </w:rPr>
-        <w:t>Bij Import_file en Import_compare: schrijven/comparen van een float32 werkte niet meer.</w:t>
-      </w:r>
-    </w:p>
-    <w:p>
-      <w:pPr>
-        <w:pStyle w:val="Lijstalinea"/>
-        <w:numPr>
-          <w:ilvl w:val="0"/>
-          <w:numId w:val="4"/>
-        </w:numPr>
-        <w:rPr>
-          <w:rFonts w:hint="eastAsia"/>
-        </w:rPr>
-      </w:pPr>
-      <w:r>
-        <w:rPr>
-          <w:rFonts w:hint="eastAsia"/>
-        </w:rPr>
-        <w:t xml:space="preserve">Ascii32 register writing </w:t>
-      </w:r>
-      <w:r>
-        <w:t>fixed.</w:t>
-      </w:r>
-    </w:p>
-    <w:p>
-      <w:pPr>
-        <w:pStyle w:val="Lijstalinea"/>
-        <w:numPr>
-          <w:ilvl w:val="0"/>
-          <w:numId w:val="4"/>
-        </w:numPr>
-        <w:rPr>
-          <w:rFonts w:hint="eastAsia"/>
-        </w:rPr>
-      </w:pPr>
-      <w:r>
-        <w:rPr>
-          <w:rFonts w:hint="eastAsia"/>
-        </w:rPr>
-        <w:t xml:space="preserve">Resizing column width is now </w:t>
-      </w:r>
-      <w:r>
-        <w:t>global for all tabs</w:t>
-      </w:r>
-      <w:r>
-        <w:rPr>
-          <w:rFonts w:hint="eastAsia"/>
-        </w:rPr>
+        <w:rPr>
+          <w:rFonts w:hint="eastAsia"/>
+        </w:rPr>
+      </w:pPr>
+      <w:r>
+        <w:t>Features</w:t>
+      </w:r>
+    </w:p>
+    <w:p>
+      <w:pPr>
+        <w:numPr>
+          <w:ilvl w:val="0"/>
+          <w:numId w:val="11"/>
+        </w:numPr>
+        <w:rPr>
+          <w:rFonts w:hint="eastAsia"/>
+        </w:rPr>
+      </w:pPr>
+      <w:r>
+        <w:t xml:space="preserve">Added </w:t>
+      </w:r>
+      <w:r>
+        <w:t>menus and toolbar.</w:t>
+      </w:r>
+    </w:p>
+    <w:p>
+      <w:pPr>
+        <w:numPr>
+          <w:ilvl w:val="0"/>
+          <w:numId w:val="11"/>
+        </w:numPr>
+        <w:rPr>
+          <w:rFonts w:hint="eastAsia"/>
+        </w:rPr>
+      </w:pPr>
+      <w:r>
+        <w:t xml:space="preserve">Can save project configuration, bridge settings and form size in mbc file. </w:t>
+      </w:r>
+    </w:p>
+    <w:p>
+      <w:pPr>
+        <w:numPr>
+          <w:ilvl w:val="0"/>
+          <w:numId w:val="11"/>
+        </w:numPr>
+        <w:rPr>
+          <w:rFonts w:hint="eastAsia"/>
+        </w:rPr>
+      </w:pPr>
+      <w:r>
+        <w:t xml:space="preserve">Communication </w:t>
+      </w:r>
+      <w:r>
+        <w:t>pausing</w:t>
+      </w:r>
+      <w:r>
+        <w:t xml:space="preserve"> and poll-once.</w:t>
+      </w:r>
+    </w:p>
+    <w:p>
+      <w:pPr>
+        <w:numPr>
+          <w:ilvl w:val="0"/>
+          <w:numId w:val="11"/>
+        </w:numPr>
+        <w:rPr>
+          <w:rFonts w:hint="eastAsia"/>
+        </w:rPr>
+      </w:pPr>
+      <w:r>
+        <w:t>C</w:t>
+      </w:r>
+      <w:r>
+        <w:t>hange the connection parameters without having to close and reopen the port.</w:t>
+      </w:r>
+    </w:p>
+    <w:p>
+      <w:pPr>
+        <w:numPr>
+          <w:ilvl w:val="0"/>
+          <w:numId w:val="11"/>
+        </w:numPr>
+        <w:rPr>
+          <w:rFonts w:hint="eastAsia"/>
+        </w:rPr>
+      </w:pPr>
+      <w:r>
+        <w:t xml:space="preserve">If the serial port is not available at start, you can </w:t>
+      </w:r>
+      <w:r>
+        <w:t>immediately</w:t>
+      </w:r>
+      <w:r>
+        <w:t xml:space="preserve"> choose another </w:t>
+      </w:r>
+      <w:r>
+        <w:t>port</w:t>
+      </w:r>
+      <w:r>
         <w:t>.</w:t>
       </w:r>
     </w:p>
     <w:p>
       <w:pPr>
-        <w:pStyle w:val="Lijstalinea"/>
-        <w:numPr>
-          <w:ilvl w:val="0"/>
-          <w:numId w:val="4"/>
-        </w:numPr>
-        <w:rPr>
-          <w:rFonts w:hint="eastAsia"/>
-        </w:rPr>
-      </w:pPr>
-      <w:r>
-        <w:rPr>
-          <w:rFonts w:hint="eastAsia"/>
-        </w:rPr>
-        <w:t>Zoom</w:t>
-      </w:r>
-      <w:r>
-        <w:t>ing</w:t>
-      </w:r>
-      <w:r>
-        <w:rPr>
-          <w:rFonts w:hint="eastAsia"/>
-        </w:rPr>
-        <w:t xml:space="preserve"> now also adjusts the size of the column headers.</w:t>
-      </w:r>
-    </w:p>
-    <w:p>
-      <w:pPr>
-        <w:pStyle w:val="Lijstalinea"/>
-        <w:numPr>
-          <w:ilvl w:val="0"/>
-          <w:numId w:val="4"/>
-        </w:numPr>
-        <w:rPr>
-          <w:rFonts w:hint="eastAsia"/>
-        </w:rPr>
-      </w:pPr>
-      <w:r>
-        <w:rPr>
-          <w:rFonts w:hint="eastAsia"/>
-        </w:rPr>
-        <w:t>You can now close the [Project_Configuration], [Save_project_file] and [About] forms with the ESC button</w:t>
-      </w:r>
-      <w:r>
-        <w:t xml:space="preserve"> too</w:t>
-      </w:r>
-      <w:r>
-        <w:rPr>
-          <w:rFonts w:hint="eastAsia"/>
-        </w:rPr>
-        <w:t>.</w:t>
-      </w:r>
-    </w:p>
-    <w:p>
-      <w:pPr>
-        <w:pStyle w:val="Lijstalinea"/>
-        <w:numPr>
-          <w:ilvl w:val="0"/>
-          <w:numId w:val="4"/>
-        </w:numPr>
-        <w:rPr>
-          <w:rFonts w:hint="eastAsia"/>
-        </w:rPr>
-      </w:pPr>
-      <w:r>
-        <w:rPr>
-          <w:rFonts w:hint="eastAsia"/>
-        </w:rPr>
-        <w:t>The expand/collapse icons scale with zoom</w:t>
-      </w:r>
-      <w:r>
-        <w:t>ing</w:t>
-      </w:r>
-      <w:r>
-        <w:rPr>
-          <w:rFonts w:hint="eastAsia"/>
-        </w:rPr>
-        <w:t>.</w:t>
-      </w:r>
-    </w:p>
-    <w:p>
-      <w:pPr>
-        <w:pStyle w:val="Lijstalinea"/>
-        <w:numPr>
-          <w:ilvl w:val="0"/>
-          <w:numId w:val="4"/>
-        </w:numPr>
-        <w:rPr>
-          <w:rFonts w:hint="eastAsia"/>
-        </w:rPr>
-      </w:pPr>
-      <w:r>
-        <w:rPr>
-          <w:rFonts w:hint="eastAsia"/>
-        </w:rPr>
-        <w:t>If an error occurs when loading an mbc file, no auto-connect to the slave/server is done.</w:t>
-      </w:r>
-    </w:p>
-    <w:p>
-      <w:pPr>
-        <w:pStyle w:val="Lijstalinea"/>
-        <w:numPr>
-          <w:ilvl w:val="0"/>
-          <w:numId w:val="4"/>
-        </w:numPr>
-        <w:rPr>
-          <w:rFonts w:hint="eastAsia"/>
-        </w:rPr>
-      </w:pPr>
-      <w:r>
-        <w:rPr>
-          <w:rFonts w:hint="eastAsia"/>
-        </w:rPr>
-        <w:t>With Import_file and Import_compare: writing/compar</w:t>
-      </w:r>
-      <w:r>
-        <w:t>ing</w:t>
-      </w:r>
-      <w:r>
-        <w:rPr>
-          <w:rFonts w:hint="eastAsia"/>
-        </w:rPr>
-        <w:t xml:space="preserve"> a float32 </w:t>
-      </w:r>
-      <w:r>
-        <w:t>is fixed</w:t>
-      </w:r>
-      <w:r>
-        <w:rPr>
-          <w:rFonts w:hint="eastAsia"/>
-        </w:rPr>
-        <w:t>.</w:t>
-      </w:r>
-    </w:p>
-    <w:p>
-      <w:pPr>
-        <w:pStyle w:val="Kop1"/>
-        <w:rPr>
-          <w:rFonts w:hint="eastAsia"/>
-        </w:rPr>
-      </w:pPr>
-      <w:r>
-        <w:t>v2.0.14 -- 2022-11-08</w:t>
-      </w:r>
-    </w:p>
-    <w:p>
-      <w:pPr>
-        <w:pStyle w:val="Kop3"/>
-        <w:rPr>
-          <w:rFonts w:hint="eastAsia"/>
-        </w:rPr>
-      </w:pPr>
-      <w:r>
-        <w:t>Features</w:t>
-      </w:r>
-    </w:p>
-    <w:p>
-      <w:pPr>
-        <w:numPr>
-          <w:ilvl w:val="0"/>
-          <w:numId w:val="4"/>
-        </w:numPr>
-        <w:rPr>
-          <w:rFonts w:hint="eastAsia"/>
-        </w:rPr>
-      </w:pPr>
-      <w:r>
-        <w:t xml:space="preserve">Added command line parameters. </w:t>
-      </w:r>
-      <w:r>
-        <w:t>These r</w:t>
-      </w:r>
-      <w:r>
-        <w:t xml:space="preserve">eplaces </w:t>
-      </w:r>
-      <w:r>
-        <w:t xml:space="preserve">the </w:t>
-      </w:r>
-      <w:r>
-        <w:t>LocalOverrides</w:t>
-      </w:r>
-      <w:r>
-        <w:t xml:space="preserve"> mechanism.</w:t>
-      </w:r>
-    </w:p>
-    <w:p>
-      <w:pPr>
-        <w:numPr>
-          <w:ilvl w:val="0"/>
-          <w:numId w:val="4"/>
-        </w:numPr>
-        <w:rPr>
-          <w:rFonts w:hint="eastAsia"/>
-        </w:rPr>
-      </w:pPr>
-      <w:r>
-        <w:t xml:space="preserve">LocalOverrides </w:t>
-      </w:r>
-      <w:r>
-        <w:t>mechanism removed.</w:t>
-      </w:r>
-    </w:p>
-    <w:p>
-      <w:pPr>
-        <w:numPr>
-          <w:ilvl w:val="0"/>
-          <w:numId w:val="4"/>
-        </w:numPr>
-        <w:rPr>
-          <w:rFonts w:hint="eastAsia"/>
-        </w:rPr>
-      </w:pPr>
-      <w:r>
-        <w:t>Save project file: the [Update XML to current version] checkbox is now enabled by default.</w:t>
-      </w:r>
-    </w:p>
-    <w:p>
-      <w:pPr>
-        <w:numPr>
-          <w:ilvl w:val="0"/>
-          <w:numId w:val="4"/>
-        </w:numPr>
-        <w:rPr>
-          <w:rFonts w:hint="eastAsia"/>
-        </w:rPr>
-      </w:pPr>
-      <w:r>
-        <w:lastRenderedPageBreak/>
-        <w:t>Options form: tooltips improved.</w:t>
-      </w:r>
-    </w:p>
-    <w:p>
-      <w:pPr>
-        <w:numPr>
-          <w:ilvl w:val="0"/>
-          <w:numId w:val="4"/>
-        </w:numPr>
-        <w:rPr>
-          <w:rFonts w:hint="eastAsia"/>
-        </w:rPr>
-      </w:pPr>
-      <w:r>
-        <w:t>Grid: Regist</w:t>
-      </w:r>
-      <w:r>
-        <w:t>er</w:t>
+        <w:numPr>
+          <w:ilvl w:val="0"/>
+          <w:numId w:val="11"/>
+        </w:numPr>
+        <w:rPr>
+          <w:rFonts w:hint="eastAsia"/>
+        </w:rPr>
+      </w:pPr>
+      <w:r>
+        <w:t>M</w:t>
+      </w:r>
+      <w:r>
+        <w:t xml:space="preserve">bc project file: XML tags </w:t>
+      </w:r>
+      <w:r>
+        <w:t xml:space="preserve">are </w:t>
+      </w:r>
+      <w:r>
+        <w:t xml:space="preserve">now preferably in lowercase. The old camelcase is also still accepted. </w:t>
+      </w:r>
+    </w:p>
+    <w:p>
+      <w:pPr>
+        <w:numPr>
+          <w:ilvl w:val="0"/>
+          <w:numId w:val="11"/>
+        </w:numPr>
+        <w:rPr>
+          <w:rFonts w:hint="eastAsia"/>
+        </w:rPr>
+      </w:pPr>
+      <w:r>
+        <w:t>Always shows line numbers f</w:t>
+      </w:r>
+      <w:r>
+        <w:t xml:space="preserve">or errors in mbc file. </w:t>
+      </w:r>
+    </w:p>
+    <w:p>
+      <w:pPr>
+        <w:numPr>
+          <w:ilvl w:val="0"/>
+          <w:numId w:val="11"/>
+        </w:numPr>
+        <w:rPr>
+          <w:rFonts w:hint="eastAsia"/>
+        </w:rPr>
+      </w:pPr>
+      <w:r>
+        <w:t>Word order (endian)</w:t>
       </w:r>
       <w:r>
         <w:t xml:space="preserve"> </w:t>
       </w:r>
       <w:r>
-        <w:t xml:space="preserve">column menu now has </w:t>
-      </w:r>
-      <w:r>
-        <w:t xml:space="preserve"> [</w:t>
-      </w:r>
-      <w:r>
-        <w:t>Expand all]</w:t>
-      </w:r>
-      <w:r>
-        <w:t xml:space="preserve"> and </w:t>
-      </w:r>
-      <w:r>
-        <w:t>[</w:t>
-      </w:r>
-      <w:r>
-        <w:t>Collapse all</w:t>
-      </w:r>
-      <w:r>
-        <w:t>].</w:t>
-      </w:r>
-    </w:p>
-    <w:p>
-      <w:pPr>
-        <w:numPr>
-          <w:ilvl w:val="0"/>
-          <w:numId w:val="4"/>
-        </w:numPr>
-        <w:rPr>
-          <w:rFonts w:hint="eastAsia"/>
-        </w:rPr>
-      </w:pPr>
-      <w:r>
-        <w:t xml:space="preserve">Mbc project file: &lt;longdescr&gt; </w:t>
-      </w:r>
-      <w:r>
-        <w:t xml:space="preserve">element </w:t>
-      </w:r>
-      <w:r>
-        <w:t xml:space="preserve">added. </w:t>
-      </w:r>
-      <w:r>
-        <w:t>Adds a long multiline text that is show when the mouse is hoovered over the register decription</w:t>
-      </w:r>
-      <w:r>
-        <w:t>.</w:t>
-      </w:r>
-    </w:p>
-    <w:p>
-      <w:pPr>
-        <w:numPr>
-          <w:ilvl w:val="0"/>
-          <w:numId w:val="4"/>
-        </w:numPr>
-        <w:rPr>
-          <w:rFonts w:hint="eastAsia"/>
-        </w:rPr>
-      </w:pPr>
-      <w:r>
-        <w:t>Mbc project file: &lt;include&gt; element added.</w:t>
-      </w:r>
-    </w:p>
-    <w:p>
-      <w:pPr>
-        <w:pStyle w:val="Kop3"/>
-        <w:numPr>
-          <w:ilvl w:val="0"/>
-          <w:numId w:val="0"/>
-        </w:numPr>
-        <w:ind w:left="680" w:hanging="431"/>
-        <w:rPr>
-          <w:rFonts w:hint="eastAsia"/>
-        </w:rPr>
-      </w:pPr>
-      <w:r>
-        <w:t>Fixes</w:t>
-      </w:r>
-    </w:p>
-    <w:p>
-      <w:pPr>
-        <w:numPr>
-          <w:ilvl w:val="0"/>
-          <w:numId w:val="4"/>
-        </w:numPr>
-        <w:rPr>
-          <w:rFonts w:hint="eastAsia"/>
-        </w:rPr>
-      </w:pPr>
-      <w:r>
-        <w:t>[</w:t>
-      </w:r>
-      <w:r>
-        <w:t>Open project file location in Explorer] now works if you gave a filename without a path on the command line.</w:t>
-      </w:r>
-    </w:p>
-    <w:p>
-      <w:pPr>
-        <w:numPr>
-          <w:ilvl w:val="0"/>
-          <w:numId w:val="4"/>
-        </w:numPr>
-        <w:rPr>
-          <w:rFonts w:hint="eastAsia"/>
-        </w:rPr>
-      </w:pPr>
-      <w:r>
-        <w:t xml:space="preserve">The temporary red </w:t>
-      </w:r>
-      <w:r>
-        <w:t>colouring</w:t>
-      </w:r>
-      <w:r>
-        <w:t xml:space="preserve"> of the value field after entering </w:t>
-      </w:r>
-      <w:r>
-        <w:t xml:space="preserve">an invalid value </w:t>
-      </w:r>
-      <w:r>
-        <w:t>has been improved.</w:t>
-      </w:r>
-    </w:p>
-    <w:p>
-      <w:pPr>
-        <w:numPr>
-          <w:ilvl w:val="0"/>
-          <w:numId w:val="4"/>
-        </w:numPr>
-        <w:rPr>
-          <w:rFonts w:hint="eastAsia"/>
-        </w:rPr>
-      </w:pPr>
-      <w:r>
-        <w:t>Edit</w:t>
-      </w:r>
-      <w:r>
-        <w:t xml:space="preserve"> enter/escape </w:t>
-      </w:r>
-      <w:r>
-        <w:t>handling is improved</w:t>
-      </w:r>
-      <w:r>
-        <w:t>.</w:t>
-      </w:r>
-    </w:p>
-    <w:p>
-      <w:pPr>
-        <w:numPr>
-          <w:ilvl w:val="0"/>
-          <w:numId w:val="4"/>
-        </w:numPr>
-        <w:rPr>
-          <w:rFonts w:hint="eastAsia"/>
-        </w:rPr>
-      </w:pPr>
-      <w:r>
-        <w:t xml:space="preserve">In the notification screen that the serial port could not be opened: the [Port] </w:t>
-      </w:r>
-      <w:r>
-        <w:t>combo box</w:t>
-      </w:r>
-      <w:r>
-        <w:t xml:space="preserve"> now automatically refreshes the list of serial ports.</w:t>
-      </w:r>
-    </w:p>
-    <w:p>
-      <w:pPr>
-        <w:pStyle w:val="Kop1"/>
-        <w:rPr>
-          <w:rFonts w:hint="eastAsia"/>
-        </w:rPr>
-      </w:pPr>
-      <w:r>
-        <w:t>v2.0.13 -- 2022-07-11</w:t>
-      </w:r>
-    </w:p>
-    <w:p>
-      <w:pPr>
-        <w:pStyle w:val="Kop3"/>
-        <w:rPr>
-          <w:rFonts w:hint="eastAsia"/>
-        </w:rPr>
-      </w:pPr>
-      <w:r>
-        <w:t>Features</w:t>
-      </w:r>
-    </w:p>
-    <w:p>
-      <w:pPr>
-        <w:numPr>
-          <w:ilvl w:val="0"/>
-          <w:numId w:val="4"/>
-        </w:numPr>
-        <w:rPr>
-          <w:rFonts w:hint="eastAsia"/>
-        </w:rPr>
-      </w:pPr>
-      <w:r>
-        <w:t xml:space="preserve">Added Find/Filter bar. </w:t>
-      </w:r>
-      <w:r>
-        <w:t>Open it using</w:t>
-      </w:r>
-      <w:r>
-        <w:t xml:space="preserve"> Control-F. There is also an option </w:t>
-      </w:r>
-      <w:r>
-        <w:t>“</w:t>
-      </w:r>
-      <w:r>
-        <w:t>Clear Find/Filter on tab change</w:t>
-      </w:r>
-      <w:r>
-        <w:t>”</w:t>
-      </w:r>
-      <w:r>
-        <w:t>.</w:t>
-      </w:r>
-    </w:p>
-    <w:p>
-      <w:pPr>
-        <w:numPr>
-          <w:ilvl w:val="0"/>
-          <w:numId w:val="4"/>
-        </w:numPr>
-        <w:rPr>
-          <w:rFonts w:hint="eastAsia"/>
-        </w:rPr>
-      </w:pPr>
-      <w:r>
-        <w:t xml:space="preserve">The properties of a register (rw, int32, ...) are now displayed in a separate </w:t>
-      </w:r>
-      <w:r>
-        <w:t>[</w:t>
-      </w:r>
-      <w:r>
-        <w:t>Properties</w:t>
-      </w:r>
-      <w:r>
-        <w:t>]</w:t>
-      </w:r>
-      <w:r>
-        <w:t xml:space="preserve"> column</w:t>
-      </w:r>
-      <w:r>
-        <w:t xml:space="preserve"> instead of being added to </w:t>
-      </w:r>
-      <w:r>
-        <w:t xml:space="preserve">the </w:t>
-      </w:r>
-      <w:r>
-        <w:t>[</w:t>
-      </w:r>
-      <w:r>
-        <w:t>Description</w:t>
-      </w:r>
-      <w:r>
-        <w:t>]</w:t>
-      </w:r>
-      <w:r>
-        <w:t xml:space="preserve"> column. </w:t>
-      </w:r>
-      <w:r>
-        <w:t>The [Properties]  column can be e</w:t>
-      </w:r>
-      <w:r>
-        <w:t>nable/disable</w:t>
-      </w:r>
-      <w:r>
-        <w:t>d</w:t>
-      </w:r>
-      <w:r>
-        <w:t xml:space="preserve"> in Options.</w:t>
-      </w:r>
-    </w:p>
-    <w:p>
-      <w:pPr>
-        <w:numPr>
-          <w:ilvl w:val="0"/>
-          <w:numId w:val="4"/>
-        </w:numPr>
-        <w:rPr>
-          <w:rFonts w:hint="eastAsia"/>
-        </w:rPr>
-      </w:pPr>
-      <w:r>
-        <w:t>The Description text can now be multi-line</w:t>
-      </w:r>
-      <w:r>
-        <w:t>, i</w:t>
-      </w:r>
-      <w:r>
-        <w:t xml:space="preserve">f  the </w:t>
-      </w:r>
-      <w:r>
-        <w:t>“</w:t>
-      </w:r>
-      <w:r>
-        <w:t>Multiline rows with auto row size</w:t>
-      </w:r>
-      <w:r>
-        <w:t>”</w:t>
-      </w:r>
-      <w:r>
-        <w:t xml:space="preserve"> option </w:t>
-      </w:r>
-      <w:r>
-        <w:t>is enabled</w:t>
-      </w:r>
-      <w:r>
-        <w:t xml:space="preserve">. A </w:t>
-      </w:r>
-      <w:r>
-        <w:t xml:space="preserve">long </w:t>
-      </w:r>
-      <w:r>
-        <w:t xml:space="preserve">description </w:t>
-      </w:r>
-      <w:r>
-        <w:t>text is wrappe</w:t>
-      </w:r>
-      <w:r>
-        <w:t xml:space="preserve">d. </w:t>
-      </w:r>
-      <w:r>
-        <w:t>CR/LF</w:t>
-      </w:r>
-      <w:r>
-        <w:t xml:space="preserve">’s can be used in the description text. </w:t>
-      </w:r>
-      <w:r>
-        <w:t xml:space="preserve">The row height of the grid is automatically adjusted to the text. </w:t>
-      </w:r>
-    </w:p>
-    <w:p>
-      <w:pPr>
-        <w:numPr>
-          <w:ilvl w:val="0"/>
-          <w:numId w:val="4"/>
-        </w:numPr>
-        <w:rPr>
-          <w:rFonts w:hint="eastAsia"/>
-        </w:rPr>
-      </w:pPr>
-      <w:r>
-        <w:t>"Move to next row on Enter"</w:t>
-      </w:r>
-      <w:r>
-        <w:t xml:space="preserve"> option</w:t>
-      </w:r>
-      <w:r>
-        <w:t xml:space="preserve">: depending on this option, after entering a new value with the Enter key, the </w:t>
-      </w:r>
-      <w:r>
-        <w:t>cursor</w:t>
-      </w:r>
-      <w:r>
-        <w:t xml:space="preserve"> may or may not go to the next line. </w:t>
-      </w:r>
-      <w:r>
-        <w:t xml:space="preserve">Enter a value with </w:t>
-      </w:r>
-      <w:r>
-        <w:t>Control-Enter</w:t>
-      </w:r>
-      <w:r>
-        <w:t xml:space="preserve"> to get the</w:t>
-      </w:r>
-      <w:r>
-        <w:t xml:space="preserve"> opposite</w:t>
-      </w:r>
-      <w:r>
-        <w:t xml:space="preserve"> behaviour.</w:t>
-      </w:r>
-    </w:p>
-    <w:p>
-      <w:pPr>
-        <w:pStyle w:val="Kop3"/>
-        <w:numPr>
-          <w:ilvl w:val="0"/>
-          <w:numId w:val="0"/>
-        </w:numPr>
-        <w:ind w:left="680" w:hanging="431"/>
-        <w:rPr>
-          <w:rFonts w:hint="eastAsia"/>
-        </w:rPr>
-      </w:pPr>
-      <w:r>
-        <w:t>Fixes</w:t>
-      </w:r>
-    </w:p>
-    <w:p>
-      <w:pPr>
-        <w:numPr>
-          <w:ilvl w:val="0"/>
-          <w:numId w:val="5"/>
-        </w:numPr>
-        <w:rPr>
-          <w:rFonts w:hint="eastAsia"/>
-        </w:rPr>
-      </w:pPr>
-      <w:r>
-        <w:t>Control-0 for zoom reset now works globally on the form, not just when the focus is in the grid.</w:t>
-      </w:r>
-    </w:p>
-    <w:p>
-      <w:pPr>
-        <w:numPr>
-          <w:ilvl w:val="0"/>
-          <w:numId w:val="5"/>
-        </w:numPr>
-        <w:rPr>
-          <w:rFonts w:hint="eastAsia"/>
-        </w:rPr>
-      </w:pPr>
-      <w:r>
-        <w:t>R</w:t>
-      </w:r>
-      <w:r>
-        <w:t>ight-click</w:t>
-      </w:r>
-      <w:r>
-        <w:t>ing</w:t>
-      </w:r>
-      <w:r>
-        <w:t xml:space="preserve"> in the grid</w:t>
-      </w:r>
-      <w:r>
-        <w:t xml:space="preserve"> now moves the focus to that row, to </w:t>
-      </w:r>
-      <w:r>
-        <w:t>better see which row you are working on.</w:t>
-      </w:r>
-    </w:p>
-    <w:p>
-      <w:pPr>
-        <w:numPr>
-          <w:ilvl w:val="0"/>
-          <w:numId w:val="5"/>
-        </w:numPr>
-        <w:rPr>
-          <w:rFonts w:hint="eastAsia"/>
-        </w:rPr>
-      </w:pPr>
-      <w:r>
-        <w:t>Migrated</w:t>
-      </w:r>
-      <w:r>
-        <w:t xml:space="preserve"> to .NET framework 4.7.2.</w:t>
-      </w:r>
-    </w:p>
-    <w:p>
-      <w:pPr>
-        <w:pStyle w:val="Kop1"/>
-        <w:rPr>
-          <w:rFonts w:hint="eastAsia"/>
-        </w:rPr>
-      </w:pPr>
-      <w:r>
-        <w:t>v2.0.12 -- 2020-07-13</w:t>
-      </w:r>
-    </w:p>
-    <w:p>
-      <w:pPr>
-        <w:pStyle w:val="Kop3"/>
-        <w:rPr>
-          <w:rFonts w:hint="eastAsia"/>
-        </w:rPr>
-      </w:pPr>
-      <w:r>
-        <w:t>Features</w:t>
-      </w:r>
-    </w:p>
-    <w:p>
-      <w:pPr>
-        <w:numPr>
-          <w:ilvl w:val="0"/>
-          <w:numId w:val="6"/>
-        </w:numPr>
-        <w:rPr>
-          <w:rFonts w:hint="eastAsia"/>
-        </w:rPr>
-      </w:pPr>
-      <w:r>
-        <w:t>Added mbc project file validation with XSD schema</w:t>
-      </w:r>
-      <w:r>
-        <w:t xml:space="preserve"> file</w:t>
-      </w:r>
-      <w:r>
-        <w:t xml:space="preserve">. </w:t>
-      </w:r>
-      <w:r>
-        <w:t xml:space="preserve">Validation is optional. </w:t>
-      </w:r>
-      <w:r>
-        <w:t>The validation only allows lower-case XML tags</w:t>
-      </w:r>
-      <w:r>
-        <w:t>, a</w:t>
-      </w:r>
-      <w:r>
-        <w:t xml:space="preserve">nd only allows the XML elements that are supported in this version. The intention is that over time all mbc files will </w:t>
-      </w:r>
-      <w:r>
-        <w:t>migrate</w:t>
-      </w:r>
-      <w:r>
-        <w:t xml:space="preserve"> to meet the validation.</w:t>
-      </w:r>
-    </w:p>
-    <w:p>
-      <w:pPr>
-        <w:numPr>
-          <w:ilvl w:val="0"/>
-          <w:numId w:val="6"/>
-        </w:numPr>
-        <w:rPr>
-          <w:rFonts w:hint="eastAsia"/>
-        </w:rPr>
-      </w:pPr>
-      <w:r>
-        <w:t>In</w:t>
-      </w:r>
-      <w:r>
-        <w:t xml:space="preserve"> </w:t>
-      </w:r>
-      <w:r>
-        <w:t xml:space="preserve">the </w:t>
-      </w:r>
-      <w:r>
-        <w:t xml:space="preserve">"Save project file" </w:t>
-      </w:r>
-      <w:r>
-        <w:t xml:space="preserve">form </w:t>
-      </w:r>
-      <w:r>
-        <w:t xml:space="preserve">you now have the option to update the XML with "Update XML to current version" so that it then passes the validation. </w:t>
-      </w:r>
-      <w:r>
-        <w:t>E</w:t>
-      </w:r>
-      <w:r>
-        <w:t>rrors must be corrected manually.</w:t>
-      </w:r>
-    </w:p>
-    <w:p>
-      <w:pPr>
-        <w:numPr>
-          <w:ilvl w:val="0"/>
-          <w:numId w:val="6"/>
-        </w:numPr>
-        <w:rPr>
-          <w:rFonts w:hint="eastAsia"/>
-        </w:rPr>
-      </w:pPr>
-      <w:r>
-        <w:t>In</w:t>
-      </w:r>
-      <w:r>
-        <w:t xml:space="preserve"> "Save project file" the project file is now saved with XML formatting.</w:t>
-      </w:r>
-    </w:p>
-    <w:p>
-      <w:pPr>
-        <w:numPr>
-          <w:ilvl w:val="0"/>
-          <w:numId w:val="6"/>
-        </w:numPr>
-        <w:rPr>
-          <w:rFonts w:hint="eastAsia"/>
-        </w:rPr>
-      </w:pPr>
-      <w:r>
-        <w:t>If you start ModbusControl by double-clicking an mbc file and the file points to a non-existent COM port, the error dialog "Error opening serial port COMx" now appears after the ModbusControl program appears.</w:t>
-      </w:r>
-    </w:p>
-    <w:p>
-      <w:pPr>
-        <w:numPr>
-          <w:ilvl w:val="0"/>
-          <w:numId w:val="6"/>
-        </w:numPr>
-        <w:rPr>
-          <w:rFonts w:hint="eastAsia"/>
-        </w:rPr>
-      </w:pPr>
-      <w:r>
-        <w:t xml:space="preserve">At the first start </w:t>
-      </w:r>
-      <w:r>
-        <w:t xml:space="preserve">of the program </w:t>
-      </w:r>
-      <w:r>
-        <w:t xml:space="preserve">after an update, </w:t>
-      </w:r>
-      <w:r>
-        <w:t xml:space="preserve">an option is shown </w:t>
-      </w:r>
-      <w:r>
-        <w:t xml:space="preserve">to see the 'Release </w:t>
-      </w:r>
-      <w:r>
-        <w:lastRenderedPageBreak/>
-        <w:t>notes'.</w:t>
-      </w:r>
-    </w:p>
-    <w:p>
-      <w:pPr>
-        <w:numPr>
-          <w:ilvl w:val="0"/>
-          <w:numId w:val="6"/>
-        </w:numPr>
-        <w:rPr>
-          <w:rFonts w:hint="eastAsia"/>
-        </w:rPr>
-      </w:pPr>
-      <w:r>
-        <w:t xml:space="preserve">Program settings split into user-dependent part and </w:t>
-      </w:r>
-      <w:r>
-        <w:t>computer</w:t>
-      </w:r>
-      <w:r>
-        <w:t xml:space="preserve">-dependent part. The old settings are migrated to the new settings files, then </w:t>
-      </w:r>
-      <w:r>
-        <w:t xml:space="preserve">the </w:t>
-      </w:r>
-      <w:r>
-        <w:t>old settings file is deleted.</w:t>
-      </w:r>
-    </w:p>
-    <w:p>
-      <w:pPr>
-        <w:numPr>
-          <w:ilvl w:val="0"/>
-          <w:numId w:val="6"/>
-        </w:numPr>
-        <w:rPr>
-          <w:rFonts w:hint="eastAsia"/>
-        </w:rPr>
-      </w:pPr>
-      <w:r>
-        <w:t xml:space="preserve">LocalOverrides.xml </w:t>
-      </w:r>
-      <w:r>
-        <w:t xml:space="preserve">file is automatically </w:t>
-      </w:r>
-      <w:r>
-        <w:t xml:space="preserve">moved from &lt;mydocuments&gt;\ModbusControl to %AppData%\Roaming\E.D.&amp;A\ModbusControl. Content from old is not migrated. Old </w:t>
-      </w:r>
-      <w:r>
-        <w:t>file</w:t>
-      </w:r>
-      <w:r>
-        <w:t xml:space="preserve"> is renamed with '.old' and moved to the </w:t>
-      </w:r>
-      <w:r>
-        <w:t xml:space="preserve">new </w:t>
-      </w:r>
-      <w:r>
-        <w:t>location. If overrides were used, the user will receive a notification.</w:t>
-      </w:r>
-    </w:p>
-    <w:p>
-      <w:pPr>
-        <w:numPr>
-          <w:ilvl w:val="0"/>
-          <w:numId w:val="6"/>
-        </w:numPr>
-        <w:rPr>
-          <w:rFonts w:hint="eastAsia"/>
-        </w:rPr>
-      </w:pPr>
-      <w:r>
-        <w:t>&lt;user&gt;\Documents\ModbusControl is no longer used.</w:t>
-      </w:r>
-    </w:p>
-    <w:p>
-      <w:pPr>
-        <w:pStyle w:val="Kop3"/>
-        <w:rPr>
-          <w:rFonts w:hint="eastAsia"/>
-        </w:rPr>
-      </w:pPr>
-      <w:r>
-        <w:t>Fixes</w:t>
-      </w:r>
-    </w:p>
-    <w:p>
-      <w:pPr>
-        <w:numPr>
-          <w:ilvl w:val="0"/>
-          <w:numId w:val="7"/>
-        </w:numPr>
-        <w:rPr>
-          <w:rFonts w:hint="eastAsia"/>
-        </w:rPr>
-      </w:pPr>
-      <w:r>
-        <w:t>The import/export dialogs now show '*. CSV' instead of '*. C</w:t>
-      </w:r>
-      <w:r>
-        <w:t>VS</w:t>
-      </w:r>
-      <w:r>
-        <w:t>'.</w:t>
-      </w:r>
-    </w:p>
-    <w:p>
-      <w:pPr>
-        <w:numPr>
-          <w:ilvl w:val="0"/>
-          <w:numId w:val="7"/>
-        </w:numPr>
-        <w:rPr>
-          <w:rFonts w:hint="eastAsia"/>
-        </w:rPr>
-      </w:pPr>
-      <w:r>
-        <w:t>Mbc file is now saved without BOM (</w:t>
-      </w:r>
-      <w:r>
-        <w:t>Unicode</w:t>
-      </w:r>
-      <w:r>
-        <w:t xml:space="preserve"> byte order mark).</w:t>
-      </w:r>
-    </w:p>
-    <w:p>
-      <w:pPr>
-        <w:numPr>
-          <w:ilvl w:val="0"/>
-          <w:numId w:val="7"/>
-        </w:numPr>
-        <w:rPr>
-          <w:rFonts w:hint="eastAsia"/>
-        </w:rPr>
-      </w:pPr>
-      <w:r>
-        <w:t xml:space="preserve">Better </w:t>
-      </w:r>
-      <w:r>
-        <w:t>handling</w:t>
-      </w:r>
-      <w:r>
-        <w:t xml:space="preserve"> if </w:t>
-      </w:r>
-      <w:r>
-        <w:t>a</w:t>
-      </w:r>
-      <w:r>
-        <w:t xml:space="preserve"> non-admin</w:t>
-      </w:r>
-      <w:r>
-        <w:t>istrator</w:t>
-      </w:r>
-      <w:r>
-        <w:t xml:space="preserve"> user logs </w:t>
-      </w:r>
-      <w:r>
-        <w:t xml:space="preserve">on </w:t>
-      </w:r>
-      <w:r>
-        <w:t>and uses ModbusControl.</w:t>
-      </w:r>
-    </w:p>
-    <w:p>
-      <w:pPr>
-        <w:pStyle w:val="Kop1"/>
-        <w:rPr>
-          <w:rFonts w:hint="eastAsia"/>
-        </w:rPr>
-      </w:pPr>
-      <w:r>
-        <w:t>v2.0.11 -- 2019-11-18</w:t>
-      </w:r>
-    </w:p>
-    <w:p>
-      <w:pPr>
-        <w:pStyle w:val="Kop3"/>
-        <w:rPr>
-          <w:rFonts w:hint="eastAsia"/>
-        </w:rPr>
-      </w:pPr>
-      <w:r>
-        <w:t>Fixes</w:t>
-      </w:r>
-    </w:p>
-    <w:p>
-      <w:pPr>
-        <w:numPr>
-          <w:ilvl w:val="0"/>
-          <w:numId w:val="8"/>
-        </w:numPr>
-        <w:rPr>
-          <w:rFonts w:hint="eastAsia"/>
-        </w:rPr>
-      </w:pPr>
-      <w:r>
-        <w:t xml:space="preserve">Better handling if the USB/serial connection is lost. In the past </w:t>
-      </w:r>
-      <w:r>
-        <w:t xml:space="preserve">the </w:t>
-      </w:r>
-      <w:r>
-        <w:t xml:space="preserve">program </w:t>
-      </w:r>
-      <w:r>
-        <w:t>could stop responding</w:t>
-      </w:r>
-      <w:r>
-        <w:t>.</w:t>
-      </w:r>
-    </w:p>
-    <w:p>
-      <w:pPr>
-        <w:pStyle w:val="Kop1"/>
-        <w:rPr>
-          <w:rFonts w:hint="eastAsia"/>
-        </w:rPr>
-      </w:pPr>
-      <w:r>
-        <w:t>v2.0.10 -- 2019-03-11</w:t>
-      </w:r>
-    </w:p>
-    <w:p>
-      <w:pPr>
-        <w:pStyle w:val="Kop3"/>
-        <w:rPr>
-          <w:rFonts w:hint="eastAsia"/>
-        </w:rPr>
-      </w:pPr>
-      <w:r>
-        <w:t>Features</w:t>
-      </w:r>
-    </w:p>
-    <w:p>
-      <w:pPr>
-        <w:numPr>
-          <w:ilvl w:val="0"/>
-          <w:numId w:val="8"/>
-        </w:numPr>
-        <w:rPr>
-          <w:rFonts w:hint="eastAsia"/>
-        </w:rPr>
-      </w:pPr>
-      <w:r>
-        <w:t>Added display</w:t>
-      </w:r>
-      <w:r>
-        <w:t>ing</w:t>
-      </w:r>
-      <w:r>
-        <w:t xml:space="preserve"> of enum </w:t>
-      </w:r>
-      <w:r>
-        <w:t xml:space="preserve">values </w:t>
-      </w:r>
-      <w:r>
-        <w:t xml:space="preserve">in the value column. </w:t>
-      </w:r>
-    </w:p>
-    <w:p>
-      <w:pPr>
-        <w:pStyle w:val="Kop3"/>
-        <w:rPr>
-          <w:rFonts w:hint="eastAsia"/>
-        </w:rPr>
-      </w:pPr>
-      <w:r>
-        <w:t>Fixes</w:t>
-      </w:r>
-    </w:p>
-    <w:p>
-      <w:pPr>
-        <w:numPr>
-          <w:ilvl w:val="0"/>
-          <w:numId w:val="8"/>
-        </w:numPr>
-        <w:rPr>
-          <w:rFonts w:hint="eastAsia"/>
-        </w:rPr>
-      </w:pPr>
-      <w:r>
-        <w:t xml:space="preserve">Menu </w:t>
-      </w:r>
-      <w:r>
-        <w:t xml:space="preserve">item </w:t>
-      </w:r>
-      <w:r>
-        <w:t xml:space="preserve">"Edit project file" did not work </w:t>
-      </w:r>
-      <w:r>
-        <w:t xml:space="preserve">correctly </w:t>
-      </w:r>
-      <w:r>
-        <w:t>if there was a space in the path.</w:t>
-      </w:r>
-    </w:p>
-    <w:p>
-      <w:pPr>
-        <w:numPr>
-          <w:ilvl w:val="0"/>
-          <w:numId w:val="8"/>
-        </w:numPr>
-        <w:rPr>
-          <w:rFonts w:hint="eastAsia"/>
-        </w:rPr>
-      </w:pPr>
-      <w:r>
-        <w:t>Logger: Clear button did not clear number of logs in the status bar.</w:t>
-      </w:r>
-    </w:p>
-    <w:p>
-      <w:pPr>
-        <w:numPr>
-          <w:ilvl w:val="0"/>
-          <w:numId w:val="8"/>
-        </w:numPr>
-        <w:rPr>
-          <w:rFonts w:hint="eastAsia"/>
-        </w:rPr>
-      </w:pPr>
-      <w:r>
-        <w:t xml:space="preserve">Send Custom Modbus Command: allows tabs and CR/LF in the string. </w:t>
-      </w:r>
-      <w:r>
-        <w:t xml:space="preserve">Reports </w:t>
-      </w:r>
-      <w:r>
-        <w:t xml:space="preserve">error </w:t>
-      </w:r>
-      <w:r>
-        <w:t>for</w:t>
-      </w:r>
-      <w:r>
-        <w:t xml:space="preserve"> empty command string. </w:t>
-      </w:r>
-    </w:p>
-    <w:p>
-      <w:pPr>
-        <w:numPr>
-          <w:ilvl w:val="0"/>
-          <w:numId w:val="8"/>
-        </w:numPr>
-        <w:rPr>
-          <w:rFonts w:hint="eastAsia"/>
-        </w:rPr>
-      </w:pPr>
-      <w:r>
-        <w:t xml:space="preserve">Send Custom Modbus Command: </w:t>
-      </w:r>
-      <w:r>
-        <w:t>Reports</w:t>
-      </w:r>
-      <w:r>
-        <w:t xml:space="preserve"> error when command is too short, must be at least 2 bytes.</w:t>
-      </w:r>
-    </w:p>
-    <w:p>
-      <w:pPr>
-        <w:numPr>
-          <w:ilvl w:val="0"/>
-          <w:numId w:val="8"/>
-        </w:numPr>
-        <w:rPr>
-          <w:rFonts w:hint="eastAsia"/>
-        </w:rPr>
-      </w:pPr>
-      <w:r>
-        <w:t xml:space="preserve">Fix background </w:t>
-      </w:r>
-      <w:r>
-        <w:t>colour</w:t>
-      </w:r>
-      <w:r>
-        <w:t xml:space="preserve"> of registers.</w:t>
-      </w:r>
-    </w:p>
-    <w:p>
-      <w:pPr>
-        <w:pStyle w:val="Kop1"/>
-        <w:rPr>
-          <w:rFonts w:hint="eastAsia"/>
-        </w:rPr>
-      </w:pPr>
-      <w:r>
-        <w:t>v2.0.9 -- 2018-10-20</w:t>
-      </w:r>
-    </w:p>
-    <w:p>
-      <w:pPr>
-        <w:pStyle w:val="Kop3"/>
-        <w:rPr>
-          <w:rFonts w:hint="eastAsia"/>
-        </w:rPr>
-      </w:pPr>
-      <w:r>
-        <w:t>Features</w:t>
-      </w:r>
-    </w:p>
-    <w:p>
-      <w:pPr>
-        <w:numPr>
-          <w:ilvl w:val="0"/>
-          <w:numId w:val="9"/>
-        </w:numPr>
-        <w:rPr>
-          <w:rFonts w:hint="eastAsia"/>
-        </w:rPr>
-      </w:pPr>
-      <w:r>
-        <w:t>New option: "Move to next row on Enter".</w:t>
-      </w:r>
-    </w:p>
-    <w:p>
-      <w:pPr>
-        <w:numPr>
-          <w:ilvl w:val="0"/>
-          <w:numId w:val="9"/>
-        </w:numPr>
-        <w:rPr>
-          <w:rFonts w:hint="eastAsia"/>
-        </w:rPr>
-      </w:pPr>
-      <w:r>
-        <w:t xml:space="preserve">New option: "Auto-start edit mode on typing". </w:t>
-      </w:r>
-    </w:p>
-    <w:p>
-      <w:pPr>
-        <w:numPr>
-          <w:ilvl w:val="0"/>
-          <w:numId w:val="9"/>
-        </w:numPr>
-        <w:rPr>
-          <w:rFonts w:hint="eastAsia"/>
-        </w:rPr>
-      </w:pPr>
-      <w:r>
-        <w:t xml:space="preserve">New option: "Use custom editor". </w:t>
-      </w:r>
-    </w:p>
-    <w:p>
-      <w:pPr>
-        <w:numPr>
-          <w:ilvl w:val="0"/>
-          <w:numId w:val="9"/>
-        </w:numPr>
-        <w:rPr>
-          <w:rFonts w:hint="eastAsia"/>
-        </w:rPr>
-      </w:pPr>
-      <w:r>
-        <w:t>New option: "Ignore form size on project reload".</w:t>
-      </w:r>
-    </w:p>
-    <w:p>
-      <w:pPr>
-        <w:numPr>
-          <w:ilvl w:val="0"/>
-          <w:numId w:val="9"/>
-        </w:numPr>
-        <w:rPr>
-          <w:rFonts w:hint="eastAsia"/>
-        </w:rPr>
-      </w:pPr>
-      <w:r>
-        <w:t>Config</w:t>
-      </w:r>
-      <w:r>
-        <w:t>uration</w:t>
-      </w:r>
-      <w:r>
-        <w:t xml:space="preserve"> form now has an Apply button.</w:t>
-      </w:r>
-    </w:p>
-    <w:p>
-      <w:pPr>
-        <w:numPr>
-          <w:ilvl w:val="0"/>
-          <w:numId w:val="9"/>
-        </w:numPr>
-        <w:rPr>
-          <w:rFonts w:hint="eastAsia"/>
-        </w:rPr>
-      </w:pPr>
-      <w:r>
-        <w:t xml:space="preserve">Separate line-copy and value-copy </w:t>
-      </w:r>
-      <w:r>
-        <w:t xml:space="preserve">capability </w:t>
-      </w:r>
-      <w:r>
-        <w:t xml:space="preserve">in grid, </w:t>
-      </w:r>
-      <w:r>
-        <w:t>using</w:t>
-      </w:r>
-      <w:r>
-        <w:t xml:space="preserve"> control-C and context menu.</w:t>
-      </w:r>
-    </w:p>
-    <w:p>
-      <w:pPr>
-        <w:numPr>
-          <w:ilvl w:val="0"/>
-          <w:numId w:val="9"/>
-        </w:numPr>
-        <w:rPr>
-          <w:rFonts w:hint="eastAsia"/>
-        </w:rPr>
-      </w:pPr>
-      <w:r>
-        <w:t xml:space="preserve">The status bar now </w:t>
-      </w:r>
-      <w:r>
-        <w:t xml:space="preserve">has </w:t>
-      </w:r>
-      <w:r>
-        <w:t xml:space="preserve">blue </w:t>
-      </w:r>
-      <w:r>
-        <w:t xml:space="preserve">colour </w:t>
-      </w:r>
-      <w:r>
-        <w:t>if there is no connection or no polling is done.</w:t>
-      </w:r>
-    </w:p>
-    <w:p>
-      <w:pPr>
-        <w:numPr>
-          <w:ilvl w:val="0"/>
-          <w:numId w:val="9"/>
-        </w:numPr>
-        <w:rPr>
-          <w:rFonts w:hint="eastAsia"/>
-        </w:rPr>
-      </w:pPr>
-      <w:r>
-        <w:t xml:space="preserve">The status bar </w:t>
-      </w:r>
-      <w:r>
-        <w:t xml:space="preserve">now has red colour </w:t>
-      </w:r>
-      <w:r>
-        <w:t>for errors.</w:t>
-      </w:r>
-    </w:p>
-    <w:p>
-      <w:pPr>
-        <w:numPr>
-          <w:ilvl w:val="0"/>
-          <w:numId w:val="9"/>
-        </w:numPr>
-        <w:rPr>
-          <w:rFonts w:hint="eastAsia"/>
-        </w:rPr>
-      </w:pPr>
-      <w:r>
-        <w:t xml:space="preserve">Now </w:t>
-      </w:r>
-      <w:r>
-        <w:t>shows</w:t>
-      </w:r>
-      <w:r>
-        <w:t xml:space="preserve"> a warning in the "Save configuration to project file" and "Project configuration" screens if localoverrides </w:t>
-      </w:r>
-      <w:r>
-        <w:t>were</w:t>
-      </w:r>
-      <w:r>
-        <w:t xml:space="preserve"> used.</w:t>
-      </w:r>
-    </w:p>
-    <w:p>
-      <w:pPr>
-        <w:pStyle w:val="Kop3"/>
-        <w:rPr>
-          <w:rFonts w:hint="eastAsia"/>
-        </w:rPr>
-      </w:pPr>
-      <w:r>
-        <w:t>Fixes</w:t>
-      </w:r>
-    </w:p>
-    <w:p>
-      <w:pPr>
-        <w:numPr>
-          <w:ilvl w:val="0"/>
-          <w:numId w:val="10"/>
-        </w:numPr>
-        <w:rPr>
-          <w:rFonts w:hint="eastAsia"/>
-        </w:rPr>
-      </w:pPr>
-      <w:r>
-        <w:t xml:space="preserve">Notification </w:t>
-      </w:r>
-      <w:r>
-        <w:t>if Settings.xml could not be loaded at startup.</w:t>
-      </w:r>
-    </w:p>
-    <w:p>
-      <w:pPr>
-        <w:numPr>
-          <w:ilvl w:val="0"/>
-          <w:numId w:val="10"/>
-        </w:numPr>
-        <w:rPr>
-          <w:rFonts w:hint="eastAsia"/>
-        </w:rPr>
-      </w:pPr>
-      <w:r>
-        <w:t xml:space="preserve">Settings.xml </w:t>
-      </w:r>
-      <w:r>
-        <w:t xml:space="preserve">writing now </w:t>
-      </w:r>
-      <w:r>
-        <w:t>update</w:t>
-      </w:r>
-      <w:r>
-        <w:t>s</w:t>
-      </w:r>
-      <w:r>
-        <w:t>/insert</w:t>
-      </w:r>
-      <w:r>
-        <w:t>s</w:t>
-      </w:r>
-      <w:r>
-        <w:t xml:space="preserve"> </w:t>
-      </w:r>
-      <w:r>
-        <w:t>al</w:t>
-      </w:r>
-      <w:r>
-        <w:t xml:space="preserve">l tags in the </w:t>
-      </w:r>
-      <w:r>
-        <w:t xml:space="preserve">existing </w:t>
-      </w:r>
-      <w:r>
-        <w:t>file instead of writing a completely new file, so that any newer tags from a newer version remain.</w:t>
-      </w:r>
-    </w:p>
-    <w:p>
-      <w:pPr>
-        <w:numPr>
-          <w:ilvl w:val="0"/>
-          <w:numId w:val="10"/>
-        </w:numPr>
-        <w:rPr>
-          <w:rFonts w:hint="eastAsia"/>
-        </w:rPr>
-      </w:pPr>
-      <w:r>
-        <w:t>Project Configuration: Interframe-delay: now shows "0 (auto)" at setting 0.</w:t>
-      </w:r>
-    </w:p>
-    <w:p>
-      <w:pPr>
-        <w:numPr>
-          <w:ilvl w:val="0"/>
-          <w:numId w:val="10"/>
-        </w:numPr>
-        <w:rPr>
-          <w:rFonts w:hint="eastAsia"/>
-        </w:rPr>
-      </w:pPr>
-      <w:r>
-        <w:lastRenderedPageBreak/>
-        <w:t xml:space="preserve">Local override project </w:t>
-      </w:r>
-      <w:r>
         <w:t xml:space="preserve">is </w:t>
       </w:r>
       <w:r>
-        <w:t xml:space="preserve">no longer </w:t>
-      </w:r>
-      <w:r>
-        <w:t xml:space="preserve">required to have a </w:t>
-      </w:r>
-      <w:r>
-        <w:t>&lt;modbus&gt; element.</w:t>
-      </w:r>
-    </w:p>
-    <w:p>
-      <w:pPr>
-        <w:numPr>
-          <w:ilvl w:val="0"/>
-          <w:numId w:val="10"/>
-        </w:numPr>
-        <w:rPr>
-          <w:rFonts w:hint="eastAsia"/>
-        </w:rPr>
-      </w:pPr>
-      <w:r>
-        <w:t>Dialog forms can now be closed with the Enter key.</w:t>
-      </w:r>
-    </w:p>
-    <w:p>
-      <w:pPr>
-        <w:numPr>
-          <w:ilvl w:val="0"/>
-          <w:numId w:val="10"/>
-        </w:numPr>
-        <w:rPr>
-          <w:rFonts w:hint="eastAsia"/>
-        </w:rPr>
-      </w:pPr>
-      <w:r>
-        <w:t xml:space="preserve">The </w:t>
-      </w:r>
-      <w:r>
-        <w:t>checkboxes of the "Save configuration to project file" form</w:t>
-      </w:r>
-      <w:r>
-        <w:t xml:space="preserve"> are now cleared when loading a project.</w:t>
-      </w:r>
-    </w:p>
-    <w:p>
-      <w:pPr>
-        <w:numPr>
-          <w:ilvl w:val="0"/>
-          <w:numId w:val="10"/>
-        </w:numPr>
-        <w:rPr>
-          <w:rFonts w:hint="eastAsia"/>
-        </w:rPr>
-      </w:pPr>
-      <w:r>
-        <w:t xml:space="preserve">Buttons at the bottom of the forms now have </w:t>
-      </w:r>
-      <w:r>
-        <w:t>better spacing</w:t>
-      </w:r>
-      <w:r>
-        <w:t>.</w:t>
-      </w:r>
-    </w:p>
-    <w:p>
-      <w:pPr>
-        <w:pStyle w:val="Kop1"/>
-        <w:rPr>
-          <w:rFonts w:hint="eastAsia"/>
-        </w:rPr>
-      </w:pPr>
-      <w:r>
-        <w:t>v2.0.8 -- 2018-08-02</w:t>
-      </w:r>
-    </w:p>
-    <w:p>
-      <w:pPr>
-        <w:pStyle w:val="Kop3"/>
-        <w:rPr>
-          <w:rFonts w:hint="eastAsia"/>
-        </w:rPr>
-      </w:pPr>
-      <w:r>
-        <w:t>Features</w:t>
+        <w:t xml:space="preserve">separately </w:t>
+      </w:r>
+      <w:r>
+        <w:t>configurable</w:t>
+      </w:r>
+      <w:r>
+        <w:t xml:space="preserve"> for int32 and float32. </w:t>
+      </w:r>
+      <w:r>
+        <w:t>Character</w:t>
+      </w:r>
+      <w:r>
+        <w:t xml:space="preserve"> order </w:t>
+      </w:r>
+      <w:r>
+        <w:t xml:space="preserve">is configurable </w:t>
+      </w:r>
+      <w:r>
+        <w:t xml:space="preserve">for ASCII. </w:t>
       </w:r>
     </w:p>
     <w:p>
@@ -2147,183 +2533,13 @@
           <w:rFonts w:hint="eastAsia"/>
         </w:rPr>
       </w:pPr>
-      <w:r>
-        <w:t xml:space="preserve">Added </w:t>
-      </w:r>
-      <w:r>
-        <w:t>menus and toolbar.</w:t>
-      </w:r>
-    </w:p>
-    <w:p>
-      <w:pPr>
-        <w:numPr>
-          <w:ilvl w:val="0"/>
-          <w:numId w:val="11"/>
-        </w:numPr>
-        <w:rPr>
-          <w:rFonts w:hint="eastAsia"/>
-        </w:rPr>
-      </w:pPr>
-      <w:r>
-        <w:t xml:space="preserve">Can save project configuration, bridge settings and form size in mbc file. </w:t>
-      </w:r>
-    </w:p>
-    <w:p>
-      <w:pPr>
-        <w:numPr>
-          <w:ilvl w:val="0"/>
-          <w:numId w:val="11"/>
-        </w:numPr>
-        <w:rPr>
-          <w:rFonts w:hint="eastAsia"/>
-        </w:rPr>
-      </w:pPr>
-      <w:r>
-        <w:t xml:space="preserve">Communication </w:t>
-      </w:r>
-      <w:r>
-        <w:t>pausing</w:t>
-      </w:r>
-      <w:r>
-        <w:t xml:space="preserve"> and poll-once.</w:t>
-      </w:r>
-    </w:p>
-    <w:p>
-      <w:pPr>
-        <w:numPr>
-          <w:ilvl w:val="0"/>
-          <w:numId w:val="11"/>
-        </w:numPr>
-        <w:rPr>
-          <w:rFonts w:hint="eastAsia"/>
-        </w:rPr>
-      </w:pPr>
-      <w:r>
-        <w:t>C</w:t>
-      </w:r>
-      <w:r>
-        <w:t>hange the connection parameters without having to close and reopen the port.</w:t>
-      </w:r>
-    </w:p>
-    <w:p>
-      <w:pPr>
-        <w:numPr>
-          <w:ilvl w:val="0"/>
-          <w:numId w:val="11"/>
-        </w:numPr>
-        <w:rPr>
-          <w:rFonts w:hint="eastAsia"/>
-        </w:rPr>
-      </w:pPr>
-      <w:r>
-        <w:t xml:space="preserve">If the serial port is not available at start, you can </w:t>
-      </w:r>
-      <w:r>
-        <w:t>immediately</w:t>
-      </w:r>
-      <w:r>
-        <w:t xml:space="preserve"> choose another </w:t>
-      </w:r>
-      <w:r>
-        <w:t>port</w:t>
-      </w:r>
-      <w:r>
-        <w:t>.</w:t>
-      </w:r>
-    </w:p>
-    <w:p>
-      <w:pPr>
-        <w:numPr>
-          <w:ilvl w:val="0"/>
-          <w:numId w:val="11"/>
-        </w:numPr>
-        <w:rPr>
-          <w:rFonts w:hint="eastAsia"/>
-        </w:rPr>
-      </w:pPr>
-      <w:r>
-        <w:t>M</w:t>
-      </w:r>
-      <w:r>
-        <w:t xml:space="preserve">bc project file: XML tags </w:t>
-      </w:r>
-      <w:r>
-        <w:t xml:space="preserve">are </w:t>
-      </w:r>
-      <w:r>
-        <w:t xml:space="preserve">now preferably in lowercase. The old camelcase is also still accepted. </w:t>
-      </w:r>
-    </w:p>
-    <w:p>
-      <w:pPr>
-        <w:numPr>
-          <w:ilvl w:val="0"/>
-          <w:numId w:val="11"/>
-        </w:numPr>
-        <w:rPr>
-          <w:rFonts w:hint="eastAsia"/>
-        </w:rPr>
-      </w:pPr>
-      <w:r>
-        <w:t>Always shows line numbers f</w:t>
-      </w:r>
-      <w:r>
-        <w:t xml:space="preserve">or errors in mbc file. </w:t>
-      </w:r>
-    </w:p>
-    <w:p>
-      <w:pPr>
-        <w:numPr>
-          <w:ilvl w:val="0"/>
-          <w:numId w:val="11"/>
-        </w:numPr>
-        <w:rPr>
-          <w:rFonts w:hint="eastAsia"/>
-        </w:rPr>
-      </w:pPr>
-      <w:r>
-        <w:t>Word order (endian)</w:t>
-      </w:r>
-      <w:r>
-        <w:t xml:space="preserve"> </w:t>
-      </w:r>
-      <w:r>
-        <w:t xml:space="preserve">is </w:t>
-      </w:r>
-      <w:r>
-        <w:t xml:space="preserve">separately </w:t>
-      </w:r>
-      <w:r>
-        <w:t>configurable</w:t>
-      </w:r>
-      <w:r>
-        <w:t xml:space="preserve"> for int32 and float32. </w:t>
-      </w:r>
-      <w:r>
-        <w:t>Character</w:t>
-      </w:r>
-      <w:r>
-        <w:t xml:space="preserve"> order </w:t>
-      </w:r>
-      <w:r>
-        <w:t xml:space="preserve">is configurable </w:t>
-      </w:r>
-      <w:r>
-        <w:t xml:space="preserve">for ASCII. </w:t>
-      </w:r>
-    </w:p>
-    <w:p>
-      <w:pPr>
-        <w:numPr>
-          <w:ilvl w:val="0"/>
-          <w:numId w:val="11"/>
-        </w:numPr>
-        <w:rPr>
-          <w:rFonts w:hint="eastAsia"/>
-        </w:rPr>
-      </w:pPr>
-      <w:r>
-        <w:t>WriteHoldingregFunctionCode now also supports 'auto'.</w:t>
+      <w:proofErr w:type="spellStart"/>
+      <w:r>
+        <w:t>WriteHoldingregFunctionCode</w:t>
+      </w:r>
+      <w:proofErr w:type="spellEnd"/>
+      <w:r>
+        <w:t xml:space="preserve"> now also supports 'auto'.</w:t>
       </w:r>
     </w:p>
     <w:p>
@@ -5912,11 +6128,13 @@
     <w:basedOn w:val="Kop"/>
     <w:next w:val="Plattetekst"/>
     <w:qFormat/>
+    <w:rsid w:val="00FC5F78"/>
     <w:pPr>
       <w:numPr>
         <w:numId w:val="1"/>
       </w:numPr>
-      <w:spacing w:before="170" w:after="57"/>
+      <w:spacing w:before="360" w:after="57"/>
+      <w:ind w:left="431" w:hanging="431"/>
       <w:outlineLvl w:val="0"/>
     </w:pPr>
     <w:rPr>

</xml_diff>

<commit_message>
Reverted to r4034, because in r4043 and r4882 I added files of the new CustomModbusCommand, and it is not ready yet.
git-svn-id: http://visualsvn.edna.local/EDNA/ModbusControl/V2@4883 03c8d257-35a7-c645-9f01-50f27e98b9e6
</commit_message>
<xml_diff>
--- a/Manuals/ModbusControl - Release notes.docx
+++ b/Manuals/ModbusControl - Release notes.docx
@@ -1,6 +1,6 @@
 
 <file path=word/document.xml><?xml version="1.0" encoding="utf-8"?>
-<w:document xmlns:wpc="http://schemas.microsoft.com/office/word/2010/wordprocessingCanvas" xmlns:cx="http://schemas.microsoft.com/office/drawing/2014/chartex" xmlns:cx1="http://schemas.microsoft.com/office/drawing/2015/9/8/chartex" xmlns:cx2="http://schemas.microsoft.com/office/drawing/2015/10/21/chartex" xmlns:cx3="http://schemas.microsoft.com/office/drawing/2016/5/9/chartex" xmlns:cx4="http://schemas.microsoft.com/office/drawing/2016/5/10/chartex" xmlns:cx5="http://schemas.microsoft.com/office/drawing/2016/5/11/chartex" xmlns:cx6="http://schemas.microsoft.com/office/drawing/2016/5/12/chartex" xmlns:cx7="http://schemas.microsoft.com/office/drawing/2016/5/13/chartex" xmlns:cx8="http://schemas.microsoft.com/office/drawing/2016/5/14/chartex" xmlns:mc="http://schemas.openxmlformats.org/markup-compatibility/2006" xmlns:aink="http://schemas.microsoft.com/office/drawing/2016/ink" xmlns:am3d="http://schemas.microsoft.com/office/drawing/2017/model3d" xmlns:o="urn:schemas-microsoft-com:office:office" xmlns:oel="http://schemas.microsoft.com/office/2019/extlst" xmlns:r="http://schemas.openxmlformats.org/officeDocument/2006/relationships" xmlns:m="http://schemas.openxmlformats.org/officeDocument/2006/math" xmlns:v="urn:schemas-microsoft-com:vml" xmlns:wp14="http://schemas.microsoft.com/office/word/2010/wordprocessingDrawing" xmlns:wp="http://schemas.openxmlformats.org/drawingml/2006/wordprocessingDrawing" xmlns:w10="urn:schemas-microsoft-com:office:word" xmlns:w="http://schemas.openxmlformats.org/wordprocessingml/2006/main" xmlns:w14="http://schemas.microsoft.com/office/word/2010/wordml" xmlns:w15="http://schemas.microsoft.com/office/word/2012/wordml" xmlns:w16cex="http://schemas.microsoft.com/office/word/2018/wordml/cex" xmlns:w16cid="http://schemas.microsoft.com/office/word/2016/wordml/cid" xmlns:w16="http://schemas.microsoft.com/office/word/2018/wordml" xmlns:w16du="http://schemas.microsoft.com/office/word/2023/wordml/word16du" xmlns:w16sdtdh="http://schemas.microsoft.com/office/word/2020/wordml/sdtdatahash" xmlns:w16se="http://schemas.microsoft.com/office/word/2015/wordml/symex" xmlns:wpg="http://schemas.microsoft.com/office/word/2010/wordprocessingGroup" xmlns:wpi="http://schemas.microsoft.com/office/word/2010/wordprocessingInk" xmlns:wne="http://schemas.microsoft.com/office/word/2006/wordml" xmlns:wps="http://schemas.microsoft.com/office/word/2010/wordprocessingShape" mc:Ignorable="w14 w15 w16se w16cid w16 w16cex w16sdtdh w16du wp14">
+<w:document xmlns:wpc="http://schemas.microsoft.com/office/word/2010/wordprocessingCanvas" xmlns:cx="http://schemas.microsoft.com/office/drawing/2014/chartex" xmlns:cx1="http://schemas.microsoft.com/office/drawing/2015/9/8/chartex" xmlns:cx2="http://schemas.microsoft.com/office/drawing/2015/10/21/chartex" xmlns:cx3="http://schemas.microsoft.com/office/drawing/2016/5/9/chartex" xmlns:cx4="http://schemas.microsoft.com/office/drawing/2016/5/10/chartex" xmlns:cx5="http://schemas.microsoft.com/office/drawing/2016/5/11/chartex" xmlns:cx6="http://schemas.microsoft.com/office/drawing/2016/5/12/chartex" xmlns:cx7="http://schemas.microsoft.com/office/drawing/2016/5/13/chartex" xmlns:cx8="http://schemas.microsoft.com/office/drawing/2016/5/14/chartex" xmlns:mc="http://schemas.openxmlformats.org/markup-compatibility/2006" xmlns:aink="http://schemas.microsoft.com/office/drawing/2016/ink" xmlns:am3d="http://schemas.microsoft.com/office/drawing/2017/model3d" xmlns:o="urn:schemas-microsoft-com:office:office" xmlns:oel="http://schemas.microsoft.com/office/2019/extlst" xmlns:r="http://schemas.openxmlformats.org/officeDocument/2006/relationships" xmlns:m="http://schemas.openxmlformats.org/officeDocument/2006/math" xmlns:v="urn:schemas-microsoft-com:vml" xmlns:wp14="http://schemas.microsoft.com/office/word/2010/wordprocessingDrawing" xmlns:wp="http://schemas.openxmlformats.org/drawingml/2006/wordprocessingDrawing" xmlns:w10="urn:schemas-microsoft-com:office:word" xmlns:w="http://schemas.openxmlformats.org/wordprocessingml/2006/main" xmlns:w14="http://schemas.microsoft.com/office/word/2010/wordml" xmlns:w15="http://schemas.microsoft.com/office/word/2012/wordml" xmlns:w16cex="http://schemas.microsoft.com/office/word/2018/wordml/cex" xmlns:w16cid="http://schemas.microsoft.com/office/word/2016/wordml/cid" xmlns:w16="http://schemas.microsoft.com/office/word/2018/wordml" xmlns:w16sdtdh="http://schemas.microsoft.com/office/word/2020/wordml/sdtdatahash" xmlns:w16se="http://schemas.microsoft.com/office/word/2015/wordml/symex" xmlns:wpg="http://schemas.microsoft.com/office/word/2010/wordprocessingGroup" xmlns:wpi="http://schemas.microsoft.com/office/word/2010/wordprocessingInk" xmlns:wne="http://schemas.microsoft.com/office/word/2006/wordml" xmlns:wps="http://schemas.microsoft.com/office/word/2010/wordprocessingShape" mc:Ignorable="w14 w15 w16se w16cid w16 w16cex w16sdtdh wp14">
   <w:body>
     <w:p>
       <w:pPr>
@@ -130,9 +130,6 @@
           <w:ilvl w:val="0"/>
           <w:numId w:val="4"/>
         </w:numPr>
-        <w:rPr>
-          <w:rFonts w:hint="eastAsia"/>
-        </w:rPr>
       </w:pPr>
       <w:r>
         <w:t>Added</w:t>
@@ -158,7 +155,15 @@
         </w:rPr>
       </w:pPr>
       <w:r>
-        <w:t>Mbc file: &lt;exportorder&gt; element added.</w:t>
+        <w:t>Mbc file: &lt;</w:t>
+      </w:r>
+      <w:proofErr w:type="spellStart"/>
+      <w:r>
+        <w:t>exportorder</w:t>
+      </w:r>
+      <w:proofErr w:type="spellEnd"/>
+      <w:r>
+        <w:t>&gt; element added.</w:t>
       </w:r>
     </w:p>
     <w:p>
@@ -252,12 +257,14 @@
           <w:rFonts w:hint="eastAsia"/>
         </w:rPr>
       </w:pPr>
+      <w:proofErr w:type="spellStart"/>
       <w:r>
         <w:rPr>
           <w:rFonts w:hint="eastAsia"/>
         </w:rPr>
         <w:t>WriteHoldingregisterFC</w:t>
       </w:r>
+      <w:proofErr w:type="spellEnd"/>
       <w:r>
         <w:t xml:space="preserve"> </w:t>
       </w:r>
@@ -292,9 +299,6 @@
           <w:ilvl w:val="0"/>
           <w:numId w:val="4"/>
         </w:numPr>
-        <w:rPr>
-          <w:rFonts w:hint="eastAsia"/>
-        </w:rPr>
       </w:pPr>
       <w:r>
         <w:t>Stop-on-error mechanism fix.</w:t>
@@ -306,9 +310,6 @@
           <w:ilvl w:val="0"/>
           <w:numId w:val="4"/>
         </w:numPr>
-        <w:rPr>
-          <w:rFonts w:hint="eastAsia"/>
-        </w:rPr>
       </w:pPr>
       <w:r>
         <w:t xml:space="preserve">Import now processes the </w:t>
@@ -338,9 +339,6 @@
           <w:ilvl w:val="0"/>
           <w:numId w:val="4"/>
         </w:numPr>
-        <w:rPr>
-          <w:rFonts w:hint="eastAsia"/>
-        </w:rPr>
       </w:pPr>
       <w:r>
         <w:t>Import now also ignores lines that only have spaces and/or separators.</w:t>
@@ -391,7 +389,21 @@
         <w:rPr>
           <w:rFonts w:hint="eastAsia"/>
         </w:rPr>
-        <w:t>Enum registers editing now has a dropdown combobox with possible values.</w:t>
+        <w:t xml:space="preserve">Enum registers editing now has a dropdown </w:t>
+      </w:r>
+      <w:proofErr w:type="spellStart"/>
+      <w:r>
+        <w:rPr>
+          <w:rFonts w:hint="eastAsia"/>
+        </w:rPr>
+        <w:t>combobox</w:t>
+      </w:r>
+      <w:proofErr w:type="spellEnd"/>
+      <w:r>
+        <w:rPr>
+          <w:rFonts w:hint="eastAsia"/>
+        </w:rPr>
+        <w:t xml:space="preserve"> with possible values.</w:t>
       </w:r>
     </w:p>
     <w:p>
@@ -515,16 +527,63 @@
         </w:numPr>
         <w:rPr>
           <w:rFonts w:hint="eastAsia"/>
-        </w:rPr>
-      </w:pPr>
-      <w:r>
-        <w:t xml:space="preserve">In Import_file and Import_compare: writing/comparing a float32 </w:t>
-      </w:r>
-      <w:r>
-        <w:t xml:space="preserve">value </w:t>
-      </w:r>
-      <w:r>
-        <w:t>no longer worked.</w:t>
+          <w:lang w:val="nl-BE"/>
+        </w:rPr>
+      </w:pPr>
+      <w:r>
+        <w:rPr>
+          <w:rFonts w:hint="eastAsia"/>
+          <w:lang w:val="nl-BE"/>
+        </w:rPr>
+        <w:t xml:space="preserve">Bij </w:t>
+      </w:r>
+      <w:proofErr w:type="spellStart"/>
+      <w:r>
+        <w:rPr>
+          <w:rFonts w:hint="eastAsia"/>
+          <w:lang w:val="nl-BE"/>
+        </w:rPr>
+        <w:t>Import_file</w:t>
+      </w:r>
+      <w:proofErr w:type="spellEnd"/>
+      <w:r>
+        <w:rPr>
+          <w:rFonts w:hint="eastAsia"/>
+          <w:lang w:val="nl-BE"/>
+        </w:rPr>
+        <w:t xml:space="preserve"> en </w:t>
+      </w:r>
+      <w:proofErr w:type="spellStart"/>
+      <w:r>
+        <w:rPr>
+          <w:rFonts w:hint="eastAsia"/>
+          <w:lang w:val="nl-BE"/>
+        </w:rPr>
+        <w:t>Import_compare</w:t>
+      </w:r>
+      <w:proofErr w:type="spellEnd"/>
+      <w:r>
+        <w:rPr>
+          <w:rFonts w:hint="eastAsia"/>
+          <w:lang w:val="nl-BE"/>
+        </w:rPr>
+        <w:t>: schrijven/</w:t>
+      </w:r>
+      <w:proofErr w:type="spellStart"/>
+      <w:r>
+        <w:rPr>
+          <w:rFonts w:hint="eastAsia"/>
+          <w:lang w:val="nl-BE"/>
+        </w:rPr>
+        <w:t>comparen</w:t>
+      </w:r>
+      <w:proofErr w:type="spellEnd"/>
+      <w:r>
+        <w:rPr>
+          <w:rFonts w:hint="eastAsia"/>
+          <w:lang w:val="nl-BE"/>
+        </w:rPr>
+        <w:t xml:space="preserve"> van een float32 werkte niet meer.</w:t>
       </w:r>
     </w:p>
     <w:p>
@@ -617,7 +676,35 @@
         <w:rPr>
           <w:rFonts w:hint="eastAsia"/>
         </w:rPr>
-        <w:t>You can now close the [Project_Configuration], [Save_project_file] and [About] forms with the ESC button</w:t>
+        <w:t>You can now close the [</w:t>
+      </w:r>
+      <w:proofErr w:type="spellStart"/>
+      <w:r>
+        <w:rPr>
+          <w:rFonts w:hint="eastAsia"/>
+        </w:rPr>
+        <w:t>Project_Configuration</w:t>
+      </w:r>
+      <w:proofErr w:type="spellEnd"/>
+      <w:r>
+        <w:rPr>
+          <w:rFonts w:hint="eastAsia"/>
+        </w:rPr>
+        <w:t>], [</w:t>
+      </w:r>
+      <w:proofErr w:type="spellStart"/>
+      <w:r>
+        <w:rPr>
+          <w:rFonts w:hint="eastAsia"/>
+        </w:rPr>
+        <w:t>Save_project_file</w:t>
+      </w:r>
+      <w:proofErr w:type="spellEnd"/>
+      <w:r>
+        <w:rPr>
+          <w:rFonts w:hint="eastAsia"/>
+        </w:rPr>
+        <w:t>] and [About] forms with the ESC button</w:t>
       </w:r>
       <w:r>
         <w:t xml:space="preserve"> too</w:t>
@@ -689,7 +776,35 @@
         <w:rPr>
           <w:rFonts w:hint="eastAsia"/>
         </w:rPr>
-        <w:t>With Import_file and Import_compare: writing/compar</w:t>
+        <w:t xml:space="preserve">With </w:t>
+      </w:r>
+      <w:proofErr w:type="spellStart"/>
+      <w:r>
+        <w:rPr>
+          <w:rFonts w:hint="eastAsia"/>
+        </w:rPr>
+        <w:t>Import_file</w:t>
+      </w:r>
+      <w:proofErr w:type="spellEnd"/>
+      <w:r>
+        <w:rPr>
+          <w:rFonts w:hint="eastAsia"/>
+        </w:rPr>
+        <w:t xml:space="preserve"> and </w:t>
+      </w:r>
+      <w:proofErr w:type="spellStart"/>
+      <w:r>
+        <w:rPr>
+          <w:rFonts w:hint="eastAsia"/>
+        </w:rPr>
+        <w:t>Import_compare</w:t>
+      </w:r>
+      <w:proofErr w:type="spellEnd"/>
+      <w:r>
+        <w:rPr>
+          <w:rFonts w:hint="eastAsia"/>
+        </w:rPr>
+        <w:t>: writing/compar</w:t>
       </w:r>
       <w:r>
         <w:t>ing</w:t>
@@ -859,7 +974,15 @@
         </w:rPr>
       </w:pPr>
       <w:r>
-        <w:t xml:space="preserve">Mbc project file: &lt;longdescr&gt; </w:t>
+        <w:t>Mbc project file: &lt;</w:t>
+      </w:r>
+      <w:proofErr w:type="spellStart"/>
+      <w:r>
+        <w:t>longdescr</w:t>
+      </w:r>
+      <w:proofErr w:type="spellEnd"/>
+      <w:r>
+        <w:t xml:space="preserve">&gt; </w:t>
       </w:r>
       <w:r>
         <w:t xml:space="preserve">element </w:t>
@@ -868,8 +991,13 @@
         <w:t xml:space="preserve">added. </w:t>
       </w:r>
       <w:r>
-        <w:t>Adds a long multiline text that is show when the mouse is hoovered over the register decription</w:t>
-      </w:r>
+        <w:t xml:space="preserve">Adds a long multiline text that is show when the mouse is hoovered over the register </w:t>
+      </w:r>
+      <w:proofErr w:type="spellStart"/>
+      <w:r>
+        <w:t>decription</w:t>
+      </w:r>
+      <w:proofErr w:type="spellEnd"/>
       <w:r>
         <w:t>.</w:t>
       </w:r>
@@ -1055,7 +1183,15 @@
         </w:rPr>
       </w:pPr>
       <w:r>
-        <w:t xml:space="preserve">The properties of a register (rw, int32, ...) are now displayed in a separate </w:t>
+        <w:t>The properties of a register (</w:t>
+      </w:r>
+      <w:proofErr w:type="spellStart"/>
+      <w:r>
+        <w:t>rw</w:t>
+      </w:r>
+      <w:proofErr w:type="spellEnd"/>
+      <w:r>
+        <w:t xml:space="preserve">, int32, ...) are now displayed in a separate </w:t>
       </w:r>
       <w:r>
         <w:t>[</w:t>
@@ -1400,7 +1536,15 @@
         </w:rPr>
       </w:pPr>
       <w:r>
-        <w:t>If you start ModbusControl by double-clicking an mbc file and the file points to a non-existent COM port, the error dialog "Error opening serial port COMx" now appears after the ModbusControl program appears.</w:t>
+        <w:t xml:space="preserve">If you start ModbusControl by double-clicking an mbc file and the file points to a non-existent COM port, the error dialog "Error opening serial port </w:t>
+      </w:r>
+      <w:proofErr w:type="spellStart"/>
+      <w:r>
+        <w:t>COMx</w:t>
+      </w:r>
+      <w:proofErr w:type="spellEnd"/>
+      <w:r>
+        <w:t>" now appears after the ModbusControl program appears.</w:t>
       </w:r>
     </w:p>
     <w:p>
@@ -1472,7 +1616,23 @@
         <w:t xml:space="preserve">file is automatically </w:t>
       </w:r>
       <w:r>
-        <w:t xml:space="preserve">moved from &lt;mydocuments&gt;\ModbusControl to %AppData%\Roaming\E.D.&amp;A\ModbusControl. Content from old is not migrated. Old </w:t>
+        <w:t>moved from &lt;</w:t>
+      </w:r>
+      <w:proofErr w:type="spellStart"/>
+      <w:r>
+        <w:t>mydocuments</w:t>
+      </w:r>
+      <w:proofErr w:type="spellEnd"/>
+      <w:r>
+        <w:t>&gt;\ModbusControl to %</w:t>
+      </w:r>
+      <w:proofErr w:type="spellStart"/>
+      <w:r>
+        <w:t>AppData</w:t>
+      </w:r>
+      <w:proofErr w:type="spellEnd"/>
+      <w:r>
+        <w:t xml:space="preserve">%\Roaming\E.D.&amp;A\ModbusControl. Content from old is not migrated. Old </w:t>
       </w:r>
       <w:r>
         <w:t>file</w:t>
@@ -2373,8 +2533,13 @@
           <w:rFonts w:hint="eastAsia"/>
         </w:rPr>
       </w:pPr>
-      <w:r>
-        <w:t>WriteHoldingregFunctionCode now also supports 'auto'.</w:t>
+      <w:proofErr w:type="spellStart"/>
+      <w:r>
+        <w:t>WriteHoldingregFunctionCode</w:t>
+      </w:r>
+      <w:proofErr w:type="spellEnd"/>
+      <w:r>
+        <w:t xml:space="preserve"> now also supports 'auto'.</w:t>
       </w:r>
     </w:p>
     <w:p>
@@ -2418,7 +2583,7 @@
 </file>
 
 <file path=word/endnotes.xml><?xml version="1.0" encoding="utf-8"?>
-<w:endnotes xmlns:wpc="http://schemas.microsoft.com/office/word/2010/wordprocessingCanvas" xmlns:cx="http://schemas.microsoft.com/office/drawing/2014/chartex" xmlns:cx1="http://schemas.microsoft.com/office/drawing/2015/9/8/chartex" xmlns:cx2="http://schemas.microsoft.com/office/drawing/2015/10/21/chartex" xmlns:cx3="http://schemas.microsoft.com/office/drawing/2016/5/9/chartex" xmlns:cx4="http://schemas.microsoft.com/office/drawing/2016/5/10/chartex" xmlns:cx5="http://schemas.microsoft.com/office/drawing/2016/5/11/chartex" xmlns:cx6="http://schemas.microsoft.com/office/drawing/2016/5/12/chartex" xmlns:cx7="http://schemas.microsoft.com/office/drawing/2016/5/13/chartex" xmlns:cx8="http://schemas.microsoft.com/office/drawing/2016/5/14/chartex" xmlns:mc="http://schemas.openxmlformats.org/markup-compatibility/2006" xmlns:aink="http://schemas.microsoft.com/office/drawing/2016/ink" xmlns:am3d="http://schemas.microsoft.com/office/drawing/2017/model3d" xmlns:o="urn:schemas-microsoft-com:office:office" xmlns:oel="http://schemas.microsoft.com/office/2019/extlst" xmlns:r="http://schemas.openxmlformats.org/officeDocument/2006/relationships" xmlns:m="http://schemas.openxmlformats.org/officeDocument/2006/math" xmlns:v="urn:schemas-microsoft-com:vml" xmlns:wp14="http://schemas.microsoft.com/office/word/2010/wordprocessingDrawing" xmlns:wp="http://schemas.openxmlformats.org/drawingml/2006/wordprocessingDrawing" xmlns:w10="urn:schemas-microsoft-com:office:word" xmlns:w="http://schemas.openxmlformats.org/wordprocessingml/2006/main" xmlns:w14="http://schemas.microsoft.com/office/word/2010/wordml" xmlns:w15="http://schemas.microsoft.com/office/word/2012/wordml" xmlns:w16cex="http://schemas.microsoft.com/office/word/2018/wordml/cex" xmlns:w16cid="http://schemas.microsoft.com/office/word/2016/wordml/cid" xmlns:w16="http://schemas.microsoft.com/office/word/2018/wordml" xmlns:w16du="http://schemas.microsoft.com/office/word/2023/wordml/word16du" xmlns:w16sdtdh="http://schemas.microsoft.com/office/word/2020/wordml/sdtdatahash" xmlns:w16se="http://schemas.microsoft.com/office/word/2015/wordml/symex" xmlns:wpg="http://schemas.microsoft.com/office/word/2010/wordprocessingGroup" xmlns:wpi="http://schemas.microsoft.com/office/word/2010/wordprocessingInk" xmlns:wne="http://schemas.microsoft.com/office/word/2006/wordml" xmlns:wps="http://schemas.microsoft.com/office/word/2010/wordprocessingShape" mc:Ignorable="w14 w15 w16se w16cid w16 w16cex w16sdtdh w16du wp14">
+<w:endnotes xmlns:wpc="http://schemas.microsoft.com/office/word/2010/wordprocessingCanvas" xmlns:cx="http://schemas.microsoft.com/office/drawing/2014/chartex" xmlns:cx1="http://schemas.microsoft.com/office/drawing/2015/9/8/chartex" xmlns:cx2="http://schemas.microsoft.com/office/drawing/2015/10/21/chartex" xmlns:cx3="http://schemas.microsoft.com/office/drawing/2016/5/9/chartex" xmlns:cx4="http://schemas.microsoft.com/office/drawing/2016/5/10/chartex" xmlns:cx5="http://schemas.microsoft.com/office/drawing/2016/5/11/chartex" xmlns:cx6="http://schemas.microsoft.com/office/drawing/2016/5/12/chartex" xmlns:cx7="http://schemas.microsoft.com/office/drawing/2016/5/13/chartex" xmlns:cx8="http://schemas.microsoft.com/office/drawing/2016/5/14/chartex" xmlns:mc="http://schemas.openxmlformats.org/markup-compatibility/2006" xmlns:aink="http://schemas.microsoft.com/office/drawing/2016/ink" xmlns:am3d="http://schemas.microsoft.com/office/drawing/2017/model3d" xmlns:o="urn:schemas-microsoft-com:office:office" xmlns:oel="http://schemas.microsoft.com/office/2019/extlst" xmlns:r="http://schemas.openxmlformats.org/officeDocument/2006/relationships" xmlns:m="http://schemas.openxmlformats.org/officeDocument/2006/math" xmlns:v="urn:schemas-microsoft-com:vml" xmlns:wp14="http://schemas.microsoft.com/office/word/2010/wordprocessingDrawing" xmlns:wp="http://schemas.openxmlformats.org/drawingml/2006/wordprocessingDrawing" xmlns:w10="urn:schemas-microsoft-com:office:word" xmlns:w="http://schemas.openxmlformats.org/wordprocessingml/2006/main" xmlns:w14="http://schemas.microsoft.com/office/word/2010/wordml" xmlns:w15="http://schemas.microsoft.com/office/word/2012/wordml" xmlns:w16cex="http://schemas.microsoft.com/office/word/2018/wordml/cex" xmlns:w16cid="http://schemas.microsoft.com/office/word/2016/wordml/cid" xmlns:w16="http://schemas.microsoft.com/office/word/2018/wordml" xmlns:w16sdtdh="http://schemas.microsoft.com/office/word/2020/wordml/sdtdatahash" xmlns:w16se="http://schemas.microsoft.com/office/word/2015/wordml/symex" xmlns:wpg="http://schemas.microsoft.com/office/word/2010/wordprocessingGroup" xmlns:wpi="http://schemas.microsoft.com/office/word/2010/wordprocessingInk" xmlns:wne="http://schemas.microsoft.com/office/word/2006/wordml" xmlns:wps="http://schemas.microsoft.com/office/word/2010/wordprocessingShape" mc:Ignorable="w14 w15 w16se w16cid w16 w16cex w16sdtdh wp14">
   <w:endnote w:type="separator" w:id="-1">
     <w:p>
       <w:pPr>
@@ -2447,7 +2612,7 @@
 </file>
 
 <file path=word/footer1.xml><?xml version="1.0" encoding="utf-8"?>
-<w:ftr xmlns:wpc="http://schemas.microsoft.com/office/word/2010/wordprocessingCanvas" xmlns:cx="http://schemas.microsoft.com/office/drawing/2014/chartex" xmlns:cx1="http://schemas.microsoft.com/office/drawing/2015/9/8/chartex" xmlns:cx2="http://schemas.microsoft.com/office/drawing/2015/10/21/chartex" xmlns:cx3="http://schemas.microsoft.com/office/drawing/2016/5/9/chartex" xmlns:cx4="http://schemas.microsoft.com/office/drawing/2016/5/10/chartex" xmlns:cx5="http://schemas.microsoft.com/office/drawing/2016/5/11/chartex" xmlns:cx6="http://schemas.microsoft.com/office/drawing/2016/5/12/chartex" xmlns:cx7="http://schemas.microsoft.com/office/drawing/2016/5/13/chartex" xmlns:cx8="http://schemas.microsoft.com/office/drawing/2016/5/14/chartex" xmlns:mc="http://schemas.openxmlformats.org/markup-compatibility/2006" xmlns:aink="http://schemas.microsoft.com/office/drawing/2016/ink" xmlns:am3d="http://schemas.microsoft.com/office/drawing/2017/model3d" xmlns:o="urn:schemas-microsoft-com:office:office" xmlns:oel="http://schemas.microsoft.com/office/2019/extlst" xmlns:r="http://schemas.openxmlformats.org/officeDocument/2006/relationships" xmlns:m="http://schemas.openxmlformats.org/officeDocument/2006/math" xmlns:v="urn:schemas-microsoft-com:vml" xmlns:wp14="http://schemas.microsoft.com/office/word/2010/wordprocessingDrawing" xmlns:wp="http://schemas.openxmlformats.org/drawingml/2006/wordprocessingDrawing" xmlns:w10="urn:schemas-microsoft-com:office:word" xmlns:w="http://schemas.openxmlformats.org/wordprocessingml/2006/main" xmlns:w14="http://schemas.microsoft.com/office/word/2010/wordml" xmlns:w15="http://schemas.microsoft.com/office/word/2012/wordml" xmlns:w16cex="http://schemas.microsoft.com/office/word/2018/wordml/cex" xmlns:w16cid="http://schemas.microsoft.com/office/word/2016/wordml/cid" xmlns:w16="http://schemas.microsoft.com/office/word/2018/wordml" xmlns:w16du="http://schemas.microsoft.com/office/word/2023/wordml/word16du" xmlns:w16sdtdh="http://schemas.microsoft.com/office/word/2020/wordml/sdtdatahash" xmlns:w16se="http://schemas.microsoft.com/office/word/2015/wordml/symex" xmlns:wpg="http://schemas.microsoft.com/office/word/2010/wordprocessingGroup" xmlns:wpi="http://schemas.microsoft.com/office/word/2010/wordprocessingInk" xmlns:wne="http://schemas.microsoft.com/office/word/2006/wordml" xmlns:wps="http://schemas.microsoft.com/office/word/2010/wordprocessingShape" mc:Ignorable="w14 w15 w16se w16cid w16 w16cex w16sdtdh w16du wp14">
+<w:ftr xmlns:wpc="http://schemas.microsoft.com/office/word/2010/wordprocessingCanvas" xmlns:cx="http://schemas.microsoft.com/office/drawing/2014/chartex" xmlns:cx1="http://schemas.microsoft.com/office/drawing/2015/9/8/chartex" xmlns:cx2="http://schemas.microsoft.com/office/drawing/2015/10/21/chartex" xmlns:cx3="http://schemas.microsoft.com/office/drawing/2016/5/9/chartex" xmlns:cx4="http://schemas.microsoft.com/office/drawing/2016/5/10/chartex" xmlns:cx5="http://schemas.microsoft.com/office/drawing/2016/5/11/chartex" xmlns:cx6="http://schemas.microsoft.com/office/drawing/2016/5/12/chartex" xmlns:cx7="http://schemas.microsoft.com/office/drawing/2016/5/13/chartex" xmlns:cx8="http://schemas.microsoft.com/office/drawing/2016/5/14/chartex" xmlns:mc="http://schemas.openxmlformats.org/markup-compatibility/2006" xmlns:aink="http://schemas.microsoft.com/office/drawing/2016/ink" xmlns:am3d="http://schemas.microsoft.com/office/drawing/2017/model3d" xmlns:o="urn:schemas-microsoft-com:office:office" xmlns:oel="http://schemas.microsoft.com/office/2019/extlst" xmlns:r="http://schemas.openxmlformats.org/officeDocument/2006/relationships" xmlns:m="http://schemas.openxmlformats.org/officeDocument/2006/math" xmlns:v="urn:schemas-microsoft-com:vml" xmlns:wp14="http://schemas.microsoft.com/office/word/2010/wordprocessingDrawing" xmlns:wp="http://schemas.openxmlformats.org/drawingml/2006/wordprocessingDrawing" xmlns:w10="urn:schemas-microsoft-com:office:word" xmlns:w="http://schemas.openxmlformats.org/wordprocessingml/2006/main" xmlns:w14="http://schemas.microsoft.com/office/word/2010/wordml" xmlns:w15="http://schemas.microsoft.com/office/word/2012/wordml" xmlns:w16cex="http://schemas.microsoft.com/office/word/2018/wordml/cex" xmlns:w16cid="http://schemas.microsoft.com/office/word/2016/wordml/cid" xmlns:w16="http://schemas.microsoft.com/office/word/2018/wordml" xmlns:w16sdtdh="http://schemas.microsoft.com/office/word/2020/wordml/sdtdatahash" xmlns:w16se="http://schemas.microsoft.com/office/word/2015/wordml/symex" xmlns:wpg="http://schemas.microsoft.com/office/word/2010/wordprocessingGroup" xmlns:wpi="http://schemas.microsoft.com/office/word/2010/wordprocessingInk" xmlns:wne="http://schemas.microsoft.com/office/word/2006/wordml" xmlns:wps="http://schemas.microsoft.com/office/word/2010/wordprocessingShape" mc:Ignorable="w14 w15 w16se w16cid w16 w16cex w16sdtdh wp14">
   <w:p>
     <w:pPr>
       <w:pStyle w:val="Voettekst"/>
@@ -2500,7 +2665,7 @@
 </file>
 
 <file path=word/footer2.xml><?xml version="1.0" encoding="utf-8"?>
-<w:ftr xmlns:wpc="http://schemas.microsoft.com/office/word/2010/wordprocessingCanvas" xmlns:cx="http://schemas.microsoft.com/office/drawing/2014/chartex" xmlns:cx1="http://schemas.microsoft.com/office/drawing/2015/9/8/chartex" xmlns:cx2="http://schemas.microsoft.com/office/drawing/2015/10/21/chartex" xmlns:cx3="http://schemas.microsoft.com/office/drawing/2016/5/9/chartex" xmlns:cx4="http://schemas.microsoft.com/office/drawing/2016/5/10/chartex" xmlns:cx5="http://schemas.microsoft.com/office/drawing/2016/5/11/chartex" xmlns:cx6="http://schemas.microsoft.com/office/drawing/2016/5/12/chartex" xmlns:cx7="http://schemas.microsoft.com/office/drawing/2016/5/13/chartex" xmlns:cx8="http://schemas.microsoft.com/office/drawing/2016/5/14/chartex" xmlns:mc="http://schemas.openxmlformats.org/markup-compatibility/2006" xmlns:aink="http://schemas.microsoft.com/office/drawing/2016/ink" xmlns:am3d="http://schemas.microsoft.com/office/drawing/2017/model3d" xmlns:o="urn:schemas-microsoft-com:office:office" xmlns:oel="http://schemas.microsoft.com/office/2019/extlst" xmlns:r="http://schemas.openxmlformats.org/officeDocument/2006/relationships" xmlns:m="http://schemas.openxmlformats.org/officeDocument/2006/math" xmlns:v="urn:schemas-microsoft-com:vml" xmlns:wp14="http://schemas.microsoft.com/office/word/2010/wordprocessingDrawing" xmlns:wp="http://schemas.openxmlformats.org/drawingml/2006/wordprocessingDrawing" xmlns:w10="urn:schemas-microsoft-com:office:word" xmlns:w="http://schemas.openxmlformats.org/wordprocessingml/2006/main" xmlns:w14="http://schemas.microsoft.com/office/word/2010/wordml" xmlns:w15="http://schemas.microsoft.com/office/word/2012/wordml" xmlns:w16cex="http://schemas.microsoft.com/office/word/2018/wordml/cex" xmlns:w16cid="http://schemas.microsoft.com/office/word/2016/wordml/cid" xmlns:w16="http://schemas.microsoft.com/office/word/2018/wordml" xmlns:w16du="http://schemas.microsoft.com/office/word/2023/wordml/word16du" xmlns:w16sdtdh="http://schemas.microsoft.com/office/word/2020/wordml/sdtdatahash" xmlns:w16se="http://schemas.microsoft.com/office/word/2015/wordml/symex" xmlns:wpg="http://schemas.microsoft.com/office/word/2010/wordprocessingGroup" xmlns:wpi="http://schemas.microsoft.com/office/word/2010/wordprocessingInk" xmlns:wne="http://schemas.microsoft.com/office/word/2006/wordml" xmlns:wps="http://schemas.microsoft.com/office/word/2010/wordprocessingShape" mc:Ignorable="w14 w15 w16se w16cid w16 w16cex w16sdtdh w16du wp14">
+<w:ftr xmlns:wpc="http://schemas.microsoft.com/office/word/2010/wordprocessingCanvas" xmlns:cx="http://schemas.microsoft.com/office/drawing/2014/chartex" xmlns:cx1="http://schemas.microsoft.com/office/drawing/2015/9/8/chartex" xmlns:cx2="http://schemas.microsoft.com/office/drawing/2015/10/21/chartex" xmlns:cx3="http://schemas.microsoft.com/office/drawing/2016/5/9/chartex" xmlns:cx4="http://schemas.microsoft.com/office/drawing/2016/5/10/chartex" xmlns:cx5="http://schemas.microsoft.com/office/drawing/2016/5/11/chartex" xmlns:cx6="http://schemas.microsoft.com/office/drawing/2016/5/12/chartex" xmlns:cx7="http://schemas.microsoft.com/office/drawing/2016/5/13/chartex" xmlns:cx8="http://schemas.microsoft.com/office/drawing/2016/5/14/chartex" xmlns:mc="http://schemas.openxmlformats.org/markup-compatibility/2006" xmlns:aink="http://schemas.microsoft.com/office/drawing/2016/ink" xmlns:am3d="http://schemas.microsoft.com/office/drawing/2017/model3d" xmlns:o="urn:schemas-microsoft-com:office:office" xmlns:oel="http://schemas.microsoft.com/office/2019/extlst" xmlns:r="http://schemas.openxmlformats.org/officeDocument/2006/relationships" xmlns:m="http://schemas.openxmlformats.org/officeDocument/2006/math" xmlns:v="urn:schemas-microsoft-com:vml" xmlns:wp14="http://schemas.microsoft.com/office/word/2010/wordprocessingDrawing" xmlns:wp="http://schemas.openxmlformats.org/drawingml/2006/wordprocessingDrawing" xmlns:w10="urn:schemas-microsoft-com:office:word" xmlns:w="http://schemas.openxmlformats.org/wordprocessingml/2006/main" xmlns:w14="http://schemas.microsoft.com/office/word/2010/wordml" xmlns:w15="http://schemas.microsoft.com/office/word/2012/wordml" xmlns:w16cex="http://schemas.microsoft.com/office/word/2018/wordml/cex" xmlns:w16cid="http://schemas.microsoft.com/office/word/2016/wordml/cid" xmlns:w16="http://schemas.microsoft.com/office/word/2018/wordml" xmlns:w16sdtdh="http://schemas.microsoft.com/office/word/2020/wordml/sdtdatahash" xmlns:w16se="http://schemas.microsoft.com/office/word/2015/wordml/symex" xmlns:wpg="http://schemas.microsoft.com/office/word/2010/wordprocessingGroup" xmlns:wpi="http://schemas.microsoft.com/office/word/2010/wordprocessingInk" xmlns:wne="http://schemas.microsoft.com/office/word/2006/wordml" xmlns:wps="http://schemas.microsoft.com/office/word/2010/wordprocessingShape" mc:Ignorable="w14 w15 w16se w16cid w16 w16cex w16sdtdh wp14">
   <w:p>
     <w:pPr>
       <w:rPr>
@@ -2512,7 +2677,7 @@
 </file>
 
 <file path=word/footnotes.xml><?xml version="1.0" encoding="utf-8"?>
-<w:footnotes xmlns:wpc="http://schemas.microsoft.com/office/word/2010/wordprocessingCanvas" xmlns:cx="http://schemas.microsoft.com/office/drawing/2014/chartex" xmlns:cx1="http://schemas.microsoft.com/office/drawing/2015/9/8/chartex" xmlns:cx2="http://schemas.microsoft.com/office/drawing/2015/10/21/chartex" xmlns:cx3="http://schemas.microsoft.com/office/drawing/2016/5/9/chartex" xmlns:cx4="http://schemas.microsoft.com/office/drawing/2016/5/10/chartex" xmlns:cx5="http://schemas.microsoft.com/office/drawing/2016/5/11/chartex" xmlns:cx6="http://schemas.microsoft.com/office/drawing/2016/5/12/chartex" xmlns:cx7="http://schemas.microsoft.com/office/drawing/2016/5/13/chartex" xmlns:cx8="http://schemas.microsoft.com/office/drawing/2016/5/14/chartex" xmlns:mc="http://schemas.openxmlformats.org/markup-compatibility/2006" xmlns:aink="http://schemas.microsoft.com/office/drawing/2016/ink" xmlns:am3d="http://schemas.microsoft.com/office/drawing/2017/model3d" xmlns:o="urn:schemas-microsoft-com:office:office" xmlns:oel="http://schemas.microsoft.com/office/2019/extlst" xmlns:r="http://schemas.openxmlformats.org/officeDocument/2006/relationships" xmlns:m="http://schemas.openxmlformats.org/officeDocument/2006/math" xmlns:v="urn:schemas-microsoft-com:vml" xmlns:wp14="http://schemas.microsoft.com/office/word/2010/wordprocessingDrawing" xmlns:wp="http://schemas.openxmlformats.org/drawingml/2006/wordprocessingDrawing" xmlns:w10="urn:schemas-microsoft-com:office:word" xmlns:w="http://schemas.openxmlformats.org/wordprocessingml/2006/main" xmlns:w14="http://schemas.microsoft.com/office/word/2010/wordml" xmlns:w15="http://schemas.microsoft.com/office/word/2012/wordml" xmlns:w16cex="http://schemas.microsoft.com/office/word/2018/wordml/cex" xmlns:w16cid="http://schemas.microsoft.com/office/word/2016/wordml/cid" xmlns:w16="http://schemas.microsoft.com/office/word/2018/wordml" xmlns:w16du="http://schemas.microsoft.com/office/word/2023/wordml/word16du" xmlns:w16sdtdh="http://schemas.microsoft.com/office/word/2020/wordml/sdtdatahash" xmlns:w16se="http://schemas.microsoft.com/office/word/2015/wordml/symex" xmlns:wpg="http://schemas.microsoft.com/office/word/2010/wordprocessingGroup" xmlns:wpi="http://schemas.microsoft.com/office/word/2010/wordprocessingInk" xmlns:wne="http://schemas.microsoft.com/office/word/2006/wordml" xmlns:wps="http://schemas.microsoft.com/office/word/2010/wordprocessingShape" mc:Ignorable="w14 w15 w16se w16cid w16 w16cex w16sdtdh w16du wp14">
+<w:footnotes xmlns:wpc="http://schemas.microsoft.com/office/word/2010/wordprocessingCanvas" xmlns:cx="http://schemas.microsoft.com/office/drawing/2014/chartex" xmlns:cx1="http://schemas.microsoft.com/office/drawing/2015/9/8/chartex" xmlns:cx2="http://schemas.microsoft.com/office/drawing/2015/10/21/chartex" xmlns:cx3="http://schemas.microsoft.com/office/drawing/2016/5/9/chartex" xmlns:cx4="http://schemas.microsoft.com/office/drawing/2016/5/10/chartex" xmlns:cx5="http://schemas.microsoft.com/office/drawing/2016/5/11/chartex" xmlns:cx6="http://schemas.microsoft.com/office/drawing/2016/5/12/chartex" xmlns:cx7="http://schemas.microsoft.com/office/drawing/2016/5/13/chartex" xmlns:cx8="http://schemas.microsoft.com/office/drawing/2016/5/14/chartex" xmlns:mc="http://schemas.openxmlformats.org/markup-compatibility/2006" xmlns:aink="http://schemas.microsoft.com/office/drawing/2016/ink" xmlns:am3d="http://schemas.microsoft.com/office/drawing/2017/model3d" xmlns:o="urn:schemas-microsoft-com:office:office" xmlns:oel="http://schemas.microsoft.com/office/2019/extlst" xmlns:r="http://schemas.openxmlformats.org/officeDocument/2006/relationships" xmlns:m="http://schemas.openxmlformats.org/officeDocument/2006/math" xmlns:v="urn:schemas-microsoft-com:vml" xmlns:wp14="http://schemas.microsoft.com/office/word/2010/wordprocessingDrawing" xmlns:wp="http://schemas.openxmlformats.org/drawingml/2006/wordprocessingDrawing" xmlns:w10="urn:schemas-microsoft-com:office:word" xmlns:w="http://schemas.openxmlformats.org/wordprocessingml/2006/main" xmlns:w14="http://schemas.microsoft.com/office/word/2010/wordml" xmlns:w15="http://schemas.microsoft.com/office/word/2012/wordml" xmlns:w16cex="http://schemas.microsoft.com/office/word/2018/wordml/cex" xmlns:w16cid="http://schemas.microsoft.com/office/word/2016/wordml/cid" xmlns:w16="http://schemas.microsoft.com/office/word/2018/wordml" xmlns:w16sdtdh="http://schemas.microsoft.com/office/word/2020/wordml/sdtdatahash" xmlns:w16se="http://schemas.microsoft.com/office/word/2015/wordml/symex" xmlns:wpg="http://schemas.microsoft.com/office/word/2010/wordprocessingGroup" xmlns:wpi="http://schemas.microsoft.com/office/word/2010/wordprocessingInk" xmlns:wne="http://schemas.microsoft.com/office/word/2006/wordml" xmlns:wps="http://schemas.microsoft.com/office/word/2010/wordprocessingShape" mc:Ignorable="w14 w15 w16se w16cid w16 w16cex w16sdtdh wp14">
   <w:footnote w:type="separator" w:id="-1">
     <w:p>
       <w:pPr>
@@ -2541,7 +2706,7 @@
 </file>
 
 <file path=word/numbering.xml><?xml version="1.0" encoding="utf-8"?>
-<w:numbering xmlns:wpc="http://schemas.microsoft.com/office/word/2010/wordprocessingCanvas" xmlns:cx="http://schemas.microsoft.com/office/drawing/2014/chartex" xmlns:cx1="http://schemas.microsoft.com/office/drawing/2015/9/8/chartex" xmlns:cx2="http://schemas.microsoft.com/office/drawing/2015/10/21/chartex" xmlns:cx3="http://schemas.microsoft.com/office/drawing/2016/5/9/chartex" xmlns:cx4="http://schemas.microsoft.com/office/drawing/2016/5/10/chartex" xmlns:cx5="http://schemas.microsoft.com/office/drawing/2016/5/11/chartex" xmlns:cx6="http://schemas.microsoft.com/office/drawing/2016/5/12/chartex" xmlns:cx7="http://schemas.microsoft.com/office/drawing/2016/5/13/chartex" xmlns:cx8="http://schemas.microsoft.com/office/drawing/2016/5/14/chartex" xmlns:mc="http://schemas.openxmlformats.org/markup-compatibility/2006" xmlns:aink="http://schemas.microsoft.com/office/drawing/2016/ink" xmlns:am3d="http://schemas.microsoft.com/office/drawing/2017/model3d" xmlns:o="urn:schemas-microsoft-com:office:office" xmlns:oel="http://schemas.microsoft.com/office/2019/extlst" xmlns:r="http://schemas.openxmlformats.org/officeDocument/2006/relationships" xmlns:m="http://schemas.openxmlformats.org/officeDocument/2006/math" xmlns:v="urn:schemas-microsoft-com:vml" xmlns:wp14="http://schemas.microsoft.com/office/word/2010/wordprocessingDrawing" xmlns:wp="http://schemas.openxmlformats.org/drawingml/2006/wordprocessingDrawing" xmlns:w10="urn:schemas-microsoft-com:office:word" xmlns:w="http://schemas.openxmlformats.org/wordprocessingml/2006/main" xmlns:w14="http://schemas.microsoft.com/office/word/2010/wordml" xmlns:w15="http://schemas.microsoft.com/office/word/2012/wordml" xmlns:w16cex="http://schemas.microsoft.com/office/word/2018/wordml/cex" xmlns:w16cid="http://schemas.microsoft.com/office/word/2016/wordml/cid" xmlns:w16="http://schemas.microsoft.com/office/word/2018/wordml" xmlns:w16du="http://schemas.microsoft.com/office/word/2023/wordml/word16du" xmlns:w16sdtdh="http://schemas.microsoft.com/office/word/2020/wordml/sdtdatahash" xmlns:w16se="http://schemas.microsoft.com/office/word/2015/wordml/symex" xmlns:wpg="http://schemas.microsoft.com/office/word/2010/wordprocessingGroup" xmlns:wpi="http://schemas.microsoft.com/office/word/2010/wordprocessingInk" xmlns:wne="http://schemas.microsoft.com/office/word/2006/wordml" xmlns:wps="http://schemas.microsoft.com/office/word/2010/wordprocessingShape" mc:Ignorable="w14 w15 w16se w16cid w16 w16cex w16sdtdh w16du wp14">
+<w:numbering xmlns:wpc="http://schemas.microsoft.com/office/word/2010/wordprocessingCanvas" xmlns:cx="http://schemas.microsoft.com/office/drawing/2014/chartex" xmlns:cx1="http://schemas.microsoft.com/office/drawing/2015/9/8/chartex" xmlns:cx2="http://schemas.microsoft.com/office/drawing/2015/10/21/chartex" xmlns:cx3="http://schemas.microsoft.com/office/drawing/2016/5/9/chartex" xmlns:cx4="http://schemas.microsoft.com/office/drawing/2016/5/10/chartex" xmlns:cx5="http://schemas.microsoft.com/office/drawing/2016/5/11/chartex" xmlns:cx6="http://schemas.microsoft.com/office/drawing/2016/5/12/chartex" xmlns:cx7="http://schemas.microsoft.com/office/drawing/2016/5/13/chartex" xmlns:cx8="http://schemas.microsoft.com/office/drawing/2016/5/14/chartex" xmlns:mc="http://schemas.openxmlformats.org/markup-compatibility/2006" xmlns:aink="http://schemas.microsoft.com/office/drawing/2016/ink" xmlns:am3d="http://schemas.microsoft.com/office/drawing/2017/model3d" xmlns:o="urn:schemas-microsoft-com:office:office" xmlns:oel="http://schemas.microsoft.com/office/2019/extlst" xmlns:r="http://schemas.openxmlformats.org/officeDocument/2006/relationships" xmlns:m="http://schemas.openxmlformats.org/officeDocument/2006/math" xmlns:v="urn:schemas-microsoft-com:vml" xmlns:wp14="http://schemas.microsoft.com/office/word/2010/wordprocessingDrawing" xmlns:wp="http://schemas.openxmlformats.org/drawingml/2006/wordprocessingDrawing" xmlns:w10="urn:schemas-microsoft-com:office:word" xmlns:w="http://schemas.openxmlformats.org/wordprocessingml/2006/main" xmlns:w14="http://schemas.microsoft.com/office/word/2010/wordml" xmlns:w15="http://schemas.microsoft.com/office/word/2012/wordml" xmlns:w16cex="http://schemas.microsoft.com/office/word/2018/wordml/cex" xmlns:w16cid="http://schemas.microsoft.com/office/word/2016/wordml/cid" xmlns:w16="http://schemas.microsoft.com/office/word/2018/wordml" xmlns:w16sdtdh="http://schemas.microsoft.com/office/word/2020/wordml/sdtdatahash" xmlns:w16se="http://schemas.microsoft.com/office/word/2015/wordml/symex" xmlns:wpg="http://schemas.microsoft.com/office/word/2010/wordprocessingGroup" xmlns:wpi="http://schemas.microsoft.com/office/word/2010/wordprocessingInk" xmlns:wne="http://schemas.microsoft.com/office/word/2006/wordml" xmlns:wps="http://schemas.microsoft.com/office/word/2010/wordprocessingShape" mc:Ignorable="w14 w15 w16se w16cid w16 w16cex w16sdtdh wp14">
   <w:abstractNum w:abstractNumId="0" w15:restartNumberingAfterBreak="0">
     <w:nsid w:val="00000001"/>
     <w:multiLevelType w:val="multilevel"/>
@@ -5554,7 +5719,7 @@
 </file>
 
 <file path=word/styles.xml><?xml version="1.0" encoding="utf-8"?>
-<w:styles xmlns:mc="http://schemas.openxmlformats.org/markup-compatibility/2006" xmlns:r="http://schemas.openxmlformats.org/officeDocument/2006/relationships" xmlns:w="http://schemas.openxmlformats.org/wordprocessingml/2006/main" xmlns:w14="http://schemas.microsoft.com/office/word/2010/wordml" xmlns:w15="http://schemas.microsoft.com/office/word/2012/wordml" xmlns:w16cex="http://schemas.microsoft.com/office/word/2018/wordml/cex" xmlns:w16cid="http://schemas.microsoft.com/office/word/2016/wordml/cid" xmlns:w16="http://schemas.microsoft.com/office/word/2018/wordml" xmlns:w16du="http://schemas.microsoft.com/office/word/2023/wordml/word16du" xmlns:w16sdtdh="http://schemas.microsoft.com/office/word/2020/wordml/sdtdatahash" xmlns:w16se="http://schemas.microsoft.com/office/word/2015/wordml/symex" mc:Ignorable="w14 w15 w16se w16cid w16 w16cex w16sdtdh w16du">
+<w:styles xmlns:mc="http://schemas.openxmlformats.org/markup-compatibility/2006" xmlns:r="http://schemas.openxmlformats.org/officeDocument/2006/relationships" xmlns:w="http://schemas.openxmlformats.org/wordprocessingml/2006/main" xmlns:w14="http://schemas.microsoft.com/office/word/2010/wordml" xmlns:w15="http://schemas.microsoft.com/office/word/2012/wordml" xmlns:w16cex="http://schemas.microsoft.com/office/word/2018/wordml/cex" xmlns:w16cid="http://schemas.microsoft.com/office/word/2016/wordml/cid" xmlns:w16="http://schemas.microsoft.com/office/word/2018/wordml" xmlns:w16sdtdh="http://schemas.microsoft.com/office/word/2020/wordml/sdtdatahash" xmlns:w16se="http://schemas.microsoft.com/office/word/2015/wordml/symex" mc:Ignorable="w14 w15 w16se w16cid w16 w16cex w16sdtdh">
   <w:docDefaults>
     <w:rPrDefault>
       <w:rPr>
@@ -6023,6 +6188,7 @@
   <w:style w:type="character" w:default="1" w:styleId="Standaardalinea-lettertype">
     <w:name w:val="Default Paragraph Font"/>
     <w:uiPriority w:val="1"/>
+    <w:semiHidden/>
     <w:unhideWhenUsed/>
   </w:style>
   <w:style w:type="table" w:default="1" w:styleId="Standaardtabel">

</xml_diff>

<commit_message>
Some minor updates were adopted.
git-svn-id: http://visualsvn.edna.local/EDNA/ModbusControl/V2@4884 03c8d257-35a7-c645-9f01-50f27e98b9e6
</commit_message>
<xml_diff>
--- a/Manuals/ModbusControl - Release notes.docx
+++ b/Manuals/ModbusControl - Release notes.docx
@@ -1,6 +1,6 @@
 
 <file path=word/document.xml><?xml version="1.0" encoding="utf-8"?>
-<w:document xmlns:wpc="http://schemas.microsoft.com/office/word/2010/wordprocessingCanvas" xmlns:cx="http://schemas.microsoft.com/office/drawing/2014/chartex" xmlns:cx1="http://schemas.microsoft.com/office/drawing/2015/9/8/chartex" xmlns:cx2="http://schemas.microsoft.com/office/drawing/2015/10/21/chartex" xmlns:cx3="http://schemas.microsoft.com/office/drawing/2016/5/9/chartex" xmlns:cx4="http://schemas.microsoft.com/office/drawing/2016/5/10/chartex" xmlns:cx5="http://schemas.microsoft.com/office/drawing/2016/5/11/chartex" xmlns:cx6="http://schemas.microsoft.com/office/drawing/2016/5/12/chartex" xmlns:cx7="http://schemas.microsoft.com/office/drawing/2016/5/13/chartex" xmlns:cx8="http://schemas.microsoft.com/office/drawing/2016/5/14/chartex" xmlns:mc="http://schemas.openxmlformats.org/markup-compatibility/2006" xmlns:aink="http://schemas.microsoft.com/office/drawing/2016/ink" xmlns:am3d="http://schemas.microsoft.com/office/drawing/2017/model3d" xmlns:o="urn:schemas-microsoft-com:office:office" xmlns:oel="http://schemas.microsoft.com/office/2019/extlst" xmlns:r="http://schemas.openxmlformats.org/officeDocument/2006/relationships" xmlns:m="http://schemas.openxmlformats.org/officeDocument/2006/math" xmlns:v="urn:schemas-microsoft-com:vml" xmlns:wp14="http://schemas.microsoft.com/office/word/2010/wordprocessingDrawing" xmlns:wp="http://schemas.openxmlformats.org/drawingml/2006/wordprocessingDrawing" xmlns:w10="urn:schemas-microsoft-com:office:word" xmlns:w="http://schemas.openxmlformats.org/wordprocessingml/2006/main" xmlns:w14="http://schemas.microsoft.com/office/word/2010/wordml" xmlns:w15="http://schemas.microsoft.com/office/word/2012/wordml" xmlns:w16cex="http://schemas.microsoft.com/office/word/2018/wordml/cex" xmlns:w16cid="http://schemas.microsoft.com/office/word/2016/wordml/cid" xmlns:w16="http://schemas.microsoft.com/office/word/2018/wordml" xmlns:w16sdtdh="http://schemas.microsoft.com/office/word/2020/wordml/sdtdatahash" xmlns:w16se="http://schemas.microsoft.com/office/word/2015/wordml/symex" xmlns:wpg="http://schemas.microsoft.com/office/word/2010/wordprocessingGroup" xmlns:wpi="http://schemas.microsoft.com/office/word/2010/wordprocessingInk" xmlns:wne="http://schemas.microsoft.com/office/word/2006/wordml" xmlns:wps="http://schemas.microsoft.com/office/word/2010/wordprocessingShape" mc:Ignorable="w14 w15 w16se w16cid w16 w16cex w16sdtdh wp14">
+<w:document xmlns:wpc="http://schemas.microsoft.com/office/word/2010/wordprocessingCanvas" xmlns:cx="http://schemas.microsoft.com/office/drawing/2014/chartex" xmlns:cx1="http://schemas.microsoft.com/office/drawing/2015/9/8/chartex" xmlns:cx2="http://schemas.microsoft.com/office/drawing/2015/10/21/chartex" xmlns:cx3="http://schemas.microsoft.com/office/drawing/2016/5/9/chartex" xmlns:cx4="http://schemas.microsoft.com/office/drawing/2016/5/10/chartex" xmlns:cx5="http://schemas.microsoft.com/office/drawing/2016/5/11/chartex" xmlns:cx6="http://schemas.microsoft.com/office/drawing/2016/5/12/chartex" xmlns:cx7="http://schemas.microsoft.com/office/drawing/2016/5/13/chartex" xmlns:cx8="http://schemas.microsoft.com/office/drawing/2016/5/14/chartex" xmlns:mc="http://schemas.openxmlformats.org/markup-compatibility/2006" xmlns:aink="http://schemas.microsoft.com/office/drawing/2016/ink" xmlns:am3d="http://schemas.microsoft.com/office/drawing/2017/model3d" xmlns:o="urn:schemas-microsoft-com:office:office" xmlns:oel="http://schemas.microsoft.com/office/2019/extlst" xmlns:r="http://schemas.openxmlformats.org/officeDocument/2006/relationships" xmlns:m="http://schemas.openxmlformats.org/officeDocument/2006/math" xmlns:v="urn:schemas-microsoft-com:vml" xmlns:wp14="http://schemas.microsoft.com/office/word/2010/wordprocessingDrawing" xmlns:wp="http://schemas.openxmlformats.org/drawingml/2006/wordprocessingDrawing" xmlns:w10="urn:schemas-microsoft-com:office:word" xmlns:w="http://schemas.openxmlformats.org/wordprocessingml/2006/main" xmlns:w14="http://schemas.microsoft.com/office/word/2010/wordml" xmlns:w15="http://schemas.microsoft.com/office/word/2012/wordml" xmlns:w16cex="http://schemas.microsoft.com/office/word/2018/wordml/cex" xmlns:w16cid="http://schemas.microsoft.com/office/word/2016/wordml/cid" xmlns:w16="http://schemas.microsoft.com/office/word/2018/wordml" xmlns:w16du="http://schemas.microsoft.com/office/word/2023/wordml/word16du" xmlns:w16sdtdh="http://schemas.microsoft.com/office/word/2020/wordml/sdtdatahash" xmlns:w16se="http://schemas.microsoft.com/office/word/2015/wordml/symex" xmlns:wpg="http://schemas.microsoft.com/office/word/2010/wordprocessingGroup" xmlns:wpi="http://schemas.microsoft.com/office/word/2010/wordprocessingInk" xmlns:wne="http://schemas.microsoft.com/office/word/2006/wordml" xmlns:wps="http://schemas.microsoft.com/office/word/2010/wordprocessingShape" mc:Ignorable="w14 w15 w16se w16cid w16 w16cex w16sdtdh w16du wp14">
   <w:body>
     <w:p>
       <w:pPr>
@@ -130,6 +130,9 @@
           <w:ilvl w:val="0"/>
           <w:numId w:val="4"/>
         </w:numPr>
+        <w:rPr>
+          <w:rFonts w:hint="eastAsia"/>
+        </w:rPr>
       </w:pPr>
       <w:r>
         <w:t>Added</w:t>
@@ -155,15 +158,7 @@
         </w:rPr>
       </w:pPr>
       <w:r>
-        <w:t>Mbc file: &lt;</w:t>
-      </w:r>
-      <w:proofErr w:type="spellStart"/>
-      <w:r>
-        <w:t>exportorder</w:t>
-      </w:r>
-      <w:proofErr w:type="spellEnd"/>
-      <w:r>
-        <w:t>&gt; element added.</w:t>
+        <w:t>Mbc file: &lt;exportorder&gt; element added.</w:t>
       </w:r>
     </w:p>
     <w:p>
@@ -257,14 +252,12 @@
           <w:rFonts w:hint="eastAsia"/>
         </w:rPr>
       </w:pPr>
-      <w:proofErr w:type="spellStart"/>
       <w:r>
         <w:rPr>
           <w:rFonts w:hint="eastAsia"/>
         </w:rPr>
         <w:t>WriteHoldingregisterFC</w:t>
       </w:r>
-      <w:proofErr w:type="spellEnd"/>
       <w:r>
         <w:t xml:space="preserve"> </w:t>
       </w:r>
@@ -299,6 +292,9 @@
           <w:ilvl w:val="0"/>
           <w:numId w:val="4"/>
         </w:numPr>
+        <w:rPr>
+          <w:rFonts w:hint="eastAsia"/>
+        </w:rPr>
       </w:pPr>
       <w:r>
         <w:t>Stop-on-error mechanism fix.</w:t>
@@ -310,6 +306,9 @@
           <w:ilvl w:val="0"/>
           <w:numId w:val="4"/>
         </w:numPr>
+        <w:rPr>
+          <w:rFonts w:hint="eastAsia"/>
+        </w:rPr>
       </w:pPr>
       <w:r>
         <w:t xml:space="preserve">Import now processes the </w:t>
@@ -339,6 +338,9 @@
           <w:ilvl w:val="0"/>
           <w:numId w:val="4"/>
         </w:numPr>
+        <w:rPr>
+          <w:rFonts w:hint="eastAsia"/>
+        </w:rPr>
       </w:pPr>
       <w:r>
         <w:t>Import now also ignores lines that only have spaces and/or separators.</w:t>
@@ -389,21 +391,7 @@
         <w:rPr>
           <w:rFonts w:hint="eastAsia"/>
         </w:rPr>
-        <w:t xml:space="preserve">Enum registers editing now has a dropdown </w:t>
-      </w:r>
-      <w:proofErr w:type="spellStart"/>
-      <w:r>
-        <w:rPr>
-          <w:rFonts w:hint="eastAsia"/>
-        </w:rPr>
-        <w:t>combobox</w:t>
-      </w:r>
-      <w:proofErr w:type="spellEnd"/>
-      <w:r>
-        <w:rPr>
-          <w:rFonts w:hint="eastAsia"/>
-        </w:rPr>
-        <w:t xml:space="preserve"> with possible values.</w:t>
+        <w:t>Enum registers editing now has a dropdown combobox with possible values.</w:t>
       </w:r>
     </w:p>
     <w:p>
@@ -527,63 +515,16 @@
         </w:numPr>
         <w:rPr>
           <w:rFonts w:hint="eastAsia"/>
-          <w:lang w:val="nl-BE"/>
-        </w:rPr>
-      </w:pPr>
-      <w:r>
-        <w:rPr>
-          <w:rFonts w:hint="eastAsia"/>
-          <w:lang w:val="nl-BE"/>
-        </w:rPr>
-        <w:t xml:space="preserve">Bij </w:t>
-      </w:r>
-      <w:proofErr w:type="spellStart"/>
-      <w:r>
-        <w:rPr>
-          <w:rFonts w:hint="eastAsia"/>
-          <w:lang w:val="nl-BE"/>
-        </w:rPr>
-        <w:t>Import_file</w:t>
-      </w:r>
-      <w:proofErr w:type="spellEnd"/>
-      <w:r>
-        <w:rPr>
-          <w:rFonts w:hint="eastAsia"/>
-          <w:lang w:val="nl-BE"/>
-        </w:rPr>
-        <w:t xml:space="preserve"> en </w:t>
-      </w:r>
-      <w:proofErr w:type="spellStart"/>
-      <w:r>
-        <w:rPr>
-          <w:rFonts w:hint="eastAsia"/>
-          <w:lang w:val="nl-BE"/>
-        </w:rPr>
-        <w:t>Import_compare</w:t>
-      </w:r>
-      <w:proofErr w:type="spellEnd"/>
-      <w:r>
-        <w:rPr>
-          <w:rFonts w:hint="eastAsia"/>
-          <w:lang w:val="nl-BE"/>
-        </w:rPr>
-        <w:t>: schrijven/</w:t>
-      </w:r>
-      <w:proofErr w:type="spellStart"/>
-      <w:r>
-        <w:rPr>
-          <w:rFonts w:hint="eastAsia"/>
-          <w:lang w:val="nl-BE"/>
-        </w:rPr>
-        <w:t>comparen</w:t>
-      </w:r>
-      <w:proofErr w:type="spellEnd"/>
-      <w:r>
-        <w:rPr>
-          <w:rFonts w:hint="eastAsia"/>
-          <w:lang w:val="nl-BE"/>
-        </w:rPr>
-        <w:t xml:space="preserve"> van een float32 werkte niet meer.</w:t>
+        </w:rPr>
+      </w:pPr>
+      <w:r>
+        <w:t xml:space="preserve">In Import_file and Import_compare: writing/comparing a float32 </w:t>
+      </w:r>
+      <w:r>
+        <w:t xml:space="preserve">value </w:t>
+      </w:r>
+      <w:r>
+        <w:t>no longer worked.</w:t>
       </w:r>
     </w:p>
     <w:p>
@@ -676,35 +617,7 @@
         <w:rPr>
           <w:rFonts w:hint="eastAsia"/>
         </w:rPr>
-        <w:t>You can now close the [</w:t>
-      </w:r>
-      <w:proofErr w:type="spellStart"/>
-      <w:r>
-        <w:rPr>
-          <w:rFonts w:hint="eastAsia"/>
-        </w:rPr>
-        <w:t>Project_Configuration</w:t>
-      </w:r>
-      <w:proofErr w:type="spellEnd"/>
-      <w:r>
-        <w:rPr>
-          <w:rFonts w:hint="eastAsia"/>
-        </w:rPr>
-        <w:t>], [</w:t>
-      </w:r>
-      <w:proofErr w:type="spellStart"/>
-      <w:r>
-        <w:rPr>
-          <w:rFonts w:hint="eastAsia"/>
-        </w:rPr>
-        <w:t>Save_project_file</w:t>
-      </w:r>
-      <w:proofErr w:type="spellEnd"/>
-      <w:r>
-        <w:rPr>
-          <w:rFonts w:hint="eastAsia"/>
-        </w:rPr>
-        <w:t>] and [About] forms with the ESC button</w:t>
+        <w:t>You can now close the [Project_Configuration], [Save_project_file] and [About] forms with the ESC button</w:t>
       </w:r>
       <w:r>
         <w:t xml:space="preserve"> too</w:t>
@@ -776,35 +689,7 @@
         <w:rPr>
           <w:rFonts w:hint="eastAsia"/>
         </w:rPr>
-        <w:t xml:space="preserve">With </w:t>
-      </w:r>
-      <w:proofErr w:type="spellStart"/>
-      <w:r>
-        <w:rPr>
-          <w:rFonts w:hint="eastAsia"/>
-        </w:rPr>
-        <w:t>Import_file</w:t>
-      </w:r>
-      <w:proofErr w:type="spellEnd"/>
-      <w:r>
-        <w:rPr>
-          <w:rFonts w:hint="eastAsia"/>
-        </w:rPr>
-        <w:t xml:space="preserve"> and </w:t>
-      </w:r>
-      <w:proofErr w:type="spellStart"/>
-      <w:r>
-        <w:rPr>
-          <w:rFonts w:hint="eastAsia"/>
-        </w:rPr>
-        <w:t>Import_compare</w:t>
-      </w:r>
-      <w:proofErr w:type="spellEnd"/>
-      <w:r>
-        <w:rPr>
-          <w:rFonts w:hint="eastAsia"/>
-        </w:rPr>
-        <w:t>: writing/compar</w:t>
+        <w:t>With Import_file and Import_compare: writing/compar</w:t>
       </w:r>
       <w:r>
         <w:t>ing</w:t>
@@ -974,15 +859,7 @@
         </w:rPr>
       </w:pPr>
       <w:r>
-        <w:t>Mbc project file: &lt;</w:t>
-      </w:r>
-      <w:proofErr w:type="spellStart"/>
-      <w:r>
-        <w:t>longdescr</w:t>
-      </w:r>
-      <w:proofErr w:type="spellEnd"/>
-      <w:r>
-        <w:t xml:space="preserve">&gt; </w:t>
+        <w:t xml:space="preserve">Mbc project file: &lt;longdescr&gt; </w:t>
       </w:r>
       <w:r>
         <w:t xml:space="preserve">element </w:t>
@@ -991,13 +868,8 @@
         <w:t xml:space="preserve">added. </w:t>
       </w:r>
       <w:r>
-        <w:t xml:space="preserve">Adds a long multiline text that is show when the mouse is hoovered over the register </w:t>
-      </w:r>
-      <w:proofErr w:type="spellStart"/>
-      <w:r>
-        <w:t>decription</w:t>
-      </w:r>
-      <w:proofErr w:type="spellEnd"/>
+        <w:t>Adds a long multiline text that is show when the mouse is hoovered over the register decription</w:t>
+      </w:r>
       <w:r>
         <w:t>.</w:t>
       </w:r>
@@ -1183,15 +1055,7 @@
         </w:rPr>
       </w:pPr>
       <w:r>
-        <w:t>The properties of a register (</w:t>
-      </w:r>
-      <w:proofErr w:type="spellStart"/>
-      <w:r>
-        <w:t>rw</w:t>
-      </w:r>
-      <w:proofErr w:type="spellEnd"/>
-      <w:r>
-        <w:t xml:space="preserve">, int32, ...) are now displayed in a separate </w:t>
+        <w:t xml:space="preserve">The properties of a register (rw, int32, ...) are now displayed in a separate </w:t>
       </w:r>
       <w:r>
         <w:t>[</w:t>
@@ -1536,15 +1400,7 @@
         </w:rPr>
       </w:pPr>
       <w:r>
-        <w:t xml:space="preserve">If you start ModbusControl by double-clicking an mbc file and the file points to a non-existent COM port, the error dialog "Error opening serial port </w:t>
-      </w:r>
-      <w:proofErr w:type="spellStart"/>
-      <w:r>
-        <w:t>COMx</w:t>
-      </w:r>
-      <w:proofErr w:type="spellEnd"/>
-      <w:r>
-        <w:t>" now appears after the ModbusControl program appears.</w:t>
+        <w:t>If you start ModbusControl by double-clicking an mbc file and the file points to a non-existent COM port, the error dialog "Error opening serial port COMx" now appears after the ModbusControl program appears.</w:t>
       </w:r>
     </w:p>
     <w:p>
@@ -1616,23 +1472,7 @@
         <w:t xml:space="preserve">file is automatically </w:t>
       </w:r>
       <w:r>
-        <w:t>moved from &lt;</w:t>
-      </w:r>
-      <w:proofErr w:type="spellStart"/>
-      <w:r>
-        <w:t>mydocuments</w:t>
-      </w:r>
-      <w:proofErr w:type="spellEnd"/>
-      <w:r>
-        <w:t>&gt;\ModbusControl to %</w:t>
-      </w:r>
-      <w:proofErr w:type="spellStart"/>
-      <w:r>
-        <w:t>AppData</w:t>
-      </w:r>
-      <w:proofErr w:type="spellEnd"/>
-      <w:r>
-        <w:t xml:space="preserve">%\Roaming\E.D.&amp;A\ModbusControl. Content from old is not migrated. Old </w:t>
+        <w:t xml:space="preserve">moved from &lt;mydocuments&gt;\ModbusControl to %AppData%\Roaming\E.D.&amp;A\ModbusControl. Content from old is not migrated. Old </w:t>
       </w:r>
       <w:r>
         <w:t>file</w:t>
@@ -2533,13 +2373,8 @@
           <w:rFonts w:hint="eastAsia"/>
         </w:rPr>
       </w:pPr>
-      <w:proofErr w:type="spellStart"/>
-      <w:r>
-        <w:t>WriteHoldingregFunctionCode</w:t>
-      </w:r>
-      <w:proofErr w:type="spellEnd"/>
-      <w:r>
-        <w:t xml:space="preserve"> now also supports 'auto'.</w:t>
+      <w:r>
+        <w:t>WriteHoldingregFunctionCode now also supports 'auto'.</w:t>
       </w:r>
     </w:p>
     <w:p>
@@ -2583,7 +2418,7 @@
 </file>
 
 <file path=word/endnotes.xml><?xml version="1.0" encoding="utf-8"?>
-<w:endnotes xmlns:wpc="http://schemas.microsoft.com/office/word/2010/wordprocessingCanvas" xmlns:cx="http://schemas.microsoft.com/office/drawing/2014/chartex" xmlns:cx1="http://schemas.microsoft.com/office/drawing/2015/9/8/chartex" xmlns:cx2="http://schemas.microsoft.com/office/drawing/2015/10/21/chartex" xmlns:cx3="http://schemas.microsoft.com/office/drawing/2016/5/9/chartex" xmlns:cx4="http://schemas.microsoft.com/office/drawing/2016/5/10/chartex" xmlns:cx5="http://schemas.microsoft.com/office/drawing/2016/5/11/chartex" xmlns:cx6="http://schemas.microsoft.com/office/drawing/2016/5/12/chartex" xmlns:cx7="http://schemas.microsoft.com/office/drawing/2016/5/13/chartex" xmlns:cx8="http://schemas.microsoft.com/office/drawing/2016/5/14/chartex" xmlns:mc="http://schemas.openxmlformats.org/markup-compatibility/2006" xmlns:aink="http://schemas.microsoft.com/office/drawing/2016/ink" xmlns:am3d="http://schemas.microsoft.com/office/drawing/2017/model3d" xmlns:o="urn:schemas-microsoft-com:office:office" xmlns:oel="http://schemas.microsoft.com/office/2019/extlst" xmlns:r="http://schemas.openxmlformats.org/officeDocument/2006/relationships" xmlns:m="http://schemas.openxmlformats.org/officeDocument/2006/math" xmlns:v="urn:schemas-microsoft-com:vml" xmlns:wp14="http://schemas.microsoft.com/office/word/2010/wordprocessingDrawing" xmlns:wp="http://schemas.openxmlformats.org/drawingml/2006/wordprocessingDrawing" xmlns:w10="urn:schemas-microsoft-com:office:word" xmlns:w="http://schemas.openxmlformats.org/wordprocessingml/2006/main" xmlns:w14="http://schemas.microsoft.com/office/word/2010/wordml" xmlns:w15="http://schemas.microsoft.com/office/word/2012/wordml" xmlns:w16cex="http://schemas.microsoft.com/office/word/2018/wordml/cex" xmlns:w16cid="http://schemas.microsoft.com/office/word/2016/wordml/cid" xmlns:w16="http://schemas.microsoft.com/office/word/2018/wordml" xmlns:w16sdtdh="http://schemas.microsoft.com/office/word/2020/wordml/sdtdatahash" xmlns:w16se="http://schemas.microsoft.com/office/word/2015/wordml/symex" xmlns:wpg="http://schemas.microsoft.com/office/word/2010/wordprocessingGroup" xmlns:wpi="http://schemas.microsoft.com/office/word/2010/wordprocessingInk" xmlns:wne="http://schemas.microsoft.com/office/word/2006/wordml" xmlns:wps="http://schemas.microsoft.com/office/word/2010/wordprocessingShape" mc:Ignorable="w14 w15 w16se w16cid w16 w16cex w16sdtdh wp14">
+<w:endnotes xmlns:wpc="http://schemas.microsoft.com/office/word/2010/wordprocessingCanvas" xmlns:cx="http://schemas.microsoft.com/office/drawing/2014/chartex" xmlns:cx1="http://schemas.microsoft.com/office/drawing/2015/9/8/chartex" xmlns:cx2="http://schemas.microsoft.com/office/drawing/2015/10/21/chartex" xmlns:cx3="http://schemas.microsoft.com/office/drawing/2016/5/9/chartex" xmlns:cx4="http://schemas.microsoft.com/office/drawing/2016/5/10/chartex" xmlns:cx5="http://schemas.microsoft.com/office/drawing/2016/5/11/chartex" xmlns:cx6="http://schemas.microsoft.com/office/drawing/2016/5/12/chartex" xmlns:cx7="http://schemas.microsoft.com/office/drawing/2016/5/13/chartex" xmlns:cx8="http://schemas.microsoft.com/office/drawing/2016/5/14/chartex" xmlns:mc="http://schemas.openxmlformats.org/markup-compatibility/2006" xmlns:aink="http://schemas.microsoft.com/office/drawing/2016/ink" xmlns:am3d="http://schemas.microsoft.com/office/drawing/2017/model3d" xmlns:o="urn:schemas-microsoft-com:office:office" xmlns:oel="http://schemas.microsoft.com/office/2019/extlst" xmlns:r="http://schemas.openxmlformats.org/officeDocument/2006/relationships" xmlns:m="http://schemas.openxmlformats.org/officeDocument/2006/math" xmlns:v="urn:schemas-microsoft-com:vml" xmlns:wp14="http://schemas.microsoft.com/office/word/2010/wordprocessingDrawing" xmlns:wp="http://schemas.openxmlformats.org/drawingml/2006/wordprocessingDrawing" xmlns:w10="urn:schemas-microsoft-com:office:word" xmlns:w="http://schemas.openxmlformats.org/wordprocessingml/2006/main" xmlns:w14="http://schemas.microsoft.com/office/word/2010/wordml" xmlns:w15="http://schemas.microsoft.com/office/word/2012/wordml" xmlns:w16cex="http://schemas.microsoft.com/office/word/2018/wordml/cex" xmlns:w16cid="http://schemas.microsoft.com/office/word/2016/wordml/cid" xmlns:w16="http://schemas.microsoft.com/office/word/2018/wordml" xmlns:w16du="http://schemas.microsoft.com/office/word/2023/wordml/word16du" xmlns:w16sdtdh="http://schemas.microsoft.com/office/word/2020/wordml/sdtdatahash" xmlns:w16se="http://schemas.microsoft.com/office/word/2015/wordml/symex" xmlns:wpg="http://schemas.microsoft.com/office/word/2010/wordprocessingGroup" xmlns:wpi="http://schemas.microsoft.com/office/word/2010/wordprocessingInk" xmlns:wne="http://schemas.microsoft.com/office/word/2006/wordml" xmlns:wps="http://schemas.microsoft.com/office/word/2010/wordprocessingShape" mc:Ignorable="w14 w15 w16se w16cid w16 w16cex w16sdtdh w16du wp14">
   <w:endnote w:type="separator" w:id="-1">
     <w:p>
       <w:pPr>
@@ -2612,7 +2447,7 @@
 </file>
 
 <file path=word/footer1.xml><?xml version="1.0" encoding="utf-8"?>
-<w:ftr xmlns:wpc="http://schemas.microsoft.com/office/word/2010/wordprocessingCanvas" xmlns:cx="http://schemas.microsoft.com/office/drawing/2014/chartex" xmlns:cx1="http://schemas.microsoft.com/office/drawing/2015/9/8/chartex" xmlns:cx2="http://schemas.microsoft.com/office/drawing/2015/10/21/chartex" xmlns:cx3="http://schemas.microsoft.com/office/drawing/2016/5/9/chartex" xmlns:cx4="http://schemas.microsoft.com/office/drawing/2016/5/10/chartex" xmlns:cx5="http://schemas.microsoft.com/office/drawing/2016/5/11/chartex" xmlns:cx6="http://schemas.microsoft.com/office/drawing/2016/5/12/chartex" xmlns:cx7="http://schemas.microsoft.com/office/drawing/2016/5/13/chartex" xmlns:cx8="http://schemas.microsoft.com/office/drawing/2016/5/14/chartex" xmlns:mc="http://schemas.openxmlformats.org/markup-compatibility/2006" xmlns:aink="http://schemas.microsoft.com/office/drawing/2016/ink" xmlns:am3d="http://schemas.microsoft.com/office/drawing/2017/model3d" xmlns:o="urn:schemas-microsoft-com:office:office" xmlns:oel="http://schemas.microsoft.com/office/2019/extlst" xmlns:r="http://schemas.openxmlformats.org/officeDocument/2006/relationships" xmlns:m="http://schemas.openxmlformats.org/officeDocument/2006/math" xmlns:v="urn:schemas-microsoft-com:vml" xmlns:wp14="http://schemas.microsoft.com/office/word/2010/wordprocessingDrawing" xmlns:wp="http://schemas.openxmlformats.org/drawingml/2006/wordprocessingDrawing" xmlns:w10="urn:schemas-microsoft-com:office:word" xmlns:w="http://schemas.openxmlformats.org/wordprocessingml/2006/main" xmlns:w14="http://schemas.microsoft.com/office/word/2010/wordml" xmlns:w15="http://schemas.microsoft.com/office/word/2012/wordml" xmlns:w16cex="http://schemas.microsoft.com/office/word/2018/wordml/cex" xmlns:w16cid="http://schemas.microsoft.com/office/word/2016/wordml/cid" xmlns:w16="http://schemas.microsoft.com/office/word/2018/wordml" xmlns:w16sdtdh="http://schemas.microsoft.com/office/word/2020/wordml/sdtdatahash" xmlns:w16se="http://schemas.microsoft.com/office/word/2015/wordml/symex" xmlns:wpg="http://schemas.microsoft.com/office/word/2010/wordprocessingGroup" xmlns:wpi="http://schemas.microsoft.com/office/word/2010/wordprocessingInk" xmlns:wne="http://schemas.microsoft.com/office/word/2006/wordml" xmlns:wps="http://schemas.microsoft.com/office/word/2010/wordprocessingShape" mc:Ignorable="w14 w15 w16se w16cid w16 w16cex w16sdtdh wp14">
+<w:ftr xmlns:wpc="http://schemas.microsoft.com/office/word/2010/wordprocessingCanvas" xmlns:cx="http://schemas.microsoft.com/office/drawing/2014/chartex" xmlns:cx1="http://schemas.microsoft.com/office/drawing/2015/9/8/chartex" xmlns:cx2="http://schemas.microsoft.com/office/drawing/2015/10/21/chartex" xmlns:cx3="http://schemas.microsoft.com/office/drawing/2016/5/9/chartex" xmlns:cx4="http://schemas.microsoft.com/office/drawing/2016/5/10/chartex" xmlns:cx5="http://schemas.microsoft.com/office/drawing/2016/5/11/chartex" xmlns:cx6="http://schemas.microsoft.com/office/drawing/2016/5/12/chartex" xmlns:cx7="http://schemas.microsoft.com/office/drawing/2016/5/13/chartex" xmlns:cx8="http://schemas.microsoft.com/office/drawing/2016/5/14/chartex" xmlns:mc="http://schemas.openxmlformats.org/markup-compatibility/2006" xmlns:aink="http://schemas.microsoft.com/office/drawing/2016/ink" xmlns:am3d="http://schemas.microsoft.com/office/drawing/2017/model3d" xmlns:o="urn:schemas-microsoft-com:office:office" xmlns:oel="http://schemas.microsoft.com/office/2019/extlst" xmlns:r="http://schemas.openxmlformats.org/officeDocument/2006/relationships" xmlns:m="http://schemas.openxmlformats.org/officeDocument/2006/math" xmlns:v="urn:schemas-microsoft-com:vml" xmlns:wp14="http://schemas.microsoft.com/office/word/2010/wordprocessingDrawing" xmlns:wp="http://schemas.openxmlformats.org/drawingml/2006/wordprocessingDrawing" xmlns:w10="urn:schemas-microsoft-com:office:word" xmlns:w="http://schemas.openxmlformats.org/wordprocessingml/2006/main" xmlns:w14="http://schemas.microsoft.com/office/word/2010/wordml" xmlns:w15="http://schemas.microsoft.com/office/word/2012/wordml" xmlns:w16cex="http://schemas.microsoft.com/office/word/2018/wordml/cex" xmlns:w16cid="http://schemas.microsoft.com/office/word/2016/wordml/cid" xmlns:w16="http://schemas.microsoft.com/office/word/2018/wordml" xmlns:w16du="http://schemas.microsoft.com/office/word/2023/wordml/word16du" xmlns:w16sdtdh="http://schemas.microsoft.com/office/word/2020/wordml/sdtdatahash" xmlns:w16se="http://schemas.microsoft.com/office/word/2015/wordml/symex" xmlns:wpg="http://schemas.microsoft.com/office/word/2010/wordprocessingGroup" xmlns:wpi="http://schemas.microsoft.com/office/word/2010/wordprocessingInk" xmlns:wne="http://schemas.microsoft.com/office/word/2006/wordml" xmlns:wps="http://schemas.microsoft.com/office/word/2010/wordprocessingShape" mc:Ignorable="w14 w15 w16se w16cid w16 w16cex w16sdtdh w16du wp14">
   <w:p>
     <w:pPr>
       <w:pStyle w:val="Voettekst"/>
@@ -2665,7 +2500,7 @@
 </file>
 
 <file path=word/footer2.xml><?xml version="1.0" encoding="utf-8"?>
-<w:ftr xmlns:wpc="http://schemas.microsoft.com/office/word/2010/wordprocessingCanvas" xmlns:cx="http://schemas.microsoft.com/office/drawing/2014/chartex" xmlns:cx1="http://schemas.microsoft.com/office/drawing/2015/9/8/chartex" xmlns:cx2="http://schemas.microsoft.com/office/drawing/2015/10/21/chartex" xmlns:cx3="http://schemas.microsoft.com/office/drawing/2016/5/9/chartex" xmlns:cx4="http://schemas.microsoft.com/office/drawing/2016/5/10/chartex" xmlns:cx5="http://schemas.microsoft.com/office/drawing/2016/5/11/chartex" xmlns:cx6="http://schemas.microsoft.com/office/drawing/2016/5/12/chartex" xmlns:cx7="http://schemas.microsoft.com/office/drawing/2016/5/13/chartex" xmlns:cx8="http://schemas.microsoft.com/office/drawing/2016/5/14/chartex" xmlns:mc="http://schemas.openxmlformats.org/markup-compatibility/2006" xmlns:aink="http://schemas.microsoft.com/office/drawing/2016/ink" xmlns:am3d="http://schemas.microsoft.com/office/drawing/2017/model3d" xmlns:o="urn:schemas-microsoft-com:office:office" xmlns:oel="http://schemas.microsoft.com/office/2019/extlst" xmlns:r="http://schemas.openxmlformats.org/officeDocument/2006/relationships" xmlns:m="http://schemas.openxmlformats.org/officeDocument/2006/math" xmlns:v="urn:schemas-microsoft-com:vml" xmlns:wp14="http://schemas.microsoft.com/office/word/2010/wordprocessingDrawing" xmlns:wp="http://schemas.openxmlformats.org/drawingml/2006/wordprocessingDrawing" xmlns:w10="urn:schemas-microsoft-com:office:word" xmlns:w="http://schemas.openxmlformats.org/wordprocessingml/2006/main" xmlns:w14="http://schemas.microsoft.com/office/word/2010/wordml" xmlns:w15="http://schemas.microsoft.com/office/word/2012/wordml" xmlns:w16cex="http://schemas.microsoft.com/office/word/2018/wordml/cex" xmlns:w16cid="http://schemas.microsoft.com/office/word/2016/wordml/cid" xmlns:w16="http://schemas.microsoft.com/office/word/2018/wordml" xmlns:w16sdtdh="http://schemas.microsoft.com/office/word/2020/wordml/sdtdatahash" xmlns:w16se="http://schemas.microsoft.com/office/word/2015/wordml/symex" xmlns:wpg="http://schemas.microsoft.com/office/word/2010/wordprocessingGroup" xmlns:wpi="http://schemas.microsoft.com/office/word/2010/wordprocessingInk" xmlns:wne="http://schemas.microsoft.com/office/word/2006/wordml" xmlns:wps="http://schemas.microsoft.com/office/word/2010/wordprocessingShape" mc:Ignorable="w14 w15 w16se w16cid w16 w16cex w16sdtdh wp14">
+<w:ftr xmlns:wpc="http://schemas.microsoft.com/office/word/2010/wordprocessingCanvas" xmlns:cx="http://schemas.microsoft.com/office/drawing/2014/chartex" xmlns:cx1="http://schemas.microsoft.com/office/drawing/2015/9/8/chartex" xmlns:cx2="http://schemas.microsoft.com/office/drawing/2015/10/21/chartex" xmlns:cx3="http://schemas.microsoft.com/office/drawing/2016/5/9/chartex" xmlns:cx4="http://schemas.microsoft.com/office/drawing/2016/5/10/chartex" xmlns:cx5="http://schemas.microsoft.com/office/drawing/2016/5/11/chartex" xmlns:cx6="http://schemas.microsoft.com/office/drawing/2016/5/12/chartex" xmlns:cx7="http://schemas.microsoft.com/office/drawing/2016/5/13/chartex" xmlns:cx8="http://schemas.microsoft.com/office/drawing/2016/5/14/chartex" xmlns:mc="http://schemas.openxmlformats.org/markup-compatibility/2006" xmlns:aink="http://schemas.microsoft.com/office/drawing/2016/ink" xmlns:am3d="http://schemas.microsoft.com/office/drawing/2017/model3d" xmlns:o="urn:schemas-microsoft-com:office:office" xmlns:oel="http://schemas.microsoft.com/office/2019/extlst" xmlns:r="http://schemas.openxmlformats.org/officeDocument/2006/relationships" xmlns:m="http://schemas.openxmlformats.org/officeDocument/2006/math" xmlns:v="urn:schemas-microsoft-com:vml" xmlns:wp14="http://schemas.microsoft.com/office/word/2010/wordprocessingDrawing" xmlns:wp="http://schemas.openxmlformats.org/drawingml/2006/wordprocessingDrawing" xmlns:w10="urn:schemas-microsoft-com:office:word" xmlns:w="http://schemas.openxmlformats.org/wordprocessingml/2006/main" xmlns:w14="http://schemas.microsoft.com/office/word/2010/wordml" xmlns:w15="http://schemas.microsoft.com/office/word/2012/wordml" xmlns:w16cex="http://schemas.microsoft.com/office/word/2018/wordml/cex" xmlns:w16cid="http://schemas.microsoft.com/office/word/2016/wordml/cid" xmlns:w16="http://schemas.microsoft.com/office/word/2018/wordml" xmlns:w16du="http://schemas.microsoft.com/office/word/2023/wordml/word16du" xmlns:w16sdtdh="http://schemas.microsoft.com/office/word/2020/wordml/sdtdatahash" xmlns:w16se="http://schemas.microsoft.com/office/word/2015/wordml/symex" xmlns:wpg="http://schemas.microsoft.com/office/word/2010/wordprocessingGroup" xmlns:wpi="http://schemas.microsoft.com/office/word/2010/wordprocessingInk" xmlns:wne="http://schemas.microsoft.com/office/word/2006/wordml" xmlns:wps="http://schemas.microsoft.com/office/word/2010/wordprocessingShape" mc:Ignorable="w14 w15 w16se w16cid w16 w16cex w16sdtdh w16du wp14">
   <w:p>
     <w:pPr>
       <w:rPr>
@@ -2677,7 +2512,7 @@
 </file>
 
 <file path=word/footnotes.xml><?xml version="1.0" encoding="utf-8"?>
-<w:footnotes xmlns:wpc="http://schemas.microsoft.com/office/word/2010/wordprocessingCanvas" xmlns:cx="http://schemas.microsoft.com/office/drawing/2014/chartex" xmlns:cx1="http://schemas.microsoft.com/office/drawing/2015/9/8/chartex" xmlns:cx2="http://schemas.microsoft.com/office/drawing/2015/10/21/chartex" xmlns:cx3="http://schemas.microsoft.com/office/drawing/2016/5/9/chartex" xmlns:cx4="http://schemas.microsoft.com/office/drawing/2016/5/10/chartex" xmlns:cx5="http://schemas.microsoft.com/office/drawing/2016/5/11/chartex" xmlns:cx6="http://schemas.microsoft.com/office/drawing/2016/5/12/chartex" xmlns:cx7="http://schemas.microsoft.com/office/drawing/2016/5/13/chartex" xmlns:cx8="http://schemas.microsoft.com/office/drawing/2016/5/14/chartex" xmlns:mc="http://schemas.openxmlformats.org/markup-compatibility/2006" xmlns:aink="http://schemas.microsoft.com/office/drawing/2016/ink" xmlns:am3d="http://schemas.microsoft.com/office/drawing/2017/model3d" xmlns:o="urn:schemas-microsoft-com:office:office" xmlns:oel="http://schemas.microsoft.com/office/2019/extlst" xmlns:r="http://schemas.openxmlformats.org/officeDocument/2006/relationships" xmlns:m="http://schemas.openxmlformats.org/officeDocument/2006/math" xmlns:v="urn:schemas-microsoft-com:vml" xmlns:wp14="http://schemas.microsoft.com/office/word/2010/wordprocessingDrawing" xmlns:wp="http://schemas.openxmlformats.org/drawingml/2006/wordprocessingDrawing" xmlns:w10="urn:schemas-microsoft-com:office:word" xmlns:w="http://schemas.openxmlformats.org/wordprocessingml/2006/main" xmlns:w14="http://schemas.microsoft.com/office/word/2010/wordml" xmlns:w15="http://schemas.microsoft.com/office/word/2012/wordml" xmlns:w16cex="http://schemas.microsoft.com/office/word/2018/wordml/cex" xmlns:w16cid="http://schemas.microsoft.com/office/word/2016/wordml/cid" xmlns:w16="http://schemas.microsoft.com/office/word/2018/wordml" xmlns:w16sdtdh="http://schemas.microsoft.com/office/word/2020/wordml/sdtdatahash" xmlns:w16se="http://schemas.microsoft.com/office/word/2015/wordml/symex" xmlns:wpg="http://schemas.microsoft.com/office/word/2010/wordprocessingGroup" xmlns:wpi="http://schemas.microsoft.com/office/word/2010/wordprocessingInk" xmlns:wne="http://schemas.microsoft.com/office/word/2006/wordml" xmlns:wps="http://schemas.microsoft.com/office/word/2010/wordprocessingShape" mc:Ignorable="w14 w15 w16se w16cid w16 w16cex w16sdtdh wp14">
+<w:footnotes xmlns:wpc="http://schemas.microsoft.com/office/word/2010/wordprocessingCanvas" xmlns:cx="http://schemas.microsoft.com/office/drawing/2014/chartex" xmlns:cx1="http://schemas.microsoft.com/office/drawing/2015/9/8/chartex" xmlns:cx2="http://schemas.microsoft.com/office/drawing/2015/10/21/chartex" xmlns:cx3="http://schemas.microsoft.com/office/drawing/2016/5/9/chartex" xmlns:cx4="http://schemas.microsoft.com/office/drawing/2016/5/10/chartex" xmlns:cx5="http://schemas.microsoft.com/office/drawing/2016/5/11/chartex" xmlns:cx6="http://schemas.microsoft.com/office/drawing/2016/5/12/chartex" xmlns:cx7="http://schemas.microsoft.com/office/drawing/2016/5/13/chartex" xmlns:cx8="http://schemas.microsoft.com/office/drawing/2016/5/14/chartex" xmlns:mc="http://schemas.openxmlformats.org/markup-compatibility/2006" xmlns:aink="http://schemas.microsoft.com/office/drawing/2016/ink" xmlns:am3d="http://schemas.microsoft.com/office/drawing/2017/model3d" xmlns:o="urn:schemas-microsoft-com:office:office" xmlns:oel="http://schemas.microsoft.com/office/2019/extlst" xmlns:r="http://schemas.openxmlformats.org/officeDocument/2006/relationships" xmlns:m="http://schemas.openxmlformats.org/officeDocument/2006/math" xmlns:v="urn:schemas-microsoft-com:vml" xmlns:wp14="http://schemas.microsoft.com/office/word/2010/wordprocessingDrawing" xmlns:wp="http://schemas.openxmlformats.org/drawingml/2006/wordprocessingDrawing" xmlns:w10="urn:schemas-microsoft-com:office:word" xmlns:w="http://schemas.openxmlformats.org/wordprocessingml/2006/main" xmlns:w14="http://schemas.microsoft.com/office/word/2010/wordml" xmlns:w15="http://schemas.microsoft.com/office/word/2012/wordml" xmlns:w16cex="http://schemas.microsoft.com/office/word/2018/wordml/cex" xmlns:w16cid="http://schemas.microsoft.com/office/word/2016/wordml/cid" xmlns:w16="http://schemas.microsoft.com/office/word/2018/wordml" xmlns:w16du="http://schemas.microsoft.com/office/word/2023/wordml/word16du" xmlns:w16sdtdh="http://schemas.microsoft.com/office/word/2020/wordml/sdtdatahash" xmlns:w16se="http://schemas.microsoft.com/office/word/2015/wordml/symex" xmlns:wpg="http://schemas.microsoft.com/office/word/2010/wordprocessingGroup" xmlns:wpi="http://schemas.microsoft.com/office/word/2010/wordprocessingInk" xmlns:wne="http://schemas.microsoft.com/office/word/2006/wordml" xmlns:wps="http://schemas.microsoft.com/office/word/2010/wordprocessingShape" mc:Ignorable="w14 w15 w16se w16cid w16 w16cex w16sdtdh w16du wp14">
   <w:footnote w:type="separator" w:id="-1">
     <w:p>
       <w:pPr>
@@ -2706,7 +2541,7 @@
 </file>
 
 <file path=word/numbering.xml><?xml version="1.0" encoding="utf-8"?>
-<w:numbering xmlns:wpc="http://schemas.microsoft.com/office/word/2010/wordprocessingCanvas" xmlns:cx="http://schemas.microsoft.com/office/drawing/2014/chartex" xmlns:cx1="http://schemas.microsoft.com/office/drawing/2015/9/8/chartex" xmlns:cx2="http://schemas.microsoft.com/office/drawing/2015/10/21/chartex" xmlns:cx3="http://schemas.microsoft.com/office/drawing/2016/5/9/chartex" xmlns:cx4="http://schemas.microsoft.com/office/drawing/2016/5/10/chartex" xmlns:cx5="http://schemas.microsoft.com/office/drawing/2016/5/11/chartex" xmlns:cx6="http://schemas.microsoft.com/office/drawing/2016/5/12/chartex" xmlns:cx7="http://schemas.microsoft.com/office/drawing/2016/5/13/chartex" xmlns:cx8="http://schemas.microsoft.com/office/drawing/2016/5/14/chartex" xmlns:mc="http://schemas.openxmlformats.org/markup-compatibility/2006" xmlns:aink="http://schemas.microsoft.com/office/drawing/2016/ink" xmlns:am3d="http://schemas.microsoft.com/office/drawing/2017/model3d" xmlns:o="urn:schemas-microsoft-com:office:office" xmlns:oel="http://schemas.microsoft.com/office/2019/extlst" xmlns:r="http://schemas.openxmlformats.org/officeDocument/2006/relationships" xmlns:m="http://schemas.openxmlformats.org/officeDocument/2006/math" xmlns:v="urn:schemas-microsoft-com:vml" xmlns:wp14="http://schemas.microsoft.com/office/word/2010/wordprocessingDrawing" xmlns:wp="http://schemas.openxmlformats.org/drawingml/2006/wordprocessingDrawing" xmlns:w10="urn:schemas-microsoft-com:office:word" xmlns:w="http://schemas.openxmlformats.org/wordprocessingml/2006/main" xmlns:w14="http://schemas.microsoft.com/office/word/2010/wordml" xmlns:w15="http://schemas.microsoft.com/office/word/2012/wordml" xmlns:w16cex="http://schemas.microsoft.com/office/word/2018/wordml/cex" xmlns:w16cid="http://schemas.microsoft.com/office/word/2016/wordml/cid" xmlns:w16="http://schemas.microsoft.com/office/word/2018/wordml" xmlns:w16sdtdh="http://schemas.microsoft.com/office/word/2020/wordml/sdtdatahash" xmlns:w16se="http://schemas.microsoft.com/office/word/2015/wordml/symex" xmlns:wpg="http://schemas.microsoft.com/office/word/2010/wordprocessingGroup" xmlns:wpi="http://schemas.microsoft.com/office/word/2010/wordprocessingInk" xmlns:wne="http://schemas.microsoft.com/office/word/2006/wordml" xmlns:wps="http://schemas.microsoft.com/office/word/2010/wordprocessingShape" mc:Ignorable="w14 w15 w16se w16cid w16 w16cex w16sdtdh wp14">
+<w:numbering xmlns:wpc="http://schemas.microsoft.com/office/word/2010/wordprocessingCanvas" xmlns:cx="http://schemas.microsoft.com/office/drawing/2014/chartex" xmlns:cx1="http://schemas.microsoft.com/office/drawing/2015/9/8/chartex" xmlns:cx2="http://schemas.microsoft.com/office/drawing/2015/10/21/chartex" xmlns:cx3="http://schemas.microsoft.com/office/drawing/2016/5/9/chartex" xmlns:cx4="http://schemas.microsoft.com/office/drawing/2016/5/10/chartex" xmlns:cx5="http://schemas.microsoft.com/office/drawing/2016/5/11/chartex" xmlns:cx6="http://schemas.microsoft.com/office/drawing/2016/5/12/chartex" xmlns:cx7="http://schemas.microsoft.com/office/drawing/2016/5/13/chartex" xmlns:cx8="http://schemas.microsoft.com/office/drawing/2016/5/14/chartex" xmlns:mc="http://schemas.openxmlformats.org/markup-compatibility/2006" xmlns:aink="http://schemas.microsoft.com/office/drawing/2016/ink" xmlns:am3d="http://schemas.microsoft.com/office/drawing/2017/model3d" xmlns:o="urn:schemas-microsoft-com:office:office" xmlns:oel="http://schemas.microsoft.com/office/2019/extlst" xmlns:r="http://schemas.openxmlformats.org/officeDocument/2006/relationships" xmlns:m="http://schemas.openxmlformats.org/officeDocument/2006/math" xmlns:v="urn:schemas-microsoft-com:vml" xmlns:wp14="http://schemas.microsoft.com/office/word/2010/wordprocessingDrawing" xmlns:wp="http://schemas.openxmlformats.org/drawingml/2006/wordprocessingDrawing" xmlns:w10="urn:schemas-microsoft-com:office:word" xmlns:w="http://schemas.openxmlformats.org/wordprocessingml/2006/main" xmlns:w14="http://schemas.microsoft.com/office/word/2010/wordml" xmlns:w15="http://schemas.microsoft.com/office/word/2012/wordml" xmlns:w16cex="http://schemas.microsoft.com/office/word/2018/wordml/cex" xmlns:w16cid="http://schemas.microsoft.com/office/word/2016/wordml/cid" xmlns:w16="http://schemas.microsoft.com/office/word/2018/wordml" xmlns:w16du="http://schemas.microsoft.com/office/word/2023/wordml/word16du" xmlns:w16sdtdh="http://schemas.microsoft.com/office/word/2020/wordml/sdtdatahash" xmlns:w16se="http://schemas.microsoft.com/office/word/2015/wordml/symex" xmlns:wpg="http://schemas.microsoft.com/office/word/2010/wordprocessingGroup" xmlns:wpi="http://schemas.microsoft.com/office/word/2010/wordprocessingInk" xmlns:wne="http://schemas.microsoft.com/office/word/2006/wordml" xmlns:wps="http://schemas.microsoft.com/office/word/2010/wordprocessingShape" mc:Ignorable="w14 w15 w16se w16cid w16 w16cex w16sdtdh w16du wp14">
   <w:abstractNum w:abstractNumId="0" w15:restartNumberingAfterBreak="0">
     <w:nsid w:val="00000001"/>
     <w:multiLevelType w:val="multilevel"/>
@@ -5719,7 +5554,7 @@
 </file>
 
 <file path=word/styles.xml><?xml version="1.0" encoding="utf-8"?>
-<w:styles xmlns:mc="http://schemas.openxmlformats.org/markup-compatibility/2006" xmlns:r="http://schemas.openxmlformats.org/officeDocument/2006/relationships" xmlns:w="http://schemas.openxmlformats.org/wordprocessingml/2006/main" xmlns:w14="http://schemas.microsoft.com/office/word/2010/wordml" xmlns:w15="http://schemas.microsoft.com/office/word/2012/wordml" xmlns:w16cex="http://schemas.microsoft.com/office/word/2018/wordml/cex" xmlns:w16cid="http://schemas.microsoft.com/office/word/2016/wordml/cid" xmlns:w16="http://schemas.microsoft.com/office/word/2018/wordml" xmlns:w16sdtdh="http://schemas.microsoft.com/office/word/2020/wordml/sdtdatahash" xmlns:w16se="http://schemas.microsoft.com/office/word/2015/wordml/symex" mc:Ignorable="w14 w15 w16se w16cid w16 w16cex w16sdtdh">
+<w:styles xmlns:mc="http://schemas.openxmlformats.org/markup-compatibility/2006" xmlns:r="http://schemas.openxmlformats.org/officeDocument/2006/relationships" xmlns:w="http://schemas.openxmlformats.org/wordprocessingml/2006/main" xmlns:w14="http://schemas.microsoft.com/office/word/2010/wordml" xmlns:w15="http://schemas.microsoft.com/office/word/2012/wordml" xmlns:w16cex="http://schemas.microsoft.com/office/word/2018/wordml/cex" xmlns:w16cid="http://schemas.microsoft.com/office/word/2016/wordml/cid" xmlns:w16="http://schemas.microsoft.com/office/word/2018/wordml" xmlns:w16du="http://schemas.microsoft.com/office/word/2023/wordml/word16du" xmlns:w16sdtdh="http://schemas.microsoft.com/office/word/2020/wordml/sdtdatahash" xmlns:w16se="http://schemas.microsoft.com/office/word/2015/wordml/symex" mc:Ignorable="w14 w15 w16se w16cid w16 w16cex w16sdtdh w16du">
   <w:docDefaults>
     <w:rPrDefault>
       <w:rPr>
@@ -6188,7 +6023,6 @@
   <w:style w:type="character" w:default="1" w:styleId="Standaardalinea-lettertype">
     <w:name w:val="Default Paragraph Font"/>
     <w:uiPriority w:val="1"/>
-    <w:semiHidden/>
     <w:unhideWhenUsed/>
   </w:style>
   <w:style w:type="table" w:default="1" w:styleId="Standaardtabel">

</xml_diff>

<commit_message>
ModbusImport and ModbusExport: now have -retries parameter. User manual updated.
git-svn-id: http://visualsvn.edna.local/EDNA/ModbusControl/V2@4888 03c8d257-35a7-c645-9f01-50f27e98b9e6
</commit_message>
<xml_diff>
--- a/Manuals/ModbusControl - Release notes.docx
+++ b/Manuals/ModbusControl - Release notes.docx
@@ -1,6 +1,6 @@
 
 <file path=word/document.xml><?xml version="1.0" encoding="utf-8"?>
-<w:document xmlns:wpc="http://schemas.microsoft.com/office/word/2010/wordprocessingCanvas" xmlns:cx="http://schemas.microsoft.com/office/drawing/2014/chartex" xmlns:cx1="http://schemas.microsoft.com/office/drawing/2015/9/8/chartex" xmlns:cx2="http://schemas.microsoft.com/office/drawing/2015/10/21/chartex" xmlns:cx3="http://schemas.microsoft.com/office/drawing/2016/5/9/chartex" xmlns:cx4="http://schemas.microsoft.com/office/drawing/2016/5/10/chartex" xmlns:cx5="http://schemas.microsoft.com/office/drawing/2016/5/11/chartex" xmlns:cx6="http://schemas.microsoft.com/office/drawing/2016/5/12/chartex" xmlns:cx7="http://schemas.microsoft.com/office/drawing/2016/5/13/chartex" xmlns:cx8="http://schemas.microsoft.com/office/drawing/2016/5/14/chartex" xmlns:mc="http://schemas.openxmlformats.org/markup-compatibility/2006" xmlns:aink="http://schemas.microsoft.com/office/drawing/2016/ink" xmlns:am3d="http://schemas.microsoft.com/office/drawing/2017/model3d" xmlns:o="urn:schemas-microsoft-com:office:office" xmlns:oel="http://schemas.microsoft.com/office/2019/extlst" xmlns:r="http://schemas.openxmlformats.org/officeDocument/2006/relationships" xmlns:m="http://schemas.openxmlformats.org/officeDocument/2006/math" xmlns:v="urn:schemas-microsoft-com:vml" xmlns:wp14="http://schemas.microsoft.com/office/word/2010/wordprocessingDrawing" xmlns:wp="http://schemas.openxmlformats.org/drawingml/2006/wordprocessingDrawing" xmlns:w10="urn:schemas-microsoft-com:office:word" xmlns:w="http://schemas.openxmlformats.org/wordprocessingml/2006/main" xmlns:w14="http://schemas.microsoft.com/office/word/2010/wordml" xmlns:w15="http://schemas.microsoft.com/office/word/2012/wordml" xmlns:w16cex="http://schemas.microsoft.com/office/word/2018/wordml/cex" xmlns:w16cid="http://schemas.microsoft.com/office/word/2016/wordml/cid" xmlns:w16="http://schemas.microsoft.com/office/word/2018/wordml" xmlns:w16du="http://schemas.microsoft.com/office/word/2023/wordml/word16du" xmlns:w16sdtdh="http://schemas.microsoft.com/office/word/2020/wordml/sdtdatahash" xmlns:w16se="http://schemas.microsoft.com/office/word/2015/wordml/symex" xmlns:wpg="http://schemas.microsoft.com/office/word/2010/wordprocessingGroup" xmlns:wpi="http://schemas.microsoft.com/office/word/2010/wordprocessingInk" xmlns:wne="http://schemas.microsoft.com/office/word/2006/wordml" xmlns:wps="http://schemas.microsoft.com/office/word/2010/wordprocessingShape" mc:Ignorable="w14 w15 w16se w16cid w16 w16cex w16sdtdh w16du wp14">
+<w:document xmlns:wpc="http://schemas.microsoft.com/office/word/2010/wordprocessingCanvas" xmlns:cx="http://schemas.microsoft.com/office/drawing/2014/chartex" xmlns:cx1="http://schemas.microsoft.com/office/drawing/2015/9/8/chartex" xmlns:cx2="http://schemas.microsoft.com/office/drawing/2015/10/21/chartex" xmlns:cx3="http://schemas.microsoft.com/office/drawing/2016/5/9/chartex" xmlns:cx4="http://schemas.microsoft.com/office/drawing/2016/5/10/chartex" xmlns:cx5="http://schemas.microsoft.com/office/drawing/2016/5/11/chartex" xmlns:cx6="http://schemas.microsoft.com/office/drawing/2016/5/12/chartex" xmlns:cx7="http://schemas.microsoft.com/office/drawing/2016/5/13/chartex" xmlns:cx8="http://schemas.microsoft.com/office/drawing/2016/5/14/chartex" xmlns:mc="http://schemas.openxmlformats.org/markup-compatibility/2006" xmlns:aink="http://schemas.microsoft.com/office/drawing/2016/ink" xmlns:am3d="http://schemas.microsoft.com/office/drawing/2017/model3d" xmlns:o="urn:schemas-microsoft-com:office:office" xmlns:oel="http://schemas.microsoft.com/office/2019/extlst" xmlns:r="http://schemas.openxmlformats.org/officeDocument/2006/relationships" xmlns:m="http://schemas.openxmlformats.org/officeDocument/2006/math" xmlns:v="urn:schemas-microsoft-com:vml" xmlns:wp14="http://schemas.microsoft.com/office/word/2010/wordprocessingDrawing" xmlns:wp="http://schemas.openxmlformats.org/drawingml/2006/wordprocessingDrawing" xmlns:w10="urn:schemas-microsoft-com:office:word" xmlns:w="http://schemas.openxmlformats.org/wordprocessingml/2006/main" xmlns:w14="http://schemas.microsoft.com/office/word/2010/wordml" xmlns:w15="http://schemas.microsoft.com/office/word/2012/wordml" xmlns:w16cex="http://schemas.microsoft.com/office/word/2018/wordml/cex" xmlns:w16cid="http://schemas.microsoft.com/office/word/2016/wordml/cid" xmlns:w16="http://schemas.microsoft.com/office/word/2018/wordml" xmlns:w16du="http://schemas.microsoft.com/office/word/2023/wordml/word16du" xmlns:w16sdtdh="http://schemas.microsoft.com/office/word/2020/wordml/sdtdatahash" xmlns:w16sdtfl="http://schemas.microsoft.com/office/word/2024/wordml/sdtformatlock" xmlns:w16se="http://schemas.microsoft.com/office/word/2015/wordml/symex" xmlns:wpg="http://schemas.microsoft.com/office/word/2010/wordprocessingGroup" xmlns:wpi="http://schemas.microsoft.com/office/word/2010/wordprocessingInk" xmlns:wne="http://schemas.microsoft.com/office/word/2006/wordml" xmlns:wps="http://schemas.microsoft.com/office/word/2010/wordprocessingShape" mc:Ignorable="w14 w15 w16se w16cid w16 w16cex w16sdtdh w16sdtfl w16du wp14">
   <w:body>
     <w:p>
       <w:pPr>
@@ -37,6 +37,183 @@
         <w:rPr>
           <w:color w:val="auto"/>
         </w:rPr>
+        <w:t>7</w:t>
+      </w:r>
+      <w:r>
+        <w:rPr>
+          <w:color w:val="auto"/>
+        </w:rPr>
+        <w:t xml:space="preserve"> – </w:t>
+      </w:r>
+    </w:p>
+    <w:p>
+      <w:pPr>
+        <w:pStyle w:val="Kop3"/>
+        <w:rPr>
+          <w:rFonts w:hint="eastAsia"/>
+        </w:rPr>
+      </w:pPr>
+      <w:r>
+        <w:t>Features</w:t>
+      </w:r>
+    </w:p>
+    <w:p>
+      <w:pPr>
+        <w:numPr>
+          <w:ilvl w:val="0"/>
+          <w:numId w:val="4"/>
+        </w:numPr>
+      </w:pPr>
+      <w:r>
+        <w:t>ModbusImport and ModbusExport now have a -retries parameter.</w:t>
+      </w:r>
+    </w:p>
+    <w:p>
+      <w:pPr>
+        <w:pStyle w:val="Kop3"/>
+        <w:numPr>
+          <w:ilvl w:val="0"/>
+          <w:numId w:val="0"/>
+        </w:numPr>
+        <w:ind w:left="680" w:hanging="431"/>
+        <w:rPr>
+          <w:rFonts w:hint="eastAsia"/>
+        </w:rPr>
+      </w:pPr>
+      <w:r>
+        <w:t>Fixes</w:t>
+      </w:r>
+    </w:p>
+    <w:p>
+      <w:pPr>
+        <w:numPr>
+          <w:ilvl w:val="0"/>
+          <w:numId w:val="4"/>
+        </w:numPr>
+        <w:rPr>
+          <w:rFonts w:hint="eastAsia"/>
+        </w:rPr>
+      </w:pPr>
+      <w:r>
+        <w:rPr>
+          <w:rFonts w:hint="eastAsia"/>
+        </w:rPr>
+        <w:t xml:space="preserve">ModbusImport: CSV </w:t>
+      </w:r>
+      <w:r>
+        <w:t xml:space="preserve">file </w:t>
+      </w:r>
+      <w:r>
+        <w:rPr>
+          <w:rFonts w:hint="eastAsia"/>
+        </w:rPr>
+        <w:t xml:space="preserve">errors </w:t>
+      </w:r>
+      <w:r>
+        <w:t>were not counted when using the -</w:t>
+      </w:r>
+      <w:r>
+        <w:rPr>
+          <w:rFonts w:hint="eastAsia"/>
+        </w:rPr>
+        <w:t xml:space="preserve">verbose </w:t>
+      </w:r>
+      <w:r>
+        <w:t xml:space="preserve">and </w:t>
+      </w:r>
+      <w:r>
+        <w:br/>
+        <w:t>-</w:t>
+      </w:r>
+      <w:proofErr w:type="spellStart"/>
+      <w:r>
+        <w:rPr>
+          <w:rFonts w:hint="eastAsia"/>
+        </w:rPr>
+        <w:t>continueonerror</w:t>
+      </w:r>
+      <w:proofErr w:type="spellEnd"/>
+      <w:r>
+        <w:t xml:space="preserve"> options.</w:t>
+      </w:r>
+      <w:r>
+        <w:t xml:space="preserve"> Always show counters, not only in -verbose mode.</w:t>
+      </w:r>
+    </w:p>
+    <w:p>
+      <w:pPr>
+        <w:numPr>
+          <w:ilvl w:val="0"/>
+          <w:numId w:val="4"/>
+        </w:numPr>
+        <w:rPr>
+          <w:rFonts w:hint="eastAsia"/>
+        </w:rPr>
+      </w:pPr>
+      <w:r>
+        <w:rPr>
+          <w:rFonts w:hint="eastAsia"/>
+        </w:rPr>
+        <w:t xml:space="preserve">ModbusExport: </w:t>
+      </w:r>
+      <w:r>
+        <w:t>“I</w:t>
+      </w:r>
+      <w:r>
+        <w:rPr>
+          <w:rFonts w:hint="eastAsia"/>
+        </w:rPr>
+        <w:t>llegal function</w:t>
+      </w:r>
+      <w:r>
+        <w:t>”</w:t>
+      </w:r>
+      <w:r>
+        <w:t xml:space="preserve"> </w:t>
+      </w:r>
+      <w:r>
+        <w:t>er</w:t>
+      </w:r>
+      <w:r>
+        <w:t xml:space="preserve">rors </w:t>
+      </w:r>
+      <w:r>
+        <w:t>were not counted in the er</w:t>
+      </w:r>
+      <w:r>
+        <w:t>ror counter</w:t>
+      </w:r>
+      <w:r>
+        <w:rPr>
+          <w:rFonts w:hint="eastAsia"/>
+        </w:rPr>
+        <w:t xml:space="preserve">. </w:t>
+      </w:r>
+      <w:r>
+        <w:t>Always show counters, not only in -verbose mode.</w:t>
+      </w:r>
+    </w:p>
+    <w:p>
+      <w:pPr>
+        <w:pStyle w:val="Kop1"/>
+        <w:rPr>
+          <w:rFonts w:hint="eastAsia"/>
+          <w:color w:val="auto"/>
+        </w:rPr>
+      </w:pPr>
+      <w:r>
+        <w:t>v2.0.</w:t>
+      </w:r>
+      <w:r>
+        <w:rPr>
+          <w:color w:val="auto"/>
+        </w:rPr>
+        <w:t>1</w:t>
+      </w:r>
+      <w:r>
+        <w:rPr>
+          <w:color w:val="auto"/>
+        </w:rPr>
         <w:t>6</w:t>
       </w:r>
       <w:r>
@@ -158,7 +335,15 @@
         </w:rPr>
       </w:pPr>
       <w:r>
-        <w:t>Mbc file: &lt;exportorder&gt; element added.</w:t>
+        <w:t>Mbc file: &lt;</w:t>
+      </w:r>
+      <w:proofErr w:type="spellStart"/>
+      <w:r>
+        <w:t>exportorder</w:t>
+      </w:r>
+      <w:proofErr w:type="spellEnd"/>
+      <w:r>
+        <w:t>&gt; element added.</w:t>
       </w:r>
     </w:p>
     <w:p>
@@ -252,12 +437,14 @@
           <w:rFonts w:hint="eastAsia"/>
         </w:rPr>
       </w:pPr>
+      <w:proofErr w:type="spellStart"/>
       <w:r>
         <w:rPr>
           <w:rFonts w:hint="eastAsia"/>
         </w:rPr>
         <w:t>WriteHoldingregisterFC</w:t>
       </w:r>
+      <w:proofErr w:type="spellEnd"/>
       <w:r>
         <w:t xml:space="preserve"> </w:t>
       </w:r>
@@ -391,7 +578,21 @@
         <w:rPr>
           <w:rFonts w:hint="eastAsia"/>
         </w:rPr>
-        <w:t>Enum registers editing now has a dropdown combobox with possible values.</w:t>
+        <w:t xml:space="preserve">Enum registers editing now has a dropdown </w:t>
+      </w:r>
+      <w:proofErr w:type="spellStart"/>
+      <w:r>
+        <w:rPr>
+          <w:rFonts w:hint="eastAsia"/>
+        </w:rPr>
+        <w:t>combobox</w:t>
+      </w:r>
+      <w:proofErr w:type="spellEnd"/>
+      <w:r>
+        <w:rPr>
+          <w:rFonts w:hint="eastAsia"/>
+        </w:rPr>
+        <w:t xml:space="preserve"> with possible values.</w:t>
       </w:r>
     </w:p>
     <w:p>
@@ -518,7 +719,23 @@
         </w:rPr>
       </w:pPr>
       <w:r>
-        <w:t xml:space="preserve">In Import_file and Import_compare: writing/comparing a float32 </w:t>
+        <w:t xml:space="preserve">In </w:t>
+      </w:r>
+      <w:proofErr w:type="spellStart"/>
+      <w:r>
+        <w:t>Import_file</w:t>
+      </w:r>
+      <w:proofErr w:type="spellEnd"/>
+      <w:r>
+        <w:t xml:space="preserve"> and </w:t>
+      </w:r>
+      <w:proofErr w:type="spellStart"/>
+      <w:r>
+        <w:t>Import_compare</w:t>
+      </w:r>
+      <w:proofErr w:type="spellEnd"/>
+      <w:r>
+        <w:t xml:space="preserve">: writing/comparing a float32 </w:t>
       </w:r>
       <w:r>
         <w:t xml:space="preserve">value </w:t>
@@ -563,6 +780,7 @@
         <w:rPr>
           <w:rFonts w:hint="eastAsia"/>
         </w:rPr>
+        <w:lastRenderedPageBreak/>
         <w:t xml:space="preserve">Resizing column width is now </w:t>
       </w:r>
       <w:r>
@@ -617,7 +835,35 @@
         <w:rPr>
           <w:rFonts w:hint="eastAsia"/>
         </w:rPr>
-        <w:t>You can now close the [Project_Configuration], [Save_project_file] and [About] forms with the ESC button</w:t>
+        <w:t>You can now close the [</w:t>
+      </w:r>
+      <w:proofErr w:type="spellStart"/>
+      <w:r>
+        <w:rPr>
+          <w:rFonts w:hint="eastAsia"/>
+        </w:rPr>
+        <w:t>Project_Configuration</w:t>
+      </w:r>
+      <w:proofErr w:type="spellEnd"/>
+      <w:r>
+        <w:rPr>
+          <w:rFonts w:hint="eastAsia"/>
+        </w:rPr>
+        <w:t>], [</w:t>
+      </w:r>
+      <w:proofErr w:type="spellStart"/>
+      <w:r>
+        <w:rPr>
+          <w:rFonts w:hint="eastAsia"/>
+        </w:rPr>
+        <w:t>Save_project_file</w:t>
+      </w:r>
+      <w:proofErr w:type="spellEnd"/>
+      <w:r>
+        <w:rPr>
+          <w:rFonts w:hint="eastAsia"/>
+        </w:rPr>
+        <w:t>] and [About] forms with the ESC button</w:t>
       </w:r>
       <w:r>
         <w:t xml:space="preserve"> too</w:t>
@@ -689,7 +935,35 @@
         <w:rPr>
           <w:rFonts w:hint="eastAsia"/>
         </w:rPr>
-        <w:t>With Import_file and Import_compare: writing/compar</w:t>
+        <w:t xml:space="preserve">With </w:t>
+      </w:r>
+      <w:proofErr w:type="spellStart"/>
+      <w:r>
+        <w:rPr>
+          <w:rFonts w:hint="eastAsia"/>
+        </w:rPr>
+        <w:t>Import_file</w:t>
+      </w:r>
+      <w:proofErr w:type="spellEnd"/>
+      <w:r>
+        <w:rPr>
+          <w:rFonts w:hint="eastAsia"/>
+        </w:rPr>
+        <w:t xml:space="preserve"> and </w:t>
+      </w:r>
+      <w:proofErr w:type="spellStart"/>
+      <w:r>
+        <w:rPr>
+          <w:rFonts w:hint="eastAsia"/>
+        </w:rPr>
+        <w:t>Import_compare</w:t>
+      </w:r>
+      <w:proofErr w:type="spellEnd"/>
+      <w:r>
+        <w:rPr>
+          <w:rFonts w:hint="eastAsia"/>
+        </w:rPr>
+        <w:t>: writing/compar</w:t>
       </w:r>
       <w:r>
         <w:t>ing</w:t>
@@ -718,8 +992,594 @@
         </w:rPr>
       </w:pPr>
       <w:r>
+        <w:t>v2.0.14 -- 2022-11-08</w:t>
+      </w:r>
+    </w:p>
+    <w:p>
+      <w:pPr>
+        <w:pStyle w:val="Kop3"/>
+        <w:rPr>
+          <w:rFonts w:hint="eastAsia"/>
+        </w:rPr>
+      </w:pPr>
+      <w:r>
+        <w:t>Features</w:t>
+      </w:r>
+    </w:p>
+    <w:p>
+      <w:pPr>
+        <w:numPr>
+          <w:ilvl w:val="0"/>
+          <w:numId w:val="4"/>
+        </w:numPr>
+        <w:rPr>
+          <w:rFonts w:hint="eastAsia"/>
+        </w:rPr>
+      </w:pPr>
+      <w:r>
+        <w:t xml:space="preserve">Added command line parameters. </w:t>
+      </w:r>
+      <w:r>
+        <w:t>These r</w:t>
+      </w:r>
+      <w:r>
+        <w:t xml:space="preserve">eplaces </w:t>
+      </w:r>
+      <w:r>
+        <w:t xml:space="preserve">the </w:t>
+      </w:r>
+      <w:r>
+        <w:t>LocalOverrides</w:t>
+      </w:r>
+      <w:r>
+        <w:t xml:space="preserve"> mechanism.</w:t>
+      </w:r>
+    </w:p>
+    <w:p>
+      <w:pPr>
+        <w:numPr>
+          <w:ilvl w:val="0"/>
+          <w:numId w:val="4"/>
+        </w:numPr>
+        <w:rPr>
+          <w:rFonts w:hint="eastAsia"/>
+        </w:rPr>
+      </w:pPr>
+      <w:r>
+        <w:t xml:space="preserve">LocalOverrides </w:t>
+      </w:r>
+      <w:r>
+        <w:t>mechanism removed.</w:t>
+      </w:r>
+    </w:p>
+    <w:p>
+      <w:pPr>
+        <w:numPr>
+          <w:ilvl w:val="0"/>
+          <w:numId w:val="4"/>
+        </w:numPr>
+        <w:rPr>
+          <w:rFonts w:hint="eastAsia"/>
+        </w:rPr>
+      </w:pPr>
+      <w:r>
+        <w:t>Save project file: the [Update XML to current version] checkbox is now enabled by default.</w:t>
+      </w:r>
+    </w:p>
+    <w:p>
+      <w:pPr>
+        <w:numPr>
+          <w:ilvl w:val="0"/>
+          <w:numId w:val="4"/>
+        </w:numPr>
+        <w:rPr>
+          <w:rFonts w:hint="eastAsia"/>
+        </w:rPr>
+      </w:pPr>
+      <w:r>
+        <w:t>Options form: tooltips improved.</w:t>
+      </w:r>
+    </w:p>
+    <w:p>
+      <w:pPr>
+        <w:numPr>
+          <w:ilvl w:val="0"/>
+          <w:numId w:val="4"/>
+        </w:numPr>
+        <w:rPr>
+          <w:rFonts w:hint="eastAsia"/>
+        </w:rPr>
+      </w:pPr>
+      <w:r>
+        <w:t>Grid: Regist</w:t>
+      </w:r>
+      <w:r>
+        <w:t>er</w:t>
+      </w:r>
+      <w:r>
+        <w:t xml:space="preserve"> </w:t>
+      </w:r>
+      <w:r>
+        <w:t xml:space="preserve">column menu now has </w:t>
+      </w:r>
+      <w:r>
+        <w:t xml:space="preserve"> [</w:t>
+      </w:r>
+      <w:r>
+        <w:t>Expand all]</w:t>
+      </w:r>
+      <w:r>
+        <w:t xml:space="preserve"> and </w:t>
+      </w:r>
+      <w:r>
+        <w:t>[</w:t>
+      </w:r>
+      <w:r>
+        <w:t>Collapse all</w:t>
+      </w:r>
+      <w:r>
+        <w:t>].</w:t>
+      </w:r>
+    </w:p>
+    <w:p>
+      <w:pPr>
+        <w:numPr>
+          <w:ilvl w:val="0"/>
+          <w:numId w:val="4"/>
+        </w:numPr>
+        <w:rPr>
+          <w:rFonts w:hint="eastAsia"/>
+        </w:rPr>
+      </w:pPr>
+      <w:r>
+        <w:t>Mbc project file: &lt;</w:t>
+      </w:r>
+      <w:proofErr w:type="spellStart"/>
+      <w:r>
+        <w:t>longdescr</w:t>
+      </w:r>
+      <w:proofErr w:type="spellEnd"/>
+      <w:r>
+        <w:t xml:space="preserve">&gt; </w:t>
+      </w:r>
+      <w:r>
+        <w:t xml:space="preserve">element </w:t>
+      </w:r>
+      <w:r>
+        <w:t xml:space="preserve">added. </w:t>
+      </w:r>
+      <w:r>
+        <w:t xml:space="preserve">Adds a long multiline text that is show when the mouse is hoovered over the register </w:t>
+      </w:r>
+      <w:proofErr w:type="spellStart"/>
+      <w:r>
+        <w:t>decription</w:t>
+      </w:r>
+      <w:proofErr w:type="spellEnd"/>
+      <w:r>
+        <w:t>.</w:t>
+      </w:r>
+    </w:p>
+    <w:p>
+      <w:pPr>
+        <w:numPr>
+          <w:ilvl w:val="0"/>
+          <w:numId w:val="4"/>
+        </w:numPr>
+        <w:rPr>
+          <w:rFonts w:hint="eastAsia"/>
+        </w:rPr>
+      </w:pPr>
+      <w:r>
+        <w:t>Mbc project file: &lt;include&gt; element added.</w:t>
+      </w:r>
+    </w:p>
+    <w:p>
+      <w:pPr>
+        <w:pStyle w:val="Kop3"/>
+        <w:numPr>
+          <w:ilvl w:val="0"/>
+          <w:numId w:val="0"/>
+        </w:numPr>
+        <w:ind w:left="680" w:hanging="431"/>
+        <w:rPr>
+          <w:rFonts w:hint="eastAsia"/>
+        </w:rPr>
+      </w:pPr>
+      <w:r>
+        <w:t>Fixes</w:t>
+      </w:r>
+    </w:p>
+    <w:p>
+      <w:pPr>
+        <w:numPr>
+          <w:ilvl w:val="0"/>
+          <w:numId w:val="4"/>
+        </w:numPr>
+        <w:rPr>
+          <w:rFonts w:hint="eastAsia"/>
+        </w:rPr>
+      </w:pPr>
+      <w:r>
+        <w:t>[</w:t>
+      </w:r>
+      <w:r>
+        <w:t>Open project file location in Explorer] now works if you gave a filename without a path on the command line.</w:t>
+      </w:r>
+    </w:p>
+    <w:p>
+      <w:pPr>
+        <w:numPr>
+          <w:ilvl w:val="0"/>
+          <w:numId w:val="4"/>
+        </w:numPr>
+        <w:rPr>
+          <w:rFonts w:hint="eastAsia"/>
+        </w:rPr>
+      </w:pPr>
+      <w:r>
+        <w:t xml:space="preserve">The temporary red </w:t>
+      </w:r>
+      <w:r>
+        <w:t>colouring</w:t>
+      </w:r>
+      <w:r>
+        <w:t xml:space="preserve"> of the value field after entering </w:t>
+      </w:r>
+      <w:r>
+        <w:t xml:space="preserve">an invalid value </w:t>
+      </w:r>
+      <w:r>
+        <w:t>has been improved.</w:t>
+      </w:r>
+    </w:p>
+    <w:p>
+      <w:pPr>
+        <w:numPr>
+          <w:ilvl w:val="0"/>
+          <w:numId w:val="4"/>
+        </w:numPr>
+        <w:rPr>
+          <w:rFonts w:hint="eastAsia"/>
+        </w:rPr>
+      </w:pPr>
+      <w:r>
+        <w:t>Edit</w:t>
+      </w:r>
+      <w:r>
+        <w:t xml:space="preserve"> enter/escape </w:t>
+      </w:r>
+      <w:r>
+        <w:t>handling is improved</w:t>
+      </w:r>
+      <w:r>
+        <w:t>.</w:t>
+      </w:r>
+    </w:p>
+    <w:p>
+      <w:pPr>
+        <w:numPr>
+          <w:ilvl w:val="0"/>
+          <w:numId w:val="4"/>
+        </w:numPr>
+        <w:rPr>
+          <w:rFonts w:hint="eastAsia"/>
+        </w:rPr>
+      </w:pPr>
+      <w:r>
+        <w:t xml:space="preserve">In the notification screen that the serial port could not be opened: the [Port] </w:t>
+      </w:r>
+      <w:r>
+        <w:t>combo box</w:t>
+      </w:r>
+      <w:r>
+        <w:t xml:space="preserve"> now automatically refreshes the list of serial ports.</w:t>
+      </w:r>
+    </w:p>
+    <w:p>
+      <w:pPr>
+        <w:pStyle w:val="Kop1"/>
+        <w:rPr>
+          <w:rFonts w:hint="eastAsia"/>
+        </w:rPr>
+      </w:pPr>
+      <w:r>
+        <w:t>v2.0.13 -- 2022-07-11</w:t>
+      </w:r>
+    </w:p>
+    <w:p>
+      <w:pPr>
+        <w:pStyle w:val="Kop3"/>
+        <w:rPr>
+          <w:rFonts w:hint="eastAsia"/>
+        </w:rPr>
+      </w:pPr>
+      <w:r>
+        <w:t>Features</w:t>
+      </w:r>
+    </w:p>
+    <w:p>
+      <w:pPr>
+        <w:numPr>
+          <w:ilvl w:val="0"/>
+          <w:numId w:val="4"/>
+        </w:numPr>
+        <w:rPr>
+          <w:rFonts w:hint="eastAsia"/>
+        </w:rPr>
+      </w:pPr>
+      <w:r>
+        <w:t xml:space="preserve">Added Find/Filter bar. </w:t>
+      </w:r>
+      <w:r>
+        <w:t>Open it using</w:t>
+      </w:r>
+      <w:r>
+        <w:t xml:space="preserve"> Control-F. There is also an option </w:t>
+      </w:r>
+      <w:r>
+        <w:t>“</w:t>
+      </w:r>
+      <w:r>
+        <w:t>Clear Find/Filter on tab change</w:t>
+      </w:r>
+      <w:r>
+        <w:t>”</w:t>
+      </w:r>
+      <w:r>
+        <w:t>.</w:t>
+      </w:r>
+    </w:p>
+    <w:p>
+      <w:pPr>
+        <w:numPr>
+          <w:ilvl w:val="0"/>
+          <w:numId w:val="4"/>
+        </w:numPr>
+        <w:rPr>
+          <w:rFonts w:hint="eastAsia"/>
+        </w:rPr>
+      </w:pPr>
+      <w:r>
+        <w:t>The properties of a register (</w:t>
+      </w:r>
+      <w:proofErr w:type="spellStart"/>
+      <w:r>
+        <w:t>rw</w:t>
+      </w:r>
+      <w:proofErr w:type="spellEnd"/>
+      <w:r>
+        <w:t xml:space="preserve">, int32, ...) are now displayed in a separate </w:t>
+      </w:r>
+      <w:r>
+        <w:t>[</w:t>
+      </w:r>
+      <w:r>
+        <w:t>Properties</w:t>
+      </w:r>
+      <w:r>
+        <w:t>]</w:t>
+      </w:r>
+      <w:r>
+        <w:t xml:space="preserve"> column</w:t>
+      </w:r>
+      <w:r>
+        <w:t xml:space="preserve"> instead of being added to </w:t>
+      </w:r>
+      <w:r>
+        <w:t xml:space="preserve">the </w:t>
+      </w:r>
+      <w:r>
+        <w:t>[</w:t>
+      </w:r>
+      <w:r>
+        <w:t>Description</w:t>
+      </w:r>
+      <w:r>
+        <w:t>]</w:t>
+      </w:r>
+      <w:r>
+        <w:t xml:space="preserve"> column. </w:t>
+      </w:r>
+      <w:r>
+        <w:t>The [Properties]  column can be e</w:t>
+      </w:r>
+      <w:r>
+        <w:t>nable/disable</w:t>
+      </w:r>
+      <w:r>
+        <w:t>d</w:t>
+      </w:r>
+      <w:r>
+        <w:t xml:space="preserve"> in Options.</w:t>
+      </w:r>
+    </w:p>
+    <w:p>
+      <w:pPr>
+        <w:numPr>
+          <w:ilvl w:val="0"/>
+          <w:numId w:val="4"/>
+        </w:numPr>
+        <w:rPr>
+          <w:rFonts w:hint="eastAsia"/>
+        </w:rPr>
+      </w:pPr>
+      <w:r>
+        <w:t>The Description text can now be multi-line</w:t>
+      </w:r>
+      <w:r>
+        <w:t>, i</w:t>
+      </w:r>
+      <w:r>
+        <w:t xml:space="preserve">f  the </w:t>
+      </w:r>
+      <w:r>
+        <w:t>“</w:t>
+      </w:r>
+      <w:r>
+        <w:t>Multiline rows with auto row size</w:t>
+      </w:r>
+      <w:r>
+        <w:t>”</w:t>
+      </w:r>
+      <w:r>
+        <w:t xml:space="preserve"> option </w:t>
+      </w:r>
+      <w:r>
+        <w:t>is enabled</w:t>
+      </w:r>
+      <w:r>
+        <w:t xml:space="preserve">. A </w:t>
+      </w:r>
+      <w:r>
+        <w:t xml:space="preserve">long </w:t>
+      </w:r>
+      <w:r>
+        <w:t xml:space="preserve">description </w:t>
+      </w:r>
+      <w:r>
+        <w:t>text is wrappe</w:t>
+      </w:r>
+      <w:r>
+        <w:t xml:space="preserve">d. </w:t>
+      </w:r>
+      <w:r>
+        <w:t>CR/LF</w:t>
+      </w:r>
+      <w:r>
+        <w:t xml:space="preserve">’s can be used in the description text. </w:t>
+      </w:r>
+      <w:r>
+        <w:t xml:space="preserve">The row height of the grid is automatically adjusted to the text. </w:t>
+      </w:r>
+    </w:p>
+    <w:p>
+      <w:pPr>
+        <w:numPr>
+          <w:ilvl w:val="0"/>
+          <w:numId w:val="4"/>
+        </w:numPr>
+        <w:rPr>
+          <w:rFonts w:hint="eastAsia"/>
+        </w:rPr>
+      </w:pPr>
+      <w:r>
+        <w:t>"Move to next row on Enter"</w:t>
+      </w:r>
+      <w:r>
+        <w:t xml:space="preserve"> option</w:t>
+      </w:r>
+      <w:r>
+        <w:t xml:space="preserve">: depending on this option, after entering a new value with the Enter key, the </w:t>
+      </w:r>
+      <w:r>
+        <w:t>cursor</w:t>
+      </w:r>
+      <w:r>
+        <w:t xml:space="preserve"> may or may not go to the next line. </w:t>
+      </w:r>
+      <w:r>
+        <w:t xml:space="preserve">Enter a value with </w:t>
+      </w:r>
+      <w:r>
+        <w:t>Control-Enter</w:t>
+      </w:r>
+      <w:r>
+        <w:t xml:space="preserve"> to get the</w:t>
+      </w:r>
+      <w:r>
+        <w:t xml:space="preserve"> opposite</w:t>
+      </w:r>
+      <w:r>
+        <w:t xml:space="preserve"> behaviour.</w:t>
+      </w:r>
+    </w:p>
+    <w:p>
+      <w:pPr>
+        <w:pStyle w:val="Kop3"/>
+        <w:numPr>
+          <w:ilvl w:val="0"/>
+          <w:numId w:val="0"/>
+        </w:numPr>
+        <w:ind w:left="680" w:hanging="431"/>
+        <w:rPr>
+          <w:rFonts w:hint="eastAsia"/>
+        </w:rPr>
+      </w:pPr>
+      <w:r>
+        <w:t>Fixes</w:t>
+      </w:r>
+    </w:p>
+    <w:p>
+      <w:pPr>
+        <w:numPr>
+          <w:ilvl w:val="0"/>
+          <w:numId w:val="5"/>
+        </w:numPr>
+        <w:rPr>
+          <w:rFonts w:hint="eastAsia"/>
+        </w:rPr>
+      </w:pPr>
+      <w:r>
+        <w:t>Control-0 for zoom reset now works globally on the form, not just when the focus is in the grid.</w:t>
+      </w:r>
+    </w:p>
+    <w:p>
+      <w:pPr>
+        <w:numPr>
+          <w:ilvl w:val="0"/>
+          <w:numId w:val="5"/>
+        </w:numPr>
+        <w:rPr>
+          <w:rFonts w:hint="eastAsia"/>
+        </w:rPr>
+      </w:pPr>
+      <w:r>
+        <w:t>R</w:t>
+      </w:r>
+      <w:r>
+        <w:t>ight-click</w:t>
+      </w:r>
+      <w:r>
+        <w:t>ing</w:t>
+      </w:r>
+      <w:r>
+        <w:t xml:space="preserve"> in the grid</w:t>
+      </w:r>
+      <w:r>
+        <w:t xml:space="preserve"> now moves the focus to that row, to </w:t>
+      </w:r>
+      <w:r>
+        <w:t>better see which row you are working on.</w:t>
+      </w:r>
+    </w:p>
+    <w:p>
+      <w:pPr>
+        <w:numPr>
+          <w:ilvl w:val="0"/>
+          <w:numId w:val="5"/>
+        </w:numPr>
+        <w:rPr>
+          <w:rFonts w:hint="eastAsia"/>
+        </w:rPr>
+      </w:pPr>
+      <w:r>
         <w:lastRenderedPageBreak/>
-        <w:t>v2.0.14 -- 2022-11-08</w:t>
+        <w:t>Migrated</w:t>
+      </w:r>
+      <w:r>
+        <w:t xml:space="preserve"> to .NET framework 4.7.2.</w:t>
+      </w:r>
+    </w:p>
+    <w:p>
+      <w:pPr>
+        <w:pStyle w:val="Kop1"/>
+        <w:rPr>
+          <w:rFonts w:hint="eastAsia"/>
+        </w:rPr>
+      </w:pPr>
+      <w:r>
+        <w:t>v2.0.12 -- 2020-07-13</w:t>
       </w:r>
     </w:p>
     <w:p>
@@ -737,138 +1597,888 @@
       <w:pPr>
         <w:numPr>
           <w:ilvl w:val="0"/>
-          <w:numId w:val="4"/>
-        </w:numPr>
-        <w:rPr>
-          <w:rFonts w:hint="eastAsia"/>
-        </w:rPr>
-      </w:pPr>
-      <w:r>
-        <w:t xml:space="preserve">Added command line parameters. </w:t>
-      </w:r>
-      <w:r>
-        <w:t>These r</w:t>
-      </w:r>
-      <w:r>
-        <w:t xml:space="preserve">eplaces </w:t>
+          <w:numId w:val="6"/>
+        </w:numPr>
+        <w:rPr>
+          <w:rFonts w:hint="eastAsia"/>
+        </w:rPr>
+      </w:pPr>
+      <w:r>
+        <w:t>Added mbc project file validation with XSD schema</w:t>
+      </w:r>
+      <w:r>
+        <w:t xml:space="preserve"> file</w:t>
+      </w:r>
+      <w:r>
+        <w:t xml:space="preserve">. </w:t>
+      </w:r>
+      <w:r>
+        <w:t xml:space="preserve">Validation is optional. </w:t>
+      </w:r>
+      <w:r>
+        <w:t>The validation only allows lower-case XML tags</w:t>
+      </w:r>
+      <w:r>
+        <w:t>, a</w:t>
+      </w:r>
+      <w:r>
+        <w:t xml:space="preserve">nd only allows the XML elements that are supported in this version. The intention is that over time all mbc files will </w:t>
+      </w:r>
+      <w:r>
+        <w:t>migrate</w:t>
+      </w:r>
+      <w:r>
+        <w:t xml:space="preserve"> to meet the validation.</w:t>
+      </w:r>
+    </w:p>
+    <w:p>
+      <w:pPr>
+        <w:numPr>
+          <w:ilvl w:val="0"/>
+          <w:numId w:val="6"/>
+        </w:numPr>
+        <w:rPr>
+          <w:rFonts w:hint="eastAsia"/>
+        </w:rPr>
+      </w:pPr>
+      <w:r>
+        <w:t>In</w:t>
+      </w:r>
+      <w:r>
+        <w:t xml:space="preserve"> </w:t>
       </w:r>
       <w:r>
         <w:t xml:space="preserve">the </w:t>
       </w:r>
       <w:r>
-        <w:t>LocalOverrides</w:t>
-      </w:r>
-      <w:r>
-        <w:t xml:space="preserve"> mechanism.</w:t>
-      </w:r>
-    </w:p>
-    <w:p>
-      <w:pPr>
-        <w:numPr>
-          <w:ilvl w:val="0"/>
-          <w:numId w:val="4"/>
-        </w:numPr>
-        <w:rPr>
-          <w:rFonts w:hint="eastAsia"/>
-        </w:rPr>
-      </w:pPr>
-      <w:r>
-        <w:t xml:space="preserve">LocalOverrides </w:t>
-      </w:r>
-      <w:r>
-        <w:t>mechanism removed.</w:t>
-      </w:r>
-    </w:p>
-    <w:p>
-      <w:pPr>
-        <w:numPr>
-          <w:ilvl w:val="0"/>
-          <w:numId w:val="4"/>
-        </w:numPr>
-        <w:rPr>
-          <w:rFonts w:hint="eastAsia"/>
-        </w:rPr>
-      </w:pPr>
-      <w:r>
-        <w:t>Save project file: the [Update XML to current version] checkbox is now enabled by default.</w:t>
-      </w:r>
-    </w:p>
-    <w:p>
-      <w:pPr>
-        <w:numPr>
-          <w:ilvl w:val="0"/>
-          <w:numId w:val="4"/>
-        </w:numPr>
-        <w:rPr>
-          <w:rFonts w:hint="eastAsia"/>
-        </w:rPr>
-      </w:pPr>
-      <w:r>
-        <w:t>Options form: tooltips improved.</w:t>
-      </w:r>
-    </w:p>
-    <w:p>
-      <w:pPr>
-        <w:numPr>
-          <w:ilvl w:val="0"/>
-          <w:numId w:val="4"/>
-        </w:numPr>
-        <w:rPr>
-          <w:rFonts w:hint="eastAsia"/>
-        </w:rPr>
-      </w:pPr>
-      <w:r>
-        <w:t>Grid: Regist</w:t>
-      </w:r>
-      <w:r>
-        <w:t>er</w:t>
+        <w:t xml:space="preserve">"Save project file" </w:t>
+      </w:r>
+      <w:r>
+        <w:t xml:space="preserve">form </w:t>
+      </w:r>
+      <w:r>
+        <w:t xml:space="preserve">you now have the option to update the XML with "Update XML to current version" so that it then passes the validation. </w:t>
+      </w:r>
+      <w:r>
+        <w:t>E</w:t>
+      </w:r>
+      <w:r>
+        <w:t>rrors must be corrected manually.</w:t>
+      </w:r>
+    </w:p>
+    <w:p>
+      <w:pPr>
+        <w:numPr>
+          <w:ilvl w:val="0"/>
+          <w:numId w:val="6"/>
+        </w:numPr>
+        <w:rPr>
+          <w:rFonts w:hint="eastAsia"/>
+        </w:rPr>
+      </w:pPr>
+      <w:r>
+        <w:t>In</w:t>
+      </w:r>
+      <w:r>
+        <w:t xml:space="preserve"> "Save project file" the project file is now saved with XML formatting.</w:t>
+      </w:r>
+    </w:p>
+    <w:p>
+      <w:pPr>
+        <w:numPr>
+          <w:ilvl w:val="0"/>
+          <w:numId w:val="6"/>
+        </w:numPr>
+        <w:rPr>
+          <w:rFonts w:hint="eastAsia"/>
+        </w:rPr>
+      </w:pPr>
+      <w:r>
+        <w:t xml:space="preserve">If you start ModbusControl by double-clicking an mbc file and the file points to a non-existent COM port, the error dialog "Error opening serial port </w:t>
+      </w:r>
+      <w:proofErr w:type="spellStart"/>
+      <w:r>
+        <w:t>COMx</w:t>
+      </w:r>
+      <w:proofErr w:type="spellEnd"/>
+      <w:r>
+        <w:t>" now appears after the ModbusControl program appears.</w:t>
+      </w:r>
+    </w:p>
+    <w:p>
+      <w:pPr>
+        <w:numPr>
+          <w:ilvl w:val="0"/>
+          <w:numId w:val="6"/>
+        </w:numPr>
+        <w:rPr>
+          <w:rFonts w:hint="eastAsia"/>
+        </w:rPr>
+      </w:pPr>
+      <w:r>
+        <w:t xml:space="preserve">At the first start </w:t>
+      </w:r>
+      <w:r>
+        <w:t xml:space="preserve">of the program </w:t>
+      </w:r>
+      <w:r>
+        <w:t xml:space="preserve">after an update, </w:t>
+      </w:r>
+      <w:r>
+        <w:t xml:space="preserve">an option is shown </w:t>
+      </w:r>
+      <w:r>
+        <w:t>to see the 'Release notes'.</w:t>
+      </w:r>
+    </w:p>
+    <w:p>
+      <w:pPr>
+        <w:numPr>
+          <w:ilvl w:val="0"/>
+          <w:numId w:val="6"/>
+        </w:numPr>
+        <w:rPr>
+          <w:rFonts w:hint="eastAsia"/>
+        </w:rPr>
+      </w:pPr>
+      <w:r>
+        <w:t xml:space="preserve">Program settings split into user-dependent part and </w:t>
+      </w:r>
+      <w:r>
+        <w:t>computer</w:t>
+      </w:r>
+      <w:r>
+        <w:t xml:space="preserve">-dependent part. The old settings are migrated to the new settings files, then </w:t>
+      </w:r>
+      <w:r>
+        <w:t xml:space="preserve">the </w:t>
+      </w:r>
+      <w:r>
+        <w:t>old settings file is deleted.</w:t>
+      </w:r>
+    </w:p>
+    <w:p>
+      <w:pPr>
+        <w:numPr>
+          <w:ilvl w:val="0"/>
+          <w:numId w:val="6"/>
+        </w:numPr>
+        <w:rPr>
+          <w:rFonts w:hint="eastAsia"/>
+        </w:rPr>
+      </w:pPr>
+      <w:r>
+        <w:t xml:space="preserve">LocalOverrides.xml </w:t>
+      </w:r>
+      <w:r>
+        <w:t xml:space="preserve">file is automatically </w:t>
+      </w:r>
+      <w:r>
+        <w:t>moved from &lt;</w:t>
+      </w:r>
+      <w:proofErr w:type="spellStart"/>
+      <w:r>
+        <w:t>mydocuments</w:t>
+      </w:r>
+      <w:proofErr w:type="spellEnd"/>
+      <w:r>
+        <w:t>&gt;\ModbusControl to %</w:t>
+      </w:r>
+      <w:proofErr w:type="spellStart"/>
+      <w:r>
+        <w:t>AppData</w:t>
+      </w:r>
+      <w:proofErr w:type="spellEnd"/>
+      <w:r>
+        <w:t xml:space="preserve">%\Roaming\E.D.&amp;A\ModbusControl. Content from old is not migrated. Old </w:t>
+      </w:r>
+      <w:r>
+        <w:t>file</w:t>
+      </w:r>
+      <w:r>
+        <w:t xml:space="preserve"> is renamed with '.old' and moved to the </w:t>
+      </w:r>
+      <w:r>
+        <w:t xml:space="preserve">new </w:t>
+      </w:r>
+      <w:r>
+        <w:t>location. If overrides were used, the user will receive a notification.</w:t>
+      </w:r>
+    </w:p>
+    <w:p>
+      <w:pPr>
+        <w:numPr>
+          <w:ilvl w:val="0"/>
+          <w:numId w:val="6"/>
+        </w:numPr>
+        <w:rPr>
+          <w:rFonts w:hint="eastAsia"/>
+        </w:rPr>
+      </w:pPr>
+      <w:r>
+        <w:t>&lt;user&gt;\Documents\ModbusControl is no longer used.</w:t>
+      </w:r>
+    </w:p>
+    <w:p>
+      <w:pPr>
+        <w:pStyle w:val="Kop3"/>
+        <w:rPr>
+          <w:rFonts w:hint="eastAsia"/>
+        </w:rPr>
+      </w:pPr>
+      <w:r>
+        <w:t>Fixes</w:t>
+      </w:r>
+    </w:p>
+    <w:p>
+      <w:pPr>
+        <w:numPr>
+          <w:ilvl w:val="0"/>
+          <w:numId w:val="7"/>
+        </w:numPr>
+        <w:rPr>
+          <w:rFonts w:hint="eastAsia"/>
+        </w:rPr>
+      </w:pPr>
+      <w:r>
+        <w:t>The import/export dialogs now show '*. CSV' instead of '*. C</w:t>
+      </w:r>
+      <w:r>
+        <w:t>VS</w:t>
+      </w:r>
+      <w:r>
+        <w:t>'.</w:t>
+      </w:r>
+    </w:p>
+    <w:p>
+      <w:pPr>
+        <w:numPr>
+          <w:ilvl w:val="0"/>
+          <w:numId w:val="7"/>
+        </w:numPr>
+        <w:rPr>
+          <w:rFonts w:hint="eastAsia"/>
+        </w:rPr>
+      </w:pPr>
+      <w:r>
+        <w:t>Mbc file is now saved without BOM (</w:t>
+      </w:r>
+      <w:r>
+        <w:t>Unicode</w:t>
+      </w:r>
+      <w:r>
+        <w:t xml:space="preserve"> byte order mark).</w:t>
+      </w:r>
+    </w:p>
+    <w:p>
+      <w:pPr>
+        <w:numPr>
+          <w:ilvl w:val="0"/>
+          <w:numId w:val="7"/>
+        </w:numPr>
+        <w:rPr>
+          <w:rFonts w:hint="eastAsia"/>
+        </w:rPr>
+      </w:pPr>
+      <w:r>
+        <w:t xml:space="preserve">Better </w:t>
+      </w:r>
+      <w:r>
+        <w:t>handling</w:t>
+      </w:r>
+      <w:r>
+        <w:t xml:space="preserve"> if </w:t>
+      </w:r>
+      <w:r>
+        <w:t>a</w:t>
+      </w:r>
+      <w:r>
+        <w:t xml:space="preserve"> non-admin</w:t>
+      </w:r>
+      <w:r>
+        <w:t>istrator</w:t>
+      </w:r>
+      <w:r>
+        <w:t xml:space="preserve"> user logs </w:t>
+      </w:r>
+      <w:r>
+        <w:t xml:space="preserve">on </w:t>
+      </w:r>
+      <w:r>
+        <w:t>and uses ModbusControl.</w:t>
+      </w:r>
+    </w:p>
+    <w:p>
+      <w:pPr>
+        <w:pStyle w:val="Kop1"/>
+        <w:rPr>
+          <w:rFonts w:hint="eastAsia"/>
+        </w:rPr>
+      </w:pPr>
+      <w:r>
+        <w:t>v2.0.11 -- 2019-11-18</w:t>
+      </w:r>
+    </w:p>
+    <w:p>
+      <w:pPr>
+        <w:pStyle w:val="Kop3"/>
+        <w:rPr>
+          <w:rFonts w:hint="eastAsia"/>
+        </w:rPr>
+      </w:pPr>
+      <w:r>
+        <w:t>Fixes</w:t>
+      </w:r>
+    </w:p>
+    <w:p>
+      <w:pPr>
+        <w:numPr>
+          <w:ilvl w:val="0"/>
+          <w:numId w:val="8"/>
+        </w:numPr>
+        <w:rPr>
+          <w:rFonts w:hint="eastAsia"/>
+        </w:rPr>
+      </w:pPr>
+      <w:r>
+        <w:t xml:space="preserve">Better handling if the USB/serial connection is lost. In the past </w:t>
+      </w:r>
+      <w:r>
+        <w:t xml:space="preserve">the </w:t>
+      </w:r>
+      <w:r>
+        <w:t xml:space="preserve">program </w:t>
+      </w:r>
+      <w:r>
+        <w:t>could stop responding</w:t>
+      </w:r>
+      <w:r>
+        <w:t>.</w:t>
+      </w:r>
+    </w:p>
+    <w:p>
+      <w:pPr>
+        <w:pStyle w:val="Kop1"/>
+        <w:rPr>
+          <w:rFonts w:hint="eastAsia"/>
+        </w:rPr>
+      </w:pPr>
+      <w:r>
+        <w:t>v2.0.10 -- 2019-03-11</w:t>
+      </w:r>
+    </w:p>
+    <w:p>
+      <w:pPr>
+        <w:pStyle w:val="Kop3"/>
+        <w:rPr>
+          <w:rFonts w:hint="eastAsia"/>
+        </w:rPr>
+      </w:pPr>
+      <w:r>
+        <w:t>Features</w:t>
+      </w:r>
+    </w:p>
+    <w:p>
+      <w:pPr>
+        <w:numPr>
+          <w:ilvl w:val="0"/>
+          <w:numId w:val="8"/>
+        </w:numPr>
+        <w:rPr>
+          <w:rFonts w:hint="eastAsia"/>
+        </w:rPr>
+      </w:pPr>
+      <w:r>
+        <w:t>Added display</w:t>
+      </w:r>
+      <w:r>
+        <w:t>ing</w:t>
+      </w:r>
+      <w:r>
+        <w:t xml:space="preserve"> of enum </w:t>
+      </w:r>
+      <w:r>
+        <w:t xml:space="preserve">values </w:t>
+      </w:r>
+      <w:r>
+        <w:t xml:space="preserve">in the value column. </w:t>
+      </w:r>
+    </w:p>
+    <w:p>
+      <w:pPr>
+        <w:pStyle w:val="Kop3"/>
+        <w:rPr>
+          <w:rFonts w:hint="eastAsia"/>
+        </w:rPr>
+      </w:pPr>
+      <w:r>
+        <w:t>Fixes</w:t>
+      </w:r>
+    </w:p>
+    <w:p>
+      <w:pPr>
+        <w:numPr>
+          <w:ilvl w:val="0"/>
+          <w:numId w:val="8"/>
+        </w:numPr>
+        <w:rPr>
+          <w:rFonts w:hint="eastAsia"/>
+        </w:rPr>
+      </w:pPr>
+      <w:r>
+        <w:t xml:space="preserve">Menu </w:t>
+      </w:r>
+      <w:r>
+        <w:t xml:space="preserve">item </w:t>
+      </w:r>
+      <w:r>
+        <w:t xml:space="preserve">"Edit project file" did not work </w:t>
+      </w:r>
+      <w:r>
+        <w:t xml:space="preserve">correctly </w:t>
+      </w:r>
+      <w:r>
+        <w:t>if there was a space in the path.</w:t>
+      </w:r>
+    </w:p>
+    <w:p>
+      <w:pPr>
+        <w:numPr>
+          <w:ilvl w:val="0"/>
+          <w:numId w:val="8"/>
+        </w:numPr>
+        <w:rPr>
+          <w:rFonts w:hint="eastAsia"/>
+        </w:rPr>
+      </w:pPr>
+      <w:r>
+        <w:t>Logger: Clear button did not clear number of logs in the status bar.</w:t>
+      </w:r>
+    </w:p>
+    <w:p>
+      <w:pPr>
+        <w:numPr>
+          <w:ilvl w:val="0"/>
+          <w:numId w:val="8"/>
+        </w:numPr>
+        <w:rPr>
+          <w:rFonts w:hint="eastAsia"/>
+        </w:rPr>
+      </w:pPr>
+      <w:r>
+        <w:t xml:space="preserve">Send Custom Modbus Command: allows tabs and CR/LF in the string. </w:t>
+      </w:r>
+      <w:r>
+        <w:t xml:space="preserve">Reports </w:t>
+      </w:r>
+      <w:r>
+        <w:t xml:space="preserve">error </w:t>
+      </w:r>
+      <w:r>
+        <w:t>for</w:t>
+      </w:r>
+      <w:r>
+        <w:t xml:space="preserve"> empty command string. </w:t>
+      </w:r>
+    </w:p>
+    <w:p>
+      <w:pPr>
+        <w:numPr>
+          <w:ilvl w:val="0"/>
+          <w:numId w:val="8"/>
+        </w:numPr>
+        <w:rPr>
+          <w:rFonts w:hint="eastAsia"/>
+        </w:rPr>
+      </w:pPr>
+      <w:r>
+        <w:t xml:space="preserve">Send Custom Modbus Command: </w:t>
+      </w:r>
+      <w:r>
+        <w:t>Reports</w:t>
+      </w:r>
+      <w:r>
+        <w:t xml:space="preserve"> error when command is too short, must be at least 2 bytes.</w:t>
+      </w:r>
+    </w:p>
+    <w:p>
+      <w:pPr>
+        <w:numPr>
+          <w:ilvl w:val="0"/>
+          <w:numId w:val="8"/>
+        </w:numPr>
+        <w:rPr>
+          <w:rFonts w:hint="eastAsia"/>
+        </w:rPr>
+      </w:pPr>
+      <w:r>
+        <w:t xml:space="preserve">Fix background </w:t>
+      </w:r>
+      <w:r>
+        <w:t>colour</w:t>
+      </w:r>
+      <w:r>
+        <w:t xml:space="preserve"> of registers.</w:t>
+      </w:r>
+    </w:p>
+    <w:p>
+      <w:pPr>
+        <w:pStyle w:val="Kop1"/>
+        <w:rPr>
+          <w:rFonts w:hint="eastAsia"/>
+        </w:rPr>
+      </w:pPr>
+      <w:r>
+        <w:lastRenderedPageBreak/>
+        <w:t>v2.0.9 -- 2018-10-20</w:t>
+      </w:r>
+    </w:p>
+    <w:p>
+      <w:pPr>
+        <w:pStyle w:val="Kop3"/>
+        <w:rPr>
+          <w:rFonts w:hint="eastAsia"/>
+        </w:rPr>
+      </w:pPr>
+      <w:r>
+        <w:t>Features</w:t>
+      </w:r>
+    </w:p>
+    <w:p>
+      <w:pPr>
+        <w:numPr>
+          <w:ilvl w:val="0"/>
+          <w:numId w:val="9"/>
+        </w:numPr>
+        <w:rPr>
+          <w:rFonts w:hint="eastAsia"/>
+        </w:rPr>
+      </w:pPr>
+      <w:r>
+        <w:t>New option: "Move to next row on Enter".</w:t>
+      </w:r>
+    </w:p>
+    <w:p>
+      <w:pPr>
+        <w:numPr>
+          <w:ilvl w:val="0"/>
+          <w:numId w:val="9"/>
+        </w:numPr>
+        <w:rPr>
+          <w:rFonts w:hint="eastAsia"/>
+        </w:rPr>
+      </w:pPr>
+      <w:r>
+        <w:t xml:space="preserve">New option: "Auto-start edit mode on typing". </w:t>
+      </w:r>
+    </w:p>
+    <w:p>
+      <w:pPr>
+        <w:numPr>
+          <w:ilvl w:val="0"/>
+          <w:numId w:val="9"/>
+        </w:numPr>
+        <w:rPr>
+          <w:rFonts w:hint="eastAsia"/>
+        </w:rPr>
+      </w:pPr>
+      <w:r>
+        <w:t xml:space="preserve">New option: "Use custom editor". </w:t>
+      </w:r>
+    </w:p>
+    <w:p>
+      <w:pPr>
+        <w:numPr>
+          <w:ilvl w:val="0"/>
+          <w:numId w:val="9"/>
+        </w:numPr>
+        <w:rPr>
+          <w:rFonts w:hint="eastAsia"/>
+        </w:rPr>
+      </w:pPr>
+      <w:r>
+        <w:t>New option: "Ignore form size on project reload".</w:t>
+      </w:r>
+    </w:p>
+    <w:p>
+      <w:pPr>
+        <w:numPr>
+          <w:ilvl w:val="0"/>
+          <w:numId w:val="9"/>
+        </w:numPr>
+        <w:rPr>
+          <w:rFonts w:hint="eastAsia"/>
+        </w:rPr>
+      </w:pPr>
+      <w:r>
+        <w:t>Config</w:t>
+      </w:r>
+      <w:r>
+        <w:t>uration</w:t>
+      </w:r>
+      <w:r>
+        <w:t xml:space="preserve"> form now has an Apply button.</w:t>
+      </w:r>
+    </w:p>
+    <w:p>
+      <w:pPr>
+        <w:numPr>
+          <w:ilvl w:val="0"/>
+          <w:numId w:val="9"/>
+        </w:numPr>
+        <w:rPr>
+          <w:rFonts w:hint="eastAsia"/>
+        </w:rPr>
+      </w:pPr>
+      <w:r>
+        <w:t xml:space="preserve">Separate line-copy and value-copy </w:t>
+      </w:r>
+      <w:r>
+        <w:t xml:space="preserve">capability </w:t>
+      </w:r>
+      <w:r>
+        <w:t xml:space="preserve">in grid, </w:t>
+      </w:r>
+      <w:r>
+        <w:t>using</w:t>
+      </w:r>
+      <w:r>
+        <w:t xml:space="preserve"> control-C and context menu.</w:t>
+      </w:r>
+    </w:p>
+    <w:p>
+      <w:pPr>
+        <w:numPr>
+          <w:ilvl w:val="0"/>
+          <w:numId w:val="9"/>
+        </w:numPr>
+        <w:rPr>
+          <w:rFonts w:hint="eastAsia"/>
+        </w:rPr>
+      </w:pPr>
+      <w:r>
+        <w:t xml:space="preserve">The status bar now </w:t>
+      </w:r>
+      <w:r>
+        <w:t xml:space="preserve">has </w:t>
+      </w:r>
+      <w:r>
+        <w:t xml:space="preserve">blue </w:t>
+      </w:r>
+      <w:r>
+        <w:t xml:space="preserve">colour </w:t>
+      </w:r>
+      <w:r>
+        <w:t>if there is no connection or no polling is done.</w:t>
+      </w:r>
+    </w:p>
+    <w:p>
+      <w:pPr>
+        <w:numPr>
+          <w:ilvl w:val="0"/>
+          <w:numId w:val="9"/>
+        </w:numPr>
+        <w:rPr>
+          <w:rFonts w:hint="eastAsia"/>
+        </w:rPr>
+      </w:pPr>
+      <w:r>
+        <w:t xml:space="preserve">The status bar </w:t>
+      </w:r>
+      <w:r>
+        <w:t xml:space="preserve">now has red colour </w:t>
+      </w:r>
+      <w:r>
+        <w:t>for errors.</w:t>
+      </w:r>
+    </w:p>
+    <w:p>
+      <w:pPr>
+        <w:numPr>
+          <w:ilvl w:val="0"/>
+          <w:numId w:val="9"/>
+        </w:numPr>
+        <w:rPr>
+          <w:rFonts w:hint="eastAsia"/>
+        </w:rPr>
+      </w:pPr>
+      <w:r>
+        <w:t xml:space="preserve">Now </w:t>
+      </w:r>
+      <w:r>
+        <w:t>shows</w:t>
+      </w:r>
+      <w:r>
+        <w:t xml:space="preserve"> a warning in the "Save configuration to project file" and "Project configuration" screens if localoverrides </w:t>
+      </w:r>
+      <w:r>
+        <w:t>were</w:t>
+      </w:r>
+      <w:r>
+        <w:t xml:space="preserve"> used.</w:t>
+      </w:r>
+    </w:p>
+    <w:p>
+      <w:pPr>
+        <w:pStyle w:val="Kop3"/>
+        <w:rPr>
+          <w:rFonts w:hint="eastAsia"/>
+        </w:rPr>
+      </w:pPr>
+      <w:r>
+        <w:t>Fixes</w:t>
+      </w:r>
+    </w:p>
+    <w:p>
+      <w:pPr>
+        <w:numPr>
+          <w:ilvl w:val="0"/>
+          <w:numId w:val="10"/>
+        </w:numPr>
+        <w:rPr>
+          <w:rFonts w:hint="eastAsia"/>
+        </w:rPr>
+      </w:pPr>
+      <w:r>
+        <w:t xml:space="preserve">Notification </w:t>
+      </w:r>
+      <w:r>
+        <w:t>if Settings.xml could not be loaded at startup.</w:t>
+      </w:r>
+    </w:p>
+    <w:p>
+      <w:pPr>
+        <w:numPr>
+          <w:ilvl w:val="0"/>
+          <w:numId w:val="10"/>
+        </w:numPr>
+        <w:rPr>
+          <w:rFonts w:hint="eastAsia"/>
+        </w:rPr>
+      </w:pPr>
+      <w:r>
+        <w:t xml:space="preserve">Settings.xml </w:t>
+      </w:r>
+      <w:r>
+        <w:t xml:space="preserve">writing now </w:t>
+      </w:r>
+      <w:r>
+        <w:t>update</w:t>
+      </w:r>
+      <w:r>
+        <w:t>s</w:t>
+      </w:r>
+      <w:r>
+        <w:t>/insert</w:t>
+      </w:r>
+      <w:r>
+        <w:t>s</w:t>
       </w:r>
       <w:r>
         <w:t xml:space="preserve"> </w:t>
       </w:r>
       <w:r>
-        <w:t xml:space="preserve">column menu now has </w:t>
-      </w:r>
-      <w:r>
-        <w:t xml:space="preserve"> [</w:t>
-      </w:r>
-      <w:r>
-        <w:t>Expand all]</w:t>
-      </w:r>
-      <w:r>
-        <w:t xml:space="preserve"> and </w:t>
-      </w:r>
-      <w:r>
-        <w:t>[</w:t>
-      </w:r>
-      <w:r>
-        <w:t>Collapse all</w:t>
-      </w:r>
-      <w:r>
-        <w:t>].</w:t>
-      </w:r>
-    </w:p>
-    <w:p>
-      <w:pPr>
-        <w:numPr>
-          <w:ilvl w:val="0"/>
-          <w:numId w:val="4"/>
-        </w:numPr>
-        <w:rPr>
-          <w:rFonts w:hint="eastAsia"/>
-        </w:rPr>
-      </w:pPr>
-      <w:r>
-        <w:t xml:space="preserve">Mbc project file: &lt;longdescr&gt; </w:t>
-      </w:r>
-      <w:r>
-        <w:t xml:space="preserve">element </w:t>
-      </w:r>
-      <w:r>
-        <w:t xml:space="preserve">added. </w:t>
-      </w:r>
-      <w:r>
-        <w:t>Adds a long multiline text that is show when the mouse is hoovered over the register decription</w:t>
+        <w:t>al</w:t>
+      </w:r>
+      <w:r>
+        <w:t xml:space="preserve">l tags in the </w:t>
+      </w:r>
+      <w:r>
+        <w:t xml:space="preserve">existing </w:t>
+      </w:r>
+      <w:r>
+        <w:t>file instead of writing a completely new file, so that any newer tags from a newer version remain.</w:t>
+      </w:r>
+    </w:p>
+    <w:p>
+      <w:pPr>
+        <w:numPr>
+          <w:ilvl w:val="0"/>
+          <w:numId w:val="10"/>
+        </w:numPr>
+        <w:rPr>
+          <w:rFonts w:hint="eastAsia"/>
+        </w:rPr>
+      </w:pPr>
+      <w:r>
+        <w:t>Project Configuration: Interframe-delay: now shows "0 (auto)" at setting 0.</w:t>
+      </w:r>
+    </w:p>
+    <w:p>
+      <w:pPr>
+        <w:numPr>
+          <w:ilvl w:val="0"/>
+          <w:numId w:val="10"/>
+        </w:numPr>
+        <w:rPr>
+          <w:rFonts w:hint="eastAsia"/>
+        </w:rPr>
+      </w:pPr>
+      <w:r>
+        <w:t xml:space="preserve">Local override project </w:t>
+      </w:r>
+      <w:r>
+        <w:t xml:space="preserve">is </w:t>
+      </w:r>
+      <w:r>
+        <w:t xml:space="preserve">no longer </w:t>
+      </w:r>
+      <w:r>
+        <w:t xml:space="preserve">required to have a </w:t>
+      </w:r>
+      <w:r>
+        <w:t>&lt;modbus&gt; element.</w:t>
+      </w:r>
+    </w:p>
+    <w:p>
+      <w:pPr>
+        <w:numPr>
+          <w:ilvl w:val="0"/>
+          <w:numId w:val="10"/>
+        </w:numPr>
+        <w:rPr>
+          <w:rFonts w:hint="eastAsia"/>
+        </w:rPr>
+      </w:pPr>
+      <w:r>
+        <w:t>Dialog forms can now be closed with the Enter key.</w:t>
+      </w:r>
+    </w:p>
+    <w:p>
+      <w:pPr>
+        <w:numPr>
+          <w:ilvl w:val="0"/>
+          <w:numId w:val="10"/>
+        </w:numPr>
+        <w:rPr>
+          <w:rFonts w:hint="eastAsia"/>
+        </w:rPr>
+      </w:pPr>
+      <w:r>
+        <w:t xml:space="preserve">The </w:t>
+      </w:r>
+      <w:r>
+        <w:t>checkboxes of the "Save configuration to project file" form</w:t>
+      </w:r>
+      <w:r>
+        <w:t xml:space="preserve"> are now cleared when loading a project.</w:t>
+      </w:r>
+    </w:p>
+    <w:p>
+      <w:pPr>
+        <w:numPr>
+          <w:ilvl w:val="0"/>
+          <w:numId w:val="10"/>
+        </w:numPr>
+        <w:rPr>
+          <w:rFonts w:hint="eastAsia"/>
+        </w:rPr>
+      </w:pPr>
+      <w:r>
+        <w:t xml:space="preserve">Buttons at the bottom of the forms now have </w:t>
+      </w:r>
+      <w:r>
+        <w:t>better spacing</w:t>
       </w:r>
       <w:r>
         <w:t>.</w:t>
@@ -876,95 +2486,115 @@
     </w:p>
     <w:p>
       <w:pPr>
-        <w:numPr>
-          <w:ilvl w:val="0"/>
-          <w:numId w:val="4"/>
-        </w:numPr>
-        <w:rPr>
-          <w:rFonts w:hint="eastAsia"/>
-        </w:rPr>
-      </w:pPr>
-      <w:r>
-        <w:t>Mbc project file: &lt;include&gt; element added.</w:t>
+        <w:pStyle w:val="Kop1"/>
+        <w:rPr>
+          <w:rFonts w:hint="eastAsia"/>
+        </w:rPr>
+      </w:pPr>
+      <w:r>
+        <w:t>v2.0.8 -- 2018-08-02</w:t>
       </w:r>
     </w:p>
     <w:p>
       <w:pPr>
         <w:pStyle w:val="Kop3"/>
-        <w:numPr>
-          <w:ilvl w:val="0"/>
-          <w:numId w:val="0"/>
-        </w:numPr>
-        <w:ind w:left="680" w:hanging="431"/>
-        <w:rPr>
-          <w:rFonts w:hint="eastAsia"/>
-        </w:rPr>
-      </w:pPr>
-      <w:r>
-        <w:t>Fixes</w:t>
-      </w:r>
-    </w:p>
-    <w:p>
-      <w:pPr>
-        <w:numPr>
-          <w:ilvl w:val="0"/>
-          <w:numId w:val="4"/>
-        </w:numPr>
-        <w:rPr>
-          <w:rFonts w:hint="eastAsia"/>
-        </w:rPr>
-      </w:pPr>
-      <w:r>
-        <w:t>[</w:t>
-      </w:r>
-      <w:r>
-        <w:t>Open project file location in Explorer] now works if you gave a filename without a path on the command line.</w:t>
-      </w:r>
-    </w:p>
-    <w:p>
-      <w:pPr>
-        <w:numPr>
-          <w:ilvl w:val="0"/>
-          <w:numId w:val="4"/>
-        </w:numPr>
-        <w:rPr>
-          <w:rFonts w:hint="eastAsia"/>
-        </w:rPr>
-      </w:pPr>
-      <w:r>
-        <w:t xml:space="preserve">The temporary red </w:t>
-      </w:r>
-      <w:r>
-        <w:t>colouring</w:t>
-      </w:r>
-      <w:r>
-        <w:t xml:space="preserve"> of the value field after entering </w:t>
-      </w:r>
-      <w:r>
-        <w:t xml:space="preserve">an invalid value </w:t>
-      </w:r>
-      <w:r>
-        <w:t>has been improved.</w:t>
-      </w:r>
-    </w:p>
-    <w:p>
-      <w:pPr>
-        <w:numPr>
-          <w:ilvl w:val="0"/>
-          <w:numId w:val="4"/>
-        </w:numPr>
-        <w:rPr>
-          <w:rFonts w:hint="eastAsia"/>
-        </w:rPr>
-      </w:pPr>
-      <w:r>
-        <w:t>Edit</w:t>
-      </w:r>
-      <w:r>
-        <w:t xml:space="preserve"> enter/escape </w:t>
-      </w:r>
-      <w:r>
-        <w:t>handling is improved</w:t>
+        <w:rPr>
+          <w:rFonts w:hint="eastAsia"/>
+        </w:rPr>
+      </w:pPr>
+      <w:r>
+        <w:t>Features</w:t>
+      </w:r>
+    </w:p>
+    <w:p>
+      <w:pPr>
+        <w:numPr>
+          <w:ilvl w:val="0"/>
+          <w:numId w:val="11"/>
+        </w:numPr>
+        <w:rPr>
+          <w:rFonts w:hint="eastAsia"/>
+        </w:rPr>
+      </w:pPr>
+      <w:r>
+        <w:t xml:space="preserve">Added </w:t>
+      </w:r>
+      <w:r>
+        <w:t>menus and toolbar.</w:t>
+      </w:r>
+    </w:p>
+    <w:p>
+      <w:pPr>
+        <w:numPr>
+          <w:ilvl w:val="0"/>
+          <w:numId w:val="11"/>
+        </w:numPr>
+        <w:rPr>
+          <w:rFonts w:hint="eastAsia"/>
+        </w:rPr>
+      </w:pPr>
+      <w:r>
+        <w:t xml:space="preserve">Can save project configuration, bridge settings and form size in mbc file. </w:t>
+      </w:r>
+    </w:p>
+    <w:p>
+      <w:pPr>
+        <w:numPr>
+          <w:ilvl w:val="0"/>
+          <w:numId w:val="11"/>
+        </w:numPr>
+        <w:rPr>
+          <w:rFonts w:hint="eastAsia"/>
+        </w:rPr>
+      </w:pPr>
+      <w:r>
+        <w:t xml:space="preserve">Communication </w:t>
+      </w:r>
+      <w:r>
+        <w:t>pausing</w:t>
+      </w:r>
+      <w:r>
+        <w:t xml:space="preserve"> and poll-once.</w:t>
+      </w:r>
+    </w:p>
+    <w:p>
+      <w:pPr>
+        <w:numPr>
+          <w:ilvl w:val="0"/>
+          <w:numId w:val="11"/>
+        </w:numPr>
+        <w:rPr>
+          <w:rFonts w:hint="eastAsia"/>
+        </w:rPr>
+      </w:pPr>
+      <w:r>
+        <w:t>C</w:t>
+      </w:r>
+      <w:r>
+        <w:t>hange the connection parameters without having to close and reopen the port.</w:t>
+      </w:r>
+    </w:p>
+    <w:p>
+      <w:pPr>
+        <w:numPr>
+          <w:ilvl w:val="0"/>
+          <w:numId w:val="11"/>
+        </w:numPr>
+        <w:rPr>
+          <w:rFonts w:hint="eastAsia"/>
+        </w:rPr>
+      </w:pPr>
+      <w:r>
+        <w:t xml:space="preserve">If the serial port is not available at start, you can </w:t>
+      </w:r>
+      <w:r>
+        <w:t>immediately</w:t>
+      </w:r>
+      <w:r>
+        <w:t xml:space="preserve"> choose another </w:t>
+      </w:r>
+      <w:r>
+        <w:t>port</w:t>
       </w:r>
       <w:r>
         <w:t>.</w:t>
@@ -974,1218 +2604,81 @@
       <w:pPr>
         <w:numPr>
           <w:ilvl w:val="0"/>
-          <w:numId w:val="4"/>
-        </w:numPr>
-        <w:rPr>
-          <w:rFonts w:hint="eastAsia"/>
-        </w:rPr>
-      </w:pPr>
-      <w:r>
-        <w:t xml:space="preserve">In the notification screen that the serial port could not be opened: the [Port] </w:t>
-      </w:r>
-      <w:r>
-        <w:t>combo box</w:t>
-      </w:r>
-      <w:r>
-        <w:t xml:space="preserve"> now automatically refreshes the list of serial ports.</w:t>
-      </w:r>
-    </w:p>
-    <w:p>
-      <w:pPr>
-        <w:pStyle w:val="Kop1"/>
-        <w:rPr>
-          <w:rFonts w:hint="eastAsia"/>
-        </w:rPr>
-      </w:pPr>
-      <w:r>
-        <w:t>v2.0.13 -- 2022-07-11</w:t>
-      </w:r>
-    </w:p>
-    <w:p>
-      <w:pPr>
-        <w:pStyle w:val="Kop3"/>
-        <w:rPr>
-          <w:rFonts w:hint="eastAsia"/>
-        </w:rPr>
-      </w:pPr>
-      <w:r>
-        <w:t>Features</w:t>
-      </w:r>
-    </w:p>
-    <w:p>
-      <w:pPr>
-        <w:numPr>
-          <w:ilvl w:val="0"/>
-          <w:numId w:val="4"/>
-        </w:numPr>
-        <w:rPr>
-          <w:rFonts w:hint="eastAsia"/>
-        </w:rPr>
-      </w:pPr>
-      <w:r>
-        <w:t xml:space="preserve">Added Find/Filter bar. </w:t>
-      </w:r>
-      <w:r>
-        <w:t>Open it using</w:t>
-      </w:r>
-      <w:r>
-        <w:t xml:space="preserve"> Control-F. There is also an option </w:t>
-      </w:r>
-      <w:r>
-        <w:t>“</w:t>
-      </w:r>
-      <w:r>
-        <w:t>Clear Find/Filter on tab change</w:t>
-      </w:r>
-      <w:r>
-        <w:t>”</w:t>
-      </w:r>
-      <w:r>
-        <w:t>.</w:t>
-      </w:r>
-    </w:p>
-    <w:p>
-      <w:pPr>
-        <w:numPr>
-          <w:ilvl w:val="0"/>
-          <w:numId w:val="4"/>
-        </w:numPr>
-        <w:rPr>
-          <w:rFonts w:hint="eastAsia"/>
-        </w:rPr>
-      </w:pPr>
-      <w:r>
-        <w:t xml:space="preserve">The properties of a register (rw, int32, ...) are now displayed in a separate </w:t>
-      </w:r>
-      <w:r>
-        <w:t>[</w:t>
-      </w:r>
-      <w:r>
-        <w:t>Properties</w:t>
-      </w:r>
-      <w:r>
-        <w:t>]</w:t>
-      </w:r>
-      <w:r>
-        <w:t xml:space="preserve"> column</w:t>
-      </w:r>
-      <w:r>
-        <w:t xml:space="preserve"> instead of being added to </w:t>
-      </w:r>
-      <w:r>
-        <w:t xml:space="preserve">the </w:t>
-      </w:r>
-      <w:r>
-        <w:t>[</w:t>
-      </w:r>
-      <w:r>
-        <w:t>Description</w:t>
-      </w:r>
-      <w:r>
-        <w:t>]</w:t>
-      </w:r>
-      <w:r>
-        <w:t xml:space="preserve"> column. </w:t>
-      </w:r>
-      <w:r>
-        <w:t>The [Properties]  column can be e</w:t>
-      </w:r>
-      <w:r>
-        <w:t>nable/disable</w:t>
-      </w:r>
-      <w:r>
-        <w:t>d</w:t>
-      </w:r>
-      <w:r>
-        <w:t xml:space="preserve"> in Options.</w:t>
-      </w:r>
-    </w:p>
-    <w:p>
-      <w:pPr>
-        <w:numPr>
-          <w:ilvl w:val="0"/>
-          <w:numId w:val="4"/>
-        </w:numPr>
-        <w:rPr>
-          <w:rFonts w:hint="eastAsia"/>
-        </w:rPr>
-      </w:pPr>
-      <w:r>
-        <w:t>The Description text can now be multi-line</w:t>
-      </w:r>
-      <w:r>
-        <w:t>, i</w:t>
-      </w:r>
-      <w:r>
-        <w:t xml:space="preserve">f  the </w:t>
-      </w:r>
-      <w:r>
-        <w:t>“</w:t>
-      </w:r>
-      <w:r>
-        <w:t>Multiline rows with auto row size</w:t>
-      </w:r>
-      <w:r>
-        <w:t>”</w:t>
-      </w:r>
-      <w:r>
-        <w:t xml:space="preserve"> option </w:t>
-      </w:r>
-      <w:r>
-        <w:t>is enabled</w:t>
-      </w:r>
-      <w:r>
-        <w:t xml:space="preserve">. A </w:t>
-      </w:r>
-      <w:r>
-        <w:t xml:space="preserve">long </w:t>
-      </w:r>
-      <w:r>
-        <w:t xml:space="preserve">description </w:t>
-      </w:r>
-      <w:r>
-        <w:t>text is wrappe</w:t>
-      </w:r>
-      <w:r>
-        <w:t xml:space="preserve">d. </w:t>
-      </w:r>
-      <w:r>
-        <w:t>CR/LF</w:t>
-      </w:r>
-      <w:r>
-        <w:t xml:space="preserve">’s can be used in the description text. </w:t>
-      </w:r>
-      <w:r>
-        <w:t xml:space="preserve">The row height of the grid is automatically adjusted to the text. </w:t>
-      </w:r>
-    </w:p>
-    <w:p>
-      <w:pPr>
-        <w:numPr>
-          <w:ilvl w:val="0"/>
-          <w:numId w:val="4"/>
-        </w:numPr>
-        <w:rPr>
-          <w:rFonts w:hint="eastAsia"/>
-        </w:rPr>
-      </w:pPr>
-      <w:r>
-        <w:t>"Move to next row on Enter"</w:t>
-      </w:r>
-      <w:r>
-        <w:t xml:space="preserve"> option</w:t>
-      </w:r>
-      <w:r>
-        <w:t xml:space="preserve">: depending on this option, after entering a new value with the Enter key, the </w:t>
-      </w:r>
-      <w:r>
-        <w:t>cursor</w:t>
-      </w:r>
-      <w:r>
-        <w:t xml:space="preserve"> may or may not go to the next line. </w:t>
-      </w:r>
-      <w:r>
-        <w:t xml:space="preserve">Enter a value with </w:t>
-      </w:r>
-      <w:r>
-        <w:t>Control-Enter</w:t>
-      </w:r>
-      <w:r>
-        <w:t xml:space="preserve"> to get the</w:t>
-      </w:r>
-      <w:r>
-        <w:t xml:space="preserve"> opposite</w:t>
-      </w:r>
-      <w:r>
-        <w:t xml:space="preserve"> behaviour.</w:t>
-      </w:r>
-    </w:p>
-    <w:p>
-      <w:pPr>
-        <w:pStyle w:val="Kop3"/>
-        <w:numPr>
-          <w:ilvl w:val="0"/>
-          <w:numId w:val="0"/>
-        </w:numPr>
-        <w:ind w:left="680" w:hanging="431"/>
-        <w:rPr>
-          <w:rFonts w:hint="eastAsia"/>
-        </w:rPr>
-      </w:pPr>
-      <w:r>
-        <w:t>Fixes</w:t>
-      </w:r>
-    </w:p>
-    <w:p>
-      <w:pPr>
-        <w:numPr>
-          <w:ilvl w:val="0"/>
-          <w:numId w:val="5"/>
-        </w:numPr>
-        <w:rPr>
-          <w:rFonts w:hint="eastAsia"/>
-        </w:rPr>
-      </w:pPr>
-      <w:r>
-        <w:t>Control-0 for zoom reset now works globally on the form, not just when the focus is in the grid.</w:t>
-      </w:r>
-    </w:p>
-    <w:p>
-      <w:pPr>
-        <w:numPr>
-          <w:ilvl w:val="0"/>
-          <w:numId w:val="5"/>
-        </w:numPr>
-        <w:rPr>
-          <w:rFonts w:hint="eastAsia"/>
-        </w:rPr>
-      </w:pPr>
-      <w:r>
-        <w:t>R</w:t>
-      </w:r>
-      <w:r>
-        <w:t>ight-click</w:t>
-      </w:r>
-      <w:r>
-        <w:t>ing</w:t>
-      </w:r>
-      <w:r>
-        <w:t xml:space="preserve"> in the grid</w:t>
-      </w:r>
-      <w:r>
-        <w:t xml:space="preserve"> now moves the focus to that row, to </w:t>
-      </w:r>
-      <w:r>
-        <w:t>better see which row you are working on.</w:t>
-      </w:r>
-    </w:p>
-    <w:p>
-      <w:pPr>
-        <w:numPr>
-          <w:ilvl w:val="0"/>
-          <w:numId w:val="5"/>
-        </w:numPr>
-        <w:rPr>
-          <w:rFonts w:hint="eastAsia"/>
-        </w:rPr>
-      </w:pPr>
-      <w:r>
-        <w:t>Migrated</w:t>
-      </w:r>
-      <w:r>
-        <w:t xml:space="preserve"> to .NET framework 4.7.2.</w:t>
-      </w:r>
-    </w:p>
-    <w:p>
-      <w:pPr>
-        <w:pStyle w:val="Kop1"/>
-        <w:rPr>
-          <w:rFonts w:hint="eastAsia"/>
-        </w:rPr>
-      </w:pPr>
-      <w:r>
-        <w:t>v2.0.12 -- 2020-07-13</w:t>
-      </w:r>
-    </w:p>
-    <w:p>
-      <w:pPr>
-        <w:pStyle w:val="Kop3"/>
-        <w:rPr>
-          <w:rFonts w:hint="eastAsia"/>
-        </w:rPr>
-      </w:pPr>
-      <w:r>
-        <w:t>Features</w:t>
-      </w:r>
-    </w:p>
-    <w:p>
-      <w:pPr>
-        <w:numPr>
-          <w:ilvl w:val="0"/>
-          <w:numId w:val="6"/>
-        </w:numPr>
-        <w:rPr>
-          <w:rFonts w:hint="eastAsia"/>
-        </w:rPr>
-      </w:pPr>
-      <w:r>
-        <w:t>Added mbc project file validation with XSD schema</w:t>
-      </w:r>
-      <w:r>
-        <w:t xml:space="preserve"> file</w:t>
-      </w:r>
-      <w:r>
-        <w:t xml:space="preserve">. </w:t>
-      </w:r>
-      <w:r>
-        <w:t xml:space="preserve">Validation is optional. </w:t>
-      </w:r>
-      <w:r>
-        <w:t>The validation only allows lower-case XML tags</w:t>
-      </w:r>
-      <w:r>
-        <w:t>, a</w:t>
-      </w:r>
-      <w:r>
-        <w:t xml:space="preserve">nd only allows the XML elements that are supported in this version. The intention is that over time all mbc files will </w:t>
-      </w:r>
-      <w:r>
-        <w:t>migrate</w:t>
-      </w:r>
-      <w:r>
-        <w:t xml:space="preserve"> to meet the validation.</w:t>
-      </w:r>
-    </w:p>
-    <w:p>
-      <w:pPr>
-        <w:numPr>
-          <w:ilvl w:val="0"/>
-          <w:numId w:val="6"/>
-        </w:numPr>
-        <w:rPr>
-          <w:rFonts w:hint="eastAsia"/>
-        </w:rPr>
-      </w:pPr>
-      <w:r>
-        <w:lastRenderedPageBreak/>
-        <w:t>In</w:t>
+          <w:numId w:val="11"/>
+        </w:numPr>
+        <w:rPr>
+          <w:rFonts w:hint="eastAsia"/>
+        </w:rPr>
+      </w:pPr>
+      <w:r>
+        <w:t>M</w:t>
+      </w:r>
+      <w:r>
+        <w:t xml:space="preserve">bc project file: XML tags </w:t>
+      </w:r>
+      <w:r>
+        <w:t xml:space="preserve">are </w:t>
+      </w:r>
+      <w:r>
+        <w:t xml:space="preserve">now preferably in lowercase. The old camelcase is also still accepted. </w:t>
+      </w:r>
+    </w:p>
+    <w:p>
+      <w:pPr>
+        <w:numPr>
+          <w:ilvl w:val="0"/>
+          <w:numId w:val="11"/>
+        </w:numPr>
+        <w:rPr>
+          <w:rFonts w:hint="eastAsia"/>
+        </w:rPr>
+      </w:pPr>
+      <w:r>
+        <w:t>Always shows line numbers f</w:t>
+      </w:r>
+      <w:r>
+        <w:t xml:space="preserve">or errors in mbc file. </w:t>
+      </w:r>
+    </w:p>
+    <w:p>
+      <w:pPr>
+        <w:numPr>
+          <w:ilvl w:val="0"/>
+          <w:numId w:val="11"/>
+        </w:numPr>
+        <w:rPr>
+          <w:rFonts w:hint="eastAsia"/>
+        </w:rPr>
+      </w:pPr>
+      <w:r>
+        <w:t>Word order (endian)</w:t>
       </w:r>
       <w:r>
         <w:t xml:space="preserve"> </w:t>
       </w:r>
       <w:r>
-        <w:t xml:space="preserve">the </w:t>
-      </w:r>
-      <w:r>
-        <w:t xml:space="preserve">"Save project file" </w:t>
-      </w:r>
-      <w:r>
-        <w:t xml:space="preserve">form </w:t>
-      </w:r>
-      <w:r>
-        <w:t xml:space="preserve">you now have the option to update the XML with "Update XML to current version" so that it then passes the validation. </w:t>
-      </w:r>
-      <w:r>
-        <w:t>E</w:t>
-      </w:r>
-      <w:r>
-        <w:t>rrors must be corrected manually.</w:t>
-      </w:r>
-    </w:p>
-    <w:p>
-      <w:pPr>
-        <w:numPr>
-          <w:ilvl w:val="0"/>
-          <w:numId w:val="6"/>
-        </w:numPr>
-        <w:rPr>
-          <w:rFonts w:hint="eastAsia"/>
-        </w:rPr>
-      </w:pPr>
-      <w:r>
-        <w:t>In</w:t>
-      </w:r>
-      <w:r>
-        <w:t xml:space="preserve"> "Save project file" the project file is now saved with XML formatting.</w:t>
-      </w:r>
-    </w:p>
-    <w:p>
-      <w:pPr>
-        <w:numPr>
-          <w:ilvl w:val="0"/>
-          <w:numId w:val="6"/>
-        </w:numPr>
-        <w:rPr>
-          <w:rFonts w:hint="eastAsia"/>
-        </w:rPr>
-      </w:pPr>
-      <w:r>
-        <w:t>If you start ModbusControl by double-clicking an mbc file and the file points to a non-existent COM port, the error dialog "Error opening serial port COMx" now appears after the ModbusControl program appears.</w:t>
-      </w:r>
-    </w:p>
-    <w:p>
-      <w:pPr>
-        <w:numPr>
-          <w:ilvl w:val="0"/>
-          <w:numId w:val="6"/>
-        </w:numPr>
-        <w:rPr>
-          <w:rFonts w:hint="eastAsia"/>
-        </w:rPr>
-      </w:pPr>
-      <w:r>
-        <w:t xml:space="preserve">At the first start </w:t>
-      </w:r>
-      <w:r>
-        <w:t xml:space="preserve">of the program </w:t>
-      </w:r>
-      <w:r>
-        <w:t xml:space="preserve">after an update, </w:t>
-      </w:r>
-      <w:r>
-        <w:t xml:space="preserve">an option is shown </w:t>
-      </w:r>
-      <w:r>
-        <w:t>to see the 'Release notes'.</w:t>
-      </w:r>
-    </w:p>
-    <w:p>
-      <w:pPr>
-        <w:numPr>
-          <w:ilvl w:val="0"/>
-          <w:numId w:val="6"/>
-        </w:numPr>
-        <w:rPr>
-          <w:rFonts w:hint="eastAsia"/>
-        </w:rPr>
-      </w:pPr>
-      <w:r>
-        <w:t xml:space="preserve">Program settings split into user-dependent part and </w:t>
-      </w:r>
-      <w:r>
-        <w:t>computer</w:t>
-      </w:r>
-      <w:r>
-        <w:t xml:space="preserve">-dependent part. The old settings are migrated to the new settings files, then </w:t>
-      </w:r>
-      <w:r>
-        <w:t xml:space="preserve">the </w:t>
-      </w:r>
-      <w:r>
-        <w:t>old settings file is deleted.</w:t>
-      </w:r>
-    </w:p>
-    <w:p>
-      <w:pPr>
-        <w:numPr>
-          <w:ilvl w:val="0"/>
-          <w:numId w:val="6"/>
-        </w:numPr>
-        <w:rPr>
-          <w:rFonts w:hint="eastAsia"/>
-        </w:rPr>
-      </w:pPr>
-      <w:r>
-        <w:t xml:space="preserve">LocalOverrides.xml </w:t>
-      </w:r>
-      <w:r>
-        <w:t xml:space="preserve">file is automatically </w:t>
-      </w:r>
-      <w:r>
-        <w:t xml:space="preserve">moved from &lt;mydocuments&gt;\ModbusControl to %AppData%\Roaming\E.D.&amp;A\ModbusControl. Content from old is not migrated. Old </w:t>
-      </w:r>
-      <w:r>
-        <w:t>file</w:t>
-      </w:r>
-      <w:r>
-        <w:t xml:space="preserve"> is renamed with '.old' and moved to the </w:t>
-      </w:r>
-      <w:r>
-        <w:t xml:space="preserve">new </w:t>
-      </w:r>
-      <w:r>
-        <w:t>location. If overrides were used, the user will receive a notification.</w:t>
-      </w:r>
-    </w:p>
-    <w:p>
-      <w:pPr>
-        <w:numPr>
-          <w:ilvl w:val="0"/>
-          <w:numId w:val="6"/>
-        </w:numPr>
-        <w:rPr>
-          <w:rFonts w:hint="eastAsia"/>
-        </w:rPr>
-      </w:pPr>
-      <w:r>
-        <w:t>&lt;user&gt;\Documents\ModbusControl is no longer used.</w:t>
-      </w:r>
-    </w:p>
-    <w:p>
-      <w:pPr>
-        <w:pStyle w:val="Kop3"/>
-        <w:rPr>
-          <w:rFonts w:hint="eastAsia"/>
-        </w:rPr>
-      </w:pPr>
-      <w:r>
-        <w:t>Fixes</w:t>
-      </w:r>
-    </w:p>
-    <w:p>
-      <w:pPr>
-        <w:numPr>
-          <w:ilvl w:val="0"/>
-          <w:numId w:val="7"/>
-        </w:numPr>
-        <w:rPr>
-          <w:rFonts w:hint="eastAsia"/>
-        </w:rPr>
-      </w:pPr>
-      <w:r>
-        <w:t>The import/export dialogs now show '*. CSV' instead of '*. C</w:t>
-      </w:r>
-      <w:r>
-        <w:t>VS</w:t>
-      </w:r>
-      <w:r>
-        <w:t>'.</w:t>
-      </w:r>
-    </w:p>
-    <w:p>
-      <w:pPr>
-        <w:numPr>
-          <w:ilvl w:val="0"/>
-          <w:numId w:val="7"/>
-        </w:numPr>
-        <w:rPr>
-          <w:rFonts w:hint="eastAsia"/>
-        </w:rPr>
-      </w:pPr>
-      <w:r>
-        <w:t>Mbc file is now saved without BOM (</w:t>
-      </w:r>
-      <w:r>
-        <w:t>Unicode</w:t>
-      </w:r>
-      <w:r>
-        <w:t xml:space="preserve"> byte order mark).</w:t>
-      </w:r>
-    </w:p>
-    <w:p>
-      <w:pPr>
-        <w:numPr>
-          <w:ilvl w:val="0"/>
-          <w:numId w:val="7"/>
-        </w:numPr>
-        <w:rPr>
-          <w:rFonts w:hint="eastAsia"/>
-        </w:rPr>
-      </w:pPr>
-      <w:r>
-        <w:t xml:space="preserve">Better </w:t>
-      </w:r>
-      <w:r>
-        <w:t>handling</w:t>
-      </w:r>
-      <w:r>
-        <w:t xml:space="preserve"> if </w:t>
-      </w:r>
-      <w:r>
-        <w:t>a</w:t>
-      </w:r>
-      <w:r>
-        <w:t xml:space="preserve"> non-admin</w:t>
-      </w:r>
-      <w:r>
-        <w:t>istrator</w:t>
-      </w:r>
-      <w:r>
-        <w:t xml:space="preserve"> user logs </w:t>
-      </w:r>
-      <w:r>
-        <w:t xml:space="preserve">on </w:t>
-      </w:r>
-      <w:r>
-        <w:t>and uses ModbusControl.</w:t>
-      </w:r>
-    </w:p>
-    <w:p>
-      <w:pPr>
-        <w:pStyle w:val="Kop1"/>
-        <w:rPr>
-          <w:rFonts w:hint="eastAsia"/>
-        </w:rPr>
-      </w:pPr>
-      <w:r>
-        <w:t>v2.0.11 -- 2019-11-18</w:t>
-      </w:r>
-    </w:p>
-    <w:p>
-      <w:pPr>
-        <w:pStyle w:val="Kop3"/>
-        <w:rPr>
-          <w:rFonts w:hint="eastAsia"/>
-        </w:rPr>
-      </w:pPr>
-      <w:r>
-        <w:t>Fixes</w:t>
-      </w:r>
-    </w:p>
-    <w:p>
-      <w:pPr>
-        <w:numPr>
-          <w:ilvl w:val="0"/>
-          <w:numId w:val="8"/>
-        </w:numPr>
-        <w:rPr>
-          <w:rFonts w:hint="eastAsia"/>
-        </w:rPr>
-      </w:pPr>
-      <w:r>
-        <w:t xml:space="preserve">Better handling if the USB/serial connection is lost. In the past </w:t>
-      </w:r>
-      <w:r>
-        <w:t xml:space="preserve">the </w:t>
-      </w:r>
-      <w:r>
-        <w:t xml:space="preserve">program </w:t>
-      </w:r>
-      <w:r>
-        <w:t>could stop responding</w:t>
-      </w:r>
-      <w:r>
-        <w:t>.</w:t>
-      </w:r>
-    </w:p>
-    <w:p>
-      <w:pPr>
-        <w:pStyle w:val="Kop1"/>
-        <w:rPr>
-          <w:rFonts w:hint="eastAsia"/>
-        </w:rPr>
-      </w:pPr>
-      <w:r>
-        <w:t>v2.0.10 -- 2019-03-11</w:t>
-      </w:r>
-    </w:p>
-    <w:p>
-      <w:pPr>
-        <w:pStyle w:val="Kop3"/>
-        <w:rPr>
-          <w:rFonts w:hint="eastAsia"/>
-        </w:rPr>
-      </w:pPr>
-      <w:r>
-        <w:t>Features</w:t>
-      </w:r>
-    </w:p>
-    <w:p>
-      <w:pPr>
-        <w:numPr>
-          <w:ilvl w:val="0"/>
-          <w:numId w:val="8"/>
-        </w:numPr>
-        <w:rPr>
-          <w:rFonts w:hint="eastAsia"/>
-        </w:rPr>
-      </w:pPr>
-      <w:r>
-        <w:t>Added display</w:t>
-      </w:r>
-      <w:r>
-        <w:t>ing</w:t>
-      </w:r>
-      <w:r>
-        <w:t xml:space="preserve"> of enum </w:t>
-      </w:r>
-      <w:r>
-        <w:t xml:space="preserve">values </w:t>
-      </w:r>
-      <w:r>
-        <w:t xml:space="preserve">in the value column. </w:t>
-      </w:r>
-    </w:p>
-    <w:p>
-      <w:pPr>
-        <w:pStyle w:val="Kop3"/>
-        <w:rPr>
-          <w:rFonts w:hint="eastAsia"/>
-        </w:rPr>
-      </w:pPr>
-      <w:r>
-        <w:t>Fixes</w:t>
-      </w:r>
-    </w:p>
-    <w:p>
-      <w:pPr>
-        <w:numPr>
-          <w:ilvl w:val="0"/>
-          <w:numId w:val="8"/>
-        </w:numPr>
-        <w:rPr>
-          <w:rFonts w:hint="eastAsia"/>
-        </w:rPr>
-      </w:pPr>
-      <w:r>
-        <w:t xml:space="preserve">Menu </w:t>
-      </w:r>
-      <w:r>
-        <w:t xml:space="preserve">item </w:t>
-      </w:r>
-      <w:r>
-        <w:t xml:space="preserve">"Edit project file" did not work </w:t>
-      </w:r>
-      <w:r>
-        <w:t xml:space="preserve">correctly </w:t>
-      </w:r>
-      <w:r>
-        <w:t>if there was a space in the path.</w:t>
-      </w:r>
-    </w:p>
-    <w:p>
-      <w:pPr>
-        <w:numPr>
-          <w:ilvl w:val="0"/>
-          <w:numId w:val="8"/>
-        </w:numPr>
-        <w:rPr>
-          <w:rFonts w:hint="eastAsia"/>
-        </w:rPr>
-      </w:pPr>
-      <w:r>
-        <w:t>Logger: Clear button did not clear number of logs in the status bar.</w:t>
-      </w:r>
-    </w:p>
-    <w:p>
-      <w:pPr>
-        <w:numPr>
-          <w:ilvl w:val="0"/>
-          <w:numId w:val="8"/>
-        </w:numPr>
-        <w:rPr>
-          <w:rFonts w:hint="eastAsia"/>
-        </w:rPr>
-      </w:pPr>
-      <w:r>
-        <w:t xml:space="preserve">Send Custom Modbus Command: allows tabs and CR/LF in the string. </w:t>
-      </w:r>
-      <w:r>
-        <w:t xml:space="preserve">Reports </w:t>
-      </w:r>
-      <w:r>
-        <w:t xml:space="preserve">error </w:t>
-      </w:r>
-      <w:r>
-        <w:t>for</w:t>
-      </w:r>
-      <w:r>
-        <w:t xml:space="preserve"> empty command string. </w:t>
-      </w:r>
-    </w:p>
-    <w:p>
-      <w:pPr>
-        <w:numPr>
-          <w:ilvl w:val="0"/>
-          <w:numId w:val="8"/>
-        </w:numPr>
-        <w:rPr>
-          <w:rFonts w:hint="eastAsia"/>
-        </w:rPr>
-      </w:pPr>
-      <w:r>
-        <w:t xml:space="preserve">Send Custom Modbus Command: </w:t>
-      </w:r>
-      <w:r>
-        <w:t>Reports</w:t>
-      </w:r>
-      <w:r>
-        <w:t xml:space="preserve"> error when command is too short, must be at least 2 bytes.</w:t>
-      </w:r>
-    </w:p>
-    <w:p>
-      <w:pPr>
-        <w:numPr>
-          <w:ilvl w:val="0"/>
-          <w:numId w:val="8"/>
-        </w:numPr>
-        <w:rPr>
-          <w:rFonts w:hint="eastAsia"/>
-        </w:rPr>
-      </w:pPr>
-      <w:r>
-        <w:t xml:space="preserve">Fix background </w:t>
-      </w:r>
-      <w:r>
-        <w:t>colour</w:t>
-      </w:r>
-      <w:r>
-        <w:t xml:space="preserve"> of registers.</w:t>
-      </w:r>
-    </w:p>
-    <w:p>
-      <w:pPr>
-        <w:pStyle w:val="Kop1"/>
-        <w:rPr>
-          <w:rFonts w:hint="eastAsia"/>
-        </w:rPr>
-      </w:pPr>
-      <w:r>
-        <w:t>v2.0.9 -- 2018-10-20</w:t>
-      </w:r>
-    </w:p>
-    <w:p>
-      <w:pPr>
-        <w:pStyle w:val="Kop3"/>
-        <w:rPr>
-          <w:rFonts w:hint="eastAsia"/>
-        </w:rPr>
-      </w:pPr>
-      <w:r>
-        <w:t>Features</w:t>
-      </w:r>
-    </w:p>
-    <w:p>
-      <w:pPr>
-        <w:numPr>
-          <w:ilvl w:val="0"/>
-          <w:numId w:val="9"/>
-        </w:numPr>
-        <w:rPr>
-          <w:rFonts w:hint="eastAsia"/>
-        </w:rPr>
-      </w:pPr>
-      <w:r>
-        <w:t>New option: "Move to next row on Enter".</w:t>
-      </w:r>
-    </w:p>
-    <w:p>
-      <w:pPr>
-        <w:numPr>
-          <w:ilvl w:val="0"/>
-          <w:numId w:val="9"/>
-        </w:numPr>
-        <w:rPr>
-          <w:rFonts w:hint="eastAsia"/>
-        </w:rPr>
-      </w:pPr>
-      <w:r>
-        <w:t xml:space="preserve">New option: "Auto-start edit mode on typing". </w:t>
-      </w:r>
-    </w:p>
-    <w:p>
-      <w:pPr>
-        <w:numPr>
-          <w:ilvl w:val="0"/>
-          <w:numId w:val="9"/>
-        </w:numPr>
-        <w:rPr>
-          <w:rFonts w:hint="eastAsia"/>
-        </w:rPr>
-      </w:pPr>
-      <w:r>
-        <w:t xml:space="preserve">New option: "Use custom editor". </w:t>
-      </w:r>
-    </w:p>
-    <w:p>
-      <w:pPr>
-        <w:numPr>
-          <w:ilvl w:val="0"/>
-          <w:numId w:val="9"/>
-        </w:numPr>
-        <w:rPr>
-          <w:rFonts w:hint="eastAsia"/>
-        </w:rPr>
-      </w:pPr>
-      <w:r>
-        <w:t>New option: "Ignore form size on project reload".</w:t>
-      </w:r>
-    </w:p>
-    <w:p>
-      <w:pPr>
-        <w:numPr>
-          <w:ilvl w:val="0"/>
-          <w:numId w:val="9"/>
-        </w:numPr>
-        <w:rPr>
-          <w:rFonts w:hint="eastAsia"/>
-        </w:rPr>
-      </w:pPr>
-      <w:r>
-        <w:t>Config</w:t>
-      </w:r>
-      <w:r>
-        <w:t>uration</w:t>
-      </w:r>
-      <w:r>
-        <w:t xml:space="preserve"> form now has an Apply button.</w:t>
-      </w:r>
-    </w:p>
-    <w:p>
-      <w:pPr>
-        <w:numPr>
-          <w:ilvl w:val="0"/>
-          <w:numId w:val="9"/>
-        </w:numPr>
-        <w:rPr>
-          <w:rFonts w:hint="eastAsia"/>
-        </w:rPr>
-      </w:pPr>
-      <w:r>
-        <w:lastRenderedPageBreak/>
-        <w:t xml:space="preserve">Separate line-copy and value-copy </w:t>
-      </w:r>
-      <w:r>
-        <w:t xml:space="preserve">capability </w:t>
-      </w:r>
-      <w:r>
-        <w:t xml:space="preserve">in grid, </w:t>
-      </w:r>
-      <w:r>
-        <w:t>using</w:t>
-      </w:r>
-      <w:r>
-        <w:t xml:space="preserve"> control-C and context menu.</w:t>
-      </w:r>
-    </w:p>
-    <w:p>
-      <w:pPr>
-        <w:numPr>
-          <w:ilvl w:val="0"/>
-          <w:numId w:val="9"/>
-        </w:numPr>
-        <w:rPr>
-          <w:rFonts w:hint="eastAsia"/>
-        </w:rPr>
-      </w:pPr>
-      <w:r>
-        <w:t xml:space="preserve">The status bar now </w:t>
-      </w:r>
-      <w:r>
-        <w:t xml:space="preserve">has </w:t>
-      </w:r>
-      <w:r>
-        <w:t xml:space="preserve">blue </w:t>
-      </w:r>
-      <w:r>
-        <w:t xml:space="preserve">colour </w:t>
-      </w:r>
-      <w:r>
-        <w:t>if there is no connection or no polling is done.</w:t>
-      </w:r>
-    </w:p>
-    <w:p>
-      <w:pPr>
-        <w:numPr>
-          <w:ilvl w:val="0"/>
-          <w:numId w:val="9"/>
-        </w:numPr>
-        <w:rPr>
-          <w:rFonts w:hint="eastAsia"/>
-        </w:rPr>
-      </w:pPr>
-      <w:r>
-        <w:t xml:space="preserve">The status bar </w:t>
-      </w:r>
-      <w:r>
-        <w:t xml:space="preserve">now has red colour </w:t>
-      </w:r>
-      <w:r>
-        <w:t>for errors.</w:t>
-      </w:r>
-    </w:p>
-    <w:p>
-      <w:pPr>
-        <w:numPr>
-          <w:ilvl w:val="0"/>
-          <w:numId w:val="9"/>
-        </w:numPr>
-        <w:rPr>
-          <w:rFonts w:hint="eastAsia"/>
-        </w:rPr>
-      </w:pPr>
-      <w:r>
-        <w:t xml:space="preserve">Now </w:t>
-      </w:r>
-      <w:r>
-        <w:t>shows</w:t>
-      </w:r>
-      <w:r>
-        <w:t xml:space="preserve"> a warning in the "Save configuration to project file" and "Project configuration" screens if localoverrides </w:t>
-      </w:r>
-      <w:r>
-        <w:t>were</w:t>
-      </w:r>
-      <w:r>
-        <w:t xml:space="preserve"> used.</w:t>
-      </w:r>
-    </w:p>
-    <w:p>
-      <w:pPr>
-        <w:pStyle w:val="Kop3"/>
-        <w:rPr>
-          <w:rFonts w:hint="eastAsia"/>
-        </w:rPr>
-      </w:pPr>
-      <w:r>
-        <w:t>Fixes</w:t>
-      </w:r>
-    </w:p>
-    <w:p>
-      <w:pPr>
-        <w:numPr>
-          <w:ilvl w:val="0"/>
-          <w:numId w:val="10"/>
-        </w:numPr>
-        <w:rPr>
-          <w:rFonts w:hint="eastAsia"/>
-        </w:rPr>
-      </w:pPr>
-      <w:r>
-        <w:t xml:space="preserve">Notification </w:t>
-      </w:r>
-      <w:r>
-        <w:t>if Settings.xml could not be loaded at startup.</w:t>
-      </w:r>
-    </w:p>
-    <w:p>
-      <w:pPr>
-        <w:numPr>
-          <w:ilvl w:val="0"/>
-          <w:numId w:val="10"/>
-        </w:numPr>
-        <w:rPr>
-          <w:rFonts w:hint="eastAsia"/>
-        </w:rPr>
-      </w:pPr>
-      <w:r>
-        <w:t xml:space="preserve">Settings.xml </w:t>
-      </w:r>
-      <w:r>
-        <w:t xml:space="preserve">writing now </w:t>
-      </w:r>
-      <w:r>
-        <w:t>update</w:t>
-      </w:r>
-      <w:r>
-        <w:t>s</w:t>
-      </w:r>
-      <w:r>
-        <w:t>/insert</w:t>
-      </w:r>
-      <w:r>
-        <w:t>s</w:t>
-      </w:r>
-      <w:r>
-        <w:t xml:space="preserve"> </w:t>
-      </w:r>
-      <w:r>
-        <w:t>al</w:t>
-      </w:r>
-      <w:r>
-        <w:t xml:space="preserve">l tags in the </w:t>
-      </w:r>
-      <w:r>
-        <w:t xml:space="preserve">existing </w:t>
-      </w:r>
-      <w:r>
-        <w:t>file instead of writing a completely new file, so that any newer tags from a newer version remain.</w:t>
-      </w:r>
-    </w:p>
-    <w:p>
-      <w:pPr>
-        <w:numPr>
-          <w:ilvl w:val="0"/>
-          <w:numId w:val="10"/>
-        </w:numPr>
-        <w:rPr>
-          <w:rFonts w:hint="eastAsia"/>
-        </w:rPr>
-      </w:pPr>
-      <w:r>
-        <w:t>Project Configuration: Interframe-delay: now shows "0 (auto)" at setting 0.</w:t>
-      </w:r>
-    </w:p>
-    <w:p>
-      <w:pPr>
-        <w:numPr>
-          <w:ilvl w:val="0"/>
-          <w:numId w:val="10"/>
-        </w:numPr>
-        <w:rPr>
-          <w:rFonts w:hint="eastAsia"/>
-        </w:rPr>
-      </w:pPr>
-      <w:r>
-        <w:t xml:space="preserve">Local override project </w:t>
-      </w:r>
-      <w:r>
         <w:t xml:space="preserve">is </w:t>
       </w:r>
       <w:r>
-        <w:t xml:space="preserve">no longer </w:t>
-      </w:r>
-      <w:r>
-        <w:t xml:space="preserve">required to have a </w:t>
-      </w:r>
-      <w:r>
-        <w:t>&lt;modbus&gt; element.</w:t>
-      </w:r>
-    </w:p>
-    <w:p>
-      <w:pPr>
-        <w:numPr>
-          <w:ilvl w:val="0"/>
-          <w:numId w:val="10"/>
-        </w:numPr>
-        <w:rPr>
-          <w:rFonts w:hint="eastAsia"/>
-        </w:rPr>
-      </w:pPr>
-      <w:r>
-        <w:t>Dialog forms can now be closed with the Enter key.</w:t>
-      </w:r>
-    </w:p>
-    <w:p>
-      <w:pPr>
-        <w:numPr>
-          <w:ilvl w:val="0"/>
-          <w:numId w:val="10"/>
-        </w:numPr>
-        <w:rPr>
-          <w:rFonts w:hint="eastAsia"/>
-        </w:rPr>
-      </w:pPr>
-      <w:r>
-        <w:t xml:space="preserve">The </w:t>
-      </w:r>
-      <w:r>
-        <w:t>checkboxes of the "Save configuration to project file" form</w:t>
-      </w:r>
-      <w:r>
-        <w:t xml:space="preserve"> are now cleared when loading a project.</w:t>
-      </w:r>
-    </w:p>
-    <w:p>
-      <w:pPr>
-        <w:numPr>
-          <w:ilvl w:val="0"/>
-          <w:numId w:val="10"/>
-        </w:numPr>
-        <w:rPr>
-          <w:rFonts w:hint="eastAsia"/>
-        </w:rPr>
-      </w:pPr>
-      <w:r>
-        <w:t xml:space="preserve">Buttons at the bottom of the forms now have </w:t>
-      </w:r>
-      <w:r>
-        <w:t>better spacing</w:t>
-      </w:r>
-      <w:r>
-        <w:t>.</w:t>
-      </w:r>
-    </w:p>
-    <w:p>
-      <w:pPr>
-        <w:pStyle w:val="Kop1"/>
-        <w:rPr>
-          <w:rFonts w:hint="eastAsia"/>
-        </w:rPr>
-      </w:pPr>
-      <w:r>
-        <w:t>v2.0.8 -- 2018-08-02</w:t>
-      </w:r>
-    </w:p>
-    <w:p>
-      <w:pPr>
-        <w:pStyle w:val="Kop3"/>
-        <w:rPr>
-          <w:rFonts w:hint="eastAsia"/>
-        </w:rPr>
-      </w:pPr>
-      <w:r>
-        <w:t>Features</w:t>
+        <w:t xml:space="preserve">separately </w:t>
+      </w:r>
+      <w:r>
+        <w:t>configurable</w:t>
+      </w:r>
+      <w:r>
+        <w:t xml:space="preserve"> for int32 and float32. </w:t>
+      </w:r>
+      <w:r>
+        <w:t>Character</w:t>
+      </w:r>
+      <w:r>
+        <w:t xml:space="preserve"> order </w:t>
+      </w:r>
+      <w:r>
+        <w:t xml:space="preserve">is configurable </w:t>
+      </w:r>
+      <w:r>
+        <w:t xml:space="preserve">for ASCII. </w:t>
       </w:r>
     </w:p>
     <w:p>
@@ -2198,183 +2691,13 @@
           <w:rFonts w:hint="eastAsia"/>
         </w:rPr>
       </w:pPr>
-      <w:r>
-        <w:t xml:space="preserve">Added </w:t>
-      </w:r>
-      <w:r>
-        <w:t>menus and toolbar.</w:t>
-      </w:r>
-    </w:p>
-    <w:p>
-      <w:pPr>
-        <w:numPr>
-          <w:ilvl w:val="0"/>
-          <w:numId w:val="11"/>
-        </w:numPr>
-        <w:rPr>
-          <w:rFonts w:hint="eastAsia"/>
-        </w:rPr>
-      </w:pPr>
-      <w:r>
-        <w:t xml:space="preserve">Can save project configuration, bridge settings and form size in mbc file. </w:t>
-      </w:r>
-    </w:p>
-    <w:p>
-      <w:pPr>
-        <w:numPr>
-          <w:ilvl w:val="0"/>
-          <w:numId w:val="11"/>
-        </w:numPr>
-        <w:rPr>
-          <w:rFonts w:hint="eastAsia"/>
-        </w:rPr>
-      </w:pPr>
-      <w:r>
-        <w:t xml:space="preserve">Communication </w:t>
-      </w:r>
-      <w:r>
-        <w:t>pausing</w:t>
-      </w:r>
-      <w:r>
-        <w:t xml:space="preserve"> and poll-once.</w:t>
-      </w:r>
-    </w:p>
-    <w:p>
-      <w:pPr>
-        <w:numPr>
-          <w:ilvl w:val="0"/>
-          <w:numId w:val="11"/>
-        </w:numPr>
-        <w:rPr>
-          <w:rFonts w:hint="eastAsia"/>
-        </w:rPr>
-      </w:pPr>
-      <w:r>
-        <w:t>C</w:t>
-      </w:r>
-      <w:r>
-        <w:t>hange the connection parameters without having to close and reopen the port.</w:t>
-      </w:r>
-    </w:p>
-    <w:p>
-      <w:pPr>
-        <w:numPr>
-          <w:ilvl w:val="0"/>
-          <w:numId w:val="11"/>
-        </w:numPr>
-        <w:rPr>
-          <w:rFonts w:hint="eastAsia"/>
-        </w:rPr>
-      </w:pPr>
-      <w:r>
-        <w:t xml:space="preserve">If the serial port is not available at start, you can </w:t>
-      </w:r>
-      <w:r>
-        <w:t>immediately</w:t>
-      </w:r>
-      <w:r>
-        <w:t xml:space="preserve"> choose another </w:t>
-      </w:r>
-      <w:r>
-        <w:t>port</w:t>
-      </w:r>
-      <w:r>
-        <w:t>.</w:t>
-      </w:r>
-    </w:p>
-    <w:p>
-      <w:pPr>
-        <w:numPr>
-          <w:ilvl w:val="0"/>
-          <w:numId w:val="11"/>
-        </w:numPr>
-        <w:rPr>
-          <w:rFonts w:hint="eastAsia"/>
-        </w:rPr>
-      </w:pPr>
-      <w:r>
-        <w:t>M</w:t>
-      </w:r>
-      <w:r>
-        <w:t xml:space="preserve">bc project file: XML tags </w:t>
-      </w:r>
-      <w:r>
-        <w:t xml:space="preserve">are </w:t>
-      </w:r>
-      <w:r>
-        <w:t xml:space="preserve">now preferably in lowercase. The old camelcase is also still accepted. </w:t>
-      </w:r>
-    </w:p>
-    <w:p>
-      <w:pPr>
-        <w:numPr>
-          <w:ilvl w:val="0"/>
-          <w:numId w:val="11"/>
-        </w:numPr>
-        <w:rPr>
-          <w:rFonts w:hint="eastAsia"/>
-        </w:rPr>
-      </w:pPr>
-      <w:r>
-        <w:t>Always shows line numbers f</w:t>
-      </w:r>
-      <w:r>
-        <w:t xml:space="preserve">or errors in mbc file. </w:t>
-      </w:r>
-    </w:p>
-    <w:p>
-      <w:pPr>
-        <w:numPr>
-          <w:ilvl w:val="0"/>
-          <w:numId w:val="11"/>
-        </w:numPr>
-        <w:rPr>
-          <w:rFonts w:hint="eastAsia"/>
-        </w:rPr>
-      </w:pPr>
-      <w:r>
-        <w:t>Word order (endian)</w:t>
-      </w:r>
-      <w:r>
-        <w:t xml:space="preserve"> </w:t>
-      </w:r>
-      <w:r>
-        <w:t xml:space="preserve">is </w:t>
-      </w:r>
-      <w:r>
-        <w:t xml:space="preserve">separately </w:t>
-      </w:r>
-      <w:r>
-        <w:t>configurable</w:t>
-      </w:r>
-      <w:r>
-        <w:t xml:space="preserve"> for int32 and float32. </w:t>
-      </w:r>
-      <w:r>
-        <w:t>Character</w:t>
-      </w:r>
-      <w:r>
-        <w:t xml:space="preserve"> order </w:t>
-      </w:r>
-      <w:r>
-        <w:t xml:space="preserve">is configurable </w:t>
-      </w:r>
-      <w:r>
-        <w:t xml:space="preserve">for ASCII. </w:t>
-      </w:r>
-    </w:p>
-    <w:p>
-      <w:pPr>
-        <w:numPr>
-          <w:ilvl w:val="0"/>
-          <w:numId w:val="11"/>
-        </w:numPr>
-        <w:rPr>
-          <w:rFonts w:hint="eastAsia"/>
-        </w:rPr>
-      </w:pPr>
-      <w:r>
-        <w:t>WriteHoldingregFunctionCode now also supports 'auto'.</w:t>
+      <w:proofErr w:type="spellStart"/>
+      <w:r>
+        <w:t>WriteHoldingregFunctionCode</w:t>
+      </w:r>
+      <w:proofErr w:type="spellEnd"/>
+      <w:r>
+        <w:t xml:space="preserve"> now also supports 'auto'.</w:t>
       </w:r>
     </w:p>
     <w:p>
@@ -2418,7 +2741,7 @@
 </file>
 
 <file path=word/endnotes.xml><?xml version="1.0" encoding="utf-8"?>
-<w:endnotes xmlns:wpc="http://schemas.microsoft.com/office/word/2010/wordprocessingCanvas" xmlns:cx="http://schemas.microsoft.com/office/drawing/2014/chartex" xmlns:cx1="http://schemas.microsoft.com/office/drawing/2015/9/8/chartex" xmlns:cx2="http://schemas.microsoft.com/office/drawing/2015/10/21/chartex" xmlns:cx3="http://schemas.microsoft.com/office/drawing/2016/5/9/chartex" xmlns:cx4="http://schemas.microsoft.com/office/drawing/2016/5/10/chartex" xmlns:cx5="http://schemas.microsoft.com/office/drawing/2016/5/11/chartex" xmlns:cx6="http://schemas.microsoft.com/office/drawing/2016/5/12/chartex" xmlns:cx7="http://schemas.microsoft.com/office/drawing/2016/5/13/chartex" xmlns:cx8="http://schemas.microsoft.com/office/drawing/2016/5/14/chartex" xmlns:mc="http://schemas.openxmlformats.org/markup-compatibility/2006" xmlns:aink="http://schemas.microsoft.com/office/drawing/2016/ink" xmlns:am3d="http://schemas.microsoft.com/office/drawing/2017/model3d" xmlns:o="urn:schemas-microsoft-com:office:office" xmlns:oel="http://schemas.microsoft.com/office/2019/extlst" xmlns:r="http://schemas.openxmlformats.org/officeDocument/2006/relationships" xmlns:m="http://schemas.openxmlformats.org/officeDocument/2006/math" xmlns:v="urn:schemas-microsoft-com:vml" xmlns:wp14="http://schemas.microsoft.com/office/word/2010/wordprocessingDrawing" xmlns:wp="http://schemas.openxmlformats.org/drawingml/2006/wordprocessingDrawing" xmlns:w10="urn:schemas-microsoft-com:office:word" xmlns:w="http://schemas.openxmlformats.org/wordprocessingml/2006/main" xmlns:w14="http://schemas.microsoft.com/office/word/2010/wordml" xmlns:w15="http://schemas.microsoft.com/office/word/2012/wordml" xmlns:w16cex="http://schemas.microsoft.com/office/word/2018/wordml/cex" xmlns:w16cid="http://schemas.microsoft.com/office/word/2016/wordml/cid" xmlns:w16="http://schemas.microsoft.com/office/word/2018/wordml" xmlns:w16du="http://schemas.microsoft.com/office/word/2023/wordml/word16du" xmlns:w16sdtdh="http://schemas.microsoft.com/office/word/2020/wordml/sdtdatahash" xmlns:w16se="http://schemas.microsoft.com/office/word/2015/wordml/symex" xmlns:wpg="http://schemas.microsoft.com/office/word/2010/wordprocessingGroup" xmlns:wpi="http://schemas.microsoft.com/office/word/2010/wordprocessingInk" xmlns:wne="http://schemas.microsoft.com/office/word/2006/wordml" xmlns:wps="http://schemas.microsoft.com/office/word/2010/wordprocessingShape" mc:Ignorable="w14 w15 w16se w16cid w16 w16cex w16sdtdh w16du wp14">
+<w:endnotes xmlns:wpc="http://schemas.microsoft.com/office/word/2010/wordprocessingCanvas" xmlns:cx="http://schemas.microsoft.com/office/drawing/2014/chartex" xmlns:cx1="http://schemas.microsoft.com/office/drawing/2015/9/8/chartex" xmlns:cx2="http://schemas.microsoft.com/office/drawing/2015/10/21/chartex" xmlns:cx3="http://schemas.microsoft.com/office/drawing/2016/5/9/chartex" xmlns:cx4="http://schemas.microsoft.com/office/drawing/2016/5/10/chartex" xmlns:cx5="http://schemas.microsoft.com/office/drawing/2016/5/11/chartex" xmlns:cx6="http://schemas.microsoft.com/office/drawing/2016/5/12/chartex" xmlns:cx7="http://schemas.microsoft.com/office/drawing/2016/5/13/chartex" xmlns:cx8="http://schemas.microsoft.com/office/drawing/2016/5/14/chartex" xmlns:mc="http://schemas.openxmlformats.org/markup-compatibility/2006" xmlns:aink="http://schemas.microsoft.com/office/drawing/2016/ink" xmlns:am3d="http://schemas.microsoft.com/office/drawing/2017/model3d" xmlns:o="urn:schemas-microsoft-com:office:office" xmlns:oel="http://schemas.microsoft.com/office/2019/extlst" xmlns:r="http://schemas.openxmlformats.org/officeDocument/2006/relationships" xmlns:m="http://schemas.openxmlformats.org/officeDocument/2006/math" xmlns:v="urn:schemas-microsoft-com:vml" xmlns:wp14="http://schemas.microsoft.com/office/word/2010/wordprocessingDrawing" xmlns:wp="http://schemas.openxmlformats.org/drawingml/2006/wordprocessingDrawing" xmlns:w10="urn:schemas-microsoft-com:office:word" xmlns:w="http://schemas.openxmlformats.org/wordprocessingml/2006/main" xmlns:w14="http://schemas.microsoft.com/office/word/2010/wordml" xmlns:w15="http://schemas.microsoft.com/office/word/2012/wordml" xmlns:w16cex="http://schemas.microsoft.com/office/word/2018/wordml/cex" xmlns:w16cid="http://schemas.microsoft.com/office/word/2016/wordml/cid" xmlns:w16="http://schemas.microsoft.com/office/word/2018/wordml" xmlns:w16du="http://schemas.microsoft.com/office/word/2023/wordml/word16du" xmlns:w16sdtdh="http://schemas.microsoft.com/office/word/2020/wordml/sdtdatahash" xmlns:w16sdtfl="http://schemas.microsoft.com/office/word/2024/wordml/sdtformatlock" xmlns:w16se="http://schemas.microsoft.com/office/word/2015/wordml/symex" xmlns:wpg="http://schemas.microsoft.com/office/word/2010/wordprocessingGroup" xmlns:wpi="http://schemas.microsoft.com/office/word/2010/wordprocessingInk" xmlns:wne="http://schemas.microsoft.com/office/word/2006/wordml" xmlns:wps="http://schemas.microsoft.com/office/word/2010/wordprocessingShape" mc:Ignorable="w14 w15 w16se w16cid w16 w16cex w16sdtdh w16sdtfl w16du wp14">
   <w:endnote w:type="separator" w:id="-1">
     <w:p>
       <w:pPr>
@@ -2447,7 +2770,7 @@
 </file>
 
 <file path=word/footer1.xml><?xml version="1.0" encoding="utf-8"?>
-<w:ftr xmlns:wpc="http://schemas.microsoft.com/office/word/2010/wordprocessingCanvas" xmlns:cx="http://schemas.microsoft.com/office/drawing/2014/chartex" xmlns:cx1="http://schemas.microsoft.com/office/drawing/2015/9/8/chartex" xmlns:cx2="http://schemas.microsoft.com/office/drawing/2015/10/21/chartex" xmlns:cx3="http://schemas.microsoft.com/office/drawing/2016/5/9/chartex" xmlns:cx4="http://schemas.microsoft.com/office/drawing/2016/5/10/chartex" xmlns:cx5="http://schemas.microsoft.com/office/drawing/2016/5/11/chartex" xmlns:cx6="http://schemas.microsoft.com/office/drawing/2016/5/12/chartex" xmlns:cx7="http://schemas.microsoft.com/office/drawing/2016/5/13/chartex" xmlns:cx8="http://schemas.microsoft.com/office/drawing/2016/5/14/chartex" xmlns:mc="http://schemas.openxmlformats.org/markup-compatibility/2006" xmlns:aink="http://schemas.microsoft.com/office/drawing/2016/ink" xmlns:am3d="http://schemas.microsoft.com/office/drawing/2017/model3d" xmlns:o="urn:schemas-microsoft-com:office:office" xmlns:oel="http://schemas.microsoft.com/office/2019/extlst" xmlns:r="http://schemas.openxmlformats.org/officeDocument/2006/relationships" xmlns:m="http://schemas.openxmlformats.org/officeDocument/2006/math" xmlns:v="urn:schemas-microsoft-com:vml" xmlns:wp14="http://schemas.microsoft.com/office/word/2010/wordprocessingDrawing" xmlns:wp="http://schemas.openxmlformats.org/drawingml/2006/wordprocessingDrawing" xmlns:w10="urn:schemas-microsoft-com:office:word" xmlns:w="http://schemas.openxmlformats.org/wordprocessingml/2006/main" xmlns:w14="http://schemas.microsoft.com/office/word/2010/wordml" xmlns:w15="http://schemas.microsoft.com/office/word/2012/wordml" xmlns:w16cex="http://schemas.microsoft.com/office/word/2018/wordml/cex" xmlns:w16cid="http://schemas.microsoft.com/office/word/2016/wordml/cid" xmlns:w16="http://schemas.microsoft.com/office/word/2018/wordml" xmlns:w16du="http://schemas.microsoft.com/office/word/2023/wordml/word16du" xmlns:w16sdtdh="http://schemas.microsoft.com/office/word/2020/wordml/sdtdatahash" xmlns:w16se="http://schemas.microsoft.com/office/word/2015/wordml/symex" xmlns:wpg="http://schemas.microsoft.com/office/word/2010/wordprocessingGroup" xmlns:wpi="http://schemas.microsoft.com/office/word/2010/wordprocessingInk" xmlns:wne="http://schemas.microsoft.com/office/word/2006/wordml" xmlns:wps="http://schemas.microsoft.com/office/word/2010/wordprocessingShape" mc:Ignorable="w14 w15 w16se w16cid w16 w16cex w16sdtdh w16du wp14">
+<w:ftr xmlns:wpc="http://schemas.microsoft.com/office/word/2010/wordprocessingCanvas" xmlns:cx="http://schemas.microsoft.com/office/drawing/2014/chartex" xmlns:cx1="http://schemas.microsoft.com/office/drawing/2015/9/8/chartex" xmlns:cx2="http://schemas.microsoft.com/office/drawing/2015/10/21/chartex" xmlns:cx3="http://schemas.microsoft.com/office/drawing/2016/5/9/chartex" xmlns:cx4="http://schemas.microsoft.com/office/drawing/2016/5/10/chartex" xmlns:cx5="http://schemas.microsoft.com/office/drawing/2016/5/11/chartex" xmlns:cx6="http://schemas.microsoft.com/office/drawing/2016/5/12/chartex" xmlns:cx7="http://schemas.microsoft.com/office/drawing/2016/5/13/chartex" xmlns:cx8="http://schemas.microsoft.com/office/drawing/2016/5/14/chartex" xmlns:mc="http://schemas.openxmlformats.org/markup-compatibility/2006" xmlns:aink="http://schemas.microsoft.com/office/drawing/2016/ink" xmlns:am3d="http://schemas.microsoft.com/office/drawing/2017/model3d" xmlns:o="urn:schemas-microsoft-com:office:office" xmlns:oel="http://schemas.microsoft.com/office/2019/extlst" xmlns:r="http://schemas.openxmlformats.org/officeDocument/2006/relationships" xmlns:m="http://schemas.openxmlformats.org/officeDocument/2006/math" xmlns:v="urn:schemas-microsoft-com:vml" xmlns:wp14="http://schemas.microsoft.com/office/word/2010/wordprocessingDrawing" xmlns:wp="http://schemas.openxmlformats.org/drawingml/2006/wordprocessingDrawing" xmlns:w10="urn:schemas-microsoft-com:office:word" xmlns:w="http://schemas.openxmlformats.org/wordprocessingml/2006/main" xmlns:w14="http://schemas.microsoft.com/office/word/2010/wordml" xmlns:w15="http://schemas.microsoft.com/office/word/2012/wordml" xmlns:w16cex="http://schemas.microsoft.com/office/word/2018/wordml/cex" xmlns:w16cid="http://schemas.microsoft.com/office/word/2016/wordml/cid" xmlns:w16="http://schemas.microsoft.com/office/word/2018/wordml" xmlns:w16du="http://schemas.microsoft.com/office/word/2023/wordml/word16du" xmlns:w16sdtdh="http://schemas.microsoft.com/office/word/2020/wordml/sdtdatahash" xmlns:w16sdtfl="http://schemas.microsoft.com/office/word/2024/wordml/sdtformatlock" xmlns:w16se="http://schemas.microsoft.com/office/word/2015/wordml/symex" xmlns:wpg="http://schemas.microsoft.com/office/word/2010/wordprocessingGroup" xmlns:wpi="http://schemas.microsoft.com/office/word/2010/wordprocessingInk" xmlns:wne="http://schemas.microsoft.com/office/word/2006/wordml" xmlns:wps="http://schemas.microsoft.com/office/word/2010/wordprocessingShape" mc:Ignorable="w14 w15 w16se w16cid w16 w16cex w16sdtdh w16sdtfl w16du wp14">
   <w:p>
     <w:pPr>
       <w:pStyle w:val="Voettekst"/>
@@ -2500,7 +2823,7 @@
 </file>
 
 <file path=word/footer2.xml><?xml version="1.0" encoding="utf-8"?>
-<w:ftr xmlns:wpc="http://schemas.microsoft.com/office/word/2010/wordprocessingCanvas" xmlns:cx="http://schemas.microsoft.com/office/drawing/2014/chartex" xmlns:cx1="http://schemas.microsoft.com/office/drawing/2015/9/8/chartex" xmlns:cx2="http://schemas.microsoft.com/office/drawing/2015/10/21/chartex" xmlns:cx3="http://schemas.microsoft.com/office/drawing/2016/5/9/chartex" xmlns:cx4="http://schemas.microsoft.com/office/drawing/2016/5/10/chartex" xmlns:cx5="http://schemas.microsoft.com/office/drawing/2016/5/11/chartex" xmlns:cx6="http://schemas.microsoft.com/office/drawing/2016/5/12/chartex" xmlns:cx7="http://schemas.microsoft.com/office/drawing/2016/5/13/chartex" xmlns:cx8="http://schemas.microsoft.com/office/drawing/2016/5/14/chartex" xmlns:mc="http://schemas.openxmlformats.org/markup-compatibility/2006" xmlns:aink="http://schemas.microsoft.com/office/drawing/2016/ink" xmlns:am3d="http://schemas.microsoft.com/office/drawing/2017/model3d" xmlns:o="urn:schemas-microsoft-com:office:office" xmlns:oel="http://schemas.microsoft.com/office/2019/extlst" xmlns:r="http://schemas.openxmlformats.org/officeDocument/2006/relationships" xmlns:m="http://schemas.openxmlformats.org/officeDocument/2006/math" xmlns:v="urn:schemas-microsoft-com:vml" xmlns:wp14="http://schemas.microsoft.com/office/word/2010/wordprocessingDrawing" xmlns:wp="http://schemas.openxmlformats.org/drawingml/2006/wordprocessingDrawing" xmlns:w10="urn:schemas-microsoft-com:office:word" xmlns:w="http://schemas.openxmlformats.org/wordprocessingml/2006/main" xmlns:w14="http://schemas.microsoft.com/office/word/2010/wordml" xmlns:w15="http://schemas.microsoft.com/office/word/2012/wordml" xmlns:w16cex="http://schemas.microsoft.com/office/word/2018/wordml/cex" xmlns:w16cid="http://schemas.microsoft.com/office/word/2016/wordml/cid" xmlns:w16="http://schemas.microsoft.com/office/word/2018/wordml" xmlns:w16du="http://schemas.microsoft.com/office/word/2023/wordml/word16du" xmlns:w16sdtdh="http://schemas.microsoft.com/office/word/2020/wordml/sdtdatahash" xmlns:w16se="http://schemas.microsoft.com/office/word/2015/wordml/symex" xmlns:wpg="http://schemas.microsoft.com/office/word/2010/wordprocessingGroup" xmlns:wpi="http://schemas.microsoft.com/office/word/2010/wordprocessingInk" xmlns:wne="http://schemas.microsoft.com/office/word/2006/wordml" xmlns:wps="http://schemas.microsoft.com/office/word/2010/wordprocessingShape" mc:Ignorable="w14 w15 w16se w16cid w16 w16cex w16sdtdh w16du wp14">
+<w:ftr xmlns:wpc="http://schemas.microsoft.com/office/word/2010/wordprocessingCanvas" xmlns:cx="http://schemas.microsoft.com/office/drawing/2014/chartex" xmlns:cx1="http://schemas.microsoft.com/office/drawing/2015/9/8/chartex" xmlns:cx2="http://schemas.microsoft.com/office/drawing/2015/10/21/chartex" xmlns:cx3="http://schemas.microsoft.com/office/drawing/2016/5/9/chartex" xmlns:cx4="http://schemas.microsoft.com/office/drawing/2016/5/10/chartex" xmlns:cx5="http://schemas.microsoft.com/office/drawing/2016/5/11/chartex" xmlns:cx6="http://schemas.microsoft.com/office/drawing/2016/5/12/chartex" xmlns:cx7="http://schemas.microsoft.com/office/drawing/2016/5/13/chartex" xmlns:cx8="http://schemas.microsoft.com/office/drawing/2016/5/14/chartex" xmlns:mc="http://schemas.openxmlformats.org/markup-compatibility/2006" xmlns:aink="http://schemas.microsoft.com/office/drawing/2016/ink" xmlns:am3d="http://schemas.microsoft.com/office/drawing/2017/model3d" xmlns:o="urn:schemas-microsoft-com:office:office" xmlns:oel="http://schemas.microsoft.com/office/2019/extlst" xmlns:r="http://schemas.openxmlformats.org/officeDocument/2006/relationships" xmlns:m="http://schemas.openxmlformats.org/officeDocument/2006/math" xmlns:v="urn:schemas-microsoft-com:vml" xmlns:wp14="http://schemas.microsoft.com/office/word/2010/wordprocessingDrawing" xmlns:wp="http://schemas.openxmlformats.org/drawingml/2006/wordprocessingDrawing" xmlns:w10="urn:schemas-microsoft-com:office:word" xmlns:w="http://schemas.openxmlformats.org/wordprocessingml/2006/main" xmlns:w14="http://schemas.microsoft.com/office/word/2010/wordml" xmlns:w15="http://schemas.microsoft.com/office/word/2012/wordml" xmlns:w16cex="http://schemas.microsoft.com/office/word/2018/wordml/cex" xmlns:w16cid="http://schemas.microsoft.com/office/word/2016/wordml/cid" xmlns:w16="http://schemas.microsoft.com/office/word/2018/wordml" xmlns:w16du="http://schemas.microsoft.com/office/word/2023/wordml/word16du" xmlns:w16sdtdh="http://schemas.microsoft.com/office/word/2020/wordml/sdtdatahash" xmlns:w16sdtfl="http://schemas.microsoft.com/office/word/2024/wordml/sdtformatlock" xmlns:w16se="http://schemas.microsoft.com/office/word/2015/wordml/symex" xmlns:wpg="http://schemas.microsoft.com/office/word/2010/wordprocessingGroup" xmlns:wpi="http://schemas.microsoft.com/office/word/2010/wordprocessingInk" xmlns:wne="http://schemas.microsoft.com/office/word/2006/wordml" xmlns:wps="http://schemas.microsoft.com/office/word/2010/wordprocessingShape" mc:Ignorable="w14 w15 w16se w16cid w16 w16cex w16sdtdh w16sdtfl w16du wp14">
   <w:p>
     <w:pPr>
       <w:rPr>
@@ -2512,7 +2835,7 @@
 </file>
 
 <file path=word/footnotes.xml><?xml version="1.0" encoding="utf-8"?>
-<w:footnotes xmlns:wpc="http://schemas.microsoft.com/office/word/2010/wordprocessingCanvas" xmlns:cx="http://schemas.microsoft.com/office/drawing/2014/chartex" xmlns:cx1="http://schemas.microsoft.com/office/drawing/2015/9/8/chartex" xmlns:cx2="http://schemas.microsoft.com/office/drawing/2015/10/21/chartex" xmlns:cx3="http://schemas.microsoft.com/office/drawing/2016/5/9/chartex" xmlns:cx4="http://schemas.microsoft.com/office/drawing/2016/5/10/chartex" xmlns:cx5="http://schemas.microsoft.com/office/drawing/2016/5/11/chartex" xmlns:cx6="http://schemas.microsoft.com/office/drawing/2016/5/12/chartex" xmlns:cx7="http://schemas.microsoft.com/office/drawing/2016/5/13/chartex" xmlns:cx8="http://schemas.microsoft.com/office/drawing/2016/5/14/chartex" xmlns:mc="http://schemas.openxmlformats.org/markup-compatibility/2006" xmlns:aink="http://schemas.microsoft.com/office/drawing/2016/ink" xmlns:am3d="http://schemas.microsoft.com/office/drawing/2017/model3d" xmlns:o="urn:schemas-microsoft-com:office:office" xmlns:oel="http://schemas.microsoft.com/office/2019/extlst" xmlns:r="http://schemas.openxmlformats.org/officeDocument/2006/relationships" xmlns:m="http://schemas.openxmlformats.org/officeDocument/2006/math" xmlns:v="urn:schemas-microsoft-com:vml" xmlns:wp14="http://schemas.microsoft.com/office/word/2010/wordprocessingDrawing" xmlns:wp="http://schemas.openxmlformats.org/drawingml/2006/wordprocessingDrawing" xmlns:w10="urn:schemas-microsoft-com:office:word" xmlns:w="http://schemas.openxmlformats.org/wordprocessingml/2006/main" xmlns:w14="http://schemas.microsoft.com/office/word/2010/wordml" xmlns:w15="http://schemas.microsoft.com/office/word/2012/wordml" xmlns:w16cex="http://schemas.microsoft.com/office/word/2018/wordml/cex" xmlns:w16cid="http://schemas.microsoft.com/office/word/2016/wordml/cid" xmlns:w16="http://schemas.microsoft.com/office/word/2018/wordml" xmlns:w16du="http://schemas.microsoft.com/office/word/2023/wordml/word16du" xmlns:w16sdtdh="http://schemas.microsoft.com/office/word/2020/wordml/sdtdatahash" xmlns:w16se="http://schemas.microsoft.com/office/word/2015/wordml/symex" xmlns:wpg="http://schemas.microsoft.com/office/word/2010/wordprocessingGroup" xmlns:wpi="http://schemas.microsoft.com/office/word/2010/wordprocessingInk" xmlns:wne="http://schemas.microsoft.com/office/word/2006/wordml" xmlns:wps="http://schemas.microsoft.com/office/word/2010/wordprocessingShape" mc:Ignorable="w14 w15 w16se w16cid w16 w16cex w16sdtdh w16du wp14">
+<w:footnotes xmlns:wpc="http://schemas.microsoft.com/office/word/2010/wordprocessingCanvas" xmlns:cx="http://schemas.microsoft.com/office/drawing/2014/chartex" xmlns:cx1="http://schemas.microsoft.com/office/drawing/2015/9/8/chartex" xmlns:cx2="http://schemas.microsoft.com/office/drawing/2015/10/21/chartex" xmlns:cx3="http://schemas.microsoft.com/office/drawing/2016/5/9/chartex" xmlns:cx4="http://schemas.microsoft.com/office/drawing/2016/5/10/chartex" xmlns:cx5="http://schemas.microsoft.com/office/drawing/2016/5/11/chartex" xmlns:cx6="http://schemas.microsoft.com/office/drawing/2016/5/12/chartex" xmlns:cx7="http://schemas.microsoft.com/office/drawing/2016/5/13/chartex" xmlns:cx8="http://schemas.microsoft.com/office/drawing/2016/5/14/chartex" xmlns:mc="http://schemas.openxmlformats.org/markup-compatibility/2006" xmlns:aink="http://schemas.microsoft.com/office/drawing/2016/ink" xmlns:am3d="http://schemas.microsoft.com/office/drawing/2017/model3d" xmlns:o="urn:schemas-microsoft-com:office:office" xmlns:oel="http://schemas.microsoft.com/office/2019/extlst" xmlns:r="http://schemas.openxmlformats.org/officeDocument/2006/relationships" xmlns:m="http://schemas.openxmlformats.org/officeDocument/2006/math" xmlns:v="urn:schemas-microsoft-com:vml" xmlns:wp14="http://schemas.microsoft.com/office/word/2010/wordprocessingDrawing" xmlns:wp="http://schemas.openxmlformats.org/drawingml/2006/wordprocessingDrawing" xmlns:w10="urn:schemas-microsoft-com:office:word" xmlns:w="http://schemas.openxmlformats.org/wordprocessingml/2006/main" xmlns:w14="http://schemas.microsoft.com/office/word/2010/wordml" xmlns:w15="http://schemas.microsoft.com/office/word/2012/wordml" xmlns:w16cex="http://schemas.microsoft.com/office/word/2018/wordml/cex" xmlns:w16cid="http://schemas.microsoft.com/office/word/2016/wordml/cid" xmlns:w16="http://schemas.microsoft.com/office/word/2018/wordml" xmlns:w16du="http://schemas.microsoft.com/office/word/2023/wordml/word16du" xmlns:w16sdtdh="http://schemas.microsoft.com/office/word/2020/wordml/sdtdatahash" xmlns:w16sdtfl="http://schemas.microsoft.com/office/word/2024/wordml/sdtformatlock" xmlns:w16se="http://schemas.microsoft.com/office/word/2015/wordml/symex" xmlns:wpg="http://schemas.microsoft.com/office/word/2010/wordprocessingGroup" xmlns:wpi="http://schemas.microsoft.com/office/word/2010/wordprocessingInk" xmlns:wne="http://schemas.microsoft.com/office/word/2006/wordml" xmlns:wps="http://schemas.microsoft.com/office/word/2010/wordprocessingShape" mc:Ignorable="w14 w15 w16se w16cid w16 w16cex w16sdtdh w16sdtfl w16du wp14">
   <w:footnote w:type="separator" w:id="-1">
     <w:p>
       <w:pPr>
@@ -2541,7 +2864,7 @@
 </file>
 
 <file path=word/numbering.xml><?xml version="1.0" encoding="utf-8"?>
-<w:numbering xmlns:wpc="http://schemas.microsoft.com/office/word/2010/wordprocessingCanvas" xmlns:cx="http://schemas.microsoft.com/office/drawing/2014/chartex" xmlns:cx1="http://schemas.microsoft.com/office/drawing/2015/9/8/chartex" xmlns:cx2="http://schemas.microsoft.com/office/drawing/2015/10/21/chartex" xmlns:cx3="http://schemas.microsoft.com/office/drawing/2016/5/9/chartex" xmlns:cx4="http://schemas.microsoft.com/office/drawing/2016/5/10/chartex" xmlns:cx5="http://schemas.microsoft.com/office/drawing/2016/5/11/chartex" xmlns:cx6="http://schemas.microsoft.com/office/drawing/2016/5/12/chartex" xmlns:cx7="http://schemas.microsoft.com/office/drawing/2016/5/13/chartex" xmlns:cx8="http://schemas.microsoft.com/office/drawing/2016/5/14/chartex" xmlns:mc="http://schemas.openxmlformats.org/markup-compatibility/2006" xmlns:aink="http://schemas.microsoft.com/office/drawing/2016/ink" xmlns:am3d="http://schemas.microsoft.com/office/drawing/2017/model3d" xmlns:o="urn:schemas-microsoft-com:office:office" xmlns:oel="http://schemas.microsoft.com/office/2019/extlst" xmlns:r="http://schemas.openxmlformats.org/officeDocument/2006/relationships" xmlns:m="http://schemas.openxmlformats.org/officeDocument/2006/math" xmlns:v="urn:schemas-microsoft-com:vml" xmlns:wp14="http://schemas.microsoft.com/office/word/2010/wordprocessingDrawing" xmlns:wp="http://schemas.openxmlformats.org/drawingml/2006/wordprocessingDrawing" xmlns:w10="urn:schemas-microsoft-com:office:word" xmlns:w="http://schemas.openxmlformats.org/wordprocessingml/2006/main" xmlns:w14="http://schemas.microsoft.com/office/word/2010/wordml" xmlns:w15="http://schemas.microsoft.com/office/word/2012/wordml" xmlns:w16cex="http://schemas.microsoft.com/office/word/2018/wordml/cex" xmlns:w16cid="http://schemas.microsoft.com/office/word/2016/wordml/cid" xmlns:w16="http://schemas.microsoft.com/office/word/2018/wordml" xmlns:w16du="http://schemas.microsoft.com/office/word/2023/wordml/word16du" xmlns:w16sdtdh="http://schemas.microsoft.com/office/word/2020/wordml/sdtdatahash" xmlns:w16se="http://schemas.microsoft.com/office/word/2015/wordml/symex" xmlns:wpg="http://schemas.microsoft.com/office/word/2010/wordprocessingGroup" xmlns:wpi="http://schemas.microsoft.com/office/word/2010/wordprocessingInk" xmlns:wne="http://schemas.microsoft.com/office/word/2006/wordml" xmlns:wps="http://schemas.microsoft.com/office/word/2010/wordprocessingShape" mc:Ignorable="w14 w15 w16se w16cid w16 w16cex w16sdtdh w16du wp14">
+<w:numbering xmlns:wpc="http://schemas.microsoft.com/office/word/2010/wordprocessingCanvas" xmlns:cx="http://schemas.microsoft.com/office/drawing/2014/chartex" xmlns:cx1="http://schemas.microsoft.com/office/drawing/2015/9/8/chartex" xmlns:cx2="http://schemas.microsoft.com/office/drawing/2015/10/21/chartex" xmlns:cx3="http://schemas.microsoft.com/office/drawing/2016/5/9/chartex" xmlns:cx4="http://schemas.microsoft.com/office/drawing/2016/5/10/chartex" xmlns:cx5="http://schemas.microsoft.com/office/drawing/2016/5/11/chartex" xmlns:cx6="http://schemas.microsoft.com/office/drawing/2016/5/12/chartex" xmlns:cx7="http://schemas.microsoft.com/office/drawing/2016/5/13/chartex" xmlns:cx8="http://schemas.microsoft.com/office/drawing/2016/5/14/chartex" xmlns:mc="http://schemas.openxmlformats.org/markup-compatibility/2006" xmlns:aink="http://schemas.microsoft.com/office/drawing/2016/ink" xmlns:am3d="http://schemas.microsoft.com/office/drawing/2017/model3d" xmlns:o="urn:schemas-microsoft-com:office:office" xmlns:oel="http://schemas.microsoft.com/office/2019/extlst" xmlns:r="http://schemas.openxmlformats.org/officeDocument/2006/relationships" xmlns:m="http://schemas.openxmlformats.org/officeDocument/2006/math" xmlns:v="urn:schemas-microsoft-com:vml" xmlns:wp14="http://schemas.microsoft.com/office/word/2010/wordprocessingDrawing" xmlns:wp="http://schemas.openxmlformats.org/drawingml/2006/wordprocessingDrawing" xmlns:w10="urn:schemas-microsoft-com:office:word" xmlns:w="http://schemas.openxmlformats.org/wordprocessingml/2006/main" xmlns:w14="http://schemas.microsoft.com/office/word/2010/wordml" xmlns:w15="http://schemas.microsoft.com/office/word/2012/wordml" xmlns:w16cex="http://schemas.microsoft.com/office/word/2018/wordml/cex" xmlns:w16cid="http://schemas.microsoft.com/office/word/2016/wordml/cid" xmlns:w16="http://schemas.microsoft.com/office/word/2018/wordml" xmlns:w16du="http://schemas.microsoft.com/office/word/2023/wordml/word16du" xmlns:w16sdtdh="http://schemas.microsoft.com/office/word/2020/wordml/sdtdatahash" xmlns:w16sdtfl="http://schemas.microsoft.com/office/word/2024/wordml/sdtformatlock" xmlns:w16se="http://schemas.microsoft.com/office/word/2015/wordml/symex" xmlns:wpg="http://schemas.microsoft.com/office/word/2010/wordprocessingGroup" xmlns:wpi="http://schemas.microsoft.com/office/word/2010/wordprocessingInk" xmlns:wne="http://schemas.microsoft.com/office/word/2006/wordml" xmlns:wps="http://schemas.microsoft.com/office/word/2010/wordprocessingShape" mc:Ignorable="w14 w15 w16se w16cid w16 w16cex w16sdtdh w16sdtfl w16du wp14">
   <w:abstractNum w:abstractNumId="0" w15:restartNumberingAfterBreak="0">
     <w:nsid w:val="00000001"/>
     <w:multiLevelType w:val="multilevel"/>
@@ -5554,7 +5877,7 @@
 </file>
 
 <file path=word/styles.xml><?xml version="1.0" encoding="utf-8"?>
-<w:styles xmlns:mc="http://schemas.openxmlformats.org/markup-compatibility/2006" xmlns:r="http://schemas.openxmlformats.org/officeDocument/2006/relationships" xmlns:w="http://schemas.openxmlformats.org/wordprocessingml/2006/main" xmlns:w14="http://schemas.microsoft.com/office/word/2010/wordml" xmlns:w15="http://schemas.microsoft.com/office/word/2012/wordml" xmlns:w16cex="http://schemas.microsoft.com/office/word/2018/wordml/cex" xmlns:w16cid="http://schemas.microsoft.com/office/word/2016/wordml/cid" xmlns:w16="http://schemas.microsoft.com/office/word/2018/wordml" xmlns:w16du="http://schemas.microsoft.com/office/word/2023/wordml/word16du" xmlns:w16sdtdh="http://schemas.microsoft.com/office/word/2020/wordml/sdtdatahash" xmlns:w16se="http://schemas.microsoft.com/office/word/2015/wordml/symex" mc:Ignorable="w14 w15 w16se w16cid w16 w16cex w16sdtdh w16du">
+<w:styles xmlns:mc="http://schemas.openxmlformats.org/markup-compatibility/2006" xmlns:r="http://schemas.openxmlformats.org/officeDocument/2006/relationships" xmlns:w="http://schemas.openxmlformats.org/wordprocessingml/2006/main" xmlns:w14="http://schemas.microsoft.com/office/word/2010/wordml" xmlns:w15="http://schemas.microsoft.com/office/word/2012/wordml" xmlns:w16cex="http://schemas.microsoft.com/office/word/2018/wordml/cex" xmlns:w16cid="http://schemas.microsoft.com/office/word/2016/wordml/cid" xmlns:w16="http://schemas.microsoft.com/office/word/2018/wordml" xmlns:w16du="http://schemas.microsoft.com/office/word/2023/wordml/word16du" xmlns:w16sdtdh="http://schemas.microsoft.com/office/word/2020/wordml/sdtdatahash" xmlns:w16sdtfl="http://schemas.microsoft.com/office/word/2024/wordml/sdtformatlock" xmlns:w16se="http://schemas.microsoft.com/office/word/2015/wordml/symex" mc:Ignorable="w14 w15 w16se w16cid w16 w16cex w16sdtdh w16sdtfl w16du">
   <w:docDefaults>
     <w:rPrDefault>
       <w:rPr>

</xml_diff>

<commit_message>
Fixed: When editing an enum value one could cause an exception with key sequences like: numlock on, enter edit, backspace to erase all, numlock off, Enter.  Or like: enter edit, backspace 3 times, Enter.
git-svn-id: http://visualsvn.edna.local/EDNA/ModbusControl/V2@4891 03c8d257-35a7-c645-9f01-50f27e98b9e6
</commit_message>
<xml_diff>
--- a/Manuals/ModbusControl - Release notes.docx
+++ b/Manuals/ModbusControl - Release notes.docx
@@ -63,6 +63,9 @@
           <w:ilvl w:val="0"/>
           <w:numId w:val="4"/>
         </w:numPr>
+        <w:rPr>
+          <w:rFonts w:hint="eastAsia"/>
+        </w:rPr>
       </w:pPr>
       <w:r>
         <w:t>ModbusImport and ModbusExport now have a -retries parameter.</w:t>
@@ -90,9 +93,6 @@
           <w:ilvl w:val="0"/>
           <w:numId w:val="4"/>
         </w:numPr>
-        <w:rPr>
-          <w:rFonts w:hint="eastAsia"/>
-        </w:rPr>
       </w:pPr>
       <w:r>
         <w:rPr>
@@ -125,19 +125,17 @@
         <w:br/>
         <w:t>-</w:t>
       </w:r>
-      <w:proofErr w:type="spellStart"/>
       <w:r>
         <w:rPr>
           <w:rFonts w:hint="eastAsia"/>
         </w:rPr>
         <w:t>continueonerror</w:t>
       </w:r>
-      <w:proofErr w:type="spellEnd"/>
       <w:r>
         <w:t xml:space="preserve"> options.</w:t>
       </w:r>
       <w:r>
-        <w:t xml:space="preserve"> Always show counters, not only in -verbose mode.</w:t>
+        <w:t xml:space="preserve"> </w:t>
       </w:r>
     </w:p>
     <w:p>
@@ -154,9 +152,38 @@
         <w:rPr>
           <w:rFonts w:hint="eastAsia"/>
         </w:rPr>
+        <w:t>ModbusImport</w:t>
+      </w:r>
+      <w:r>
+        <w:t xml:space="preserve"> and </w:t>
+      </w:r>
+      <w:r>
+        <w:rPr>
+          <w:rFonts w:hint="eastAsia"/>
+        </w:rPr>
         <w:t xml:space="preserve">ModbusExport: </w:t>
       </w:r>
       <w:r>
+        <w:t>Always show counters, not only in -verbose mode.</w:t>
+      </w:r>
+    </w:p>
+    <w:p>
+      <w:pPr>
+        <w:numPr>
+          <w:ilvl w:val="0"/>
+          <w:numId w:val="4"/>
+        </w:numPr>
+        <w:rPr>
+          <w:rFonts w:hint="eastAsia"/>
+        </w:rPr>
+      </w:pPr>
+      <w:r>
+        <w:rPr>
+          <w:rFonts w:hint="eastAsia"/>
+        </w:rPr>
+        <w:t xml:space="preserve">ModbusExport: </w:t>
+      </w:r>
+      <w:r>
         <w:t>“I</w:t>
       </w:r>
       <w:r>
@@ -189,8 +216,36 @@
         </w:rPr>
         <w:t xml:space="preserve">. </w:t>
       </w:r>
-      <w:r>
-        <w:t>Always show counters, not only in -verbose mode.</w:t>
+    </w:p>
+    <w:p>
+      <w:pPr>
+        <w:numPr>
+          <w:ilvl w:val="0"/>
+          <w:numId w:val="4"/>
+        </w:numPr>
+      </w:pPr>
+      <w:r>
+        <w:t xml:space="preserve">A uint16 enum translation with a value of 65535 as enum </w:t>
+      </w:r>
+      <w:r>
+        <w:t>did not work</w:t>
+      </w:r>
+    </w:p>
+    <w:p>
+      <w:pPr>
+        <w:numPr>
+          <w:ilvl w:val="0"/>
+          <w:numId w:val="4"/>
+        </w:numPr>
+        <w:rPr>
+          <w:rFonts w:hint="eastAsia"/>
+        </w:rPr>
+      </w:pPr>
+      <w:r>
+        <w:t xml:space="preserve">When editing an enum value one could cause an exception with key sequences like: numlock on, enter edit, backspace to erase all, numlock off, Enter.  Or like: enter edit, backspace 3 times, Enter. </w:t>
+      </w:r>
+      <w:r>
+        <w:t xml:space="preserve"> </w:t>
       </w:r>
     </w:p>
     <w:p>
@@ -335,15 +390,7 @@
         </w:rPr>
       </w:pPr>
       <w:r>
-        <w:t>Mbc file: &lt;</w:t>
-      </w:r>
-      <w:proofErr w:type="spellStart"/>
-      <w:r>
-        <w:t>exportorder</w:t>
-      </w:r>
-      <w:proofErr w:type="spellEnd"/>
-      <w:r>
-        <w:t>&gt; element added.</w:t>
+        <w:t>Mbc file: &lt;exportorder&gt; element added.</w:t>
       </w:r>
     </w:p>
     <w:p>
@@ -437,14 +484,12 @@
           <w:rFonts w:hint="eastAsia"/>
         </w:rPr>
       </w:pPr>
-      <w:proofErr w:type="spellStart"/>
       <w:r>
         <w:rPr>
           <w:rFonts w:hint="eastAsia"/>
         </w:rPr>
         <w:t>WriteHoldingregisterFC</w:t>
       </w:r>
-      <w:proofErr w:type="spellEnd"/>
       <w:r>
         <w:t xml:space="preserve"> </w:t>
       </w:r>
@@ -484,7 +529,13 @@
         </w:rPr>
       </w:pPr>
       <w:r>
-        <w:t>Stop-on-error mechanism fix.</w:t>
+        <w:t>Stop-on-error mechanism fix</w:t>
+      </w:r>
+      <w:r>
+        <w:t>ed</w:t>
+      </w:r>
+      <w:r>
+        <w:t>.</w:t>
       </w:r>
     </w:p>
     <w:p>
@@ -578,21 +629,7 @@
         <w:rPr>
           <w:rFonts w:hint="eastAsia"/>
         </w:rPr>
-        <w:t xml:space="preserve">Enum registers editing now has a dropdown </w:t>
-      </w:r>
-      <w:proofErr w:type="spellStart"/>
-      <w:r>
-        <w:rPr>
-          <w:rFonts w:hint="eastAsia"/>
-        </w:rPr>
-        <w:t>combobox</w:t>
-      </w:r>
-      <w:proofErr w:type="spellEnd"/>
-      <w:r>
-        <w:rPr>
-          <w:rFonts w:hint="eastAsia"/>
-        </w:rPr>
-        <w:t xml:space="preserve"> with possible values.</w:t>
+        <w:t>Enum registers editing now has a dropdown combobox with possible values.</w:t>
       </w:r>
     </w:p>
     <w:p>
@@ -704,6 +741,7 @@
         <w:rPr>
           <w:rFonts w:hint="eastAsia"/>
         </w:rPr>
+        <w:lastRenderedPageBreak/>
         <w:t>Fixes</w:t>
       </w:r>
     </w:p>
@@ -719,34 +757,337 @@
         </w:rPr>
       </w:pPr>
       <w:r>
-        <w:t xml:space="preserve">In </w:t>
-      </w:r>
-      <w:proofErr w:type="spellStart"/>
-      <w:r>
-        <w:t>Import_file</w:t>
-      </w:r>
-      <w:proofErr w:type="spellEnd"/>
+        <w:t xml:space="preserve">In Import_file and Import_compare: writing/comparing a float32 </w:t>
+      </w:r>
+      <w:r>
+        <w:t xml:space="preserve">value </w:t>
+      </w:r>
+      <w:r>
+        <w:t>no longer worked.</w:t>
+      </w:r>
+    </w:p>
+    <w:p>
+      <w:pPr>
+        <w:pStyle w:val="Lijstalinea"/>
+        <w:numPr>
+          <w:ilvl w:val="0"/>
+          <w:numId w:val="4"/>
+        </w:numPr>
+        <w:rPr>
+          <w:rFonts w:hint="eastAsia"/>
+        </w:rPr>
+      </w:pPr>
+      <w:r>
+        <w:rPr>
+          <w:rFonts w:hint="eastAsia"/>
+        </w:rPr>
+        <w:t xml:space="preserve">Ascii32 register writing </w:t>
+      </w:r>
+      <w:r>
+        <w:t>fixed.</w:t>
+      </w:r>
+    </w:p>
+    <w:p>
+      <w:pPr>
+        <w:pStyle w:val="Lijstalinea"/>
+        <w:numPr>
+          <w:ilvl w:val="0"/>
+          <w:numId w:val="4"/>
+        </w:numPr>
+        <w:rPr>
+          <w:rFonts w:hint="eastAsia"/>
+        </w:rPr>
+      </w:pPr>
+      <w:r>
+        <w:rPr>
+          <w:rFonts w:hint="eastAsia"/>
+        </w:rPr>
+        <w:t xml:space="preserve">Resizing column width is now </w:t>
+      </w:r>
+      <w:r>
+        <w:t>global for all tabs</w:t>
+      </w:r>
+      <w:r>
+        <w:rPr>
+          <w:rFonts w:hint="eastAsia"/>
+        </w:rPr>
+        <w:t>.</w:t>
+      </w:r>
+    </w:p>
+    <w:p>
+      <w:pPr>
+        <w:pStyle w:val="Lijstalinea"/>
+        <w:numPr>
+          <w:ilvl w:val="0"/>
+          <w:numId w:val="4"/>
+        </w:numPr>
+        <w:rPr>
+          <w:rFonts w:hint="eastAsia"/>
+        </w:rPr>
+      </w:pPr>
+      <w:r>
+        <w:rPr>
+          <w:rFonts w:hint="eastAsia"/>
+        </w:rPr>
+        <w:t>Zoom</w:t>
+      </w:r>
+      <w:r>
+        <w:t>ing</w:t>
+      </w:r>
+      <w:r>
+        <w:rPr>
+          <w:rFonts w:hint="eastAsia"/>
+        </w:rPr>
+        <w:t xml:space="preserve"> now also adjusts the size of the column headers.</w:t>
+      </w:r>
+    </w:p>
+    <w:p>
+      <w:pPr>
+        <w:pStyle w:val="Lijstalinea"/>
+        <w:numPr>
+          <w:ilvl w:val="0"/>
+          <w:numId w:val="4"/>
+        </w:numPr>
+        <w:rPr>
+          <w:rFonts w:hint="eastAsia"/>
+        </w:rPr>
+      </w:pPr>
+      <w:r>
+        <w:rPr>
+          <w:rFonts w:hint="eastAsia"/>
+        </w:rPr>
+        <w:t>You can now close the [Project_Configuration], [Save_project_file] and [About] forms with the ESC button</w:t>
+      </w:r>
+      <w:r>
+        <w:t xml:space="preserve"> too</w:t>
+      </w:r>
+      <w:r>
+        <w:rPr>
+          <w:rFonts w:hint="eastAsia"/>
+        </w:rPr>
+        <w:t>.</w:t>
+      </w:r>
+    </w:p>
+    <w:p>
+      <w:pPr>
+        <w:pStyle w:val="Lijstalinea"/>
+        <w:numPr>
+          <w:ilvl w:val="0"/>
+          <w:numId w:val="4"/>
+        </w:numPr>
+        <w:rPr>
+          <w:rFonts w:hint="eastAsia"/>
+        </w:rPr>
+      </w:pPr>
+      <w:r>
+        <w:rPr>
+          <w:rFonts w:hint="eastAsia"/>
+        </w:rPr>
+        <w:t>The expand/collapse icons scale with zoom</w:t>
+      </w:r>
+      <w:r>
+        <w:t>ing</w:t>
+      </w:r>
+      <w:r>
+        <w:rPr>
+          <w:rFonts w:hint="eastAsia"/>
+        </w:rPr>
+        <w:t>.</w:t>
+      </w:r>
+    </w:p>
+    <w:p>
+      <w:pPr>
+        <w:pStyle w:val="Lijstalinea"/>
+        <w:numPr>
+          <w:ilvl w:val="0"/>
+          <w:numId w:val="4"/>
+        </w:numPr>
+        <w:rPr>
+          <w:rFonts w:hint="eastAsia"/>
+        </w:rPr>
+      </w:pPr>
+      <w:r>
+        <w:rPr>
+          <w:rFonts w:hint="eastAsia"/>
+        </w:rPr>
+        <w:t>If an error occurs when loading an mbc file, no auto-connect to the slave/server is done.</w:t>
+      </w:r>
+    </w:p>
+    <w:p>
+      <w:pPr>
+        <w:pStyle w:val="Lijstalinea"/>
+        <w:numPr>
+          <w:ilvl w:val="0"/>
+          <w:numId w:val="4"/>
+        </w:numPr>
+        <w:rPr>
+          <w:rFonts w:hint="eastAsia"/>
+        </w:rPr>
+      </w:pPr>
+      <w:r>
+        <w:rPr>
+          <w:rFonts w:hint="eastAsia"/>
+        </w:rPr>
+        <w:t>With Import_file and Import_compare: writing/compar</w:t>
+      </w:r>
+      <w:r>
+        <w:t>ing</w:t>
+      </w:r>
+      <w:r>
+        <w:rPr>
+          <w:rFonts w:hint="eastAsia"/>
+        </w:rPr>
+        <w:t xml:space="preserve"> a float32 </w:t>
+      </w:r>
+      <w:r>
+        <w:t>is fixed</w:t>
+      </w:r>
+      <w:r>
+        <w:rPr>
+          <w:rFonts w:hint="eastAsia"/>
+        </w:rPr>
+        <w:t>.</w:t>
+      </w:r>
+    </w:p>
+    <w:p>
+      <w:pPr>
+        <w:pStyle w:val="Kop1"/>
+        <w:rPr>
+          <w:rFonts w:hint="eastAsia"/>
+        </w:rPr>
+      </w:pPr>
+      <w:r>
+        <w:t>v2.0.14 -- 2022-11-08</w:t>
+      </w:r>
+    </w:p>
+    <w:p>
+      <w:pPr>
+        <w:pStyle w:val="Kop3"/>
+        <w:rPr>
+          <w:rFonts w:hint="eastAsia"/>
+        </w:rPr>
+      </w:pPr>
+      <w:r>
+        <w:t>Features</w:t>
+      </w:r>
+    </w:p>
+    <w:p>
+      <w:pPr>
+        <w:numPr>
+          <w:ilvl w:val="0"/>
+          <w:numId w:val="4"/>
+        </w:numPr>
+        <w:rPr>
+          <w:rFonts w:hint="eastAsia"/>
+        </w:rPr>
+      </w:pPr>
+      <w:r>
+        <w:t xml:space="preserve">Added command line parameters. </w:t>
+      </w:r>
+      <w:r>
+        <w:t>These r</w:t>
+      </w:r>
+      <w:r>
+        <w:t xml:space="preserve">eplaces </w:t>
+      </w:r>
+      <w:r>
+        <w:t xml:space="preserve">the </w:t>
+      </w:r>
+      <w:r>
+        <w:t>LocalOverrides</w:t>
+      </w:r>
+      <w:r>
+        <w:t xml:space="preserve"> mechanism.</w:t>
+      </w:r>
+    </w:p>
+    <w:p>
+      <w:pPr>
+        <w:numPr>
+          <w:ilvl w:val="0"/>
+          <w:numId w:val="4"/>
+        </w:numPr>
+        <w:rPr>
+          <w:rFonts w:hint="eastAsia"/>
+        </w:rPr>
+      </w:pPr>
+      <w:r>
+        <w:t xml:space="preserve">LocalOverrides </w:t>
+      </w:r>
+      <w:r>
+        <w:t>mechanism removed.</w:t>
+      </w:r>
+    </w:p>
+    <w:p>
+      <w:pPr>
+        <w:numPr>
+          <w:ilvl w:val="0"/>
+          <w:numId w:val="4"/>
+        </w:numPr>
+        <w:rPr>
+          <w:rFonts w:hint="eastAsia"/>
+        </w:rPr>
+      </w:pPr>
+      <w:r>
+        <w:t>Save project file: the [Update XML to current version] checkbox is now enabled by default.</w:t>
+      </w:r>
+    </w:p>
+    <w:p>
+      <w:pPr>
+        <w:numPr>
+          <w:ilvl w:val="0"/>
+          <w:numId w:val="4"/>
+        </w:numPr>
+        <w:rPr>
+          <w:rFonts w:hint="eastAsia"/>
+        </w:rPr>
+      </w:pPr>
+      <w:r>
+        <w:t>Options form: tooltips improved.</w:t>
+      </w:r>
+    </w:p>
+    <w:p>
+      <w:pPr>
+        <w:numPr>
+          <w:ilvl w:val="0"/>
+          <w:numId w:val="4"/>
+        </w:numPr>
+        <w:rPr>
+          <w:rFonts w:hint="eastAsia"/>
+        </w:rPr>
+      </w:pPr>
+      <w:r>
+        <w:t>Grid: Regist</w:t>
+      </w:r>
+      <w:r>
+        <w:t>er</w:t>
+      </w:r>
+      <w:r>
+        <w:t xml:space="preserve"> </w:t>
+      </w:r>
+      <w:r>
+        <w:t xml:space="preserve">column menu now has </w:t>
+      </w:r>
+      <w:r>
+        <w:t xml:space="preserve"> [</w:t>
+      </w:r>
+      <w:r>
+        <w:t>Expand all]</w:t>
+      </w:r>
       <w:r>
         <w:t xml:space="preserve"> and </w:t>
       </w:r>
-      <w:proofErr w:type="spellStart"/>
-      <w:r>
-        <w:t>Import_compare</w:t>
-      </w:r>
-      <w:proofErr w:type="spellEnd"/>
-      <w:r>
-        <w:t xml:space="preserve">: writing/comparing a float32 </w:t>
-      </w:r>
-      <w:r>
-        <w:t xml:space="preserve">value </w:t>
-      </w:r>
-      <w:r>
-        <w:t>no longer worked.</w:t>
-      </w:r>
-    </w:p>
-    <w:p>
-      <w:pPr>
-        <w:pStyle w:val="Lijstalinea"/>
+      <w:r>
+        <w:t>[</w:t>
+      </w:r>
+      <w:r>
+        <w:t>Collapse all</w:t>
+      </w:r>
+      <w:r>
+        <w:t>].</w:t>
+      </w:r>
+    </w:p>
+    <w:p>
+      <w:pPr>
         <w:numPr>
           <w:ilvl w:val="0"/>
           <w:numId w:val="4"/>
@@ -756,18 +1097,23 @@
         </w:rPr>
       </w:pPr>
       <w:r>
-        <w:rPr>
-          <w:rFonts w:hint="eastAsia"/>
-        </w:rPr>
-        <w:t xml:space="preserve">Ascii32 register writing </w:t>
-      </w:r>
-      <w:r>
-        <w:t>fixed.</w:t>
-      </w:r>
-    </w:p>
-    <w:p>
-      <w:pPr>
-        <w:pStyle w:val="Lijstalinea"/>
+        <w:t xml:space="preserve">Mbc project file: &lt;longdescr&gt; </w:t>
+      </w:r>
+      <w:r>
+        <w:t xml:space="preserve">element </w:t>
+      </w:r>
+      <w:r>
+        <w:t xml:space="preserve">added. </w:t>
+      </w:r>
+      <w:r>
+        <w:t>Adds a long multiline text that is show when the mouse is hoovered over the register decription</w:t>
+      </w:r>
+      <w:r>
+        <w:t>.</w:t>
+      </w:r>
+    </w:p>
+    <w:p>
+      <w:pPr>
         <w:numPr>
           <w:ilvl w:val="0"/>
           <w:numId w:val="4"/>
@@ -777,1733 +1123,1482 @@
         </w:rPr>
       </w:pPr>
       <w:r>
-        <w:rPr>
-          <w:rFonts w:hint="eastAsia"/>
-        </w:rPr>
+        <w:t>Mbc project file: &lt;include&gt; element added.</w:t>
+      </w:r>
+    </w:p>
+    <w:p>
+      <w:pPr>
+        <w:pStyle w:val="Kop3"/>
+        <w:numPr>
+          <w:ilvl w:val="0"/>
+          <w:numId w:val="0"/>
+        </w:numPr>
+        <w:ind w:left="680" w:hanging="431"/>
+        <w:rPr>
+          <w:rFonts w:hint="eastAsia"/>
+        </w:rPr>
+      </w:pPr>
+      <w:r>
+        <w:t>Fixes</w:t>
+      </w:r>
+    </w:p>
+    <w:p>
+      <w:pPr>
+        <w:numPr>
+          <w:ilvl w:val="0"/>
+          <w:numId w:val="4"/>
+        </w:numPr>
+        <w:rPr>
+          <w:rFonts w:hint="eastAsia"/>
+        </w:rPr>
+      </w:pPr>
+      <w:r>
+        <w:t>[</w:t>
+      </w:r>
+      <w:r>
+        <w:t>Open project file location in Explorer] now works if you gave a filename without a path on the command line.</w:t>
+      </w:r>
+    </w:p>
+    <w:p>
+      <w:pPr>
+        <w:numPr>
+          <w:ilvl w:val="0"/>
+          <w:numId w:val="4"/>
+        </w:numPr>
+        <w:rPr>
+          <w:rFonts w:hint="eastAsia"/>
+        </w:rPr>
+      </w:pPr>
+      <w:r>
+        <w:t xml:space="preserve">The temporary red </w:t>
+      </w:r>
+      <w:r>
+        <w:t>colouring</w:t>
+      </w:r>
+      <w:r>
+        <w:t xml:space="preserve"> of the value field after entering </w:t>
+      </w:r>
+      <w:r>
+        <w:t xml:space="preserve">an invalid value </w:t>
+      </w:r>
+      <w:r>
+        <w:t>has been improved.</w:t>
+      </w:r>
+    </w:p>
+    <w:p>
+      <w:pPr>
+        <w:numPr>
+          <w:ilvl w:val="0"/>
+          <w:numId w:val="4"/>
+        </w:numPr>
+        <w:rPr>
+          <w:rFonts w:hint="eastAsia"/>
+        </w:rPr>
+      </w:pPr>
+      <w:r>
+        <w:t>Edit</w:t>
+      </w:r>
+      <w:r>
+        <w:t xml:space="preserve"> enter/escape </w:t>
+      </w:r>
+      <w:r>
+        <w:t>handling is improved</w:t>
+      </w:r>
+      <w:r>
+        <w:t>.</w:t>
+      </w:r>
+    </w:p>
+    <w:p>
+      <w:pPr>
+        <w:numPr>
+          <w:ilvl w:val="0"/>
+          <w:numId w:val="4"/>
+        </w:numPr>
+        <w:rPr>
+          <w:rFonts w:hint="eastAsia"/>
+        </w:rPr>
+      </w:pPr>
+      <w:r>
+        <w:t xml:space="preserve">In the notification screen that the serial port could not be opened: the [Port] </w:t>
+      </w:r>
+      <w:r>
+        <w:t>combo box</w:t>
+      </w:r>
+      <w:r>
+        <w:t xml:space="preserve"> now automatically refreshes the list of serial ports.</w:t>
+      </w:r>
+    </w:p>
+    <w:p>
+      <w:pPr>
+        <w:pStyle w:val="Kop1"/>
+        <w:rPr>
+          <w:rFonts w:hint="eastAsia"/>
+        </w:rPr>
+      </w:pPr>
+      <w:r>
+        <w:t>v2.0.13 -- 2022-07-11</w:t>
+      </w:r>
+    </w:p>
+    <w:p>
+      <w:pPr>
+        <w:pStyle w:val="Kop3"/>
+        <w:rPr>
+          <w:rFonts w:hint="eastAsia"/>
+        </w:rPr>
+      </w:pPr>
+      <w:r>
+        <w:t>Features</w:t>
+      </w:r>
+    </w:p>
+    <w:p>
+      <w:pPr>
+        <w:numPr>
+          <w:ilvl w:val="0"/>
+          <w:numId w:val="4"/>
+        </w:numPr>
+        <w:rPr>
+          <w:rFonts w:hint="eastAsia"/>
+        </w:rPr>
+      </w:pPr>
+      <w:r>
+        <w:t xml:space="preserve">Added Find/Filter bar. </w:t>
+      </w:r>
+      <w:r>
+        <w:t>Open it using</w:t>
+      </w:r>
+      <w:r>
+        <w:t xml:space="preserve"> Control-F. There is also an option </w:t>
+      </w:r>
+      <w:r>
+        <w:t>“</w:t>
+      </w:r>
+      <w:r>
+        <w:t>Clear Find/Filter on tab change</w:t>
+      </w:r>
+      <w:r>
+        <w:t>”</w:t>
+      </w:r>
+      <w:r>
+        <w:t>.</w:t>
+      </w:r>
+    </w:p>
+    <w:p>
+      <w:pPr>
+        <w:numPr>
+          <w:ilvl w:val="0"/>
+          <w:numId w:val="4"/>
+        </w:numPr>
+        <w:rPr>
+          <w:rFonts w:hint="eastAsia"/>
+        </w:rPr>
+      </w:pPr>
+      <w:r>
+        <w:t xml:space="preserve">The properties of a register (rw, int32, ...) are now displayed in a separate </w:t>
+      </w:r>
+      <w:r>
+        <w:t>[</w:t>
+      </w:r>
+      <w:r>
+        <w:t>Properties</w:t>
+      </w:r>
+      <w:r>
+        <w:t>]</w:t>
+      </w:r>
+      <w:r>
+        <w:t xml:space="preserve"> column</w:t>
+      </w:r>
+      <w:r>
+        <w:t xml:space="preserve"> instead of being added to </w:t>
+      </w:r>
+      <w:r>
+        <w:t xml:space="preserve">the </w:t>
+      </w:r>
+      <w:r>
+        <w:t>[</w:t>
+      </w:r>
+      <w:r>
+        <w:t>Description</w:t>
+      </w:r>
+      <w:r>
+        <w:t>]</w:t>
+      </w:r>
+      <w:r>
+        <w:t xml:space="preserve"> column. </w:t>
+      </w:r>
+      <w:r>
+        <w:t>The [Properties]  column can be e</w:t>
+      </w:r>
+      <w:r>
+        <w:t>nable/disable</w:t>
+      </w:r>
+      <w:r>
+        <w:t>d</w:t>
+      </w:r>
+      <w:r>
+        <w:t xml:space="preserve"> in Options.</w:t>
+      </w:r>
+    </w:p>
+    <w:p>
+      <w:pPr>
+        <w:numPr>
+          <w:ilvl w:val="0"/>
+          <w:numId w:val="4"/>
+        </w:numPr>
+        <w:rPr>
+          <w:rFonts w:hint="eastAsia"/>
+        </w:rPr>
+      </w:pPr>
+      <w:r>
+        <w:t>The Description text can now be multi-line</w:t>
+      </w:r>
+      <w:r>
+        <w:t>, i</w:t>
+      </w:r>
+      <w:r>
+        <w:t xml:space="preserve">f  the </w:t>
+      </w:r>
+      <w:r>
+        <w:t>“</w:t>
+      </w:r>
+      <w:r>
+        <w:t>Multiline rows with auto row size</w:t>
+      </w:r>
+      <w:r>
+        <w:t>”</w:t>
+      </w:r>
+      <w:r>
+        <w:t xml:space="preserve"> option </w:t>
+      </w:r>
+      <w:r>
+        <w:t>is enabled</w:t>
+      </w:r>
+      <w:r>
+        <w:t xml:space="preserve">. A </w:t>
+      </w:r>
+      <w:r>
+        <w:t xml:space="preserve">long </w:t>
+      </w:r>
+      <w:r>
+        <w:t xml:space="preserve">description </w:t>
+      </w:r>
+      <w:r>
+        <w:t>text is wrappe</w:t>
+      </w:r>
+      <w:r>
+        <w:t xml:space="preserve">d. </w:t>
+      </w:r>
+      <w:r>
+        <w:t>CR/LF</w:t>
+      </w:r>
+      <w:r>
+        <w:t xml:space="preserve">’s can be used in the description text. </w:t>
+      </w:r>
+      <w:r>
+        <w:t xml:space="preserve">The row height of the grid is automatically adjusted to the text. </w:t>
+      </w:r>
+    </w:p>
+    <w:p>
+      <w:pPr>
+        <w:numPr>
+          <w:ilvl w:val="0"/>
+          <w:numId w:val="4"/>
+        </w:numPr>
+        <w:rPr>
+          <w:rFonts w:hint="eastAsia"/>
+        </w:rPr>
+      </w:pPr>
+      <w:r>
+        <w:t>"Move to next row on Enter"</w:t>
+      </w:r>
+      <w:r>
+        <w:t xml:space="preserve"> option</w:t>
+      </w:r>
+      <w:r>
+        <w:t xml:space="preserve">: depending on this option, after entering a new value with the Enter key, the </w:t>
+      </w:r>
+      <w:r>
+        <w:t>cursor</w:t>
+      </w:r>
+      <w:r>
+        <w:t xml:space="preserve"> may or may not go to the next line. </w:t>
+      </w:r>
+      <w:r>
+        <w:t xml:space="preserve">Enter a value with </w:t>
+      </w:r>
+      <w:r>
+        <w:t>Control-Enter</w:t>
+      </w:r>
+      <w:r>
+        <w:t xml:space="preserve"> to get the</w:t>
+      </w:r>
+      <w:r>
+        <w:t xml:space="preserve"> opposite</w:t>
+      </w:r>
+      <w:r>
+        <w:t xml:space="preserve"> behaviour.</w:t>
+      </w:r>
+    </w:p>
+    <w:p>
+      <w:pPr>
+        <w:pStyle w:val="Kop3"/>
+        <w:numPr>
+          <w:ilvl w:val="0"/>
+          <w:numId w:val="0"/>
+        </w:numPr>
+        <w:ind w:left="680" w:hanging="431"/>
+        <w:rPr>
+          <w:rFonts w:hint="eastAsia"/>
+        </w:rPr>
+      </w:pPr>
+      <w:r>
         <w:lastRenderedPageBreak/>
-        <w:t xml:space="preserve">Resizing column width is now </w:t>
-      </w:r>
-      <w:r>
-        <w:t>global for all tabs</w:t>
-      </w:r>
-      <w:r>
-        <w:rPr>
-          <w:rFonts w:hint="eastAsia"/>
-        </w:rPr>
+        <w:t>Fixes</w:t>
+      </w:r>
+    </w:p>
+    <w:p>
+      <w:pPr>
+        <w:numPr>
+          <w:ilvl w:val="0"/>
+          <w:numId w:val="5"/>
+        </w:numPr>
+        <w:rPr>
+          <w:rFonts w:hint="eastAsia"/>
+        </w:rPr>
+      </w:pPr>
+      <w:r>
+        <w:t>Control-0 for zoom reset now works globally on the form, not just when the focus is in the grid.</w:t>
+      </w:r>
+    </w:p>
+    <w:p>
+      <w:pPr>
+        <w:numPr>
+          <w:ilvl w:val="0"/>
+          <w:numId w:val="5"/>
+        </w:numPr>
+        <w:rPr>
+          <w:rFonts w:hint="eastAsia"/>
+        </w:rPr>
+      </w:pPr>
+      <w:r>
+        <w:t>R</w:t>
+      </w:r>
+      <w:r>
+        <w:t>ight-click</w:t>
+      </w:r>
+      <w:r>
+        <w:t>ing</w:t>
+      </w:r>
+      <w:r>
+        <w:t xml:space="preserve"> in the grid</w:t>
+      </w:r>
+      <w:r>
+        <w:t xml:space="preserve"> now moves the focus to that row, to </w:t>
+      </w:r>
+      <w:r>
+        <w:t>better see which row you are working on.</w:t>
+      </w:r>
+    </w:p>
+    <w:p>
+      <w:pPr>
+        <w:numPr>
+          <w:ilvl w:val="0"/>
+          <w:numId w:val="5"/>
+        </w:numPr>
+        <w:rPr>
+          <w:rFonts w:hint="eastAsia"/>
+        </w:rPr>
+      </w:pPr>
+      <w:r>
+        <w:t>Migrated</w:t>
+      </w:r>
+      <w:r>
+        <w:t xml:space="preserve"> to .NET framework 4.7.2.</w:t>
+      </w:r>
+    </w:p>
+    <w:p>
+      <w:pPr>
+        <w:pStyle w:val="Kop1"/>
+        <w:rPr>
+          <w:rFonts w:hint="eastAsia"/>
+        </w:rPr>
+      </w:pPr>
+      <w:r>
+        <w:t>v2.0.12 -- 2020-07-13</w:t>
+      </w:r>
+    </w:p>
+    <w:p>
+      <w:pPr>
+        <w:pStyle w:val="Kop3"/>
+        <w:rPr>
+          <w:rFonts w:hint="eastAsia"/>
+        </w:rPr>
+      </w:pPr>
+      <w:r>
+        <w:t>Features</w:t>
+      </w:r>
+    </w:p>
+    <w:p>
+      <w:pPr>
+        <w:numPr>
+          <w:ilvl w:val="0"/>
+          <w:numId w:val="6"/>
+        </w:numPr>
+        <w:rPr>
+          <w:rFonts w:hint="eastAsia"/>
+        </w:rPr>
+      </w:pPr>
+      <w:r>
+        <w:t>Added mbc project file validation with XSD schema</w:t>
+      </w:r>
+      <w:r>
+        <w:t xml:space="preserve"> file</w:t>
+      </w:r>
+      <w:r>
+        <w:t xml:space="preserve">. </w:t>
+      </w:r>
+      <w:r>
+        <w:t xml:space="preserve">Validation is optional. </w:t>
+      </w:r>
+      <w:r>
+        <w:t>The validation only allows lower-case XML tags</w:t>
+      </w:r>
+      <w:r>
+        <w:t>, a</w:t>
+      </w:r>
+      <w:r>
+        <w:t xml:space="preserve">nd only allows the XML elements that are supported in this version. The intention is that over time all mbc files will </w:t>
+      </w:r>
+      <w:r>
+        <w:t>migrate</w:t>
+      </w:r>
+      <w:r>
+        <w:t xml:space="preserve"> to meet the validation.</w:t>
+      </w:r>
+    </w:p>
+    <w:p>
+      <w:pPr>
+        <w:numPr>
+          <w:ilvl w:val="0"/>
+          <w:numId w:val="6"/>
+        </w:numPr>
+        <w:rPr>
+          <w:rFonts w:hint="eastAsia"/>
+        </w:rPr>
+      </w:pPr>
+      <w:r>
+        <w:t>In</w:t>
+      </w:r>
+      <w:r>
+        <w:t xml:space="preserve"> </w:t>
+      </w:r>
+      <w:r>
+        <w:t xml:space="preserve">the </w:t>
+      </w:r>
+      <w:r>
+        <w:t xml:space="preserve">"Save project file" </w:t>
+      </w:r>
+      <w:r>
+        <w:t xml:space="preserve">form </w:t>
+      </w:r>
+      <w:r>
+        <w:t xml:space="preserve">you now have the option to update the XML with "Update XML to current version" so that it then passes the validation. </w:t>
+      </w:r>
+      <w:r>
+        <w:t>E</w:t>
+      </w:r>
+      <w:r>
+        <w:t>rrors must be corrected manually.</w:t>
+      </w:r>
+    </w:p>
+    <w:p>
+      <w:pPr>
+        <w:numPr>
+          <w:ilvl w:val="0"/>
+          <w:numId w:val="6"/>
+        </w:numPr>
+        <w:rPr>
+          <w:rFonts w:hint="eastAsia"/>
+        </w:rPr>
+      </w:pPr>
+      <w:r>
+        <w:t>In</w:t>
+      </w:r>
+      <w:r>
+        <w:t xml:space="preserve"> "Save project file" the project file is now saved with XML formatting.</w:t>
+      </w:r>
+    </w:p>
+    <w:p>
+      <w:pPr>
+        <w:numPr>
+          <w:ilvl w:val="0"/>
+          <w:numId w:val="6"/>
+        </w:numPr>
+        <w:rPr>
+          <w:rFonts w:hint="eastAsia"/>
+        </w:rPr>
+      </w:pPr>
+      <w:r>
+        <w:t>If you start ModbusControl by double-clicking an mbc file and the file points to a non-existent COM port, the error dialog "Error opening serial port COMx" now appears after the ModbusControl program appears.</w:t>
+      </w:r>
+    </w:p>
+    <w:p>
+      <w:pPr>
+        <w:numPr>
+          <w:ilvl w:val="0"/>
+          <w:numId w:val="6"/>
+        </w:numPr>
+        <w:rPr>
+          <w:rFonts w:hint="eastAsia"/>
+        </w:rPr>
+      </w:pPr>
+      <w:r>
+        <w:t xml:space="preserve">At the first start </w:t>
+      </w:r>
+      <w:r>
+        <w:t xml:space="preserve">of the program </w:t>
+      </w:r>
+      <w:r>
+        <w:t xml:space="preserve">after an update, </w:t>
+      </w:r>
+      <w:r>
+        <w:t xml:space="preserve">an option is shown </w:t>
+      </w:r>
+      <w:r>
+        <w:t>to see the 'Release notes'.</w:t>
+      </w:r>
+    </w:p>
+    <w:p>
+      <w:pPr>
+        <w:numPr>
+          <w:ilvl w:val="0"/>
+          <w:numId w:val="6"/>
+        </w:numPr>
+        <w:rPr>
+          <w:rFonts w:hint="eastAsia"/>
+        </w:rPr>
+      </w:pPr>
+      <w:r>
+        <w:t xml:space="preserve">Program settings split into user-dependent part and </w:t>
+      </w:r>
+      <w:r>
+        <w:t>computer</w:t>
+      </w:r>
+      <w:r>
+        <w:t xml:space="preserve">-dependent part. The old settings are migrated to the new settings files, then </w:t>
+      </w:r>
+      <w:r>
+        <w:t xml:space="preserve">the </w:t>
+      </w:r>
+      <w:r>
+        <w:t>old settings file is deleted.</w:t>
+      </w:r>
+    </w:p>
+    <w:p>
+      <w:pPr>
+        <w:numPr>
+          <w:ilvl w:val="0"/>
+          <w:numId w:val="6"/>
+        </w:numPr>
+        <w:rPr>
+          <w:rFonts w:hint="eastAsia"/>
+        </w:rPr>
+      </w:pPr>
+      <w:r>
+        <w:t xml:space="preserve">LocalOverrides.xml </w:t>
+      </w:r>
+      <w:r>
+        <w:t xml:space="preserve">file is automatically </w:t>
+      </w:r>
+      <w:r>
+        <w:t xml:space="preserve">moved from &lt;mydocuments&gt;\ModbusControl to %AppData%\Roaming\E.D.&amp;A\ModbusControl. Content from old is not migrated. Old </w:t>
+      </w:r>
+      <w:r>
+        <w:t>file</w:t>
+      </w:r>
+      <w:r>
+        <w:t xml:space="preserve"> is renamed with '.old' and moved to the </w:t>
+      </w:r>
+      <w:r>
+        <w:t xml:space="preserve">new </w:t>
+      </w:r>
+      <w:r>
+        <w:t>location. If overrides were used, the user will receive a notification.</w:t>
+      </w:r>
+    </w:p>
+    <w:p>
+      <w:pPr>
+        <w:numPr>
+          <w:ilvl w:val="0"/>
+          <w:numId w:val="6"/>
+        </w:numPr>
+        <w:rPr>
+          <w:rFonts w:hint="eastAsia"/>
+        </w:rPr>
+      </w:pPr>
+      <w:r>
+        <w:t>&lt;user&gt;\Documents\ModbusControl is no longer used.</w:t>
+      </w:r>
+    </w:p>
+    <w:p>
+      <w:pPr>
+        <w:pStyle w:val="Kop3"/>
+        <w:rPr>
+          <w:rFonts w:hint="eastAsia"/>
+        </w:rPr>
+      </w:pPr>
+      <w:r>
+        <w:t>Fixes</w:t>
+      </w:r>
+    </w:p>
+    <w:p>
+      <w:pPr>
+        <w:numPr>
+          <w:ilvl w:val="0"/>
+          <w:numId w:val="7"/>
+        </w:numPr>
+        <w:rPr>
+          <w:rFonts w:hint="eastAsia"/>
+        </w:rPr>
+      </w:pPr>
+      <w:r>
+        <w:t>The import/export dialogs now show '*. CSV' instead of '*. C</w:t>
+      </w:r>
+      <w:r>
+        <w:t>VS</w:t>
+      </w:r>
+      <w:r>
+        <w:t>'.</w:t>
+      </w:r>
+    </w:p>
+    <w:p>
+      <w:pPr>
+        <w:numPr>
+          <w:ilvl w:val="0"/>
+          <w:numId w:val="7"/>
+        </w:numPr>
+        <w:rPr>
+          <w:rFonts w:hint="eastAsia"/>
+        </w:rPr>
+      </w:pPr>
+      <w:r>
+        <w:t>Mbc file is now saved without BOM (</w:t>
+      </w:r>
+      <w:r>
+        <w:t>Unicode</w:t>
+      </w:r>
+      <w:r>
+        <w:t xml:space="preserve"> byte order mark).</w:t>
+      </w:r>
+    </w:p>
+    <w:p>
+      <w:pPr>
+        <w:numPr>
+          <w:ilvl w:val="0"/>
+          <w:numId w:val="7"/>
+        </w:numPr>
+        <w:rPr>
+          <w:rFonts w:hint="eastAsia"/>
+        </w:rPr>
+      </w:pPr>
+      <w:r>
+        <w:t xml:space="preserve">Better </w:t>
+      </w:r>
+      <w:r>
+        <w:t>handling</w:t>
+      </w:r>
+      <w:r>
+        <w:t xml:space="preserve"> if </w:t>
+      </w:r>
+      <w:r>
+        <w:t>a</w:t>
+      </w:r>
+      <w:r>
+        <w:t xml:space="preserve"> non-admin</w:t>
+      </w:r>
+      <w:r>
+        <w:t>istrator</w:t>
+      </w:r>
+      <w:r>
+        <w:t xml:space="preserve"> user logs </w:t>
+      </w:r>
+      <w:r>
+        <w:t xml:space="preserve">on </w:t>
+      </w:r>
+      <w:r>
+        <w:t>and uses ModbusControl.</w:t>
+      </w:r>
+    </w:p>
+    <w:p>
+      <w:pPr>
+        <w:pStyle w:val="Kop1"/>
+        <w:rPr>
+          <w:rFonts w:hint="eastAsia"/>
+        </w:rPr>
+      </w:pPr>
+      <w:r>
+        <w:t>v2.0.11 -- 2019-11-18</w:t>
+      </w:r>
+    </w:p>
+    <w:p>
+      <w:pPr>
+        <w:pStyle w:val="Kop3"/>
+        <w:rPr>
+          <w:rFonts w:hint="eastAsia"/>
+        </w:rPr>
+      </w:pPr>
+      <w:r>
+        <w:t>Fixes</w:t>
+      </w:r>
+    </w:p>
+    <w:p>
+      <w:pPr>
+        <w:numPr>
+          <w:ilvl w:val="0"/>
+          <w:numId w:val="8"/>
+        </w:numPr>
+        <w:rPr>
+          <w:rFonts w:hint="eastAsia"/>
+        </w:rPr>
+      </w:pPr>
+      <w:r>
+        <w:t xml:space="preserve">Better handling if the USB/serial connection is lost. In the past </w:t>
+      </w:r>
+      <w:r>
+        <w:t xml:space="preserve">the </w:t>
+      </w:r>
+      <w:r>
+        <w:t xml:space="preserve">program </w:t>
+      </w:r>
+      <w:r>
+        <w:t>could stop responding</w:t>
+      </w:r>
+      <w:r>
         <w:t>.</w:t>
       </w:r>
     </w:p>
     <w:p>
       <w:pPr>
-        <w:pStyle w:val="Lijstalinea"/>
-        <w:numPr>
-          <w:ilvl w:val="0"/>
-          <w:numId w:val="4"/>
-        </w:numPr>
-        <w:rPr>
-          <w:rFonts w:hint="eastAsia"/>
-        </w:rPr>
-      </w:pPr>
-      <w:r>
-        <w:rPr>
-          <w:rFonts w:hint="eastAsia"/>
-        </w:rPr>
-        <w:t>Zoom</w:t>
+        <w:pStyle w:val="Kop1"/>
+        <w:rPr>
+          <w:rFonts w:hint="eastAsia"/>
+        </w:rPr>
+      </w:pPr>
+      <w:r>
+        <w:t>v2.0.10 -- 2019-03-11</w:t>
+      </w:r>
+    </w:p>
+    <w:p>
+      <w:pPr>
+        <w:pStyle w:val="Kop3"/>
+        <w:rPr>
+          <w:rFonts w:hint="eastAsia"/>
+        </w:rPr>
+      </w:pPr>
+      <w:r>
+        <w:t>Features</w:t>
+      </w:r>
+    </w:p>
+    <w:p>
+      <w:pPr>
+        <w:numPr>
+          <w:ilvl w:val="0"/>
+          <w:numId w:val="8"/>
+        </w:numPr>
+        <w:rPr>
+          <w:rFonts w:hint="eastAsia"/>
+        </w:rPr>
+      </w:pPr>
+      <w:r>
+        <w:t>Added display</w:t>
       </w:r>
       <w:r>
         <w:t>ing</w:t>
       </w:r>
       <w:r>
-        <w:rPr>
-          <w:rFonts w:hint="eastAsia"/>
-        </w:rPr>
-        <w:t xml:space="preserve"> now also adjusts the size of the column headers.</w:t>
-      </w:r>
-    </w:p>
-    <w:p>
-      <w:pPr>
-        <w:pStyle w:val="Lijstalinea"/>
-        <w:numPr>
-          <w:ilvl w:val="0"/>
-          <w:numId w:val="4"/>
-        </w:numPr>
-        <w:rPr>
-          <w:rFonts w:hint="eastAsia"/>
-        </w:rPr>
-      </w:pPr>
-      <w:r>
-        <w:rPr>
-          <w:rFonts w:hint="eastAsia"/>
-        </w:rPr>
-        <w:t>You can now close the [</w:t>
-      </w:r>
-      <w:proofErr w:type="spellStart"/>
-      <w:r>
-        <w:rPr>
-          <w:rFonts w:hint="eastAsia"/>
-        </w:rPr>
-        <w:t>Project_Configuration</w:t>
-      </w:r>
-      <w:proofErr w:type="spellEnd"/>
-      <w:r>
-        <w:rPr>
-          <w:rFonts w:hint="eastAsia"/>
-        </w:rPr>
-        <w:t>], [</w:t>
-      </w:r>
-      <w:proofErr w:type="spellStart"/>
-      <w:r>
-        <w:rPr>
-          <w:rFonts w:hint="eastAsia"/>
-        </w:rPr>
-        <w:t>Save_project_file</w:t>
-      </w:r>
-      <w:proofErr w:type="spellEnd"/>
-      <w:r>
-        <w:rPr>
-          <w:rFonts w:hint="eastAsia"/>
-        </w:rPr>
-        <w:t>] and [About] forms with the ESC button</w:t>
-      </w:r>
-      <w:r>
-        <w:t xml:space="preserve"> too</w:t>
-      </w:r>
-      <w:r>
-        <w:rPr>
-          <w:rFonts w:hint="eastAsia"/>
-        </w:rPr>
+        <w:t xml:space="preserve"> of enum </w:t>
+      </w:r>
+      <w:r>
+        <w:t xml:space="preserve">values </w:t>
+      </w:r>
+      <w:r>
+        <w:t xml:space="preserve">in the value column. </w:t>
+      </w:r>
+    </w:p>
+    <w:p>
+      <w:pPr>
+        <w:pStyle w:val="Kop3"/>
+        <w:rPr>
+          <w:rFonts w:hint="eastAsia"/>
+        </w:rPr>
+      </w:pPr>
+      <w:r>
+        <w:t>Fixes</w:t>
+      </w:r>
+    </w:p>
+    <w:p>
+      <w:pPr>
+        <w:numPr>
+          <w:ilvl w:val="0"/>
+          <w:numId w:val="8"/>
+        </w:numPr>
+        <w:rPr>
+          <w:rFonts w:hint="eastAsia"/>
+        </w:rPr>
+      </w:pPr>
+      <w:r>
+        <w:t xml:space="preserve">Menu </w:t>
+      </w:r>
+      <w:r>
+        <w:t xml:space="preserve">item </w:t>
+      </w:r>
+      <w:r>
+        <w:t xml:space="preserve">"Edit project file" did not work </w:t>
+      </w:r>
+      <w:r>
+        <w:t xml:space="preserve">correctly </w:t>
+      </w:r>
+      <w:r>
+        <w:t>if there was a space in the path.</w:t>
+      </w:r>
+    </w:p>
+    <w:p>
+      <w:pPr>
+        <w:numPr>
+          <w:ilvl w:val="0"/>
+          <w:numId w:val="8"/>
+        </w:numPr>
+        <w:rPr>
+          <w:rFonts w:hint="eastAsia"/>
+        </w:rPr>
+      </w:pPr>
+      <w:r>
+        <w:t>Logger: Clear button did not clear number of logs in the status bar.</w:t>
+      </w:r>
+    </w:p>
+    <w:p>
+      <w:pPr>
+        <w:numPr>
+          <w:ilvl w:val="0"/>
+          <w:numId w:val="8"/>
+        </w:numPr>
+        <w:rPr>
+          <w:rFonts w:hint="eastAsia"/>
+        </w:rPr>
+      </w:pPr>
+      <w:r>
+        <w:lastRenderedPageBreak/>
+        <w:t xml:space="preserve">Send Custom Modbus Command: allows tabs and CR/LF in the string. </w:t>
+      </w:r>
+      <w:r>
+        <w:t xml:space="preserve">Reports </w:t>
+      </w:r>
+      <w:r>
+        <w:t xml:space="preserve">error </w:t>
+      </w:r>
+      <w:r>
+        <w:t>for</w:t>
+      </w:r>
+      <w:r>
+        <w:t xml:space="preserve"> empty command string. </w:t>
+      </w:r>
+    </w:p>
+    <w:p>
+      <w:pPr>
+        <w:numPr>
+          <w:ilvl w:val="0"/>
+          <w:numId w:val="8"/>
+        </w:numPr>
+        <w:rPr>
+          <w:rFonts w:hint="eastAsia"/>
+        </w:rPr>
+      </w:pPr>
+      <w:r>
+        <w:t xml:space="preserve">Send Custom Modbus Command: </w:t>
+      </w:r>
+      <w:r>
+        <w:t>Reports</w:t>
+      </w:r>
+      <w:r>
+        <w:t xml:space="preserve"> error when command is too short, must be at least 2 bytes.</w:t>
+      </w:r>
+    </w:p>
+    <w:p>
+      <w:pPr>
+        <w:numPr>
+          <w:ilvl w:val="0"/>
+          <w:numId w:val="8"/>
+        </w:numPr>
+        <w:rPr>
+          <w:rFonts w:hint="eastAsia"/>
+        </w:rPr>
+      </w:pPr>
+      <w:r>
+        <w:t xml:space="preserve">Fix background </w:t>
+      </w:r>
+      <w:r>
+        <w:t>colour</w:t>
+      </w:r>
+      <w:r>
+        <w:t xml:space="preserve"> of registers.</w:t>
+      </w:r>
+    </w:p>
+    <w:p>
+      <w:pPr>
+        <w:pStyle w:val="Kop1"/>
+        <w:rPr>
+          <w:rFonts w:hint="eastAsia"/>
+        </w:rPr>
+      </w:pPr>
+      <w:r>
+        <w:t>v2.0.9 -- 2018-10-20</w:t>
+      </w:r>
+    </w:p>
+    <w:p>
+      <w:pPr>
+        <w:pStyle w:val="Kop3"/>
+        <w:rPr>
+          <w:rFonts w:hint="eastAsia"/>
+        </w:rPr>
+      </w:pPr>
+      <w:r>
+        <w:t>Features</w:t>
+      </w:r>
+    </w:p>
+    <w:p>
+      <w:pPr>
+        <w:numPr>
+          <w:ilvl w:val="0"/>
+          <w:numId w:val="9"/>
+        </w:numPr>
+        <w:rPr>
+          <w:rFonts w:hint="eastAsia"/>
+        </w:rPr>
+      </w:pPr>
+      <w:r>
+        <w:t>New option: "Move to next row on Enter".</w:t>
+      </w:r>
+    </w:p>
+    <w:p>
+      <w:pPr>
+        <w:numPr>
+          <w:ilvl w:val="0"/>
+          <w:numId w:val="9"/>
+        </w:numPr>
+        <w:rPr>
+          <w:rFonts w:hint="eastAsia"/>
+        </w:rPr>
+      </w:pPr>
+      <w:r>
+        <w:t xml:space="preserve">New option: "Auto-start edit mode on typing". </w:t>
+      </w:r>
+    </w:p>
+    <w:p>
+      <w:pPr>
+        <w:numPr>
+          <w:ilvl w:val="0"/>
+          <w:numId w:val="9"/>
+        </w:numPr>
+        <w:rPr>
+          <w:rFonts w:hint="eastAsia"/>
+        </w:rPr>
+      </w:pPr>
+      <w:r>
+        <w:t xml:space="preserve">New option: "Use custom editor". </w:t>
+      </w:r>
+    </w:p>
+    <w:p>
+      <w:pPr>
+        <w:numPr>
+          <w:ilvl w:val="0"/>
+          <w:numId w:val="9"/>
+        </w:numPr>
+        <w:rPr>
+          <w:rFonts w:hint="eastAsia"/>
+        </w:rPr>
+      </w:pPr>
+      <w:r>
+        <w:t>New option: "Ignore form size on project reload".</w:t>
+      </w:r>
+    </w:p>
+    <w:p>
+      <w:pPr>
+        <w:numPr>
+          <w:ilvl w:val="0"/>
+          <w:numId w:val="9"/>
+        </w:numPr>
+        <w:rPr>
+          <w:rFonts w:hint="eastAsia"/>
+        </w:rPr>
+      </w:pPr>
+      <w:r>
+        <w:t>Config</w:t>
+      </w:r>
+      <w:r>
+        <w:t>uration</w:t>
+      </w:r>
+      <w:r>
+        <w:t xml:space="preserve"> form now has an Apply button.</w:t>
+      </w:r>
+    </w:p>
+    <w:p>
+      <w:pPr>
+        <w:numPr>
+          <w:ilvl w:val="0"/>
+          <w:numId w:val="9"/>
+        </w:numPr>
+        <w:rPr>
+          <w:rFonts w:hint="eastAsia"/>
+        </w:rPr>
+      </w:pPr>
+      <w:r>
+        <w:t xml:space="preserve">Separate line-copy and value-copy </w:t>
+      </w:r>
+      <w:r>
+        <w:t xml:space="preserve">capability </w:t>
+      </w:r>
+      <w:r>
+        <w:t xml:space="preserve">in grid, </w:t>
+      </w:r>
+      <w:r>
+        <w:t>using</w:t>
+      </w:r>
+      <w:r>
+        <w:t xml:space="preserve"> control-C and context menu.</w:t>
+      </w:r>
+    </w:p>
+    <w:p>
+      <w:pPr>
+        <w:numPr>
+          <w:ilvl w:val="0"/>
+          <w:numId w:val="9"/>
+        </w:numPr>
+        <w:rPr>
+          <w:rFonts w:hint="eastAsia"/>
+        </w:rPr>
+      </w:pPr>
+      <w:r>
+        <w:t xml:space="preserve">The status bar now </w:t>
+      </w:r>
+      <w:r>
+        <w:t xml:space="preserve">has </w:t>
+      </w:r>
+      <w:r>
+        <w:t xml:space="preserve">blue </w:t>
+      </w:r>
+      <w:r>
+        <w:t xml:space="preserve">colour </w:t>
+      </w:r>
+      <w:r>
+        <w:t>if there is no connection or no polling is done.</w:t>
+      </w:r>
+    </w:p>
+    <w:p>
+      <w:pPr>
+        <w:numPr>
+          <w:ilvl w:val="0"/>
+          <w:numId w:val="9"/>
+        </w:numPr>
+        <w:rPr>
+          <w:rFonts w:hint="eastAsia"/>
+        </w:rPr>
+      </w:pPr>
+      <w:r>
+        <w:t xml:space="preserve">The status bar </w:t>
+      </w:r>
+      <w:r>
+        <w:t xml:space="preserve">now has red colour </w:t>
+      </w:r>
+      <w:r>
+        <w:t>for errors.</w:t>
+      </w:r>
+    </w:p>
+    <w:p>
+      <w:pPr>
+        <w:numPr>
+          <w:ilvl w:val="0"/>
+          <w:numId w:val="9"/>
+        </w:numPr>
+        <w:rPr>
+          <w:rFonts w:hint="eastAsia"/>
+        </w:rPr>
+      </w:pPr>
+      <w:r>
+        <w:t xml:space="preserve">Now </w:t>
+      </w:r>
+      <w:r>
+        <w:t>shows</w:t>
+      </w:r>
+      <w:r>
+        <w:t xml:space="preserve"> a warning in the "Save configuration to project file" and "Project configuration" screens if localoverrides </w:t>
+      </w:r>
+      <w:r>
+        <w:t>were</w:t>
+      </w:r>
+      <w:r>
+        <w:t xml:space="preserve"> used.</w:t>
+      </w:r>
+    </w:p>
+    <w:p>
+      <w:pPr>
+        <w:pStyle w:val="Kop3"/>
+        <w:rPr>
+          <w:rFonts w:hint="eastAsia"/>
+        </w:rPr>
+      </w:pPr>
+      <w:r>
+        <w:t>Fixes</w:t>
+      </w:r>
+    </w:p>
+    <w:p>
+      <w:pPr>
+        <w:numPr>
+          <w:ilvl w:val="0"/>
+          <w:numId w:val="10"/>
+        </w:numPr>
+        <w:rPr>
+          <w:rFonts w:hint="eastAsia"/>
+        </w:rPr>
+      </w:pPr>
+      <w:r>
+        <w:t xml:space="preserve">Notification </w:t>
+      </w:r>
+      <w:r>
+        <w:t>if Settings.xml could not be loaded at startup.</w:t>
+      </w:r>
+    </w:p>
+    <w:p>
+      <w:pPr>
+        <w:numPr>
+          <w:ilvl w:val="0"/>
+          <w:numId w:val="10"/>
+        </w:numPr>
+        <w:rPr>
+          <w:rFonts w:hint="eastAsia"/>
+        </w:rPr>
+      </w:pPr>
+      <w:r>
+        <w:t xml:space="preserve">Settings.xml </w:t>
+      </w:r>
+      <w:r>
+        <w:t xml:space="preserve">writing now </w:t>
+      </w:r>
+      <w:r>
+        <w:t>update</w:t>
+      </w:r>
+      <w:r>
+        <w:t>s</w:t>
+      </w:r>
+      <w:r>
+        <w:t>/insert</w:t>
+      </w:r>
+      <w:r>
+        <w:t>s</w:t>
+      </w:r>
+      <w:r>
+        <w:t xml:space="preserve"> </w:t>
+      </w:r>
+      <w:r>
+        <w:t>al</w:t>
+      </w:r>
+      <w:r>
+        <w:t xml:space="preserve">l tags in the </w:t>
+      </w:r>
+      <w:r>
+        <w:t xml:space="preserve">existing </w:t>
+      </w:r>
+      <w:r>
+        <w:t>file instead of writing a completely new file, so that any newer tags from a newer version remain.</w:t>
+      </w:r>
+    </w:p>
+    <w:p>
+      <w:pPr>
+        <w:numPr>
+          <w:ilvl w:val="0"/>
+          <w:numId w:val="10"/>
+        </w:numPr>
+        <w:rPr>
+          <w:rFonts w:hint="eastAsia"/>
+        </w:rPr>
+      </w:pPr>
+      <w:r>
+        <w:t>Project Configuration: Interframe-delay: now shows "0 (auto)" at setting 0.</w:t>
+      </w:r>
+    </w:p>
+    <w:p>
+      <w:pPr>
+        <w:numPr>
+          <w:ilvl w:val="0"/>
+          <w:numId w:val="10"/>
+        </w:numPr>
+        <w:rPr>
+          <w:rFonts w:hint="eastAsia"/>
+        </w:rPr>
+      </w:pPr>
+      <w:r>
+        <w:t xml:space="preserve">Local override project </w:t>
+      </w:r>
+      <w:r>
+        <w:t xml:space="preserve">is </w:t>
+      </w:r>
+      <w:r>
+        <w:t xml:space="preserve">no longer </w:t>
+      </w:r>
+      <w:r>
+        <w:t xml:space="preserve">required to have a </w:t>
+      </w:r>
+      <w:r>
+        <w:t>&lt;modbus&gt; element.</w:t>
+      </w:r>
+    </w:p>
+    <w:p>
+      <w:pPr>
+        <w:numPr>
+          <w:ilvl w:val="0"/>
+          <w:numId w:val="10"/>
+        </w:numPr>
+        <w:rPr>
+          <w:rFonts w:hint="eastAsia"/>
+        </w:rPr>
+      </w:pPr>
+      <w:r>
+        <w:t>Dialog forms can now be closed with the Enter key.</w:t>
+      </w:r>
+    </w:p>
+    <w:p>
+      <w:pPr>
+        <w:numPr>
+          <w:ilvl w:val="0"/>
+          <w:numId w:val="10"/>
+        </w:numPr>
+        <w:rPr>
+          <w:rFonts w:hint="eastAsia"/>
+        </w:rPr>
+      </w:pPr>
+      <w:r>
+        <w:t xml:space="preserve">The </w:t>
+      </w:r>
+      <w:r>
+        <w:t>checkboxes of the "Save configuration to project file" form</w:t>
+      </w:r>
+      <w:r>
+        <w:t xml:space="preserve"> are now cleared when loading a project.</w:t>
+      </w:r>
+    </w:p>
+    <w:p>
+      <w:pPr>
+        <w:numPr>
+          <w:ilvl w:val="0"/>
+          <w:numId w:val="10"/>
+        </w:numPr>
+        <w:rPr>
+          <w:rFonts w:hint="eastAsia"/>
+        </w:rPr>
+      </w:pPr>
+      <w:r>
+        <w:t xml:space="preserve">Buttons at the bottom of the forms now have </w:t>
+      </w:r>
+      <w:r>
+        <w:t>better spacing</w:t>
+      </w:r>
+      <w:r>
         <w:t>.</w:t>
       </w:r>
     </w:p>
     <w:p>
       <w:pPr>
-        <w:pStyle w:val="Lijstalinea"/>
-        <w:numPr>
-          <w:ilvl w:val="0"/>
-          <w:numId w:val="4"/>
-        </w:numPr>
-        <w:rPr>
-          <w:rFonts w:hint="eastAsia"/>
-        </w:rPr>
-      </w:pPr>
-      <w:r>
-        <w:rPr>
-          <w:rFonts w:hint="eastAsia"/>
-        </w:rPr>
-        <w:t>The expand/collapse icons scale with zoom</w:t>
-      </w:r>
-      <w:r>
-        <w:t>ing</w:t>
-      </w:r>
-      <w:r>
-        <w:rPr>
-          <w:rFonts w:hint="eastAsia"/>
-        </w:rPr>
+        <w:pStyle w:val="Kop1"/>
+        <w:rPr>
+          <w:rFonts w:hint="eastAsia"/>
+        </w:rPr>
+      </w:pPr>
+      <w:r>
+        <w:t>v2.0.8 -- 2018-08-02</w:t>
+      </w:r>
+    </w:p>
+    <w:p>
+      <w:pPr>
+        <w:pStyle w:val="Kop3"/>
+        <w:rPr>
+          <w:rFonts w:hint="eastAsia"/>
+        </w:rPr>
+      </w:pPr>
+      <w:r>
+        <w:t>Features</w:t>
+      </w:r>
+    </w:p>
+    <w:p>
+      <w:pPr>
+        <w:numPr>
+          <w:ilvl w:val="0"/>
+          <w:numId w:val="11"/>
+        </w:numPr>
+        <w:rPr>
+          <w:rFonts w:hint="eastAsia"/>
+        </w:rPr>
+      </w:pPr>
+      <w:r>
+        <w:t xml:space="preserve">Added </w:t>
+      </w:r>
+      <w:r>
+        <w:t>menus and toolbar.</w:t>
+      </w:r>
+    </w:p>
+    <w:p>
+      <w:pPr>
+        <w:numPr>
+          <w:ilvl w:val="0"/>
+          <w:numId w:val="11"/>
+        </w:numPr>
+        <w:rPr>
+          <w:rFonts w:hint="eastAsia"/>
+        </w:rPr>
+      </w:pPr>
+      <w:r>
+        <w:t xml:space="preserve">Can save project configuration, bridge settings and form size in mbc file. </w:t>
+      </w:r>
+    </w:p>
+    <w:p>
+      <w:pPr>
+        <w:numPr>
+          <w:ilvl w:val="0"/>
+          <w:numId w:val="11"/>
+        </w:numPr>
+        <w:rPr>
+          <w:rFonts w:hint="eastAsia"/>
+        </w:rPr>
+      </w:pPr>
+      <w:r>
+        <w:t xml:space="preserve">Communication </w:t>
+      </w:r>
+      <w:r>
+        <w:t>pausing</w:t>
+      </w:r>
+      <w:r>
+        <w:t xml:space="preserve"> and poll-once.</w:t>
+      </w:r>
+    </w:p>
+    <w:p>
+      <w:pPr>
+        <w:numPr>
+          <w:ilvl w:val="0"/>
+          <w:numId w:val="11"/>
+        </w:numPr>
+        <w:rPr>
+          <w:rFonts w:hint="eastAsia"/>
+        </w:rPr>
+      </w:pPr>
+      <w:r>
+        <w:t>C</w:t>
+      </w:r>
+      <w:r>
+        <w:t>hange the connection parameters without having to close and reopen the port.</w:t>
+      </w:r>
+    </w:p>
+    <w:p>
+      <w:pPr>
+        <w:numPr>
+          <w:ilvl w:val="0"/>
+          <w:numId w:val="11"/>
+        </w:numPr>
+        <w:rPr>
+          <w:rFonts w:hint="eastAsia"/>
+        </w:rPr>
+      </w:pPr>
+      <w:r>
+        <w:t xml:space="preserve">If the serial port is not available at start, you can </w:t>
+      </w:r>
+      <w:r>
+        <w:t>immediately</w:t>
+      </w:r>
+      <w:r>
+        <w:t xml:space="preserve"> choose another </w:t>
+      </w:r>
+      <w:r>
+        <w:t>port</w:t>
+      </w:r>
+      <w:r>
         <w:t>.</w:t>
       </w:r>
     </w:p>
     <w:p>
       <w:pPr>
-        <w:pStyle w:val="Lijstalinea"/>
-        <w:numPr>
-          <w:ilvl w:val="0"/>
-          <w:numId w:val="4"/>
-        </w:numPr>
-        <w:rPr>
-          <w:rFonts w:hint="eastAsia"/>
-        </w:rPr>
-      </w:pPr>
-      <w:r>
-        <w:rPr>
-          <w:rFonts w:hint="eastAsia"/>
-        </w:rPr>
-        <w:t>If an error occurs when loading an mbc file, no auto-connect to the slave/server is done.</w:t>
-      </w:r>
-    </w:p>
-    <w:p>
-      <w:pPr>
-        <w:pStyle w:val="Lijstalinea"/>
-        <w:numPr>
-          <w:ilvl w:val="0"/>
-          <w:numId w:val="4"/>
-        </w:numPr>
-        <w:rPr>
-          <w:rFonts w:hint="eastAsia"/>
-        </w:rPr>
-      </w:pPr>
-      <w:r>
-        <w:rPr>
-          <w:rFonts w:hint="eastAsia"/>
-        </w:rPr>
-        <w:t xml:space="preserve">With </w:t>
-      </w:r>
-      <w:proofErr w:type="spellStart"/>
-      <w:r>
-        <w:rPr>
-          <w:rFonts w:hint="eastAsia"/>
-        </w:rPr>
-        <w:t>Import_file</w:t>
-      </w:r>
-      <w:proofErr w:type="spellEnd"/>
-      <w:r>
-        <w:rPr>
-          <w:rFonts w:hint="eastAsia"/>
-        </w:rPr>
-        <w:t xml:space="preserve"> and </w:t>
-      </w:r>
-      <w:proofErr w:type="spellStart"/>
-      <w:r>
-        <w:rPr>
-          <w:rFonts w:hint="eastAsia"/>
-        </w:rPr>
-        <w:t>Import_compare</w:t>
-      </w:r>
-      <w:proofErr w:type="spellEnd"/>
-      <w:r>
-        <w:rPr>
-          <w:rFonts w:hint="eastAsia"/>
-        </w:rPr>
-        <w:t>: writing/compar</w:t>
-      </w:r>
-      <w:r>
-        <w:t>ing</w:t>
-      </w:r>
-      <w:r>
-        <w:rPr>
-          <w:rFonts w:hint="eastAsia"/>
-        </w:rPr>
-        <w:t xml:space="preserve"> a float32 </w:t>
-      </w:r>
-      <w:r>
-        <w:t>is fixed</w:t>
-      </w:r>
-      <w:r>
-        <w:rPr>
-          <w:rFonts w:hint="eastAsia"/>
-        </w:rPr>
-        <w:t>.</w:t>
-      </w:r>
-    </w:p>
-    <w:p>
-      <w:pPr>
-        <w:pStyle w:val="Kop1"/>
-        <w:rPr>
-          <w:rFonts w:hint="eastAsia"/>
-        </w:rPr>
-      </w:pPr>
-      <w:r>
-        <w:t>v2.0.14 -- 2022-11-08</w:t>
-      </w:r>
-    </w:p>
-    <w:p>
-      <w:pPr>
-        <w:pStyle w:val="Kop3"/>
-        <w:rPr>
-          <w:rFonts w:hint="eastAsia"/>
-        </w:rPr>
-      </w:pPr>
-      <w:r>
-        <w:t>Features</w:t>
-      </w:r>
-    </w:p>
-    <w:p>
-      <w:pPr>
-        <w:numPr>
-          <w:ilvl w:val="0"/>
-          <w:numId w:val="4"/>
-        </w:numPr>
-        <w:rPr>
-          <w:rFonts w:hint="eastAsia"/>
-        </w:rPr>
-      </w:pPr>
-      <w:r>
-        <w:t xml:space="preserve">Added command line parameters. </w:t>
-      </w:r>
-      <w:r>
-        <w:t>These r</w:t>
-      </w:r>
-      <w:r>
-        <w:t xml:space="preserve">eplaces </w:t>
-      </w:r>
-      <w:r>
-        <w:t xml:space="preserve">the </w:t>
-      </w:r>
-      <w:r>
-        <w:t>LocalOverrides</w:t>
-      </w:r>
-      <w:r>
-        <w:t xml:space="preserve"> mechanism.</w:t>
-      </w:r>
-    </w:p>
-    <w:p>
-      <w:pPr>
-        <w:numPr>
-          <w:ilvl w:val="0"/>
-          <w:numId w:val="4"/>
-        </w:numPr>
-        <w:rPr>
-          <w:rFonts w:hint="eastAsia"/>
-        </w:rPr>
-      </w:pPr>
-      <w:r>
-        <w:t xml:space="preserve">LocalOverrides </w:t>
-      </w:r>
-      <w:r>
-        <w:t>mechanism removed.</w:t>
-      </w:r>
-    </w:p>
-    <w:p>
-      <w:pPr>
-        <w:numPr>
-          <w:ilvl w:val="0"/>
-          <w:numId w:val="4"/>
-        </w:numPr>
-        <w:rPr>
-          <w:rFonts w:hint="eastAsia"/>
-        </w:rPr>
-      </w:pPr>
-      <w:r>
-        <w:t>Save project file: the [Update XML to current version] checkbox is now enabled by default.</w:t>
-      </w:r>
-    </w:p>
-    <w:p>
-      <w:pPr>
-        <w:numPr>
-          <w:ilvl w:val="0"/>
-          <w:numId w:val="4"/>
-        </w:numPr>
-        <w:rPr>
-          <w:rFonts w:hint="eastAsia"/>
-        </w:rPr>
-      </w:pPr>
-      <w:r>
-        <w:t>Options form: tooltips improved.</w:t>
-      </w:r>
-    </w:p>
-    <w:p>
-      <w:pPr>
-        <w:numPr>
-          <w:ilvl w:val="0"/>
-          <w:numId w:val="4"/>
-        </w:numPr>
-        <w:rPr>
-          <w:rFonts w:hint="eastAsia"/>
-        </w:rPr>
-      </w:pPr>
-      <w:r>
-        <w:t>Grid: Regist</w:t>
-      </w:r>
-      <w:r>
-        <w:t>er</w:t>
+        <w:numPr>
+          <w:ilvl w:val="0"/>
+          <w:numId w:val="11"/>
+        </w:numPr>
+        <w:rPr>
+          <w:rFonts w:hint="eastAsia"/>
+        </w:rPr>
+      </w:pPr>
+      <w:r>
+        <w:t>M</w:t>
+      </w:r>
+      <w:r>
+        <w:t xml:space="preserve">bc project file: XML tags </w:t>
+      </w:r>
+      <w:r>
+        <w:t xml:space="preserve">are </w:t>
+      </w:r>
+      <w:r>
+        <w:t xml:space="preserve">now preferably in lowercase. The old camelcase is also still accepted. </w:t>
+      </w:r>
+    </w:p>
+    <w:p>
+      <w:pPr>
+        <w:numPr>
+          <w:ilvl w:val="0"/>
+          <w:numId w:val="11"/>
+        </w:numPr>
+        <w:rPr>
+          <w:rFonts w:hint="eastAsia"/>
+        </w:rPr>
+      </w:pPr>
+      <w:r>
+        <w:t>Always shows line numbers f</w:t>
+      </w:r>
+      <w:r>
+        <w:t xml:space="preserve">or errors in mbc file. </w:t>
+      </w:r>
+    </w:p>
+    <w:p>
+      <w:pPr>
+        <w:numPr>
+          <w:ilvl w:val="0"/>
+          <w:numId w:val="11"/>
+        </w:numPr>
+        <w:rPr>
+          <w:rFonts w:hint="eastAsia"/>
+        </w:rPr>
+      </w:pPr>
+      <w:r>
+        <w:t>Word order (endian)</w:t>
       </w:r>
       <w:r>
         <w:t xml:space="preserve"> </w:t>
       </w:r>
       <w:r>
-        <w:t xml:space="preserve">column menu now has </w:t>
-      </w:r>
-      <w:r>
-        <w:t xml:space="preserve"> [</w:t>
-      </w:r>
-      <w:r>
-        <w:t>Expand all]</w:t>
-      </w:r>
-      <w:r>
-        <w:t xml:space="preserve"> and </w:t>
-      </w:r>
-      <w:r>
-        <w:t>[</w:t>
-      </w:r>
-      <w:r>
-        <w:t>Collapse all</w:t>
-      </w:r>
-      <w:r>
-        <w:t>].</w:t>
-      </w:r>
-    </w:p>
-    <w:p>
-      <w:pPr>
-        <w:numPr>
-          <w:ilvl w:val="0"/>
-          <w:numId w:val="4"/>
-        </w:numPr>
-        <w:rPr>
-          <w:rFonts w:hint="eastAsia"/>
-        </w:rPr>
-      </w:pPr>
-      <w:r>
-        <w:t>Mbc project file: &lt;</w:t>
-      </w:r>
-      <w:proofErr w:type="spellStart"/>
-      <w:r>
-        <w:t>longdescr</w:t>
-      </w:r>
-      <w:proofErr w:type="spellEnd"/>
-      <w:r>
-        <w:t xml:space="preserve">&gt; </w:t>
-      </w:r>
-      <w:r>
-        <w:t xml:space="preserve">element </w:t>
-      </w:r>
-      <w:r>
-        <w:t xml:space="preserve">added. </w:t>
-      </w:r>
-      <w:r>
-        <w:t xml:space="preserve">Adds a long multiline text that is show when the mouse is hoovered over the register </w:t>
-      </w:r>
-      <w:proofErr w:type="spellStart"/>
-      <w:r>
-        <w:t>decription</w:t>
-      </w:r>
-      <w:proofErr w:type="spellEnd"/>
-      <w:r>
-        <w:t>.</w:t>
-      </w:r>
-    </w:p>
-    <w:p>
-      <w:pPr>
-        <w:numPr>
-          <w:ilvl w:val="0"/>
-          <w:numId w:val="4"/>
-        </w:numPr>
-        <w:rPr>
-          <w:rFonts w:hint="eastAsia"/>
-        </w:rPr>
-      </w:pPr>
-      <w:r>
-        <w:t>Mbc project file: &lt;include&gt; element added.</w:t>
-      </w:r>
-    </w:p>
-    <w:p>
-      <w:pPr>
-        <w:pStyle w:val="Kop3"/>
-        <w:numPr>
-          <w:ilvl w:val="0"/>
-          <w:numId w:val="0"/>
-        </w:numPr>
-        <w:ind w:left="680" w:hanging="431"/>
-        <w:rPr>
-          <w:rFonts w:hint="eastAsia"/>
-        </w:rPr>
-      </w:pPr>
-      <w:r>
-        <w:t>Fixes</w:t>
-      </w:r>
-    </w:p>
-    <w:p>
-      <w:pPr>
-        <w:numPr>
-          <w:ilvl w:val="0"/>
-          <w:numId w:val="4"/>
-        </w:numPr>
-        <w:rPr>
-          <w:rFonts w:hint="eastAsia"/>
-        </w:rPr>
-      </w:pPr>
-      <w:r>
-        <w:t>[</w:t>
-      </w:r>
-      <w:r>
-        <w:t>Open project file location in Explorer] now works if you gave a filename without a path on the command line.</w:t>
-      </w:r>
-    </w:p>
-    <w:p>
-      <w:pPr>
-        <w:numPr>
-          <w:ilvl w:val="0"/>
-          <w:numId w:val="4"/>
-        </w:numPr>
-        <w:rPr>
-          <w:rFonts w:hint="eastAsia"/>
-        </w:rPr>
-      </w:pPr>
-      <w:r>
-        <w:t xml:space="preserve">The temporary red </w:t>
-      </w:r>
-      <w:r>
-        <w:t>colouring</w:t>
-      </w:r>
-      <w:r>
-        <w:t xml:space="preserve"> of the value field after entering </w:t>
-      </w:r>
-      <w:r>
-        <w:t xml:space="preserve">an invalid value </w:t>
-      </w:r>
-      <w:r>
-        <w:t>has been improved.</w:t>
-      </w:r>
-    </w:p>
-    <w:p>
-      <w:pPr>
-        <w:numPr>
-          <w:ilvl w:val="0"/>
-          <w:numId w:val="4"/>
-        </w:numPr>
-        <w:rPr>
-          <w:rFonts w:hint="eastAsia"/>
-        </w:rPr>
-      </w:pPr>
-      <w:r>
-        <w:t>Edit</w:t>
-      </w:r>
-      <w:r>
-        <w:t xml:space="preserve"> enter/escape </w:t>
-      </w:r>
-      <w:r>
-        <w:t>handling is improved</w:t>
-      </w:r>
-      <w:r>
-        <w:t>.</w:t>
-      </w:r>
-    </w:p>
-    <w:p>
-      <w:pPr>
-        <w:numPr>
-          <w:ilvl w:val="0"/>
-          <w:numId w:val="4"/>
-        </w:numPr>
-        <w:rPr>
-          <w:rFonts w:hint="eastAsia"/>
-        </w:rPr>
-      </w:pPr>
-      <w:r>
-        <w:t xml:space="preserve">In the notification screen that the serial port could not be opened: the [Port] </w:t>
-      </w:r>
-      <w:r>
-        <w:t>combo box</w:t>
-      </w:r>
-      <w:r>
-        <w:t xml:space="preserve"> now automatically refreshes the list of serial ports.</w:t>
-      </w:r>
-    </w:p>
-    <w:p>
-      <w:pPr>
-        <w:pStyle w:val="Kop1"/>
-        <w:rPr>
-          <w:rFonts w:hint="eastAsia"/>
-        </w:rPr>
-      </w:pPr>
-      <w:r>
-        <w:t>v2.0.13 -- 2022-07-11</w:t>
-      </w:r>
-    </w:p>
-    <w:p>
-      <w:pPr>
-        <w:pStyle w:val="Kop3"/>
-        <w:rPr>
-          <w:rFonts w:hint="eastAsia"/>
-        </w:rPr>
-      </w:pPr>
-      <w:r>
-        <w:t>Features</w:t>
-      </w:r>
-    </w:p>
-    <w:p>
-      <w:pPr>
-        <w:numPr>
-          <w:ilvl w:val="0"/>
-          <w:numId w:val="4"/>
-        </w:numPr>
-        <w:rPr>
-          <w:rFonts w:hint="eastAsia"/>
-        </w:rPr>
-      </w:pPr>
-      <w:r>
-        <w:t xml:space="preserve">Added Find/Filter bar. </w:t>
-      </w:r>
-      <w:r>
-        <w:t>Open it using</w:t>
-      </w:r>
-      <w:r>
-        <w:t xml:space="preserve"> Control-F. There is also an option </w:t>
-      </w:r>
-      <w:r>
-        <w:t>“</w:t>
-      </w:r>
-      <w:r>
-        <w:t>Clear Find/Filter on tab change</w:t>
-      </w:r>
-      <w:r>
-        <w:t>”</w:t>
-      </w:r>
-      <w:r>
-        <w:t>.</w:t>
-      </w:r>
-    </w:p>
-    <w:p>
-      <w:pPr>
-        <w:numPr>
-          <w:ilvl w:val="0"/>
-          <w:numId w:val="4"/>
-        </w:numPr>
-        <w:rPr>
-          <w:rFonts w:hint="eastAsia"/>
-        </w:rPr>
-      </w:pPr>
-      <w:r>
-        <w:t>The properties of a register (</w:t>
-      </w:r>
-      <w:proofErr w:type="spellStart"/>
-      <w:r>
-        <w:t>rw</w:t>
-      </w:r>
-      <w:proofErr w:type="spellEnd"/>
-      <w:r>
-        <w:t xml:space="preserve">, int32, ...) are now displayed in a separate </w:t>
-      </w:r>
-      <w:r>
-        <w:t>[</w:t>
-      </w:r>
-      <w:r>
-        <w:t>Properties</w:t>
-      </w:r>
-      <w:r>
-        <w:t>]</w:t>
-      </w:r>
-      <w:r>
-        <w:t xml:space="preserve"> column</w:t>
-      </w:r>
-      <w:r>
-        <w:t xml:space="preserve"> instead of being added to </w:t>
-      </w:r>
-      <w:r>
-        <w:t xml:space="preserve">the </w:t>
-      </w:r>
-      <w:r>
-        <w:t>[</w:t>
-      </w:r>
-      <w:r>
-        <w:t>Description</w:t>
-      </w:r>
-      <w:r>
-        <w:t>]</w:t>
-      </w:r>
-      <w:r>
-        <w:t xml:space="preserve"> column. </w:t>
-      </w:r>
-      <w:r>
-        <w:t>The [Properties]  column can be e</w:t>
-      </w:r>
-      <w:r>
-        <w:t>nable/disable</w:t>
-      </w:r>
-      <w:r>
-        <w:t>d</w:t>
-      </w:r>
-      <w:r>
-        <w:t xml:space="preserve"> in Options.</w:t>
-      </w:r>
-    </w:p>
-    <w:p>
-      <w:pPr>
-        <w:numPr>
-          <w:ilvl w:val="0"/>
-          <w:numId w:val="4"/>
-        </w:numPr>
-        <w:rPr>
-          <w:rFonts w:hint="eastAsia"/>
-        </w:rPr>
-      </w:pPr>
-      <w:r>
-        <w:t>The Description text can now be multi-line</w:t>
-      </w:r>
-      <w:r>
-        <w:t>, i</w:t>
-      </w:r>
-      <w:r>
-        <w:t xml:space="preserve">f  the </w:t>
-      </w:r>
-      <w:r>
-        <w:t>“</w:t>
-      </w:r>
-      <w:r>
-        <w:t>Multiline rows with auto row size</w:t>
-      </w:r>
-      <w:r>
-        <w:t>”</w:t>
-      </w:r>
-      <w:r>
-        <w:t xml:space="preserve"> option </w:t>
-      </w:r>
-      <w:r>
-        <w:t>is enabled</w:t>
-      </w:r>
-      <w:r>
-        <w:t xml:space="preserve">. A </w:t>
-      </w:r>
-      <w:r>
-        <w:t xml:space="preserve">long </w:t>
-      </w:r>
-      <w:r>
-        <w:t xml:space="preserve">description </w:t>
-      </w:r>
-      <w:r>
-        <w:t>text is wrappe</w:t>
-      </w:r>
-      <w:r>
-        <w:t xml:space="preserve">d. </w:t>
-      </w:r>
-      <w:r>
-        <w:t>CR/LF</w:t>
-      </w:r>
-      <w:r>
-        <w:t xml:space="preserve">’s can be used in the description text. </w:t>
-      </w:r>
-      <w:r>
-        <w:t xml:space="preserve">The row height of the grid is automatically adjusted to the text. </w:t>
-      </w:r>
-    </w:p>
-    <w:p>
-      <w:pPr>
-        <w:numPr>
-          <w:ilvl w:val="0"/>
-          <w:numId w:val="4"/>
-        </w:numPr>
-        <w:rPr>
-          <w:rFonts w:hint="eastAsia"/>
-        </w:rPr>
-      </w:pPr>
-      <w:r>
-        <w:t>"Move to next row on Enter"</w:t>
-      </w:r>
-      <w:r>
-        <w:t xml:space="preserve"> option</w:t>
-      </w:r>
-      <w:r>
-        <w:t xml:space="preserve">: depending on this option, after entering a new value with the Enter key, the </w:t>
-      </w:r>
-      <w:r>
-        <w:t>cursor</w:t>
-      </w:r>
-      <w:r>
-        <w:t xml:space="preserve"> may or may not go to the next line. </w:t>
-      </w:r>
-      <w:r>
-        <w:t xml:space="preserve">Enter a value with </w:t>
-      </w:r>
-      <w:r>
-        <w:t>Control-Enter</w:t>
-      </w:r>
-      <w:r>
-        <w:t xml:space="preserve"> to get the</w:t>
-      </w:r>
-      <w:r>
-        <w:t xml:space="preserve"> opposite</w:t>
-      </w:r>
-      <w:r>
-        <w:t xml:space="preserve"> behaviour.</w:t>
-      </w:r>
-    </w:p>
-    <w:p>
-      <w:pPr>
-        <w:pStyle w:val="Kop3"/>
-        <w:numPr>
-          <w:ilvl w:val="0"/>
-          <w:numId w:val="0"/>
-        </w:numPr>
-        <w:ind w:left="680" w:hanging="431"/>
-        <w:rPr>
-          <w:rFonts w:hint="eastAsia"/>
-        </w:rPr>
-      </w:pPr>
-      <w:r>
-        <w:t>Fixes</w:t>
-      </w:r>
-    </w:p>
-    <w:p>
-      <w:pPr>
-        <w:numPr>
-          <w:ilvl w:val="0"/>
-          <w:numId w:val="5"/>
-        </w:numPr>
-        <w:rPr>
-          <w:rFonts w:hint="eastAsia"/>
-        </w:rPr>
-      </w:pPr>
-      <w:r>
-        <w:t>Control-0 for zoom reset now works globally on the form, not just when the focus is in the grid.</w:t>
-      </w:r>
-    </w:p>
-    <w:p>
-      <w:pPr>
-        <w:numPr>
-          <w:ilvl w:val="0"/>
-          <w:numId w:val="5"/>
-        </w:numPr>
-        <w:rPr>
-          <w:rFonts w:hint="eastAsia"/>
-        </w:rPr>
-      </w:pPr>
-      <w:r>
-        <w:t>R</w:t>
-      </w:r>
-      <w:r>
-        <w:t>ight-click</w:t>
-      </w:r>
-      <w:r>
-        <w:t>ing</w:t>
-      </w:r>
-      <w:r>
-        <w:t xml:space="preserve"> in the grid</w:t>
-      </w:r>
-      <w:r>
-        <w:t xml:space="preserve"> now moves the focus to that row, to </w:t>
-      </w:r>
-      <w:r>
-        <w:t>better see which row you are working on.</w:t>
-      </w:r>
-    </w:p>
-    <w:p>
-      <w:pPr>
-        <w:numPr>
-          <w:ilvl w:val="0"/>
-          <w:numId w:val="5"/>
-        </w:numPr>
-        <w:rPr>
-          <w:rFonts w:hint="eastAsia"/>
-        </w:rPr>
-      </w:pPr>
-      <w:r>
-        <w:lastRenderedPageBreak/>
-        <w:t>Migrated</w:t>
-      </w:r>
-      <w:r>
-        <w:t xml:space="preserve"> to .NET framework 4.7.2.</w:t>
-      </w:r>
-    </w:p>
-    <w:p>
-      <w:pPr>
-        <w:pStyle w:val="Kop1"/>
-        <w:rPr>
-          <w:rFonts w:hint="eastAsia"/>
-        </w:rPr>
-      </w:pPr>
-      <w:r>
-        <w:t>v2.0.12 -- 2020-07-13</w:t>
-      </w:r>
-    </w:p>
-    <w:p>
-      <w:pPr>
-        <w:pStyle w:val="Kop3"/>
-        <w:rPr>
-          <w:rFonts w:hint="eastAsia"/>
-        </w:rPr>
-      </w:pPr>
-      <w:r>
-        <w:t>Features</w:t>
-      </w:r>
-    </w:p>
-    <w:p>
-      <w:pPr>
-        <w:numPr>
-          <w:ilvl w:val="0"/>
-          <w:numId w:val="6"/>
-        </w:numPr>
-        <w:rPr>
-          <w:rFonts w:hint="eastAsia"/>
-        </w:rPr>
-      </w:pPr>
-      <w:r>
-        <w:t>Added mbc project file validation with XSD schema</w:t>
-      </w:r>
-      <w:r>
-        <w:t xml:space="preserve"> file</w:t>
-      </w:r>
-      <w:r>
-        <w:t xml:space="preserve">. </w:t>
-      </w:r>
-      <w:r>
-        <w:t xml:space="preserve">Validation is optional. </w:t>
-      </w:r>
-      <w:r>
-        <w:t>The validation only allows lower-case XML tags</w:t>
-      </w:r>
-      <w:r>
-        <w:t>, a</w:t>
-      </w:r>
-      <w:r>
-        <w:t xml:space="preserve">nd only allows the XML elements that are supported in this version. The intention is that over time all mbc files will </w:t>
-      </w:r>
-      <w:r>
-        <w:t>migrate</w:t>
-      </w:r>
-      <w:r>
-        <w:t xml:space="preserve"> to meet the validation.</w:t>
-      </w:r>
-    </w:p>
-    <w:p>
-      <w:pPr>
-        <w:numPr>
-          <w:ilvl w:val="0"/>
-          <w:numId w:val="6"/>
-        </w:numPr>
-        <w:rPr>
-          <w:rFonts w:hint="eastAsia"/>
-        </w:rPr>
-      </w:pPr>
-      <w:r>
-        <w:t>In</w:t>
-      </w:r>
-      <w:r>
-        <w:t xml:space="preserve"> </w:t>
-      </w:r>
-      <w:r>
-        <w:t xml:space="preserve">the </w:t>
-      </w:r>
-      <w:r>
-        <w:t xml:space="preserve">"Save project file" </w:t>
-      </w:r>
-      <w:r>
-        <w:t xml:space="preserve">form </w:t>
-      </w:r>
-      <w:r>
-        <w:t xml:space="preserve">you now have the option to update the XML with "Update XML to current version" so that it then passes the validation. </w:t>
-      </w:r>
-      <w:r>
-        <w:t>E</w:t>
-      </w:r>
-      <w:r>
-        <w:t>rrors must be corrected manually.</w:t>
-      </w:r>
-    </w:p>
-    <w:p>
-      <w:pPr>
-        <w:numPr>
-          <w:ilvl w:val="0"/>
-          <w:numId w:val="6"/>
-        </w:numPr>
-        <w:rPr>
-          <w:rFonts w:hint="eastAsia"/>
-        </w:rPr>
-      </w:pPr>
-      <w:r>
-        <w:t>In</w:t>
-      </w:r>
-      <w:r>
-        <w:t xml:space="preserve"> "Save project file" the project file is now saved with XML formatting.</w:t>
-      </w:r>
-    </w:p>
-    <w:p>
-      <w:pPr>
-        <w:numPr>
-          <w:ilvl w:val="0"/>
-          <w:numId w:val="6"/>
-        </w:numPr>
-        <w:rPr>
-          <w:rFonts w:hint="eastAsia"/>
-        </w:rPr>
-      </w:pPr>
-      <w:r>
-        <w:t xml:space="preserve">If you start ModbusControl by double-clicking an mbc file and the file points to a non-existent COM port, the error dialog "Error opening serial port </w:t>
-      </w:r>
-      <w:proofErr w:type="spellStart"/>
-      <w:r>
-        <w:t>COMx</w:t>
-      </w:r>
-      <w:proofErr w:type="spellEnd"/>
-      <w:r>
-        <w:t>" now appears after the ModbusControl program appears.</w:t>
-      </w:r>
-    </w:p>
-    <w:p>
-      <w:pPr>
-        <w:numPr>
-          <w:ilvl w:val="0"/>
-          <w:numId w:val="6"/>
-        </w:numPr>
-        <w:rPr>
-          <w:rFonts w:hint="eastAsia"/>
-        </w:rPr>
-      </w:pPr>
-      <w:r>
-        <w:t xml:space="preserve">At the first start </w:t>
-      </w:r>
-      <w:r>
-        <w:t xml:space="preserve">of the program </w:t>
-      </w:r>
-      <w:r>
-        <w:t xml:space="preserve">after an update, </w:t>
-      </w:r>
-      <w:r>
-        <w:t xml:space="preserve">an option is shown </w:t>
-      </w:r>
-      <w:r>
-        <w:t>to see the 'Release notes'.</w:t>
-      </w:r>
-    </w:p>
-    <w:p>
-      <w:pPr>
-        <w:numPr>
-          <w:ilvl w:val="0"/>
-          <w:numId w:val="6"/>
-        </w:numPr>
-        <w:rPr>
-          <w:rFonts w:hint="eastAsia"/>
-        </w:rPr>
-      </w:pPr>
-      <w:r>
-        <w:t xml:space="preserve">Program settings split into user-dependent part and </w:t>
-      </w:r>
-      <w:r>
-        <w:t>computer</w:t>
-      </w:r>
-      <w:r>
-        <w:t xml:space="preserve">-dependent part. The old settings are migrated to the new settings files, then </w:t>
-      </w:r>
-      <w:r>
-        <w:t xml:space="preserve">the </w:t>
-      </w:r>
-      <w:r>
-        <w:t>old settings file is deleted.</w:t>
-      </w:r>
-    </w:p>
-    <w:p>
-      <w:pPr>
-        <w:numPr>
-          <w:ilvl w:val="0"/>
-          <w:numId w:val="6"/>
-        </w:numPr>
-        <w:rPr>
-          <w:rFonts w:hint="eastAsia"/>
-        </w:rPr>
-      </w:pPr>
-      <w:r>
-        <w:t xml:space="preserve">LocalOverrides.xml </w:t>
-      </w:r>
-      <w:r>
-        <w:t xml:space="preserve">file is automatically </w:t>
-      </w:r>
-      <w:r>
-        <w:t>moved from &lt;</w:t>
-      </w:r>
-      <w:proofErr w:type="spellStart"/>
-      <w:r>
-        <w:t>mydocuments</w:t>
-      </w:r>
-      <w:proofErr w:type="spellEnd"/>
-      <w:r>
-        <w:t>&gt;\ModbusControl to %</w:t>
-      </w:r>
-      <w:proofErr w:type="spellStart"/>
-      <w:r>
-        <w:t>AppData</w:t>
-      </w:r>
-      <w:proofErr w:type="spellEnd"/>
-      <w:r>
-        <w:t xml:space="preserve">%\Roaming\E.D.&amp;A\ModbusControl. Content from old is not migrated. Old </w:t>
-      </w:r>
-      <w:r>
-        <w:t>file</w:t>
-      </w:r>
-      <w:r>
-        <w:t xml:space="preserve"> is renamed with '.old' and moved to the </w:t>
-      </w:r>
-      <w:r>
-        <w:t xml:space="preserve">new </w:t>
-      </w:r>
-      <w:r>
-        <w:t>location. If overrides were used, the user will receive a notification.</w:t>
-      </w:r>
-    </w:p>
-    <w:p>
-      <w:pPr>
-        <w:numPr>
-          <w:ilvl w:val="0"/>
-          <w:numId w:val="6"/>
-        </w:numPr>
-        <w:rPr>
-          <w:rFonts w:hint="eastAsia"/>
-        </w:rPr>
-      </w:pPr>
-      <w:r>
-        <w:t>&lt;user&gt;\Documents\ModbusControl is no longer used.</w:t>
-      </w:r>
-    </w:p>
-    <w:p>
-      <w:pPr>
-        <w:pStyle w:val="Kop3"/>
-        <w:rPr>
-          <w:rFonts w:hint="eastAsia"/>
-        </w:rPr>
-      </w:pPr>
-      <w:r>
-        <w:t>Fixes</w:t>
-      </w:r>
-    </w:p>
-    <w:p>
-      <w:pPr>
-        <w:numPr>
-          <w:ilvl w:val="0"/>
-          <w:numId w:val="7"/>
-        </w:numPr>
-        <w:rPr>
-          <w:rFonts w:hint="eastAsia"/>
-        </w:rPr>
-      </w:pPr>
-      <w:r>
-        <w:t>The import/export dialogs now show '*. CSV' instead of '*. C</w:t>
-      </w:r>
-      <w:r>
-        <w:t>VS</w:t>
-      </w:r>
-      <w:r>
-        <w:t>'.</w:t>
-      </w:r>
-    </w:p>
-    <w:p>
-      <w:pPr>
-        <w:numPr>
-          <w:ilvl w:val="0"/>
-          <w:numId w:val="7"/>
-        </w:numPr>
-        <w:rPr>
-          <w:rFonts w:hint="eastAsia"/>
-        </w:rPr>
-      </w:pPr>
-      <w:r>
-        <w:t>Mbc file is now saved without BOM (</w:t>
-      </w:r>
-      <w:r>
-        <w:t>Unicode</w:t>
-      </w:r>
-      <w:r>
-        <w:t xml:space="preserve"> byte order mark).</w:t>
-      </w:r>
-    </w:p>
-    <w:p>
-      <w:pPr>
-        <w:numPr>
-          <w:ilvl w:val="0"/>
-          <w:numId w:val="7"/>
-        </w:numPr>
-        <w:rPr>
-          <w:rFonts w:hint="eastAsia"/>
-        </w:rPr>
-      </w:pPr>
-      <w:r>
-        <w:t xml:space="preserve">Better </w:t>
-      </w:r>
-      <w:r>
-        <w:t>handling</w:t>
-      </w:r>
-      <w:r>
-        <w:t xml:space="preserve"> if </w:t>
-      </w:r>
-      <w:r>
-        <w:t>a</w:t>
-      </w:r>
-      <w:r>
-        <w:t xml:space="preserve"> non-admin</w:t>
-      </w:r>
-      <w:r>
-        <w:t>istrator</w:t>
-      </w:r>
-      <w:r>
-        <w:t xml:space="preserve"> user logs </w:t>
-      </w:r>
-      <w:r>
-        <w:t xml:space="preserve">on </w:t>
-      </w:r>
-      <w:r>
-        <w:t>and uses ModbusControl.</w:t>
-      </w:r>
-    </w:p>
-    <w:p>
-      <w:pPr>
-        <w:pStyle w:val="Kop1"/>
-        <w:rPr>
-          <w:rFonts w:hint="eastAsia"/>
-        </w:rPr>
-      </w:pPr>
-      <w:r>
-        <w:t>v2.0.11 -- 2019-11-18</w:t>
-      </w:r>
-    </w:p>
-    <w:p>
-      <w:pPr>
-        <w:pStyle w:val="Kop3"/>
-        <w:rPr>
-          <w:rFonts w:hint="eastAsia"/>
-        </w:rPr>
-      </w:pPr>
-      <w:r>
-        <w:t>Fixes</w:t>
-      </w:r>
-    </w:p>
-    <w:p>
-      <w:pPr>
-        <w:numPr>
-          <w:ilvl w:val="0"/>
-          <w:numId w:val="8"/>
-        </w:numPr>
-        <w:rPr>
-          <w:rFonts w:hint="eastAsia"/>
-        </w:rPr>
-      </w:pPr>
-      <w:r>
-        <w:t xml:space="preserve">Better handling if the USB/serial connection is lost. In the past </w:t>
-      </w:r>
-      <w:r>
-        <w:t xml:space="preserve">the </w:t>
-      </w:r>
-      <w:r>
-        <w:t xml:space="preserve">program </w:t>
-      </w:r>
-      <w:r>
-        <w:t>could stop responding</w:t>
-      </w:r>
-      <w:r>
-        <w:t>.</w:t>
-      </w:r>
-    </w:p>
-    <w:p>
-      <w:pPr>
-        <w:pStyle w:val="Kop1"/>
-        <w:rPr>
-          <w:rFonts w:hint="eastAsia"/>
-        </w:rPr>
-      </w:pPr>
-      <w:r>
-        <w:t>v2.0.10 -- 2019-03-11</w:t>
-      </w:r>
-    </w:p>
-    <w:p>
-      <w:pPr>
-        <w:pStyle w:val="Kop3"/>
-        <w:rPr>
-          <w:rFonts w:hint="eastAsia"/>
-        </w:rPr>
-      </w:pPr>
-      <w:r>
-        <w:t>Features</w:t>
-      </w:r>
-    </w:p>
-    <w:p>
-      <w:pPr>
-        <w:numPr>
-          <w:ilvl w:val="0"/>
-          <w:numId w:val="8"/>
-        </w:numPr>
-        <w:rPr>
-          <w:rFonts w:hint="eastAsia"/>
-        </w:rPr>
-      </w:pPr>
-      <w:r>
-        <w:t>Added display</w:t>
-      </w:r>
-      <w:r>
-        <w:t>ing</w:t>
-      </w:r>
-      <w:r>
-        <w:t xml:space="preserve"> of enum </w:t>
-      </w:r>
-      <w:r>
-        <w:t xml:space="preserve">values </w:t>
-      </w:r>
-      <w:r>
-        <w:t xml:space="preserve">in the value column. </w:t>
-      </w:r>
-    </w:p>
-    <w:p>
-      <w:pPr>
-        <w:pStyle w:val="Kop3"/>
-        <w:rPr>
-          <w:rFonts w:hint="eastAsia"/>
-        </w:rPr>
-      </w:pPr>
-      <w:r>
-        <w:t>Fixes</w:t>
-      </w:r>
-    </w:p>
-    <w:p>
-      <w:pPr>
-        <w:numPr>
-          <w:ilvl w:val="0"/>
-          <w:numId w:val="8"/>
-        </w:numPr>
-        <w:rPr>
-          <w:rFonts w:hint="eastAsia"/>
-        </w:rPr>
-      </w:pPr>
-      <w:r>
-        <w:t xml:space="preserve">Menu </w:t>
-      </w:r>
-      <w:r>
-        <w:t xml:space="preserve">item </w:t>
-      </w:r>
-      <w:r>
-        <w:t xml:space="preserve">"Edit project file" did not work </w:t>
-      </w:r>
-      <w:r>
-        <w:t xml:space="preserve">correctly </w:t>
-      </w:r>
-      <w:r>
-        <w:t>if there was a space in the path.</w:t>
-      </w:r>
-    </w:p>
-    <w:p>
-      <w:pPr>
-        <w:numPr>
-          <w:ilvl w:val="0"/>
-          <w:numId w:val="8"/>
-        </w:numPr>
-        <w:rPr>
-          <w:rFonts w:hint="eastAsia"/>
-        </w:rPr>
-      </w:pPr>
-      <w:r>
-        <w:t>Logger: Clear button did not clear number of logs in the status bar.</w:t>
-      </w:r>
-    </w:p>
-    <w:p>
-      <w:pPr>
-        <w:numPr>
-          <w:ilvl w:val="0"/>
-          <w:numId w:val="8"/>
-        </w:numPr>
-        <w:rPr>
-          <w:rFonts w:hint="eastAsia"/>
-        </w:rPr>
-      </w:pPr>
-      <w:r>
-        <w:t xml:space="preserve">Send Custom Modbus Command: allows tabs and CR/LF in the string. </w:t>
-      </w:r>
-      <w:r>
-        <w:t xml:space="preserve">Reports </w:t>
-      </w:r>
-      <w:r>
-        <w:t xml:space="preserve">error </w:t>
-      </w:r>
-      <w:r>
-        <w:t>for</w:t>
-      </w:r>
-      <w:r>
-        <w:t xml:space="preserve"> empty command string. </w:t>
-      </w:r>
-    </w:p>
-    <w:p>
-      <w:pPr>
-        <w:numPr>
-          <w:ilvl w:val="0"/>
-          <w:numId w:val="8"/>
-        </w:numPr>
-        <w:rPr>
-          <w:rFonts w:hint="eastAsia"/>
-        </w:rPr>
-      </w:pPr>
-      <w:r>
-        <w:t xml:space="preserve">Send Custom Modbus Command: </w:t>
-      </w:r>
-      <w:r>
-        <w:t>Reports</w:t>
-      </w:r>
-      <w:r>
-        <w:t xml:space="preserve"> error when command is too short, must be at least 2 bytes.</w:t>
-      </w:r>
-    </w:p>
-    <w:p>
-      <w:pPr>
-        <w:numPr>
-          <w:ilvl w:val="0"/>
-          <w:numId w:val="8"/>
-        </w:numPr>
-        <w:rPr>
-          <w:rFonts w:hint="eastAsia"/>
-        </w:rPr>
-      </w:pPr>
-      <w:r>
-        <w:t xml:space="preserve">Fix background </w:t>
-      </w:r>
-      <w:r>
-        <w:t>colour</w:t>
-      </w:r>
-      <w:r>
-        <w:t xml:space="preserve"> of registers.</w:t>
-      </w:r>
-    </w:p>
-    <w:p>
-      <w:pPr>
-        <w:pStyle w:val="Kop1"/>
-        <w:rPr>
-          <w:rFonts w:hint="eastAsia"/>
-        </w:rPr>
-      </w:pPr>
-      <w:r>
-        <w:lastRenderedPageBreak/>
-        <w:t>v2.0.9 -- 2018-10-20</w:t>
-      </w:r>
-    </w:p>
-    <w:p>
-      <w:pPr>
-        <w:pStyle w:val="Kop3"/>
-        <w:rPr>
-          <w:rFonts w:hint="eastAsia"/>
-        </w:rPr>
-      </w:pPr>
-      <w:r>
-        <w:t>Features</w:t>
-      </w:r>
-    </w:p>
-    <w:p>
-      <w:pPr>
-        <w:numPr>
-          <w:ilvl w:val="0"/>
-          <w:numId w:val="9"/>
-        </w:numPr>
-        <w:rPr>
-          <w:rFonts w:hint="eastAsia"/>
-        </w:rPr>
-      </w:pPr>
-      <w:r>
-        <w:t>New option: "Move to next row on Enter".</w:t>
-      </w:r>
-    </w:p>
-    <w:p>
-      <w:pPr>
-        <w:numPr>
-          <w:ilvl w:val="0"/>
-          <w:numId w:val="9"/>
-        </w:numPr>
-        <w:rPr>
-          <w:rFonts w:hint="eastAsia"/>
-        </w:rPr>
-      </w:pPr>
-      <w:r>
-        <w:t xml:space="preserve">New option: "Auto-start edit mode on typing". </w:t>
-      </w:r>
-    </w:p>
-    <w:p>
-      <w:pPr>
-        <w:numPr>
-          <w:ilvl w:val="0"/>
-          <w:numId w:val="9"/>
-        </w:numPr>
-        <w:rPr>
-          <w:rFonts w:hint="eastAsia"/>
-        </w:rPr>
-      </w:pPr>
-      <w:r>
-        <w:t xml:space="preserve">New option: "Use custom editor". </w:t>
-      </w:r>
-    </w:p>
-    <w:p>
-      <w:pPr>
-        <w:numPr>
-          <w:ilvl w:val="0"/>
-          <w:numId w:val="9"/>
-        </w:numPr>
-        <w:rPr>
-          <w:rFonts w:hint="eastAsia"/>
-        </w:rPr>
-      </w:pPr>
-      <w:r>
-        <w:t>New option: "Ignore form size on project reload".</w:t>
-      </w:r>
-    </w:p>
-    <w:p>
-      <w:pPr>
-        <w:numPr>
-          <w:ilvl w:val="0"/>
-          <w:numId w:val="9"/>
-        </w:numPr>
-        <w:rPr>
-          <w:rFonts w:hint="eastAsia"/>
-        </w:rPr>
-      </w:pPr>
-      <w:r>
-        <w:t>Config</w:t>
-      </w:r>
-      <w:r>
-        <w:t>uration</w:t>
-      </w:r>
-      <w:r>
-        <w:t xml:space="preserve"> form now has an Apply button.</w:t>
-      </w:r>
-    </w:p>
-    <w:p>
-      <w:pPr>
-        <w:numPr>
-          <w:ilvl w:val="0"/>
-          <w:numId w:val="9"/>
-        </w:numPr>
-        <w:rPr>
-          <w:rFonts w:hint="eastAsia"/>
-        </w:rPr>
-      </w:pPr>
-      <w:r>
-        <w:t xml:space="preserve">Separate line-copy and value-copy </w:t>
-      </w:r>
-      <w:r>
-        <w:t xml:space="preserve">capability </w:t>
-      </w:r>
-      <w:r>
-        <w:t xml:space="preserve">in grid, </w:t>
-      </w:r>
-      <w:r>
-        <w:t>using</w:t>
-      </w:r>
-      <w:r>
-        <w:t xml:space="preserve"> control-C and context menu.</w:t>
-      </w:r>
-    </w:p>
-    <w:p>
-      <w:pPr>
-        <w:numPr>
-          <w:ilvl w:val="0"/>
-          <w:numId w:val="9"/>
-        </w:numPr>
-        <w:rPr>
-          <w:rFonts w:hint="eastAsia"/>
-        </w:rPr>
-      </w:pPr>
-      <w:r>
-        <w:t xml:space="preserve">The status bar now </w:t>
-      </w:r>
-      <w:r>
-        <w:t xml:space="preserve">has </w:t>
-      </w:r>
-      <w:r>
-        <w:t xml:space="preserve">blue </w:t>
-      </w:r>
-      <w:r>
-        <w:t xml:space="preserve">colour </w:t>
-      </w:r>
-      <w:r>
-        <w:t>if there is no connection or no polling is done.</w:t>
-      </w:r>
-    </w:p>
-    <w:p>
-      <w:pPr>
-        <w:numPr>
-          <w:ilvl w:val="0"/>
-          <w:numId w:val="9"/>
-        </w:numPr>
-        <w:rPr>
-          <w:rFonts w:hint="eastAsia"/>
-        </w:rPr>
-      </w:pPr>
-      <w:r>
-        <w:t xml:space="preserve">The status bar </w:t>
-      </w:r>
-      <w:r>
-        <w:t xml:space="preserve">now has red colour </w:t>
-      </w:r>
-      <w:r>
-        <w:t>for errors.</w:t>
-      </w:r>
-    </w:p>
-    <w:p>
-      <w:pPr>
-        <w:numPr>
-          <w:ilvl w:val="0"/>
-          <w:numId w:val="9"/>
-        </w:numPr>
-        <w:rPr>
-          <w:rFonts w:hint="eastAsia"/>
-        </w:rPr>
-      </w:pPr>
-      <w:r>
-        <w:t xml:space="preserve">Now </w:t>
-      </w:r>
-      <w:r>
-        <w:t>shows</w:t>
-      </w:r>
-      <w:r>
-        <w:t xml:space="preserve"> a warning in the "Save configuration to project file" and "Project configuration" screens if localoverrides </w:t>
-      </w:r>
-      <w:r>
-        <w:t>were</w:t>
-      </w:r>
-      <w:r>
-        <w:t xml:space="preserve"> used.</w:t>
-      </w:r>
-    </w:p>
-    <w:p>
-      <w:pPr>
-        <w:pStyle w:val="Kop3"/>
-        <w:rPr>
-          <w:rFonts w:hint="eastAsia"/>
-        </w:rPr>
-      </w:pPr>
-      <w:r>
-        <w:t>Fixes</w:t>
-      </w:r>
-    </w:p>
-    <w:p>
-      <w:pPr>
-        <w:numPr>
-          <w:ilvl w:val="0"/>
-          <w:numId w:val="10"/>
-        </w:numPr>
-        <w:rPr>
-          <w:rFonts w:hint="eastAsia"/>
-        </w:rPr>
-      </w:pPr>
-      <w:r>
-        <w:t xml:space="preserve">Notification </w:t>
-      </w:r>
-      <w:r>
-        <w:t>if Settings.xml could not be loaded at startup.</w:t>
-      </w:r>
-    </w:p>
-    <w:p>
-      <w:pPr>
-        <w:numPr>
-          <w:ilvl w:val="0"/>
-          <w:numId w:val="10"/>
-        </w:numPr>
-        <w:rPr>
-          <w:rFonts w:hint="eastAsia"/>
-        </w:rPr>
-      </w:pPr>
-      <w:r>
-        <w:t xml:space="preserve">Settings.xml </w:t>
-      </w:r>
-      <w:r>
-        <w:t xml:space="preserve">writing now </w:t>
-      </w:r>
-      <w:r>
-        <w:t>update</w:t>
-      </w:r>
-      <w:r>
-        <w:t>s</w:t>
-      </w:r>
-      <w:r>
-        <w:t>/insert</w:t>
-      </w:r>
-      <w:r>
-        <w:t>s</w:t>
-      </w:r>
-      <w:r>
-        <w:t xml:space="preserve"> </w:t>
-      </w:r>
-      <w:r>
-        <w:t>al</w:t>
-      </w:r>
-      <w:r>
-        <w:t xml:space="preserve">l tags in the </w:t>
-      </w:r>
-      <w:r>
-        <w:t xml:space="preserve">existing </w:t>
-      </w:r>
-      <w:r>
-        <w:t>file instead of writing a completely new file, so that any newer tags from a newer version remain.</w:t>
-      </w:r>
-    </w:p>
-    <w:p>
-      <w:pPr>
-        <w:numPr>
-          <w:ilvl w:val="0"/>
-          <w:numId w:val="10"/>
-        </w:numPr>
-        <w:rPr>
-          <w:rFonts w:hint="eastAsia"/>
-        </w:rPr>
-      </w:pPr>
-      <w:r>
-        <w:t>Project Configuration: Interframe-delay: now shows "0 (auto)" at setting 0.</w:t>
-      </w:r>
-    </w:p>
-    <w:p>
-      <w:pPr>
-        <w:numPr>
-          <w:ilvl w:val="0"/>
-          <w:numId w:val="10"/>
-        </w:numPr>
-        <w:rPr>
-          <w:rFonts w:hint="eastAsia"/>
-        </w:rPr>
-      </w:pPr>
-      <w:r>
-        <w:t xml:space="preserve">Local override project </w:t>
-      </w:r>
-      <w:r>
         <w:t xml:space="preserve">is </w:t>
       </w:r>
       <w:r>
-        <w:t xml:space="preserve">no longer </w:t>
-      </w:r>
-      <w:r>
-        <w:t xml:space="preserve">required to have a </w:t>
-      </w:r>
-      <w:r>
-        <w:t>&lt;modbus&gt; element.</w:t>
-      </w:r>
-    </w:p>
-    <w:p>
-      <w:pPr>
-        <w:numPr>
-          <w:ilvl w:val="0"/>
-          <w:numId w:val="10"/>
-        </w:numPr>
-        <w:rPr>
-          <w:rFonts w:hint="eastAsia"/>
-        </w:rPr>
-      </w:pPr>
-      <w:r>
-        <w:t>Dialog forms can now be closed with the Enter key.</w:t>
-      </w:r>
-    </w:p>
-    <w:p>
-      <w:pPr>
-        <w:numPr>
-          <w:ilvl w:val="0"/>
-          <w:numId w:val="10"/>
-        </w:numPr>
-        <w:rPr>
-          <w:rFonts w:hint="eastAsia"/>
-        </w:rPr>
-      </w:pPr>
-      <w:r>
-        <w:t xml:space="preserve">The </w:t>
-      </w:r>
-      <w:r>
-        <w:t>checkboxes of the "Save configuration to project file" form</w:t>
-      </w:r>
-      <w:r>
-        <w:t xml:space="preserve"> are now cleared when loading a project.</w:t>
-      </w:r>
-    </w:p>
-    <w:p>
-      <w:pPr>
-        <w:numPr>
-          <w:ilvl w:val="0"/>
-          <w:numId w:val="10"/>
-        </w:numPr>
-        <w:rPr>
-          <w:rFonts w:hint="eastAsia"/>
-        </w:rPr>
-      </w:pPr>
-      <w:r>
-        <w:t xml:space="preserve">Buttons at the bottom of the forms now have </w:t>
-      </w:r>
-      <w:r>
-        <w:t>better spacing</w:t>
-      </w:r>
-      <w:r>
-        <w:t>.</w:t>
-      </w:r>
-    </w:p>
-    <w:p>
-      <w:pPr>
-        <w:pStyle w:val="Kop1"/>
-        <w:rPr>
-          <w:rFonts w:hint="eastAsia"/>
-        </w:rPr>
-      </w:pPr>
-      <w:r>
-        <w:t>v2.0.8 -- 2018-08-02</w:t>
-      </w:r>
-    </w:p>
-    <w:p>
-      <w:pPr>
-        <w:pStyle w:val="Kop3"/>
-        <w:rPr>
-          <w:rFonts w:hint="eastAsia"/>
-        </w:rPr>
-      </w:pPr>
-      <w:r>
-        <w:t>Features</w:t>
+        <w:t xml:space="preserve">separately </w:t>
+      </w:r>
+      <w:r>
+        <w:t>configurable</w:t>
+      </w:r>
+      <w:r>
+        <w:t xml:space="preserve"> for int32 and float32. </w:t>
+      </w:r>
+      <w:r>
+        <w:t>Character</w:t>
+      </w:r>
+      <w:r>
+        <w:t xml:space="preserve"> order </w:t>
+      </w:r>
+      <w:r>
+        <w:t xml:space="preserve">is configurable </w:t>
+      </w:r>
+      <w:r>
+        <w:t xml:space="preserve">for ASCII. </w:t>
       </w:r>
     </w:p>
     <w:p>
@@ -2517,187 +2612,7 @@
         </w:rPr>
       </w:pPr>
       <w:r>
-        <w:t xml:space="preserve">Added </w:t>
-      </w:r>
-      <w:r>
-        <w:t>menus and toolbar.</w:t>
-      </w:r>
-    </w:p>
-    <w:p>
-      <w:pPr>
-        <w:numPr>
-          <w:ilvl w:val="0"/>
-          <w:numId w:val="11"/>
-        </w:numPr>
-        <w:rPr>
-          <w:rFonts w:hint="eastAsia"/>
-        </w:rPr>
-      </w:pPr>
-      <w:r>
-        <w:t xml:space="preserve">Can save project configuration, bridge settings and form size in mbc file. </w:t>
-      </w:r>
-    </w:p>
-    <w:p>
-      <w:pPr>
-        <w:numPr>
-          <w:ilvl w:val="0"/>
-          <w:numId w:val="11"/>
-        </w:numPr>
-        <w:rPr>
-          <w:rFonts w:hint="eastAsia"/>
-        </w:rPr>
-      </w:pPr>
-      <w:r>
-        <w:t xml:space="preserve">Communication </w:t>
-      </w:r>
-      <w:r>
-        <w:t>pausing</w:t>
-      </w:r>
-      <w:r>
-        <w:t xml:space="preserve"> and poll-once.</w:t>
-      </w:r>
-    </w:p>
-    <w:p>
-      <w:pPr>
-        <w:numPr>
-          <w:ilvl w:val="0"/>
-          <w:numId w:val="11"/>
-        </w:numPr>
-        <w:rPr>
-          <w:rFonts w:hint="eastAsia"/>
-        </w:rPr>
-      </w:pPr>
-      <w:r>
-        <w:t>C</w:t>
-      </w:r>
-      <w:r>
-        <w:t>hange the connection parameters without having to close and reopen the port.</w:t>
-      </w:r>
-    </w:p>
-    <w:p>
-      <w:pPr>
-        <w:numPr>
-          <w:ilvl w:val="0"/>
-          <w:numId w:val="11"/>
-        </w:numPr>
-        <w:rPr>
-          <w:rFonts w:hint="eastAsia"/>
-        </w:rPr>
-      </w:pPr>
-      <w:r>
-        <w:t xml:space="preserve">If the serial port is not available at start, you can </w:t>
-      </w:r>
-      <w:r>
-        <w:t>immediately</w:t>
-      </w:r>
-      <w:r>
-        <w:t xml:space="preserve"> choose another </w:t>
-      </w:r>
-      <w:r>
-        <w:t>port</w:t>
-      </w:r>
-      <w:r>
-        <w:t>.</w:t>
-      </w:r>
-    </w:p>
-    <w:p>
-      <w:pPr>
-        <w:numPr>
-          <w:ilvl w:val="0"/>
-          <w:numId w:val="11"/>
-        </w:numPr>
-        <w:rPr>
-          <w:rFonts w:hint="eastAsia"/>
-        </w:rPr>
-      </w:pPr>
-      <w:r>
-        <w:t>M</w:t>
-      </w:r>
-      <w:r>
-        <w:t xml:space="preserve">bc project file: XML tags </w:t>
-      </w:r>
-      <w:r>
-        <w:t xml:space="preserve">are </w:t>
-      </w:r>
-      <w:r>
-        <w:t xml:space="preserve">now preferably in lowercase. The old camelcase is also still accepted. </w:t>
-      </w:r>
-    </w:p>
-    <w:p>
-      <w:pPr>
-        <w:numPr>
-          <w:ilvl w:val="0"/>
-          <w:numId w:val="11"/>
-        </w:numPr>
-        <w:rPr>
-          <w:rFonts w:hint="eastAsia"/>
-        </w:rPr>
-      </w:pPr>
-      <w:r>
-        <w:t>Always shows line numbers f</w:t>
-      </w:r>
-      <w:r>
-        <w:t xml:space="preserve">or errors in mbc file. </w:t>
-      </w:r>
-    </w:p>
-    <w:p>
-      <w:pPr>
-        <w:numPr>
-          <w:ilvl w:val="0"/>
-          <w:numId w:val="11"/>
-        </w:numPr>
-        <w:rPr>
-          <w:rFonts w:hint="eastAsia"/>
-        </w:rPr>
-      </w:pPr>
-      <w:r>
-        <w:t>Word order (endian)</w:t>
-      </w:r>
-      <w:r>
-        <w:t xml:space="preserve"> </w:t>
-      </w:r>
-      <w:r>
-        <w:t xml:space="preserve">is </w:t>
-      </w:r>
-      <w:r>
-        <w:t xml:space="preserve">separately </w:t>
-      </w:r>
-      <w:r>
-        <w:t>configurable</w:t>
-      </w:r>
-      <w:r>
-        <w:t xml:space="preserve"> for int32 and float32. </w:t>
-      </w:r>
-      <w:r>
-        <w:t>Character</w:t>
-      </w:r>
-      <w:r>
-        <w:t xml:space="preserve"> order </w:t>
-      </w:r>
-      <w:r>
-        <w:t xml:space="preserve">is configurable </w:t>
-      </w:r>
-      <w:r>
-        <w:t xml:space="preserve">for ASCII. </w:t>
-      </w:r>
-    </w:p>
-    <w:p>
-      <w:pPr>
-        <w:numPr>
-          <w:ilvl w:val="0"/>
-          <w:numId w:val="11"/>
-        </w:numPr>
-        <w:rPr>
-          <w:rFonts w:hint="eastAsia"/>
-        </w:rPr>
-      </w:pPr>
-      <w:proofErr w:type="spellStart"/>
-      <w:r>
-        <w:t>WriteHoldingregFunctionCode</w:t>
-      </w:r>
-      <w:proofErr w:type="spellEnd"/>
-      <w:r>
-        <w:t xml:space="preserve"> now also supports 'auto'.</w:t>
+        <w:t>WriteHoldingregFunctionCode now also supports 'auto'.</w:t>
       </w:r>
     </w:p>
     <w:p>
@@ -6346,6 +6261,7 @@
   <w:style w:type="character" w:default="1" w:styleId="Standaardalinea-lettertype">
     <w:name w:val="Default Paragraph Font"/>
     <w:uiPriority w:val="1"/>
+    <w:semiHidden/>
     <w:unhideWhenUsed/>
   </w:style>
   <w:style w:type="table" w:default="1" w:styleId="Standaardtabel">

</xml_diff>

<commit_message>
You can now open the enum dropdown to view the list of enum values ​​even when no connection is open or the register is read-only.
git-svn-id: http://visualsvn.edna.local/EDNA/ModbusControl/V2@4892 03c8d257-35a7-c645-9f01-50f27e98b9e6
</commit_message>
<xml_diff>
--- a/Manuals/ModbusControl - Release notes.docx
+++ b/Manuals/ModbusControl - Release notes.docx
@@ -63,12 +63,39 @@
           <w:ilvl w:val="0"/>
           <w:numId w:val="4"/>
         </w:numPr>
-        <w:rPr>
-          <w:rFonts w:hint="eastAsia"/>
-        </w:rPr>
-      </w:pPr>
-      <w:r>
-        <w:t>ModbusImport and ModbusExport now have a -retries parameter.</w:t>
+      </w:pPr>
+      <w:r>
+        <w:t xml:space="preserve">ModbusImport and ModbusExport now have a </w:t>
+      </w:r>
+      <w:r>
+        <w:t>“</w:t>
+      </w:r>
+      <w:r>
+        <w:t>-retries</w:t>
+      </w:r>
+      <w:r>
+        <w:t>”</w:t>
+      </w:r>
+      <w:r>
+        <w:t xml:space="preserve"> parameter.</w:t>
+      </w:r>
+    </w:p>
+    <w:p>
+      <w:pPr>
+        <w:pStyle w:val="Lijstalinea"/>
+        <w:numPr>
+          <w:ilvl w:val="0"/>
+          <w:numId w:val="4"/>
+        </w:numPr>
+        <w:rPr>
+          <w:rFonts w:hint="eastAsia"/>
+        </w:rPr>
+      </w:pPr>
+      <w:r>
+        <w:t>You can now open the enum dropdown to view the list of enum values even if there is no connection open or the register is read-only</w:t>
+      </w:r>
+      <w:r>
+        <w:t>.</w:t>
       </w:r>
     </w:p>
     <w:p>
@@ -93,6 +120,9 @@
           <w:ilvl w:val="0"/>
           <w:numId w:val="4"/>
         </w:numPr>
+        <w:rPr>
+          <w:rFonts w:hint="eastAsia"/>
+        </w:rPr>
       </w:pPr>
       <w:r>
         <w:rPr>
@@ -223,6 +253,9 @@
           <w:ilvl w:val="0"/>
           <w:numId w:val="4"/>
         </w:numPr>
+        <w:rPr>
+          <w:rFonts w:hint="eastAsia"/>
+        </w:rPr>
       </w:pPr>
       <w:r>
         <w:t xml:space="preserve">A uint16 enum translation with a value of 65535 as enum </w:t>
@@ -242,61 +275,378 @@
         </w:rPr>
       </w:pPr>
       <w:r>
-        <w:t xml:space="preserve">When editing an enum value one could cause an exception with key sequences like: numlock on, enter edit, backspace to erase all, numlock off, Enter.  Or like: enter edit, backspace 3 times, Enter. </w:t>
+        <w:t xml:space="preserve">When editing an enum value one could cause an exception with key sequences like: numlock on, enter edit, backspace to erase all, numlock off, Enter.  Or like: enter edit, backspace 3 times, Enter.  </w:t>
+      </w:r>
+    </w:p>
+    <w:p>
+      <w:pPr>
+        <w:pStyle w:val="Kop1"/>
+        <w:rPr>
+          <w:rFonts w:hint="eastAsia"/>
+          <w:color w:val="auto"/>
+        </w:rPr>
+      </w:pPr>
+      <w:r>
+        <w:t>v2.0.</w:t>
+      </w:r>
+      <w:r>
+        <w:rPr>
+          <w:color w:val="auto"/>
+        </w:rPr>
+        <w:t>1</w:t>
+      </w:r>
+      <w:r>
+        <w:rPr>
+          <w:color w:val="auto"/>
+        </w:rPr>
+        <w:t>6</w:t>
+      </w:r>
+      <w:r>
+        <w:rPr>
+          <w:color w:val="auto"/>
+        </w:rPr>
+        <w:t xml:space="preserve"> – 2023-</w:t>
+      </w:r>
+      <w:r>
+        <w:rPr>
+          <w:color w:val="auto"/>
+        </w:rPr>
+        <w:t>12-27</w:t>
+      </w:r>
+    </w:p>
+    <w:p>
+      <w:pPr>
+        <w:pStyle w:val="Kop3"/>
+        <w:rPr>
+          <w:rFonts w:hint="eastAsia"/>
+        </w:rPr>
+      </w:pPr>
+      <w:r>
+        <w:t>Features</w:t>
+      </w:r>
+    </w:p>
+    <w:p>
+      <w:pPr>
+        <w:numPr>
+          <w:ilvl w:val="0"/>
+          <w:numId w:val="4"/>
+        </w:numPr>
+        <w:rPr>
+          <w:rFonts w:hint="eastAsia"/>
+        </w:rPr>
+      </w:pPr>
+      <w:r>
+        <w:t>Project configuration form</w:t>
+      </w:r>
+      <w:r>
+        <w:t>:</w:t>
+      </w:r>
+      <w:r>
+        <w:t xml:space="preserve"> now shows </w:t>
+      </w:r>
+      <w:r>
+        <w:t xml:space="preserve">a warning icon </w:t>
+      </w:r>
+      <w:r>
+        <w:t>with</w:t>
+      </w:r>
+      <w:r>
+        <w:t xml:space="preserve"> each parameter that had a command line override, instead of one </w:t>
+      </w:r>
+      <w:r>
+        <w:t>general</w:t>
       </w:r>
       <w:r>
         <w:t xml:space="preserve"> </w:t>
       </w:r>
+      <w:r>
+        <w:t>warning</w:t>
+      </w:r>
+      <w:r>
+        <w:t>.</w:t>
+      </w:r>
+    </w:p>
+    <w:p>
+      <w:pPr>
+        <w:numPr>
+          <w:ilvl w:val="0"/>
+          <w:numId w:val="4"/>
+        </w:numPr>
+        <w:rPr>
+          <w:rFonts w:hint="eastAsia"/>
+        </w:rPr>
+      </w:pPr>
+      <w:r>
+        <w:t xml:space="preserve">Command line options can </w:t>
+      </w:r>
+      <w:r>
+        <w:t xml:space="preserve">now </w:t>
+      </w:r>
+      <w:r>
+        <w:t xml:space="preserve">start with – or /. </w:t>
+      </w:r>
+    </w:p>
+    <w:p>
+      <w:pPr>
+        <w:numPr>
+          <w:ilvl w:val="0"/>
+          <w:numId w:val="4"/>
+        </w:numPr>
+        <w:rPr>
+          <w:rFonts w:hint="eastAsia"/>
+        </w:rPr>
+      </w:pPr>
+      <w:r>
+        <w:t>Added</w:t>
+      </w:r>
+      <w:r>
+        <w:t xml:space="preserve"> more command line options. Use </w:t>
+      </w:r>
+      <w:r>
+        <w:t>-? -h -help /? /h or /help</w:t>
+      </w:r>
+      <w:r>
+        <w:t xml:space="preserve"> for help.</w:t>
+      </w:r>
+    </w:p>
+    <w:p>
+      <w:pPr>
+        <w:numPr>
+          <w:ilvl w:val="0"/>
+          <w:numId w:val="4"/>
+        </w:numPr>
+        <w:rPr>
+          <w:rFonts w:hint="eastAsia"/>
+        </w:rPr>
+      </w:pPr>
+      <w:r>
+        <w:t>Mbc file: &lt;exportorder&gt; element added.</w:t>
+      </w:r>
+    </w:p>
+    <w:p>
+      <w:pPr>
+        <w:numPr>
+          <w:ilvl w:val="0"/>
+          <w:numId w:val="4"/>
+        </w:numPr>
+        <w:rPr>
+          <w:rFonts w:hint="eastAsia"/>
+        </w:rPr>
+      </w:pPr>
+      <w:r>
+        <w:t>C</w:t>
+      </w:r>
+      <w:r>
+        <w:t>ommand line import and export utilities ModbusImport.exe and ModbusExport.exe</w:t>
+      </w:r>
+      <w:r>
+        <w:t xml:space="preserve"> added</w:t>
+      </w:r>
+      <w:r>
+        <w:t>.</w:t>
+      </w:r>
+    </w:p>
+    <w:p>
+      <w:pPr>
+        <w:pStyle w:val="Kop3"/>
+        <w:numPr>
+          <w:ilvl w:val="0"/>
+          <w:numId w:val="0"/>
+        </w:numPr>
+        <w:ind w:left="680" w:hanging="431"/>
+        <w:rPr>
+          <w:rFonts w:hint="eastAsia"/>
+        </w:rPr>
+      </w:pPr>
+      <w:r>
+        <w:t>Fixes</w:t>
+      </w:r>
+    </w:p>
+    <w:p>
+      <w:pPr>
+        <w:numPr>
+          <w:ilvl w:val="0"/>
+          <w:numId w:val="4"/>
+        </w:numPr>
+        <w:rPr>
+          <w:rFonts w:hint="eastAsia"/>
+        </w:rPr>
+      </w:pPr>
+      <w:r>
+        <w:t xml:space="preserve">Release notes </w:t>
+      </w:r>
+      <w:r>
+        <w:t xml:space="preserve">are now </w:t>
+      </w:r>
+      <w:r>
+        <w:t>in English.</w:t>
+      </w:r>
+    </w:p>
+    <w:p>
+      <w:pPr>
+        <w:pStyle w:val="Lijstalinea"/>
+        <w:numPr>
+          <w:ilvl w:val="0"/>
+          <w:numId w:val="4"/>
+        </w:numPr>
+        <w:rPr>
+          <w:rFonts w:hint="eastAsia"/>
+        </w:rPr>
+      </w:pPr>
+      <w:r>
+        <w:t xml:space="preserve">Crash fixed: an internal buffer overflow in the communications code </w:t>
+      </w:r>
+      <w:r>
+        <w:t xml:space="preserve">sometimes </w:t>
+      </w:r>
+      <w:r>
+        <w:t xml:space="preserve">caused an application crash. </w:t>
+      </w:r>
+    </w:p>
+    <w:p>
+      <w:pPr>
+        <w:pStyle w:val="Lijstalinea"/>
+        <w:numPr>
+          <w:ilvl w:val="0"/>
+          <w:numId w:val="4"/>
+        </w:numPr>
+        <w:rPr>
+          <w:rFonts w:hint="eastAsia"/>
+        </w:rPr>
+      </w:pPr>
+      <w:r>
+        <w:rPr>
+          <w:rFonts w:hint="eastAsia"/>
+        </w:rPr>
+        <w:t>WriteHoldingregisterFC</w:t>
+      </w:r>
+      <w:r>
+        <w:t xml:space="preserve"> </w:t>
+      </w:r>
+      <w:r>
+        <w:rPr>
+          <w:rFonts w:hint="eastAsia"/>
+        </w:rPr>
+        <w:t>=</w:t>
+      </w:r>
+      <w:r>
+        <w:t xml:space="preserve"> ‘</w:t>
+      </w:r>
+      <w:r>
+        <w:rPr>
+          <w:rFonts w:hint="eastAsia"/>
+        </w:rPr>
+        <w:t>alternate</w:t>
+      </w:r>
+      <w:r>
+        <w:t>’</w:t>
+      </w:r>
+      <w:r>
+        <w:t xml:space="preserve"> is dropped because it was con</w:t>
+      </w:r>
+      <w:r>
+        <w:t>fusing. It is automatically replaced by ‘auto’ if found in an mbc project file.</w:t>
+      </w:r>
+    </w:p>
+    <w:p>
+      <w:pPr>
+        <w:numPr>
+          <w:ilvl w:val="0"/>
+          <w:numId w:val="4"/>
+        </w:numPr>
+        <w:rPr>
+          <w:rFonts w:hint="eastAsia"/>
+        </w:rPr>
+      </w:pPr>
+      <w:r>
+        <w:t>Stop-on-error mechanism fix</w:t>
+      </w:r>
+      <w:r>
+        <w:t>ed</w:t>
+      </w:r>
+      <w:r>
+        <w:t>.</w:t>
+      </w:r>
+    </w:p>
+    <w:p>
+      <w:pPr>
+        <w:numPr>
+          <w:ilvl w:val="0"/>
+          <w:numId w:val="4"/>
+        </w:numPr>
+        <w:rPr>
+          <w:rFonts w:hint="eastAsia"/>
+        </w:rPr>
+      </w:pPr>
+      <w:r>
+        <w:t xml:space="preserve">Import now processes the </w:t>
+      </w:r>
+      <w:r>
+        <w:t>CSV</w:t>
+      </w:r>
+      <w:r>
+        <w:t xml:space="preserve"> file in top-down order. </w:t>
+      </w:r>
+      <w:r>
+        <w:t>E</w:t>
+      </w:r>
+      <w:r>
+        <w:t xml:space="preserve">arlier versions </w:t>
+      </w:r>
+      <w:r>
+        <w:t xml:space="preserve">first scanned the file for errors, </w:t>
+      </w:r>
+      <w:r>
+        <w:t>then started import which could report more errors.</w:t>
+      </w:r>
+    </w:p>
+    <w:p>
+      <w:pPr>
+        <w:numPr>
+          <w:ilvl w:val="0"/>
+          <w:numId w:val="4"/>
+        </w:numPr>
+        <w:rPr>
+          <w:rFonts w:hint="eastAsia"/>
+        </w:rPr>
+      </w:pPr>
+      <w:r>
+        <w:t>Import now also ignores lines that only have spaces and/or separators.</w:t>
+      </w:r>
     </w:p>
     <w:p>
       <w:pPr>
         <w:pStyle w:val="Kop1"/>
         <w:rPr>
           <w:rFonts w:hint="eastAsia"/>
-          <w:color w:val="auto"/>
-        </w:rPr>
-      </w:pPr>
-      <w:r>
-        <w:t>v2.0.</w:t>
-      </w:r>
-      <w:r>
-        <w:rPr>
-          <w:color w:val="auto"/>
-        </w:rPr>
-        <w:t>1</w:t>
-      </w:r>
-      <w:r>
-        <w:rPr>
-          <w:color w:val="auto"/>
-        </w:rPr>
-        <w:t>6</w:t>
-      </w:r>
-      <w:r>
-        <w:rPr>
-          <w:color w:val="auto"/>
-        </w:rPr>
-        <w:t xml:space="preserve"> – 2023-</w:t>
-      </w:r>
-      <w:r>
-        <w:rPr>
-          <w:color w:val="auto"/>
-        </w:rPr>
-        <w:t>12-27</w:t>
+        </w:rPr>
+      </w:pPr>
+      <w:r>
+        <w:t>v2.0.15 – 2023-06-24</w:t>
       </w:r>
     </w:p>
     <w:p>
       <w:pPr>
         <w:pStyle w:val="Kop3"/>
-        <w:rPr>
-          <w:rFonts w:hint="eastAsia"/>
-        </w:rPr>
-      </w:pPr>
-      <w:r>
+        <w:numPr>
+          <w:ilvl w:val="0"/>
+          <w:numId w:val="0"/>
+        </w:numPr>
+        <w:ind w:left="680" w:hanging="431"/>
+        <w:rPr>
+          <w:rFonts w:hint="eastAsia"/>
+        </w:rPr>
+      </w:pPr>
+      <w:r>
+        <w:rPr>
+          <w:rFonts w:hint="eastAsia"/>
+        </w:rPr>
         <w:t>Features</w:t>
       </w:r>
     </w:p>
     <w:p>
       <w:pPr>
+        <w:pStyle w:val="Lijstalinea"/>
         <w:numPr>
           <w:ilvl w:val="0"/>
           <w:numId w:val="4"/>
@@ -306,38 +656,15 @@
         </w:rPr>
       </w:pPr>
       <w:r>
-        <w:t>Project configuration form</w:t>
-      </w:r>
-      <w:r>
-        <w:t>:</w:t>
-      </w:r>
-      <w:r>
-        <w:t xml:space="preserve"> now shows </w:t>
-      </w:r>
-      <w:r>
-        <w:t xml:space="preserve">a warning icon </w:t>
-      </w:r>
-      <w:r>
-        <w:t>with</w:t>
-      </w:r>
-      <w:r>
-        <w:t xml:space="preserve"> each parameter that had a command line override, instead of one </w:t>
-      </w:r>
-      <w:r>
-        <w:t>general</w:t>
-      </w:r>
-      <w:r>
-        <w:t xml:space="preserve"> </w:t>
-      </w:r>
-      <w:r>
-        <w:t>warning</w:t>
-      </w:r>
-      <w:r>
-        <w:t>.</w:t>
-      </w:r>
-    </w:p>
-    <w:p>
-      <w:pPr>
+        <w:rPr>
+          <w:rFonts w:hint="eastAsia"/>
+        </w:rPr>
+        <w:t>Enum registers editing now has a dropdown combobox with possible values.</w:t>
+      </w:r>
+    </w:p>
+    <w:p>
+      <w:pPr>
+        <w:pStyle w:val="Lijstalinea"/>
         <w:numPr>
           <w:ilvl w:val="0"/>
           <w:numId w:val="4"/>
@@ -347,17 +674,36 @@
         </w:rPr>
       </w:pPr>
       <w:r>
-        <w:t xml:space="preserve">Command line options can </w:t>
-      </w:r>
-      <w:r>
-        <w:t xml:space="preserve">now </w:t>
-      </w:r>
-      <w:r>
-        <w:t xml:space="preserve">start with – or /. </w:t>
-      </w:r>
-    </w:p>
-    <w:p>
-      <w:pPr>
+        <w:rPr>
+          <w:rFonts w:hint="eastAsia"/>
+        </w:rPr>
+        <w:t>Mbc file: Enum values now allow a cu</w:t>
+      </w:r>
+      <w:r>
+        <w:t>s</w:t>
+      </w:r>
+      <w:r>
+        <w:rPr>
+          <w:rFonts w:hint="eastAsia"/>
+        </w:rPr>
+        <w:t xml:space="preserve">tom &lt;else&gt; </w:t>
+      </w:r>
+      <w:r>
+        <w:t>text</w:t>
+      </w:r>
+      <w:r>
+        <w:rPr>
+          <w:rFonts w:hint="eastAsia"/>
+        </w:rPr>
+        <w:t xml:space="preserve"> that is shown if no value matches. </w:t>
+      </w:r>
+      <w:r>
+        <w:t>&lt;else&gt; text can be left empty to suppress the message.</w:t>
+      </w:r>
+    </w:p>
+    <w:p>
+      <w:pPr>
+        <w:pStyle w:val="Lijstalinea"/>
         <w:numPr>
           <w:ilvl w:val="0"/>
           <w:numId w:val="4"/>
@@ -367,53 +713,53 @@
         </w:rPr>
       </w:pPr>
       <w:r>
-        <w:t>Added</w:t>
-      </w:r>
-      <w:r>
-        <w:t xml:space="preserve"> more command line options. Use </w:t>
-      </w:r>
-      <w:r>
-        <w:t>-? -h -help /? /h or /help</w:t>
-      </w:r>
-      <w:r>
-        <w:t xml:space="preserve"> for help.</w:t>
-      </w:r>
-    </w:p>
-    <w:p>
-      <w:pPr>
-        <w:numPr>
-          <w:ilvl w:val="0"/>
-          <w:numId w:val="4"/>
-        </w:numPr>
-        <w:rPr>
-          <w:rFonts w:hint="eastAsia"/>
-        </w:rPr>
-      </w:pPr>
-      <w:r>
-        <w:t>Mbc file: &lt;exportorder&gt; element added.</w:t>
-      </w:r>
-    </w:p>
-    <w:p>
-      <w:pPr>
-        <w:numPr>
-          <w:ilvl w:val="0"/>
-          <w:numId w:val="4"/>
-        </w:numPr>
-        <w:rPr>
-          <w:rFonts w:hint="eastAsia"/>
-        </w:rPr>
-      </w:pPr>
-      <w:r>
-        <w:t>C</w:t>
-      </w:r>
-      <w:r>
-        <w:t>ommand line import and export utilities ModbusImport.exe and ModbusExport.exe</w:t>
-      </w:r>
-      <w:r>
-        <w:t xml:space="preserve"> added</w:t>
-      </w:r>
-      <w:r>
-        <w:t>.</w:t>
+        <w:rPr>
+          <w:rFonts w:hint="eastAsia"/>
+        </w:rPr>
+        <w:t xml:space="preserve">You can now use </w:t>
+      </w:r>
+      <w:r>
+        <w:t xml:space="preserve">5 digits and 6 digits </w:t>
+      </w:r>
+      <w:r>
+        <w:rPr>
+          <w:rFonts w:hint="eastAsia"/>
+        </w:rPr>
+        <w:t>registers numbering scheme</w:t>
+      </w:r>
+      <w:r>
+        <w:t>,</w:t>
+      </w:r>
+      <w:r>
+        <w:rPr>
+          <w:rFonts w:hint="eastAsia"/>
+        </w:rPr>
+        <w:t xml:space="preserve"> 40001-49999 and </w:t>
+      </w:r>
+      <w:r>
+        <w:rPr>
+          <w:rFonts w:hint="eastAsia"/>
+        </w:rPr>
+        <w:lastRenderedPageBreak/>
+        <w:t>400001-465536</w:t>
+      </w:r>
+      <w:r>
+        <w:t xml:space="preserve">, or </w:t>
+      </w:r>
+      <w:r>
+        <w:rPr>
+          <w:rFonts w:hint="eastAsia"/>
+        </w:rPr>
+        <w:t>40000-49999 and 400000-465535</w:t>
+      </w:r>
+      <w:r>
+        <w:t xml:space="preserve">, </w:t>
+      </w:r>
+      <w:r>
+        <w:rPr>
+          <w:rFonts w:hint="eastAsia"/>
+        </w:rPr>
+        <w:t xml:space="preserve">at the same time. </w:t>
       </w:r>
     </w:p>
     <w:p>
@@ -429,319 +775,9 @@
         </w:rPr>
       </w:pPr>
       <w:r>
-        <w:t>Fixes</w:t>
-      </w:r>
-    </w:p>
-    <w:p>
-      <w:pPr>
-        <w:numPr>
-          <w:ilvl w:val="0"/>
-          <w:numId w:val="4"/>
-        </w:numPr>
-        <w:rPr>
-          <w:rFonts w:hint="eastAsia"/>
-        </w:rPr>
-      </w:pPr>
-      <w:r>
-        <w:t xml:space="preserve">Release notes </w:t>
-      </w:r>
-      <w:r>
-        <w:t xml:space="preserve">are now </w:t>
-      </w:r>
-      <w:r>
-        <w:t>in English.</w:t>
-      </w:r>
-    </w:p>
-    <w:p>
-      <w:pPr>
-        <w:pStyle w:val="Lijstalinea"/>
-        <w:numPr>
-          <w:ilvl w:val="0"/>
-          <w:numId w:val="4"/>
-        </w:numPr>
-        <w:rPr>
-          <w:rFonts w:hint="eastAsia"/>
-        </w:rPr>
-      </w:pPr>
-      <w:r>
-        <w:t xml:space="preserve">Crash fixed: an internal buffer overflow in the communications code </w:t>
-      </w:r>
-      <w:r>
-        <w:t xml:space="preserve">sometimes </w:t>
-      </w:r>
-      <w:r>
-        <w:t xml:space="preserve">caused an application crash. </w:t>
-      </w:r>
-    </w:p>
-    <w:p>
-      <w:pPr>
-        <w:pStyle w:val="Lijstalinea"/>
-        <w:numPr>
-          <w:ilvl w:val="0"/>
-          <w:numId w:val="4"/>
-        </w:numPr>
-        <w:rPr>
-          <w:rFonts w:hint="eastAsia"/>
-        </w:rPr>
-      </w:pPr>
-      <w:r>
-        <w:rPr>
-          <w:rFonts w:hint="eastAsia"/>
-        </w:rPr>
-        <w:t>WriteHoldingregisterFC</w:t>
-      </w:r>
-      <w:r>
-        <w:t xml:space="preserve"> </w:t>
-      </w:r>
-      <w:r>
-        <w:rPr>
-          <w:rFonts w:hint="eastAsia"/>
-        </w:rPr>
-        <w:t>=</w:t>
-      </w:r>
-      <w:r>
-        <w:t xml:space="preserve"> ‘</w:t>
-      </w:r>
-      <w:r>
-        <w:rPr>
-          <w:rFonts w:hint="eastAsia"/>
-        </w:rPr>
-        <w:t>alternate</w:t>
-      </w:r>
-      <w:r>
-        <w:t>’</w:t>
-      </w:r>
-      <w:r>
-        <w:t xml:space="preserve"> is dropped because it was con</w:t>
-      </w:r>
-      <w:r>
-        <w:t>fusing. It is automatically replaced by ‘auto’ if found in an mbc project file.</w:t>
-      </w:r>
-    </w:p>
-    <w:p>
-      <w:pPr>
-        <w:numPr>
-          <w:ilvl w:val="0"/>
-          <w:numId w:val="4"/>
-        </w:numPr>
-        <w:rPr>
-          <w:rFonts w:hint="eastAsia"/>
-        </w:rPr>
-      </w:pPr>
-      <w:r>
-        <w:t>Stop-on-error mechanism fix</w:t>
-      </w:r>
-      <w:r>
-        <w:t>ed</w:t>
-      </w:r>
-      <w:r>
-        <w:t>.</w:t>
-      </w:r>
-    </w:p>
-    <w:p>
-      <w:pPr>
-        <w:numPr>
-          <w:ilvl w:val="0"/>
-          <w:numId w:val="4"/>
-        </w:numPr>
-        <w:rPr>
-          <w:rFonts w:hint="eastAsia"/>
-        </w:rPr>
-      </w:pPr>
-      <w:r>
-        <w:t xml:space="preserve">Import now processes the </w:t>
-      </w:r>
-      <w:r>
-        <w:t>CSV</w:t>
-      </w:r>
-      <w:r>
-        <w:t xml:space="preserve"> file in top-down order. </w:t>
-      </w:r>
-      <w:r>
-        <w:t>E</w:t>
-      </w:r>
-      <w:r>
-        <w:t xml:space="preserve">arlier versions </w:t>
-      </w:r>
-      <w:r>
-        <w:t xml:space="preserve">first scanned the file for errors, </w:t>
-      </w:r>
-      <w:r>
-        <w:t>then started import which could report more errors.</w:t>
-      </w:r>
-    </w:p>
-    <w:p>
-      <w:pPr>
-        <w:numPr>
-          <w:ilvl w:val="0"/>
-          <w:numId w:val="4"/>
-        </w:numPr>
-        <w:rPr>
-          <w:rFonts w:hint="eastAsia"/>
-        </w:rPr>
-      </w:pPr>
-      <w:r>
-        <w:t>Import now also ignores lines that only have spaces and/or separators.</w:t>
-      </w:r>
-    </w:p>
-    <w:p>
-      <w:pPr>
-        <w:pStyle w:val="Kop1"/>
-        <w:rPr>
-          <w:rFonts w:hint="eastAsia"/>
-        </w:rPr>
-      </w:pPr>
-      <w:r>
-        <w:t>v2.0.15 – 2023-06-24</w:t>
-      </w:r>
-    </w:p>
-    <w:p>
-      <w:pPr>
-        <w:pStyle w:val="Kop3"/>
-        <w:numPr>
-          <w:ilvl w:val="0"/>
-          <w:numId w:val="0"/>
-        </w:numPr>
-        <w:ind w:left="680" w:hanging="431"/>
-        <w:rPr>
-          <w:rFonts w:hint="eastAsia"/>
-        </w:rPr>
-      </w:pPr>
-      <w:r>
-        <w:rPr>
-          <w:rFonts w:hint="eastAsia"/>
-        </w:rPr>
-        <w:t>Features</w:t>
-      </w:r>
-    </w:p>
-    <w:p>
-      <w:pPr>
-        <w:pStyle w:val="Lijstalinea"/>
-        <w:numPr>
-          <w:ilvl w:val="0"/>
-          <w:numId w:val="4"/>
-        </w:numPr>
-        <w:rPr>
-          <w:rFonts w:hint="eastAsia"/>
-        </w:rPr>
-      </w:pPr>
-      <w:r>
-        <w:rPr>
-          <w:rFonts w:hint="eastAsia"/>
-        </w:rPr>
-        <w:t>Enum registers editing now has a dropdown combobox with possible values.</w:t>
-      </w:r>
-    </w:p>
-    <w:p>
-      <w:pPr>
-        <w:pStyle w:val="Lijstalinea"/>
-        <w:numPr>
-          <w:ilvl w:val="0"/>
-          <w:numId w:val="4"/>
-        </w:numPr>
-        <w:rPr>
-          <w:rFonts w:hint="eastAsia"/>
-        </w:rPr>
-      </w:pPr>
-      <w:r>
-        <w:rPr>
-          <w:rFonts w:hint="eastAsia"/>
-        </w:rPr>
-        <w:t>Mbc file: Enum values now allow a cu</w:t>
-      </w:r>
-      <w:r>
-        <w:t>s</w:t>
-      </w:r>
-      <w:r>
-        <w:rPr>
-          <w:rFonts w:hint="eastAsia"/>
-        </w:rPr>
-        <w:t xml:space="preserve">tom &lt;else&gt; </w:t>
-      </w:r>
-      <w:r>
-        <w:t>text</w:t>
-      </w:r>
-      <w:r>
-        <w:rPr>
-          <w:rFonts w:hint="eastAsia"/>
-        </w:rPr>
-        <w:t xml:space="preserve"> that is shown if no value matches. </w:t>
-      </w:r>
-      <w:r>
-        <w:t>&lt;else&gt; text can be left empty to suppress the message.</w:t>
-      </w:r>
-    </w:p>
-    <w:p>
-      <w:pPr>
-        <w:pStyle w:val="Lijstalinea"/>
-        <w:numPr>
-          <w:ilvl w:val="0"/>
-          <w:numId w:val="4"/>
-        </w:numPr>
-        <w:rPr>
-          <w:rFonts w:hint="eastAsia"/>
-        </w:rPr>
-      </w:pPr>
-      <w:r>
-        <w:rPr>
-          <w:rFonts w:hint="eastAsia"/>
-        </w:rPr>
-        <w:t xml:space="preserve">You can now use </w:t>
-      </w:r>
-      <w:r>
-        <w:t xml:space="preserve">5 digits and 6 digits </w:t>
-      </w:r>
-      <w:r>
-        <w:rPr>
-          <w:rFonts w:hint="eastAsia"/>
-        </w:rPr>
-        <w:t>registers numbering scheme</w:t>
-      </w:r>
-      <w:r>
-        <w:t>,</w:t>
-      </w:r>
-      <w:r>
-        <w:rPr>
-          <w:rFonts w:hint="eastAsia"/>
-        </w:rPr>
-        <w:t xml:space="preserve"> 40001-49999 and 400001-465536</w:t>
-      </w:r>
-      <w:r>
-        <w:t xml:space="preserve">, or </w:t>
-      </w:r>
-      <w:r>
-        <w:rPr>
-          <w:rFonts w:hint="eastAsia"/>
-        </w:rPr>
-        <w:t>40000-49999 and 400000-465535</w:t>
-      </w:r>
-      <w:r>
-        <w:t xml:space="preserve">, </w:t>
-      </w:r>
-      <w:r>
-        <w:rPr>
-          <w:rFonts w:hint="eastAsia"/>
-        </w:rPr>
-        <w:t xml:space="preserve">at the same time. </w:t>
-      </w:r>
-    </w:p>
-    <w:p>
-      <w:pPr>
-        <w:pStyle w:val="Kop3"/>
-        <w:numPr>
-          <w:ilvl w:val="0"/>
-          <w:numId w:val="0"/>
-        </w:numPr>
-        <w:ind w:left="680" w:hanging="431"/>
-        <w:rPr>
-          <w:rFonts w:hint="eastAsia"/>
-        </w:rPr>
-      </w:pPr>
-      <w:r>
-        <w:rPr>
-          <w:rFonts w:hint="eastAsia"/>
-        </w:rPr>
-        <w:lastRenderedPageBreak/>
+        <w:rPr>
+          <w:rFonts w:hint="eastAsia"/>
+        </w:rPr>
         <w:t>Fixes</w:t>
       </w:r>
     </w:p>

</xml_diff>

<commit_message>
Error codes changes: - Error "RESPONSE TOO SHORT AND CRC ERROR" added: shown if response was shorter than expected and has CRC mismatch. The response probably has bytes missing. - "RESPONSE FORMAT ERROR" changed to "RESPONSE PROTOCOL ERROR" - Error "RESPONSE DATA ERROR" added: shown for example if the query specifies to read 10 registers and less were returned is the response. Expectedresponselength handling changed.
git-svn-id: http://visualsvn.edna.local/EDNA/ModbusControl/V2@4893 03c8d257-35a7-c645-9f01-50f27e98b9e6
</commit_message>
<xml_diff>
--- a/Manuals/ModbusControl - Release notes.docx
+++ b/Manuals/ModbusControl - Release notes.docx
@@ -45,6 +45,12 @@
         </w:rPr>
         <w:t xml:space="preserve"> – </w:t>
       </w:r>
+      <w:r>
+        <w:rPr>
+          <w:color w:val="auto"/>
+        </w:rPr>
+        <w:t>?????????</w:t>
+      </w:r>
     </w:p>
     <w:p>
       <w:pPr>
@@ -59,25 +65,28 @@
     </w:p>
     <w:p>
       <w:pPr>
+        <w:pStyle w:val="Lijstalinea"/>
         <w:numPr>
           <w:ilvl w:val="0"/>
           <w:numId w:val="4"/>
         </w:numPr>
       </w:pPr>
       <w:r>
-        <w:t xml:space="preserve">ModbusImport and ModbusExport now have a </w:t>
-      </w:r>
-      <w:r>
-        <w:t>“</w:t>
-      </w:r>
-      <w:r>
-        <w:t>-retries</w:t>
-      </w:r>
-      <w:r>
-        <w:t>”</w:t>
-      </w:r>
-      <w:r>
-        <w:t xml:space="preserve"> parameter.</w:t>
+        <w:t>You can now open the enum dropdown to view the list of enum values if there is no connection open or the register is read-only.</w:t>
+      </w:r>
+    </w:p>
+    <w:p>
+      <w:pPr>
+        <w:numPr>
+          <w:ilvl w:val="0"/>
+          <w:numId w:val="4"/>
+        </w:numPr>
+        <w:rPr>
+          <w:rFonts w:hint="eastAsia"/>
+        </w:rPr>
+      </w:pPr>
+      <w:r>
+        <w:t>ModbusImport and ModbusExport now have a “-retries” parameter.</w:t>
       </w:r>
     </w:p>
     <w:p>
@@ -87,15 +96,84 @@
           <w:ilvl w:val="0"/>
           <w:numId w:val="4"/>
         </w:numPr>
-        <w:rPr>
-          <w:rFonts w:hint="eastAsia"/>
-        </w:rPr>
-      </w:pPr>
-      <w:r>
-        <w:t>You can now open the enum dropdown to view the list of enum values even if there is no connection open or the register is read-only</w:t>
-      </w:r>
-      <w:r>
-        <w:t>.</w:t>
+      </w:pPr>
+      <w:r>
+        <w:t>Error codes changes:</w:t>
+      </w:r>
+    </w:p>
+    <w:p>
+      <w:pPr>
+        <w:pStyle w:val="Lijstalinea"/>
+        <w:numPr>
+          <w:ilvl w:val="1"/>
+          <w:numId w:val="4"/>
+        </w:numPr>
+      </w:pPr>
+      <w:r>
+        <w:t>Error</w:t>
+      </w:r>
+      <w:r>
+        <w:t xml:space="preserve"> "RESPONSE TOO SHORT AND CRC ERROR"</w:t>
+      </w:r>
+      <w:r>
+        <w:t xml:space="preserve"> added</w:t>
+      </w:r>
+      <w:r>
+        <w:t>: shown if response was shorter than expected and has CRC mismatch. T</w:t>
+      </w:r>
+      <w:r>
+        <w:rPr>
+          <w:rFonts w:hint="eastAsia"/>
+        </w:rPr>
+        <w:t>h</w:t>
+      </w:r>
+      <w:r>
+        <w:t>e response probably has bytes missing.</w:t>
+      </w:r>
+    </w:p>
+    <w:p>
+      <w:pPr>
+        <w:pStyle w:val="Lijstalinea"/>
+        <w:numPr>
+          <w:ilvl w:val="1"/>
+          <w:numId w:val="4"/>
+        </w:numPr>
+      </w:pPr>
+      <w:r>
+        <w:rPr>
+          <w:rFonts w:hint="eastAsia"/>
+        </w:rPr>
+        <w:t>"RESPONSE FORMAT ERROR"</w:t>
+      </w:r>
+      <w:r>
+        <w:t xml:space="preserve"> changed to </w:t>
+      </w:r>
+      <w:r>
+        <w:rPr>
+          <w:rFonts w:hint="eastAsia"/>
+        </w:rPr>
+        <w:t>"RESPONSE PROTOCOL ERROR"</w:t>
+      </w:r>
+    </w:p>
+    <w:p>
+      <w:pPr>
+        <w:pStyle w:val="Lijstalinea"/>
+        <w:numPr>
+          <w:ilvl w:val="1"/>
+          <w:numId w:val="4"/>
+        </w:numPr>
+      </w:pPr>
+      <w:r>
+        <w:t>Error</w:t>
+      </w:r>
+      <w:r>
+        <w:rPr>
+          <w:rFonts w:hint="eastAsia"/>
+        </w:rPr>
+        <w:t xml:space="preserve"> "RESPONSE DATA ERROR"</w:t>
+      </w:r>
+      <w:r>
+        <w:t xml:space="preserve"> added: shown for example if the query specifies to read 10 registers and less were returned is the response.</w:t>
       </w:r>
     </w:p>
     <w:p>
@@ -105,7 +183,7 @@
           <w:ilvl w:val="0"/>
           <w:numId w:val="0"/>
         </w:numPr>
-        <w:ind w:left="680" w:hanging="431"/>
+        <w:ind w:left="431" w:hanging="431"/>
         <w:rPr>
           <w:rFonts w:hint="eastAsia"/>
         </w:rPr>
@@ -155,12 +233,14 @@
         <w:br/>
         <w:t>-</w:t>
       </w:r>
+      <w:proofErr w:type="spellStart"/>
       <w:r>
         <w:rPr>
           <w:rFonts w:hint="eastAsia"/>
         </w:rPr>
         <w:t>continueonerror</w:t>
       </w:r>
+      <w:proofErr w:type="spellEnd"/>
       <w:r>
         <w:t xml:space="preserve"> options.</w:t>
       </w:r>
@@ -275,7 +355,23 @@
         </w:rPr>
       </w:pPr>
       <w:r>
-        <w:t xml:space="preserve">When editing an enum value one could cause an exception with key sequences like: numlock on, enter edit, backspace to erase all, numlock off, Enter.  Or like: enter edit, backspace 3 times, Enter.  </w:t>
+        <w:t xml:space="preserve">When editing an enum value one could cause an exception with key sequences like: </w:t>
+      </w:r>
+      <w:proofErr w:type="spellStart"/>
+      <w:r>
+        <w:t>numlock</w:t>
+      </w:r>
+      <w:proofErr w:type="spellEnd"/>
+      <w:r>
+        <w:t xml:space="preserve"> on, enter edit, backspace to erase all, </w:t>
+      </w:r>
+      <w:proofErr w:type="spellStart"/>
+      <w:r>
+        <w:t>numlock</w:t>
+      </w:r>
+      <w:proofErr w:type="spellEnd"/>
+      <w:r>
+        <w:t xml:space="preserve"> off, Enter.  Or like: enter edit, backspace 3 times, Enter.  </w:t>
       </w:r>
     </w:p>
     <w:p>
@@ -420,7 +516,15 @@
         </w:rPr>
       </w:pPr>
       <w:r>
-        <w:t>Mbc file: &lt;exportorder&gt; element added.</w:t>
+        <w:t>Mbc file: &lt;</w:t>
+      </w:r>
+      <w:proofErr w:type="spellStart"/>
+      <w:r>
+        <w:t>exportorder</w:t>
+      </w:r>
+      <w:proofErr w:type="spellEnd"/>
+      <w:r>
+        <w:t>&gt; element added.</w:t>
       </w:r>
     </w:p>
     <w:p>
@@ -453,17 +557,347 @@
           <w:ilvl w:val="0"/>
           <w:numId w:val="0"/>
         </w:numPr>
+        <w:ind w:left="431" w:hanging="431"/>
+        <w:rPr>
+          <w:rFonts w:hint="eastAsia"/>
+        </w:rPr>
+      </w:pPr>
+      <w:r>
+        <w:t>Fixes</w:t>
+      </w:r>
+    </w:p>
+    <w:p>
+      <w:pPr>
+        <w:numPr>
+          <w:ilvl w:val="0"/>
+          <w:numId w:val="4"/>
+        </w:numPr>
+        <w:rPr>
+          <w:rFonts w:hint="eastAsia"/>
+        </w:rPr>
+      </w:pPr>
+      <w:r>
+        <w:t xml:space="preserve">Release notes </w:t>
+      </w:r>
+      <w:r>
+        <w:t xml:space="preserve">are now </w:t>
+      </w:r>
+      <w:r>
+        <w:t>in English.</w:t>
+      </w:r>
+    </w:p>
+    <w:p>
+      <w:pPr>
+        <w:pStyle w:val="Lijstalinea"/>
+        <w:numPr>
+          <w:ilvl w:val="0"/>
+          <w:numId w:val="4"/>
+        </w:numPr>
+        <w:rPr>
+          <w:rFonts w:hint="eastAsia"/>
+        </w:rPr>
+      </w:pPr>
+      <w:r>
+        <w:t xml:space="preserve">Crash fixed: an internal buffer overflow in the communications code </w:t>
+      </w:r>
+      <w:r>
+        <w:t xml:space="preserve">sometimes </w:t>
+      </w:r>
+      <w:r>
+        <w:t xml:space="preserve">caused an application crash. </w:t>
+      </w:r>
+    </w:p>
+    <w:p>
+      <w:pPr>
+        <w:pStyle w:val="Lijstalinea"/>
+        <w:numPr>
+          <w:ilvl w:val="0"/>
+          <w:numId w:val="4"/>
+        </w:numPr>
+        <w:rPr>
+          <w:rFonts w:hint="eastAsia"/>
+        </w:rPr>
+      </w:pPr>
+      <w:proofErr w:type="spellStart"/>
+      <w:r>
+        <w:rPr>
+          <w:rFonts w:hint="eastAsia"/>
+        </w:rPr>
+        <w:t>WriteHoldingregisterFC</w:t>
+      </w:r>
+      <w:proofErr w:type="spellEnd"/>
+      <w:r>
+        <w:t xml:space="preserve"> </w:t>
+      </w:r>
+      <w:r>
+        <w:rPr>
+          <w:rFonts w:hint="eastAsia"/>
+        </w:rPr>
+        <w:t>=</w:t>
+      </w:r>
+      <w:r>
+        <w:t xml:space="preserve"> ‘</w:t>
+      </w:r>
+      <w:r>
+        <w:rPr>
+          <w:rFonts w:hint="eastAsia"/>
+        </w:rPr>
+        <w:t>alternate</w:t>
+      </w:r>
+      <w:r>
+        <w:t>’</w:t>
+      </w:r>
+      <w:r>
+        <w:t xml:space="preserve"> is dropped because it was con</w:t>
+      </w:r>
+      <w:r>
+        <w:t>fusing. It is automatically replaced by ‘auto’ if found in an mbc project file.</w:t>
+      </w:r>
+    </w:p>
+    <w:p>
+      <w:pPr>
+        <w:numPr>
+          <w:ilvl w:val="0"/>
+          <w:numId w:val="4"/>
+        </w:numPr>
+        <w:rPr>
+          <w:rFonts w:hint="eastAsia"/>
+        </w:rPr>
+      </w:pPr>
+      <w:r>
+        <w:t>Stop-on-error mechanism fix</w:t>
+      </w:r>
+      <w:r>
+        <w:t>ed</w:t>
+      </w:r>
+      <w:r>
+        <w:t>.</w:t>
+      </w:r>
+    </w:p>
+    <w:p>
+      <w:pPr>
+        <w:numPr>
+          <w:ilvl w:val="0"/>
+          <w:numId w:val="4"/>
+        </w:numPr>
+        <w:rPr>
+          <w:rFonts w:hint="eastAsia"/>
+        </w:rPr>
+      </w:pPr>
+      <w:r>
+        <w:t xml:space="preserve">Import now processes the </w:t>
+      </w:r>
+      <w:r>
+        <w:t>CSV</w:t>
+      </w:r>
+      <w:r>
+        <w:t xml:space="preserve"> file in top-down order. </w:t>
+      </w:r>
+      <w:r>
+        <w:t>E</w:t>
+      </w:r>
+      <w:r>
+        <w:t xml:space="preserve">arlier versions </w:t>
+      </w:r>
+      <w:r>
+        <w:t xml:space="preserve">first scanned the file for errors, </w:t>
+      </w:r>
+      <w:r>
+        <w:t>then started import which could report more errors.</w:t>
+      </w:r>
+    </w:p>
+    <w:p>
+      <w:pPr>
+        <w:numPr>
+          <w:ilvl w:val="0"/>
+          <w:numId w:val="4"/>
+        </w:numPr>
+        <w:rPr>
+          <w:rFonts w:hint="eastAsia"/>
+        </w:rPr>
+      </w:pPr>
+      <w:r>
+        <w:t>Import now also ignores lines that only have spaces and/or separators.</w:t>
+      </w:r>
+    </w:p>
+    <w:p>
+      <w:pPr>
+        <w:pStyle w:val="Kop1"/>
+        <w:rPr>
+          <w:rFonts w:hint="eastAsia"/>
+        </w:rPr>
+      </w:pPr>
+      <w:r>
+        <w:lastRenderedPageBreak/>
+        <w:t>v2.0.15 – 2023-06-24</w:t>
+      </w:r>
+    </w:p>
+    <w:p>
+      <w:pPr>
+        <w:pStyle w:val="Kop3"/>
+        <w:numPr>
+          <w:ilvl w:val="0"/>
+          <w:numId w:val="0"/>
+        </w:numPr>
         <w:ind w:left="680" w:hanging="431"/>
         <w:rPr>
           <w:rFonts w:hint="eastAsia"/>
         </w:rPr>
       </w:pPr>
       <w:r>
+        <w:rPr>
+          <w:rFonts w:hint="eastAsia"/>
+        </w:rPr>
+        <w:t>Features</w:t>
+      </w:r>
+    </w:p>
+    <w:p>
+      <w:pPr>
+        <w:pStyle w:val="Lijstalinea"/>
+        <w:numPr>
+          <w:ilvl w:val="0"/>
+          <w:numId w:val="4"/>
+        </w:numPr>
+        <w:rPr>
+          <w:rFonts w:hint="eastAsia"/>
+        </w:rPr>
+      </w:pPr>
+      <w:r>
+        <w:rPr>
+          <w:rFonts w:hint="eastAsia"/>
+        </w:rPr>
+        <w:t xml:space="preserve">Enum registers editing now has a dropdown </w:t>
+      </w:r>
+      <w:proofErr w:type="spellStart"/>
+      <w:r>
+        <w:rPr>
+          <w:rFonts w:hint="eastAsia"/>
+        </w:rPr>
+        <w:t>combobox</w:t>
+      </w:r>
+      <w:proofErr w:type="spellEnd"/>
+      <w:r>
+        <w:rPr>
+          <w:rFonts w:hint="eastAsia"/>
+        </w:rPr>
+        <w:t xml:space="preserve"> with possible values.</w:t>
+      </w:r>
+    </w:p>
+    <w:p>
+      <w:pPr>
+        <w:pStyle w:val="Lijstalinea"/>
+        <w:numPr>
+          <w:ilvl w:val="0"/>
+          <w:numId w:val="4"/>
+        </w:numPr>
+        <w:rPr>
+          <w:rFonts w:hint="eastAsia"/>
+        </w:rPr>
+      </w:pPr>
+      <w:r>
+        <w:rPr>
+          <w:rFonts w:hint="eastAsia"/>
+        </w:rPr>
+        <w:t>Mbc file: Enum values now allow a cu</w:t>
+      </w:r>
+      <w:r>
+        <w:t>s</w:t>
+      </w:r>
+      <w:r>
+        <w:rPr>
+          <w:rFonts w:hint="eastAsia"/>
+        </w:rPr>
+        <w:t xml:space="preserve">tom &lt;else&gt; </w:t>
+      </w:r>
+      <w:r>
+        <w:t>text</w:t>
+      </w:r>
+      <w:r>
+        <w:rPr>
+          <w:rFonts w:hint="eastAsia"/>
+        </w:rPr>
+        <w:t xml:space="preserve"> that is shown if no value matches. </w:t>
+      </w:r>
+      <w:r>
+        <w:t>&lt;else&gt; text can be left empty to suppress the message.</w:t>
+      </w:r>
+    </w:p>
+    <w:p>
+      <w:pPr>
+        <w:pStyle w:val="Lijstalinea"/>
+        <w:numPr>
+          <w:ilvl w:val="0"/>
+          <w:numId w:val="4"/>
+        </w:numPr>
+        <w:rPr>
+          <w:rFonts w:hint="eastAsia"/>
+        </w:rPr>
+      </w:pPr>
+      <w:r>
+        <w:rPr>
+          <w:rFonts w:hint="eastAsia"/>
+        </w:rPr>
+        <w:t xml:space="preserve">You can now use </w:t>
+      </w:r>
+      <w:r>
+        <w:t xml:space="preserve">5 digits and 6 digits </w:t>
+      </w:r>
+      <w:r>
+        <w:rPr>
+          <w:rFonts w:hint="eastAsia"/>
+        </w:rPr>
+        <w:t>registers numbering scheme</w:t>
+      </w:r>
+      <w:r>
+        <w:t>,</w:t>
+      </w:r>
+      <w:r>
+        <w:rPr>
+          <w:rFonts w:hint="eastAsia"/>
+        </w:rPr>
+        <w:t xml:space="preserve"> 40001-49999 and 400001-465536</w:t>
+      </w:r>
+      <w:r>
+        <w:t xml:space="preserve">, or </w:t>
+      </w:r>
+      <w:r>
+        <w:rPr>
+          <w:rFonts w:hint="eastAsia"/>
+        </w:rPr>
+        <w:t>40000-49999 and 400000-465535</w:t>
+      </w:r>
+      <w:r>
+        <w:t xml:space="preserve">, </w:t>
+      </w:r>
+      <w:r>
+        <w:rPr>
+          <w:rFonts w:hint="eastAsia"/>
+        </w:rPr>
+        <w:t xml:space="preserve">at the same time. </w:t>
+      </w:r>
+    </w:p>
+    <w:p>
+      <w:pPr>
+        <w:pStyle w:val="Kop3"/>
+        <w:numPr>
+          <w:ilvl w:val="0"/>
+          <w:numId w:val="0"/>
+        </w:numPr>
+        <w:ind w:left="680" w:hanging="431"/>
+        <w:rPr>
+          <w:rFonts w:hint="eastAsia"/>
+        </w:rPr>
+      </w:pPr>
+      <w:r>
+        <w:rPr>
+          <w:rFonts w:hint="eastAsia"/>
+        </w:rPr>
         <w:t>Fixes</w:t>
       </w:r>
     </w:p>
     <w:p>
       <w:pPr>
+        <w:pStyle w:val="Lijstalinea"/>
         <w:numPr>
           <w:ilvl w:val="0"/>
           <w:numId w:val="4"/>
@@ -473,13 +907,29 @@
         </w:rPr>
       </w:pPr>
       <w:r>
-        <w:t xml:space="preserve">Release notes </w:t>
-      </w:r>
-      <w:r>
-        <w:t xml:space="preserve">are now </w:t>
-      </w:r>
-      <w:r>
-        <w:t>in English.</w:t>
+        <w:t xml:space="preserve">In </w:t>
+      </w:r>
+      <w:proofErr w:type="spellStart"/>
+      <w:r>
+        <w:t>Import_file</w:t>
+      </w:r>
+      <w:proofErr w:type="spellEnd"/>
+      <w:r>
+        <w:t xml:space="preserve"> and </w:t>
+      </w:r>
+      <w:proofErr w:type="spellStart"/>
+      <w:r>
+        <w:t>Import_compare</w:t>
+      </w:r>
+      <w:proofErr w:type="spellEnd"/>
+      <w:r>
+        <w:t xml:space="preserve">: writing/comparing a float32 </w:t>
+      </w:r>
+      <w:r>
+        <w:t xml:space="preserve">value </w:t>
+      </w:r>
+      <w:r>
+        <w:t>no longer worked.</w:t>
       </w:r>
     </w:p>
     <w:p>
@@ -494,13 +944,13 @@
         </w:rPr>
       </w:pPr>
       <w:r>
-        <w:t xml:space="preserve">Crash fixed: an internal buffer overflow in the communications code </w:t>
-      </w:r>
-      <w:r>
-        <w:t xml:space="preserve">sometimes </w:t>
-      </w:r>
-      <w:r>
-        <w:t xml:space="preserve">caused an application crash. </w:t>
+        <w:rPr>
+          <w:rFonts w:hint="eastAsia"/>
+        </w:rPr>
+        <w:t xml:space="preserve">Ascii32 register writing </w:t>
+      </w:r>
+      <w:r>
+        <w:t>fixed.</w:t>
       </w:r>
     </w:p>
     <w:p>
@@ -518,34 +968,344 @@
         <w:rPr>
           <w:rFonts w:hint="eastAsia"/>
         </w:rPr>
-        <w:t>WriteHoldingregisterFC</w:t>
+        <w:t xml:space="preserve">Resizing column width is now </w:t>
+      </w:r>
+      <w:r>
+        <w:t>global for all tabs</w:t>
+      </w:r>
+      <w:r>
+        <w:rPr>
+          <w:rFonts w:hint="eastAsia"/>
+        </w:rPr>
+        <w:t>.</w:t>
+      </w:r>
+    </w:p>
+    <w:p>
+      <w:pPr>
+        <w:pStyle w:val="Lijstalinea"/>
+        <w:numPr>
+          <w:ilvl w:val="0"/>
+          <w:numId w:val="4"/>
+        </w:numPr>
+        <w:rPr>
+          <w:rFonts w:hint="eastAsia"/>
+        </w:rPr>
+      </w:pPr>
+      <w:r>
+        <w:rPr>
+          <w:rFonts w:hint="eastAsia"/>
+        </w:rPr>
+        <w:t>Zoom</w:t>
+      </w:r>
+      <w:r>
+        <w:t>ing</w:t>
+      </w:r>
+      <w:r>
+        <w:rPr>
+          <w:rFonts w:hint="eastAsia"/>
+        </w:rPr>
+        <w:t xml:space="preserve"> now also adjusts the size of the column headers.</w:t>
+      </w:r>
+    </w:p>
+    <w:p>
+      <w:pPr>
+        <w:pStyle w:val="Lijstalinea"/>
+        <w:numPr>
+          <w:ilvl w:val="0"/>
+          <w:numId w:val="4"/>
+        </w:numPr>
+        <w:rPr>
+          <w:rFonts w:hint="eastAsia"/>
+        </w:rPr>
+      </w:pPr>
+      <w:r>
+        <w:rPr>
+          <w:rFonts w:hint="eastAsia"/>
+        </w:rPr>
+        <w:t>You can now close the [</w:t>
+      </w:r>
+      <w:proofErr w:type="spellStart"/>
+      <w:r>
+        <w:rPr>
+          <w:rFonts w:hint="eastAsia"/>
+        </w:rPr>
+        <w:t>Project_Configuration</w:t>
+      </w:r>
+      <w:proofErr w:type="spellEnd"/>
+      <w:r>
+        <w:rPr>
+          <w:rFonts w:hint="eastAsia"/>
+        </w:rPr>
+        <w:t>], [</w:t>
+      </w:r>
+      <w:proofErr w:type="spellStart"/>
+      <w:r>
+        <w:rPr>
+          <w:rFonts w:hint="eastAsia"/>
+        </w:rPr>
+        <w:t>Save_project_file</w:t>
+      </w:r>
+      <w:proofErr w:type="spellEnd"/>
+      <w:r>
+        <w:rPr>
+          <w:rFonts w:hint="eastAsia"/>
+        </w:rPr>
+        <w:t>] and [About] forms with the ESC button</w:t>
+      </w:r>
+      <w:r>
+        <w:t xml:space="preserve"> too</w:t>
+      </w:r>
+      <w:r>
+        <w:rPr>
+          <w:rFonts w:hint="eastAsia"/>
+        </w:rPr>
+        <w:t>.</w:t>
+      </w:r>
+    </w:p>
+    <w:p>
+      <w:pPr>
+        <w:pStyle w:val="Lijstalinea"/>
+        <w:numPr>
+          <w:ilvl w:val="0"/>
+          <w:numId w:val="4"/>
+        </w:numPr>
+        <w:rPr>
+          <w:rFonts w:hint="eastAsia"/>
+        </w:rPr>
+      </w:pPr>
+      <w:r>
+        <w:rPr>
+          <w:rFonts w:hint="eastAsia"/>
+        </w:rPr>
+        <w:t>The expand/collapse icons scale with zoom</w:t>
+      </w:r>
+      <w:r>
+        <w:t>ing</w:t>
+      </w:r>
+      <w:r>
+        <w:rPr>
+          <w:rFonts w:hint="eastAsia"/>
+        </w:rPr>
+        <w:t>.</w:t>
+      </w:r>
+    </w:p>
+    <w:p>
+      <w:pPr>
+        <w:pStyle w:val="Lijstalinea"/>
+        <w:numPr>
+          <w:ilvl w:val="0"/>
+          <w:numId w:val="4"/>
+        </w:numPr>
+        <w:rPr>
+          <w:rFonts w:hint="eastAsia"/>
+        </w:rPr>
+      </w:pPr>
+      <w:r>
+        <w:rPr>
+          <w:rFonts w:hint="eastAsia"/>
+        </w:rPr>
+        <w:t>If an error occurs when loading an mbc file, no auto-connect to the slave/server is done.</w:t>
+      </w:r>
+    </w:p>
+    <w:p>
+      <w:pPr>
+        <w:pStyle w:val="Lijstalinea"/>
+        <w:numPr>
+          <w:ilvl w:val="0"/>
+          <w:numId w:val="4"/>
+        </w:numPr>
+        <w:rPr>
+          <w:rFonts w:hint="eastAsia"/>
+        </w:rPr>
+      </w:pPr>
+      <w:r>
+        <w:rPr>
+          <w:rFonts w:hint="eastAsia"/>
+        </w:rPr>
+        <w:t xml:space="preserve">With </w:t>
+      </w:r>
+      <w:proofErr w:type="spellStart"/>
+      <w:r>
+        <w:rPr>
+          <w:rFonts w:hint="eastAsia"/>
+        </w:rPr>
+        <w:t>Import_file</w:t>
+      </w:r>
+      <w:proofErr w:type="spellEnd"/>
+      <w:r>
+        <w:rPr>
+          <w:rFonts w:hint="eastAsia"/>
+        </w:rPr>
+        <w:t xml:space="preserve"> and </w:t>
+      </w:r>
+      <w:proofErr w:type="spellStart"/>
+      <w:r>
+        <w:rPr>
+          <w:rFonts w:hint="eastAsia"/>
+        </w:rPr>
+        <w:t>Import_compare</w:t>
+      </w:r>
+      <w:proofErr w:type="spellEnd"/>
+      <w:r>
+        <w:rPr>
+          <w:rFonts w:hint="eastAsia"/>
+        </w:rPr>
+        <w:t>: writing/compar</w:t>
+      </w:r>
+      <w:r>
+        <w:t>ing</w:t>
+      </w:r>
+      <w:r>
+        <w:rPr>
+          <w:rFonts w:hint="eastAsia"/>
+        </w:rPr>
+        <w:t xml:space="preserve"> a float32 </w:t>
+      </w:r>
+      <w:r>
+        <w:t>is fixed</w:t>
+      </w:r>
+      <w:r>
+        <w:rPr>
+          <w:rFonts w:hint="eastAsia"/>
+        </w:rPr>
+        <w:t>.</w:t>
+      </w:r>
+    </w:p>
+    <w:p>
+      <w:pPr>
+        <w:pStyle w:val="Kop1"/>
+        <w:rPr>
+          <w:rFonts w:hint="eastAsia"/>
+        </w:rPr>
+      </w:pPr>
+      <w:r>
+        <w:t>v2.0.14 -- 2022-11-08</w:t>
+      </w:r>
+    </w:p>
+    <w:p>
+      <w:pPr>
+        <w:pStyle w:val="Kop3"/>
+        <w:rPr>
+          <w:rFonts w:hint="eastAsia"/>
+        </w:rPr>
+      </w:pPr>
+      <w:r>
+        <w:t>Features</w:t>
+      </w:r>
+    </w:p>
+    <w:p>
+      <w:pPr>
+        <w:numPr>
+          <w:ilvl w:val="0"/>
+          <w:numId w:val="4"/>
+        </w:numPr>
+        <w:rPr>
+          <w:rFonts w:hint="eastAsia"/>
+        </w:rPr>
+      </w:pPr>
+      <w:r>
+        <w:t xml:space="preserve">Added command line parameters. </w:t>
+      </w:r>
+      <w:r>
+        <w:t>These r</w:t>
+      </w:r>
+      <w:r>
+        <w:t xml:space="preserve">eplaces </w:t>
+      </w:r>
+      <w:r>
+        <w:t xml:space="preserve">the </w:t>
+      </w:r>
+      <w:r>
+        <w:t>LocalOverrides</w:t>
+      </w:r>
+      <w:r>
+        <w:t xml:space="preserve"> mechanism.</w:t>
+      </w:r>
+    </w:p>
+    <w:p>
+      <w:pPr>
+        <w:numPr>
+          <w:ilvl w:val="0"/>
+          <w:numId w:val="4"/>
+        </w:numPr>
+        <w:rPr>
+          <w:rFonts w:hint="eastAsia"/>
+        </w:rPr>
+      </w:pPr>
+      <w:r>
+        <w:t xml:space="preserve">LocalOverrides </w:t>
+      </w:r>
+      <w:r>
+        <w:t>mechanism removed.</w:t>
+      </w:r>
+    </w:p>
+    <w:p>
+      <w:pPr>
+        <w:numPr>
+          <w:ilvl w:val="0"/>
+          <w:numId w:val="4"/>
+        </w:numPr>
+        <w:rPr>
+          <w:rFonts w:hint="eastAsia"/>
+        </w:rPr>
+      </w:pPr>
+      <w:r>
+        <w:t>Save project file: the [Update XML to current version] checkbox is now enabled by default.</w:t>
+      </w:r>
+    </w:p>
+    <w:p>
+      <w:pPr>
+        <w:numPr>
+          <w:ilvl w:val="0"/>
+          <w:numId w:val="4"/>
+        </w:numPr>
+        <w:rPr>
+          <w:rFonts w:hint="eastAsia"/>
+        </w:rPr>
+      </w:pPr>
+      <w:r>
+        <w:t>Options form: tooltips improved.</w:t>
+      </w:r>
+    </w:p>
+    <w:p>
+      <w:pPr>
+        <w:numPr>
+          <w:ilvl w:val="0"/>
+          <w:numId w:val="4"/>
+        </w:numPr>
+        <w:rPr>
+          <w:rFonts w:hint="eastAsia"/>
+        </w:rPr>
+      </w:pPr>
+      <w:r>
+        <w:t>Grid: Regist</w:t>
+      </w:r>
+      <w:r>
+        <w:t>er</w:t>
       </w:r>
       <w:r>
         <w:t xml:space="preserve"> </w:t>
       </w:r>
       <w:r>
-        <w:rPr>
-          <w:rFonts w:hint="eastAsia"/>
-        </w:rPr>
-        <w:t>=</w:t>
-      </w:r>
-      <w:r>
-        <w:t xml:space="preserve"> ‘</w:t>
-      </w:r>
-      <w:r>
-        <w:rPr>
-          <w:rFonts w:hint="eastAsia"/>
-        </w:rPr>
-        <w:t>alternate</w:t>
-      </w:r>
-      <w:r>
-        <w:t>’</w:t>
-      </w:r>
-      <w:r>
-        <w:t xml:space="preserve"> is dropped because it was con</w:t>
-      </w:r>
-      <w:r>
-        <w:t>fusing. It is automatically replaced by ‘auto’ if found in an mbc project file.</w:t>
+        <w:t xml:space="preserve">column menu now has </w:t>
+      </w:r>
+      <w:r>
+        <w:t xml:space="preserve"> [</w:t>
+      </w:r>
+      <w:r>
+        <w:t>Expand all]</w:t>
+      </w:r>
+      <w:r>
+        <w:t xml:space="preserve"> and </w:t>
+      </w:r>
+      <w:r>
+        <w:t>[</w:t>
+      </w:r>
+      <w:r>
+        <w:t>Collapse all</w:t>
+      </w:r>
+      <w:r>
+        <w:t>].</w:t>
       </w:r>
     </w:p>
     <w:p>
@@ -559,11 +1319,30 @@
         </w:rPr>
       </w:pPr>
       <w:r>
-        <w:t>Stop-on-error mechanism fix</w:t>
-      </w:r>
-      <w:r>
-        <w:t>ed</w:t>
-      </w:r>
+        <w:t>Mbc project file: &lt;</w:t>
+      </w:r>
+      <w:proofErr w:type="spellStart"/>
+      <w:r>
+        <w:t>longdescr</w:t>
+      </w:r>
+      <w:proofErr w:type="spellEnd"/>
+      <w:r>
+        <w:t xml:space="preserve">&gt; </w:t>
+      </w:r>
+      <w:r>
+        <w:t xml:space="preserve">element </w:t>
+      </w:r>
+      <w:r>
+        <w:t xml:space="preserve">added. </w:t>
+      </w:r>
+      <w:r>
+        <w:t xml:space="preserve">Adds a long multiline text that is show when the mouse is hoovered over the register </w:t>
+      </w:r>
+      <w:proofErr w:type="spellStart"/>
+      <w:r>
+        <w:t>decription</w:t>
+      </w:r>
+      <w:proofErr w:type="spellEnd"/>
       <w:r>
         <w:t>.</w:t>
       </w:r>
@@ -579,39 +1358,744 @@
         </w:rPr>
       </w:pPr>
       <w:r>
-        <w:t xml:space="preserve">Import now processes the </w:t>
-      </w:r>
-      <w:r>
-        <w:t>CSV</w:t>
-      </w:r>
-      <w:r>
-        <w:t xml:space="preserve"> file in top-down order. </w:t>
+        <w:t>Mbc project file: &lt;include&gt; element added.</w:t>
+      </w:r>
+    </w:p>
+    <w:p>
+      <w:pPr>
+        <w:pStyle w:val="Kop3"/>
+        <w:numPr>
+          <w:ilvl w:val="0"/>
+          <w:numId w:val="0"/>
+        </w:numPr>
+        <w:ind w:left="680" w:hanging="431"/>
+        <w:rPr>
+          <w:rFonts w:hint="eastAsia"/>
+        </w:rPr>
+      </w:pPr>
+      <w:r>
+        <w:t>Fixes</w:t>
+      </w:r>
+    </w:p>
+    <w:p>
+      <w:pPr>
+        <w:numPr>
+          <w:ilvl w:val="0"/>
+          <w:numId w:val="4"/>
+        </w:numPr>
+        <w:rPr>
+          <w:rFonts w:hint="eastAsia"/>
+        </w:rPr>
+      </w:pPr>
+      <w:r>
+        <w:t>[</w:t>
+      </w:r>
+      <w:r>
+        <w:t>Open project file location in Explorer] now works if you gave a filename without a path on the command line.</w:t>
+      </w:r>
+    </w:p>
+    <w:p>
+      <w:pPr>
+        <w:numPr>
+          <w:ilvl w:val="0"/>
+          <w:numId w:val="4"/>
+        </w:numPr>
+        <w:rPr>
+          <w:rFonts w:hint="eastAsia"/>
+        </w:rPr>
+      </w:pPr>
+      <w:r>
+        <w:t xml:space="preserve">The temporary red </w:t>
+      </w:r>
+      <w:r>
+        <w:t>colouring</w:t>
+      </w:r>
+      <w:r>
+        <w:t xml:space="preserve"> of the value field after entering </w:t>
+      </w:r>
+      <w:r>
+        <w:t xml:space="preserve">an invalid value </w:t>
+      </w:r>
+      <w:r>
+        <w:t>has been improved.</w:t>
+      </w:r>
+    </w:p>
+    <w:p>
+      <w:pPr>
+        <w:numPr>
+          <w:ilvl w:val="0"/>
+          <w:numId w:val="4"/>
+        </w:numPr>
+        <w:rPr>
+          <w:rFonts w:hint="eastAsia"/>
+        </w:rPr>
+      </w:pPr>
+      <w:r>
+        <w:t>Edit</w:t>
+      </w:r>
+      <w:r>
+        <w:t xml:space="preserve"> enter/escape </w:t>
+      </w:r>
+      <w:r>
+        <w:t>handling is improved</w:t>
+      </w:r>
+      <w:r>
+        <w:t>.</w:t>
+      </w:r>
+    </w:p>
+    <w:p>
+      <w:pPr>
+        <w:numPr>
+          <w:ilvl w:val="0"/>
+          <w:numId w:val="4"/>
+        </w:numPr>
+        <w:rPr>
+          <w:rFonts w:hint="eastAsia"/>
+        </w:rPr>
+      </w:pPr>
+      <w:r>
+        <w:t xml:space="preserve">In the notification screen that the serial port could not be opened: the [Port] </w:t>
+      </w:r>
+      <w:r>
+        <w:t>combo box</w:t>
+      </w:r>
+      <w:r>
+        <w:t xml:space="preserve"> now automatically refreshes the list of serial ports.</w:t>
+      </w:r>
+    </w:p>
+    <w:p>
+      <w:pPr>
+        <w:pStyle w:val="Kop1"/>
+        <w:rPr>
+          <w:rFonts w:hint="eastAsia"/>
+        </w:rPr>
+      </w:pPr>
+      <w:r>
+        <w:t>v2.0.13 -- 2022-07-11</w:t>
+      </w:r>
+    </w:p>
+    <w:p>
+      <w:pPr>
+        <w:pStyle w:val="Kop3"/>
+        <w:rPr>
+          <w:rFonts w:hint="eastAsia"/>
+        </w:rPr>
+      </w:pPr>
+      <w:r>
+        <w:t>Features</w:t>
+      </w:r>
+    </w:p>
+    <w:p>
+      <w:pPr>
+        <w:numPr>
+          <w:ilvl w:val="0"/>
+          <w:numId w:val="4"/>
+        </w:numPr>
+        <w:rPr>
+          <w:rFonts w:hint="eastAsia"/>
+        </w:rPr>
+      </w:pPr>
+      <w:r>
+        <w:t xml:space="preserve">Added Find/Filter bar. </w:t>
+      </w:r>
+      <w:r>
+        <w:t>Open it using</w:t>
+      </w:r>
+      <w:r>
+        <w:t xml:space="preserve"> Control-F. There is also an option </w:t>
+      </w:r>
+      <w:r>
+        <w:t>“</w:t>
+      </w:r>
+      <w:r>
+        <w:t>Clear Find/Filter on tab change</w:t>
+      </w:r>
+      <w:r>
+        <w:t>”</w:t>
+      </w:r>
+      <w:r>
+        <w:t>.</w:t>
+      </w:r>
+    </w:p>
+    <w:p>
+      <w:pPr>
+        <w:numPr>
+          <w:ilvl w:val="0"/>
+          <w:numId w:val="4"/>
+        </w:numPr>
+        <w:rPr>
+          <w:rFonts w:hint="eastAsia"/>
+        </w:rPr>
+      </w:pPr>
+      <w:r>
+        <w:t>The properties of a register (</w:t>
+      </w:r>
+      <w:proofErr w:type="spellStart"/>
+      <w:r>
+        <w:t>rw</w:t>
+      </w:r>
+      <w:proofErr w:type="spellEnd"/>
+      <w:r>
+        <w:t xml:space="preserve">, int32, ...) are now displayed in a separate </w:t>
+      </w:r>
+      <w:r>
+        <w:t>[</w:t>
+      </w:r>
+      <w:r>
+        <w:t>Properties</w:t>
+      </w:r>
+      <w:r>
+        <w:t>]</w:t>
+      </w:r>
+      <w:r>
+        <w:t xml:space="preserve"> column</w:t>
+      </w:r>
+      <w:r>
+        <w:t xml:space="preserve"> instead of being added to </w:t>
+      </w:r>
+      <w:r>
+        <w:t xml:space="preserve">the </w:t>
+      </w:r>
+      <w:r>
+        <w:t>[</w:t>
+      </w:r>
+      <w:r>
+        <w:t>Description</w:t>
+      </w:r>
+      <w:r>
+        <w:t>]</w:t>
+      </w:r>
+      <w:r>
+        <w:t xml:space="preserve"> column. </w:t>
+      </w:r>
+      <w:r>
+        <w:t xml:space="preserve">The [Properties]  column can </w:t>
+      </w:r>
+      <w:r>
+        <w:lastRenderedPageBreak/>
+        <w:t>be e</w:t>
+      </w:r>
+      <w:r>
+        <w:t>nable/disable</w:t>
+      </w:r>
+      <w:r>
+        <w:t>d</w:t>
+      </w:r>
+      <w:r>
+        <w:t xml:space="preserve"> in Options.</w:t>
+      </w:r>
+    </w:p>
+    <w:p>
+      <w:pPr>
+        <w:numPr>
+          <w:ilvl w:val="0"/>
+          <w:numId w:val="4"/>
+        </w:numPr>
+        <w:rPr>
+          <w:rFonts w:hint="eastAsia"/>
+        </w:rPr>
+      </w:pPr>
+      <w:r>
+        <w:t>The Description text can now be multi-line</w:t>
+      </w:r>
+      <w:r>
+        <w:t>, i</w:t>
+      </w:r>
+      <w:r>
+        <w:t xml:space="preserve">f  the </w:t>
+      </w:r>
+      <w:r>
+        <w:t>“</w:t>
+      </w:r>
+      <w:r>
+        <w:t>Multiline rows with auto row size</w:t>
+      </w:r>
+      <w:r>
+        <w:t>”</w:t>
+      </w:r>
+      <w:r>
+        <w:t xml:space="preserve"> option </w:t>
+      </w:r>
+      <w:r>
+        <w:t>is enabled</w:t>
+      </w:r>
+      <w:r>
+        <w:t xml:space="preserve">. A </w:t>
+      </w:r>
+      <w:r>
+        <w:t xml:space="preserve">long </w:t>
+      </w:r>
+      <w:r>
+        <w:t xml:space="preserve">description </w:t>
+      </w:r>
+      <w:r>
+        <w:t>text is wrappe</w:t>
+      </w:r>
+      <w:r>
+        <w:t xml:space="preserve">d. </w:t>
+      </w:r>
+      <w:r>
+        <w:t>CR/LF</w:t>
+      </w:r>
+      <w:r>
+        <w:t xml:space="preserve">’s can be used in the description text. </w:t>
+      </w:r>
+      <w:r>
+        <w:t xml:space="preserve">The row height of the grid is automatically adjusted to the text. </w:t>
+      </w:r>
+    </w:p>
+    <w:p>
+      <w:pPr>
+        <w:numPr>
+          <w:ilvl w:val="0"/>
+          <w:numId w:val="4"/>
+        </w:numPr>
+        <w:rPr>
+          <w:rFonts w:hint="eastAsia"/>
+        </w:rPr>
+      </w:pPr>
+      <w:r>
+        <w:t>"Move to next row on Enter"</w:t>
+      </w:r>
+      <w:r>
+        <w:t xml:space="preserve"> option</w:t>
+      </w:r>
+      <w:r>
+        <w:t xml:space="preserve">: depending on this option, after entering a new value with the Enter key, the </w:t>
+      </w:r>
+      <w:r>
+        <w:t>cursor</w:t>
+      </w:r>
+      <w:r>
+        <w:t xml:space="preserve"> may or may not go to the next line. </w:t>
+      </w:r>
+      <w:r>
+        <w:t xml:space="preserve">Enter a value with </w:t>
+      </w:r>
+      <w:r>
+        <w:t>Control-Enter</w:t>
+      </w:r>
+      <w:r>
+        <w:t xml:space="preserve"> to get the</w:t>
+      </w:r>
+      <w:r>
+        <w:t xml:space="preserve"> opposite</w:t>
+      </w:r>
+      <w:r>
+        <w:t xml:space="preserve"> behaviour.</w:t>
+      </w:r>
+    </w:p>
+    <w:p>
+      <w:pPr>
+        <w:pStyle w:val="Kop3"/>
+        <w:numPr>
+          <w:ilvl w:val="0"/>
+          <w:numId w:val="0"/>
+        </w:numPr>
+        <w:ind w:left="680" w:hanging="431"/>
+        <w:rPr>
+          <w:rFonts w:hint="eastAsia"/>
+        </w:rPr>
+      </w:pPr>
+      <w:r>
+        <w:t>Fixes</w:t>
+      </w:r>
+    </w:p>
+    <w:p>
+      <w:pPr>
+        <w:numPr>
+          <w:ilvl w:val="0"/>
+          <w:numId w:val="5"/>
+        </w:numPr>
+        <w:rPr>
+          <w:rFonts w:hint="eastAsia"/>
+        </w:rPr>
+      </w:pPr>
+      <w:r>
+        <w:t>Control-0 for zoom reset now works globally on the form, not just when the focus is in the grid.</w:t>
+      </w:r>
+    </w:p>
+    <w:p>
+      <w:pPr>
+        <w:numPr>
+          <w:ilvl w:val="0"/>
+          <w:numId w:val="5"/>
+        </w:numPr>
+        <w:rPr>
+          <w:rFonts w:hint="eastAsia"/>
+        </w:rPr>
+      </w:pPr>
+      <w:r>
+        <w:t>R</w:t>
+      </w:r>
+      <w:r>
+        <w:t>ight-click</w:t>
+      </w:r>
+      <w:r>
+        <w:t>ing</w:t>
+      </w:r>
+      <w:r>
+        <w:t xml:space="preserve"> in the grid</w:t>
+      </w:r>
+      <w:r>
+        <w:t xml:space="preserve"> now moves the focus to that row, to </w:t>
+      </w:r>
+      <w:r>
+        <w:t>better see which row you are working on.</w:t>
+      </w:r>
+    </w:p>
+    <w:p>
+      <w:pPr>
+        <w:numPr>
+          <w:ilvl w:val="0"/>
+          <w:numId w:val="5"/>
+        </w:numPr>
+        <w:rPr>
+          <w:rFonts w:hint="eastAsia"/>
+        </w:rPr>
+      </w:pPr>
+      <w:r>
+        <w:t>Migrated</w:t>
+      </w:r>
+      <w:r>
+        <w:t xml:space="preserve"> to .NET framework 4.7.2.</w:t>
+      </w:r>
+    </w:p>
+    <w:p>
+      <w:pPr>
+        <w:pStyle w:val="Kop1"/>
+        <w:rPr>
+          <w:rFonts w:hint="eastAsia"/>
+        </w:rPr>
+      </w:pPr>
+      <w:r>
+        <w:t>v2.0.12 -- 2020-07-13</w:t>
+      </w:r>
+    </w:p>
+    <w:p>
+      <w:pPr>
+        <w:pStyle w:val="Kop3"/>
+        <w:rPr>
+          <w:rFonts w:hint="eastAsia"/>
+        </w:rPr>
+      </w:pPr>
+      <w:r>
+        <w:t>Features</w:t>
+      </w:r>
+    </w:p>
+    <w:p>
+      <w:pPr>
+        <w:numPr>
+          <w:ilvl w:val="0"/>
+          <w:numId w:val="6"/>
+        </w:numPr>
+        <w:rPr>
+          <w:rFonts w:hint="eastAsia"/>
+        </w:rPr>
+      </w:pPr>
+      <w:r>
+        <w:t>Added mbc project file validation with XSD schema</w:t>
+      </w:r>
+      <w:r>
+        <w:t xml:space="preserve"> file</w:t>
+      </w:r>
+      <w:r>
+        <w:t xml:space="preserve">. </w:t>
+      </w:r>
+      <w:r>
+        <w:t xml:space="preserve">Validation is optional. </w:t>
+      </w:r>
+      <w:r>
+        <w:t>The validation only allows lower-case XML tags</w:t>
+      </w:r>
+      <w:r>
+        <w:t>, a</w:t>
+      </w:r>
+      <w:r>
+        <w:t xml:space="preserve">nd only allows the XML elements that are supported in this version. The intention is that over time all mbc files will </w:t>
+      </w:r>
+      <w:r>
+        <w:t>migrate</w:t>
+      </w:r>
+      <w:r>
+        <w:t xml:space="preserve"> to meet the validation.</w:t>
+      </w:r>
+    </w:p>
+    <w:p>
+      <w:pPr>
+        <w:numPr>
+          <w:ilvl w:val="0"/>
+          <w:numId w:val="6"/>
+        </w:numPr>
+        <w:rPr>
+          <w:rFonts w:hint="eastAsia"/>
+        </w:rPr>
+      </w:pPr>
+      <w:r>
+        <w:t>In</w:t>
+      </w:r>
+      <w:r>
+        <w:t xml:space="preserve"> </w:t>
+      </w:r>
+      <w:r>
+        <w:t xml:space="preserve">the </w:t>
+      </w:r>
+      <w:r>
+        <w:t xml:space="preserve">"Save project file" </w:t>
+      </w:r>
+      <w:r>
+        <w:t xml:space="preserve">form </w:t>
+      </w:r>
+      <w:r>
+        <w:t xml:space="preserve">you now have the option to update the XML with "Update XML to current version" so that it then passes the validation. </w:t>
       </w:r>
       <w:r>
         <w:t>E</w:t>
       </w:r>
       <w:r>
-        <w:t xml:space="preserve">arlier versions </w:t>
-      </w:r>
-      <w:r>
-        <w:t xml:space="preserve">first scanned the file for errors, </w:t>
-      </w:r>
-      <w:r>
-        <w:t>then started import which could report more errors.</w:t>
-      </w:r>
-    </w:p>
-    <w:p>
-      <w:pPr>
-        <w:numPr>
-          <w:ilvl w:val="0"/>
-          <w:numId w:val="4"/>
-        </w:numPr>
-        <w:rPr>
-          <w:rFonts w:hint="eastAsia"/>
-        </w:rPr>
-      </w:pPr>
-      <w:r>
-        <w:t>Import now also ignores lines that only have spaces and/or separators.</w:t>
+        <w:t>rrors must be corrected manually.</w:t>
+      </w:r>
+    </w:p>
+    <w:p>
+      <w:pPr>
+        <w:numPr>
+          <w:ilvl w:val="0"/>
+          <w:numId w:val="6"/>
+        </w:numPr>
+        <w:rPr>
+          <w:rFonts w:hint="eastAsia"/>
+        </w:rPr>
+      </w:pPr>
+      <w:r>
+        <w:t>In</w:t>
+      </w:r>
+      <w:r>
+        <w:t xml:space="preserve"> "Save project file" the project file is now saved with XML formatting.</w:t>
+      </w:r>
+    </w:p>
+    <w:p>
+      <w:pPr>
+        <w:numPr>
+          <w:ilvl w:val="0"/>
+          <w:numId w:val="6"/>
+        </w:numPr>
+        <w:rPr>
+          <w:rFonts w:hint="eastAsia"/>
+        </w:rPr>
+      </w:pPr>
+      <w:r>
+        <w:t xml:space="preserve">If you start ModbusControl by double-clicking an mbc file and the file points to a non-existent COM port, the error dialog "Error opening serial port </w:t>
+      </w:r>
+      <w:proofErr w:type="spellStart"/>
+      <w:r>
+        <w:t>COMx</w:t>
+      </w:r>
+      <w:proofErr w:type="spellEnd"/>
+      <w:r>
+        <w:t>" now appears after the ModbusControl program appears.</w:t>
+      </w:r>
+    </w:p>
+    <w:p>
+      <w:pPr>
+        <w:numPr>
+          <w:ilvl w:val="0"/>
+          <w:numId w:val="6"/>
+        </w:numPr>
+        <w:rPr>
+          <w:rFonts w:hint="eastAsia"/>
+        </w:rPr>
+      </w:pPr>
+      <w:r>
+        <w:t xml:space="preserve">At the first start </w:t>
+      </w:r>
+      <w:r>
+        <w:t xml:space="preserve">of the program </w:t>
+      </w:r>
+      <w:r>
+        <w:t xml:space="preserve">after an update, </w:t>
+      </w:r>
+      <w:r>
+        <w:t xml:space="preserve">an option is shown </w:t>
+      </w:r>
+      <w:r>
+        <w:t>to see the 'Release notes'.</w:t>
+      </w:r>
+    </w:p>
+    <w:p>
+      <w:pPr>
+        <w:numPr>
+          <w:ilvl w:val="0"/>
+          <w:numId w:val="6"/>
+        </w:numPr>
+        <w:rPr>
+          <w:rFonts w:hint="eastAsia"/>
+        </w:rPr>
+      </w:pPr>
+      <w:r>
+        <w:t xml:space="preserve">Program settings split into user-dependent part and </w:t>
+      </w:r>
+      <w:r>
+        <w:t>computer</w:t>
+      </w:r>
+      <w:r>
+        <w:t xml:space="preserve">-dependent part. The old settings are migrated to the new settings files, then </w:t>
+      </w:r>
+      <w:r>
+        <w:t xml:space="preserve">the </w:t>
+      </w:r>
+      <w:r>
+        <w:t>old settings file is deleted.</w:t>
+      </w:r>
+    </w:p>
+    <w:p>
+      <w:pPr>
+        <w:numPr>
+          <w:ilvl w:val="0"/>
+          <w:numId w:val="6"/>
+        </w:numPr>
+        <w:rPr>
+          <w:rFonts w:hint="eastAsia"/>
+        </w:rPr>
+      </w:pPr>
+      <w:r>
+        <w:t xml:space="preserve">LocalOverrides.xml </w:t>
+      </w:r>
+      <w:r>
+        <w:t xml:space="preserve">file is automatically </w:t>
+      </w:r>
+      <w:r>
+        <w:t>moved from &lt;</w:t>
+      </w:r>
+      <w:proofErr w:type="spellStart"/>
+      <w:r>
+        <w:t>mydocuments</w:t>
+      </w:r>
+      <w:proofErr w:type="spellEnd"/>
+      <w:r>
+        <w:t>&gt;\ModbusControl to %</w:t>
+      </w:r>
+      <w:proofErr w:type="spellStart"/>
+      <w:r>
+        <w:t>AppData</w:t>
+      </w:r>
+      <w:proofErr w:type="spellEnd"/>
+      <w:r>
+        <w:t xml:space="preserve">%\Roaming\E.D.&amp;A\ModbusControl. Content from old is not migrated. Old </w:t>
+      </w:r>
+      <w:r>
+        <w:t>file</w:t>
+      </w:r>
+      <w:r>
+        <w:t xml:space="preserve"> is renamed with '.old' and moved to the </w:t>
+      </w:r>
+      <w:r>
+        <w:t xml:space="preserve">new </w:t>
+      </w:r>
+      <w:r>
+        <w:t>location. If overrides were used, the user will receive a notification.</w:t>
+      </w:r>
+    </w:p>
+    <w:p>
+      <w:pPr>
+        <w:numPr>
+          <w:ilvl w:val="0"/>
+          <w:numId w:val="6"/>
+        </w:numPr>
+        <w:rPr>
+          <w:rFonts w:hint="eastAsia"/>
+        </w:rPr>
+      </w:pPr>
+      <w:r>
+        <w:t>&lt;user&gt;\Documents\ModbusControl is no longer used.</w:t>
+      </w:r>
+    </w:p>
+    <w:p>
+      <w:pPr>
+        <w:pStyle w:val="Kop3"/>
+        <w:rPr>
+          <w:rFonts w:hint="eastAsia"/>
+        </w:rPr>
+      </w:pPr>
+      <w:r>
+        <w:t>Fixes</w:t>
+      </w:r>
+    </w:p>
+    <w:p>
+      <w:pPr>
+        <w:numPr>
+          <w:ilvl w:val="0"/>
+          <w:numId w:val="7"/>
+        </w:numPr>
+        <w:rPr>
+          <w:rFonts w:hint="eastAsia"/>
+        </w:rPr>
+      </w:pPr>
+      <w:r>
+        <w:t>The import/export dialogs now show '*. CSV' instead of '*. C</w:t>
+      </w:r>
+      <w:r>
+        <w:t>VS</w:t>
+      </w:r>
+      <w:r>
+        <w:t>'.</w:t>
+      </w:r>
+    </w:p>
+    <w:p>
+      <w:pPr>
+        <w:numPr>
+          <w:ilvl w:val="0"/>
+          <w:numId w:val="7"/>
+        </w:numPr>
+        <w:rPr>
+          <w:rFonts w:hint="eastAsia"/>
+        </w:rPr>
+      </w:pPr>
+      <w:r>
+        <w:t>Mbc file is now saved without BOM (</w:t>
+      </w:r>
+      <w:r>
+        <w:t>Unicode</w:t>
+      </w:r>
+      <w:r>
+        <w:t xml:space="preserve"> byte order mark).</w:t>
+      </w:r>
+    </w:p>
+    <w:p>
+      <w:pPr>
+        <w:numPr>
+          <w:ilvl w:val="0"/>
+          <w:numId w:val="7"/>
+        </w:numPr>
+        <w:rPr>
+          <w:rFonts w:hint="eastAsia"/>
+        </w:rPr>
+      </w:pPr>
+      <w:r>
+        <w:t xml:space="preserve">Better </w:t>
+      </w:r>
+      <w:r>
+        <w:t>handling</w:t>
+      </w:r>
+      <w:r>
+        <w:t xml:space="preserve"> if </w:t>
+      </w:r>
+      <w:r>
+        <w:t>a</w:t>
+      </w:r>
+      <w:r>
+        <w:t xml:space="preserve"> non-admin</w:t>
+      </w:r>
+      <w:r>
+        <w:t>istrator</w:t>
+      </w:r>
+      <w:r>
+        <w:t xml:space="preserve"> user logs </w:t>
+      </w:r>
+      <w:r>
+        <w:t xml:space="preserve">on </w:t>
+      </w:r>
+      <w:r>
+        <w:t>and uses ModbusControl.</w:t>
       </w:r>
     </w:p>
     <w:p>
@@ -622,1844 +2106,770 @@
         </w:rPr>
       </w:pPr>
       <w:r>
-        <w:t>v2.0.15 – 2023-06-24</w:t>
+        <w:t>v2.0.11 -- 2019-11-18</w:t>
       </w:r>
     </w:p>
     <w:p>
       <w:pPr>
         <w:pStyle w:val="Kop3"/>
-        <w:numPr>
-          <w:ilvl w:val="0"/>
-          <w:numId w:val="0"/>
-        </w:numPr>
-        <w:ind w:left="680" w:hanging="431"/>
-        <w:rPr>
-          <w:rFonts w:hint="eastAsia"/>
-        </w:rPr>
-      </w:pPr>
-      <w:r>
-        <w:rPr>
-          <w:rFonts w:hint="eastAsia"/>
-        </w:rPr>
+        <w:rPr>
+          <w:rFonts w:hint="eastAsia"/>
+        </w:rPr>
+      </w:pPr>
+      <w:r>
+        <w:t>Fixes</w:t>
+      </w:r>
+    </w:p>
+    <w:p>
+      <w:pPr>
+        <w:numPr>
+          <w:ilvl w:val="0"/>
+          <w:numId w:val="8"/>
+        </w:numPr>
+        <w:rPr>
+          <w:rFonts w:hint="eastAsia"/>
+        </w:rPr>
+      </w:pPr>
+      <w:r>
+        <w:t xml:space="preserve">Better handling if the USB/serial connection is lost. In the past </w:t>
+      </w:r>
+      <w:r>
+        <w:t xml:space="preserve">the </w:t>
+      </w:r>
+      <w:r>
+        <w:t xml:space="preserve">program </w:t>
+      </w:r>
+      <w:r>
+        <w:t>could stop responding</w:t>
+      </w:r>
+      <w:r>
+        <w:t>.</w:t>
+      </w:r>
+    </w:p>
+    <w:p>
+      <w:pPr>
+        <w:pStyle w:val="Kop1"/>
+        <w:rPr>
+          <w:rFonts w:hint="eastAsia"/>
+        </w:rPr>
+      </w:pPr>
+      <w:r>
+        <w:lastRenderedPageBreak/>
+        <w:t>v2.0.10 -- 2019-03-11</w:t>
+      </w:r>
+    </w:p>
+    <w:p>
+      <w:pPr>
+        <w:pStyle w:val="Kop3"/>
+        <w:rPr>
+          <w:rFonts w:hint="eastAsia"/>
+        </w:rPr>
+      </w:pPr>
+      <w:r>
         <w:t>Features</w:t>
       </w:r>
     </w:p>
     <w:p>
       <w:pPr>
-        <w:pStyle w:val="Lijstalinea"/>
-        <w:numPr>
-          <w:ilvl w:val="0"/>
-          <w:numId w:val="4"/>
-        </w:numPr>
-        <w:rPr>
-          <w:rFonts w:hint="eastAsia"/>
-        </w:rPr>
-      </w:pPr>
-      <w:r>
-        <w:rPr>
-          <w:rFonts w:hint="eastAsia"/>
-        </w:rPr>
-        <w:t>Enum registers editing now has a dropdown combobox with possible values.</w:t>
-      </w:r>
-    </w:p>
-    <w:p>
-      <w:pPr>
-        <w:pStyle w:val="Lijstalinea"/>
-        <w:numPr>
-          <w:ilvl w:val="0"/>
-          <w:numId w:val="4"/>
-        </w:numPr>
-        <w:rPr>
-          <w:rFonts w:hint="eastAsia"/>
-        </w:rPr>
-      </w:pPr>
-      <w:r>
-        <w:rPr>
-          <w:rFonts w:hint="eastAsia"/>
-        </w:rPr>
-        <w:t>Mbc file: Enum values now allow a cu</w:t>
+        <w:numPr>
+          <w:ilvl w:val="0"/>
+          <w:numId w:val="8"/>
+        </w:numPr>
+        <w:rPr>
+          <w:rFonts w:hint="eastAsia"/>
+        </w:rPr>
+      </w:pPr>
+      <w:r>
+        <w:t>Added display</w:t>
+      </w:r>
+      <w:r>
+        <w:t>ing</w:t>
+      </w:r>
+      <w:r>
+        <w:t xml:space="preserve"> of enum </w:t>
+      </w:r>
+      <w:r>
+        <w:t xml:space="preserve">values </w:t>
+      </w:r>
+      <w:r>
+        <w:t xml:space="preserve">in the value column. </w:t>
+      </w:r>
+    </w:p>
+    <w:p>
+      <w:pPr>
+        <w:pStyle w:val="Kop3"/>
+        <w:rPr>
+          <w:rFonts w:hint="eastAsia"/>
+        </w:rPr>
+      </w:pPr>
+      <w:r>
+        <w:t>Fixes</w:t>
+      </w:r>
+    </w:p>
+    <w:p>
+      <w:pPr>
+        <w:numPr>
+          <w:ilvl w:val="0"/>
+          <w:numId w:val="8"/>
+        </w:numPr>
+        <w:rPr>
+          <w:rFonts w:hint="eastAsia"/>
+        </w:rPr>
+      </w:pPr>
+      <w:r>
+        <w:t xml:space="preserve">Menu </w:t>
+      </w:r>
+      <w:r>
+        <w:t xml:space="preserve">item </w:t>
+      </w:r>
+      <w:r>
+        <w:t xml:space="preserve">"Edit project file" did not work </w:t>
+      </w:r>
+      <w:r>
+        <w:t xml:space="preserve">correctly </w:t>
+      </w:r>
+      <w:r>
+        <w:t>if there was a space in the path.</w:t>
+      </w:r>
+    </w:p>
+    <w:p>
+      <w:pPr>
+        <w:numPr>
+          <w:ilvl w:val="0"/>
+          <w:numId w:val="8"/>
+        </w:numPr>
+        <w:rPr>
+          <w:rFonts w:hint="eastAsia"/>
+        </w:rPr>
+      </w:pPr>
+      <w:r>
+        <w:t>Logger: Clear button did not clear number of logs in the status bar.</w:t>
+      </w:r>
+    </w:p>
+    <w:p>
+      <w:pPr>
+        <w:numPr>
+          <w:ilvl w:val="0"/>
+          <w:numId w:val="8"/>
+        </w:numPr>
+        <w:rPr>
+          <w:rFonts w:hint="eastAsia"/>
+        </w:rPr>
+      </w:pPr>
+      <w:r>
+        <w:t xml:space="preserve">Send Custom Modbus Command: allows tabs and CR/LF in the string. </w:t>
+      </w:r>
+      <w:r>
+        <w:t xml:space="preserve">Reports </w:t>
+      </w:r>
+      <w:r>
+        <w:t xml:space="preserve">error </w:t>
+      </w:r>
+      <w:r>
+        <w:t>for</w:t>
+      </w:r>
+      <w:r>
+        <w:t xml:space="preserve"> empty command string. </w:t>
+      </w:r>
+    </w:p>
+    <w:p>
+      <w:pPr>
+        <w:numPr>
+          <w:ilvl w:val="0"/>
+          <w:numId w:val="8"/>
+        </w:numPr>
+        <w:rPr>
+          <w:rFonts w:hint="eastAsia"/>
+        </w:rPr>
+      </w:pPr>
+      <w:r>
+        <w:t xml:space="preserve">Send Custom Modbus Command: </w:t>
+      </w:r>
+      <w:r>
+        <w:t>Reports</w:t>
+      </w:r>
+      <w:r>
+        <w:t xml:space="preserve"> error when command is too short, must be at least 2 bytes.</w:t>
+      </w:r>
+    </w:p>
+    <w:p>
+      <w:pPr>
+        <w:numPr>
+          <w:ilvl w:val="0"/>
+          <w:numId w:val="8"/>
+        </w:numPr>
+        <w:rPr>
+          <w:rFonts w:hint="eastAsia"/>
+        </w:rPr>
+      </w:pPr>
+      <w:r>
+        <w:t xml:space="preserve">Fix background </w:t>
+      </w:r>
+      <w:r>
+        <w:t>colour</w:t>
+      </w:r>
+      <w:r>
+        <w:t xml:space="preserve"> of registers.</w:t>
+      </w:r>
+    </w:p>
+    <w:p>
+      <w:pPr>
+        <w:pStyle w:val="Kop1"/>
+        <w:rPr>
+          <w:rFonts w:hint="eastAsia"/>
+        </w:rPr>
+      </w:pPr>
+      <w:r>
+        <w:t>v2.0.9 -- 2018-10-20</w:t>
+      </w:r>
+    </w:p>
+    <w:p>
+      <w:pPr>
+        <w:pStyle w:val="Kop3"/>
+        <w:rPr>
+          <w:rFonts w:hint="eastAsia"/>
+        </w:rPr>
+      </w:pPr>
+      <w:r>
+        <w:t>Features</w:t>
+      </w:r>
+    </w:p>
+    <w:p>
+      <w:pPr>
+        <w:numPr>
+          <w:ilvl w:val="0"/>
+          <w:numId w:val="9"/>
+        </w:numPr>
+        <w:rPr>
+          <w:rFonts w:hint="eastAsia"/>
+        </w:rPr>
+      </w:pPr>
+      <w:r>
+        <w:t>New option: "Move to next row on Enter".</w:t>
+      </w:r>
+    </w:p>
+    <w:p>
+      <w:pPr>
+        <w:numPr>
+          <w:ilvl w:val="0"/>
+          <w:numId w:val="9"/>
+        </w:numPr>
+        <w:rPr>
+          <w:rFonts w:hint="eastAsia"/>
+        </w:rPr>
+      </w:pPr>
+      <w:r>
+        <w:t xml:space="preserve">New option: "Auto-start edit mode on typing". </w:t>
+      </w:r>
+    </w:p>
+    <w:p>
+      <w:pPr>
+        <w:numPr>
+          <w:ilvl w:val="0"/>
+          <w:numId w:val="9"/>
+        </w:numPr>
+        <w:rPr>
+          <w:rFonts w:hint="eastAsia"/>
+        </w:rPr>
+      </w:pPr>
+      <w:r>
+        <w:t xml:space="preserve">New option: "Use custom editor". </w:t>
+      </w:r>
+    </w:p>
+    <w:p>
+      <w:pPr>
+        <w:numPr>
+          <w:ilvl w:val="0"/>
+          <w:numId w:val="9"/>
+        </w:numPr>
+        <w:rPr>
+          <w:rFonts w:hint="eastAsia"/>
+        </w:rPr>
+      </w:pPr>
+      <w:r>
+        <w:t>New option: "Ignore form size on project reload".</w:t>
+      </w:r>
+    </w:p>
+    <w:p>
+      <w:pPr>
+        <w:numPr>
+          <w:ilvl w:val="0"/>
+          <w:numId w:val="9"/>
+        </w:numPr>
+        <w:rPr>
+          <w:rFonts w:hint="eastAsia"/>
+        </w:rPr>
+      </w:pPr>
+      <w:r>
+        <w:t>Config</w:t>
+      </w:r>
+      <w:r>
+        <w:t>uration</w:t>
+      </w:r>
+      <w:r>
+        <w:t xml:space="preserve"> form now has an Apply button.</w:t>
+      </w:r>
+    </w:p>
+    <w:p>
+      <w:pPr>
+        <w:numPr>
+          <w:ilvl w:val="0"/>
+          <w:numId w:val="9"/>
+        </w:numPr>
+        <w:rPr>
+          <w:rFonts w:hint="eastAsia"/>
+        </w:rPr>
+      </w:pPr>
+      <w:r>
+        <w:t xml:space="preserve">Separate line-copy and value-copy </w:t>
+      </w:r>
+      <w:r>
+        <w:t xml:space="preserve">capability </w:t>
+      </w:r>
+      <w:r>
+        <w:t xml:space="preserve">in grid, </w:t>
+      </w:r>
+      <w:r>
+        <w:t>using</w:t>
+      </w:r>
+      <w:r>
+        <w:t xml:space="preserve"> control-C and context menu.</w:t>
+      </w:r>
+    </w:p>
+    <w:p>
+      <w:pPr>
+        <w:numPr>
+          <w:ilvl w:val="0"/>
+          <w:numId w:val="9"/>
+        </w:numPr>
+        <w:rPr>
+          <w:rFonts w:hint="eastAsia"/>
+        </w:rPr>
+      </w:pPr>
+      <w:r>
+        <w:t xml:space="preserve">The status bar now </w:t>
+      </w:r>
+      <w:r>
+        <w:t xml:space="preserve">has </w:t>
+      </w:r>
+      <w:r>
+        <w:t xml:space="preserve">blue </w:t>
+      </w:r>
+      <w:r>
+        <w:t xml:space="preserve">colour </w:t>
+      </w:r>
+      <w:r>
+        <w:t>if there is no connection or no polling is done.</w:t>
+      </w:r>
+    </w:p>
+    <w:p>
+      <w:pPr>
+        <w:numPr>
+          <w:ilvl w:val="0"/>
+          <w:numId w:val="9"/>
+        </w:numPr>
+        <w:rPr>
+          <w:rFonts w:hint="eastAsia"/>
+        </w:rPr>
+      </w:pPr>
+      <w:r>
+        <w:t xml:space="preserve">The status bar </w:t>
+      </w:r>
+      <w:r>
+        <w:t xml:space="preserve">now has red colour </w:t>
+      </w:r>
+      <w:r>
+        <w:t>for errors.</w:t>
+      </w:r>
+    </w:p>
+    <w:p>
+      <w:pPr>
+        <w:numPr>
+          <w:ilvl w:val="0"/>
+          <w:numId w:val="9"/>
+        </w:numPr>
+        <w:rPr>
+          <w:rFonts w:hint="eastAsia"/>
+        </w:rPr>
+      </w:pPr>
+      <w:r>
+        <w:t xml:space="preserve">Now </w:t>
+      </w:r>
+      <w:r>
+        <w:t>shows</w:t>
+      </w:r>
+      <w:r>
+        <w:t xml:space="preserve"> a warning in the "Save configuration to project file" and "Project configuration" screens if localoverrides </w:t>
+      </w:r>
+      <w:r>
+        <w:t>were</w:t>
+      </w:r>
+      <w:r>
+        <w:t xml:space="preserve"> used.</w:t>
+      </w:r>
+    </w:p>
+    <w:p>
+      <w:pPr>
+        <w:pStyle w:val="Kop3"/>
+        <w:rPr>
+          <w:rFonts w:hint="eastAsia"/>
+        </w:rPr>
+      </w:pPr>
+      <w:r>
+        <w:t>Fixes</w:t>
+      </w:r>
+    </w:p>
+    <w:p>
+      <w:pPr>
+        <w:numPr>
+          <w:ilvl w:val="0"/>
+          <w:numId w:val="10"/>
+        </w:numPr>
+        <w:rPr>
+          <w:rFonts w:hint="eastAsia"/>
+        </w:rPr>
+      </w:pPr>
+      <w:r>
+        <w:t xml:space="preserve">Notification </w:t>
+      </w:r>
+      <w:r>
+        <w:t>if Settings.xml could not be loaded at startup.</w:t>
+      </w:r>
+    </w:p>
+    <w:p>
+      <w:pPr>
+        <w:numPr>
+          <w:ilvl w:val="0"/>
+          <w:numId w:val="10"/>
+        </w:numPr>
+        <w:rPr>
+          <w:rFonts w:hint="eastAsia"/>
+        </w:rPr>
+      </w:pPr>
+      <w:r>
+        <w:t xml:space="preserve">Settings.xml </w:t>
+      </w:r>
+      <w:r>
+        <w:t xml:space="preserve">writing now </w:t>
+      </w:r>
+      <w:r>
+        <w:t>update</w:t>
       </w:r>
       <w:r>
         <w:t>s</w:t>
       </w:r>
       <w:r>
-        <w:rPr>
-          <w:rFonts w:hint="eastAsia"/>
-        </w:rPr>
-        <w:t xml:space="preserve">tom &lt;else&gt; </w:t>
-      </w:r>
-      <w:r>
-        <w:t>text</w:t>
-      </w:r>
-      <w:r>
-        <w:rPr>
-          <w:rFonts w:hint="eastAsia"/>
-        </w:rPr>
-        <w:t xml:space="preserve"> that is shown if no value matches. </w:t>
-      </w:r>
-      <w:r>
-        <w:t>&lt;else&gt; text can be left empty to suppress the message.</w:t>
-      </w:r>
-    </w:p>
-    <w:p>
-      <w:pPr>
-        <w:pStyle w:val="Lijstalinea"/>
-        <w:numPr>
-          <w:ilvl w:val="0"/>
-          <w:numId w:val="4"/>
-        </w:numPr>
-        <w:rPr>
-          <w:rFonts w:hint="eastAsia"/>
-        </w:rPr>
-      </w:pPr>
-      <w:r>
-        <w:rPr>
-          <w:rFonts w:hint="eastAsia"/>
-        </w:rPr>
-        <w:t xml:space="preserve">You can now use </w:t>
-      </w:r>
-      <w:r>
-        <w:t xml:space="preserve">5 digits and 6 digits </w:t>
-      </w:r>
-      <w:r>
-        <w:rPr>
-          <w:rFonts w:hint="eastAsia"/>
-        </w:rPr>
-        <w:t>registers numbering scheme</w:t>
-      </w:r>
-      <w:r>
-        <w:t>,</w:t>
-      </w:r>
-      <w:r>
-        <w:rPr>
-          <w:rFonts w:hint="eastAsia"/>
-        </w:rPr>
-        <w:t xml:space="preserve"> 40001-49999 and </w:t>
-      </w:r>
-      <w:r>
-        <w:rPr>
-          <w:rFonts w:hint="eastAsia"/>
-        </w:rPr>
+        <w:t>/insert</w:t>
+      </w:r>
+      <w:r>
+        <w:t>s</w:t>
+      </w:r>
+      <w:r>
+        <w:t xml:space="preserve"> </w:t>
+      </w:r>
+      <w:r>
+        <w:t>al</w:t>
+      </w:r>
+      <w:r>
+        <w:t xml:space="preserve">l tags in the </w:t>
+      </w:r>
+      <w:r>
+        <w:t xml:space="preserve">existing </w:t>
+      </w:r>
+      <w:r>
+        <w:t>file instead of writing a completely new file, so that any newer tags from a newer version remain.</w:t>
+      </w:r>
+    </w:p>
+    <w:p>
+      <w:pPr>
+        <w:numPr>
+          <w:ilvl w:val="0"/>
+          <w:numId w:val="10"/>
+        </w:numPr>
+        <w:rPr>
+          <w:rFonts w:hint="eastAsia"/>
+        </w:rPr>
+      </w:pPr>
+      <w:r>
+        <w:t>Project Configuration: Interframe-delay: now shows "0 (auto)" at setting 0.</w:t>
+      </w:r>
+    </w:p>
+    <w:p>
+      <w:pPr>
+        <w:numPr>
+          <w:ilvl w:val="0"/>
+          <w:numId w:val="10"/>
+        </w:numPr>
+        <w:rPr>
+          <w:rFonts w:hint="eastAsia"/>
+        </w:rPr>
+      </w:pPr>
+      <w:r>
+        <w:t xml:space="preserve">Local override project </w:t>
+      </w:r>
+      <w:r>
+        <w:t xml:space="preserve">is </w:t>
+      </w:r>
+      <w:r>
+        <w:t xml:space="preserve">no longer </w:t>
+      </w:r>
+      <w:r>
+        <w:t xml:space="preserve">required to have a </w:t>
+      </w:r>
+      <w:r>
+        <w:t>&lt;modbus&gt; element.</w:t>
+      </w:r>
+    </w:p>
+    <w:p>
+      <w:pPr>
+        <w:numPr>
+          <w:ilvl w:val="0"/>
+          <w:numId w:val="10"/>
+        </w:numPr>
+        <w:rPr>
+          <w:rFonts w:hint="eastAsia"/>
+        </w:rPr>
+      </w:pPr>
+      <w:r>
+        <w:t>Dialog forms can now be closed with the Enter key.</w:t>
+      </w:r>
+    </w:p>
+    <w:p>
+      <w:pPr>
+        <w:numPr>
+          <w:ilvl w:val="0"/>
+          <w:numId w:val="10"/>
+        </w:numPr>
+        <w:rPr>
+          <w:rFonts w:hint="eastAsia"/>
+        </w:rPr>
+      </w:pPr>
+      <w:r>
+        <w:t xml:space="preserve">The </w:t>
+      </w:r>
+      <w:r>
+        <w:t>checkboxes of the "Save configuration to project file" form</w:t>
+      </w:r>
+      <w:r>
+        <w:t xml:space="preserve"> are now cleared when loading a project.</w:t>
+      </w:r>
+    </w:p>
+    <w:p>
+      <w:pPr>
+        <w:numPr>
+          <w:ilvl w:val="0"/>
+          <w:numId w:val="10"/>
+        </w:numPr>
+        <w:rPr>
+          <w:rFonts w:hint="eastAsia"/>
+        </w:rPr>
+      </w:pPr>
+      <w:r>
+        <w:t xml:space="preserve">Buttons at the bottom of the forms now have </w:t>
+      </w:r>
+      <w:r>
+        <w:t>better spacing</w:t>
+      </w:r>
+      <w:r>
+        <w:t>.</w:t>
+      </w:r>
+    </w:p>
+    <w:p>
+      <w:pPr>
+        <w:pStyle w:val="Kop1"/>
+        <w:rPr>
+          <w:rFonts w:hint="eastAsia"/>
+        </w:rPr>
+      </w:pPr>
+      <w:r>
+        <w:t>v2.0.8 -- 2018-08-02</w:t>
+      </w:r>
+    </w:p>
+    <w:p>
+      <w:pPr>
+        <w:pStyle w:val="Kop3"/>
+        <w:rPr>
+          <w:rFonts w:hint="eastAsia"/>
+        </w:rPr>
+      </w:pPr>
+      <w:r>
+        <w:t>Features</w:t>
+      </w:r>
+    </w:p>
+    <w:p>
+      <w:pPr>
+        <w:numPr>
+          <w:ilvl w:val="0"/>
+          <w:numId w:val="11"/>
+        </w:numPr>
+        <w:rPr>
+          <w:rFonts w:hint="eastAsia"/>
+        </w:rPr>
+      </w:pPr>
+      <w:r>
+        <w:t xml:space="preserve">Added </w:t>
+      </w:r>
+      <w:r>
+        <w:t>menus and toolbar.</w:t>
+      </w:r>
+    </w:p>
+    <w:p>
+      <w:pPr>
+        <w:numPr>
+          <w:ilvl w:val="0"/>
+          <w:numId w:val="11"/>
+        </w:numPr>
+        <w:rPr>
+          <w:rFonts w:hint="eastAsia"/>
+        </w:rPr>
+      </w:pPr>
+      <w:r>
+        <w:t xml:space="preserve">Can save project configuration, bridge settings and form size in mbc file. </w:t>
+      </w:r>
+    </w:p>
+    <w:p>
+      <w:pPr>
+        <w:numPr>
+          <w:ilvl w:val="0"/>
+          <w:numId w:val="11"/>
+        </w:numPr>
+        <w:rPr>
+          <w:rFonts w:hint="eastAsia"/>
+        </w:rPr>
+      </w:pPr>
+      <w:r>
+        <w:t xml:space="preserve">Communication </w:t>
+      </w:r>
+      <w:r>
+        <w:t>pausing</w:t>
+      </w:r>
+      <w:r>
+        <w:t xml:space="preserve"> and poll-once.</w:t>
+      </w:r>
+    </w:p>
+    <w:p>
+      <w:pPr>
+        <w:numPr>
+          <w:ilvl w:val="0"/>
+          <w:numId w:val="11"/>
+        </w:numPr>
+        <w:rPr>
+          <w:rFonts w:hint="eastAsia"/>
+        </w:rPr>
+      </w:pPr>
+      <w:r>
+        <w:t>C</w:t>
+      </w:r>
+      <w:r>
+        <w:t>hange the connection parameters without having to close and reopen the port.</w:t>
+      </w:r>
+    </w:p>
+    <w:p>
+      <w:pPr>
+        <w:numPr>
+          <w:ilvl w:val="0"/>
+          <w:numId w:val="11"/>
+        </w:numPr>
+        <w:rPr>
+          <w:rFonts w:hint="eastAsia"/>
+        </w:rPr>
+      </w:pPr>
+      <w:r>
+        <w:t xml:space="preserve">If the serial port is not available at start, you can </w:t>
+      </w:r>
+      <w:r>
+        <w:t>immediately</w:t>
+      </w:r>
+      <w:r>
+        <w:t xml:space="preserve"> choose another </w:t>
+      </w:r>
+      <w:r>
+        <w:t>port</w:t>
+      </w:r>
+      <w:r>
+        <w:t>.</w:t>
+      </w:r>
+    </w:p>
+    <w:p>
+      <w:pPr>
+        <w:numPr>
+          <w:ilvl w:val="0"/>
+          <w:numId w:val="11"/>
+        </w:numPr>
+        <w:rPr>
+          <w:rFonts w:hint="eastAsia"/>
+        </w:rPr>
+      </w:pPr>
+      <w:r>
+        <w:t>M</w:t>
+      </w:r>
+      <w:r>
+        <w:t xml:space="preserve">bc project file: XML tags </w:t>
+      </w:r>
+      <w:r>
+        <w:t xml:space="preserve">are </w:t>
+      </w:r>
+      <w:r>
+        <w:t xml:space="preserve">now preferably in lowercase. The old camelcase is also still accepted. </w:t>
+      </w:r>
+    </w:p>
+    <w:p>
+      <w:pPr>
+        <w:numPr>
+          <w:ilvl w:val="0"/>
+          <w:numId w:val="11"/>
+        </w:numPr>
+        <w:rPr>
+          <w:rFonts w:hint="eastAsia"/>
+        </w:rPr>
+      </w:pPr>
+      <w:r>
+        <w:t>Always shows line numbers f</w:t>
+      </w:r>
+      <w:r>
+        <w:t xml:space="preserve">or errors in mbc file. </w:t>
+      </w:r>
+    </w:p>
+    <w:p>
+      <w:pPr>
+        <w:numPr>
+          <w:ilvl w:val="0"/>
+          <w:numId w:val="11"/>
+        </w:numPr>
+        <w:rPr>
+          <w:rFonts w:hint="eastAsia"/>
+        </w:rPr>
+      </w:pPr>
+      <w:r>
         <w:lastRenderedPageBreak/>
-        <w:t>400001-465536</w:t>
-      </w:r>
-      <w:r>
-        <w:t xml:space="preserve">, or </w:t>
-      </w:r>
-      <w:r>
-        <w:rPr>
-          <w:rFonts w:hint="eastAsia"/>
-        </w:rPr>
-        <w:t>40000-49999 and 400000-465535</w:t>
-      </w:r>
-      <w:r>
-        <w:t xml:space="preserve">, </w:t>
-      </w:r>
-      <w:r>
-        <w:rPr>
-          <w:rFonts w:hint="eastAsia"/>
-        </w:rPr>
-        <w:t xml:space="preserve">at the same time. </w:t>
-      </w:r>
-    </w:p>
-    <w:p>
-      <w:pPr>
-        <w:pStyle w:val="Kop3"/>
-        <w:numPr>
-          <w:ilvl w:val="0"/>
-          <w:numId w:val="0"/>
-        </w:numPr>
-        <w:ind w:left="680" w:hanging="431"/>
-        <w:rPr>
-          <w:rFonts w:hint="eastAsia"/>
-        </w:rPr>
-      </w:pPr>
-      <w:r>
-        <w:rPr>
-          <w:rFonts w:hint="eastAsia"/>
-        </w:rPr>
-        <w:t>Fixes</w:t>
-      </w:r>
-    </w:p>
-    <w:p>
-      <w:pPr>
-        <w:pStyle w:val="Lijstalinea"/>
-        <w:numPr>
-          <w:ilvl w:val="0"/>
-          <w:numId w:val="4"/>
-        </w:numPr>
-        <w:rPr>
-          <w:rFonts w:hint="eastAsia"/>
-        </w:rPr>
-      </w:pPr>
-      <w:r>
-        <w:t xml:space="preserve">In Import_file and Import_compare: writing/comparing a float32 </w:t>
-      </w:r>
-      <w:r>
-        <w:t xml:space="preserve">value </w:t>
-      </w:r>
-      <w:r>
-        <w:t>no longer worked.</w:t>
-      </w:r>
-    </w:p>
-    <w:p>
-      <w:pPr>
-        <w:pStyle w:val="Lijstalinea"/>
-        <w:numPr>
-          <w:ilvl w:val="0"/>
-          <w:numId w:val="4"/>
-        </w:numPr>
-        <w:rPr>
-          <w:rFonts w:hint="eastAsia"/>
-        </w:rPr>
-      </w:pPr>
-      <w:r>
-        <w:rPr>
-          <w:rFonts w:hint="eastAsia"/>
-        </w:rPr>
-        <w:t xml:space="preserve">Ascii32 register writing </w:t>
-      </w:r>
-      <w:r>
-        <w:t>fixed.</w:t>
-      </w:r>
-    </w:p>
-    <w:p>
-      <w:pPr>
-        <w:pStyle w:val="Lijstalinea"/>
-        <w:numPr>
-          <w:ilvl w:val="0"/>
-          <w:numId w:val="4"/>
-        </w:numPr>
-        <w:rPr>
-          <w:rFonts w:hint="eastAsia"/>
-        </w:rPr>
-      </w:pPr>
-      <w:r>
-        <w:rPr>
-          <w:rFonts w:hint="eastAsia"/>
-        </w:rPr>
-        <w:t xml:space="preserve">Resizing column width is now </w:t>
-      </w:r>
-      <w:r>
-        <w:t>global for all tabs</w:t>
-      </w:r>
-      <w:r>
-        <w:rPr>
-          <w:rFonts w:hint="eastAsia"/>
-        </w:rPr>
-        <w:t>.</w:t>
-      </w:r>
-    </w:p>
-    <w:p>
-      <w:pPr>
-        <w:pStyle w:val="Lijstalinea"/>
-        <w:numPr>
-          <w:ilvl w:val="0"/>
-          <w:numId w:val="4"/>
-        </w:numPr>
-        <w:rPr>
-          <w:rFonts w:hint="eastAsia"/>
-        </w:rPr>
-      </w:pPr>
-      <w:r>
-        <w:rPr>
-          <w:rFonts w:hint="eastAsia"/>
-        </w:rPr>
-        <w:t>Zoom</w:t>
-      </w:r>
-      <w:r>
-        <w:t>ing</w:t>
-      </w:r>
-      <w:r>
-        <w:rPr>
-          <w:rFonts w:hint="eastAsia"/>
-        </w:rPr>
-        <w:t xml:space="preserve"> now also adjusts the size of the column headers.</w:t>
-      </w:r>
-    </w:p>
-    <w:p>
-      <w:pPr>
-        <w:pStyle w:val="Lijstalinea"/>
-        <w:numPr>
-          <w:ilvl w:val="0"/>
-          <w:numId w:val="4"/>
-        </w:numPr>
-        <w:rPr>
-          <w:rFonts w:hint="eastAsia"/>
-        </w:rPr>
-      </w:pPr>
-      <w:r>
-        <w:rPr>
-          <w:rFonts w:hint="eastAsia"/>
-        </w:rPr>
-        <w:t>You can now close the [Project_Configuration], [Save_project_file] and [About] forms with the ESC button</w:t>
-      </w:r>
-      <w:r>
-        <w:t xml:space="preserve"> too</w:t>
-      </w:r>
-      <w:r>
-        <w:rPr>
-          <w:rFonts w:hint="eastAsia"/>
-        </w:rPr>
-        <w:t>.</w:t>
-      </w:r>
-    </w:p>
-    <w:p>
-      <w:pPr>
-        <w:pStyle w:val="Lijstalinea"/>
-        <w:numPr>
-          <w:ilvl w:val="0"/>
-          <w:numId w:val="4"/>
-        </w:numPr>
-        <w:rPr>
-          <w:rFonts w:hint="eastAsia"/>
-        </w:rPr>
-      </w:pPr>
-      <w:r>
-        <w:rPr>
-          <w:rFonts w:hint="eastAsia"/>
-        </w:rPr>
-        <w:t>The expand/collapse icons scale with zoom</w:t>
-      </w:r>
-      <w:r>
-        <w:t>ing</w:t>
-      </w:r>
-      <w:r>
-        <w:rPr>
-          <w:rFonts w:hint="eastAsia"/>
-        </w:rPr>
-        <w:t>.</w:t>
-      </w:r>
-    </w:p>
-    <w:p>
-      <w:pPr>
-        <w:pStyle w:val="Lijstalinea"/>
-        <w:numPr>
-          <w:ilvl w:val="0"/>
-          <w:numId w:val="4"/>
-        </w:numPr>
-        <w:rPr>
-          <w:rFonts w:hint="eastAsia"/>
-        </w:rPr>
-      </w:pPr>
-      <w:r>
-        <w:rPr>
-          <w:rFonts w:hint="eastAsia"/>
-        </w:rPr>
-        <w:t>If an error occurs when loading an mbc file, no auto-connect to the slave/server is done.</w:t>
-      </w:r>
-    </w:p>
-    <w:p>
-      <w:pPr>
-        <w:pStyle w:val="Lijstalinea"/>
-        <w:numPr>
-          <w:ilvl w:val="0"/>
-          <w:numId w:val="4"/>
-        </w:numPr>
-        <w:rPr>
-          <w:rFonts w:hint="eastAsia"/>
-        </w:rPr>
-      </w:pPr>
-      <w:r>
-        <w:rPr>
-          <w:rFonts w:hint="eastAsia"/>
-        </w:rPr>
-        <w:t>With Import_file and Import_compare: writing/compar</w:t>
-      </w:r>
-      <w:r>
-        <w:t>ing</w:t>
-      </w:r>
-      <w:r>
-        <w:rPr>
-          <w:rFonts w:hint="eastAsia"/>
-        </w:rPr>
-        <w:t xml:space="preserve"> a float32 </w:t>
-      </w:r>
-      <w:r>
-        <w:t>is fixed</w:t>
-      </w:r>
-      <w:r>
-        <w:rPr>
-          <w:rFonts w:hint="eastAsia"/>
-        </w:rPr>
-        <w:t>.</w:t>
-      </w:r>
-    </w:p>
-    <w:p>
-      <w:pPr>
-        <w:pStyle w:val="Kop1"/>
-        <w:rPr>
-          <w:rFonts w:hint="eastAsia"/>
-        </w:rPr>
-      </w:pPr>
-      <w:r>
-        <w:t>v2.0.14 -- 2022-11-08</w:t>
-      </w:r>
-    </w:p>
-    <w:p>
-      <w:pPr>
-        <w:pStyle w:val="Kop3"/>
-        <w:rPr>
-          <w:rFonts w:hint="eastAsia"/>
-        </w:rPr>
-      </w:pPr>
-      <w:r>
-        <w:t>Features</w:t>
-      </w:r>
-    </w:p>
-    <w:p>
-      <w:pPr>
-        <w:numPr>
-          <w:ilvl w:val="0"/>
-          <w:numId w:val="4"/>
-        </w:numPr>
-        <w:rPr>
-          <w:rFonts w:hint="eastAsia"/>
-        </w:rPr>
-      </w:pPr>
-      <w:r>
-        <w:t xml:space="preserve">Added command line parameters. </w:t>
-      </w:r>
-      <w:r>
-        <w:t>These r</w:t>
-      </w:r>
-      <w:r>
-        <w:t xml:space="preserve">eplaces </w:t>
-      </w:r>
-      <w:r>
-        <w:t xml:space="preserve">the </w:t>
-      </w:r>
-      <w:r>
-        <w:t>LocalOverrides</w:t>
-      </w:r>
-      <w:r>
-        <w:t xml:space="preserve"> mechanism.</w:t>
-      </w:r>
-    </w:p>
-    <w:p>
-      <w:pPr>
-        <w:numPr>
-          <w:ilvl w:val="0"/>
-          <w:numId w:val="4"/>
-        </w:numPr>
-        <w:rPr>
-          <w:rFonts w:hint="eastAsia"/>
-        </w:rPr>
-      </w:pPr>
-      <w:r>
-        <w:t xml:space="preserve">LocalOverrides </w:t>
-      </w:r>
-      <w:r>
-        <w:t>mechanism removed.</w:t>
-      </w:r>
-    </w:p>
-    <w:p>
-      <w:pPr>
-        <w:numPr>
-          <w:ilvl w:val="0"/>
-          <w:numId w:val="4"/>
-        </w:numPr>
-        <w:rPr>
-          <w:rFonts w:hint="eastAsia"/>
-        </w:rPr>
-      </w:pPr>
-      <w:r>
-        <w:t>Save project file: the [Update XML to current version] checkbox is now enabled by default.</w:t>
-      </w:r>
-    </w:p>
-    <w:p>
-      <w:pPr>
-        <w:numPr>
-          <w:ilvl w:val="0"/>
-          <w:numId w:val="4"/>
-        </w:numPr>
-        <w:rPr>
-          <w:rFonts w:hint="eastAsia"/>
-        </w:rPr>
-      </w:pPr>
-      <w:r>
-        <w:t>Options form: tooltips improved.</w:t>
-      </w:r>
-    </w:p>
-    <w:p>
-      <w:pPr>
-        <w:numPr>
-          <w:ilvl w:val="0"/>
-          <w:numId w:val="4"/>
-        </w:numPr>
-        <w:rPr>
-          <w:rFonts w:hint="eastAsia"/>
-        </w:rPr>
-      </w:pPr>
-      <w:r>
-        <w:t>Grid: Regist</w:t>
-      </w:r>
-      <w:r>
-        <w:t>er</w:t>
+        <w:t>Word order (endian)</w:t>
       </w:r>
       <w:r>
         <w:t xml:space="preserve"> </w:t>
       </w:r>
       <w:r>
-        <w:t xml:space="preserve">column menu now has </w:t>
-      </w:r>
-      <w:r>
-        <w:t xml:space="preserve"> [</w:t>
-      </w:r>
-      <w:r>
-        <w:t>Expand all]</w:t>
-      </w:r>
-      <w:r>
-        <w:t xml:space="preserve"> and </w:t>
-      </w:r>
-      <w:r>
-        <w:t>[</w:t>
-      </w:r>
-      <w:r>
-        <w:t>Collapse all</w:t>
-      </w:r>
-      <w:r>
-        <w:t>].</w:t>
-      </w:r>
-    </w:p>
-    <w:p>
-      <w:pPr>
-        <w:numPr>
-          <w:ilvl w:val="0"/>
-          <w:numId w:val="4"/>
-        </w:numPr>
-        <w:rPr>
-          <w:rFonts w:hint="eastAsia"/>
-        </w:rPr>
-      </w:pPr>
-      <w:r>
-        <w:t xml:space="preserve">Mbc project file: &lt;longdescr&gt; </w:t>
-      </w:r>
-      <w:r>
-        <w:t xml:space="preserve">element </w:t>
-      </w:r>
-      <w:r>
-        <w:t xml:space="preserve">added. </w:t>
-      </w:r>
-      <w:r>
-        <w:t>Adds a long multiline text that is show when the mouse is hoovered over the register decription</w:t>
-      </w:r>
-      <w:r>
-        <w:t>.</w:t>
-      </w:r>
-    </w:p>
-    <w:p>
-      <w:pPr>
-        <w:numPr>
-          <w:ilvl w:val="0"/>
-          <w:numId w:val="4"/>
-        </w:numPr>
-        <w:rPr>
-          <w:rFonts w:hint="eastAsia"/>
-        </w:rPr>
-      </w:pPr>
-      <w:r>
-        <w:t>Mbc project file: &lt;include&gt; element added.</w:t>
-      </w:r>
-    </w:p>
-    <w:p>
-      <w:pPr>
-        <w:pStyle w:val="Kop3"/>
-        <w:numPr>
-          <w:ilvl w:val="0"/>
-          <w:numId w:val="0"/>
-        </w:numPr>
-        <w:ind w:left="680" w:hanging="431"/>
-        <w:rPr>
-          <w:rFonts w:hint="eastAsia"/>
-        </w:rPr>
-      </w:pPr>
-      <w:r>
-        <w:t>Fixes</w:t>
-      </w:r>
-    </w:p>
-    <w:p>
-      <w:pPr>
-        <w:numPr>
-          <w:ilvl w:val="0"/>
-          <w:numId w:val="4"/>
-        </w:numPr>
-        <w:rPr>
-          <w:rFonts w:hint="eastAsia"/>
-        </w:rPr>
-      </w:pPr>
-      <w:r>
-        <w:t>[</w:t>
-      </w:r>
-      <w:r>
-        <w:t>Open project file location in Explorer] now works if you gave a filename without a path on the command line.</w:t>
-      </w:r>
-    </w:p>
-    <w:p>
-      <w:pPr>
-        <w:numPr>
-          <w:ilvl w:val="0"/>
-          <w:numId w:val="4"/>
-        </w:numPr>
-        <w:rPr>
-          <w:rFonts w:hint="eastAsia"/>
-        </w:rPr>
-      </w:pPr>
-      <w:r>
-        <w:t xml:space="preserve">The temporary red </w:t>
-      </w:r>
-      <w:r>
-        <w:t>colouring</w:t>
-      </w:r>
-      <w:r>
-        <w:t xml:space="preserve"> of the value field after entering </w:t>
-      </w:r>
-      <w:r>
-        <w:t xml:space="preserve">an invalid value </w:t>
-      </w:r>
-      <w:r>
-        <w:t>has been improved.</w:t>
-      </w:r>
-    </w:p>
-    <w:p>
-      <w:pPr>
-        <w:numPr>
-          <w:ilvl w:val="0"/>
-          <w:numId w:val="4"/>
-        </w:numPr>
-        <w:rPr>
-          <w:rFonts w:hint="eastAsia"/>
-        </w:rPr>
-      </w:pPr>
-      <w:r>
-        <w:t>Edit</w:t>
-      </w:r>
-      <w:r>
-        <w:t xml:space="preserve"> enter/escape </w:t>
-      </w:r>
-      <w:r>
-        <w:t>handling is improved</w:t>
-      </w:r>
-      <w:r>
-        <w:t>.</w:t>
-      </w:r>
-    </w:p>
-    <w:p>
-      <w:pPr>
-        <w:numPr>
-          <w:ilvl w:val="0"/>
-          <w:numId w:val="4"/>
-        </w:numPr>
-        <w:rPr>
-          <w:rFonts w:hint="eastAsia"/>
-        </w:rPr>
-      </w:pPr>
-      <w:r>
-        <w:t xml:space="preserve">In the notification screen that the serial port could not be opened: the [Port] </w:t>
-      </w:r>
-      <w:r>
-        <w:t>combo box</w:t>
-      </w:r>
-      <w:r>
-        <w:t xml:space="preserve"> now automatically refreshes the list of serial ports.</w:t>
-      </w:r>
-    </w:p>
-    <w:p>
-      <w:pPr>
-        <w:pStyle w:val="Kop1"/>
-        <w:rPr>
-          <w:rFonts w:hint="eastAsia"/>
-        </w:rPr>
-      </w:pPr>
-      <w:r>
-        <w:t>v2.0.13 -- 2022-07-11</w:t>
-      </w:r>
-    </w:p>
-    <w:p>
-      <w:pPr>
-        <w:pStyle w:val="Kop3"/>
-        <w:rPr>
-          <w:rFonts w:hint="eastAsia"/>
-        </w:rPr>
-      </w:pPr>
-      <w:r>
-        <w:t>Features</w:t>
-      </w:r>
-    </w:p>
-    <w:p>
-      <w:pPr>
-        <w:numPr>
-          <w:ilvl w:val="0"/>
-          <w:numId w:val="4"/>
-        </w:numPr>
-        <w:rPr>
-          <w:rFonts w:hint="eastAsia"/>
-        </w:rPr>
-      </w:pPr>
-      <w:r>
-        <w:t xml:space="preserve">Added Find/Filter bar. </w:t>
-      </w:r>
-      <w:r>
-        <w:t>Open it using</w:t>
-      </w:r>
-      <w:r>
-        <w:t xml:space="preserve"> Control-F. There is also an option </w:t>
-      </w:r>
-      <w:r>
-        <w:t>“</w:t>
-      </w:r>
-      <w:r>
-        <w:t>Clear Find/Filter on tab change</w:t>
-      </w:r>
-      <w:r>
-        <w:t>”</w:t>
-      </w:r>
-      <w:r>
-        <w:t>.</w:t>
-      </w:r>
-    </w:p>
-    <w:p>
-      <w:pPr>
-        <w:numPr>
-          <w:ilvl w:val="0"/>
-          <w:numId w:val="4"/>
-        </w:numPr>
-        <w:rPr>
-          <w:rFonts w:hint="eastAsia"/>
-        </w:rPr>
-      </w:pPr>
-      <w:r>
-        <w:t xml:space="preserve">The properties of a register (rw, int32, ...) are now displayed in a separate </w:t>
-      </w:r>
-      <w:r>
-        <w:t>[</w:t>
-      </w:r>
-      <w:r>
-        <w:t>Properties</w:t>
-      </w:r>
-      <w:r>
-        <w:t>]</w:t>
-      </w:r>
-      <w:r>
-        <w:t xml:space="preserve"> column</w:t>
-      </w:r>
-      <w:r>
-        <w:t xml:space="preserve"> instead of being added to </w:t>
-      </w:r>
-      <w:r>
-        <w:t xml:space="preserve">the </w:t>
-      </w:r>
-      <w:r>
-        <w:t>[</w:t>
-      </w:r>
-      <w:r>
-        <w:t>Description</w:t>
-      </w:r>
-      <w:r>
-        <w:t>]</w:t>
-      </w:r>
-      <w:r>
-        <w:t xml:space="preserve"> column. </w:t>
-      </w:r>
-      <w:r>
-        <w:t>The [Properties]  column can be e</w:t>
-      </w:r>
-      <w:r>
-        <w:t>nable/disable</w:t>
-      </w:r>
-      <w:r>
-        <w:t>d</w:t>
-      </w:r>
-      <w:r>
-        <w:t xml:space="preserve"> in Options.</w:t>
-      </w:r>
-    </w:p>
-    <w:p>
-      <w:pPr>
-        <w:numPr>
-          <w:ilvl w:val="0"/>
-          <w:numId w:val="4"/>
-        </w:numPr>
-        <w:rPr>
-          <w:rFonts w:hint="eastAsia"/>
-        </w:rPr>
-      </w:pPr>
-      <w:r>
-        <w:t>The Description text can now be multi-line</w:t>
-      </w:r>
-      <w:r>
-        <w:t>, i</w:t>
-      </w:r>
-      <w:r>
-        <w:t xml:space="preserve">f  the </w:t>
-      </w:r>
-      <w:r>
-        <w:t>“</w:t>
-      </w:r>
-      <w:r>
-        <w:t>Multiline rows with auto row size</w:t>
-      </w:r>
-      <w:r>
-        <w:t>”</w:t>
-      </w:r>
-      <w:r>
-        <w:t xml:space="preserve"> option </w:t>
-      </w:r>
-      <w:r>
-        <w:t>is enabled</w:t>
-      </w:r>
-      <w:r>
-        <w:t xml:space="preserve">. A </w:t>
-      </w:r>
-      <w:r>
-        <w:t xml:space="preserve">long </w:t>
-      </w:r>
-      <w:r>
-        <w:t xml:space="preserve">description </w:t>
-      </w:r>
-      <w:r>
-        <w:t>text is wrappe</w:t>
-      </w:r>
-      <w:r>
-        <w:t xml:space="preserve">d. </w:t>
-      </w:r>
-      <w:r>
-        <w:t>CR/LF</w:t>
-      </w:r>
-      <w:r>
-        <w:t xml:space="preserve">’s can be used in the description text. </w:t>
-      </w:r>
-      <w:r>
-        <w:t xml:space="preserve">The row height of the grid is automatically adjusted to the text. </w:t>
-      </w:r>
-    </w:p>
-    <w:p>
-      <w:pPr>
-        <w:numPr>
-          <w:ilvl w:val="0"/>
-          <w:numId w:val="4"/>
-        </w:numPr>
-        <w:rPr>
-          <w:rFonts w:hint="eastAsia"/>
-        </w:rPr>
-      </w:pPr>
-      <w:r>
-        <w:t>"Move to next row on Enter"</w:t>
-      </w:r>
-      <w:r>
-        <w:t xml:space="preserve"> option</w:t>
-      </w:r>
-      <w:r>
-        <w:t xml:space="preserve">: depending on this option, after entering a new value with the Enter key, the </w:t>
-      </w:r>
-      <w:r>
-        <w:t>cursor</w:t>
-      </w:r>
-      <w:r>
-        <w:t xml:space="preserve"> may or may not go to the next line. </w:t>
-      </w:r>
-      <w:r>
-        <w:t xml:space="preserve">Enter a value with </w:t>
-      </w:r>
-      <w:r>
-        <w:t>Control-Enter</w:t>
-      </w:r>
-      <w:r>
-        <w:t xml:space="preserve"> to get the</w:t>
-      </w:r>
-      <w:r>
-        <w:t xml:space="preserve"> opposite</w:t>
-      </w:r>
-      <w:r>
-        <w:t xml:space="preserve"> behaviour.</w:t>
-      </w:r>
-    </w:p>
-    <w:p>
-      <w:pPr>
-        <w:pStyle w:val="Kop3"/>
-        <w:numPr>
-          <w:ilvl w:val="0"/>
-          <w:numId w:val="0"/>
-        </w:numPr>
-        <w:ind w:left="680" w:hanging="431"/>
-        <w:rPr>
-          <w:rFonts w:hint="eastAsia"/>
-        </w:rPr>
-      </w:pPr>
-      <w:r>
-        <w:lastRenderedPageBreak/>
-        <w:t>Fixes</w:t>
-      </w:r>
-    </w:p>
-    <w:p>
-      <w:pPr>
-        <w:numPr>
-          <w:ilvl w:val="0"/>
-          <w:numId w:val="5"/>
-        </w:numPr>
-        <w:rPr>
-          <w:rFonts w:hint="eastAsia"/>
-        </w:rPr>
-      </w:pPr>
-      <w:r>
-        <w:t>Control-0 for zoom reset now works globally on the form, not just when the focus is in the grid.</w:t>
-      </w:r>
-    </w:p>
-    <w:p>
-      <w:pPr>
-        <w:numPr>
-          <w:ilvl w:val="0"/>
-          <w:numId w:val="5"/>
-        </w:numPr>
-        <w:rPr>
-          <w:rFonts w:hint="eastAsia"/>
-        </w:rPr>
-      </w:pPr>
-      <w:r>
-        <w:t>R</w:t>
-      </w:r>
-      <w:r>
-        <w:t>ight-click</w:t>
-      </w:r>
-      <w:r>
-        <w:t>ing</w:t>
-      </w:r>
-      <w:r>
-        <w:t xml:space="preserve"> in the grid</w:t>
-      </w:r>
-      <w:r>
-        <w:t xml:space="preserve"> now moves the focus to that row, to </w:t>
-      </w:r>
-      <w:r>
-        <w:t>better see which row you are working on.</w:t>
-      </w:r>
-    </w:p>
-    <w:p>
-      <w:pPr>
-        <w:numPr>
-          <w:ilvl w:val="0"/>
-          <w:numId w:val="5"/>
-        </w:numPr>
-        <w:rPr>
-          <w:rFonts w:hint="eastAsia"/>
-        </w:rPr>
-      </w:pPr>
-      <w:r>
-        <w:t>Migrated</w:t>
-      </w:r>
-      <w:r>
-        <w:t xml:space="preserve"> to .NET framework 4.7.2.</w:t>
-      </w:r>
-    </w:p>
-    <w:p>
-      <w:pPr>
-        <w:pStyle w:val="Kop1"/>
-        <w:rPr>
-          <w:rFonts w:hint="eastAsia"/>
-        </w:rPr>
-      </w:pPr>
-      <w:r>
-        <w:t>v2.0.12 -- 2020-07-13</w:t>
-      </w:r>
-    </w:p>
-    <w:p>
-      <w:pPr>
-        <w:pStyle w:val="Kop3"/>
-        <w:rPr>
-          <w:rFonts w:hint="eastAsia"/>
-        </w:rPr>
-      </w:pPr>
-      <w:r>
-        <w:t>Features</w:t>
-      </w:r>
-    </w:p>
-    <w:p>
-      <w:pPr>
-        <w:numPr>
-          <w:ilvl w:val="0"/>
-          <w:numId w:val="6"/>
-        </w:numPr>
-        <w:rPr>
-          <w:rFonts w:hint="eastAsia"/>
-        </w:rPr>
-      </w:pPr>
-      <w:r>
-        <w:t>Added mbc project file validation with XSD schema</w:t>
-      </w:r>
-      <w:r>
-        <w:t xml:space="preserve"> file</w:t>
-      </w:r>
-      <w:r>
-        <w:t xml:space="preserve">. </w:t>
-      </w:r>
-      <w:r>
-        <w:t xml:space="preserve">Validation is optional. </w:t>
-      </w:r>
-      <w:r>
-        <w:t>The validation only allows lower-case XML tags</w:t>
-      </w:r>
-      <w:r>
-        <w:t>, a</w:t>
-      </w:r>
-      <w:r>
-        <w:t xml:space="preserve">nd only allows the XML elements that are supported in this version. The intention is that over time all mbc files will </w:t>
-      </w:r>
-      <w:r>
-        <w:t>migrate</w:t>
-      </w:r>
-      <w:r>
-        <w:t xml:space="preserve"> to meet the validation.</w:t>
-      </w:r>
-    </w:p>
-    <w:p>
-      <w:pPr>
-        <w:numPr>
-          <w:ilvl w:val="0"/>
-          <w:numId w:val="6"/>
-        </w:numPr>
-        <w:rPr>
-          <w:rFonts w:hint="eastAsia"/>
-        </w:rPr>
-      </w:pPr>
-      <w:r>
-        <w:t>In</w:t>
-      </w:r>
-      <w:r>
-        <w:t xml:space="preserve"> </w:t>
-      </w:r>
-      <w:r>
-        <w:t xml:space="preserve">the </w:t>
-      </w:r>
-      <w:r>
-        <w:t xml:space="preserve">"Save project file" </w:t>
-      </w:r>
-      <w:r>
-        <w:t xml:space="preserve">form </w:t>
-      </w:r>
-      <w:r>
-        <w:t xml:space="preserve">you now have the option to update the XML with "Update XML to current version" so that it then passes the validation. </w:t>
-      </w:r>
-      <w:r>
-        <w:t>E</w:t>
-      </w:r>
-      <w:r>
-        <w:t>rrors must be corrected manually.</w:t>
-      </w:r>
-    </w:p>
-    <w:p>
-      <w:pPr>
-        <w:numPr>
-          <w:ilvl w:val="0"/>
-          <w:numId w:val="6"/>
-        </w:numPr>
-        <w:rPr>
-          <w:rFonts w:hint="eastAsia"/>
-        </w:rPr>
-      </w:pPr>
-      <w:r>
-        <w:t>In</w:t>
-      </w:r>
-      <w:r>
-        <w:t xml:space="preserve"> "Save project file" the project file is now saved with XML formatting.</w:t>
-      </w:r>
-    </w:p>
-    <w:p>
-      <w:pPr>
-        <w:numPr>
-          <w:ilvl w:val="0"/>
-          <w:numId w:val="6"/>
-        </w:numPr>
-        <w:rPr>
-          <w:rFonts w:hint="eastAsia"/>
-        </w:rPr>
-      </w:pPr>
-      <w:r>
-        <w:t>If you start ModbusControl by double-clicking an mbc file and the file points to a non-existent COM port, the error dialog "Error opening serial port COMx" now appears after the ModbusControl program appears.</w:t>
-      </w:r>
-    </w:p>
-    <w:p>
-      <w:pPr>
-        <w:numPr>
-          <w:ilvl w:val="0"/>
-          <w:numId w:val="6"/>
-        </w:numPr>
-        <w:rPr>
-          <w:rFonts w:hint="eastAsia"/>
-        </w:rPr>
-      </w:pPr>
-      <w:r>
-        <w:t xml:space="preserve">At the first start </w:t>
-      </w:r>
-      <w:r>
-        <w:t xml:space="preserve">of the program </w:t>
-      </w:r>
-      <w:r>
-        <w:t xml:space="preserve">after an update, </w:t>
-      </w:r>
-      <w:r>
-        <w:t xml:space="preserve">an option is shown </w:t>
-      </w:r>
-      <w:r>
-        <w:t>to see the 'Release notes'.</w:t>
-      </w:r>
-    </w:p>
-    <w:p>
-      <w:pPr>
-        <w:numPr>
-          <w:ilvl w:val="0"/>
-          <w:numId w:val="6"/>
-        </w:numPr>
-        <w:rPr>
-          <w:rFonts w:hint="eastAsia"/>
-        </w:rPr>
-      </w:pPr>
-      <w:r>
-        <w:t xml:space="preserve">Program settings split into user-dependent part and </w:t>
-      </w:r>
-      <w:r>
-        <w:t>computer</w:t>
-      </w:r>
-      <w:r>
-        <w:t xml:space="preserve">-dependent part. The old settings are migrated to the new settings files, then </w:t>
-      </w:r>
-      <w:r>
-        <w:t xml:space="preserve">the </w:t>
-      </w:r>
-      <w:r>
-        <w:t>old settings file is deleted.</w:t>
-      </w:r>
-    </w:p>
-    <w:p>
-      <w:pPr>
-        <w:numPr>
-          <w:ilvl w:val="0"/>
-          <w:numId w:val="6"/>
-        </w:numPr>
-        <w:rPr>
-          <w:rFonts w:hint="eastAsia"/>
-        </w:rPr>
-      </w:pPr>
-      <w:r>
-        <w:t xml:space="preserve">LocalOverrides.xml </w:t>
-      </w:r>
-      <w:r>
-        <w:t xml:space="preserve">file is automatically </w:t>
-      </w:r>
-      <w:r>
-        <w:t xml:space="preserve">moved from &lt;mydocuments&gt;\ModbusControl to %AppData%\Roaming\E.D.&amp;A\ModbusControl. Content from old is not migrated. Old </w:t>
-      </w:r>
-      <w:r>
-        <w:t>file</w:t>
-      </w:r>
-      <w:r>
-        <w:t xml:space="preserve"> is renamed with '.old' and moved to the </w:t>
-      </w:r>
-      <w:r>
-        <w:t xml:space="preserve">new </w:t>
-      </w:r>
-      <w:r>
-        <w:t>location. If overrides were used, the user will receive a notification.</w:t>
-      </w:r>
-    </w:p>
-    <w:p>
-      <w:pPr>
-        <w:numPr>
-          <w:ilvl w:val="0"/>
-          <w:numId w:val="6"/>
-        </w:numPr>
-        <w:rPr>
-          <w:rFonts w:hint="eastAsia"/>
-        </w:rPr>
-      </w:pPr>
-      <w:r>
-        <w:t>&lt;user&gt;\Documents\ModbusControl is no longer used.</w:t>
-      </w:r>
-    </w:p>
-    <w:p>
-      <w:pPr>
-        <w:pStyle w:val="Kop3"/>
-        <w:rPr>
-          <w:rFonts w:hint="eastAsia"/>
-        </w:rPr>
-      </w:pPr>
-      <w:r>
-        <w:t>Fixes</w:t>
-      </w:r>
-    </w:p>
-    <w:p>
-      <w:pPr>
-        <w:numPr>
-          <w:ilvl w:val="0"/>
-          <w:numId w:val="7"/>
-        </w:numPr>
-        <w:rPr>
-          <w:rFonts w:hint="eastAsia"/>
-        </w:rPr>
-      </w:pPr>
-      <w:r>
-        <w:t>The import/export dialogs now show '*. CSV' instead of '*. C</w:t>
-      </w:r>
-      <w:r>
-        <w:t>VS</w:t>
-      </w:r>
-      <w:r>
-        <w:t>'.</w:t>
-      </w:r>
-    </w:p>
-    <w:p>
-      <w:pPr>
-        <w:numPr>
-          <w:ilvl w:val="0"/>
-          <w:numId w:val="7"/>
-        </w:numPr>
-        <w:rPr>
-          <w:rFonts w:hint="eastAsia"/>
-        </w:rPr>
-      </w:pPr>
-      <w:r>
-        <w:t>Mbc file is now saved without BOM (</w:t>
-      </w:r>
-      <w:r>
-        <w:t>Unicode</w:t>
-      </w:r>
-      <w:r>
-        <w:t xml:space="preserve"> byte order mark).</w:t>
-      </w:r>
-    </w:p>
-    <w:p>
-      <w:pPr>
-        <w:numPr>
-          <w:ilvl w:val="0"/>
-          <w:numId w:val="7"/>
-        </w:numPr>
-        <w:rPr>
-          <w:rFonts w:hint="eastAsia"/>
-        </w:rPr>
-      </w:pPr>
-      <w:r>
-        <w:t xml:space="preserve">Better </w:t>
-      </w:r>
-      <w:r>
-        <w:t>handling</w:t>
-      </w:r>
-      <w:r>
-        <w:t xml:space="preserve"> if </w:t>
-      </w:r>
-      <w:r>
-        <w:t>a</w:t>
-      </w:r>
-      <w:r>
-        <w:t xml:space="preserve"> non-admin</w:t>
-      </w:r>
-      <w:r>
-        <w:t>istrator</w:t>
-      </w:r>
-      <w:r>
-        <w:t xml:space="preserve"> user logs </w:t>
-      </w:r>
-      <w:r>
-        <w:t xml:space="preserve">on </w:t>
-      </w:r>
-      <w:r>
-        <w:t>and uses ModbusControl.</w:t>
-      </w:r>
-    </w:p>
-    <w:p>
-      <w:pPr>
-        <w:pStyle w:val="Kop1"/>
-        <w:rPr>
-          <w:rFonts w:hint="eastAsia"/>
-        </w:rPr>
-      </w:pPr>
-      <w:r>
-        <w:t>v2.0.11 -- 2019-11-18</w:t>
-      </w:r>
-    </w:p>
-    <w:p>
-      <w:pPr>
-        <w:pStyle w:val="Kop3"/>
-        <w:rPr>
-          <w:rFonts w:hint="eastAsia"/>
-        </w:rPr>
-      </w:pPr>
-      <w:r>
-        <w:t>Fixes</w:t>
-      </w:r>
-    </w:p>
-    <w:p>
-      <w:pPr>
-        <w:numPr>
-          <w:ilvl w:val="0"/>
-          <w:numId w:val="8"/>
-        </w:numPr>
-        <w:rPr>
-          <w:rFonts w:hint="eastAsia"/>
-        </w:rPr>
-      </w:pPr>
-      <w:r>
-        <w:t xml:space="preserve">Better handling if the USB/serial connection is lost. In the past </w:t>
-      </w:r>
-      <w:r>
-        <w:t xml:space="preserve">the </w:t>
-      </w:r>
-      <w:r>
-        <w:t xml:space="preserve">program </w:t>
-      </w:r>
-      <w:r>
-        <w:t>could stop responding</w:t>
-      </w:r>
-      <w:r>
-        <w:t>.</w:t>
-      </w:r>
-    </w:p>
-    <w:p>
-      <w:pPr>
-        <w:pStyle w:val="Kop1"/>
-        <w:rPr>
-          <w:rFonts w:hint="eastAsia"/>
-        </w:rPr>
-      </w:pPr>
-      <w:r>
-        <w:t>v2.0.10 -- 2019-03-11</w:t>
-      </w:r>
-    </w:p>
-    <w:p>
-      <w:pPr>
-        <w:pStyle w:val="Kop3"/>
-        <w:rPr>
-          <w:rFonts w:hint="eastAsia"/>
-        </w:rPr>
-      </w:pPr>
-      <w:r>
-        <w:t>Features</w:t>
-      </w:r>
-    </w:p>
-    <w:p>
-      <w:pPr>
-        <w:numPr>
-          <w:ilvl w:val="0"/>
-          <w:numId w:val="8"/>
-        </w:numPr>
-        <w:rPr>
-          <w:rFonts w:hint="eastAsia"/>
-        </w:rPr>
-      </w:pPr>
-      <w:r>
-        <w:t>Added display</w:t>
-      </w:r>
-      <w:r>
-        <w:t>ing</w:t>
-      </w:r>
-      <w:r>
-        <w:t xml:space="preserve"> of enum </w:t>
-      </w:r>
-      <w:r>
-        <w:t xml:space="preserve">values </w:t>
-      </w:r>
-      <w:r>
-        <w:t xml:space="preserve">in the value column. </w:t>
-      </w:r>
-    </w:p>
-    <w:p>
-      <w:pPr>
-        <w:pStyle w:val="Kop3"/>
-        <w:rPr>
-          <w:rFonts w:hint="eastAsia"/>
-        </w:rPr>
-      </w:pPr>
-      <w:r>
-        <w:t>Fixes</w:t>
-      </w:r>
-    </w:p>
-    <w:p>
-      <w:pPr>
-        <w:numPr>
-          <w:ilvl w:val="0"/>
-          <w:numId w:val="8"/>
-        </w:numPr>
-        <w:rPr>
-          <w:rFonts w:hint="eastAsia"/>
-        </w:rPr>
-      </w:pPr>
-      <w:r>
-        <w:t xml:space="preserve">Menu </w:t>
-      </w:r>
-      <w:r>
-        <w:t xml:space="preserve">item </w:t>
-      </w:r>
-      <w:r>
-        <w:t xml:space="preserve">"Edit project file" did not work </w:t>
-      </w:r>
-      <w:r>
-        <w:t xml:space="preserve">correctly </w:t>
-      </w:r>
-      <w:r>
-        <w:t>if there was a space in the path.</w:t>
-      </w:r>
-    </w:p>
-    <w:p>
-      <w:pPr>
-        <w:numPr>
-          <w:ilvl w:val="0"/>
-          <w:numId w:val="8"/>
-        </w:numPr>
-        <w:rPr>
-          <w:rFonts w:hint="eastAsia"/>
-        </w:rPr>
-      </w:pPr>
-      <w:r>
-        <w:t>Logger: Clear button did not clear number of logs in the status bar.</w:t>
-      </w:r>
-    </w:p>
-    <w:p>
-      <w:pPr>
-        <w:numPr>
-          <w:ilvl w:val="0"/>
-          <w:numId w:val="8"/>
-        </w:numPr>
-        <w:rPr>
-          <w:rFonts w:hint="eastAsia"/>
-        </w:rPr>
-      </w:pPr>
-      <w:r>
-        <w:lastRenderedPageBreak/>
-        <w:t xml:space="preserve">Send Custom Modbus Command: allows tabs and CR/LF in the string. </w:t>
-      </w:r>
-      <w:r>
-        <w:t xml:space="preserve">Reports </w:t>
-      </w:r>
-      <w:r>
-        <w:t xml:space="preserve">error </w:t>
-      </w:r>
-      <w:r>
-        <w:t>for</w:t>
-      </w:r>
-      <w:r>
-        <w:t xml:space="preserve"> empty command string. </w:t>
-      </w:r>
-    </w:p>
-    <w:p>
-      <w:pPr>
-        <w:numPr>
-          <w:ilvl w:val="0"/>
-          <w:numId w:val="8"/>
-        </w:numPr>
-        <w:rPr>
-          <w:rFonts w:hint="eastAsia"/>
-        </w:rPr>
-      </w:pPr>
-      <w:r>
-        <w:t xml:space="preserve">Send Custom Modbus Command: </w:t>
-      </w:r>
-      <w:r>
-        <w:t>Reports</w:t>
-      </w:r>
-      <w:r>
-        <w:t xml:space="preserve"> error when command is too short, must be at least 2 bytes.</w:t>
-      </w:r>
-    </w:p>
-    <w:p>
-      <w:pPr>
-        <w:numPr>
-          <w:ilvl w:val="0"/>
-          <w:numId w:val="8"/>
-        </w:numPr>
-        <w:rPr>
-          <w:rFonts w:hint="eastAsia"/>
-        </w:rPr>
-      </w:pPr>
-      <w:r>
-        <w:t xml:space="preserve">Fix background </w:t>
-      </w:r>
-      <w:r>
-        <w:t>colour</w:t>
-      </w:r>
-      <w:r>
-        <w:t xml:space="preserve"> of registers.</w:t>
-      </w:r>
-    </w:p>
-    <w:p>
-      <w:pPr>
-        <w:pStyle w:val="Kop1"/>
-        <w:rPr>
-          <w:rFonts w:hint="eastAsia"/>
-        </w:rPr>
-      </w:pPr>
-      <w:r>
-        <w:t>v2.0.9 -- 2018-10-20</w:t>
-      </w:r>
-    </w:p>
-    <w:p>
-      <w:pPr>
-        <w:pStyle w:val="Kop3"/>
-        <w:rPr>
-          <w:rFonts w:hint="eastAsia"/>
-        </w:rPr>
-      </w:pPr>
-      <w:r>
-        <w:t>Features</w:t>
-      </w:r>
-    </w:p>
-    <w:p>
-      <w:pPr>
-        <w:numPr>
-          <w:ilvl w:val="0"/>
-          <w:numId w:val="9"/>
-        </w:numPr>
-        <w:rPr>
-          <w:rFonts w:hint="eastAsia"/>
-        </w:rPr>
-      </w:pPr>
-      <w:r>
-        <w:t>New option: "Move to next row on Enter".</w:t>
-      </w:r>
-    </w:p>
-    <w:p>
-      <w:pPr>
-        <w:numPr>
-          <w:ilvl w:val="0"/>
-          <w:numId w:val="9"/>
-        </w:numPr>
-        <w:rPr>
-          <w:rFonts w:hint="eastAsia"/>
-        </w:rPr>
-      </w:pPr>
-      <w:r>
-        <w:t xml:space="preserve">New option: "Auto-start edit mode on typing". </w:t>
-      </w:r>
-    </w:p>
-    <w:p>
-      <w:pPr>
-        <w:numPr>
-          <w:ilvl w:val="0"/>
-          <w:numId w:val="9"/>
-        </w:numPr>
-        <w:rPr>
-          <w:rFonts w:hint="eastAsia"/>
-        </w:rPr>
-      </w:pPr>
-      <w:r>
-        <w:t xml:space="preserve">New option: "Use custom editor". </w:t>
-      </w:r>
-    </w:p>
-    <w:p>
-      <w:pPr>
-        <w:numPr>
-          <w:ilvl w:val="0"/>
-          <w:numId w:val="9"/>
-        </w:numPr>
-        <w:rPr>
-          <w:rFonts w:hint="eastAsia"/>
-        </w:rPr>
-      </w:pPr>
-      <w:r>
-        <w:t>New option: "Ignore form size on project reload".</w:t>
-      </w:r>
-    </w:p>
-    <w:p>
-      <w:pPr>
-        <w:numPr>
-          <w:ilvl w:val="0"/>
-          <w:numId w:val="9"/>
-        </w:numPr>
-        <w:rPr>
-          <w:rFonts w:hint="eastAsia"/>
-        </w:rPr>
-      </w:pPr>
-      <w:r>
-        <w:t>Config</w:t>
-      </w:r>
-      <w:r>
-        <w:t>uration</w:t>
-      </w:r>
-      <w:r>
-        <w:t xml:space="preserve"> form now has an Apply button.</w:t>
-      </w:r>
-    </w:p>
-    <w:p>
-      <w:pPr>
-        <w:numPr>
-          <w:ilvl w:val="0"/>
-          <w:numId w:val="9"/>
-        </w:numPr>
-        <w:rPr>
-          <w:rFonts w:hint="eastAsia"/>
-        </w:rPr>
-      </w:pPr>
-      <w:r>
-        <w:t xml:space="preserve">Separate line-copy and value-copy </w:t>
-      </w:r>
-      <w:r>
-        <w:t xml:space="preserve">capability </w:t>
-      </w:r>
-      <w:r>
-        <w:t xml:space="preserve">in grid, </w:t>
-      </w:r>
-      <w:r>
-        <w:t>using</w:t>
-      </w:r>
-      <w:r>
-        <w:t xml:space="preserve"> control-C and context menu.</w:t>
-      </w:r>
-    </w:p>
-    <w:p>
-      <w:pPr>
-        <w:numPr>
-          <w:ilvl w:val="0"/>
-          <w:numId w:val="9"/>
-        </w:numPr>
-        <w:rPr>
-          <w:rFonts w:hint="eastAsia"/>
-        </w:rPr>
-      </w:pPr>
-      <w:r>
-        <w:t xml:space="preserve">The status bar now </w:t>
-      </w:r>
-      <w:r>
-        <w:t xml:space="preserve">has </w:t>
-      </w:r>
-      <w:r>
-        <w:t xml:space="preserve">blue </w:t>
-      </w:r>
-      <w:r>
-        <w:t xml:space="preserve">colour </w:t>
-      </w:r>
-      <w:r>
-        <w:t>if there is no connection or no polling is done.</w:t>
-      </w:r>
-    </w:p>
-    <w:p>
-      <w:pPr>
-        <w:numPr>
-          <w:ilvl w:val="0"/>
-          <w:numId w:val="9"/>
-        </w:numPr>
-        <w:rPr>
-          <w:rFonts w:hint="eastAsia"/>
-        </w:rPr>
-      </w:pPr>
-      <w:r>
-        <w:t xml:space="preserve">The status bar </w:t>
-      </w:r>
-      <w:r>
-        <w:t xml:space="preserve">now has red colour </w:t>
-      </w:r>
-      <w:r>
-        <w:t>for errors.</w:t>
-      </w:r>
-    </w:p>
-    <w:p>
-      <w:pPr>
-        <w:numPr>
-          <w:ilvl w:val="0"/>
-          <w:numId w:val="9"/>
-        </w:numPr>
-        <w:rPr>
-          <w:rFonts w:hint="eastAsia"/>
-        </w:rPr>
-      </w:pPr>
-      <w:r>
-        <w:t xml:space="preserve">Now </w:t>
-      </w:r>
-      <w:r>
-        <w:t>shows</w:t>
-      </w:r>
-      <w:r>
-        <w:t xml:space="preserve"> a warning in the "Save configuration to project file" and "Project configuration" screens if localoverrides </w:t>
-      </w:r>
-      <w:r>
-        <w:t>were</w:t>
-      </w:r>
-      <w:r>
-        <w:t xml:space="preserve"> used.</w:t>
-      </w:r>
-    </w:p>
-    <w:p>
-      <w:pPr>
-        <w:pStyle w:val="Kop3"/>
-        <w:rPr>
-          <w:rFonts w:hint="eastAsia"/>
-        </w:rPr>
-      </w:pPr>
-      <w:r>
-        <w:t>Fixes</w:t>
-      </w:r>
-    </w:p>
-    <w:p>
-      <w:pPr>
-        <w:numPr>
-          <w:ilvl w:val="0"/>
-          <w:numId w:val="10"/>
-        </w:numPr>
-        <w:rPr>
-          <w:rFonts w:hint="eastAsia"/>
-        </w:rPr>
-      </w:pPr>
-      <w:r>
-        <w:t xml:space="preserve">Notification </w:t>
-      </w:r>
-      <w:r>
-        <w:t>if Settings.xml could not be loaded at startup.</w:t>
-      </w:r>
-    </w:p>
-    <w:p>
-      <w:pPr>
-        <w:numPr>
-          <w:ilvl w:val="0"/>
-          <w:numId w:val="10"/>
-        </w:numPr>
-        <w:rPr>
-          <w:rFonts w:hint="eastAsia"/>
-        </w:rPr>
-      </w:pPr>
-      <w:r>
-        <w:t xml:space="preserve">Settings.xml </w:t>
-      </w:r>
-      <w:r>
-        <w:t xml:space="preserve">writing now </w:t>
-      </w:r>
-      <w:r>
-        <w:t>update</w:t>
-      </w:r>
-      <w:r>
-        <w:t>s</w:t>
-      </w:r>
-      <w:r>
-        <w:t>/insert</w:t>
-      </w:r>
-      <w:r>
-        <w:t>s</w:t>
-      </w:r>
-      <w:r>
-        <w:t xml:space="preserve"> </w:t>
-      </w:r>
-      <w:r>
-        <w:t>al</w:t>
-      </w:r>
-      <w:r>
-        <w:t xml:space="preserve">l tags in the </w:t>
-      </w:r>
-      <w:r>
-        <w:t xml:space="preserve">existing </w:t>
-      </w:r>
-      <w:r>
-        <w:t>file instead of writing a completely new file, so that any newer tags from a newer version remain.</w:t>
-      </w:r>
-    </w:p>
-    <w:p>
-      <w:pPr>
-        <w:numPr>
-          <w:ilvl w:val="0"/>
-          <w:numId w:val="10"/>
-        </w:numPr>
-        <w:rPr>
-          <w:rFonts w:hint="eastAsia"/>
-        </w:rPr>
-      </w:pPr>
-      <w:r>
-        <w:t>Project Configuration: Interframe-delay: now shows "0 (auto)" at setting 0.</w:t>
-      </w:r>
-    </w:p>
-    <w:p>
-      <w:pPr>
-        <w:numPr>
-          <w:ilvl w:val="0"/>
-          <w:numId w:val="10"/>
-        </w:numPr>
-        <w:rPr>
-          <w:rFonts w:hint="eastAsia"/>
-        </w:rPr>
-      </w:pPr>
-      <w:r>
-        <w:t xml:space="preserve">Local override project </w:t>
-      </w:r>
-      <w:r>
         <w:t xml:space="preserve">is </w:t>
       </w:r>
       <w:r>
-        <w:t xml:space="preserve">no longer </w:t>
-      </w:r>
-      <w:r>
-        <w:t xml:space="preserve">required to have a </w:t>
-      </w:r>
-      <w:r>
-        <w:t>&lt;modbus&gt; element.</w:t>
-      </w:r>
-    </w:p>
-    <w:p>
-      <w:pPr>
-        <w:numPr>
-          <w:ilvl w:val="0"/>
-          <w:numId w:val="10"/>
-        </w:numPr>
-        <w:rPr>
-          <w:rFonts w:hint="eastAsia"/>
-        </w:rPr>
-      </w:pPr>
-      <w:r>
-        <w:t>Dialog forms can now be closed with the Enter key.</w:t>
-      </w:r>
-    </w:p>
-    <w:p>
-      <w:pPr>
-        <w:numPr>
-          <w:ilvl w:val="0"/>
-          <w:numId w:val="10"/>
-        </w:numPr>
-        <w:rPr>
-          <w:rFonts w:hint="eastAsia"/>
-        </w:rPr>
-      </w:pPr>
-      <w:r>
-        <w:t xml:space="preserve">The </w:t>
-      </w:r>
-      <w:r>
-        <w:t>checkboxes of the "Save configuration to project file" form</w:t>
-      </w:r>
-      <w:r>
-        <w:t xml:space="preserve"> are now cleared when loading a project.</w:t>
-      </w:r>
-    </w:p>
-    <w:p>
-      <w:pPr>
-        <w:numPr>
-          <w:ilvl w:val="0"/>
-          <w:numId w:val="10"/>
-        </w:numPr>
-        <w:rPr>
-          <w:rFonts w:hint="eastAsia"/>
-        </w:rPr>
-      </w:pPr>
-      <w:r>
-        <w:t xml:space="preserve">Buttons at the bottom of the forms now have </w:t>
-      </w:r>
-      <w:r>
-        <w:t>better spacing</w:t>
-      </w:r>
-      <w:r>
-        <w:t>.</w:t>
-      </w:r>
-    </w:p>
-    <w:p>
-      <w:pPr>
-        <w:pStyle w:val="Kop1"/>
-        <w:rPr>
-          <w:rFonts w:hint="eastAsia"/>
-        </w:rPr>
-      </w:pPr>
-      <w:r>
-        <w:t>v2.0.8 -- 2018-08-02</w:t>
-      </w:r>
-    </w:p>
-    <w:p>
-      <w:pPr>
-        <w:pStyle w:val="Kop3"/>
-        <w:rPr>
-          <w:rFonts w:hint="eastAsia"/>
-        </w:rPr>
-      </w:pPr>
-      <w:r>
-        <w:t>Features</w:t>
+        <w:t xml:space="preserve">separately </w:t>
+      </w:r>
+      <w:r>
+        <w:t>configurable</w:t>
+      </w:r>
+      <w:r>
+        <w:t xml:space="preserve"> for int32 and float32. </w:t>
+      </w:r>
+      <w:r>
+        <w:t>Character</w:t>
+      </w:r>
+      <w:r>
+        <w:t xml:space="preserve"> order </w:t>
+      </w:r>
+      <w:r>
+        <w:t xml:space="preserve">is configurable </w:t>
+      </w:r>
+      <w:r>
+        <w:t xml:space="preserve">for ASCII. </w:t>
       </w:r>
     </w:p>
     <w:p>
@@ -2472,183 +2882,13 @@
           <w:rFonts w:hint="eastAsia"/>
         </w:rPr>
       </w:pPr>
-      <w:r>
-        <w:t xml:space="preserve">Added </w:t>
-      </w:r>
-      <w:r>
-        <w:t>menus and toolbar.</w:t>
-      </w:r>
-    </w:p>
-    <w:p>
-      <w:pPr>
-        <w:numPr>
-          <w:ilvl w:val="0"/>
-          <w:numId w:val="11"/>
-        </w:numPr>
-        <w:rPr>
-          <w:rFonts w:hint="eastAsia"/>
-        </w:rPr>
-      </w:pPr>
-      <w:r>
-        <w:t xml:space="preserve">Can save project configuration, bridge settings and form size in mbc file. </w:t>
-      </w:r>
-    </w:p>
-    <w:p>
-      <w:pPr>
-        <w:numPr>
-          <w:ilvl w:val="0"/>
-          <w:numId w:val="11"/>
-        </w:numPr>
-        <w:rPr>
-          <w:rFonts w:hint="eastAsia"/>
-        </w:rPr>
-      </w:pPr>
-      <w:r>
-        <w:t xml:space="preserve">Communication </w:t>
-      </w:r>
-      <w:r>
-        <w:t>pausing</w:t>
-      </w:r>
-      <w:r>
-        <w:t xml:space="preserve"> and poll-once.</w:t>
-      </w:r>
-    </w:p>
-    <w:p>
-      <w:pPr>
-        <w:numPr>
-          <w:ilvl w:val="0"/>
-          <w:numId w:val="11"/>
-        </w:numPr>
-        <w:rPr>
-          <w:rFonts w:hint="eastAsia"/>
-        </w:rPr>
-      </w:pPr>
-      <w:r>
-        <w:t>C</w:t>
-      </w:r>
-      <w:r>
-        <w:t>hange the connection parameters without having to close and reopen the port.</w:t>
-      </w:r>
-    </w:p>
-    <w:p>
-      <w:pPr>
-        <w:numPr>
-          <w:ilvl w:val="0"/>
-          <w:numId w:val="11"/>
-        </w:numPr>
-        <w:rPr>
-          <w:rFonts w:hint="eastAsia"/>
-        </w:rPr>
-      </w:pPr>
-      <w:r>
-        <w:t xml:space="preserve">If the serial port is not available at start, you can </w:t>
-      </w:r>
-      <w:r>
-        <w:t>immediately</w:t>
-      </w:r>
-      <w:r>
-        <w:t xml:space="preserve"> choose another </w:t>
-      </w:r>
-      <w:r>
-        <w:t>port</w:t>
-      </w:r>
-      <w:r>
-        <w:t>.</w:t>
-      </w:r>
-    </w:p>
-    <w:p>
-      <w:pPr>
-        <w:numPr>
-          <w:ilvl w:val="0"/>
-          <w:numId w:val="11"/>
-        </w:numPr>
-        <w:rPr>
-          <w:rFonts w:hint="eastAsia"/>
-        </w:rPr>
-      </w:pPr>
-      <w:r>
-        <w:t>M</w:t>
-      </w:r>
-      <w:r>
-        <w:t xml:space="preserve">bc project file: XML tags </w:t>
-      </w:r>
-      <w:r>
-        <w:t xml:space="preserve">are </w:t>
-      </w:r>
-      <w:r>
-        <w:t xml:space="preserve">now preferably in lowercase. The old camelcase is also still accepted. </w:t>
-      </w:r>
-    </w:p>
-    <w:p>
-      <w:pPr>
-        <w:numPr>
-          <w:ilvl w:val="0"/>
-          <w:numId w:val="11"/>
-        </w:numPr>
-        <w:rPr>
-          <w:rFonts w:hint="eastAsia"/>
-        </w:rPr>
-      </w:pPr>
-      <w:r>
-        <w:t>Always shows line numbers f</w:t>
-      </w:r>
-      <w:r>
-        <w:t xml:space="preserve">or errors in mbc file. </w:t>
-      </w:r>
-    </w:p>
-    <w:p>
-      <w:pPr>
-        <w:numPr>
-          <w:ilvl w:val="0"/>
-          <w:numId w:val="11"/>
-        </w:numPr>
-        <w:rPr>
-          <w:rFonts w:hint="eastAsia"/>
-        </w:rPr>
-      </w:pPr>
-      <w:r>
-        <w:t>Word order (endian)</w:t>
-      </w:r>
-      <w:r>
-        <w:t xml:space="preserve"> </w:t>
-      </w:r>
-      <w:r>
-        <w:t xml:space="preserve">is </w:t>
-      </w:r>
-      <w:r>
-        <w:t xml:space="preserve">separately </w:t>
-      </w:r>
-      <w:r>
-        <w:t>configurable</w:t>
-      </w:r>
-      <w:r>
-        <w:t xml:space="preserve"> for int32 and float32. </w:t>
-      </w:r>
-      <w:r>
-        <w:t>Character</w:t>
-      </w:r>
-      <w:r>
-        <w:t xml:space="preserve"> order </w:t>
-      </w:r>
-      <w:r>
-        <w:t xml:space="preserve">is configurable </w:t>
-      </w:r>
-      <w:r>
-        <w:t xml:space="preserve">for ASCII. </w:t>
-      </w:r>
-    </w:p>
-    <w:p>
-      <w:pPr>
-        <w:numPr>
-          <w:ilvl w:val="0"/>
-          <w:numId w:val="11"/>
-        </w:numPr>
-        <w:rPr>
-          <w:rFonts w:hint="eastAsia"/>
-        </w:rPr>
-      </w:pPr>
-      <w:r>
-        <w:t>WriteHoldingregFunctionCode now also supports 'auto'.</w:t>
+      <w:proofErr w:type="spellStart"/>
+      <w:r>
+        <w:t>WriteHoldingregFunctionCode</w:t>
+      </w:r>
+      <w:proofErr w:type="spellEnd"/>
+      <w:r>
+        <w:t xml:space="preserve"> now also supports 'auto'.</w:t>
       </w:r>
     </w:p>
     <w:p>
@@ -3269,7 +3509,7 @@
         <w:rFonts w:ascii="Symbol" w:hAnsi="Symbol" w:hint="default"/>
       </w:rPr>
     </w:lvl>
-    <w:lvl w:ilvl="1" w:tplc="08130003" w:tentative="1">
+    <w:lvl w:ilvl="1" w:tplc="08130003">
       <w:start w:val="1"/>
       <w:numFmt w:val="bullet"/>
       <w:lvlText w:val="o"/>
@@ -6297,7 +6537,6 @@
   <w:style w:type="character" w:default="1" w:styleId="Standaardalinea-lettertype">
     <w:name w:val="Default Paragraph Font"/>
     <w:uiPriority w:val="1"/>
-    <w:semiHidden/>
     <w:unhideWhenUsed/>
   </w:style>
   <w:style w:type="table" w:default="1" w:styleId="Standaardtabel">

</xml_diff>

<commit_message>
ModbusImport.exe and ModbusExport.exe now also have "Prefer 32-bit" disabled.
git-svn-id: http://visualsvn.edna.local/EDNA/ModbusControl/V2@4894 03c8d257-35a7-c645-9f01-50f27e98b9e6
</commit_message>
<xml_diff>
--- a/Manuals/ModbusControl - Release notes.docx
+++ b/Manuals/ModbusControl - Release notes.docx
@@ -70,6 +70,9 @@
           <w:ilvl w:val="0"/>
           <w:numId w:val="4"/>
         </w:numPr>
+        <w:rPr>
+          <w:rFonts w:hint="eastAsia"/>
+        </w:rPr>
       </w:pPr>
       <w:r>
         <w:t>You can now open the enum dropdown to view the list of enum values if there is no connection open or the register is read-only.</w:t>
@@ -96,6 +99,9 @@
           <w:ilvl w:val="0"/>
           <w:numId w:val="4"/>
         </w:numPr>
+        <w:rPr>
+          <w:rFonts w:hint="eastAsia"/>
+        </w:rPr>
       </w:pPr>
       <w:r>
         <w:t>Error codes changes:</w:t>
@@ -108,6 +114,9 @@
           <w:ilvl w:val="1"/>
           <w:numId w:val="4"/>
         </w:numPr>
+        <w:rPr>
+          <w:rFonts w:hint="eastAsia"/>
+        </w:rPr>
       </w:pPr>
       <w:r>
         <w:t>Error</w:t>
@@ -138,6 +147,9 @@
           <w:ilvl w:val="1"/>
           <w:numId w:val="4"/>
         </w:numPr>
+        <w:rPr>
+          <w:rFonts w:hint="eastAsia"/>
+        </w:rPr>
       </w:pPr>
       <w:r>
         <w:rPr>
@@ -162,6 +174,9 @@
           <w:ilvl w:val="1"/>
           <w:numId w:val="4"/>
         </w:numPr>
+        <w:rPr>
+          <w:rFonts w:hint="eastAsia"/>
+        </w:rPr>
       </w:pPr>
       <w:r>
         <w:t>Error</w:t>
@@ -233,14 +248,12 @@
         <w:br/>
         <w:t>-</w:t>
       </w:r>
-      <w:proofErr w:type="spellStart"/>
       <w:r>
         <w:rPr>
           <w:rFonts w:hint="eastAsia"/>
         </w:rPr>
         <w:t>continueonerror</w:t>
       </w:r>
-      <w:proofErr w:type="spellEnd"/>
       <w:r>
         <w:t xml:space="preserve"> options.</w:t>
       </w:r>
@@ -350,28 +363,53 @@
           <w:ilvl w:val="0"/>
           <w:numId w:val="4"/>
         </w:numPr>
-        <w:rPr>
-          <w:rFonts w:hint="eastAsia"/>
-        </w:rPr>
-      </w:pPr>
-      <w:r>
-        <w:t xml:space="preserve">When editing an enum value one could cause an exception with key sequences like: </w:t>
-      </w:r>
-      <w:proofErr w:type="spellStart"/>
-      <w:r>
-        <w:t>numlock</w:t>
-      </w:r>
-      <w:proofErr w:type="spellEnd"/>
-      <w:r>
-        <w:t xml:space="preserve"> on, enter edit, backspace to erase all, </w:t>
-      </w:r>
-      <w:proofErr w:type="spellStart"/>
-      <w:r>
-        <w:t>numlock</w:t>
-      </w:r>
-      <w:proofErr w:type="spellEnd"/>
-      <w:r>
-        <w:t xml:space="preserve"> off, Enter.  Or like: enter edit, backspace 3 times, Enter.  </w:t>
+      </w:pPr>
+      <w:r>
+        <w:t xml:space="preserve">When editing an enum value one could cause an exception with key sequences like: numlock on, enter edit, backspace to erase all, numlock off, Enter.  Or like: enter edit, backspace 3 times, Enter.  </w:t>
+      </w:r>
+    </w:p>
+    <w:p>
+      <w:pPr>
+        <w:numPr>
+          <w:ilvl w:val="0"/>
+          <w:numId w:val="4"/>
+        </w:numPr>
+        <w:rPr>
+          <w:rFonts w:hint="eastAsia"/>
+        </w:rPr>
+      </w:pPr>
+      <w:r>
+        <w:rPr>
+          <w:rFonts w:hint="eastAsia"/>
+        </w:rPr>
+        <w:t xml:space="preserve">ModbusImport.exe </w:t>
+      </w:r>
+      <w:r>
+        <w:t>end</w:t>
+      </w:r>
+      <w:r>
+        <w:rPr>
+          <w:rFonts w:hint="eastAsia"/>
+        </w:rPr>
+        <w:t xml:space="preserve"> ModbusExport.exe </w:t>
+      </w:r>
+      <w:r>
+        <w:t>now have the</w:t>
+      </w:r>
+      <w:r>
+        <w:rPr>
+          <w:rFonts w:hint="eastAsia"/>
+        </w:rPr>
+        <w:t xml:space="preserve"> "Prefer 32-bit" </w:t>
+      </w:r>
+      <w:r>
+        <w:t xml:space="preserve">build </w:t>
+      </w:r>
+      <w:r>
+        <w:t>o</w:t>
+      </w:r>
+      <w:r>
+        <w:t>ption disabled.</w:t>
       </w:r>
     </w:p>
     <w:p>
@@ -516,15 +554,7 @@
         </w:rPr>
       </w:pPr>
       <w:r>
-        <w:t>Mbc file: &lt;</w:t>
-      </w:r>
-      <w:proofErr w:type="spellStart"/>
-      <w:r>
-        <w:t>exportorder</w:t>
-      </w:r>
-      <w:proofErr w:type="spellEnd"/>
-      <w:r>
-        <w:t>&gt; element added.</w:t>
+        <w:t>Mbc file: &lt;exportorder&gt; element added.</w:t>
       </w:r>
     </w:p>
     <w:p>
@@ -618,14 +648,12 @@
           <w:rFonts w:hint="eastAsia"/>
         </w:rPr>
       </w:pPr>
-      <w:proofErr w:type="spellStart"/>
       <w:r>
         <w:rPr>
           <w:rFonts w:hint="eastAsia"/>
         </w:rPr>
         <w:t>WriteHoldingregisterFC</w:t>
       </w:r>
-      <w:proofErr w:type="spellEnd"/>
       <w:r>
         <w:t xml:space="preserve"> </w:t>
       </w:r>
@@ -700,7 +728,11 @@
         <w:t xml:space="preserve">arlier versions </w:t>
       </w:r>
       <w:r>
-        <w:t xml:space="preserve">first scanned the file for errors, </w:t>
+        <w:t xml:space="preserve">first scanned the </w:t>
+      </w:r>
+      <w:r>
+        <w:lastRenderedPageBreak/>
+        <w:t xml:space="preserve">file for errors, </w:t>
       </w:r>
       <w:r>
         <w:t>then started import which could report more errors.</w:t>
@@ -728,8 +760,853 @@
         </w:rPr>
       </w:pPr>
       <w:r>
+        <w:t>v2.0.15 – 2023-06-24</w:t>
+      </w:r>
+    </w:p>
+    <w:p>
+      <w:pPr>
+        <w:pStyle w:val="Kop3"/>
+        <w:numPr>
+          <w:ilvl w:val="0"/>
+          <w:numId w:val="0"/>
+        </w:numPr>
+        <w:ind w:left="680" w:hanging="431"/>
+        <w:rPr>
+          <w:rFonts w:hint="eastAsia"/>
+        </w:rPr>
+      </w:pPr>
+      <w:r>
+        <w:rPr>
+          <w:rFonts w:hint="eastAsia"/>
+        </w:rPr>
+        <w:t>Features</w:t>
+      </w:r>
+    </w:p>
+    <w:p>
+      <w:pPr>
+        <w:pStyle w:val="Lijstalinea"/>
+        <w:numPr>
+          <w:ilvl w:val="0"/>
+          <w:numId w:val="4"/>
+        </w:numPr>
+        <w:rPr>
+          <w:rFonts w:hint="eastAsia"/>
+        </w:rPr>
+      </w:pPr>
+      <w:r>
+        <w:rPr>
+          <w:rFonts w:hint="eastAsia"/>
+        </w:rPr>
+        <w:t>Enum registers editing now has a dropdown combobox with possible values.</w:t>
+      </w:r>
+    </w:p>
+    <w:p>
+      <w:pPr>
+        <w:pStyle w:val="Lijstalinea"/>
+        <w:numPr>
+          <w:ilvl w:val="0"/>
+          <w:numId w:val="4"/>
+        </w:numPr>
+        <w:rPr>
+          <w:rFonts w:hint="eastAsia"/>
+        </w:rPr>
+      </w:pPr>
+      <w:r>
+        <w:rPr>
+          <w:rFonts w:hint="eastAsia"/>
+        </w:rPr>
+        <w:t>Mbc file: Enum values now allow a cu</w:t>
+      </w:r>
+      <w:r>
+        <w:t>s</w:t>
+      </w:r>
+      <w:r>
+        <w:rPr>
+          <w:rFonts w:hint="eastAsia"/>
+        </w:rPr>
+        <w:t xml:space="preserve">tom &lt;else&gt; </w:t>
+      </w:r>
+      <w:r>
+        <w:t>text</w:t>
+      </w:r>
+      <w:r>
+        <w:rPr>
+          <w:rFonts w:hint="eastAsia"/>
+        </w:rPr>
+        <w:t xml:space="preserve"> that is shown if no value matches. </w:t>
+      </w:r>
+      <w:r>
+        <w:t>&lt;else&gt; text can be left empty to suppress the message.</w:t>
+      </w:r>
+    </w:p>
+    <w:p>
+      <w:pPr>
+        <w:pStyle w:val="Lijstalinea"/>
+        <w:numPr>
+          <w:ilvl w:val="0"/>
+          <w:numId w:val="4"/>
+        </w:numPr>
+        <w:rPr>
+          <w:rFonts w:hint="eastAsia"/>
+        </w:rPr>
+      </w:pPr>
+      <w:r>
+        <w:rPr>
+          <w:rFonts w:hint="eastAsia"/>
+        </w:rPr>
+        <w:t xml:space="preserve">You can now use </w:t>
+      </w:r>
+      <w:r>
+        <w:t xml:space="preserve">5 digits and 6 digits </w:t>
+      </w:r>
+      <w:r>
+        <w:rPr>
+          <w:rFonts w:hint="eastAsia"/>
+        </w:rPr>
+        <w:t>registers numbering scheme</w:t>
+      </w:r>
+      <w:r>
+        <w:t>,</w:t>
+      </w:r>
+      <w:r>
+        <w:rPr>
+          <w:rFonts w:hint="eastAsia"/>
+        </w:rPr>
+        <w:t xml:space="preserve"> 40001-49999 and 400001-465536</w:t>
+      </w:r>
+      <w:r>
+        <w:t xml:space="preserve">, or </w:t>
+      </w:r>
+      <w:r>
+        <w:rPr>
+          <w:rFonts w:hint="eastAsia"/>
+        </w:rPr>
+        <w:t>40000-49999 and 400000-465535</w:t>
+      </w:r>
+      <w:r>
+        <w:t xml:space="preserve">, </w:t>
+      </w:r>
+      <w:r>
+        <w:rPr>
+          <w:rFonts w:hint="eastAsia"/>
+        </w:rPr>
+        <w:t xml:space="preserve">at the same time. </w:t>
+      </w:r>
+    </w:p>
+    <w:p>
+      <w:pPr>
+        <w:pStyle w:val="Kop3"/>
+        <w:numPr>
+          <w:ilvl w:val="0"/>
+          <w:numId w:val="0"/>
+        </w:numPr>
+        <w:ind w:left="680" w:hanging="431"/>
+        <w:rPr>
+          <w:rFonts w:hint="eastAsia"/>
+        </w:rPr>
+      </w:pPr>
+      <w:r>
+        <w:rPr>
+          <w:rFonts w:hint="eastAsia"/>
+        </w:rPr>
+        <w:t>Fixes</w:t>
+      </w:r>
+    </w:p>
+    <w:p>
+      <w:pPr>
+        <w:pStyle w:val="Lijstalinea"/>
+        <w:numPr>
+          <w:ilvl w:val="0"/>
+          <w:numId w:val="4"/>
+        </w:numPr>
+        <w:rPr>
+          <w:rFonts w:hint="eastAsia"/>
+        </w:rPr>
+      </w:pPr>
+      <w:r>
+        <w:t xml:space="preserve">In Import_file and Import_compare: writing/comparing a float32 </w:t>
+      </w:r>
+      <w:r>
+        <w:t xml:space="preserve">value </w:t>
+      </w:r>
+      <w:r>
+        <w:t>no longer worked.</w:t>
+      </w:r>
+    </w:p>
+    <w:p>
+      <w:pPr>
+        <w:pStyle w:val="Lijstalinea"/>
+        <w:numPr>
+          <w:ilvl w:val="0"/>
+          <w:numId w:val="4"/>
+        </w:numPr>
+        <w:rPr>
+          <w:rFonts w:hint="eastAsia"/>
+        </w:rPr>
+      </w:pPr>
+      <w:r>
+        <w:rPr>
+          <w:rFonts w:hint="eastAsia"/>
+        </w:rPr>
+        <w:t xml:space="preserve">Ascii32 register writing </w:t>
+      </w:r>
+      <w:r>
+        <w:t>fixed.</w:t>
+      </w:r>
+    </w:p>
+    <w:p>
+      <w:pPr>
+        <w:pStyle w:val="Lijstalinea"/>
+        <w:numPr>
+          <w:ilvl w:val="0"/>
+          <w:numId w:val="4"/>
+        </w:numPr>
+        <w:rPr>
+          <w:rFonts w:hint="eastAsia"/>
+        </w:rPr>
+      </w:pPr>
+      <w:r>
+        <w:rPr>
+          <w:rFonts w:hint="eastAsia"/>
+        </w:rPr>
+        <w:t xml:space="preserve">Resizing column width is now </w:t>
+      </w:r>
+      <w:r>
+        <w:t>global for all tabs</w:t>
+      </w:r>
+      <w:r>
+        <w:rPr>
+          <w:rFonts w:hint="eastAsia"/>
+        </w:rPr>
+        <w:t>.</w:t>
+      </w:r>
+    </w:p>
+    <w:p>
+      <w:pPr>
+        <w:pStyle w:val="Lijstalinea"/>
+        <w:numPr>
+          <w:ilvl w:val="0"/>
+          <w:numId w:val="4"/>
+        </w:numPr>
+        <w:rPr>
+          <w:rFonts w:hint="eastAsia"/>
+        </w:rPr>
+      </w:pPr>
+      <w:r>
+        <w:rPr>
+          <w:rFonts w:hint="eastAsia"/>
+        </w:rPr>
+        <w:t>Zoom</w:t>
+      </w:r>
+      <w:r>
+        <w:t>ing</w:t>
+      </w:r>
+      <w:r>
+        <w:rPr>
+          <w:rFonts w:hint="eastAsia"/>
+        </w:rPr>
+        <w:t xml:space="preserve"> now also adjusts the size of the column headers.</w:t>
+      </w:r>
+    </w:p>
+    <w:p>
+      <w:pPr>
+        <w:pStyle w:val="Lijstalinea"/>
+        <w:numPr>
+          <w:ilvl w:val="0"/>
+          <w:numId w:val="4"/>
+        </w:numPr>
+        <w:rPr>
+          <w:rFonts w:hint="eastAsia"/>
+        </w:rPr>
+      </w:pPr>
+      <w:r>
+        <w:rPr>
+          <w:rFonts w:hint="eastAsia"/>
+        </w:rPr>
+        <w:t>You can now close the [Project_Configuration], [Save_project_file] and [About] forms with the ESC button</w:t>
+      </w:r>
+      <w:r>
+        <w:t xml:space="preserve"> too</w:t>
+      </w:r>
+      <w:r>
+        <w:rPr>
+          <w:rFonts w:hint="eastAsia"/>
+        </w:rPr>
+        <w:t>.</w:t>
+      </w:r>
+    </w:p>
+    <w:p>
+      <w:pPr>
+        <w:pStyle w:val="Lijstalinea"/>
+        <w:numPr>
+          <w:ilvl w:val="0"/>
+          <w:numId w:val="4"/>
+        </w:numPr>
+        <w:rPr>
+          <w:rFonts w:hint="eastAsia"/>
+        </w:rPr>
+      </w:pPr>
+      <w:r>
+        <w:rPr>
+          <w:rFonts w:hint="eastAsia"/>
+        </w:rPr>
+        <w:t>The expand/collapse icons scale with zoom</w:t>
+      </w:r>
+      <w:r>
+        <w:t>ing</w:t>
+      </w:r>
+      <w:r>
+        <w:rPr>
+          <w:rFonts w:hint="eastAsia"/>
+        </w:rPr>
+        <w:t>.</w:t>
+      </w:r>
+    </w:p>
+    <w:p>
+      <w:pPr>
+        <w:pStyle w:val="Lijstalinea"/>
+        <w:numPr>
+          <w:ilvl w:val="0"/>
+          <w:numId w:val="4"/>
+        </w:numPr>
+        <w:rPr>
+          <w:rFonts w:hint="eastAsia"/>
+        </w:rPr>
+      </w:pPr>
+      <w:r>
+        <w:rPr>
+          <w:rFonts w:hint="eastAsia"/>
+        </w:rPr>
+        <w:t>If an error occurs when loading an mbc file, no auto-connect to the slave/server is done.</w:t>
+      </w:r>
+    </w:p>
+    <w:p>
+      <w:pPr>
+        <w:pStyle w:val="Lijstalinea"/>
+        <w:numPr>
+          <w:ilvl w:val="0"/>
+          <w:numId w:val="4"/>
+        </w:numPr>
+        <w:rPr>
+          <w:rFonts w:hint="eastAsia"/>
+        </w:rPr>
+      </w:pPr>
+      <w:r>
+        <w:rPr>
+          <w:rFonts w:hint="eastAsia"/>
+        </w:rPr>
+        <w:t>With Import_file and Import_compare: writing/compar</w:t>
+      </w:r>
+      <w:r>
+        <w:t>ing</w:t>
+      </w:r>
+      <w:r>
+        <w:rPr>
+          <w:rFonts w:hint="eastAsia"/>
+        </w:rPr>
+        <w:t xml:space="preserve"> a float32 </w:t>
+      </w:r>
+      <w:r>
+        <w:t>is fixed</w:t>
+      </w:r>
+      <w:r>
+        <w:rPr>
+          <w:rFonts w:hint="eastAsia"/>
+        </w:rPr>
+        <w:t>.</w:t>
+      </w:r>
+    </w:p>
+    <w:p>
+      <w:pPr>
+        <w:pStyle w:val="Kop1"/>
+        <w:rPr>
+          <w:rFonts w:hint="eastAsia"/>
+        </w:rPr>
+      </w:pPr>
+      <w:r>
+        <w:t>v2.0.14 -- 2022-11-08</w:t>
+      </w:r>
+    </w:p>
+    <w:p>
+      <w:pPr>
+        <w:pStyle w:val="Kop3"/>
+        <w:rPr>
+          <w:rFonts w:hint="eastAsia"/>
+        </w:rPr>
+      </w:pPr>
+      <w:r>
+        <w:t>Features</w:t>
+      </w:r>
+    </w:p>
+    <w:p>
+      <w:pPr>
+        <w:numPr>
+          <w:ilvl w:val="0"/>
+          <w:numId w:val="4"/>
+        </w:numPr>
+        <w:rPr>
+          <w:rFonts w:hint="eastAsia"/>
+        </w:rPr>
+      </w:pPr>
+      <w:r>
+        <w:t xml:space="preserve">Added command line parameters. </w:t>
+      </w:r>
+      <w:r>
+        <w:t>These r</w:t>
+      </w:r>
+      <w:r>
+        <w:t xml:space="preserve">eplaces </w:t>
+      </w:r>
+      <w:r>
+        <w:t xml:space="preserve">the </w:t>
+      </w:r>
+      <w:r>
+        <w:t>LocalOverrides</w:t>
+      </w:r>
+      <w:r>
+        <w:t xml:space="preserve"> mechanism.</w:t>
+      </w:r>
+    </w:p>
+    <w:p>
+      <w:pPr>
+        <w:numPr>
+          <w:ilvl w:val="0"/>
+          <w:numId w:val="4"/>
+        </w:numPr>
+        <w:rPr>
+          <w:rFonts w:hint="eastAsia"/>
+        </w:rPr>
+      </w:pPr>
+      <w:r>
+        <w:t xml:space="preserve">LocalOverrides </w:t>
+      </w:r>
+      <w:r>
+        <w:t>mechanism removed.</w:t>
+      </w:r>
+    </w:p>
+    <w:p>
+      <w:pPr>
+        <w:numPr>
+          <w:ilvl w:val="0"/>
+          <w:numId w:val="4"/>
+        </w:numPr>
+        <w:rPr>
+          <w:rFonts w:hint="eastAsia"/>
+        </w:rPr>
+      </w:pPr>
+      <w:r>
+        <w:t>Save project file: the [Update XML to current version] checkbox is now enabled by default.</w:t>
+      </w:r>
+    </w:p>
+    <w:p>
+      <w:pPr>
+        <w:numPr>
+          <w:ilvl w:val="0"/>
+          <w:numId w:val="4"/>
+        </w:numPr>
+        <w:rPr>
+          <w:rFonts w:hint="eastAsia"/>
+        </w:rPr>
+      </w:pPr>
+      <w:r>
+        <w:t>Options form: tooltips improved.</w:t>
+      </w:r>
+    </w:p>
+    <w:p>
+      <w:pPr>
+        <w:numPr>
+          <w:ilvl w:val="0"/>
+          <w:numId w:val="4"/>
+        </w:numPr>
+        <w:rPr>
+          <w:rFonts w:hint="eastAsia"/>
+        </w:rPr>
+      </w:pPr>
+      <w:r>
+        <w:t>Grid: Regist</w:t>
+      </w:r>
+      <w:r>
+        <w:t>er</w:t>
+      </w:r>
+      <w:r>
+        <w:t xml:space="preserve"> </w:t>
+      </w:r>
+      <w:r>
+        <w:t xml:space="preserve">column menu now has </w:t>
+      </w:r>
+      <w:r>
+        <w:t xml:space="preserve"> [</w:t>
+      </w:r>
+      <w:r>
+        <w:t>Expand all]</w:t>
+      </w:r>
+      <w:r>
+        <w:t xml:space="preserve"> and </w:t>
+      </w:r>
+      <w:r>
+        <w:t>[</w:t>
+      </w:r>
+      <w:r>
+        <w:t>Collapse all</w:t>
+      </w:r>
+      <w:r>
+        <w:t>].</w:t>
+      </w:r>
+    </w:p>
+    <w:p>
+      <w:pPr>
+        <w:numPr>
+          <w:ilvl w:val="0"/>
+          <w:numId w:val="4"/>
+        </w:numPr>
+        <w:rPr>
+          <w:rFonts w:hint="eastAsia"/>
+        </w:rPr>
+      </w:pPr>
+      <w:r>
+        <w:t xml:space="preserve">Mbc project file: &lt;longdescr&gt; </w:t>
+      </w:r>
+      <w:r>
+        <w:t xml:space="preserve">element </w:t>
+      </w:r>
+      <w:r>
+        <w:t xml:space="preserve">added. </w:t>
+      </w:r>
+      <w:r>
+        <w:t>Adds a long multiline text that is show when the mouse is hoovered over the register decription</w:t>
+      </w:r>
+      <w:r>
+        <w:t>.</w:t>
+      </w:r>
+    </w:p>
+    <w:p>
+      <w:pPr>
+        <w:numPr>
+          <w:ilvl w:val="0"/>
+          <w:numId w:val="4"/>
+        </w:numPr>
+        <w:rPr>
+          <w:rFonts w:hint="eastAsia"/>
+        </w:rPr>
+      </w:pPr>
+      <w:r>
+        <w:t>Mbc project file: &lt;include&gt; element added.</w:t>
+      </w:r>
+    </w:p>
+    <w:p>
+      <w:pPr>
+        <w:pStyle w:val="Kop3"/>
+        <w:numPr>
+          <w:ilvl w:val="0"/>
+          <w:numId w:val="0"/>
+        </w:numPr>
+        <w:ind w:left="680" w:hanging="431"/>
+        <w:rPr>
+          <w:rFonts w:hint="eastAsia"/>
+        </w:rPr>
+      </w:pPr>
+      <w:r>
+        <w:t>Fixes</w:t>
+      </w:r>
+    </w:p>
+    <w:p>
+      <w:pPr>
+        <w:numPr>
+          <w:ilvl w:val="0"/>
+          <w:numId w:val="4"/>
+        </w:numPr>
+        <w:rPr>
+          <w:rFonts w:hint="eastAsia"/>
+        </w:rPr>
+      </w:pPr>
+      <w:r>
+        <w:t>[</w:t>
+      </w:r>
+      <w:r>
+        <w:t>Open project file location in Explorer] now works if you gave a filename without a path on the command line.</w:t>
+      </w:r>
+    </w:p>
+    <w:p>
+      <w:pPr>
+        <w:numPr>
+          <w:ilvl w:val="0"/>
+          <w:numId w:val="4"/>
+        </w:numPr>
+        <w:rPr>
+          <w:rFonts w:hint="eastAsia"/>
+        </w:rPr>
+      </w:pPr>
+      <w:r>
+        <w:t xml:space="preserve">The temporary red </w:t>
+      </w:r>
+      <w:r>
+        <w:t>colouring</w:t>
+      </w:r>
+      <w:r>
+        <w:t xml:space="preserve"> of the value field after entering </w:t>
+      </w:r>
+      <w:r>
+        <w:t xml:space="preserve">an invalid value </w:t>
+      </w:r>
+      <w:r>
+        <w:t>has been improved.</w:t>
+      </w:r>
+    </w:p>
+    <w:p>
+      <w:pPr>
+        <w:numPr>
+          <w:ilvl w:val="0"/>
+          <w:numId w:val="4"/>
+        </w:numPr>
+        <w:rPr>
+          <w:rFonts w:hint="eastAsia"/>
+        </w:rPr>
+      </w:pPr>
+      <w:r>
+        <w:t>Edit</w:t>
+      </w:r>
+      <w:r>
+        <w:t xml:space="preserve"> enter/escape </w:t>
+      </w:r>
+      <w:r>
+        <w:t>handling is improved</w:t>
+      </w:r>
+      <w:r>
+        <w:t>.</w:t>
+      </w:r>
+    </w:p>
+    <w:p>
+      <w:pPr>
+        <w:numPr>
+          <w:ilvl w:val="0"/>
+          <w:numId w:val="4"/>
+        </w:numPr>
+        <w:rPr>
+          <w:rFonts w:hint="eastAsia"/>
+        </w:rPr>
+      </w:pPr>
+      <w:r>
+        <w:t xml:space="preserve">In the notification screen that the serial port could not be opened: the [Port] </w:t>
+      </w:r>
+      <w:r>
+        <w:t>combo box</w:t>
+      </w:r>
+      <w:r>
+        <w:t xml:space="preserve"> now automatically refreshes the list of serial ports.</w:t>
+      </w:r>
+    </w:p>
+    <w:p>
+      <w:pPr>
+        <w:pStyle w:val="Kop1"/>
+        <w:rPr>
+          <w:rFonts w:hint="eastAsia"/>
+        </w:rPr>
+      </w:pPr>
+      <w:r>
+        <w:t>v2.0.13 -- 2022-07-11</w:t>
+      </w:r>
+    </w:p>
+    <w:p>
+      <w:pPr>
+        <w:pStyle w:val="Kop3"/>
+        <w:rPr>
+          <w:rFonts w:hint="eastAsia"/>
+        </w:rPr>
+      </w:pPr>
+      <w:r>
+        <w:t>Features</w:t>
+      </w:r>
+    </w:p>
+    <w:p>
+      <w:pPr>
+        <w:numPr>
+          <w:ilvl w:val="0"/>
+          <w:numId w:val="4"/>
+        </w:numPr>
+        <w:rPr>
+          <w:rFonts w:hint="eastAsia"/>
+        </w:rPr>
+      </w:pPr>
+      <w:r>
+        <w:t xml:space="preserve">Added Find/Filter bar. </w:t>
+      </w:r>
+      <w:r>
+        <w:t>Open it using</w:t>
+      </w:r>
+      <w:r>
+        <w:t xml:space="preserve"> Control-F. There is also an option </w:t>
+      </w:r>
+      <w:r>
+        <w:t>“</w:t>
+      </w:r>
+      <w:r>
+        <w:t xml:space="preserve">Clear Find/Filter </w:t>
+      </w:r>
+      <w:r>
         <w:lastRenderedPageBreak/>
-        <w:t>v2.0.15 – 2023-06-24</w:t>
+        <w:t>on tab change</w:t>
+      </w:r>
+      <w:r>
+        <w:t>”</w:t>
+      </w:r>
+      <w:r>
+        <w:t>.</w:t>
+      </w:r>
+    </w:p>
+    <w:p>
+      <w:pPr>
+        <w:numPr>
+          <w:ilvl w:val="0"/>
+          <w:numId w:val="4"/>
+        </w:numPr>
+        <w:rPr>
+          <w:rFonts w:hint="eastAsia"/>
+        </w:rPr>
+      </w:pPr>
+      <w:r>
+        <w:t xml:space="preserve">The properties of a register (rw, int32, ...) are now displayed in a separate </w:t>
+      </w:r>
+      <w:r>
+        <w:t>[</w:t>
+      </w:r>
+      <w:r>
+        <w:t>Properties</w:t>
+      </w:r>
+      <w:r>
+        <w:t>]</w:t>
+      </w:r>
+      <w:r>
+        <w:t xml:space="preserve"> column</w:t>
+      </w:r>
+      <w:r>
+        <w:t xml:space="preserve"> instead of being added to </w:t>
+      </w:r>
+      <w:r>
+        <w:t xml:space="preserve">the </w:t>
+      </w:r>
+      <w:r>
+        <w:t>[</w:t>
+      </w:r>
+      <w:r>
+        <w:t>Description</w:t>
+      </w:r>
+      <w:r>
+        <w:t>]</w:t>
+      </w:r>
+      <w:r>
+        <w:t xml:space="preserve"> column. </w:t>
+      </w:r>
+      <w:r>
+        <w:t>The [Properties]  column can be e</w:t>
+      </w:r>
+      <w:r>
+        <w:t>nable/disable</w:t>
+      </w:r>
+      <w:r>
+        <w:t>d</w:t>
+      </w:r>
+      <w:r>
+        <w:t xml:space="preserve"> in Options.</w:t>
+      </w:r>
+    </w:p>
+    <w:p>
+      <w:pPr>
+        <w:numPr>
+          <w:ilvl w:val="0"/>
+          <w:numId w:val="4"/>
+        </w:numPr>
+        <w:rPr>
+          <w:rFonts w:hint="eastAsia"/>
+        </w:rPr>
+      </w:pPr>
+      <w:r>
+        <w:t>The Description text can now be multi-line</w:t>
+      </w:r>
+      <w:r>
+        <w:t>, i</w:t>
+      </w:r>
+      <w:r>
+        <w:t xml:space="preserve">f  the </w:t>
+      </w:r>
+      <w:r>
+        <w:t>“</w:t>
+      </w:r>
+      <w:r>
+        <w:t>Multiline rows with auto row size</w:t>
+      </w:r>
+      <w:r>
+        <w:t>”</w:t>
+      </w:r>
+      <w:r>
+        <w:t xml:space="preserve"> option </w:t>
+      </w:r>
+      <w:r>
+        <w:t>is enabled</w:t>
+      </w:r>
+      <w:r>
+        <w:t xml:space="preserve">. A </w:t>
+      </w:r>
+      <w:r>
+        <w:t xml:space="preserve">long </w:t>
+      </w:r>
+      <w:r>
+        <w:t xml:space="preserve">description </w:t>
+      </w:r>
+      <w:r>
+        <w:t>text is wrappe</w:t>
+      </w:r>
+      <w:r>
+        <w:t xml:space="preserve">d. </w:t>
+      </w:r>
+      <w:r>
+        <w:t>CR/LF</w:t>
+      </w:r>
+      <w:r>
+        <w:t xml:space="preserve">’s can be used in the description text. </w:t>
+      </w:r>
+      <w:r>
+        <w:t xml:space="preserve">The row height of the grid is automatically adjusted to the text. </w:t>
+      </w:r>
+    </w:p>
+    <w:p>
+      <w:pPr>
+        <w:numPr>
+          <w:ilvl w:val="0"/>
+          <w:numId w:val="4"/>
+        </w:numPr>
+        <w:rPr>
+          <w:rFonts w:hint="eastAsia"/>
+        </w:rPr>
+      </w:pPr>
+      <w:r>
+        <w:t>"Move to next row on Enter"</w:t>
+      </w:r>
+      <w:r>
+        <w:t xml:space="preserve"> option</w:t>
+      </w:r>
+      <w:r>
+        <w:t xml:space="preserve">: depending on this option, after entering a new value with the Enter key, the </w:t>
+      </w:r>
+      <w:r>
+        <w:t>cursor</w:t>
+      </w:r>
+      <w:r>
+        <w:t xml:space="preserve"> may or may not go to the next line. </w:t>
+      </w:r>
+      <w:r>
+        <w:t xml:space="preserve">Enter a value with </w:t>
+      </w:r>
+      <w:r>
+        <w:t>Control-Enter</w:t>
+      </w:r>
+      <w:r>
+        <w:t xml:space="preserve"> to get the</w:t>
+      </w:r>
+      <w:r>
+        <w:t xml:space="preserve"> opposite</w:t>
+      </w:r>
+      <w:r>
+        <w:t xml:space="preserve"> behaviour.</w:t>
       </w:r>
     </w:p>
     <w:p>
@@ -745,1955 +1622,1154 @@
         </w:rPr>
       </w:pPr>
       <w:r>
-        <w:rPr>
-          <w:rFonts w:hint="eastAsia"/>
-        </w:rPr>
+        <w:t>Fixes</w:t>
+      </w:r>
+    </w:p>
+    <w:p>
+      <w:pPr>
+        <w:numPr>
+          <w:ilvl w:val="0"/>
+          <w:numId w:val="5"/>
+        </w:numPr>
+        <w:rPr>
+          <w:rFonts w:hint="eastAsia"/>
+        </w:rPr>
+      </w:pPr>
+      <w:r>
+        <w:t>Control-0 for zoom reset now works globally on the form, not just when the focus is in the grid.</w:t>
+      </w:r>
+    </w:p>
+    <w:p>
+      <w:pPr>
+        <w:numPr>
+          <w:ilvl w:val="0"/>
+          <w:numId w:val="5"/>
+        </w:numPr>
+        <w:rPr>
+          <w:rFonts w:hint="eastAsia"/>
+        </w:rPr>
+      </w:pPr>
+      <w:r>
+        <w:t>R</w:t>
+      </w:r>
+      <w:r>
+        <w:t>ight-click</w:t>
+      </w:r>
+      <w:r>
+        <w:t>ing</w:t>
+      </w:r>
+      <w:r>
+        <w:t xml:space="preserve"> in the grid</w:t>
+      </w:r>
+      <w:r>
+        <w:t xml:space="preserve"> now moves the focus to that row, to </w:t>
+      </w:r>
+      <w:r>
+        <w:t>better see which row you are working on.</w:t>
+      </w:r>
+    </w:p>
+    <w:p>
+      <w:pPr>
+        <w:numPr>
+          <w:ilvl w:val="0"/>
+          <w:numId w:val="5"/>
+        </w:numPr>
+        <w:rPr>
+          <w:rFonts w:hint="eastAsia"/>
+        </w:rPr>
+      </w:pPr>
+      <w:r>
+        <w:t>Migrated</w:t>
+      </w:r>
+      <w:r>
+        <w:t xml:space="preserve"> to .NET framework 4.7.2.</w:t>
+      </w:r>
+    </w:p>
+    <w:p>
+      <w:pPr>
+        <w:pStyle w:val="Kop1"/>
+        <w:rPr>
+          <w:rFonts w:hint="eastAsia"/>
+        </w:rPr>
+      </w:pPr>
+      <w:r>
+        <w:t>v2.0.12 -- 2020-07-13</w:t>
+      </w:r>
+    </w:p>
+    <w:p>
+      <w:pPr>
+        <w:pStyle w:val="Kop3"/>
+        <w:rPr>
+          <w:rFonts w:hint="eastAsia"/>
+        </w:rPr>
+      </w:pPr>
+      <w:r>
         <w:t>Features</w:t>
       </w:r>
     </w:p>
     <w:p>
       <w:pPr>
-        <w:pStyle w:val="Lijstalinea"/>
-        <w:numPr>
-          <w:ilvl w:val="0"/>
-          <w:numId w:val="4"/>
-        </w:numPr>
-        <w:rPr>
-          <w:rFonts w:hint="eastAsia"/>
-        </w:rPr>
-      </w:pPr>
-      <w:r>
-        <w:rPr>
-          <w:rFonts w:hint="eastAsia"/>
-        </w:rPr>
-        <w:t xml:space="preserve">Enum registers editing now has a dropdown </w:t>
-      </w:r>
-      <w:proofErr w:type="spellStart"/>
-      <w:r>
-        <w:rPr>
-          <w:rFonts w:hint="eastAsia"/>
-        </w:rPr>
-        <w:t>combobox</w:t>
-      </w:r>
-      <w:proofErr w:type="spellEnd"/>
-      <w:r>
-        <w:rPr>
-          <w:rFonts w:hint="eastAsia"/>
-        </w:rPr>
-        <w:t xml:space="preserve"> with possible values.</w:t>
-      </w:r>
-    </w:p>
-    <w:p>
-      <w:pPr>
-        <w:pStyle w:val="Lijstalinea"/>
-        <w:numPr>
-          <w:ilvl w:val="0"/>
-          <w:numId w:val="4"/>
-        </w:numPr>
-        <w:rPr>
-          <w:rFonts w:hint="eastAsia"/>
-        </w:rPr>
-      </w:pPr>
-      <w:r>
-        <w:rPr>
-          <w:rFonts w:hint="eastAsia"/>
-        </w:rPr>
-        <w:t>Mbc file: Enum values now allow a cu</w:t>
+        <w:numPr>
+          <w:ilvl w:val="0"/>
+          <w:numId w:val="6"/>
+        </w:numPr>
+        <w:rPr>
+          <w:rFonts w:hint="eastAsia"/>
+        </w:rPr>
+      </w:pPr>
+      <w:r>
+        <w:t>Added mbc project file validation with XSD schema</w:t>
+      </w:r>
+      <w:r>
+        <w:t xml:space="preserve"> file</w:t>
+      </w:r>
+      <w:r>
+        <w:t xml:space="preserve">. </w:t>
+      </w:r>
+      <w:r>
+        <w:t xml:space="preserve">Validation is optional. </w:t>
+      </w:r>
+      <w:r>
+        <w:t>The validation only allows lower-case XML tags</w:t>
+      </w:r>
+      <w:r>
+        <w:t>, a</w:t>
+      </w:r>
+      <w:r>
+        <w:t xml:space="preserve">nd only allows the XML elements that are supported in this version. The intention is that over time all mbc files will </w:t>
+      </w:r>
+      <w:r>
+        <w:t>migrate</w:t>
+      </w:r>
+      <w:r>
+        <w:t xml:space="preserve"> to meet the validation.</w:t>
+      </w:r>
+    </w:p>
+    <w:p>
+      <w:pPr>
+        <w:numPr>
+          <w:ilvl w:val="0"/>
+          <w:numId w:val="6"/>
+        </w:numPr>
+        <w:rPr>
+          <w:rFonts w:hint="eastAsia"/>
+        </w:rPr>
+      </w:pPr>
+      <w:r>
+        <w:t>In</w:t>
+      </w:r>
+      <w:r>
+        <w:t xml:space="preserve"> </w:t>
+      </w:r>
+      <w:r>
+        <w:t xml:space="preserve">the </w:t>
+      </w:r>
+      <w:r>
+        <w:t xml:space="preserve">"Save project file" </w:t>
+      </w:r>
+      <w:r>
+        <w:t xml:space="preserve">form </w:t>
+      </w:r>
+      <w:r>
+        <w:t xml:space="preserve">you now have the option to update the XML with "Update XML to current version" so that it then passes the validation. </w:t>
+      </w:r>
+      <w:r>
+        <w:t>E</w:t>
+      </w:r>
+      <w:r>
+        <w:t>rrors must be corrected manually.</w:t>
+      </w:r>
+    </w:p>
+    <w:p>
+      <w:pPr>
+        <w:numPr>
+          <w:ilvl w:val="0"/>
+          <w:numId w:val="6"/>
+        </w:numPr>
+        <w:rPr>
+          <w:rFonts w:hint="eastAsia"/>
+        </w:rPr>
+      </w:pPr>
+      <w:r>
+        <w:t>In</w:t>
+      </w:r>
+      <w:r>
+        <w:t xml:space="preserve"> "Save project file" the project file is now saved with XML formatting.</w:t>
+      </w:r>
+    </w:p>
+    <w:p>
+      <w:pPr>
+        <w:numPr>
+          <w:ilvl w:val="0"/>
+          <w:numId w:val="6"/>
+        </w:numPr>
+        <w:rPr>
+          <w:rFonts w:hint="eastAsia"/>
+        </w:rPr>
+      </w:pPr>
+      <w:r>
+        <w:t>If you start ModbusControl by double-clicking an mbc file and the file points to a non-existent COM port, the error dialog "Error opening serial port COMx" now appears after the ModbusControl program appears.</w:t>
+      </w:r>
+    </w:p>
+    <w:p>
+      <w:pPr>
+        <w:numPr>
+          <w:ilvl w:val="0"/>
+          <w:numId w:val="6"/>
+        </w:numPr>
+        <w:rPr>
+          <w:rFonts w:hint="eastAsia"/>
+        </w:rPr>
+      </w:pPr>
+      <w:r>
+        <w:t xml:space="preserve">At the first start </w:t>
+      </w:r>
+      <w:r>
+        <w:t xml:space="preserve">of the program </w:t>
+      </w:r>
+      <w:r>
+        <w:t xml:space="preserve">after an update, </w:t>
+      </w:r>
+      <w:r>
+        <w:t xml:space="preserve">an option is shown </w:t>
+      </w:r>
+      <w:r>
+        <w:t>to see the 'Release notes'.</w:t>
+      </w:r>
+    </w:p>
+    <w:p>
+      <w:pPr>
+        <w:numPr>
+          <w:ilvl w:val="0"/>
+          <w:numId w:val="6"/>
+        </w:numPr>
+        <w:rPr>
+          <w:rFonts w:hint="eastAsia"/>
+        </w:rPr>
+      </w:pPr>
+      <w:r>
+        <w:t xml:space="preserve">Program settings split into user-dependent part and </w:t>
+      </w:r>
+      <w:r>
+        <w:t>computer</w:t>
+      </w:r>
+      <w:r>
+        <w:t xml:space="preserve">-dependent part. The old settings are migrated to the new settings files, then </w:t>
+      </w:r>
+      <w:r>
+        <w:t xml:space="preserve">the </w:t>
+      </w:r>
+      <w:r>
+        <w:t>old settings file is deleted.</w:t>
+      </w:r>
+    </w:p>
+    <w:p>
+      <w:pPr>
+        <w:numPr>
+          <w:ilvl w:val="0"/>
+          <w:numId w:val="6"/>
+        </w:numPr>
+        <w:rPr>
+          <w:rFonts w:hint="eastAsia"/>
+        </w:rPr>
+      </w:pPr>
+      <w:r>
+        <w:t xml:space="preserve">LocalOverrides.xml </w:t>
+      </w:r>
+      <w:r>
+        <w:t xml:space="preserve">file is automatically </w:t>
+      </w:r>
+      <w:r>
+        <w:t xml:space="preserve">moved from &lt;mydocuments&gt;\ModbusControl to %AppData%\Roaming\E.D.&amp;A\ModbusControl. Content from old is not migrated. Old </w:t>
+      </w:r>
+      <w:r>
+        <w:t>file</w:t>
+      </w:r>
+      <w:r>
+        <w:t xml:space="preserve"> is renamed with '.old' and moved to the </w:t>
+      </w:r>
+      <w:r>
+        <w:t xml:space="preserve">new </w:t>
+      </w:r>
+      <w:r>
+        <w:t>location. If overrides were used, the user will receive a notification.</w:t>
+      </w:r>
+    </w:p>
+    <w:p>
+      <w:pPr>
+        <w:numPr>
+          <w:ilvl w:val="0"/>
+          <w:numId w:val="6"/>
+        </w:numPr>
+        <w:rPr>
+          <w:rFonts w:hint="eastAsia"/>
+        </w:rPr>
+      </w:pPr>
+      <w:r>
+        <w:t>&lt;user&gt;\Documents\ModbusControl is no longer used.</w:t>
+      </w:r>
+    </w:p>
+    <w:p>
+      <w:pPr>
+        <w:pStyle w:val="Kop3"/>
+        <w:rPr>
+          <w:rFonts w:hint="eastAsia"/>
+        </w:rPr>
+      </w:pPr>
+      <w:r>
+        <w:t>Fixes</w:t>
+      </w:r>
+    </w:p>
+    <w:p>
+      <w:pPr>
+        <w:numPr>
+          <w:ilvl w:val="0"/>
+          <w:numId w:val="7"/>
+        </w:numPr>
+        <w:rPr>
+          <w:rFonts w:hint="eastAsia"/>
+        </w:rPr>
+      </w:pPr>
+      <w:r>
+        <w:t>The import/export dialogs now show '*. CSV' instead of '*. C</w:t>
+      </w:r>
+      <w:r>
+        <w:t>VS</w:t>
+      </w:r>
+      <w:r>
+        <w:t>'.</w:t>
+      </w:r>
+    </w:p>
+    <w:p>
+      <w:pPr>
+        <w:numPr>
+          <w:ilvl w:val="0"/>
+          <w:numId w:val="7"/>
+        </w:numPr>
+        <w:rPr>
+          <w:rFonts w:hint="eastAsia"/>
+        </w:rPr>
+      </w:pPr>
+      <w:r>
+        <w:t>Mbc file is now saved without BOM (</w:t>
+      </w:r>
+      <w:r>
+        <w:t>Unicode</w:t>
+      </w:r>
+      <w:r>
+        <w:t xml:space="preserve"> byte order mark).</w:t>
+      </w:r>
+    </w:p>
+    <w:p>
+      <w:pPr>
+        <w:numPr>
+          <w:ilvl w:val="0"/>
+          <w:numId w:val="7"/>
+        </w:numPr>
+        <w:rPr>
+          <w:rFonts w:hint="eastAsia"/>
+        </w:rPr>
+      </w:pPr>
+      <w:r>
+        <w:t xml:space="preserve">Better </w:t>
+      </w:r>
+      <w:r>
+        <w:t>handling</w:t>
+      </w:r>
+      <w:r>
+        <w:t xml:space="preserve"> if </w:t>
+      </w:r>
+      <w:r>
+        <w:t>a</w:t>
+      </w:r>
+      <w:r>
+        <w:t xml:space="preserve"> non-admin</w:t>
+      </w:r>
+      <w:r>
+        <w:t>istrator</w:t>
+      </w:r>
+      <w:r>
+        <w:t xml:space="preserve"> user logs </w:t>
+      </w:r>
+      <w:r>
+        <w:t xml:space="preserve">on </w:t>
+      </w:r>
+      <w:r>
+        <w:t>and uses ModbusControl.</w:t>
+      </w:r>
+    </w:p>
+    <w:p>
+      <w:pPr>
+        <w:pStyle w:val="Kop1"/>
+        <w:rPr>
+          <w:rFonts w:hint="eastAsia"/>
+        </w:rPr>
+      </w:pPr>
+      <w:r>
+        <w:lastRenderedPageBreak/>
+        <w:t>v2.0.11 -- 2019-11-18</w:t>
+      </w:r>
+    </w:p>
+    <w:p>
+      <w:pPr>
+        <w:pStyle w:val="Kop3"/>
+        <w:rPr>
+          <w:rFonts w:hint="eastAsia"/>
+        </w:rPr>
+      </w:pPr>
+      <w:r>
+        <w:t>Fixes</w:t>
+      </w:r>
+    </w:p>
+    <w:p>
+      <w:pPr>
+        <w:numPr>
+          <w:ilvl w:val="0"/>
+          <w:numId w:val="8"/>
+        </w:numPr>
+        <w:rPr>
+          <w:rFonts w:hint="eastAsia"/>
+        </w:rPr>
+      </w:pPr>
+      <w:r>
+        <w:t xml:space="preserve">Better handling if the USB/serial connection is lost. In the past </w:t>
+      </w:r>
+      <w:r>
+        <w:t xml:space="preserve">the </w:t>
+      </w:r>
+      <w:r>
+        <w:t xml:space="preserve">program </w:t>
+      </w:r>
+      <w:r>
+        <w:t>could stop responding</w:t>
+      </w:r>
+      <w:r>
+        <w:t>.</w:t>
+      </w:r>
+    </w:p>
+    <w:p>
+      <w:pPr>
+        <w:pStyle w:val="Kop1"/>
+        <w:rPr>
+          <w:rFonts w:hint="eastAsia"/>
+        </w:rPr>
+      </w:pPr>
+      <w:r>
+        <w:t>v2.0.10 -- 2019-03-11</w:t>
+      </w:r>
+    </w:p>
+    <w:p>
+      <w:pPr>
+        <w:pStyle w:val="Kop3"/>
+        <w:rPr>
+          <w:rFonts w:hint="eastAsia"/>
+        </w:rPr>
+      </w:pPr>
+      <w:r>
+        <w:t>Features</w:t>
+      </w:r>
+    </w:p>
+    <w:p>
+      <w:pPr>
+        <w:numPr>
+          <w:ilvl w:val="0"/>
+          <w:numId w:val="8"/>
+        </w:numPr>
+        <w:rPr>
+          <w:rFonts w:hint="eastAsia"/>
+        </w:rPr>
+      </w:pPr>
+      <w:r>
+        <w:t>Added display</w:t>
+      </w:r>
+      <w:r>
+        <w:t>ing</w:t>
+      </w:r>
+      <w:r>
+        <w:t xml:space="preserve"> of enum </w:t>
+      </w:r>
+      <w:r>
+        <w:t xml:space="preserve">values </w:t>
+      </w:r>
+      <w:r>
+        <w:t xml:space="preserve">in the value column. </w:t>
+      </w:r>
+    </w:p>
+    <w:p>
+      <w:pPr>
+        <w:pStyle w:val="Kop3"/>
+        <w:rPr>
+          <w:rFonts w:hint="eastAsia"/>
+        </w:rPr>
+      </w:pPr>
+      <w:r>
+        <w:t>Fixes</w:t>
+      </w:r>
+    </w:p>
+    <w:p>
+      <w:pPr>
+        <w:numPr>
+          <w:ilvl w:val="0"/>
+          <w:numId w:val="8"/>
+        </w:numPr>
+        <w:rPr>
+          <w:rFonts w:hint="eastAsia"/>
+        </w:rPr>
+      </w:pPr>
+      <w:r>
+        <w:t xml:space="preserve">Menu </w:t>
+      </w:r>
+      <w:r>
+        <w:t xml:space="preserve">item </w:t>
+      </w:r>
+      <w:r>
+        <w:t xml:space="preserve">"Edit project file" did not work </w:t>
+      </w:r>
+      <w:r>
+        <w:t xml:space="preserve">correctly </w:t>
+      </w:r>
+      <w:r>
+        <w:t>if there was a space in the path.</w:t>
+      </w:r>
+    </w:p>
+    <w:p>
+      <w:pPr>
+        <w:numPr>
+          <w:ilvl w:val="0"/>
+          <w:numId w:val="8"/>
+        </w:numPr>
+        <w:rPr>
+          <w:rFonts w:hint="eastAsia"/>
+        </w:rPr>
+      </w:pPr>
+      <w:r>
+        <w:t>Logger: Clear button did not clear number of logs in the status bar.</w:t>
+      </w:r>
+    </w:p>
+    <w:p>
+      <w:pPr>
+        <w:numPr>
+          <w:ilvl w:val="0"/>
+          <w:numId w:val="8"/>
+        </w:numPr>
+        <w:rPr>
+          <w:rFonts w:hint="eastAsia"/>
+        </w:rPr>
+      </w:pPr>
+      <w:r>
+        <w:t xml:space="preserve">Send Custom Modbus Command: allows tabs and CR/LF in the string. </w:t>
+      </w:r>
+      <w:r>
+        <w:t xml:space="preserve">Reports </w:t>
+      </w:r>
+      <w:r>
+        <w:t xml:space="preserve">error </w:t>
+      </w:r>
+      <w:r>
+        <w:t>for</w:t>
+      </w:r>
+      <w:r>
+        <w:t xml:space="preserve"> empty command string. </w:t>
+      </w:r>
+    </w:p>
+    <w:p>
+      <w:pPr>
+        <w:numPr>
+          <w:ilvl w:val="0"/>
+          <w:numId w:val="8"/>
+        </w:numPr>
+        <w:rPr>
+          <w:rFonts w:hint="eastAsia"/>
+        </w:rPr>
+      </w:pPr>
+      <w:r>
+        <w:t xml:space="preserve">Send Custom Modbus Command: </w:t>
+      </w:r>
+      <w:r>
+        <w:t>Reports</w:t>
+      </w:r>
+      <w:r>
+        <w:t xml:space="preserve"> error when command is too short, must be at least 2 bytes.</w:t>
+      </w:r>
+    </w:p>
+    <w:p>
+      <w:pPr>
+        <w:numPr>
+          <w:ilvl w:val="0"/>
+          <w:numId w:val="8"/>
+        </w:numPr>
+        <w:rPr>
+          <w:rFonts w:hint="eastAsia"/>
+        </w:rPr>
+      </w:pPr>
+      <w:r>
+        <w:t xml:space="preserve">Fix background </w:t>
+      </w:r>
+      <w:r>
+        <w:t>colour</w:t>
+      </w:r>
+      <w:r>
+        <w:t xml:space="preserve"> of registers.</w:t>
+      </w:r>
+    </w:p>
+    <w:p>
+      <w:pPr>
+        <w:pStyle w:val="Kop1"/>
+        <w:rPr>
+          <w:rFonts w:hint="eastAsia"/>
+        </w:rPr>
+      </w:pPr>
+      <w:r>
+        <w:t>v2.0.9 -- 2018-10-20</w:t>
+      </w:r>
+    </w:p>
+    <w:p>
+      <w:pPr>
+        <w:pStyle w:val="Kop3"/>
+        <w:rPr>
+          <w:rFonts w:hint="eastAsia"/>
+        </w:rPr>
+      </w:pPr>
+      <w:r>
+        <w:t>Features</w:t>
+      </w:r>
+    </w:p>
+    <w:p>
+      <w:pPr>
+        <w:numPr>
+          <w:ilvl w:val="0"/>
+          <w:numId w:val="9"/>
+        </w:numPr>
+        <w:rPr>
+          <w:rFonts w:hint="eastAsia"/>
+        </w:rPr>
+      </w:pPr>
+      <w:r>
+        <w:t>New option: "Move to next row on Enter".</w:t>
+      </w:r>
+    </w:p>
+    <w:p>
+      <w:pPr>
+        <w:numPr>
+          <w:ilvl w:val="0"/>
+          <w:numId w:val="9"/>
+        </w:numPr>
+        <w:rPr>
+          <w:rFonts w:hint="eastAsia"/>
+        </w:rPr>
+      </w:pPr>
+      <w:r>
+        <w:t xml:space="preserve">New option: "Auto-start edit mode on typing". </w:t>
+      </w:r>
+    </w:p>
+    <w:p>
+      <w:pPr>
+        <w:numPr>
+          <w:ilvl w:val="0"/>
+          <w:numId w:val="9"/>
+        </w:numPr>
+        <w:rPr>
+          <w:rFonts w:hint="eastAsia"/>
+        </w:rPr>
+      </w:pPr>
+      <w:r>
+        <w:t xml:space="preserve">New option: "Use custom editor". </w:t>
+      </w:r>
+    </w:p>
+    <w:p>
+      <w:pPr>
+        <w:numPr>
+          <w:ilvl w:val="0"/>
+          <w:numId w:val="9"/>
+        </w:numPr>
+        <w:rPr>
+          <w:rFonts w:hint="eastAsia"/>
+        </w:rPr>
+      </w:pPr>
+      <w:r>
+        <w:t>New option: "Ignore form size on project reload".</w:t>
+      </w:r>
+    </w:p>
+    <w:p>
+      <w:pPr>
+        <w:numPr>
+          <w:ilvl w:val="0"/>
+          <w:numId w:val="9"/>
+        </w:numPr>
+        <w:rPr>
+          <w:rFonts w:hint="eastAsia"/>
+        </w:rPr>
+      </w:pPr>
+      <w:r>
+        <w:t>Config</w:t>
+      </w:r>
+      <w:r>
+        <w:t>uration</w:t>
+      </w:r>
+      <w:r>
+        <w:t xml:space="preserve"> form now has an Apply button.</w:t>
+      </w:r>
+    </w:p>
+    <w:p>
+      <w:pPr>
+        <w:numPr>
+          <w:ilvl w:val="0"/>
+          <w:numId w:val="9"/>
+        </w:numPr>
+        <w:rPr>
+          <w:rFonts w:hint="eastAsia"/>
+        </w:rPr>
+      </w:pPr>
+      <w:r>
+        <w:t xml:space="preserve">Separate line-copy and value-copy </w:t>
+      </w:r>
+      <w:r>
+        <w:t xml:space="preserve">capability </w:t>
+      </w:r>
+      <w:r>
+        <w:t xml:space="preserve">in grid, </w:t>
+      </w:r>
+      <w:r>
+        <w:t>using</w:t>
+      </w:r>
+      <w:r>
+        <w:t xml:space="preserve"> control-C and context menu.</w:t>
+      </w:r>
+    </w:p>
+    <w:p>
+      <w:pPr>
+        <w:numPr>
+          <w:ilvl w:val="0"/>
+          <w:numId w:val="9"/>
+        </w:numPr>
+        <w:rPr>
+          <w:rFonts w:hint="eastAsia"/>
+        </w:rPr>
+      </w:pPr>
+      <w:r>
+        <w:t xml:space="preserve">The status bar now </w:t>
+      </w:r>
+      <w:r>
+        <w:t xml:space="preserve">has </w:t>
+      </w:r>
+      <w:r>
+        <w:t xml:space="preserve">blue </w:t>
+      </w:r>
+      <w:r>
+        <w:t xml:space="preserve">colour </w:t>
+      </w:r>
+      <w:r>
+        <w:t>if there is no connection or no polling is done.</w:t>
+      </w:r>
+    </w:p>
+    <w:p>
+      <w:pPr>
+        <w:numPr>
+          <w:ilvl w:val="0"/>
+          <w:numId w:val="9"/>
+        </w:numPr>
+        <w:rPr>
+          <w:rFonts w:hint="eastAsia"/>
+        </w:rPr>
+      </w:pPr>
+      <w:r>
+        <w:t xml:space="preserve">The status bar </w:t>
+      </w:r>
+      <w:r>
+        <w:t xml:space="preserve">now has red colour </w:t>
+      </w:r>
+      <w:r>
+        <w:t>for errors.</w:t>
+      </w:r>
+    </w:p>
+    <w:p>
+      <w:pPr>
+        <w:numPr>
+          <w:ilvl w:val="0"/>
+          <w:numId w:val="9"/>
+        </w:numPr>
+        <w:rPr>
+          <w:rFonts w:hint="eastAsia"/>
+        </w:rPr>
+      </w:pPr>
+      <w:r>
+        <w:t xml:space="preserve">Now </w:t>
+      </w:r>
+      <w:r>
+        <w:t>shows</w:t>
+      </w:r>
+      <w:r>
+        <w:t xml:space="preserve"> a warning in the "Save configuration to project file" and "Project configuration" screens if localoverrides </w:t>
+      </w:r>
+      <w:r>
+        <w:t>were</w:t>
+      </w:r>
+      <w:r>
+        <w:t xml:space="preserve"> used.</w:t>
+      </w:r>
+    </w:p>
+    <w:p>
+      <w:pPr>
+        <w:pStyle w:val="Kop3"/>
+        <w:rPr>
+          <w:rFonts w:hint="eastAsia"/>
+        </w:rPr>
+      </w:pPr>
+      <w:r>
+        <w:t>Fixes</w:t>
+      </w:r>
+    </w:p>
+    <w:p>
+      <w:pPr>
+        <w:numPr>
+          <w:ilvl w:val="0"/>
+          <w:numId w:val="10"/>
+        </w:numPr>
+        <w:rPr>
+          <w:rFonts w:hint="eastAsia"/>
+        </w:rPr>
+      </w:pPr>
+      <w:r>
+        <w:t xml:space="preserve">Notification </w:t>
+      </w:r>
+      <w:r>
+        <w:t>if Settings.xml could not be loaded at startup.</w:t>
+      </w:r>
+    </w:p>
+    <w:p>
+      <w:pPr>
+        <w:numPr>
+          <w:ilvl w:val="0"/>
+          <w:numId w:val="10"/>
+        </w:numPr>
+        <w:rPr>
+          <w:rFonts w:hint="eastAsia"/>
+        </w:rPr>
+      </w:pPr>
+      <w:r>
+        <w:t xml:space="preserve">Settings.xml </w:t>
+      </w:r>
+      <w:r>
+        <w:t xml:space="preserve">writing now </w:t>
+      </w:r>
+      <w:r>
+        <w:t>update</w:t>
       </w:r>
       <w:r>
         <w:t>s</w:t>
       </w:r>
       <w:r>
-        <w:rPr>
-          <w:rFonts w:hint="eastAsia"/>
-        </w:rPr>
-        <w:t xml:space="preserve">tom &lt;else&gt; </w:t>
-      </w:r>
-      <w:r>
-        <w:t>text</w:t>
-      </w:r>
-      <w:r>
-        <w:rPr>
-          <w:rFonts w:hint="eastAsia"/>
-        </w:rPr>
-        <w:t xml:space="preserve"> that is shown if no value matches. </w:t>
-      </w:r>
-      <w:r>
-        <w:t>&lt;else&gt; text can be left empty to suppress the message.</w:t>
-      </w:r>
-    </w:p>
-    <w:p>
-      <w:pPr>
-        <w:pStyle w:val="Lijstalinea"/>
-        <w:numPr>
-          <w:ilvl w:val="0"/>
-          <w:numId w:val="4"/>
-        </w:numPr>
-        <w:rPr>
-          <w:rFonts w:hint="eastAsia"/>
-        </w:rPr>
-      </w:pPr>
-      <w:r>
-        <w:rPr>
-          <w:rFonts w:hint="eastAsia"/>
-        </w:rPr>
-        <w:t xml:space="preserve">You can now use </w:t>
-      </w:r>
-      <w:r>
-        <w:t xml:space="preserve">5 digits and 6 digits </w:t>
-      </w:r>
-      <w:r>
-        <w:rPr>
-          <w:rFonts w:hint="eastAsia"/>
-        </w:rPr>
-        <w:t>registers numbering scheme</w:t>
-      </w:r>
-      <w:r>
-        <w:t>,</w:t>
-      </w:r>
-      <w:r>
-        <w:rPr>
-          <w:rFonts w:hint="eastAsia"/>
-        </w:rPr>
-        <w:t xml:space="preserve"> 40001-49999 and 400001-465536</w:t>
-      </w:r>
-      <w:r>
-        <w:t xml:space="preserve">, or </w:t>
-      </w:r>
-      <w:r>
-        <w:rPr>
-          <w:rFonts w:hint="eastAsia"/>
-        </w:rPr>
-        <w:t>40000-49999 and 400000-465535</w:t>
-      </w:r>
-      <w:r>
-        <w:t xml:space="preserve">, </w:t>
-      </w:r>
-      <w:r>
-        <w:rPr>
-          <w:rFonts w:hint="eastAsia"/>
-        </w:rPr>
-        <w:t xml:space="preserve">at the same time. </w:t>
+        <w:t>/insert</w:t>
+      </w:r>
+      <w:r>
+        <w:t>s</w:t>
+      </w:r>
+      <w:r>
+        <w:t xml:space="preserve"> </w:t>
+      </w:r>
+      <w:r>
+        <w:t>al</w:t>
+      </w:r>
+      <w:r>
+        <w:t xml:space="preserve">l tags in the </w:t>
+      </w:r>
+      <w:r>
+        <w:t xml:space="preserve">existing </w:t>
+      </w:r>
+      <w:r>
+        <w:t>file instead of writing a completely new file, so that any newer tags from a newer version remain.</w:t>
+      </w:r>
+    </w:p>
+    <w:p>
+      <w:pPr>
+        <w:numPr>
+          <w:ilvl w:val="0"/>
+          <w:numId w:val="10"/>
+        </w:numPr>
+        <w:rPr>
+          <w:rFonts w:hint="eastAsia"/>
+        </w:rPr>
+      </w:pPr>
+      <w:r>
+        <w:t>Project Configuration: Interframe-delay: now shows "0 (auto)" at setting 0.</w:t>
+      </w:r>
+    </w:p>
+    <w:p>
+      <w:pPr>
+        <w:numPr>
+          <w:ilvl w:val="0"/>
+          <w:numId w:val="10"/>
+        </w:numPr>
+        <w:rPr>
+          <w:rFonts w:hint="eastAsia"/>
+        </w:rPr>
+      </w:pPr>
+      <w:r>
+        <w:t xml:space="preserve">Local override project </w:t>
+      </w:r>
+      <w:r>
+        <w:t xml:space="preserve">is </w:t>
+      </w:r>
+      <w:r>
+        <w:t xml:space="preserve">no longer </w:t>
+      </w:r>
+      <w:r>
+        <w:t xml:space="preserve">required to have a </w:t>
+      </w:r>
+      <w:r>
+        <w:t>&lt;modbus&gt; element.</w:t>
+      </w:r>
+    </w:p>
+    <w:p>
+      <w:pPr>
+        <w:numPr>
+          <w:ilvl w:val="0"/>
+          <w:numId w:val="10"/>
+        </w:numPr>
+        <w:rPr>
+          <w:rFonts w:hint="eastAsia"/>
+        </w:rPr>
+      </w:pPr>
+      <w:r>
+        <w:t>Dialog forms can now be closed with the Enter key.</w:t>
+      </w:r>
+    </w:p>
+    <w:p>
+      <w:pPr>
+        <w:numPr>
+          <w:ilvl w:val="0"/>
+          <w:numId w:val="10"/>
+        </w:numPr>
+        <w:rPr>
+          <w:rFonts w:hint="eastAsia"/>
+        </w:rPr>
+      </w:pPr>
+      <w:r>
+        <w:t xml:space="preserve">The </w:t>
+      </w:r>
+      <w:r>
+        <w:t>checkboxes of the "Save configuration to project file" form</w:t>
+      </w:r>
+      <w:r>
+        <w:t xml:space="preserve"> are now cleared when loading a project.</w:t>
+      </w:r>
+    </w:p>
+    <w:p>
+      <w:pPr>
+        <w:numPr>
+          <w:ilvl w:val="0"/>
+          <w:numId w:val="10"/>
+        </w:numPr>
+        <w:rPr>
+          <w:rFonts w:hint="eastAsia"/>
+        </w:rPr>
+      </w:pPr>
+      <w:r>
+        <w:t xml:space="preserve">Buttons at the bottom of the forms now have </w:t>
+      </w:r>
+      <w:r>
+        <w:t>better spacing</w:t>
+      </w:r>
+      <w:r>
+        <w:t>.</w:t>
+      </w:r>
+    </w:p>
+    <w:p>
+      <w:pPr>
+        <w:pStyle w:val="Kop1"/>
+        <w:rPr>
+          <w:rFonts w:hint="eastAsia"/>
+        </w:rPr>
+      </w:pPr>
+      <w:r>
+        <w:t>v2.0.8 -- 2018-08-02</w:t>
       </w:r>
     </w:p>
     <w:p>
       <w:pPr>
         <w:pStyle w:val="Kop3"/>
-        <w:numPr>
-          <w:ilvl w:val="0"/>
-          <w:numId w:val="0"/>
-        </w:numPr>
-        <w:ind w:left="680" w:hanging="431"/>
-        <w:rPr>
-          <w:rFonts w:hint="eastAsia"/>
-        </w:rPr>
-      </w:pPr>
-      <w:r>
-        <w:rPr>
-          <w:rFonts w:hint="eastAsia"/>
-        </w:rPr>
-        <w:t>Fixes</w:t>
-      </w:r>
-    </w:p>
-    <w:p>
-      <w:pPr>
-        <w:pStyle w:val="Lijstalinea"/>
-        <w:numPr>
-          <w:ilvl w:val="0"/>
-          <w:numId w:val="4"/>
-        </w:numPr>
-        <w:rPr>
-          <w:rFonts w:hint="eastAsia"/>
-        </w:rPr>
-      </w:pPr>
-      <w:r>
-        <w:t xml:space="preserve">In </w:t>
-      </w:r>
-      <w:proofErr w:type="spellStart"/>
-      <w:r>
-        <w:t>Import_file</w:t>
-      </w:r>
-      <w:proofErr w:type="spellEnd"/>
-      <w:r>
-        <w:t xml:space="preserve"> and </w:t>
-      </w:r>
-      <w:proofErr w:type="spellStart"/>
-      <w:r>
-        <w:t>Import_compare</w:t>
-      </w:r>
-      <w:proofErr w:type="spellEnd"/>
-      <w:r>
-        <w:t xml:space="preserve">: writing/comparing a float32 </w:t>
-      </w:r>
-      <w:r>
-        <w:t xml:space="preserve">value </w:t>
-      </w:r>
-      <w:r>
-        <w:t>no longer worked.</w:t>
-      </w:r>
-    </w:p>
-    <w:p>
-      <w:pPr>
-        <w:pStyle w:val="Lijstalinea"/>
-        <w:numPr>
-          <w:ilvl w:val="0"/>
-          <w:numId w:val="4"/>
-        </w:numPr>
-        <w:rPr>
-          <w:rFonts w:hint="eastAsia"/>
-        </w:rPr>
-      </w:pPr>
-      <w:r>
-        <w:rPr>
-          <w:rFonts w:hint="eastAsia"/>
-        </w:rPr>
-        <w:t xml:space="preserve">Ascii32 register writing </w:t>
-      </w:r>
-      <w:r>
-        <w:t>fixed.</w:t>
-      </w:r>
-    </w:p>
-    <w:p>
-      <w:pPr>
-        <w:pStyle w:val="Lijstalinea"/>
-        <w:numPr>
-          <w:ilvl w:val="0"/>
-          <w:numId w:val="4"/>
-        </w:numPr>
-        <w:rPr>
-          <w:rFonts w:hint="eastAsia"/>
-        </w:rPr>
-      </w:pPr>
-      <w:r>
-        <w:rPr>
-          <w:rFonts w:hint="eastAsia"/>
-        </w:rPr>
-        <w:t xml:space="preserve">Resizing column width is now </w:t>
-      </w:r>
-      <w:r>
-        <w:t>global for all tabs</w:t>
-      </w:r>
-      <w:r>
-        <w:rPr>
-          <w:rFonts w:hint="eastAsia"/>
-        </w:rPr>
+        <w:rPr>
+          <w:rFonts w:hint="eastAsia"/>
+        </w:rPr>
+      </w:pPr>
+      <w:r>
+        <w:t>Features</w:t>
+      </w:r>
+    </w:p>
+    <w:p>
+      <w:pPr>
+        <w:numPr>
+          <w:ilvl w:val="0"/>
+          <w:numId w:val="11"/>
+        </w:numPr>
+        <w:rPr>
+          <w:rFonts w:hint="eastAsia"/>
+        </w:rPr>
+      </w:pPr>
+      <w:r>
+        <w:t xml:space="preserve">Added </w:t>
+      </w:r>
+      <w:r>
+        <w:t>menus and toolbar.</w:t>
+      </w:r>
+    </w:p>
+    <w:p>
+      <w:pPr>
+        <w:numPr>
+          <w:ilvl w:val="0"/>
+          <w:numId w:val="11"/>
+        </w:numPr>
+        <w:rPr>
+          <w:rFonts w:hint="eastAsia"/>
+        </w:rPr>
+      </w:pPr>
+      <w:r>
+        <w:t xml:space="preserve">Can save project configuration, bridge settings and form size in mbc file. </w:t>
+      </w:r>
+    </w:p>
+    <w:p>
+      <w:pPr>
+        <w:numPr>
+          <w:ilvl w:val="0"/>
+          <w:numId w:val="11"/>
+        </w:numPr>
+        <w:rPr>
+          <w:rFonts w:hint="eastAsia"/>
+        </w:rPr>
+      </w:pPr>
+      <w:r>
+        <w:lastRenderedPageBreak/>
+        <w:t xml:space="preserve">Communication </w:t>
+      </w:r>
+      <w:r>
+        <w:t>pausing</w:t>
+      </w:r>
+      <w:r>
+        <w:t xml:space="preserve"> and poll-once.</w:t>
+      </w:r>
+    </w:p>
+    <w:p>
+      <w:pPr>
+        <w:numPr>
+          <w:ilvl w:val="0"/>
+          <w:numId w:val="11"/>
+        </w:numPr>
+        <w:rPr>
+          <w:rFonts w:hint="eastAsia"/>
+        </w:rPr>
+      </w:pPr>
+      <w:r>
+        <w:t>C</w:t>
+      </w:r>
+      <w:r>
+        <w:t>hange the connection parameters without having to close and reopen the port.</w:t>
+      </w:r>
+    </w:p>
+    <w:p>
+      <w:pPr>
+        <w:numPr>
+          <w:ilvl w:val="0"/>
+          <w:numId w:val="11"/>
+        </w:numPr>
+        <w:rPr>
+          <w:rFonts w:hint="eastAsia"/>
+        </w:rPr>
+      </w:pPr>
+      <w:r>
+        <w:t xml:space="preserve">If the serial port is not available at start, you can </w:t>
+      </w:r>
+      <w:r>
+        <w:t>immediately</w:t>
+      </w:r>
+      <w:r>
+        <w:t xml:space="preserve"> choose another </w:t>
+      </w:r>
+      <w:r>
+        <w:t>port</w:t>
+      </w:r>
+      <w:r>
         <w:t>.</w:t>
       </w:r>
     </w:p>
     <w:p>
       <w:pPr>
-        <w:pStyle w:val="Lijstalinea"/>
-        <w:numPr>
-          <w:ilvl w:val="0"/>
-          <w:numId w:val="4"/>
-        </w:numPr>
-        <w:rPr>
-          <w:rFonts w:hint="eastAsia"/>
-        </w:rPr>
-      </w:pPr>
-      <w:r>
-        <w:rPr>
-          <w:rFonts w:hint="eastAsia"/>
-        </w:rPr>
-        <w:t>Zoom</w:t>
-      </w:r>
-      <w:r>
-        <w:t>ing</w:t>
-      </w:r>
-      <w:r>
-        <w:rPr>
-          <w:rFonts w:hint="eastAsia"/>
-        </w:rPr>
-        <w:t xml:space="preserve"> now also adjusts the size of the column headers.</w:t>
-      </w:r>
-    </w:p>
-    <w:p>
-      <w:pPr>
-        <w:pStyle w:val="Lijstalinea"/>
-        <w:numPr>
-          <w:ilvl w:val="0"/>
-          <w:numId w:val="4"/>
-        </w:numPr>
-        <w:rPr>
-          <w:rFonts w:hint="eastAsia"/>
-        </w:rPr>
-      </w:pPr>
-      <w:r>
-        <w:rPr>
-          <w:rFonts w:hint="eastAsia"/>
-        </w:rPr>
-        <w:t>You can now close the [</w:t>
-      </w:r>
-      <w:proofErr w:type="spellStart"/>
-      <w:r>
-        <w:rPr>
-          <w:rFonts w:hint="eastAsia"/>
-        </w:rPr>
-        <w:t>Project_Configuration</w:t>
-      </w:r>
-      <w:proofErr w:type="spellEnd"/>
-      <w:r>
-        <w:rPr>
-          <w:rFonts w:hint="eastAsia"/>
-        </w:rPr>
-        <w:t>], [</w:t>
-      </w:r>
-      <w:proofErr w:type="spellStart"/>
-      <w:r>
-        <w:rPr>
-          <w:rFonts w:hint="eastAsia"/>
-        </w:rPr>
-        <w:t>Save_project_file</w:t>
-      </w:r>
-      <w:proofErr w:type="spellEnd"/>
-      <w:r>
-        <w:rPr>
-          <w:rFonts w:hint="eastAsia"/>
-        </w:rPr>
-        <w:t>] and [About] forms with the ESC button</w:t>
-      </w:r>
-      <w:r>
-        <w:t xml:space="preserve"> too</w:t>
-      </w:r>
-      <w:r>
-        <w:rPr>
-          <w:rFonts w:hint="eastAsia"/>
-        </w:rPr>
-        <w:t>.</w:t>
-      </w:r>
-    </w:p>
-    <w:p>
-      <w:pPr>
-        <w:pStyle w:val="Lijstalinea"/>
-        <w:numPr>
-          <w:ilvl w:val="0"/>
-          <w:numId w:val="4"/>
-        </w:numPr>
-        <w:rPr>
-          <w:rFonts w:hint="eastAsia"/>
-        </w:rPr>
-      </w:pPr>
-      <w:r>
-        <w:rPr>
-          <w:rFonts w:hint="eastAsia"/>
-        </w:rPr>
-        <w:t>The expand/collapse icons scale with zoom</w:t>
-      </w:r>
-      <w:r>
-        <w:t>ing</w:t>
-      </w:r>
-      <w:r>
-        <w:rPr>
-          <w:rFonts w:hint="eastAsia"/>
-        </w:rPr>
-        <w:t>.</w:t>
-      </w:r>
-    </w:p>
-    <w:p>
-      <w:pPr>
-        <w:pStyle w:val="Lijstalinea"/>
-        <w:numPr>
-          <w:ilvl w:val="0"/>
-          <w:numId w:val="4"/>
-        </w:numPr>
-        <w:rPr>
-          <w:rFonts w:hint="eastAsia"/>
-        </w:rPr>
-      </w:pPr>
-      <w:r>
-        <w:rPr>
-          <w:rFonts w:hint="eastAsia"/>
-        </w:rPr>
-        <w:t>If an error occurs when loading an mbc file, no auto-connect to the slave/server is done.</w:t>
-      </w:r>
-    </w:p>
-    <w:p>
-      <w:pPr>
-        <w:pStyle w:val="Lijstalinea"/>
-        <w:numPr>
-          <w:ilvl w:val="0"/>
-          <w:numId w:val="4"/>
-        </w:numPr>
-        <w:rPr>
-          <w:rFonts w:hint="eastAsia"/>
-        </w:rPr>
-      </w:pPr>
-      <w:r>
-        <w:rPr>
-          <w:rFonts w:hint="eastAsia"/>
-        </w:rPr>
-        <w:t xml:space="preserve">With </w:t>
-      </w:r>
-      <w:proofErr w:type="spellStart"/>
-      <w:r>
-        <w:rPr>
-          <w:rFonts w:hint="eastAsia"/>
-        </w:rPr>
-        <w:t>Import_file</w:t>
-      </w:r>
-      <w:proofErr w:type="spellEnd"/>
-      <w:r>
-        <w:rPr>
-          <w:rFonts w:hint="eastAsia"/>
-        </w:rPr>
-        <w:t xml:space="preserve"> and </w:t>
-      </w:r>
-      <w:proofErr w:type="spellStart"/>
-      <w:r>
-        <w:rPr>
-          <w:rFonts w:hint="eastAsia"/>
-        </w:rPr>
-        <w:t>Import_compare</w:t>
-      </w:r>
-      <w:proofErr w:type="spellEnd"/>
-      <w:r>
-        <w:rPr>
-          <w:rFonts w:hint="eastAsia"/>
-        </w:rPr>
-        <w:t>: writing/compar</w:t>
-      </w:r>
-      <w:r>
-        <w:t>ing</w:t>
-      </w:r>
-      <w:r>
-        <w:rPr>
-          <w:rFonts w:hint="eastAsia"/>
-        </w:rPr>
-        <w:t xml:space="preserve"> a float32 </w:t>
-      </w:r>
-      <w:r>
-        <w:t>is fixed</w:t>
-      </w:r>
-      <w:r>
-        <w:rPr>
-          <w:rFonts w:hint="eastAsia"/>
-        </w:rPr>
-        <w:t>.</w:t>
-      </w:r>
-    </w:p>
-    <w:p>
-      <w:pPr>
-        <w:pStyle w:val="Kop1"/>
-        <w:rPr>
-          <w:rFonts w:hint="eastAsia"/>
-        </w:rPr>
-      </w:pPr>
-      <w:r>
-        <w:t>v2.0.14 -- 2022-11-08</w:t>
-      </w:r>
-    </w:p>
-    <w:p>
-      <w:pPr>
-        <w:pStyle w:val="Kop3"/>
-        <w:rPr>
-          <w:rFonts w:hint="eastAsia"/>
-        </w:rPr>
-      </w:pPr>
-      <w:r>
-        <w:t>Features</w:t>
-      </w:r>
-    </w:p>
-    <w:p>
-      <w:pPr>
-        <w:numPr>
-          <w:ilvl w:val="0"/>
-          <w:numId w:val="4"/>
-        </w:numPr>
-        <w:rPr>
-          <w:rFonts w:hint="eastAsia"/>
-        </w:rPr>
-      </w:pPr>
-      <w:r>
-        <w:t xml:space="preserve">Added command line parameters. </w:t>
-      </w:r>
-      <w:r>
-        <w:t>These r</w:t>
-      </w:r>
-      <w:r>
-        <w:t xml:space="preserve">eplaces </w:t>
-      </w:r>
-      <w:r>
-        <w:t xml:space="preserve">the </w:t>
-      </w:r>
-      <w:r>
-        <w:t>LocalOverrides</w:t>
-      </w:r>
-      <w:r>
-        <w:t xml:space="preserve"> mechanism.</w:t>
-      </w:r>
-    </w:p>
-    <w:p>
-      <w:pPr>
-        <w:numPr>
-          <w:ilvl w:val="0"/>
-          <w:numId w:val="4"/>
-        </w:numPr>
-        <w:rPr>
-          <w:rFonts w:hint="eastAsia"/>
-        </w:rPr>
-      </w:pPr>
-      <w:r>
-        <w:t xml:space="preserve">LocalOverrides </w:t>
-      </w:r>
-      <w:r>
-        <w:t>mechanism removed.</w:t>
-      </w:r>
-    </w:p>
-    <w:p>
-      <w:pPr>
-        <w:numPr>
-          <w:ilvl w:val="0"/>
-          <w:numId w:val="4"/>
-        </w:numPr>
-        <w:rPr>
-          <w:rFonts w:hint="eastAsia"/>
-        </w:rPr>
-      </w:pPr>
-      <w:r>
-        <w:t>Save project file: the [Update XML to current version] checkbox is now enabled by default.</w:t>
-      </w:r>
-    </w:p>
-    <w:p>
-      <w:pPr>
-        <w:numPr>
-          <w:ilvl w:val="0"/>
-          <w:numId w:val="4"/>
-        </w:numPr>
-        <w:rPr>
-          <w:rFonts w:hint="eastAsia"/>
-        </w:rPr>
-      </w:pPr>
-      <w:r>
-        <w:t>Options form: tooltips improved.</w:t>
-      </w:r>
-    </w:p>
-    <w:p>
-      <w:pPr>
-        <w:numPr>
-          <w:ilvl w:val="0"/>
-          <w:numId w:val="4"/>
-        </w:numPr>
-        <w:rPr>
-          <w:rFonts w:hint="eastAsia"/>
-        </w:rPr>
-      </w:pPr>
-      <w:r>
-        <w:t>Grid: Regist</w:t>
-      </w:r>
-      <w:r>
-        <w:t>er</w:t>
+        <w:numPr>
+          <w:ilvl w:val="0"/>
+          <w:numId w:val="11"/>
+        </w:numPr>
+        <w:rPr>
+          <w:rFonts w:hint="eastAsia"/>
+        </w:rPr>
+      </w:pPr>
+      <w:r>
+        <w:t>M</w:t>
+      </w:r>
+      <w:r>
+        <w:t xml:space="preserve">bc project file: XML tags </w:t>
+      </w:r>
+      <w:r>
+        <w:t xml:space="preserve">are </w:t>
+      </w:r>
+      <w:r>
+        <w:t xml:space="preserve">now preferably in lowercase. The old camelcase is also still accepted. </w:t>
+      </w:r>
+    </w:p>
+    <w:p>
+      <w:pPr>
+        <w:numPr>
+          <w:ilvl w:val="0"/>
+          <w:numId w:val="11"/>
+        </w:numPr>
+        <w:rPr>
+          <w:rFonts w:hint="eastAsia"/>
+        </w:rPr>
+      </w:pPr>
+      <w:r>
+        <w:t>Always shows line numbers f</w:t>
+      </w:r>
+      <w:r>
+        <w:t xml:space="preserve">or errors in mbc file. </w:t>
+      </w:r>
+    </w:p>
+    <w:p>
+      <w:pPr>
+        <w:numPr>
+          <w:ilvl w:val="0"/>
+          <w:numId w:val="11"/>
+        </w:numPr>
+        <w:rPr>
+          <w:rFonts w:hint="eastAsia"/>
+        </w:rPr>
+      </w:pPr>
+      <w:r>
+        <w:t>Word order (endian)</w:t>
       </w:r>
       <w:r>
         <w:t xml:space="preserve"> </w:t>
       </w:r>
       <w:r>
-        <w:t xml:space="preserve">column menu now has </w:t>
-      </w:r>
-      <w:r>
-        <w:t xml:space="preserve"> [</w:t>
-      </w:r>
-      <w:r>
-        <w:t>Expand all]</w:t>
-      </w:r>
-      <w:r>
-        <w:t xml:space="preserve"> and </w:t>
-      </w:r>
-      <w:r>
-        <w:t>[</w:t>
-      </w:r>
-      <w:r>
-        <w:t>Collapse all</w:t>
-      </w:r>
-      <w:r>
-        <w:t>].</w:t>
-      </w:r>
-    </w:p>
-    <w:p>
-      <w:pPr>
-        <w:numPr>
-          <w:ilvl w:val="0"/>
-          <w:numId w:val="4"/>
-        </w:numPr>
-        <w:rPr>
-          <w:rFonts w:hint="eastAsia"/>
-        </w:rPr>
-      </w:pPr>
-      <w:r>
-        <w:t>Mbc project file: &lt;</w:t>
-      </w:r>
-      <w:proofErr w:type="spellStart"/>
-      <w:r>
-        <w:t>longdescr</w:t>
-      </w:r>
-      <w:proofErr w:type="spellEnd"/>
-      <w:r>
-        <w:t xml:space="preserve">&gt; </w:t>
-      </w:r>
-      <w:r>
-        <w:t xml:space="preserve">element </w:t>
-      </w:r>
-      <w:r>
-        <w:t xml:space="preserve">added. </w:t>
-      </w:r>
-      <w:r>
-        <w:t xml:space="preserve">Adds a long multiline text that is show when the mouse is hoovered over the register </w:t>
-      </w:r>
-      <w:proofErr w:type="spellStart"/>
-      <w:r>
-        <w:t>decription</w:t>
-      </w:r>
-      <w:proofErr w:type="spellEnd"/>
-      <w:r>
-        <w:t>.</w:t>
-      </w:r>
-    </w:p>
-    <w:p>
-      <w:pPr>
-        <w:numPr>
-          <w:ilvl w:val="0"/>
-          <w:numId w:val="4"/>
-        </w:numPr>
-        <w:rPr>
-          <w:rFonts w:hint="eastAsia"/>
-        </w:rPr>
-      </w:pPr>
-      <w:r>
-        <w:t>Mbc project file: &lt;include&gt; element added.</w:t>
-      </w:r>
-    </w:p>
-    <w:p>
-      <w:pPr>
-        <w:pStyle w:val="Kop3"/>
-        <w:numPr>
-          <w:ilvl w:val="0"/>
-          <w:numId w:val="0"/>
-        </w:numPr>
-        <w:ind w:left="680" w:hanging="431"/>
-        <w:rPr>
-          <w:rFonts w:hint="eastAsia"/>
-        </w:rPr>
-      </w:pPr>
-      <w:r>
-        <w:t>Fixes</w:t>
-      </w:r>
-    </w:p>
-    <w:p>
-      <w:pPr>
-        <w:numPr>
-          <w:ilvl w:val="0"/>
-          <w:numId w:val="4"/>
-        </w:numPr>
-        <w:rPr>
-          <w:rFonts w:hint="eastAsia"/>
-        </w:rPr>
-      </w:pPr>
-      <w:r>
-        <w:t>[</w:t>
-      </w:r>
-      <w:r>
-        <w:t>Open project file location in Explorer] now works if you gave a filename without a path on the command line.</w:t>
-      </w:r>
-    </w:p>
-    <w:p>
-      <w:pPr>
-        <w:numPr>
-          <w:ilvl w:val="0"/>
-          <w:numId w:val="4"/>
-        </w:numPr>
-        <w:rPr>
-          <w:rFonts w:hint="eastAsia"/>
-        </w:rPr>
-      </w:pPr>
-      <w:r>
-        <w:t xml:space="preserve">The temporary red </w:t>
-      </w:r>
-      <w:r>
-        <w:t>colouring</w:t>
-      </w:r>
-      <w:r>
-        <w:t xml:space="preserve"> of the value field after entering </w:t>
-      </w:r>
-      <w:r>
-        <w:t xml:space="preserve">an invalid value </w:t>
-      </w:r>
-      <w:r>
-        <w:t>has been improved.</w:t>
-      </w:r>
-    </w:p>
-    <w:p>
-      <w:pPr>
-        <w:numPr>
-          <w:ilvl w:val="0"/>
-          <w:numId w:val="4"/>
-        </w:numPr>
-        <w:rPr>
-          <w:rFonts w:hint="eastAsia"/>
-        </w:rPr>
-      </w:pPr>
-      <w:r>
-        <w:t>Edit</w:t>
-      </w:r>
-      <w:r>
-        <w:t xml:space="preserve"> enter/escape </w:t>
-      </w:r>
-      <w:r>
-        <w:t>handling is improved</w:t>
-      </w:r>
-      <w:r>
-        <w:t>.</w:t>
-      </w:r>
-    </w:p>
-    <w:p>
-      <w:pPr>
-        <w:numPr>
-          <w:ilvl w:val="0"/>
-          <w:numId w:val="4"/>
-        </w:numPr>
-        <w:rPr>
-          <w:rFonts w:hint="eastAsia"/>
-        </w:rPr>
-      </w:pPr>
-      <w:r>
-        <w:t xml:space="preserve">In the notification screen that the serial port could not be opened: the [Port] </w:t>
-      </w:r>
-      <w:r>
-        <w:t>combo box</w:t>
-      </w:r>
-      <w:r>
-        <w:t xml:space="preserve"> now automatically refreshes the list of serial ports.</w:t>
-      </w:r>
-    </w:p>
-    <w:p>
-      <w:pPr>
-        <w:pStyle w:val="Kop1"/>
-        <w:rPr>
-          <w:rFonts w:hint="eastAsia"/>
-        </w:rPr>
-      </w:pPr>
-      <w:r>
-        <w:t>v2.0.13 -- 2022-07-11</w:t>
-      </w:r>
-    </w:p>
-    <w:p>
-      <w:pPr>
-        <w:pStyle w:val="Kop3"/>
-        <w:rPr>
-          <w:rFonts w:hint="eastAsia"/>
-        </w:rPr>
-      </w:pPr>
-      <w:r>
-        <w:t>Features</w:t>
-      </w:r>
-    </w:p>
-    <w:p>
-      <w:pPr>
-        <w:numPr>
-          <w:ilvl w:val="0"/>
-          <w:numId w:val="4"/>
-        </w:numPr>
-        <w:rPr>
-          <w:rFonts w:hint="eastAsia"/>
-        </w:rPr>
-      </w:pPr>
-      <w:r>
-        <w:t xml:space="preserve">Added Find/Filter bar. </w:t>
-      </w:r>
-      <w:r>
-        <w:t>Open it using</w:t>
-      </w:r>
-      <w:r>
-        <w:t xml:space="preserve"> Control-F. There is also an option </w:t>
-      </w:r>
-      <w:r>
-        <w:t>“</w:t>
-      </w:r>
-      <w:r>
-        <w:t>Clear Find/Filter on tab change</w:t>
-      </w:r>
-      <w:r>
-        <w:t>”</w:t>
-      </w:r>
-      <w:r>
-        <w:t>.</w:t>
-      </w:r>
-    </w:p>
-    <w:p>
-      <w:pPr>
-        <w:numPr>
-          <w:ilvl w:val="0"/>
-          <w:numId w:val="4"/>
-        </w:numPr>
-        <w:rPr>
-          <w:rFonts w:hint="eastAsia"/>
-        </w:rPr>
-      </w:pPr>
-      <w:r>
-        <w:t>The properties of a register (</w:t>
-      </w:r>
-      <w:proofErr w:type="spellStart"/>
-      <w:r>
-        <w:t>rw</w:t>
-      </w:r>
-      <w:proofErr w:type="spellEnd"/>
-      <w:r>
-        <w:t xml:space="preserve">, int32, ...) are now displayed in a separate </w:t>
-      </w:r>
-      <w:r>
-        <w:t>[</w:t>
-      </w:r>
-      <w:r>
-        <w:t>Properties</w:t>
-      </w:r>
-      <w:r>
-        <w:t>]</w:t>
-      </w:r>
-      <w:r>
-        <w:t xml:space="preserve"> column</w:t>
-      </w:r>
-      <w:r>
-        <w:t xml:space="preserve"> instead of being added to </w:t>
-      </w:r>
-      <w:r>
-        <w:t xml:space="preserve">the </w:t>
-      </w:r>
-      <w:r>
-        <w:t>[</w:t>
-      </w:r>
-      <w:r>
-        <w:t>Description</w:t>
-      </w:r>
-      <w:r>
-        <w:t>]</w:t>
-      </w:r>
-      <w:r>
-        <w:t xml:space="preserve"> column. </w:t>
-      </w:r>
-      <w:r>
-        <w:t xml:space="preserve">The [Properties]  column can </w:t>
-      </w:r>
-      <w:r>
-        <w:lastRenderedPageBreak/>
-        <w:t>be e</w:t>
-      </w:r>
-      <w:r>
-        <w:t>nable/disable</w:t>
-      </w:r>
-      <w:r>
-        <w:t>d</w:t>
-      </w:r>
-      <w:r>
-        <w:t xml:space="preserve"> in Options.</w:t>
-      </w:r>
-    </w:p>
-    <w:p>
-      <w:pPr>
-        <w:numPr>
-          <w:ilvl w:val="0"/>
-          <w:numId w:val="4"/>
-        </w:numPr>
-        <w:rPr>
-          <w:rFonts w:hint="eastAsia"/>
-        </w:rPr>
-      </w:pPr>
-      <w:r>
-        <w:t>The Description text can now be multi-line</w:t>
-      </w:r>
-      <w:r>
-        <w:t>, i</w:t>
-      </w:r>
-      <w:r>
-        <w:t xml:space="preserve">f  the </w:t>
-      </w:r>
-      <w:r>
-        <w:t>“</w:t>
-      </w:r>
-      <w:r>
-        <w:t>Multiline rows with auto row size</w:t>
-      </w:r>
-      <w:r>
-        <w:t>”</w:t>
-      </w:r>
-      <w:r>
-        <w:t xml:space="preserve"> option </w:t>
-      </w:r>
-      <w:r>
-        <w:t>is enabled</w:t>
-      </w:r>
-      <w:r>
-        <w:t xml:space="preserve">. A </w:t>
-      </w:r>
-      <w:r>
-        <w:t xml:space="preserve">long </w:t>
-      </w:r>
-      <w:r>
-        <w:t xml:space="preserve">description </w:t>
-      </w:r>
-      <w:r>
-        <w:t>text is wrappe</w:t>
-      </w:r>
-      <w:r>
-        <w:t xml:space="preserve">d. </w:t>
-      </w:r>
-      <w:r>
-        <w:t>CR/LF</w:t>
-      </w:r>
-      <w:r>
-        <w:t xml:space="preserve">’s can be used in the description text. </w:t>
-      </w:r>
-      <w:r>
-        <w:t xml:space="preserve">The row height of the grid is automatically adjusted to the text. </w:t>
-      </w:r>
-    </w:p>
-    <w:p>
-      <w:pPr>
-        <w:numPr>
-          <w:ilvl w:val="0"/>
-          <w:numId w:val="4"/>
-        </w:numPr>
-        <w:rPr>
-          <w:rFonts w:hint="eastAsia"/>
-        </w:rPr>
-      </w:pPr>
-      <w:r>
-        <w:t>"Move to next row on Enter"</w:t>
-      </w:r>
-      <w:r>
-        <w:t xml:space="preserve"> option</w:t>
-      </w:r>
-      <w:r>
-        <w:t xml:space="preserve">: depending on this option, after entering a new value with the Enter key, the </w:t>
-      </w:r>
-      <w:r>
-        <w:t>cursor</w:t>
-      </w:r>
-      <w:r>
-        <w:t xml:space="preserve"> may or may not go to the next line. </w:t>
-      </w:r>
-      <w:r>
-        <w:t xml:space="preserve">Enter a value with </w:t>
-      </w:r>
-      <w:r>
-        <w:t>Control-Enter</w:t>
-      </w:r>
-      <w:r>
-        <w:t xml:space="preserve"> to get the</w:t>
-      </w:r>
-      <w:r>
-        <w:t xml:space="preserve"> opposite</w:t>
-      </w:r>
-      <w:r>
-        <w:t xml:space="preserve"> behaviour.</w:t>
-      </w:r>
-    </w:p>
-    <w:p>
-      <w:pPr>
-        <w:pStyle w:val="Kop3"/>
-        <w:numPr>
-          <w:ilvl w:val="0"/>
-          <w:numId w:val="0"/>
-        </w:numPr>
-        <w:ind w:left="680" w:hanging="431"/>
-        <w:rPr>
-          <w:rFonts w:hint="eastAsia"/>
-        </w:rPr>
-      </w:pPr>
-      <w:r>
-        <w:t>Fixes</w:t>
-      </w:r>
-    </w:p>
-    <w:p>
-      <w:pPr>
-        <w:numPr>
-          <w:ilvl w:val="0"/>
-          <w:numId w:val="5"/>
-        </w:numPr>
-        <w:rPr>
-          <w:rFonts w:hint="eastAsia"/>
-        </w:rPr>
-      </w:pPr>
-      <w:r>
-        <w:t>Control-0 for zoom reset now works globally on the form, not just when the focus is in the grid.</w:t>
-      </w:r>
-    </w:p>
-    <w:p>
-      <w:pPr>
-        <w:numPr>
-          <w:ilvl w:val="0"/>
-          <w:numId w:val="5"/>
-        </w:numPr>
-        <w:rPr>
-          <w:rFonts w:hint="eastAsia"/>
-        </w:rPr>
-      </w:pPr>
-      <w:r>
-        <w:t>R</w:t>
-      </w:r>
-      <w:r>
-        <w:t>ight-click</w:t>
-      </w:r>
-      <w:r>
-        <w:t>ing</w:t>
-      </w:r>
-      <w:r>
-        <w:t xml:space="preserve"> in the grid</w:t>
-      </w:r>
-      <w:r>
-        <w:t xml:space="preserve"> now moves the focus to that row, to </w:t>
-      </w:r>
-      <w:r>
-        <w:t>better see which row you are working on.</w:t>
-      </w:r>
-    </w:p>
-    <w:p>
-      <w:pPr>
-        <w:numPr>
-          <w:ilvl w:val="0"/>
-          <w:numId w:val="5"/>
-        </w:numPr>
-        <w:rPr>
-          <w:rFonts w:hint="eastAsia"/>
-        </w:rPr>
-      </w:pPr>
-      <w:r>
-        <w:t>Migrated</w:t>
-      </w:r>
-      <w:r>
-        <w:t xml:space="preserve"> to .NET framework 4.7.2.</w:t>
-      </w:r>
-    </w:p>
-    <w:p>
-      <w:pPr>
-        <w:pStyle w:val="Kop1"/>
-        <w:rPr>
-          <w:rFonts w:hint="eastAsia"/>
-        </w:rPr>
-      </w:pPr>
-      <w:r>
-        <w:t>v2.0.12 -- 2020-07-13</w:t>
-      </w:r>
-    </w:p>
-    <w:p>
-      <w:pPr>
-        <w:pStyle w:val="Kop3"/>
-        <w:rPr>
-          <w:rFonts w:hint="eastAsia"/>
-        </w:rPr>
-      </w:pPr>
-      <w:r>
-        <w:t>Features</w:t>
-      </w:r>
-    </w:p>
-    <w:p>
-      <w:pPr>
-        <w:numPr>
-          <w:ilvl w:val="0"/>
-          <w:numId w:val="6"/>
-        </w:numPr>
-        <w:rPr>
-          <w:rFonts w:hint="eastAsia"/>
-        </w:rPr>
-      </w:pPr>
-      <w:r>
-        <w:t>Added mbc project file validation with XSD schema</w:t>
-      </w:r>
-      <w:r>
-        <w:t xml:space="preserve"> file</w:t>
-      </w:r>
-      <w:r>
-        <w:t xml:space="preserve">. </w:t>
-      </w:r>
-      <w:r>
-        <w:t xml:space="preserve">Validation is optional. </w:t>
-      </w:r>
-      <w:r>
-        <w:t>The validation only allows lower-case XML tags</w:t>
-      </w:r>
-      <w:r>
-        <w:t>, a</w:t>
-      </w:r>
-      <w:r>
-        <w:t xml:space="preserve">nd only allows the XML elements that are supported in this version. The intention is that over time all mbc files will </w:t>
-      </w:r>
-      <w:r>
-        <w:t>migrate</w:t>
-      </w:r>
-      <w:r>
-        <w:t xml:space="preserve"> to meet the validation.</w:t>
-      </w:r>
-    </w:p>
-    <w:p>
-      <w:pPr>
-        <w:numPr>
-          <w:ilvl w:val="0"/>
-          <w:numId w:val="6"/>
-        </w:numPr>
-        <w:rPr>
-          <w:rFonts w:hint="eastAsia"/>
-        </w:rPr>
-      </w:pPr>
-      <w:r>
-        <w:t>In</w:t>
-      </w:r>
-      <w:r>
-        <w:t xml:space="preserve"> </w:t>
-      </w:r>
-      <w:r>
-        <w:t xml:space="preserve">the </w:t>
-      </w:r>
-      <w:r>
-        <w:t xml:space="preserve">"Save project file" </w:t>
-      </w:r>
-      <w:r>
-        <w:t xml:space="preserve">form </w:t>
-      </w:r>
-      <w:r>
-        <w:t xml:space="preserve">you now have the option to update the XML with "Update XML to current version" so that it then passes the validation. </w:t>
-      </w:r>
-      <w:r>
-        <w:t>E</w:t>
-      </w:r>
-      <w:r>
-        <w:t>rrors must be corrected manually.</w:t>
-      </w:r>
-    </w:p>
-    <w:p>
-      <w:pPr>
-        <w:numPr>
-          <w:ilvl w:val="0"/>
-          <w:numId w:val="6"/>
-        </w:numPr>
-        <w:rPr>
-          <w:rFonts w:hint="eastAsia"/>
-        </w:rPr>
-      </w:pPr>
-      <w:r>
-        <w:t>In</w:t>
-      </w:r>
-      <w:r>
-        <w:t xml:space="preserve"> "Save project file" the project file is now saved with XML formatting.</w:t>
-      </w:r>
-    </w:p>
-    <w:p>
-      <w:pPr>
-        <w:numPr>
-          <w:ilvl w:val="0"/>
-          <w:numId w:val="6"/>
-        </w:numPr>
-        <w:rPr>
-          <w:rFonts w:hint="eastAsia"/>
-        </w:rPr>
-      </w:pPr>
-      <w:r>
-        <w:t xml:space="preserve">If you start ModbusControl by double-clicking an mbc file and the file points to a non-existent COM port, the error dialog "Error opening serial port </w:t>
-      </w:r>
-      <w:proofErr w:type="spellStart"/>
-      <w:r>
-        <w:t>COMx</w:t>
-      </w:r>
-      <w:proofErr w:type="spellEnd"/>
-      <w:r>
-        <w:t>" now appears after the ModbusControl program appears.</w:t>
-      </w:r>
-    </w:p>
-    <w:p>
-      <w:pPr>
-        <w:numPr>
-          <w:ilvl w:val="0"/>
-          <w:numId w:val="6"/>
-        </w:numPr>
-        <w:rPr>
-          <w:rFonts w:hint="eastAsia"/>
-        </w:rPr>
-      </w:pPr>
-      <w:r>
-        <w:t xml:space="preserve">At the first start </w:t>
-      </w:r>
-      <w:r>
-        <w:t xml:space="preserve">of the program </w:t>
-      </w:r>
-      <w:r>
-        <w:t xml:space="preserve">after an update, </w:t>
-      </w:r>
-      <w:r>
-        <w:t xml:space="preserve">an option is shown </w:t>
-      </w:r>
-      <w:r>
-        <w:t>to see the 'Release notes'.</w:t>
-      </w:r>
-    </w:p>
-    <w:p>
-      <w:pPr>
-        <w:numPr>
-          <w:ilvl w:val="0"/>
-          <w:numId w:val="6"/>
-        </w:numPr>
-        <w:rPr>
-          <w:rFonts w:hint="eastAsia"/>
-        </w:rPr>
-      </w:pPr>
-      <w:r>
-        <w:t xml:space="preserve">Program settings split into user-dependent part and </w:t>
-      </w:r>
-      <w:r>
-        <w:t>computer</w:t>
-      </w:r>
-      <w:r>
-        <w:t xml:space="preserve">-dependent part. The old settings are migrated to the new settings files, then </w:t>
-      </w:r>
-      <w:r>
-        <w:t xml:space="preserve">the </w:t>
-      </w:r>
-      <w:r>
-        <w:t>old settings file is deleted.</w:t>
-      </w:r>
-    </w:p>
-    <w:p>
-      <w:pPr>
-        <w:numPr>
-          <w:ilvl w:val="0"/>
-          <w:numId w:val="6"/>
-        </w:numPr>
-        <w:rPr>
-          <w:rFonts w:hint="eastAsia"/>
-        </w:rPr>
-      </w:pPr>
-      <w:r>
-        <w:t xml:space="preserve">LocalOverrides.xml </w:t>
-      </w:r>
-      <w:r>
-        <w:t xml:space="preserve">file is automatically </w:t>
-      </w:r>
-      <w:r>
-        <w:t>moved from &lt;</w:t>
-      </w:r>
-      <w:proofErr w:type="spellStart"/>
-      <w:r>
-        <w:t>mydocuments</w:t>
-      </w:r>
-      <w:proofErr w:type="spellEnd"/>
-      <w:r>
-        <w:t>&gt;\ModbusControl to %</w:t>
-      </w:r>
-      <w:proofErr w:type="spellStart"/>
-      <w:r>
-        <w:t>AppData</w:t>
-      </w:r>
-      <w:proofErr w:type="spellEnd"/>
-      <w:r>
-        <w:t xml:space="preserve">%\Roaming\E.D.&amp;A\ModbusControl. Content from old is not migrated. Old </w:t>
-      </w:r>
-      <w:r>
-        <w:t>file</w:t>
-      </w:r>
-      <w:r>
-        <w:t xml:space="preserve"> is renamed with '.old' and moved to the </w:t>
-      </w:r>
-      <w:r>
-        <w:t xml:space="preserve">new </w:t>
-      </w:r>
-      <w:r>
-        <w:t>location. If overrides were used, the user will receive a notification.</w:t>
-      </w:r>
-    </w:p>
-    <w:p>
-      <w:pPr>
-        <w:numPr>
-          <w:ilvl w:val="0"/>
-          <w:numId w:val="6"/>
-        </w:numPr>
-        <w:rPr>
-          <w:rFonts w:hint="eastAsia"/>
-        </w:rPr>
-      </w:pPr>
-      <w:r>
-        <w:t>&lt;user&gt;\Documents\ModbusControl is no longer used.</w:t>
-      </w:r>
-    </w:p>
-    <w:p>
-      <w:pPr>
-        <w:pStyle w:val="Kop3"/>
-        <w:rPr>
-          <w:rFonts w:hint="eastAsia"/>
-        </w:rPr>
-      </w:pPr>
-      <w:r>
-        <w:t>Fixes</w:t>
-      </w:r>
-    </w:p>
-    <w:p>
-      <w:pPr>
-        <w:numPr>
-          <w:ilvl w:val="0"/>
-          <w:numId w:val="7"/>
-        </w:numPr>
-        <w:rPr>
-          <w:rFonts w:hint="eastAsia"/>
-        </w:rPr>
-      </w:pPr>
-      <w:r>
-        <w:t>The import/export dialogs now show '*. CSV' instead of '*. C</w:t>
-      </w:r>
-      <w:r>
-        <w:t>VS</w:t>
-      </w:r>
-      <w:r>
-        <w:t>'.</w:t>
-      </w:r>
-    </w:p>
-    <w:p>
-      <w:pPr>
-        <w:numPr>
-          <w:ilvl w:val="0"/>
-          <w:numId w:val="7"/>
-        </w:numPr>
-        <w:rPr>
-          <w:rFonts w:hint="eastAsia"/>
-        </w:rPr>
-      </w:pPr>
-      <w:r>
-        <w:t>Mbc file is now saved without BOM (</w:t>
-      </w:r>
-      <w:r>
-        <w:t>Unicode</w:t>
-      </w:r>
-      <w:r>
-        <w:t xml:space="preserve"> byte order mark).</w:t>
-      </w:r>
-    </w:p>
-    <w:p>
-      <w:pPr>
-        <w:numPr>
-          <w:ilvl w:val="0"/>
-          <w:numId w:val="7"/>
-        </w:numPr>
-        <w:rPr>
-          <w:rFonts w:hint="eastAsia"/>
-        </w:rPr>
-      </w:pPr>
-      <w:r>
-        <w:t xml:space="preserve">Better </w:t>
-      </w:r>
-      <w:r>
-        <w:t>handling</w:t>
-      </w:r>
-      <w:r>
-        <w:t xml:space="preserve"> if </w:t>
-      </w:r>
-      <w:r>
-        <w:t>a</w:t>
-      </w:r>
-      <w:r>
-        <w:t xml:space="preserve"> non-admin</w:t>
-      </w:r>
-      <w:r>
-        <w:t>istrator</w:t>
-      </w:r>
-      <w:r>
-        <w:t xml:space="preserve"> user logs </w:t>
-      </w:r>
-      <w:r>
-        <w:t xml:space="preserve">on </w:t>
-      </w:r>
-      <w:r>
-        <w:t>and uses ModbusControl.</w:t>
-      </w:r>
-    </w:p>
-    <w:p>
-      <w:pPr>
-        <w:pStyle w:val="Kop1"/>
-        <w:rPr>
-          <w:rFonts w:hint="eastAsia"/>
-        </w:rPr>
-      </w:pPr>
-      <w:r>
-        <w:t>v2.0.11 -- 2019-11-18</w:t>
-      </w:r>
-    </w:p>
-    <w:p>
-      <w:pPr>
-        <w:pStyle w:val="Kop3"/>
-        <w:rPr>
-          <w:rFonts w:hint="eastAsia"/>
-        </w:rPr>
-      </w:pPr>
-      <w:r>
-        <w:t>Fixes</w:t>
-      </w:r>
-    </w:p>
-    <w:p>
-      <w:pPr>
-        <w:numPr>
-          <w:ilvl w:val="0"/>
-          <w:numId w:val="8"/>
-        </w:numPr>
-        <w:rPr>
-          <w:rFonts w:hint="eastAsia"/>
-        </w:rPr>
-      </w:pPr>
-      <w:r>
-        <w:t xml:space="preserve">Better handling if the USB/serial connection is lost. In the past </w:t>
-      </w:r>
-      <w:r>
-        <w:t xml:space="preserve">the </w:t>
-      </w:r>
-      <w:r>
-        <w:t xml:space="preserve">program </w:t>
-      </w:r>
-      <w:r>
-        <w:t>could stop responding</w:t>
-      </w:r>
-      <w:r>
-        <w:t>.</w:t>
-      </w:r>
-    </w:p>
-    <w:p>
-      <w:pPr>
-        <w:pStyle w:val="Kop1"/>
-        <w:rPr>
-          <w:rFonts w:hint="eastAsia"/>
-        </w:rPr>
-      </w:pPr>
-      <w:r>
-        <w:lastRenderedPageBreak/>
-        <w:t>v2.0.10 -- 2019-03-11</w:t>
-      </w:r>
-    </w:p>
-    <w:p>
-      <w:pPr>
-        <w:pStyle w:val="Kop3"/>
-        <w:rPr>
-          <w:rFonts w:hint="eastAsia"/>
-        </w:rPr>
-      </w:pPr>
-      <w:r>
-        <w:t>Features</w:t>
-      </w:r>
-    </w:p>
-    <w:p>
-      <w:pPr>
-        <w:numPr>
-          <w:ilvl w:val="0"/>
-          <w:numId w:val="8"/>
-        </w:numPr>
-        <w:rPr>
-          <w:rFonts w:hint="eastAsia"/>
-        </w:rPr>
-      </w:pPr>
-      <w:r>
-        <w:t>Added display</w:t>
-      </w:r>
-      <w:r>
-        <w:t>ing</w:t>
-      </w:r>
-      <w:r>
-        <w:t xml:space="preserve"> of enum </w:t>
-      </w:r>
-      <w:r>
-        <w:t xml:space="preserve">values </w:t>
-      </w:r>
-      <w:r>
-        <w:t xml:space="preserve">in the value column. </w:t>
-      </w:r>
-    </w:p>
-    <w:p>
-      <w:pPr>
-        <w:pStyle w:val="Kop3"/>
-        <w:rPr>
-          <w:rFonts w:hint="eastAsia"/>
-        </w:rPr>
-      </w:pPr>
-      <w:r>
-        <w:t>Fixes</w:t>
-      </w:r>
-    </w:p>
-    <w:p>
-      <w:pPr>
-        <w:numPr>
-          <w:ilvl w:val="0"/>
-          <w:numId w:val="8"/>
-        </w:numPr>
-        <w:rPr>
-          <w:rFonts w:hint="eastAsia"/>
-        </w:rPr>
-      </w:pPr>
-      <w:r>
-        <w:t xml:space="preserve">Menu </w:t>
-      </w:r>
-      <w:r>
-        <w:t xml:space="preserve">item </w:t>
-      </w:r>
-      <w:r>
-        <w:t xml:space="preserve">"Edit project file" did not work </w:t>
-      </w:r>
-      <w:r>
-        <w:t xml:space="preserve">correctly </w:t>
-      </w:r>
-      <w:r>
-        <w:t>if there was a space in the path.</w:t>
-      </w:r>
-    </w:p>
-    <w:p>
-      <w:pPr>
-        <w:numPr>
-          <w:ilvl w:val="0"/>
-          <w:numId w:val="8"/>
-        </w:numPr>
-        <w:rPr>
-          <w:rFonts w:hint="eastAsia"/>
-        </w:rPr>
-      </w:pPr>
-      <w:r>
-        <w:t>Logger: Clear button did not clear number of logs in the status bar.</w:t>
-      </w:r>
-    </w:p>
-    <w:p>
-      <w:pPr>
-        <w:numPr>
-          <w:ilvl w:val="0"/>
-          <w:numId w:val="8"/>
-        </w:numPr>
-        <w:rPr>
-          <w:rFonts w:hint="eastAsia"/>
-        </w:rPr>
-      </w:pPr>
-      <w:r>
-        <w:t xml:space="preserve">Send Custom Modbus Command: allows tabs and CR/LF in the string. </w:t>
-      </w:r>
-      <w:r>
-        <w:t xml:space="preserve">Reports </w:t>
-      </w:r>
-      <w:r>
-        <w:t xml:space="preserve">error </w:t>
-      </w:r>
-      <w:r>
-        <w:t>for</w:t>
-      </w:r>
-      <w:r>
-        <w:t xml:space="preserve"> empty command string. </w:t>
-      </w:r>
-    </w:p>
-    <w:p>
-      <w:pPr>
-        <w:numPr>
-          <w:ilvl w:val="0"/>
-          <w:numId w:val="8"/>
-        </w:numPr>
-        <w:rPr>
-          <w:rFonts w:hint="eastAsia"/>
-        </w:rPr>
-      </w:pPr>
-      <w:r>
-        <w:t xml:space="preserve">Send Custom Modbus Command: </w:t>
-      </w:r>
-      <w:r>
-        <w:t>Reports</w:t>
-      </w:r>
-      <w:r>
-        <w:t xml:space="preserve"> error when command is too short, must be at least 2 bytes.</w:t>
-      </w:r>
-    </w:p>
-    <w:p>
-      <w:pPr>
-        <w:numPr>
-          <w:ilvl w:val="0"/>
-          <w:numId w:val="8"/>
-        </w:numPr>
-        <w:rPr>
-          <w:rFonts w:hint="eastAsia"/>
-        </w:rPr>
-      </w:pPr>
-      <w:r>
-        <w:t xml:space="preserve">Fix background </w:t>
-      </w:r>
-      <w:r>
-        <w:t>colour</w:t>
-      </w:r>
-      <w:r>
-        <w:t xml:space="preserve"> of registers.</w:t>
-      </w:r>
-    </w:p>
-    <w:p>
-      <w:pPr>
-        <w:pStyle w:val="Kop1"/>
-        <w:rPr>
-          <w:rFonts w:hint="eastAsia"/>
-        </w:rPr>
-      </w:pPr>
-      <w:r>
-        <w:t>v2.0.9 -- 2018-10-20</w:t>
-      </w:r>
-    </w:p>
-    <w:p>
-      <w:pPr>
-        <w:pStyle w:val="Kop3"/>
-        <w:rPr>
-          <w:rFonts w:hint="eastAsia"/>
-        </w:rPr>
-      </w:pPr>
-      <w:r>
-        <w:t>Features</w:t>
-      </w:r>
-    </w:p>
-    <w:p>
-      <w:pPr>
-        <w:numPr>
-          <w:ilvl w:val="0"/>
-          <w:numId w:val="9"/>
-        </w:numPr>
-        <w:rPr>
-          <w:rFonts w:hint="eastAsia"/>
-        </w:rPr>
-      </w:pPr>
-      <w:r>
-        <w:t>New option: "Move to next row on Enter".</w:t>
-      </w:r>
-    </w:p>
-    <w:p>
-      <w:pPr>
-        <w:numPr>
-          <w:ilvl w:val="0"/>
-          <w:numId w:val="9"/>
-        </w:numPr>
-        <w:rPr>
-          <w:rFonts w:hint="eastAsia"/>
-        </w:rPr>
-      </w:pPr>
-      <w:r>
-        <w:t xml:space="preserve">New option: "Auto-start edit mode on typing". </w:t>
-      </w:r>
-    </w:p>
-    <w:p>
-      <w:pPr>
-        <w:numPr>
-          <w:ilvl w:val="0"/>
-          <w:numId w:val="9"/>
-        </w:numPr>
-        <w:rPr>
-          <w:rFonts w:hint="eastAsia"/>
-        </w:rPr>
-      </w:pPr>
-      <w:r>
-        <w:t xml:space="preserve">New option: "Use custom editor". </w:t>
-      </w:r>
-    </w:p>
-    <w:p>
-      <w:pPr>
-        <w:numPr>
-          <w:ilvl w:val="0"/>
-          <w:numId w:val="9"/>
-        </w:numPr>
-        <w:rPr>
-          <w:rFonts w:hint="eastAsia"/>
-        </w:rPr>
-      </w:pPr>
-      <w:r>
-        <w:t>New option: "Ignore form size on project reload".</w:t>
-      </w:r>
-    </w:p>
-    <w:p>
-      <w:pPr>
-        <w:numPr>
-          <w:ilvl w:val="0"/>
-          <w:numId w:val="9"/>
-        </w:numPr>
-        <w:rPr>
-          <w:rFonts w:hint="eastAsia"/>
-        </w:rPr>
-      </w:pPr>
-      <w:r>
-        <w:t>Config</w:t>
-      </w:r>
-      <w:r>
-        <w:t>uration</w:t>
-      </w:r>
-      <w:r>
-        <w:t xml:space="preserve"> form now has an Apply button.</w:t>
-      </w:r>
-    </w:p>
-    <w:p>
-      <w:pPr>
-        <w:numPr>
-          <w:ilvl w:val="0"/>
-          <w:numId w:val="9"/>
-        </w:numPr>
-        <w:rPr>
-          <w:rFonts w:hint="eastAsia"/>
-        </w:rPr>
-      </w:pPr>
-      <w:r>
-        <w:t xml:space="preserve">Separate line-copy and value-copy </w:t>
-      </w:r>
-      <w:r>
-        <w:t xml:space="preserve">capability </w:t>
-      </w:r>
-      <w:r>
-        <w:t xml:space="preserve">in grid, </w:t>
-      </w:r>
-      <w:r>
-        <w:t>using</w:t>
-      </w:r>
-      <w:r>
-        <w:t xml:space="preserve"> control-C and context menu.</w:t>
-      </w:r>
-    </w:p>
-    <w:p>
-      <w:pPr>
-        <w:numPr>
-          <w:ilvl w:val="0"/>
-          <w:numId w:val="9"/>
-        </w:numPr>
-        <w:rPr>
-          <w:rFonts w:hint="eastAsia"/>
-        </w:rPr>
-      </w:pPr>
-      <w:r>
-        <w:t xml:space="preserve">The status bar now </w:t>
-      </w:r>
-      <w:r>
-        <w:t xml:space="preserve">has </w:t>
-      </w:r>
-      <w:r>
-        <w:t xml:space="preserve">blue </w:t>
-      </w:r>
-      <w:r>
-        <w:t xml:space="preserve">colour </w:t>
-      </w:r>
-      <w:r>
-        <w:t>if there is no connection or no polling is done.</w:t>
-      </w:r>
-    </w:p>
-    <w:p>
-      <w:pPr>
-        <w:numPr>
-          <w:ilvl w:val="0"/>
-          <w:numId w:val="9"/>
-        </w:numPr>
-        <w:rPr>
-          <w:rFonts w:hint="eastAsia"/>
-        </w:rPr>
-      </w:pPr>
-      <w:r>
-        <w:t xml:space="preserve">The status bar </w:t>
-      </w:r>
-      <w:r>
-        <w:t xml:space="preserve">now has red colour </w:t>
-      </w:r>
-      <w:r>
-        <w:t>for errors.</w:t>
-      </w:r>
-    </w:p>
-    <w:p>
-      <w:pPr>
-        <w:numPr>
-          <w:ilvl w:val="0"/>
-          <w:numId w:val="9"/>
-        </w:numPr>
-        <w:rPr>
-          <w:rFonts w:hint="eastAsia"/>
-        </w:rPr>
-      </w:pPr>
-      <w:r>
-        <w:t xml:space="preserve">Now </w:t>
-      </w:r>
-      <w:r>
-        <w:t>shows</w:t>
-      </w:r>
-      <w:r>
-        <w:t xml:space="preserve"> a warning in the "Save configuration to project file" and "Project configuration" screens if localoverrides </w:t>
-      </w:r>
-      <w:r>
-        <w:t>were</w:t>
-      </w:r>
-      <w:r>
-        <w:t xml:space="preserve"> used.</w:t>
-      </w:r>
-    </w:p>
-    <w:p>
-      <w:pPr>
-        <w:pStyle w:val="Kop3"/>
-        <w:rPr>
-          <w:rFonts w:hint="eastAsia"/>
-        </w:rPr>
-      </w:pPr>
-      <w:r>
-        <w:t>Fixes</w:t>
-      </w:r>
-    </w:p>
-    <w:p>
-      <w:pPr>
-        <w:numPr>
-          <w:ilvl w:val="0"/>
-          <w:numId w:val="10"/>
-        </w:numPr>
-        <w:rPr>
-          <w:rFonts w:hint="eastAsia"/>
-        </w:rPr>
-      </w:pPr>
-      <w:r>
-        <w:t xml:space="preserve">Notification </w:t>
-      </w:r>
-      <w:r>
-        <w:t>if Settings.xml could not be loaded at startup.</w:t>
-      </w:r>
-    </w:p>
-    <w:p>
-      <w:pPr>
-        <w:numPr>
-          <w:ilvl w:val="0"/>
-          <w:numId w:val="10"/>
-        </w:numPr>
-        <w:rPr>
-          <w:rFonts w:hint="eastAsia"/>
-        </w:rPr>
-      </w:pPr>
-      <w:r>
-        <w:t xml:space="preserve">Settings.xml </w:t>
-      </w:r>
-      <w:r>
-        <w:t xml:space="preserve">writing now </w:t>
-      </w:r>
-      <w:r>
-        <w:t>update</w:t>
-      </w:r>
-      <w:r>
-        <w:t>s</w:t>
-      </w:r>
-      <w:r>
-        <w:t>/insert</w:t>
-      </w:r>
-      <w:r>
-        <w:t>s</w:t>
-      </w:r>
-      <w:r>
-        <w:t xml:space="preserve"> </w:t>
-      </w:r>
-      <w:r>
-        <w:t>al</w:t>
-      </w:r>
-      <w:r>
-        <w:t xml:space="preserve">l tags in the </w:t>
-      </w:r>
-      <w:r>
-        <w:t xml:space="preserve">existing </w:t>
-      </w:r>
-      <w:r>
-        <w:t>file instead of writing a completely new file, so that any newer tags from a newer version remain.</w:t>
-      </w:r>
-    </w:p>
-    <w:p>
-      <w:pPr>
-        <w:numPr>
-          <w:ilvl w:val="0"/>
-          <w:numId w:val="10"/>
-        </w:numPr>
-        <w:rPr>
-          <w:rFonts w:hint="eastAsia"/>
-        </w:rPr>
-      </w:pPr>
-      <w:r>
-        <w:t>Project Configuration: Interframe-delay: now shows "0 (auto)" at setting 0.</w:t>
-      </w:r>
-    </w:p>
-    <w:p>
-      <w:pPr>
-        <w:numPr>
-          <w:ilvl w:val="0"/>
-          <w:numId w:val="10"/>
-        </w:numPr>
-        <w:rPr>
-          <w:rFonts w:hint="eastAsia"/>
-        </w:rPr>
-      </w:pPr>
-      <w:r>
-        <w:t xml:space="preserve">Local override project </w:t>
-      </w:r>
-      <w:r>
         <w:t xml:space="preserve">is </w:t>
       </w:r>
       <w:r>
-        <w:t xml:space="preserve">no longer </w:t>
-      </w:r>
-      <w:r>
-        <w:t xml:space="preserve">required to have a </w:t>
-      </w:r>
-      <w:r>
-        <w:t>&lt;modbus&gt; element.</w:t>
-      </w:r>
-    </w:p>
-    <w:p>
-      <w:pPr>
-        <w:numPr>
-          <w:ilvl w:val="0"/>
-          <w:numId w:val="10"/>
-        </w:numPr>
-        <w:rPr>
-          <w:rFonts w:hint="eastAsia"/>
-        </w:rPr>
-      </w:pPr>
-      <w:r>
-        <w:t>Dialog forms can now be closed with the Enter key.</w:t>
-      </w:r>
-    </w:p>
-    <w:p>
-      <w:pPr>
-        <w:numPr>
-          <w:ilvl w:val="0"/>
-          <w:numId w:val="10"/>
-        </w:numPr>
-        <w:rPr>
-          <w:rFonts w:hint="eastAsia"/>
-        </w:rPr>
-      </w:pPr>
-      <w:r>
-        <w:t xml:space="preserve">The </w:t>
-      </w:r>
-      <w:r>
-        <w:t>checkboxes of the "Save configuration to project file" form</w:t>
-      </w:r>
-      <w:r>
-        <w:t xml:space="preserve"> are now cleared when loading a project.</w:t>
-      </w:r>
-    </w:p>
-    <w:p>
-      <w:pPr>
-        <w:numPr>
-          <w:ilvl w:val="0"/>
-          <w:numId w:val="10"/>
-        </w:numPr>
-        <w:rPr>
-          <w:rFonts w:hint="eastAsia"/>
-        </w:rPr>
-      </w:pPr>
-      <w:r>
-        <w:t xml:space="preserve">Buttons at the bottom of the forms now have </w:t>
-      </w:r>
-      <w:r>
-        <w:t>better spacing</w:t>
-      </w:r>
-      <w:r>
-        <w:t>.</w:t>
-      </w:r>
-    </w:p>
-    <w:p>
-      <w:pPr>
-        <w:pStyle w:val="Kop1"/>
-        <w:rPr>
-          <w:rFonts w:hint="eastAsia"/>
-        </w:rPr>
-      </w:pPr>
-      <w:r>
-        <w:t>v2.0.8 -- 2018-08-02</w:t>
-      </w:r>
-    </w:p>
-    <w:p>
-      <w:pPr>
-        <w:pStyle w:val="Kop3"/>
-        <w:rPr>
-          <w:rFonts w:hint="eastAsia"/>
-        </w:rPr>
-      </w:pPr>
-      <w:r>
-        <w:t>Features</w:t>
+        <w:t xml:space="preserve">separately </w:t>
+      </w:r>
+      <w:r>
+        <w:t>configurable</w:t>
+      </w:r>
+      <w:r>
+        <w:t xml:space="preserve"> for int32 and float32. </w:t>
+      </w:r>
+      <w:r>
+        <w:t>Character</w:t>
+      </w:r>
+      <w:r>
+        <w:t xml:space="preserve"> order </w:t>
+      </w:r>
+      <w:r>
+        <w:t xml:space="preserve">is configurable </w:t>
+      </w:r>
+      <w:r>
+        <w:t xml:space="preserve">for ASCII. </w:t>
       </w:r>
     </w:p>
     <w:p>
@@ -2707,188 +2783,7 @@
         </w:rPr>
       </w:pPr>
       <w:r>
-        <w:t xml:space="preserve">Added </w:t>
-      </w:r>
-      <w:r>
-        <w:t>menus and toolbar.</w:t>
-      </w:r>
-    </w:p>
-    <w:p>
-      <w:pPr>
-        <w:numPr>
-          <w:ilvl w:val="0"/>
-          <w:numId w:val="11"/>
-        </w:numPr>
-        <w:rPr>
-          <w:rFonts w:hint="eastAsia"/>
-        </w:rPr>
-      </w:pPr>
-      <w:r>
-        <w:t xml:space="preserve">Can save project configuration, bridge settings and form size in mbc file. </w:t>
-      </w:r>
-    </w:p>
-    <w:p>
-      <w:pPr>
-        <w:numPr>
-          <w:ilvl w:val="0"/>
-          <w:numId w:val="11"/>
-        </w:numPr>
-        <w:rPr>
-          <w:rFonts w:hint="eastAsia"/>
-        </w:rPr>
-      </w:pPr>
-      <w:r>
-        <w:t xml:space="preserve">Communication </w:t>
-      </w:r>
-      <w:r>
-        <w:t>pausing</w:t>
-      </w:r>
-      <w:r>
-        <w:t xml:space="preserve"> and poll-once.</w:t>
-      </w:r>
-    </w:p>
-    <w:p>
-      <w:pPr>
-        <w:numPr>
-          <w:ilvl w:val="0"/>
-          <w:numId w:val="11"/>
-        </w:numPr>
-        <w:rPr>
-          <w:rFonts w:hint="eastAsia"/>
-        </w:rPr>
-      </w:pPr>
-      <w:r>
-        <w:t>C</w:t>
-      </w:r>
-      <w:r>
-        <w:t>hange the connection parameters without having to close and reopen the port.</w:t>
-      </w:r>
-    </w:p>
-    <w:p>
-      <w:pPr>
-        <w:numPr>
-          <w:ilvl w:val="0"/>
-          <w:numId w:val="11"/>
-        </w:numPr>
-        <w:rPr>
-          <w:rFonts w:hint="eastAsia"/>
-        </w:rPr>
-      </w:pPr>
-      <w:r>
-        <w:t xml:space="preserve">If the serial port is not available at start, you can </w:t>
-      </w:r>
-      <w:r>
-        <w:t>immediately</w:t>
-      </w:r>
-      <w:r>
-        <w:t xml:space="preserve"> choose another </w:t>
-      </w:r>
-      <w:r>
-        <w:t>port</w:t>
-      </w:r>
-      <w:r>
-        <w:t>.</w:t>
-      </w:r>
-    </w:p>
-    <w:p>
-      <w:pPr>
-        <w:numPr>
-          <w:ilvl w:val="0"/>
-          <w:numId w:val="11"/>
-        </w:numPr>
-        <w:rPr>
-          <w:rFonts w:hint="eastAsia"/>
-        </w:rPr>
-      </w:pPr>
-      <w:r>
-        <w:t>M</w:t>
-      </w:r>
-      <w:r>
-        <w:t xml:space="preserve">bc project file: XML tags </w:t>
-      </w:r>
-      <w:r>
-        <w:t xml:space="preserve">are </w:t>
-      </w:r>
-      <w:r>
-        <w:t xml:space="preserve">now preferably in lowercase. The old camelcase is also still accepted. </w:t>
-      </w:r>
-    </w:p>
-    <w:p>
-      <w:pPr>
-        <w:numPr>
-          <w:ilvl w:val="0"/>
-          <w:numId w:val="11"/>
-        </w:numPr>
-        <w:rPr>
-          <w:rFonts w:hint="eastAsia"/>
-        </w:rPr>
-      </w:pPr>
-      <w:r>
-        <w:t>Always shows line numbers f</w:t>
-      </w:r>
-      <w:r>
-        <w:t xml:space="preserve">or errors in mbc file. </w:t>
-      </w:r>
-    </w:p>
-    <w:p>
-      <w:pPr>
-        <w:numPr>
-          <w:ilvl w:val="0"/>
-          <w:numId w:val="11"/>
-        </w:numPr>
-        <w:rPr>
-          <w:rFonts w:hint="eastAsia"/>
-        </w:rPr>
-      </w:pPr>
-      <w:r>
-        <w:lastRenderedPageBreak/>
-        <w:t>Word order (endian)</w:t>
-      </w:r>
-      <w:r>
-        <w:t xml:space="preserve"> </w:t>
-      </w:r>
-      <w:r>
-        <w:t xml:space="preserve">is </w:t>
-      </w:r>
-      <w:r>
-        <w:t xml:space="preserve">separately </w:t>
-      </w:r>
-      <w:r>
-        <w:t>configurable</w:t>
-      </w:r>
-      <w:r>
-        <w:t xml:space="preserve"> for int32 and float32. </w:t>
-      </w:r>
-      <w:r>
-        <w:t>Character</w:t>
-      </w:r>
-      <w:r>
-        <w:t xml:space="preserve"> order </w:t>
-      </w:r>
-      <w:r>
-        <w:t xml:space="preserve">is configurable </w:t>
-      </w:r>
-      <w:r>
-        <w:t xml:space="preserve">for ASCII. </w:t>
-      </w:r>
-    </w:p>
-    <w:p>
-      <w:pPr>
-        <w:numPr>
-          <w:ilvl w:val="0"/>
-          <w:numId w:val="11"/>
-        </w:numPr>
-        <w:rPr>
-          <w:rFonts w:hint="eastAsia"/>
-        </w:rPr>
-      </w:pPr>
-      <w:proofErr w:type="spellStart"/>
-      <w:r>
-        <w:t>WriteHoldingregFunctionCode</w:t>
-      </w:r>
-      <w:proofErr w:type="spellEnd"/>
-      <w:r>
-        <w:t xml:space="preserve"> now also supports 'auto'.</w:t>
+        <w:t>WriteHoldingregFunctionCode now also supports 'auto'.</w:t>
       </w:r>
     </w:p>
     <w:p>
@@ -6537,6 +6432,7 @@
   <w:style w:type="character" w:default="1" w:styleId="Standaardalinea-lettertype">
     <w:name w:val="Default Paragraph Font"/>
     <w:uiPriority w:val="1"/>
+    <w:semiHidden/>
     <w:unhideWhenUsed/>
   </w:style>
   <w:style w:type="table" w:default="1" w:styleId="Standaardtabel">

</xml_diff>

<commit_message>
CustomModbusCommand, CustomRead and CustomWrite have been replaced by 1 CustomQueries window with a grid and many more options. ModbusEndians has been replaced by Converts.cs. Tests revised. Added many tests. Fix for “Zooming now also adjusts the size of the column headers”. In the case of "start, choose project Demo, select "Registers read/write" tab, adjust column widths, open connection", the columns widths were lost.
git-svn-id: http://visualsvn.edna.local/EDNA/ModbusControl/V2@4897 03c8d257-35a7-c645-9f01-50f27e98b9e6
</commit_message>
<xml_diff>
--- a/Manuals/ModbusControl - Release notes.docx
+++ b/Manuals/ModbusControl - Release notes.docx
@@ -393,7 +393,19 @@
       </w:r>
       <w:proofErr w:type="spellEnd"/>
       <w:r>
-        <w:t xml:space="preserve"> on, enter edit, backspace to erase all, </w:t>
+        <w:t xml:space="preserve"> on, </w:t>
+      </w:r>
+      <w:r>
+        <w:t>start</w:t>
+      </w:r>
+      <w:r>
+        <w:t xml:space="preserve"> edit, </w:t>
+      </w:r>
+      <w:r>
+        <w:t xml:space="preserve">press </w:t>
+      </w:r>
+      <w:r>
+        <w:t xml:space="preserve">backspace to erase all, </w:t>
       </w:r>
       <w:proofErr w:type="spellStart"/>
       <w:r>
@@ -401,7 +413,31 @@
       </w:r>
       <w:proofErr w:type="spellEnd"/>
       <w:r>
-        <w:t xml:space="preserve"> off, Enter.  Or like: enter edit, backspace 3 times, Enter.  </w:t>
+        <w:t xml:space="preserve"> off, </w:t>
+      </w:r>
+      <w:r>
+        <w:t xml:space="preserve">press </w:t>
+      </w:r>
+      <w:r>
+        <w:t xml:space="preserve">Enter.  Or like: </w:t>
+      </w:r>
+      <w:r>
+        <w:t xml:space="preserve">start </w:t>
+      </w:r>
+      <w:r>
+        <w:t xml:space="preserve">edit, </w:t>
+      </w:r>
+      <w:r>
+        <w:t xml:space="preserve">press </w:t>
+      </w:r>
+      <w:r>
+        <w:t xml:space="preserve">backspace 3 times, </w:t>
+      </w:r>
+      <w:r>
+        <w:t xml:space="preserve">press </w:t>
+      </w:r>
+      <w:r>
+        <w:t xml:space="preserve">Enter.  </w:t>
       </w:r>
     </w:p>
     <w:p>
@@ -1961,15 +1997,7 @@
         </w:rPr>
       </w:pPr>
       <w:r>
-        <w:t xml:space="preserve">If you start ModbusControl by double-clicking an mbc file and the file points to a non-existent COM port, the error dialog "Error opening serial port </w:t>
-      </w:r>
-      <w:proofErr w:type="spellStart"/>
-      <w:r>
-        <w:t>COMx</w:t>
-      </w:r>
-      <w:proofErr w:type="spellEnd"/>
-      <w:r>
-        <w:t>" now appears after the ModbusControl program appears.</w:t>
+        <w:t>If you start ModbusControl by double-clicking an mbc file and the file points to a non-existent COM port, the error dialog "Error opening serial port COMx" now appears after the ModbusControl program appears.</w:t>
       </w:r>
     </w:p>
     <w:p>

</xml_diff>

<commit_message>
Release v2.0.18. Manuals updated.
git-svn-id: http://visualsvn.edna.local/EDNA/ModbusControl/V2@4908 03c8d257-35a7-c645-9f01-50f27e98b9e6
</commit_message>
<xml_diff>
--- a/Manuals/ModbusControl - Release notes.docx
+++ b/Manuals/ModbusControl - Release notes.docx
@@ -7,10 +7,14 @@
         <w:pStyle w:val="Titel"/>
         <w:rPr>
           <w:rFonts w:hint="eastAsia"/>
-        </w:rPr>
-      </w:pPr>
-      <w:r>
-        <w:rPr>
+          <w:sz w:val="44"/>
+          <w:szCs w:val="44"/>
+        </w:rPr>
+      </w:pPr>
+      <w:r>
+        <w:rPr>
+          <w:sz w:val="44"/>
+          <w:szCs w:val="44"/>
           <w:u w:val="single"/>
         </w:rPr>
         <w:t>ModbusControl – Release notes</w:t>
@@ -31,19 +35,300 @@
         <w:rPr>
           <w:color w:val="auto"/>
         </w:rPr>
-        <w:t>1</w:t>
+        <w:t>18 – 2025-</w:t>
       </w:r>
       <w:r>
         <w:rPr>
           <w:color w:val="auto"/>
         </w:rPr>
-        <w:t>7</w:t>
-      </w:r>
-      <w:r>
-        <w:rPr>
+        <w:t>09-09</w:t>
+      </w:r>
+    </w:p>
+    <w:p>
+      <w:pPr>
+        <w:pStyle w:val="Kop3"/>
+        <w:rPr>
+          <w:rFonts w:hint="eastAsia"/>
+        </w:rPr>
+      </w:pPr>
+      <w:r>
+        <w:t>Features</w:t>
+      </w:r>
+    </w:p>
+    <w:p>
+      <w:pPr>
+        <w:pStyle w:val="Lijstalinea"/>
+        <w:numPr>
+          <w:ilvl w:val="0"/>
+          <w:numId w:val="4"/>
+        </w:numPr>
+        <w:rPr>
+          <w:rFonts w:hint="eastAsia"/>
+        </w:rPr>
+      </w:pPr>
+      <w:r>
+        <w:t>New “C</w:t>
+      </w:r>
+      <w:r>
+        <w:rPr>
+          <w:rFonts w:hint="eastAsia"/>
+        </w:rPr>
+        <w:t>u</w:t>
+      </w:r>
+      <w:r>
+        <w:t xml:space="preserve">stom modbus queries” window added. </w:t>
+      </w:r>
+      <w:r>
+        <w:t xml:space="preserve">To the Extra menu. </w:t>
+      </w:r>
+      <w:r>
+        <w:t xml:space="preserve">It replaces the old “Send Read”, “Send write” and “Send custom command” windows. </w:t>
+      </w:r>
+    </w:p>
+    <w:p>
+      <w:pPr>
+        <w:pStyle w:val="Lijstalinea"/>
+        <w:numPr>
+          <w:ilvl w:val="0"/>
+          <w:numId w:val="4"/>
+        </w:numPr>
+        <w:rPr>
+          <w:rFonts w:hint="eastAsia"/>
+        </w:rPr>
+      </w:pPr>
+      <w:r>
+        <w:t>Added saving and restoring main grid column widths</w:t>
+      </w:r>
+      <w:r>
+        <w:t>,</w:t>
+      </w:r>
+      <w:r>
+        <w:t xml:space="preserve"> based on relative weight.</w:t>
+      </w:r>
+    </w:p>
+    <w:p>
+      <w:pPr>
+        <w:pStyle w:val="Lijstalinea"/>
+        <w:numPr>
+          <w:ilvl w:val="0"/>
+          <w:numId w:val="4"/>
+        </w:numPr>
+        <w:rPr>
+          <w:rFonts w:hint="eastAsia"/>
+        </w:rPr>
+      </w:pPr>
+      <w:r>
+        <w:rPr>
+          <w:rFonts w:hint="eastAsia"/>
+        </w:rPr>
+        <w:t>Move</w:t>
+      </w:r>
+      <w:r>
+        <w:t>d</w:t>
+      </w:r>
+      <w:r>
+        <w:rPr>
+          <w:rFonts w:hint="eastAsia"/>
+        </w:rPr>
+        <w:t>“</w:t>
+      </w:r>
+      <w:r>
+        <w:t>D</w:t>
+      </w:r>
+      <w:r>
+        <w:rPr>
+          <w:rFonts w:hint="eastAsia"/>
+        </w:rPr>
+        <w:t>iagnostics counters</w:t>
+      </w:r>
+      <w:r>
+        <w:t>” and “L</w:t>
+      </w:r>
+      <w:r>
+        <w:rPr>
+          <w:rFonts w:hint="eastAsia"/>
+        </w:rPr>
+        <w:t>ogging</w:t>
+      </w:r>
+      <w:r>
+        <w:t xml:space="preserve">” to the </w:t>
+      </w:r>
+      <w:r>
+        <w:rPr>
+          <w:rFonts w:hint="eastAsia"/>
+        </w:rPr>
+        <w:t>Extra menu</w:t>
+      </w:r>
+      <w:r>
+        <w:t>.</w:t>
+      </w:r>
+    </w:p>
+    <w:p>
+      <w:pPr>
+        <w:numPr>
+          <w:ilvl w:val="0"/>
+          <w:numId w:val="4"/>
+        </w:numPr>
+        <w:rPr>
+          <w:rFonts w:hint="eastAsia"/>
+        </w:rPr>
+      </w:pPr>
+      <w:r>
+        <w:t>The ‘Import</w:t>
+      </w:r>
+      <w:r>
+        <w:t>-</w:t>
+      </w:r>
+      <w:r>
+        <w:t xml:space="preserve">Compare’ feature was removed. </w:t>
+      </w:r>
+    </w:p>
+    <w:p>
+      <w:pPr>
+        <w:pStyle w:val="Kop3"/>
+        <w:numPr>
+          <w:ilvl w:val="0"/>
+          <w:numId w:val="0"/>
+        </w:numPr>
+        <w:ind w:left="431" w:hanging="431"/>
+        <w:rPr>
+          <w:rFonts w:hint="eastAsia"/>
+        </w:rPr>
+      </w:pPr>
+      <w:r>
+        <w:t>Fixes</w:t>
+      </w:r>
+    </w:p>
+    <w:p>
+      <w:pPr>
+        <w:numPr>
+          <w:ilvl w:val="0"/>
+          <w:numId w:val="4"/>
+        </w:numPr>
+        <w:rPr>
+          <w:rFonts w:hint="eastAsia"/>
+        </w:rPr>
+      </w:pPr>
+      <w:r>
+        <w:t>In some scenarios, the column widths i</w:t>
+      </w:r>
+      <w:r>
+        <w:rPr>
+          <w:rFonts w:hint="eastAsia"/>
+        </w:rPr>
+        <w:t>nadvertently</w:t>
+      </w:r>
+      <w:r>
+        <w:t xml:space="preserve"> reverted to earlier configurations.</w:t>
+      </w:r>
+    </w:p>
+    <w:p>
+      <w:pPr>
+        <w:numPr>
+          <w:ilvl w:val="0"/>
+          <w:numId w:val="4"/>
+        </w:numPr>
+        <w:rPr>
+          <w:rFonts w:hint="eastAsia"/>
+        </w:rPr>
+      </w:pPr>
+      <w:r>
+        <w:t>W</w:t>
+      </w:r>
+      <w:r>
+        <w:rPr>
+          <w:rFonts w:hint="eastAsia"/>
+        </w:rPr>
+        <w:t>h</w:t>
+      </w:r>
+      <w:r>
+        <w:t>en using “A</w:t>
+      </w:r>
+      <w:r>
+        <w:rPr>
+          <w:rFonts w:hint="eastAsia"/>
+        </w:rPr>
+        <w:t>u</w:t>
+      </w:r>
+      <w:r>
+        <w:t xml:space="preserve">to-start edit mode on typing”, the first digit was lost in non-enum value edits. </w:t>
+      </w:r>
+    </w:p>
+    <w:p>
+      <w:pPr>
+        <w:numPr>
+          <w:ilvl w:val="0"/>
+          <w:numId w:val="4"/>
+        </w:numPr>
+        <w:rPr>
+          <w:rFonts w:hint="eastAsia"/>
+        </w:rPr>
+      </w:pPr>
+      <w:r>
+        <w:t>T</w:t>
+      </w:r>
+      <w:r>
+        <w:rPr>
+          <w:rFonts w:hint="eastAsia"/>
+        </w:rPr>
+        <w:t>h</w:t>
+      </w:r>
+      <w:r>
+        <w:t xml:space="preserve">e </w:t>
+      </w:r>
+      <w:r>
+        <w:rPr>
+          <w:rFonts w:hint="eastAsia"/>
+        </w:rPr>
+        <w:t xml:space="preserve">Export form: </w:t>
+      </w:r>
+      <w:r>
+        <w:t xml:space="preserve">the </w:t>
+      </w:r>
+      <w:r>
+        <w:rPr>
+          <w:rFonts w:hint="eastAsia"/>
+        </w:rPr>
+        <w:t xml:space="preserve">settings </w:t>
+      </w:r>
+      <w:r>
+        <w:t>were not saved/restored.</w:t>
+      </w:r>
+    </w:p>
+    <w:p>
+      <w:pPr>
+        <w:pStyle w:val="Lijstalinea"/>
+        <w:numPr>
+          <w:ilvl w:val="0"/>
+          <w:numId w:val="4"/>
+        </w:numPr>
+        <w:rPr>
+          <w:rFonts w:hint="eastAsia"/>
+        </w:rPr>
+      </w:pPr>
+      <w:r>
+        <w:t>Major refactoring of all conversions and the endianness mechanism. Separate handling for register and bitfield conversions.</w:t>
+      </w:r>
+      <w:r>
+        <w:t xml:space="preserve"> </w:t>
+      </w:r>
+    </w:p>
+    <w:p>
+      <w:pPr>
+        <w:pStyle w:val="Kop1"/>
+        <w:rPr>
+          <w:rFonts w:hint="eastAsia"/>
           <w:color w:val="auto"/>
         </w:rPr>
-        <w:t xml:space="preserve"> – </w:t>
+      </w:pPr>
+      <w:r>
+        <w:t>v2.0.</w:t>
+      </w:r>
+      <w:r>
+        <w:rPr>
+          <w:color w:val="auto"/>
+        </w:rPr>
+        <w:t xml:space="preserve">17 – </w:t>
       </w:r>
       <w:r>
         <w:rPr>
@@ -493,6 +778,7 @@
         </w:rPr>
       </w:pPr>
       <w:r>
+        <w:lastRenderedPageBreak/>
         <w:t>v2.0.</w:t>
       </w:r>
       <w:r>
@@ -542,7 +828,10 @@
         </w:rPr>
       </w:pPr>
       <w:r>
-        <w:t>Project configuration form</w:t>
+        <w:t xml:space="preserve">Project configuration </w:t>
+      </w:r>
+      <w:r>
+        <w:t>window</w:t>
       </w:r>
       <w:r>
         <w:t>:</w:t>
@@ -810,14 +1099,577 @@
         <w:t xml:space="preserve">arlier versions </w:t>
       </w:r>
       <w:r>
-        <w:t xml:space="preserve">first scanned the </w:t>
-      </w:r>
+        <w:t xml:space="preserve">first scanned the file for errors, </w:t>
+      </w:r>
+      <w:r>
+        <w:t>then started import which could report more errors.</w:t>
+      </w:r>
+    </w:p>
+    <w:p>
+      <w:pPr>
+        <w:numPr>
+          <w:ilvl w:val="0"/>
+          <w:numId w:val="4"/>
+        </w:numPr>
+        <w:rPr>
+          <w:rFonts w:hint="eastAsia"/>
+        </w:rPr>
+      </w:pPr>
+      <w:r>
+        <w:t>Import now also ignores lines that only have spaces and/or separators.</w:t>
+      </w:r>
+    </w:p>
+    <w:p>
+      <w:pPr>
+        <w:pStyle w:val="Kop1"/>
+        <w:rPr>
+          <w:rFonts w:hint="eastAsia"/>
+        </w:rPr>
+      </w:pPr>
+      <w:r>
+        <w:t>v2.0.15 – 2023-06-24</w:t>
+      </w:r>
+    </w:p>
+    <w:p>
+      <w:pPr>
+        <w:pStyle w:val="Kop3"/>
+        <w:numPr>
+          <w:ilvl w:val="0"/>
+          <w:numId w:val="0"/>
+        </w:numPr>
+        <w:ind w:left="680" w:hanging="431"/>
+        <w:rPr>
+          <w:rFonts w:hint="eastAsia"/>
+        </w:rPr>
+      </w:pPr>
+      <w:r>
+        <w:rPr>
+          <w:rFonts w:hint="eastAsia"/>
+        </w:rPr>
+        <w:t>Features</w:t>
+      </w:r>
+    </w:p>
+    <w:p>
+      <w:pPr>
+        <w:pStyle w:val="Lijstalinea"/>
+        <w:numPr>
+          <w:ilvl w:val="0"/>
+          <w:numId w:val="4"/>
+        </w:numPr>
+        <w:rPr>
+          <w:rFonts w:hint="eastAsia"/>
+        </w:rPr>
+      </w:pPr>
+      <w:r>
+        <w:rPr>
+          <w:rFonts w:hint="eastAsia"/>
+        </w:rPr>
+        <w:t xml:space="preserve">Enum registers editing now has a dropdown </w:t>
+      </w:r>
+      <w:proofErr w:type="spellStart"/>
+      <w:r>
+        <w:rPr>
+          <w:rFonts w:hint="eastAsia"/>
+        </w:rPr>
+        <w:t>combobox</w:t>
+      </w:r>
+      <w:proofErr w:type="spellEnd"/>
+      <w:r>
+        <w:rPr>
+          <w:rFonts w:hint="eastAsia"/>
+        </w:rPr>
+        <w:t xml:space="preserve"> with possible values.</w:t>
+      </w:r>
+    </w:p>
+    <w:p>
+      <w:pPr>
+        <w:pStyle w:val="Lijstalinea"/>
+        <w:numPr>
+          <w:ilvl w:val="0"/>
+          <w:numId w:val="4"/>
+        </w:numPr>
+        <w:rPr>
+          <w:rFonts w:hint="eastAsia"/>
+        </w:rPr>
+      </w:pPr>
+      <w:r>
+        <w:rPr>
+          <w:rFonts w:hint="eastAsia"/>
+        </w:rPr>
+        <w:t>Mbc file: Enum values now allow a cu</w:t>
+      </w:r>
+      <w:r>
+        <w:t>s</w:t>
+      </w:r>
+      <w:r>
+        <w:rPr>
+          <w:rFonts w:hint="eastAsia"/>
+        </w:rPr>
+        <w:t xml:space="preserve">tom &lt;else&gt; </w:t>
+      </w:r>
+      <w:r>
+        <w:t>text</w:t>
+      </w:r>
+      <w:r>
+        <w:rPr>
+          <w:rFonts w:hint="eastAsia"/>
+        </w:rPr>
+        <w:t xml:space="preserve"> that is shown if no value matches. </w:t>
+      </w:r>
+      <w:r>
+        <w:t>&lt;else&gt; text can be left empty to suppress the message.</w:t>
+      </w:r>
+    </w:p>
+    <w:p>
+      <w:pPr>
+        <w:pStyle w:val="Lijstalinea"/>
+        <w:numPr>
+          <w:ilvl w:val="0"/>
+          <w:numId w:val="4"/>
+        </w:numPr>
+        <w:rPr>
+          <w:rFonts w:hint="eastAsia"/>
+        </w:rPr>
+      </w:pPr>
+      <w:r>
+        <w:rPr>
+          <w:rFonts w:hint="eastAsia"/>
+        </w:rPr>
+        <w:t xml:space="preserve">You can now use </w:t>
+      </w:r>
+      <w:r>
+        <w:t xml:space="preserve">5 digits and 6 digits </w:t>
+      </w:r>
+      <w:r>
+        <w:rPr>
+          <w:rFonts w:hint="eastAsia"/>
+        </w:rPr>
+        <w:t>registers numbering scheme</w:t>
+      </w:r>
+      <w:r>
+        <w:t>,</w:t>
+      </w:r>
+      <w:r>
+        <w:rPr>
+          <w:rFonts w:hint="eastAsia"/>
+        </w:rPr>
+        <w:t xml:space="preserve"> 40001-49999 and 400001-465536</w:t>
+      </w:r>
+      <w:r>
+        <w:t xml:space="preserve">, or </w:t>
+      </w:r>
+      <w:r>
+        <w:rPr>
+          <w:rFonts w:hint="eastAsia"/>
+        </w:rPr>
+        <w:t>40000-49999 and 400000-465535</w:t>
+      </w:r>
+      <w:r>
+        <w:t xml:space="preserve">, </w:t>
+      </w:r>
+      <w:r>
+        <w:rPr>
+          <w:rFonts w:hint="eastAsia"/>
+        </w:rPr>
+        <w:t xml:space="preserve">at the same time. </w:t>
+      </w:r>
+    </w:p>
+    <w:p>
+      <w:pPr>
+        <w:pStyle w:val="Kop3"/>
+        <w:numPr>
+          <w:ilvl w:val="0"/>
+          <w:numId w:val="0"/>
+        </w:numPr>
+        <w:ind w:left="680" w:hanging="431"/>
+        <w:rPr>
+          <w:rFonts w:hint="eastAsia"/>
+        </w:rPr>
+      </w:pPr>
+      <w:r>
+        <w:rPr>
+          <w:rFonts w:hint="eastAsia"/>
+        </w:rPr>
+        <w:t>Fixes</w:t>
+      </w:r>
+    </w:p>
+    <w:p>
+      <w:pPr>
+        <w:pStyle w:val="Lijstalinea"/>
+        <w:numPr>
+          <w:ilvl w:val="0"/>
+          <w:numId w:val="4"/>
+        </w:numPr>
+        <w:rPr>
+          <w:rFonts w:hint="eastAsia"/>
+        </w:rPr>
+      </w:pPr>
+      <w:r>
+        <w:t xml:space="preserve">In </w:t>
+      </w:r>
+      <w:proofErr w:type="spellStart"/>
+      <w:r>
+        <w:t>Import_file</w:t>
+      </w:r>
+      <w:proofErr w:type="spellEnd"/>
+      <w:r>
+        <w:t xml:space="preserve"> and </w:t>
+      </w:r>
+      <w:proofErr w:type="spellStart"/>
+      <w:r>
+        <w:t>Import_compare</w:t>
+      </w:r>
+      <w:proofErr w:type="spellEnd"/>
+      <w:r>
+        <w:t xml:space="preserve">: writing/comparing a float32 </w:t>
+      </w:r>
+      <w:r>
+        <w:t xml:space="preserve">value </w:t>
+      </w:r>
+      <w:r>
+        <w:t>no longer worked.</w:t>
+      </w:r>
+    </w:p>
+    <w:p>
+      <w:pPr>
+        <w:pStyle w:val="Lijstalinea"/>
+        <w:numPr>
+          <w:ilvl w:val="0"/>
+          <w:numId w:val="4"/>
+        </w:numPr>
+        <w:rPr>
+          <w:rFonts w:hint="eastAsia"/>
+        </w:rPr>
+      </w:pPr>
+      <w:r>
+        <w:rPr>
+          <w:rFonts w:hint="eastAsia"/>
+        </w:rPr>
+        <w:t xml:space="preserve">Ascii32 register writing </w:t>
+      </w:r>
+      <w:r>
+        <w:t>fixed.</w:t>
+      </w:r>
+    </w:p>
+    <w:p>
+      <w:pPr>
+        <w:pStyle w:val="Lijstalinea"/>
+        <w:numPr>
+          <w:ilvl w:val="0"/>
+          <w:numId w:val="4"/>
+        </w:numPr>
+        <w:rPr>
+          <w:rFonts w:hint="eastAsia"/>
+        </w:rPr>
+      </w:pPr>
+      <w:r>
+        <w:rPr>
+          <w:rFonts w:hint="eastAsia"/>
+        </w:rPr>
+        <w:t xml:space="preserve">Resizing column width is now </w:t>
+      </w:r>
+      <w:r>
+        <w:t>global for all tabs</w:t>
+      </w:r>
+      <w:r>
+        <w:rPr>
+          <w:rFonts w:hint="eastAsia"/>
+        </w:rPr>
+        <w:t>.</w:t>
+      </w:r>
+    </w:p>
+    <w:p>
+      <w:pPr>
+        <w:pStyle w:val="Lijstalinea"/>
+        <w:numPr>
+          <w:ilvl w:val="0"/>
+          <w:numId w:val="4"/>
+        </w:numPr>
+        <w:rPr>
+          <w:rFonts w:hint="eastAsia"/>
+        </w:rPr>
+      </w:pPr>
+      <w:r>
+        <w:rPr>
+          <w:rFonts w:hint="eastAsia"/>
+        </w:rPr>
+        <w:t>Zoom</w:t>
+      </w:r>
+      <w:r>
+        <w:t>ing</w:t>
+      </w:r>
+      <w:r>
+        <w:rPr>
+          <w:rFonts w:hint="eastAsia"/>
+        </w:rPr>
+        <w:t xml:space="preserve"> now also adjusts the size of the column headers.</w:t>
+      </w:r>
+    </w:p>
+    <w:p>
+      <w:pPr>
+        <w:pStyle w:val="Lijstalinea"/>
+        <w:numPr>
+          <w:ilvl w:val="0"/>
+          <w:numId w:val="4"/>
+        </w:numPr>
+        <w:rPr>
+          <w:rFonts w:hint="eastAsia"/>
+        </w:rPr>
+      </w:pPr>
+      <w:r>
+        <w:rPr>
+          <w:rFonts w:hint="eastAsia"/>
+        </w:rPr>
+        <w:t>You can now close the [</w:t>
+      </w:r>
+      <w:proofErr w:type="spellStart"/>
+      <w:r>
+        <w:rPr>
+          <w:rFonts w:hint="eastAsia"/>
+        </w:rPr>
+        <w:t>Project_Configuration</w:t>
+      </w:r>
+      <w:proofErr w:type="spellEnd"/>
+      <w:r>
+        <w:rPr>
+          <w:rFonts w:hint="eastAsia"/>
+        </w:rPr>
+        <w:t>], [</w:t>
+      </w:r>
+      <w:proofErr w:type="spellStart"/>
+      <w:r>
+        <w:rPr>
+          <w:rFonts w:hint="eastAsia"/>
+        </w:rPr>
+        <w:t>Save_project_file</w:t>
+      </w:r>
+      <w:proofErr w:type="spellEnd"/>
+      <w:r>
+        <w:rPr>
+          <w:rFonts w:hint="eastAsia"/>
+        </w:rPr>
+        <w:t>] and [About] forms with the ESC button</w:t>
+      </w:r>
+      <w:r>
+        <w:t xml:space="preserve"> too</w:t>
+      </w:r>
+      <w:r>
+        <w:rPr>
+          <w:rFonts w:hint="eastAsia"/>
+        </w:rPr>
+        <w:t>.</w:t>
+      </w:r>
+    </w:p>
+    <w:p>
+      <w:pPr>
+        <w:pStyle w:val="Lijstalinea"/>
+        <w:numPr>
+          <w:ilvl w:val="0"/>
+          <w:numId w:val="4"/>
+        </w:numPr>
+        <w:rPr>
+          <w:rFonts w:hint="eastAsia"/>
+        </w:rPr>
+      </w:pPr>
+      <w:r>
+        <w:rPr>
+          <w:rFonts w:hint="eastAsia"/>
+        </w:rPr>
+        <w:t>The expand/collapse icons scale with zoom</w:t>
+      </w:r>
+      <w:r>
+        <w:t>ing</w:t>
+      </w:r>
+      <w:r>
+        <w:rPr>
+          <w:rFonts w:hint="eastAsia"/>
+        </w:rPr>
+        <w:t>.</w:t>
+      </w:r>
+    </w:p>
+    <w:p>
+      <w:pPr>
+        <w:pStyle w:val="Lijstalinea"/>
+        <w:numPr>
+          <w:ilvl w:val="0"/>
+          <w:numId w:val="4"/>
+        </w:numPr>
+        <w:rPr>
+          <w:rFonts w:hint="eastAsia"/>
+        </w:rPr>
+      </w:pPr>
+      <w:r>
+        <w:rPr>
+          <w:rFonts w:hint="eastAsia"/>
+        </w:rPr>
+        <w:t>If an error occurs when loading an mbc file, no auto-connect to the slave/server is done.</w:t>
+      </w:r>
+    </w:p>
+    <w:p>
+      <w:pPr>
+        <w:pStyle w:val="Lijstalinea"/>
+        <w:numPr>
+          <w:ilvl w:val="0"/>
+          <w:numId w:val="4"/>
+        </w:numPr>
+        <w:rPr>
+          <w:rFonts w:hint="eastAsia"/>
+        </w:rPr>
+      </w:pPr>
+      <w:r>
+        <w:rPr>
+          <w:rFonts w:hint="eastAsia"/>
+        </w:rPr>
+        <w:t xml:space="preserve">With </w:t>
+      </w:r>
+      <w:proofErr w:type="spellStart"/>
+      <w:r>
+        <w:rPr>
+          <w:rFonts w:hint="eastAsia"/>
+        </w:rPr>
+        <w:t>Import_file</w:t>
+      </w:r>
+      <w:proofErr w:type="spellEnd"/>
+      <w:r>
+        <w:rPr>
+          <w:rFonts w:hint="eastAsia"/>
+        </w:rPr>
+        <w:t xml:space="preserve"> and </w:t>
+      </w:r>
+      <w:proofErr w:type="spellStart"/>
+      <w:r>
+        <w:rPr>
+          <w:rFonts w:hint="eastAsia"/>
+        </w:rPr>
+        <w:t>Import_compare</w:t>
+      </w:r>
+      <w:proofErr w:type="spellEnd"/>
+      <w:r>
+        <w:rPr>
+          <w:rFonts w:hint="eastAsia"/>
+        </w:rPr>
+        <w:t>: writing/compar</w:t>
+      </w:r>
+      <w:r>
+        <w:t>ing</w:t>
+      </w:r>
+      <w:r>
+        <w:rPr>
+          <w:rFonts w:hint="eastAsia"/>
+        </w:rPr>
+        <w:t xml:space="preserve"> a float32 </w:t>
+      </w:r>
+      <w:r>
+        <w:t>is fixed</w:t>
+      </w:r>
+      <w:r>
+        <w:rPr>
+          <w:rFonts w:hint="eastAsia"/>
+        </w:rPr>
+        <w:t>.</w:t>
+      </w:r>
+    </w:p>
+    <w:p>
+      <w:pPr>
+        <w:pStyle w:val="Kop1"/>
+        <w:rPr>
+          <w:rFonts w:hint="eastAsia"/>
+        </w:rPr>
+      </w:pPr>
+      <w:r>
+        <w:t>v2.0.14 -- 2022-11-08</w:t>
+      </w:r>
+    </w:p>
+    <w:p>
+      <w:pPr>
+        <w:pStyle w:val="Kop3"/>
+        <w:rPr>
+          <w:rFonts w:hint="eastAsia"/>
+        </w:rPr>
+      </w:pPr>
+      <w:r>
+        <w:t>Features</w:t>
+      </w:r>
+    </w:p>
+    <w:p>
+      <w:pPr>
+        <w:numPr>
+          <w:ilvl w:val="0"/>
+          <w:numId w:val="4"/>
+        </w:numPr>
+        <w:rPr>
+          <w:rFonts w:hint="eastAsia"/>
+        </w:rPr>
+      </w:pPr>
+      <w:r>
+        <w:t xml:space="preserve">Added command line parameters. </w:t>
+      </w:r>
+      <w:r>
+        <w:t>These r</w:t>
+      </w:r>
+      <w:r>
+        <w:t xml:space="preserve">eplaces </w:t>
+      </w:r>
+      <w:r>
+        <w:t xml:space="preserve">the </w:t>
+      </w:r>
+      <w:r>
+        <w:t>LocalOverrides</w:t>
+      </w:r>
+      <w:r>
+        <w:t xml:space="preserve"> mechanism.</w:t>
+      </w:r>
+    </w:p>
+    <w:p>
+      <w:pPr>
+        <w:numPr>
+          <w:ilvl w:val="0"/>
+          <w:numId w:val="4"/>
+        </w:numPr>
+        <w:rPr>
+          <w:rFonts w:hint="eastAsia"/>
+        </w:rPr>
+      </w:pPr>
+      <w:r>
+        <w:t xml:space="preserve">LocalOverrides </w:t>
+      </w:r>
+      <w:r>
+        <w:t>mechanism removed.</w:t>
+      </w:r>
+    </w:p>
+    <w:p>
+      <w:pPr>
+        <w:numPr>
+          <w:ilvl w:val="0"/>
+          <w:numId w:val="4"/>
+        </w:numPr>
+        <w:rPr>
+          <w:rFonts w:hint="eastAsia"/>
+        </w:rPr>
+      </w:pPr>
+      <w:r>
+        <w:t>Save project file: the [Update XML to current version] checkbox is now enabled by default.</w:t>
+      </w:r>
+    </w:p>
+    <w:p>
+      <w:pPr>
+        <w:numPr>
+          <w:ilvl w:val="0"/>
+          <w:numId w:val="4"/>
+        </w:numPr>
+        <w:rPr>
+          <w:rFonts w:hint="eastAsia"/>
+        </w:rPr>
+      </w:pPr>
       <w:r>
         <w:lastRenderedPageBreak/>
-        <w:t xml:space="preserve">file for errors, </w:t>
-      </w:r>
-      <w:r>
-        <w:t>then started import which could report more errors.</w:t>
+        <w:t xml:space="preserve">Options </w:t>
+      </w:r>
+      <w:r>
+        <w:t>window</w:t>
+      </w:r>
+      <w:r>
+        <w:t>: tooltips improved.</w:t>
       </w:r>
     </w:p>
     <w:p>
@@ -831,7 +1683,189 @@
         </w:rPr>
       </w:pPr>
       <w:r>
-        <w:t>Import now also ignores lines that only have spaces and/or separators.</w:t>
+        <w:t>Grid: Regist</w:t>
+      </w:r>
+      <w:r>
+        <w:t>er</w:t>
+      </w:r>
+      <w:r>
+        <w:t xml:space="preserve"> </w:t>
+      </w:r>
+      <w:r>
+        <w:t xml:space="preserve">column menu now has </w:t>
+      </w:r>
+      <w:r>
+        <w:t xml:space="preserve"> [</w:t>
+      </w:r>
+      <w:r>
+        <w:t>Expand all]</w:t>
+      </w:r>
+      <w:r>
+        <w:t xml:space="preserve"> and </w:t>
+      </w:r>
+      <w:r>
+        <w:t>[</w:t>
+      </w:r>
+      <w:r>
+        <w:t>Collapse all</w:t>
+      </w:r>
+      <w:r>
+        <w:t>].</w:t>
+      </w:r>
+    </w:p>
+    <w:p>
+      <w:pPr>
+        <w:numPr>
+          <w:ilvl w:val="0"/>
+          <w:numId w:val="4"/>
+        </w:numPr>
+        <w:rPr>
+          <w:rFonts w:hint="eastAsia"/>
+        </w:rPr>
+      </w:pPr>
+      <w:r>
+        <w:t>Mbc project file: &lt;</w:t>
+      </w:r>
+      <w:proofErr w:type="spellStart"/>
+      <w:r>
+        <w:t>longdescr</w:t>
+      </w:r>
+      <w:proofErr w:type="spellEnd"/>
+      <w:r>
+        <w:t xml:space="preserve">&gt; </w:t>
+      </w:r>
+      <w:r>
+        <w:t xml:space="preserve">element </w:t>
+      </w:r>
+      <w:r>
+        <w:t xml:space="preserve">added. </w:t>
+      </w:r>
+      <w:r>
+        <w:t xml:space="preserve">Adds a long multiline text that is show when the mouse is hoovered over the register </w:t>
+      </w:r>
+      <w:proofErr w:type="spellStart"/>
+      <w:r>
+        <w:t>decription</w:t>
+      </w:r>
+      <w:proofErr w:type="spellEnd"/>
+      <w:r>
+        <w:t>.</w:t>
+      </w:r>
+    </w:p>
+    <w:p>
+      <w:pPr>
+        <w:numPr>
+          <w:ilvl w:val="0"/>
+          <w:numId w:val="4"/>
+        </w:numPr>
+        <w:rPr>
+          <w:rFonts w:hint="eastAsia"/>
+        </w:rPr>
+      </w:pPr>
+      <w:r>
+        <w:t>Mbc project file: &lt;include&gt; element added.</w:t>
+      </w:r>
+    </w:p>
+    <w:p>
+      <w:pPr>
+        <w:pStyle w:val="Kop3"/>
+        <w:numPr>
+          <w:ilvl w:val="0"/>
+          <w:numId w:val="0"/>
+        </w:numPr>
+        <w:ind w:left="680" w:hanging="431"/>
+        <w:rPr>
+          <w:rFonts w:hint="eastAsia"/>
+        </w:rPr>
+      </w:pPr>
+      <w:r>
+        <w:t>Fixes</w:t>
+      </w:r>
+    </w:p>
+    <w:p>
+      <w:pPr>
+        <w:numPr>
+          <w:ilvl w:val="0"/>
+          <w:numId w:val="4"/>
+        </w:numPr>
+        <w:rPr>
+          <w:rFonts w:hint="eastAsia"/>
+        </w:rPr>
+      </w:pPr>
+      <w:r>
+        <w:t>[</w:t>
+      </w:r>
+      <w:r>
+        <w:t>Open project file location in Explorer] now works if you gave a filename without a path on the command line.</w:t>
+      </w:r>
+    </w:p>
+    <w:p>
+      <w:pPr>
+        <w:numPr>
+          <w:ilvl w:val="0"/>
+          <w:numId w:val="4"/>
+        </w:numPr>
+        <w:rPr>
+          <w:rFonts w:hint="eastAsia"/>
+        </w:rPr>
+      </w:pPr>
+      <w:r>
+        <w:t xml:space="preserve">The temporary red </w:t>
+      </w:r>
+      <w:r>
+        <w:t>colouring</w:t>
+      </w:r>
+      <w:r>
+        <w:t xml:space="preserve"> of the value field after entering </w:t>
+      </w:r>
+      <w:r>
+        <w:t xml:space="preserve">an invalid value </w:t>
+      </w:r>
+      <w:r>
+        <w:t>has been improved.</w:t>
+      </w:r>
+    </w:p>
+    <w:p>
+      <w:pPr>
+        <w:numPr>
+          <w:ilvl w:val="0"/>
+          <w:numId w:val="4"/>
+        </w:numPr>
+        <w:rPr>
+          <w:rFonts w:hint="eastAsia"/>
+        </w:rPr>
+      </w:pPr>
+      <w:r>
+        <w:t>Edit</w:t>
+      </w:r>
+      <w:r>
+        <w:t xml:space="preserve"> enter/escape </w:t>
+      </w:r>
+      <w:r>
+        <w:t>handling is improved</w:t>
+      </w:r>
+      <w:r>
+        <w:t>.</w:t>
+      </w:r>
+    </w:p>
+    <w:p>
+      <w:pPr>
+        <w:numPr>
+          <w:ilvl w:val="0"/>
+          <w:numId w:val="4"/>
+        </w:numPr>
+        <w:rPr>
+          <w:rFonts w:hint="eastAsia"/>
+        </w:rPr>
+      </w:pPr>
+      <w:r>
+        <w:t xml:space="preserve">In the notification screen that the serial port could not be opened: the [Port] </w:t>
+      </w:r>
+      <w:r>
+        <w:t>combo box</w:t>
+      </w:r>
+      <w:r>
+        <w:t xml:space="preserve"> now automatically refreshes the list of serial ports.</w:t>
       </w:r>
     </w:p>
     <w:p>
@@ -842,12 +1876,219 @@
         </w:rPr>
       </w:pPr>
       <w:r>
-        <w:t>v2.0.15 – 2023-06-24</w:t>
+        <w:t>v2.0.13 -- 2022-07-11</w:t>
       </w:r>
     </w:p>
     <w:p>
       <w:pPr>
         <w:pStyle w:val="Kop3"/>
+        <w:rPr>
+          <w:rFonts w:hint="eastAsia"/>
+        </w:rPr>
+      </w:pPr>
+      <w:r>
+        <w:t>Features</w:t>
+      </w:r>
+    </w:p>
+    <w:p>
+      <w:pPr>
+        <w:numPr>
+          <w:ilvl w:val="0"/>
+          <w:numId w:val="4"/>
+        </w:numPr>
+        <w:rPr>
+          <w:rFonts w:hint="eastAsia"/>
+        </w:rPr>
+      </w:pPr>
+      <w:r>
+        <w:t xml:space="preserve">Added Find/Filter bar. </w:t>
+      </w:r>
+      <w:r>
+        <w:t>Open it using</w:t>
+      </w:r>
+      <w:r>
+        <w:t xml:space="preserve"> Control-F. There is also an option </w:t>
+      </w:r>
+      <w:r>
+        <w:t>“</w:t>
+      </w:r>
+      <w:r>
+        <w:t>Clear Find/Filter on tab change</w:t>
+      </w:r>
+      <w:r>
+        <w:t>”</w:t>
+      </w:r>
+      <w:r>
+        <w:t>.</w:t>
+      </w:r>
+    </w:p>
+    <w:p>
+      <w:pPr>
+        <w:numPr>
+          <w:ilvl w:val="0"/>
+          <w:numId w:val="4"/>
+        </w:numPr>
+        <w:rPr>
+          <w:rFonts w:hint="eastAsia"/>
+        </w:rPr>
+      </w:pPr>
+      <w:r>
+        <w:t>The properties of a register (</w:t>
+      </w:r>
+      <w:proofErr w:type="spellStart"/>
+      <w:r>
+        <w:t>rw</w:t>
+      </w:r>
+      <w:proofErr w:type="spellEnd"/>
+      <w:r>
+        <w:t xml:space="preserve">, int32, ...) are now displayed in a separate </w:t>
+      </w:r>
+      <w:r>
+        <w:t>[</w:t>
+      </w:r>
+      <w:r>
+        <w:t>Properties</w:t>
+      </w:r>
+      <w:r>
+        <w:t>]</w:t>
+      </w:r>
+      <w:r>
+        <w:t xml:space="preserve"> column</w:t>
+      </w:r>
+      <w:r>
+        <w:t xml:space="preserve"> instead of being added to </w:t>
+      </w:r>
+      <w:r>
+        <w:t xml:space="preserve">the </w:t>
+      </w:r>
+      <w:r>
+        <w:t>[</w:t>
+      </w:r>
+      <w:r>
+        <w:t>Description</w:t>
+      </w:r>
+      <w:r>
+        <w:t>]</w:t>
+      </w:r>
+      <w:r>
+        <w:t xml:space="preserve"> column. </w:t>
+      </w:r>
+      <w:r>
+        <w:t>The [Properties]  column can be e</w:t>
+      </w:r>
+      <w:r>
+        <w:t>nable/disable</w:t>
+      </w:r>
+      <w:r>
+        <w:t>d</w:t>
+      </w:r>
+      <w:r>
+        <w:t xml:space="preserve"> in Options.</w:t>
+      </w:r>
+    </w:p>
+    <w:p>
+      <w:pPr>
+        <w:numPr>
+          <w:ilvl w:val="0"/>
+          <w:numId w:val="4"/>
+        </w:numPr>
+        <w:rPr>
+          <w:rFonts w:hint="eastAsia"/>
+        </w:rPr>
+      </w:pPr>
+      <w:r>
+        <w:t>The Description text can now be multi-line</w:t>
+      </w:r>
+      <w:r>
+        <w:t>, i</w:t>
+      </w:r>
+      <w:r>
+        <w:t xml:space="preserve">f  the </w:t>
+      </w:r>
+      <w:r>
+        <w:t>“</w:t>
+      </w:r>
+      <w:r>
+        <w:t>Multiline rows with auto row size</w:t>
+      </w:r>
+      <w:r>
+        <w:t>”</w:t>
+      </w:r>
+      <w:r>
+        <w:t xml:space="preserve"> option </w:t>
+      </w:r>
+      <w:r>
+        <w:t>is enabled</w:t>
+      </w:r>
+      <w:r>
+        <w:t xml:space="preserve">. A </w:t>
+      </w:r>
+      <w:r>
+        <w:t xml:space="preserve">long </w:t>
+      </w:r>
+      <w:r>
+        <w:t xml:space="preserve">description </w:t>
+      </w:r>
+      <w:r>
+        <w:t>text is wrappe</w:t>
+      </w:r>
+      <w:r>
+        <w:t xml:space="preserve">d. </w:t>
+      </w:r>
+      <w:r>
+        <w:t>CR/LF</w:t>
+      </w:r>
+      <w:r>
+        <w:t xml:space="preserve">’s can be used in the description text. </w:t>
+      </w:r>
+      <w:r>
+        <w:t xml:space="preserve">The row height of the grid is automatically adjusted to the text. </w:t>
+      </w:r>
+    </w:p>
+    <w:p>
+      <w:pPr>
+        <w:numPr>
+          <w:ilvl w:val="0"/>
+          <w:numId w:val="4"/>
+        </w:numPr>
+        <w:rPr>
+          <w:rFonts w:hint="eastAsia"/>
+        </w:rPr>
+      </w:pPr>
+      <w:r>
+        <w:t>"Move to next row on Enter"</w:t>
+      </w:r>
+      <w:r>
+        <w:t xml:space="preserve"> option</w:t>
+      </w:r>
+      <w:r>
+        <w:t xml:space="preserve">: depending on this option, after entering a new value with the Enter key, the </w:t>
+      </w:r>
+      <w:r>
+        <w:t>cursor</w:t>
+      </w:r>
+      <w:r>
+        <w:t xml:space="preserve"> may or may not go to the next line. </w:t>
+      </w:r>
+      <w:r>
+        <w:t xml:space="preserve">Enter a value with </w:t>
+      </w:r>
+      <w:r>
+        <w:t>Control-Enter</w:t>
+      </w:r>
+      <w:r>
+        <w:t xml:space="preserve"> to get the</w:t>
+      </w:r>
+      <w:r>
+        <w:t xml:space="preserve"> opposite</w:t>
+      </w:r>
+      <w:r>
+        <w:t xml:space="preserve"> behaviour.</w:t>
+      </w:r>
+    </w:p>
+    <w:p>
+      <w:pPr>
+        <w:pStyle w:val="Kop3"/>
         <w:numPr>
           <w:ilvl w:val="0"/>
           <w:numId w:val="0"/>
@@ -858,446 +2099,1018 @@
         </w:rPr>
       </w:pPr>
       <w:r>
-        <w:rPr>
-          <w:rFonts w:hint="eastAsia"/>
-        </w:rPr>
+        <w:t>Fixes</w:t>
+      </w:r>
+    </w:p>
+    <w:p>
+      <w:pPr>
+        <w:numPr>
+          <w:ilvl w:val="0"/>
+          <w:numId w:val="5"/>
+        </w:numPr>
+        <w:rPr>
+          <w:rFonts w:hint="eastAsia"/>
+        </w:rPr>
+      </w:pPr>
+      <w:r>
+        <w:t xml:space="preserve">Control-0 for zoom reset now works globally on the </w:t>
+      </w:r>
+      <w:r>
+        <w:t>window</w:t>
+      </w:r>
+      <w:r>
+        <w:t>, not just when the focus is in the grid.</w:t>
+      </w:r>
+    </w:p>
+    <w:p>
+      <w:pPr>
+        <w:numPr>
+          <w:ilvl w:val="0"/>
+          <w:numId w:val="5"/>
+        </w:numPr>
+        <w:rPr>
+          <w:rFonts w:hint="eastAsia"/>
+        </w:rPr>
+      </w:pPr>
+      <w:r>
+        <w:t>R</w:t>
+      </w:r>
+      <w:r>
+        <w:t>ight-click</w:t>
+      </w:r>
+      <w:r>
+        <w:t>ing</w:t>
+      </w:r>
+      <w:r>
+        <w:t xml:space="preserve"> in the grid</w:t>
+      </w:r>
+      <w:r>
+        <w:t xml:space="preserve"> now moves the focus to that row, to </w:t>
+      </w:r>
+      <w:r>
+        <w:t>better see which row you are working on.</w:t>
+      </w:r>
+    </w:p>
+    <w:p>
+      <w:pPr>
+        <w:numPr>
+          <w:ilvl w:val="0"/>
+          <w:numId w:val="5"/>
+        </w:numPr>
+        <w:rPr>
+          <w:rFonts w:hint="eastAsia"/>
+        </w:rPr>
+      </w:pPr>
+      <w:r>
+        <w:t>Migrated</w:t>
+      </w:r>
+      <w:r>
+        <w:t xml:space="preserve"> to .NET framework 4.7.2.</w:t>
+      </w:r>
+    </w:p>
+    <w:p>
+      <w:pPr>
+        <w:pStyle w:val="Kop1"/>
+        <w:rPr>
+          <w:rFonts w:hint="eastAsia"/>
+        </w:rPr>
+      </w:pPr>
+      <w:r>
+        <w:t>v2.0.12 -- 2020-07-13</w:t>
+      </w:r>
+    </w:p>
+    <w:p>
+      <w:pPr>
+        <w:pStyle w:val="Kop3"/>
+        <w:rPr>
+          <w:rFonts w:hint="eastAsia"/>
+        </w:rPr>
+      </w:pPr>
+      <w:r>
         <w:t>Features</w:t>
       </w:r>
     </w:p>
     <w:p>
       <w:pPr>
-        <w:pStyle w:val="Lijstalinea"/>
-        <w:numPr>
-          <w:ilvl w:val="0"/>
-          <w:numId w:val="4"/>
-        </w:numPr>
-        <w:rPr>
-          <w:rFonts w:hint="eastAsia"/>
-        </w:rPr>
-      </w:pPr>
-      <w:r>
-        <w:rPr>
-          <w:rFonts w:hint="eastAsia"/>
-        </w:rPr>
-        <w:t xml:space="preserve">Enum registers editing now has a dropdown </w:t>
+        <w:numPr>
+          <w:ilvl w:val="0"/>
+          <w:numId w:val="6"/>
+        </w:numPr>
+        <w:rPr>
+          <w:rFonts w:hint="eastAsia"/>
+        </w:rPr>
+      </w:pPr>
+      <w:r>
+        <w:t>Added mbc project file validation with XSD schema</w:t>
+      </w:r>
+      <w:r>
+        <w:t xml:space="preserve"> file</w:t>
+      </w:r>
+      <w:r>
+        <w:t xml:space="preserve">. </w:t>
+      </w:r>
+      <w:r>
+        <w:t xml:space="preserve">Validation is optional. </w:t>
+      </w:r>
+      <w:r>
+        <w:t>The validation only allows lower-case XML tags</w:t>
+      </w:r>
+      <w:r>
+        <w:t>, a</w:t>
+      </w:r>
+      <w:r>
+        <w:t xml:space="preserve">nd only allows the XML elements that are supported in this version. The intention is that over time all mbc files will </w:t>
+      </w:r>
+      <w:r>
+        <w:t>migrate</w:t>
+      </w:r>
+      <w:r>
+        <w:t xml:space="preserve"> to meet the validation.</w:t>
+      </w:r>
+    </w:p>
+    <w:p>
+      <w:pPr>
+        <w:numPr>
+          <w:ilvl w:val="0"/>
+          <w:numId w:val="6"/>
+        </w:numPr>
+        <w:rPr>
+          <w:rFonts w:hint="eastAsia"/>
+        </w:rPr>
+      </w:pPr>
+      <w:r>
+        <w:t>In</w:t>
+      </w:r>
+      <w:r>
+        <w:t xml:space="preserve"> </w:t>
+      </w:r>
+      <w:r>
+        <w:t xml:space="preserve">the </w:t>
+      </w:r>
+      <w:r>
+        <w:t xml:space="preserve">"Save project file" </w:t>
+      </w:r>
+      <w:r>
+        <w:t>window</w:t>
+      </w:r>
+      <w:r>
+        <w:t xml:space="preserve"> </w:t>
+      </w:r>
+      <w:r>
+        <w:t xml:space="preserve">you now have the option to update the XML with "Update XML to current version" so that it then passes the validation. </w:t>
+      </w:r>
+      <w:r>
+        <w:t>E</w:t>
+      </w:r>
+      <w:r>
+        <w:t>rrors must be corrected manually.</w:t>
+      </w:r>
+    </w:p>
+    <w:p>
+      <w:pPr>
+        <w:numPr>
+          <w:ilvl w:val="0"/>
+          <w:numId w:val="6"/>
+        </w:numPr>
+        <w:rPr>
+          <w:rFonts w:hint="eastAsia"/>
+        </w:rPr>
+      </w:pPr>
+      <w:r>
+        <w:t>In</w:t>
+      </w:r>
+      <w:r>
+        <w:t xml:space="preserve"> "Save project file" the project file is now saved with XML formatting.</w:t>
+      </w:r>
+    </w:p>
+    <w:p>
+      <w:pPr>
+        <w:numPr>
+          <w:ilvl w:val="0"/>
+          <w:numId w:val="6"/>
+        </w:numPr>
+        <w:rPr>
+          <w:rFonts w:hint="eastAsia"/>
+        </w:rPr>
+      </w:pPr>
+      <w:r>
+        <w:t xml:space="preserve">If you start ModbusControl by double-clicking an mbc file and the file points to a non-existent COM port, the error dialog "Error opening serial port </w:t>
       </w:r>
       <w:proofErr w:type="spellStart"/>
       <w:r>
-        <w:rPr>
-          <w:rFonts w:hint="eastAsia"/>
-        </w:rPr>
-        <w:t>combobox</w:t>
+        <w:t>COMx</w:t>
       </w:r>
       <w:proofErr w:type="spellEnd"/>
       <w:r>
-        <w:rPr>
-          <w:rFonts w:hint="eastAsia"/>
-        </w:rPr>
-        <w:t xml:space="preserve"> with possible values.</w:t>
-      </w:r>
-    </w:p>
-    <w:p>
-      <w:pPr>
-        <w:pStyle w:val="Lijstalinea"/>
-        <w:numPr>
-          <w:ilvl w:val="0"/>
-          <w:numId w:val="4"/>
-        </w:numPr>
-        <w:rPr>
-          <w:rFonts w:hint="eastAsia"/>
-        </w:rPr>
-      </w:pPr>
-      <w:r>
-        <w:rPr>
-          <w:rFonts w:hint="eastAsia"/>
-        </w:rPr>
-        <w:t>Mbc file: Enum values now allow a cu</w:t>
+        <w:t xml:space="preserve">" now appears after </w:t>
+      </w:r>
+      <w:r>
+        <w:lastRenderedPageBreak/>
+        <w:t>the ModbusControl program appears.</w:t>
+      </w:r>
+    </w:p>
+    <w:p>
+      <w:pPr>
+        <w:numPr>
+          <w:ilvl w:val="0"/>
+          <w:numId w:val="6"/>
+        </w:numPr>
+        <w:rPr>
+          <w:rFonts w:hint="eastAsia"/>
+        </w:rPr>
+      </w:pPr>
+      <w:r>
+        <w:t xml:space="preserve">At the first start </w:t>
+      </w:r>
+      <w:r>
+        <w:t xml:space="preserve">of the program </w:t>
+      </w:r>
+      <w:r>
+        <w:t xml:space="preserve">after an update, </w:t>
+      </w:r>
+      <w:r>
+        <w:t xml:space="preserve">an option is shown </w:t>
+      </w:r>
+      <w:r>
+        <w:t>to see the 'Release notes'.</w:t>
+      </w:r>
+    </w:p>
+    <w:p>
+      <w:pPr>
+        <w:numPr>
+          <w:ilvl w:val="0"/>
+          <w:numId w:val="6"/>
+        </w:numPr>
+        <w:rPr>
+          <w:rFonts w:hint="eastAsia"/>
+        </w:rPr>
+      </w:pPr>
+      <w:r>
+        <w:t xml:space="preserve">Program settings split into user-dependent part and </w:t>
+      </w:r>
+      <w:r>
+        <w:t>computer</w:t>
+      </w:r>
+      <w:r>
+        <w:t xml:space="preserve">-dependent part. The old settings are migrated to the new settings files, then </w:t>
+      </w:r>
+      <w:r>
+        <w:t xml:space="preserve">the </w:t>
+      </w:r>
+      <w:r>
+        <w:t>old settings file is deleted.</w:t>
+      </w:r>
+    </w:p>
+    <w:p>
+      <w:pPr>
+        <w:numPr>
+          <w:ilvl w:val="0"/>
+          <w:numId w:val="6"/>
+        </w:numPr>
+        <w:rPr>
+          <w:rFonts w:hint="eastAsia"/>
+        </w:rPr>
+      </w:pPr>
+      <w:r>
+        <w:t xml:space="preserve">LocalOverrides.xml </w:t>
+      </w:r>
+      <w:r>
+        <w:t xml:space="preserve">file is automatically </w:t>
+      </w:r>
+      <w:r>
+        <w:t>moved from &lt;</w:t>
+      </w:r>
+      <w:proofErr w:type="spellStart"/>
+      <w:r>
+        <w:t>mydocuments</w:t>
+      </w:r>
+      <w:proofErr w:type="spellEnd"/>
+      <w:r>
+        <w:t>&gt;\ModbusControl to %</w:t>
+      </w:r>
+      <w:proofErr w:type="spellStart"/>
+      <w:r>
+        <w:t>AppData</w:t>
+      </w:r>
+      <w:proofErr w:type="spellEnd"/>
+      <w:r>
+        <w:t xml:space="preserve">%\Roaming\E.D.&amp;A\ModbusControl. Content from old is not migrated. Old </w:t>
+      </w:r>
+      <w:r>
+        <w:t>file</w:t>
+      </w:r>
+      <w:r>
+        <w:t xml:space="preserve"> is renamed with '.old' and moved to the </w:t>
+      </w:r>
+      <w:r>
+        <w:t xml:space="preserve">new </w:t>
+      </w:r>
+      <w:r>
+        <w:t>location. If overrides were used, the user will receive a notification.</w:t>
+      </w:r>
+    </w:p>
+    <w:p>
+      <w:pPr>
+        <w:numPr>
+          <w:ilvl w:val="0"/>
+          <w:numId w:val="6"/>
+        </w:numPr>
+        <w:rPr>
+          <w:rFonts w:hint="eastAsia"/>
+        </w:rPr>
+      </w:pPr>
+      <w:r>
+        <w:t>&lt;user&gt;\Documents\ModbusControl is no longer used.</w:t>
+      </w:r>
+    </w:p>
+    <w:p>
+      <w:pPr>
+        <w:pStyle w:val="Kop3"/>
+        <w:rPr>
+          <w:rFonts w:hint="eastAsia"/>
+        </w:rPr>
+      </w:pPr>
+      <w:r>
+        <w:t>Fixes</w:t>
+      </w:r>
+    </w:p>
+    <w:p>
+      <w:pPr>
+        <w:numPr>
+          <w:ilvl w:val="0"/>
+          <w:numId w:val="7"/>
+        </w:numPr>
+        <w:rPr>
+          <w:rFonts w:hint="eastAsia"/>
+        </w:rPr>
+      </w:pPr>
+      <w:r>
+        <w:t>The import/export dialogs now show '*. CSV' instead of '*. C</w:t>
+      </w:r>
+      <w:r>
+        <w:t>VS</w:t>
+      </w:r>
+      <w:r>
+        <w:t>'.</w:t>
+      </w:r>
+    </w:p>
+    <w:p>
+      <w:pPr>
+        <w:numPr>
+          <w:ilvl w:val="0"/>
+          <w:numId w:val="7"/>
+        </w:numPr>
+        <w:rPr>
+          <w:rFonts w:hint="eastAsia"/>
+        </w:rPr>
+      </w:pPr>
+      <w:r>
+        <w:t>Mbc file is now saved without BOM (</w:t>
+      </w:r>
+      <w:r>
+        <w:t>Unicode</w:t>
+      </w:r>
+      <w:r>
+        <w:t xml:space="preserve"> byte order mark).</w:t>
+      </w:r>
+    </w:p>
+    <w:p>
+      <w:pPr>
+        <w:numPr>
+          <w:ilvl w:val="0"/>
+          <w:numId w:val="7"/>
+        </w:numPr>
+        <w:rPr>
+          <w:rFonts w:hint="eastAsia"/>
+        </w:rPr>
+      </w:pPr>
+      <w:r>
+        <w:t xml:space="preserve">Better </w:t>
+      </w:r>
+      <w:r>
+        <w:t>handling</w:t>
+      </w:r>
+      <w:r>
+        <w:t xml:space="preserve"> if </w:t>
+      </w:r>
+      <w:r>
+        <w:t>a</w:t>
+      </w:r>
+      <w:r>
+        <w:t xml:space="preserve"> non-admin</w:t>
+      </w:r>
+      <w:r>
+        <w:t>istrator</w:t>
+      </w:r>
+      <w:r>
+        <w:t xml:space="preserve"> user logs </w:t>
+      </w:r>
+      <w:r>
+        <w:t xml:space="preserve">on </w:t>
+      </w:r>
+      <w:r>
+        <w:t>and uses ModbusControl.</w:t>
+      </w:r>
+    </w:p>
+    <w:p>
+      <w:pPr>
+        <w:pStyle w:val="Kop1"/>
+        <w:rPr>
+          <w:rFonts w:hint="eastAsia"/>
+        </w:rPr>
+      </w:pPr>
+      <w:r>
+        <w:t>v2.0.11 -- 2019-11-18</w:t>
+      </w:r>
+    </w:p>
+    <w:p>
+      <w:pPr>
+        <w:pStyle w:val="Kop3"/>
+        <w:rPr>
+          <w:rFonts w:hint="eastAsia"/>
+        </w:rPr>
+      </w:pPr>
+      <w:r>
+        <w:t>Fixes</w:t>
+      </w:r>
+    </w:p>
+    <w:p>
+      <w:pPr>
+        <w:numPr>
+          <w:ilvl w:val="0"/>
+          <w:numId w:val="8"/>
+        </w:numPr>
+        <w:rPr>
+          <w:rFonts w:hint="eastAsia"/>
+        </w:rPr>
+      </w:pPr>
+      <w:r>
+        <w:t xml:space="preserve">Better handling if the USB/serial connection is lost. In the past </w:t>
+      </w:r>
+      <w:r>
+        <w:t xml:space="preserve">the </w:t>
+      </w:r>
+      <w:r>
+        <w:t xml:space="preserve">program </w:t>
+      </w:r>
+      <w:r>
+        <w:t>could stop responding</w:t>
+      </w:r>
+      <w:r>
+        <w:t>.</w:t>
+      </w:r>
+    </w:p>
+    <w:p>
+      <w:pPr>
+        <w:pStyle w:val="Kop1"/>
+        <w:rPr>
+          <w:rFonts w:hint="eastAsia"/>
+        </w:rPr>
+      </w:pPr>
+      <w:r>
+        <w:t>v2.0.10 -- 2019-03-11</w:t>
+      </w:r>
+    </w:p>
+    <w:p>
+      <w:pPr>
+        <w:pStyle w:val="Kop3"/>
+        <w:rPr>
+          <w:rFonts w:hint="eastAsia"/>
+        </w:rPr>
+      </w:pPr>
+      <w:r>
+        <w:t>Features</w:t>
+      </w:r>
+    </w:p>
+    <w:p>
+      <w:pPr>
+        <w:numPr>
+          <w:ilvl w:val="0"/>
+          <w:numId w:val="8"/>
+        </w:numPr>
+        <w:rPr>
+          <w:rFonts w:hint="eastAsia"/>
+        </w:rPr>
+      </w:pPr>
+      <w:r>
+        <w:t>Added display</w:t>
+      </w:r>
+      <w:r>
+        <w:t>ing</w:t>
+      </w:r>
+      <w:r>
+        <w:t xml:space="preserve"> of enum </w:t>
+      </w:r>
+      <w:r>
+        <w:t xml:space="preserve">values </w:t>
+      </w:r>
+      <w:r>
+        <w:t xml:space="preserve">in the value column. </w:t>
+      </w:r>
+    </w:p>
+    <w:p>
+      <w:pPr>
+        <w:pStyle w:val="Kop3"/>
+        <w:rPr>
+          <w:rFonts w:hint="eastAsia"/>
+        </w:rPr>
+      </w:pPr>
+      <w:r>
+        <w:t>Fixes</w:t>
+      </w:r>
+    </w:p>
+    <w:p>
+      <w:pPr>
+        <w:numPr>
+          <w:ilvl w:val="0"/>
+          <w:numId w:val="8"/>
+        </w:numPr>
+        <w:rPr>
+          <w:rFonts w:hint="eastAsia"/>
+        </w:rPr>
+      </w:pPr>
+      <w:r>
+        <w:t xml:space="preserve">Menu </w:t>
+      </w:r>
+      <w:r>
+        <w:t xml:space="preserve">item </w:t>
+      </w:r>
+      <w:r>
+        <w:t xml:space="preserve">"Edit project file" did not work </w:t>
+      </w:r>
+      <w:r>
+        <w:t xml:space="preserve">correctly </w:t>
+      </w:r>
+      <w:r>
+        <w:t>if there was a space in the path.</w:t>
+      </w:r>
+    </w:p>
+    <w:p>
+      <w:pPr>
+        <w:numPr>
+          <w:ilvl w:val="0"/>
+          <w:numId w:val="8"/>
+        </w:numPr>
+        <w:rPr>
+          <w:rFonts w:hint="eastAsia"/>
+        </w:rPr>
+      </w:pPr>
+      <w:r>
+        <w:t>Logger: Clear button did not clear number of logs in the status bar.</w:t>
+      </w:r>
+    </w:p>
+    <w:p>
+      <w:pPr>
+        <w:numPr>
+          <w:ilvl w:val="0"/>
+          <w:numId w:val="8"/>
+        </w:numPr>
+        <w:rPr>
+          <w:rFonts w:hint="eastAsia"/>
+        </w:rPr>
+      </w:pPr>
+      <w:r>
+        <w:t xml:space="preserve">Send Custom Modbus Command: allows tabs and CR/LF in the string. </w:t>
+      </w:r>
+      <w:r>
+        <w:t xml:space="preserve">Reports </w:t>
+      </w:r>
+      <w:r>
+        <w:t xml:space="preserve">error </w:t>
+      </w:r>
+      <w:r>
+        <w:t>for</w:t>
+      </w:r>
+      <w:r>
+        <w:t xml:space="preserve"> empty command string. </w:t>
+      </w:r>
+    </w:p>
+    <w:p>
+      <w:pPr>
+        <w:numPr>
+          <w:ilvl w:val="0"/>
+          <w:numId w:val="8"/>
+        </w:numPr>
+        <w:rPr>
+          <w:rFonts w:hint="eastAsia"/>
+        </w:rPr>
+      </w:pPr>
+      <w:r>
+        <w:t xml:space="preserve">Send Custom Modbus Command: </w:t>
+      </w:r>
+      <w:r>
+        <w:t>Reports</w:t>
+      </w:r>
+      <w:r>
+        <w:t xml:space="preserve"> error when command is too short, must be at least 2 bytes.</w:t>
+      </w:r>
+    </w:p>
+    <w:p>
+      <w:pPr>
+        <w:numPr>
+          <w:ilvl w:val="0"/>
+          <w:numId w:val="8"/>
+        </w:numPr>
+        <w:rPr>
+          <w:rFonts w:hint="eastAsia"/>
+        </w:rPr>
+      </w:pPr>
+      <w:r>
+        <w:t xml:space="preserve">Fix background </w:t>
+      </w:r>
+      <w:r>
+        <w:t>colour</w:t>
+      </w:r>
+      <w:r>
+        <w:t xml:space="preserve"> of registers.</w:t>
+      </w:r>
+    </w:p>
+    <w:p>
+      <w:pPr>
+        <w:pStyle w:val="Kop1"/>
+        <w:rPr>
+          <w:rFonts w:hint="eastAsia"/>
+        </w:rPr>
+      </w:pPr>
+      <w:r>
+        <w:t>v2.0.9 -- 2018-10-20</w:t>
+      </w:r>
+    </w:p>
+    <w:p>
+      <w:pPr>
+        <w:pStyle w:val="Kop3"/>
+        <w:rPr>
+          <w:rFonts w:hint="eastAsia"/>
+        </w:rPr>
+      </w:pPr>
+      <w:r>
+        <w:t>Features</w:t>
+      </w:r>
+    </w:p>
+    <w:p>
+      <w:pPr>
+        <w:numPr>
+          <w:ilvl w:val="0"/>
+          <w:numId w:val="9"/>
+        </w:numPr>
+        <w:rPr>
+          <w:rFonts w:hint="eastAsia"/>
+        </w:rPr>
+      </w:pPr>
+      <w:r>
+        <w:t>New option: "Move to next row on Enter".</w:t>
+      </w:r>
+    </w:p>
+    <w:p>
+      <w:pPr>
+        <w:numPr>
+          <w:ilvl w:val="0"/>
+          <w:numId w:val="9"/>
+        </w:numPr>
+        <w:rPr>
+          <w:rFonts w:hint="eastAsia"/>
+        </w:rPr>
+      </w:pPr>
+      <w:r>
+        <w:t xml:space="preserve">New option: "Auto-start edit mode on typing". </w:t>
+      </w:r>
+    </w:p>
+    <w:p>
+      <w:pPr>
+        <w:numPr>
+          <w:ilvl w:val="0"/>
+          <w:numId w:val="9"/>
+        </w:numPr>
+        <w:rPr>
+          <w:rFonts w:hint="eastAsia"/>
+        </w:rPr>
+      </w:pPr>
+      <w:r>
+        <w:t xml:space="preserve">New option: "Use custom editor". </w:t>
+      </w:r>
+    </w:p>
+    <w:p>
+      <w:pPr>
+        <w:numPr>
+          <w:ilvl w:val="0"/>
+          <w:numId w:val="9"/>
+        </w:numPr>
+        <w:rPr>
+          <w:rFonts w:hint="eastAsia"/>
+        </w:rPr>
+      </w:pPr>
+      <w:r>
+        <w:t>New option: "Ignore form size on project reload".</w:t>
+      </w:r>
+    </w:p>
+    <w:p>
+      <w:pPr>
+        <w:numPr>
+          <w:ilvl w:val="0"/>
+          <w:numId w:val="9"/>
+        </w:numPr>
+        <w:rPr>
+          <w:rFonts w:hint="eastAsia"/>
+        </w:rPr>
+      </w:pPr>
+      <w:r>
+        <w:t>Config</w:t>
+      </w:r>
+      <w:r>
+        <w:t>uration</w:t>
+      </w:r>
+      <w:r>
+        <w:t xml:space="preserve"> </w:t>
+      </w:r>
+      <w:r>
+        <w:t>window</w:t>
+      </w:r>
+      <w:r>
+        <w:t xml:space="preserve"> now has an Apply button.</w:t>
+      </w:r>
+    </w:p>
+    <w:p>
+      <w:pPr>
+        <w:numPr>
+          <w:ilvl w:val="0"/>
+          <w:numId w:val="9"/>
+        </w:numPr>
+        <w:rPr>
+          <w:rFonts w:hint="eastAsia"/>
+        </w:rPr>
+      </w:pPr>
+      <w:r>
+        <w:t xml:space="preserve">Separate line-copy and value-copy </w:t>
+      </w:r>
+      <w:r>
+        <w:t xml:space="preserve">capability </w:t>
+      </w:r>
+      <w:r>
+        <w:t xml:space="preserve">in grid, </w:t>
+      </w:r>
+      <w:r>
+        <w:t>using</w:t>
+      </w:r>
+      <w:r>
+        <w:t xml:space="preserve"> control-C and context menu.</w:t>
+      </w:r>
+    </w:p>
+    <w:p>
+      <w:pPr>
+        <w:numPr>
+          <w:ilvl w:val="0"/>
+          <w:numId w:val="9"/>
+        </w:numPr>
+        <w:rPr>
+          <w:rFonts w:hint="eastAsia"/>
+        </w:rPr>
+      </w:pPr>
+      <w:r>
+        <w:t xml:space="preserve">The status bar now </w:t>
+      </w:r>
+      <w:r>
+        <w:t xml:space="preserve">has </w:t>
+      </w:r>
+      <w:r>
+        <w:t xml:space="preserve">blue </w:t>
+      </w:r>
+      <w:r>
+        <w:t xml:space="preserve">colour </w:t>
+      </w:r>
+      <w:r>
+        <w:t>if there is no connection or no polling is done.</w:t>
+      </w:r>
+    </w:p>
+    <w:p>
+      <w:pPr>
+        <w:numPr>
+          <w:ilvl w:val="0"/>
+          <w:numId w:val="9"/>
+        </w:numPr>
+        <w:rPr>
+          <w:rFonts w:hint="eastAsia"/>
+        </w:rPr>
+      </w:pPr>
+      <w:r>
+        <w:t xml:space="preserve">The status bar </w:t>
+      </w:r>
+      <w:r>
+        <w:t xml:space="preserve">now has red colour </w:t>
+      </w:r>
+      <w:r>
+        <w:t>for errors.</w:t>
+      </w:r>
+    </w:p>
+    <w:p>
+      <w:pPr>
+        <w:numPr>
+          <w:ilvl w:val="0"/>
+          <w:numId w:val="9"/>
+        </w:numPr>
+        <w:rPr>
+          <w:rFonts w:hint="eastAsia"/>
+        </w:rPr>
+      </w:pPr>
+      <w:r>
+        <w:t xml:space="preserve">Now </w:t>
+      </w:r>
+      <w:r>
+        <w:t>shows</w:t>
+      </w:r>
+      <w:r>
+        <w:t xml:space="preserve"> a warning in the "Save configuration to project file" and "Project configuration" screens if localoverrides </w:t>
+      </w:r>
+      <w:r>
+        <w:t>were</w:t>
+      </w:r>
+      <w:r>
+        <w:t xml:space="preserve"> used.</w:t>
+      </w:r>
+    </w:p>
+    <w:p>
+      <w:pPr>
+        <w:pStyle w:val="Kop3"/>
+        <w:rPr>
+          <w:rFonts w:hint="eastAsia"/>
+        </w:rPr>
+      </w:pPr>
+      <w:r>
+        <w:lastRenderedPageBreak/>
+        <w:t>Fixes</w:t>
+      </w:r>
+    </w:p>
+    <w:p>
+      <w:pPr>
+        <w:numPr>
+          <w:ilvl w:val="0"/>
+          <w:numId w:val="10"/>
+        </w:numPr>
+        <w:rPr>
+          <w:rFonts w:hint="eastAsia"/>
+        </w:rPr>
+      </w:pPr>
+      <w:r>
+        <w:t xml:space="preserve">Notification </w:t>
+      </w:r>
+      <w:r>
+        <w:t>if Settings.xml could not be loaded at startup.</w:t>
+      </w:r>
+    </w:p>
+    <w:p>
+      <w:pPr>
+        <w:numPr>
+          <w:ilvl w:val="0"/>
+          <w:numId w:val="10"/>
+        </w:numPr>
+        <w:rPr>
+          <w:rFonts w:hint="eastAsia"/>
+        </w:rPr>
+      </w:pPr>
+      <w:r>
+        <w:t xml:space="preserve">Settings.xml </w:t>
+      </w:r>
+      <w:r>
+        <w:t xml:space="preserve">writing now </w:t>
+      </w:r>
+      <w:r>
+        <w:t>update</w:t>
       </w:r>
       <w:r>
         <w:t>s</w:t>
       </w:r>
       <w:r>
-        <w:rPr>
-          <w:rFonts w:hint="eastAsia"/>
-        </w:rPr>
-        <w:t xml:space="preserve">tom &lt;else&gt; </w:t>
-      </w:r>
-      <w:r>
-        <w:t>text</w:t>
-      </w:r>
-      <w:r>
-        <w:rPr>
-          <w:rFonts w:hint="eastAsia"/>
-        </w:rPr>
-        <w:t xml:space="preserve"> that is shown if no value matches. </w:t>
-      </w:r>
-      <w:r>
-        <w:t>&lt;else&gt; text can be left empty to suppress the message.</w:t>
-      </w:r>
-    </w:p>
-    <w:p>
-      <w:pPr>
-        <w:pStyle w:val="Lijstalinea"/>
-        <w:numPr>
-          <w:ilvl w:val="0"/>
-          <w:numId w:val="4"/>
-        </w:numPr>
-        <w:rPr>
-          <w:rFonts w:hint="eastAsia"/>
-        </w:rPr>
-      </w:pPr>
-      <w:r>
-        <w:rPr>
-          <w:rFonts w:hint="eastAsia"/>
-        </w:rPr>
-        <w:t xml:space="preserve">You can now use </w:t>
-      </w:r>
-      <w:r>
-        <w:t xml:space="preserve">5 digits and 6 digits </w:t>
-      </w:r>
-      <w:r>
-        <w:rPr>
-          <w:rFonts w:hint="eastAsia"/>
-        </w:rPr>
-        <w:t>registers numbering scheme</w:t>
-      </w:r>
-      <w:r>
-        <w:t>,</w:t>
-      </w:r>
-      <w:r>
-        <w:rPr>
-          <w:rFonts w:hint="eastAsia"/>
-        </w:rPr>
-        <w:t xml:space="preserve"> 40001-49999 and 400001-465536</w:t>
-      </w:r>
-      <w:r>
-        <w:t xml:space="preserve">, or </w:t>
-      </w:r>
-      <w:r>
-        <w:rPr>
-          <w:rFonts w:hint="eastAsia"/>
-        </w:rPr>
-        <w:t>40000-49999 and 400000-465535</w:t>
-      </w:r>
-      <w:r>
-        <w:t xml:space="preserve">, </w:t>
-      </w:r>
-      <w:r>
-        <w:rPr>
-          <w:rFonts w:hint="eastAsia"/>
-        </w:rPr>
-        <w:t xml:space="preserve">at the same time. </w:t>
+        <w:t>/insert</w:t>
+      </w:r>
+      <w:r>
+        <w:t>s</w:t>
+      </w:r>
+      <w:r>
+        <w:t xml:space="preserve"> </w:t>
+      </w:r>
+      <w:r>
+        <w:t>al</w:t>
+      </w:r>
+      <w:r>
+        <w:t xml:space="preserve">l tags in the </w:t>
+      </w:r>
+      <w:r>
+        <w:t xml:space="preserve">existing </w:t>
+      </w:r>
+      <w:r>
+        <w:t>file instead of writing a completely new file, so that any newer tags from a newer version remain.</w:t>
+      </w:r>
+    </w:p>
+    <w:p>
+      <w:pPr>
+        <w:numPr>
+          <w:ilvl w:val="0"/>
+          <w:numId w:val="10"/>
+        </w:numPr>
+        <w:rPr>
+          <w:rFonts w:hint="eastAsia"/>
+        </w:rPr>
+      </w:pPr>
+      <w:r>
+        <w:t>Project Configuration: Interframe-delay: now shows "0 (auto)" at setting 0.</w:t>
+      </w:r>
+    </w:p>
+    <w:p>
+      <w:pPr>
+        <w:numPr>
+          <w:ilvl w:val="0"/>
+          <w:numId w:val="10"/>
+        </w:numPr>
+        <w:rPr>
+          <w:rFonts w:hint="eastAsia"/>
+        </w:rPr>
+      </w:pPr>
+      <w:r>
+        <w:t xml:space="preserve">Local override project </w:t>
+      </w:r>
+      <w:r>
+        <w:t xml:space="preserve">is </w:t>
+      </w:r>
+      <w:r>
+        <w:t xml:space="preserve">no longer </w:t>
+      </w:r>
+      <w:r>
+        <w:t xml:space="preserve">required to have a </w:t>
+      </w:r>
+      <w:r>
+        <w:t>&lt;modbus&gt; element.</w:t>
+      </w:r>
+    </w:p>
+    <w:p>
+      <w:pPr>
+        <w:numPr>
+          <w:ilvl w:val="0"/>
+          <w:numId w:val="10"/>
+        </w:numPr>
+        <w:rPr>
+          <w:rFonts w:hint="eastAsia"/>
+        </w:rPr>
+      </w:pPr>
+      <w:r>
+        <w:t>Dialog forms can now be closed with the Enter key.</w:t>
+      </w:r>
+    </w:p>
+    <w:p>
+      <w:pPr>
+        <w:numPr>
+          <w:ilvl w:val="0"/>
+          <w:numId w:val="10"/>
+        </w:numPr>
+        <w:rPr>
+          <w:rFonts w:hint="eastAsia"/>
+        </w:rPr>
+      </w:pPr>
+      <w:r>
+        <w:t xml:space="preserve">The </w:t>
+      </w:r>
+      <w:r>
+        <w:t xml:space="preserve">checkboxes of the "Save configuration to project file" </w:t>
+      </w:r>
+      <w:r>
+        <w:t>window</w:t>
+      </w:r>
+      <w:r>
+        <w:t xml:space="preserve"> are now cleared when loading a project.</w:t>
+      </w:r>
+    </w:p>
+    <w:p>
+      <w:pPr>
+        <w:numPr>
+          <w:ilvl w:val="0"/>
+          <w:numId w:val="10"/>
+        </w:numPr>
+        <w:rPr>
+          <w:rFonts w:hint="eastAsia"/>
+        </w:rPr>
+      </w:pPr>
+      <w:r>
+        <w:t xml:space="preserve">Buttons at the bottom of the forms now have </w:t>
+      </w:r>
+      <w:r>
+        <w:t>better spacing</w:t>
+      </w:r>
+      <w:r>
+        <w:t>.</w:t>
+      </w:r>
+    </w:p>
+    <w:p>
+      <w:pPr>
+        <w:pStyle w:val="Kop1"/>
+        <w:rPr>
+          <w:rFonts w:hint="eastAsia"/>
+        </w:rPr>
+      </w:pPr>
+      <w:r>
+        <w:t>v2.0.8 -- 2018-08-02</w:t>
       </w:r>
     </w:p>
     <w:p>
       <w:pPr>
         <w:pStyle w:val="Kop3"/>
-        <w:numPr>
-          <w:ilvl w:val="0"/>
-          <w:numId w:val="0"/>
-        </w:numPr>
-        <w:ind w:left="680" w:hanging="431"/>
-        <w:rPr>
-          <w:rFonts w:hint="eastAsia"/>
-        </w:rPr>
-      </w:pPr>
-      <w:r>
-        <w:rPr>
-          <w:rFonts w:hint="eastAsia"/>
-        </w:rPr>
-        <w:t>Fixes</w:t>
-      </w:r>
-    </w:p>
-    <w:p>
-      <w:pPr>
-        <w:pStyle w:val="Lijstalinea"/>
-        <w:numPr>
-          <w:ilvl w:val="0"/>
-          <w:numId w:val="4"/>
-        </w:numPr>
-        <w:rPr>
-          <w:rFonts w:hint="eastAsia"/>
-        </w:rPr>
-      </w:pPr>
-      <w:r>
-        <w:t xml:space="preserve">In </w:t>
-      </w:r>
-      <w:proofErr w:type="spellStart"/>
-      <w:r>
-        <w:t>Import_file</w:t>
-      </w:r>
-      <w:proofErr w:type="spellEnd"/>
-      <w:r>
-        <w:t xml:space="preserve"> and </w:t>
-      </w:r>
-      <w:proofErr w:type="spellStart"/>
-      <w:r>
-        <w:t>Import_compare</w:t>
-      </w:r>
-      <w:proofErr w:type="spellEnd"/>
-      <w:r>
-        <w:t xml:space="preserve">: writing/comparing a float32 </w:t>
-      </w:r>
-      <w:r>
-        <w:t xml:space="preserve">value </w:t>
-      </w:r>
-      <w:r>
-        <w:t>no longer worked.</w:t>
-      </w:r>
-    </w:p>
-    <w:p>
-      <w:pPr>
-        <w:pStyle w:val="Lijstalinea"/>
-        <w:numPr>
-          <w:ilvl w:val="0"/>
-          <w:numId w:val="4"/>
-        </w:numPr>
-        <w:rPr>
-          <w:rFonts w:hint="eastAsia"/>
-        </w:rPr>
-      </w:pPr>
-      <w:r>
-        <w:rPr>
-          <w:rFonts w:hint="eastAsia"/>
-        </w:rPr>
-        <w:t xml:space="preserve">Ascii32 register writing </w:t>
-      </w:r>
-      <w:r>
-        <w:t>fixed.</w:t>
-      </w:r>
-    </w:p>
-    <w:p>
-      <w:pPr>
-        <w:pStyle w:val="Lijstalinea"/>
-        <w:numPr>
-          <w:ilvl w:val="0"/>
-          <w:numId w:val="4"/>
-        </w:numPr>
-        <w:rPr>
-          <w:rFonts w:hint="eastAsia"/>
-        </w:rPr>
-      </w:pPr>
-      <w:r>
-        <w:rPr>
-          <w:rFonts w:hint="eastAsia"/>
-        </w:rPr>
-        <w:t xml:space="preserve">Resizing column width is now </w:t>
-      </w:r>
-      <w:r>
-        <w:t>global for all tabs</w:t>
-      </w:r>
-      <w:r>
-        <w:rPr>
-          <w:rFonts w:hint="eastAsia"/>
-        </w:rPr>
-        <w:t>.</w:t>
-      </w:r>
-    </w:p>
-    <w:p>
-      <w:pPr>
-        <w:pStyle w:val="Lijstalinea"/>
-        <w:numPr>
-          <w:ilvl w:val="0"/>
-          <w:numId w:val="4"/>
-        </w:numPr>
-        <w:rPr>
-          <w:rFonts w:hint="eastAsia"/>
-        </w:rPr>
-      </w:pPr>
-      <w:r>
-        <w:rPr>
-          <w:rFonts w:hint="eastAsia"/>
-        </w:rPr>
-        <w:t>Zoom</w:t>
-      </w:r>
-      <w:r>
-        <w:t>ing</w:t>
-      </w:r>
-      <w:r>
-        <w:rPr>
-          <w:rFonts w:hint="eastAsia"/>
-        </w:rPr>
-        <w:t xml:space="preserve"> now also adjusts the size of the column headers.</w:t>
-      </w:r>
-    </w:p>
-    <w:p>
-      <w:pPr>
-        <w:pStyle w:val="Lijstalinea"/>
-        <w:numPr>
-          <w:ilvl w:val="0"/>
-          <w:numId w:val="4"/>
-        </w:numPr>
-        <w:rPr>
-          <w:rFonts w:hint="eastAsia"/>
-        </w:rPr>
-      </w:pPr>
-      <w:r>
-        <w:rPr>
-          <w:rFonts w:hint="eastAsia"/>
-        </w:rPr>
-        <w:t>You can now close the [</w:t>
-      </w:r>
-      <w:proofErr w:type="spellStart"/>
-      <w:r>
-        <w:rPr>
-          <w:rFonts w:hint="eastAsia"/>
-        </w:rPr>
-        <w:t>Project_Configuration</w:t>
-      </w:r>
-      <w:proofErr w:type="spellEnd"/>
-      <w:r>
-        <w:rPr>
-          <w:rFonts w:hint="eastAsia"/>
-        </w:rPr>
-        <w:t>], [</w:t>
-      </w:r>
-      <w:proofErr w:type="spellStart"/>
-      <w:r>
-        <w:rPr>
-          <w:rFonts w:hint="eastAsia"/>
-        </w:rPr>
-        <w:t>Save_project_file</w:t>
-      </w:r>
-      <w:proofErr w:type="spellEnd"/>
-      <w:r>
-        <w:rPr>
-          <w:rFonts w:hint="eastAsia"/>
-        </w:rPr>
-        <w:t>] and [About] forms with the ESC button</w:t>
-      </w:r>
-      <w:r>
-        <w:t xml:space="preserve"> too</w:t>
-      </w:r>
-      <w:r>
-        <w:rPr>
-          <w:rFonts w:hint="eastAsia"/>
-        </w:rPr>
-        <w:t>.</w:t>
-      </w:r>
-    </w:p>
-    <w:p>
-      <w:pPr>
-        <w:pStyle w:val="Lijstalinea"/>
-        <w:numPr>
-          <w:ilvl w:val="0"/>
-          <w:numId w:val="4"/>
-        </w:numPr>
-        <w:rPr>
-          <w:rFonts w:hint="eastAsia"/>
-        </w:rPr>
-      </w:pPr>
-      <w:r>
-        <w:rPr>
-          <w:rFonts w:hint="eastAsia"/>
-        </w:rPr>
-        <w:t>The expand/collapse icons scale with zoom</w:t>
-      </w:r>
-      <w:r>
-        <w:t>ing</w:t>
-      </w:r>
-      <w:r>
-        <w:rPr>
-          <w:rFonts w:hint="eastAsia"/>
-        </w:rPr>
-        <w:t>.</w:t>
-      </w:r>
-    </w:p>
-    <w:p>
-      <w:pPr>
-        <w:pStyle w:val="Lijstalinea"/>
-        <w:numPr>
-          <w:ilvl w:val="0"/>
-          <w:numId w:val="4"/>
-        </w:numPr>
-        <w:rPr>
-          <w:rFonts w:hint="eastAsia"/>
-        </w:rPr>
-      </w:pPr>
-      <w:r>
-        <w:rPr>
-          <w:rFonts w:hint="eastAsia"/>
-        </w:rPr>
-        <w:t>If an error occurs when loading an mbc file, no auto-connect to the slave/server is done.</w:t>
-      </w:r>
-    </w:p>
-    <w:p>
-      <w:pPr>
-        <w:pStyle w:val="Lijstalinea"/>
-        <w:numPr>
-          <w:ilvl w:val="0"/>
-          <w:numId w:val="4"/>
-        </w:numPr>
-        <w:rPr>
-          <w:rFonts w:hint="eastAsia"/>
-        </w:rPr>
-      </w:pPr>
-      <w:r>
-        <w:rPr>
-          <w:rFonts w:hint="eastAsia"/>
-        </w:rPr>
-        <w:t xml:space="preserve">With </w:t>
-      </w:r>
-      <w:proofErr w:type="spellStart"/>
-      <w:r>
-        <w:rPr>
-          <w:rFonts w:hint="eastAsia"/>
-        </w:rPr>
-        <w:t>Import_file</w:t>
-      </w:r>
-      <w:proofErr w:type="spellEnd"/>
-      <w:r>
-        <w:rPr>
-          <w:rFonts w:hint="eastAsia"/>
-        </w:rPr>
-        <w:t xml:space="preserve"> and </w:t>
-      </w:r>
-      <w:proofErr w:type="spellStart"/>
-      <w:r>
-        <w:rPr>
-          <w:rFonts w:hint="eastAsia"/>
-        </w:rPr>
-        <w:t>Import_compare</w:t>
-      </w:r>
-      <w:proofErr w:type="spellEnd"/>
-      <w:r>
-        <w:rPr>
-          <w:rFonts w:hint="eastAsia"/>
-        </w:rPr>
-        <w:t>: writing/compar</w:t>
-      </w:r>
-      <w:r>
-        <w:t>ing</w:t>
-      </w:r>
-      <w:r>
-        <w:rPr>
-          <w:rFonts w:hint="eastAsia"/>
-        </w:rPr>
-        <w:t xml:space="preserve"> a float32 </w:t>
-      </w:r>
-      <w:r>
-        <w:t>is fixed</w:t>
-      </w:r>
-      <w:r>
-        <w:rPr>
-          <w:rFonts w:hint="eastAsia"/>
-        </w:rPr>
-        <w:t>.</w:t>
-      </w:r>
-    </w:p>
-    <w:p>
-      <w:pPr>
-        <w:pStyle w:val="Kop1"/>
-        <w:rPr>
-          <w:rFonts w:hint="eastAsia"/>
-        </w:rPr>
-      </w:pPr>
-      <w:r>
-        <w:t>v2.0.14 -- 2022-11-08</w:t>
-      </w:r>
-    </w:p>
-    <w:p>
-      <w:pPr>
-        <w:pStyle w:val="Kop3"/>
         <w:rPr>
           <w:rFonts w:hint="eastAsia"/>
         </w:rPr>
@@ -1310,1501 +3123,6 @@
       <w:pPr>
         <w:numPr>
           <w:ilvl w:val="0"/>
-          <w:numId w:val="4"/>
-        </w:numPr>
-        <w:rPr>
-          <w:rFonts w:hint="eastAsia"/>
-        </w:rPr>
-      </w:pPr>
-      <w:r>
-        <w:t xml:space="preserve">Added command line parameters. </w:t>
-      </w:r>
-      <w:r>
-        <w:t>These r</w:t>
-      </w:r>
-      <w:r>
-        <w:t xml:space="preserve">eplaces </w:t>
-      </w:r>
-      <w:r>
-        <w:t xml:space="preserve">the </w:t>
-      </w:r>
-      <w:r>
-        <w:t>LocalOverrides</w:t>
-      </w:r>
-      <w:r>
-        <w:t xml:space="preserve"> mechanism.</w:t>
-      </w:r>
-    </w:p>
-    <w:p>
-      <w:pPr>
-        <w:numPr>
-          <w:ilvl w:val="0"/>
-          <w:numId w:val="4"/>
-        </w:numPr>
-        <w:rPr>
-          <w:rFonts w:hint="eastAsia"/>
-        </w:rPr>
-      </w:pPr>
-      <w:r>
-        <w:t xml:space="preserve">LocalOverrides </w:t>
-      </w:r>
-      <w:r>
-        <w:t>mechanism removed.</w:t>
-      </w:r>
-    </w:p>
-    <w:p>
-      <w:pPr>
-        <w:numPr>
-          <w:ilvl w:val="0"/>
-          <w:numId w:val="4"/>
-        </w:numPr>
-        <w:rPr>
-          <w:rFonts w:hint="eastAsia"/>
-        </w:rPr>
-      </w:pPr>
-      <w:r>
-        <w:t>Save project file: the [Update XML to current version] checkbox is now enabled by default.</w:t>
-      </w:r>
-    </w:p>
-    <w:p>
-      <w:pPr>
-        <w:numPr>
-          <w:ilvl w:val="0"/>
-          <w:numId w:val="4"/>
-        </w:numPr>
-        <w:rPr>
-          <w:rFonts w:hint="eastAsia"/>
-        </w:rPr>
-      </w:pPr>
-      <w:r>
-        <w:t>Options form: tooltips improved.</w:t>
-      </w:r>
-    </w:p>
-    <w:p>
-      <w:pPr>
-        <w:numPr>
-          <w:ilvl w:val="0"/>
-          <w:numId w:val="4"/>
-        </w:numPr>
-        <w:rPr>
-          <w:rFonts w:hint="eastAsia"/>
-        </w:rPr>
-      </w:pPr>
-      <w:r>
-        <w:t>Grid: Regist</w:t>
-      </w:r>
-      <w:r>
-        <w:t>er</w:t>
-      </w:r>
-      <w:r>
-        <w:t xml:space="preserve"> </w:t>
-      </w:r>
-      <w:r>
-        <w:t xml:space="preserve">column menu now has </w:t>
-      </w:r>
-      <w:r>
-        <w:t xml:space="preserve"> [</w:t>
-      </w:r>
-      <w:r>
-        <w:t>Expand all]</w:t>
-      </w:r>
-      <w:r>
-        <w:t xml:space="preserve"> and </w:t>
-      </w:r>
-      <w:r>
-        <w:t>[</w:t>
-      </w:r>
-      <w:r>
-        <w:t>Collapse all</w:t>
-      </w:r>
-      <w:r>
-        <w:t>].</w:t>
-      </w:r>
-    </w:p>
-    <w:p>
-      <w:pPr>
-        <w:numPr>
-          <w:ilvl w:val="0"/>
-          <w:numId w:val="4"/>
-        </w:numPr>
-        <w:rPr>
-          <w:rFonts w:hint="eastAsia"/>
-        </w:rPr>
-      </w:pPr>
-      <w:r>
-        <w:t>Mbc project file: &lt;</w:t>
-      </w:r>
-      <w:proofErr w:type="spellStart"/>
-      <w:r>
-        <w:t>longdescr</w:t>
-      </w:r>
-      <w:proofErr w:type="spellEnd"/>
-      <w:r>
-        <w:t xml:space="preserve">&gt; </w:t>
-      </w:r>
-      <w:r>
-        <w:t xml:space="preserve">element </w:t>
-      </w:r>
-      <w:r>
-        <w:t xml:space="preserve">added. </w:t>
-      </w:r>
-      <w:r>
-        <w:t xml:space="preserve">Adds a long multiline text that is show when the mouse is hoovered over the register </w:t>
-      </w:r>
-      <w:proofErr w:type="spellStart"/>
-      <w:r>
-        <w:t>decription</w:t>
-      </w:r>
-      <w:proofErr w:type="spellEnd"/>
-      <w:r>
-        <w:t>.</w:t>
-      </w:r>
-    </w:p>
-    <w:p>
-      <w:pPr>
-        <w:numPr>
-          <w:ilvl w:val="0"/>
-          <w:numId w:val="4"/>
-        </w:numPr>
-        <w:rPr>
-          <w:rFonts w:hint="eastAsia"/>
-        </w:rPr>
-      </w:pPr>
-      <w:r>
-        <w:t>Mbc project file: &lt;include&gt; element added.</w:t>
-      </w:r>
-    </w:p>
-    <w:p>
-      <w:pPr>
-        <w:pStyle w:val="Kop3"/>
-        <w:numPr>
-          <w:ilvl w:val="0"/>
-          <w:numId w:val="0"/>
-        </w:numPr>
-        <w:ind w:left="680" w:hanging="431"/>
-        <w:rPr>
-          <w:rFonts w:hint="eastAsia"/>
-        </w:rPr>
-      </w:pPr>
-      <w:r>
-        <w:t>Fixes</w:t>
-      </w:r>
-    </w:p>
-    <w:p>
-      <w:pPr>
-        <w:numPr>
-          <w:ilvl w:val="0"/>
-          <w:numId w:val="4"/>
-        </w:numPr>
-        <w:rPr>
-          <w:rFonts w:hint="eastAsia"/>
-        </w:rPr>
-      </w:pPr>
-      <w:r>
-        <w:t>[</w:t>
-      </w:r>
-      <w:r>
-        <w:t>Open project file location in Explorer] now works if you gave a filename without a path on the command line.</w:t>
-      </w:r>
-    </w:p>
-    <w:p>
-      <w:pPr>
-        <w:numPr>
-          <w:ilvl w:val="0"/>
-          <w:numId w:val="4"/>
-        </w:numPr>
-        <w:rPr>
-          <w:rFonts w:hint="eastAsia"/>
-        </w:rPr>
-      </w:pPr>
-      <w:r>
-        <w:t xml:space="preserve">The temporary red </w:t>
-      </w:r>
-      <w:r>
-        <w:t>colouring</w:t>
-      </w:r>
-      <w:r>
-        <w:t xml:space="preserve"> of the value field after entering </w:t>
-      </w:r>
-      <w:r>
-        <w:t xml:space="preserve">an invalid value </w:t>
-      </w:r>
-      <w:r>
-        <w:t>has been improved.</w:t>
-      </w:r>
-    </w:p>
-    <w:p>
-      <w:pPr>
-        <w:numPr>
-          <w:ilvl w:val="0"/>
-          <w:numId w:val="4"/>
-        </w:numPr>
-        <w:rPr>
-          <w:rFonts w:hint="eastAsia"/>
-        </w:rPr>
-      </w:pPr>
-      <w:r>
-        <w:t>Edit</w:t>
-      </w:r>
-      <w:r>
-        <w:t xml:space="preserve"> enter/escape </w:t>
-      </w:r>
-      <w:r>
-        <w:t>handling is improved</w:t>
-      </w:r>
-      <w:r>
-        <w:t>.</w:t>
-      </w:r>
-    </w:p>
-    <w:p>
-      <w:pPr>
-        <w:numPr>
-          <w:ilvl w:val="0"/>
-          <w:numId w:val="4"/>
-        </w:numPr>
-        <w:rPr>
-          <w:rFonts w:hint="eastAsia"/>
-        </w:rPr>
-      </w:pPr>
-      <w:r>
-        <w:t xml:space="preserve">In the notification screen that the serial port could not be opened: the [Port] </w:t>
-      </w:r>
-      <w:r>
-        <w:t>combo box</w:t>
-      </w:r>
-      <w:r>
-        <w:t xml:space="preserve"> now automatically refreshes the list of serial ports.</w:t>
-      </w:r>
-    </w:p>
-    <w:p>
-      <w:pPr>
-        <w:pStyle w:val="Kop1"/>
-        <w:rPr>
-          <w:rFonts w:hint="eastAsia"/>
-        </w:rPr>
-      </w:pPr>
-      <w:r>
-        <w:t>v2.0.13 -- 2022-07-11</w:t>
-      </w:r>
-    </w:p>
-    <w:p>
-      <w:pPr>
-        <w:pStyle w:val="Kop3"/>
-        <w:rPr>
-          <w:rFonts w:hint="eastAsia"/>
-        </w:rPr>
-      </w:pPr>
-      <w:r>
-        <w:t>Features</w:t>
-      </w:r>
-    </w:p>
-    <w:p>
-      <w:pPr>
-        <w:numPr>
-          <w:ilvl w:val="0"/>
-          <w:numId w:val="4"/>
-        </w:numPr>
-        <w:rPr>
-          <w:rFonts w:hint="eastAsia"/>
-        </w:rPr>
-      </w:pPr>
-      <w:r>
-        <w:t xml:space="preserve">Added Find/Filter bar. </w:t>
-      </w:r>
-      <w:r>
-        <w:t>Open it using</w:t>
-      </w:r>
-      <w:r>
-        <w:t xml:space="preserve"> Control-F. There is also an option </w:t>
-      </w:r>
-      <w:r>
-        <w:t>“</w:t>
-      </w:r>
-      <w:r>
-        <w:t xml:space="preserve">Clear Find/Filter </w:t>
-      </w:r>
-      <w:r>
-        <w:lastRenderedPageBreak/>
-        <w:t>on tab change</w:t>
-      </w:r>
-      <w:r>
-        <w:t>”</w:t>
-      </w:r>
-      <w:r>
-        <w:t>.</w:t>
-      </w:r>
-    </w:p>
-    <w:p>
-      <w:pPr>
-        <w:numPr>
-          <w:ilvl w:val="0"/>
-          <w:numId w:val="4"/>
-        </w:numPr>
-        <w:rPr>
-          <w:rFonts w:hint="eastAsia"/>
-        </w:rPr>
-      </w:pPr>
-      <w:r>
-        <w:t>The properties of a register (</w:t>
-      </w:r>
-      <w:proofErr w:type="spellStart"/>
-      <w:r>
-        <w:t>rw</w:t>
-      </w:r>
-      <w:proofErr w:type="spellEnd"/>
-      <w:r>
-        <w:t xml:space="preserve">, int32, ...) are now displayed in a separate </w:t>
-      </w:r>
-      <w:r>
-        <w:t>[</w:t>
-      </w:r>
-      <w:r>
-        <w:t>Properties</w:t>
-      </w:r>
-      <w:r>
-        <w:t>]</w:t>
-      </w:r>
-      <w:r>
-        <w:t xml:space="preserve"> column</w:t>
-      </w:r>
-      <w:r>
-        <w:t xml:space="preserve"> instead of being added to </w:t>
-      </w:r>
-      <w:r>
-        <w:t xml:space="preserve">the </w:t>
-      </w:r>
-      <w:r>
-        <w:t>[</w:t>
-      </w:r>
-      <w:r>
-        <w:t>Description</w:t>
-      </w:r>
-      <w:r>
-        <w:t>]</w:t>
-      </w:r>
-      <w:r>
-        <w:t xml:space="preserve"> column. </w:t>
-      </w:r>
-      <w:r>
-        <w:t>The [Properties]  column can be e</w:t>
-      </w:r>
-      <w:r>
-        <w:t>nable/disable</w:t>
-      </w:r>
-      <w:r>
-        <w:t>d</w:t>
-      </w:r>
-      <w:r>
-        <w:t xml:space="preserve"> in Options.</w:t>
-      </w:r>
-    </w:p>
-    <w:p>
-      <w:pPr>
-        <w:numPr>
-          <w:ilvl w:val="0"/>
-          <w:numId w:val="4"/>
-        </w:numPr>
-        <w:rPr>
-          <w:rFonts w:hint="eastAsia"/>
-        </w:rPr>
-      </w:pPr>
-      <w:r>
-        <w:t>The Description text can now be multi-line</w:t>
-      </w:r>
-      <w:r>
-        <w:t>, i</w:t>
-      </w:r>
-      <w:r>
-        <w:t xml:space="preserve">f  the </w:t>
-      </w:r>
-      <w:r>
-        <w:t>“</w:t>
-      </w:r>
-      <w:r>
-        <w:t>Multiline rows with auto row size</w:t>
-      </w:r>
-      <w:r>
-        <w:t>”</w:t>
-      </w:r>
-      <w:r>
-        <w:t xml:space="preserve"> option </w:t>
-      </w:r>
-      <w:r>
-        <w:t>is enabled</w:t>
-      </w:r>
-      <w:r>
-        <w:t xml:space="preserve">. A </w:t>
-      </w:r>
-      <w:r>
-        <w:t xml:space="preserve">long </w:t>
-      </w:r>
-      <w:r>
-        <w:t xml:space="preserve">description </w:t>
-      </w:r>
-      <w:r>
-        <w:t>text is wrappe</w:t>
-      </w:r>
-      <w:r>
-        <w:t xml:space="preserve">d. </w:t>
-      </w:r>
-      <w:r>
-        <w:t>CR/LF</w:t>
-      </w:r>
-      <w:r>
-        <w:t xml:space="preserve">’s can be used in the description text. </w:t>
-      </w:r>
-      <w:r>
-        <w:t xml:space="preserve">The row height of the grid is automatically adjusted to the text. </w:t>
-      </w:r>
-    </w:p>
-    <w:p>
-      <w:pPr>
-        <w:numPr>
-          <w:ilvl w:val="0"/>
-          <w:numId w:val="4"/>
-        </w:numPr>
-        <w:rPr>
-          <w:rFonts w:hint="eastAsia"/>
-        </w:rPr>
-      </w:pPr>
-      <w:r>
-        <w:t>"Move to next row on Enter"</w:t>
-      </w:r>
-      <w:r>
-        <w:t xml:space="preserve"> option</w:t>
-      </w:r>
-      <w:r>
-        <w:t xml:space="preserve">: depending on this option, after entering a new value with the Enter key, the </w:t>
-      </w:r>
-      <w:r>
-        <w:t>cursor</w:t>
-      </w:r>
-      <w:r>
-        <w:t xml:space="preserve"> may or may not go to the next line. </w:t>
-      </w:r>
-      <w:r>
-        <w:t xml:space="preserve">Enter a value with </w:t>
-      </w:r>
-      <w:r>
-        <w:t>Control-Enter</w:t>
-      </w:r>
-      <w:r>
-        <w:t xml:space="preserve"> to get the</w:t>
-      </w:r>
-      <w:r>
-        <w:t xml:space="preserve"> opposite</w:t>
-      </w:r>
-      <w:r>
-        <w:t xml:space="preserve"> behaviour.</w:t>
-      </w:r>
-    </w:p>
-    <w:p>
-      <w:pPr>
-        <w:pStyle w:val="Kop3"/>
-        <w:numPr>
-          <w:ilvl w:val="0"/>
-          <w:numId w:val="0"/>
-        </w:numPr>
-        <w:ind w:left="680" w:hanging="431"/>
-        <w:rPr>
-          <w:rFonts w:hint="eastAsia"/>
-        </w:rPr>
-      </w:pPr>
-      <w:r>
-        <w:t>Fixes</w:t>
-      </w:r>
-    </w:p>
-    <w:p>
-      <w:pPr>
-        <w:numPr>
-          <w:ilvl w:val="0"/>
-          <w:numId w:val="5"/>
-        </w:numPr>
-        <w:rPr>
-          <w:rFonts w:hint="eastAsia"/>
-        </w:rPr>
-      </w:pPr>
-      <w:r>
-        <w:t>Control-0 for zoom reset now works globally on the form, not just when the focus is in the grid.</w:t>
-      </w:r>
-    </w:p>
-    <w:p>
-      <w:pPr>
-        <w:numPr>
-          <w:ilvl w:val="0"/>
-          <w:numId w:val="5"/>
-        </w:numPr>
-        <w:rPr>
-          <w:rFonts w:hint="eastAsia"/>
-        </w:rPr>
-      </w:pPr>
-      <w:r>
-        <w:t>R</w:t>
-      </w:r>
-      <w:r>
-        <w:t>ight-click</w:t>
-      </w:r>
-      <w:r>
-        <w:t>ing</w:t>
-      </w:r>
-      <w:r>
-        <w:t xml:space="preserve"> in the grid</w:t>
-      </w:r>
-      <w:r>
-        <w:t xml:space="preserve"> now moves the focus to that row, to </w:t>
-      </w:r>
-      <w:r>
-        <w:t>better see which row you are working on.</w:t>
-      </w:r>
-    </w:p>
-    <w:p>
-      <w:pPr>
-        <w:numPr>
-          <w:ilvl w:val="0"/>
-          <w:numId w:val="5"/>
-        </w:numPr>
-        <w:rPr>
-          <w:rFonts w:hint="eastAsia"/>
-        </w:rPr>
-      </w:pPr>
-      <w:r>
-        <w:t>Migrated</w:t>
-      </w:r>
-      <w:r>
-        <w:t xml:space="preserve"> to .NET framework 4.7.2.</w:t>
-      </w:r>
-    </w:p>
-    <w:p>
-      <w:pPr>
-        <w:pStyle w:val="Kop1"/>
-        <w:rPr>
-          <w:rFonts w:hint="eastAsia"/>
-        </w:rPr>
-      </w:pPr>
-      <w:r>
-        <w:t>v2.0.12 -- 2020-07-13</w:t>
-      </w:r>
-    </w:p>
-    <w:p>
-      <w:pPr>
-        <w:pStyle w:val="Kop3"/>
-        <w:rPr>
-          <w:rFonts w:hint="eastAsia"/>
-        </w:rPr>
-      </w:pPr>
-      <w:r>
-        <w:t>Features</w:t>
-      </w:r>
-    </w:p>
-    <w:p>
-      <w:pPr>
-        <w:numPr>
-          <w:ilvl w:val="0"/>
-          <w:numId w:val="6"/>
-        </w:numPr>
-        <w:rPr>
-          <w:rFonts w:hint="eastAsia"/>
-        </w:rPr>
-      </w:pPr>
-      <w:r>
-        <w:t>Added mbc project file validation with XSD schema</w:t>
-      </w:r>
-      <w:r>
-        <w:t xml:space="preserve"> file</w:t>
-      </w:r>
-      <w:r>
-        <w:t xml:space="preserve">. </w:t>
-      </w:r>
-      <w:r>
-        <w:t xml:space="preserve">Validation is optional. </w:t>
-      </w:r>
-      <w:r>
-        <w:t>The validation only allows lower-case XML tags</w:t>
-      </w:r>
-      <w:r>
-        <w:t>, a</w:t>
-      </w:r>
-      <w:r>
-        <w:t xml:space="preserve">nd only allows the XML elements that are supported in this version. The intention is that over time all mbc files will </w:t>
-      </w:r>
-      <w:r>
-        <w:t>migrate</w:t>
-      </w:r>
-      <w:r>
-        <w:t xml:space="preserve"> to meet the validation.</w:t>
-      </w:r>
-    </w:p>
-    <w:p>
-      <w:pPr>
-        <w:numPr>
-          <w:ilvl w:val="0"/>
-          <w:numId w:val="6"/>
-        </w:numPr>
-        <w:rPr>
-          <w:rFonts w:hint="eastAsia"/>
-        </w:rPr>
-      </w:pPr>
-      <w:r>
-        <w:t>In</w:t>
-      </w:r>
-      <w:r>
-        <w:t xml:space="preserve"> </w:t>
-      </w:r>
-      <w:r>
-        <w:t xml:space="preserve">the </w:t>
-      </w:r>
-      <w:r>
-        <w:t xml:space="preserve">"Save project file" </w:t>
-      </w:r>
-      <w:r>
-        <w:t xml:space="preserve">form </w:t>
-      </w:r>
-      <w:r>
-        <w:t xml:space="preserve">you now have the option to update the XML with "Update XML to current version" so that it then passes the validation. </w:t>
-      </w:r>
-      <w:r>
-        <w:t>E</w:t>
-      </w:r>
-      <w:r>
-        <w:t>rrors must be corrected manually.</w:t>
-      </w:r>
-    </w:p>
-    <w:p>
-      <w:pPr>
-        <w:numPr>
-          <w:ilvl w:val="0"/>
-          <w:numId w:val="6"/>
-        </w:numPr>
-        <w:rPr>
-          <w:rFonts w:hint="eastAsia"/>
-        </w:rPr>
-      </w:pPr>
-      <w:r>
-        <w:t>In</w:t>
-      </w:r>
-      <w:r>
-        <w:t xml:space="preserve"> "Save project file" the project file is now saved with XML formatting.</w:t>
-      </w:r>
-    </w:p>
-    <w:p>
-      <w:pPr>
-        <w:numPr>
-          <w:ilvl w:val="0"/>
-          <w:numId w:val="6"/>
-        </w:numPr>
-        <w:rPr>
-          <w:rFonts w:hint="eastAsia"/>
-        </w:rPr>
-      </w:pPr>
-      <w:r>
-        <w:t>If you start ModbusControl by double-clicking an mbc file and the file points to a non-existent COM port, the error dialog "Error opening serial port COMx" now appears after the ModbusControl program appears.</w:t>
-      </w:r>
-    </w:p>
-    <w:p>
-      <w:pPr>
-        <w:numPr>
-          <w:ilvl w:val="0"/>
-          <w:numId w:val="6"/>
-        </w:numPr>
-        <w:rPr>
-          <w:rFonts w:hint="eastAsia"/>
-        </w:rPr>
-      </w:pPr>
-      <w:r>
-        <w:t xml:space="preserve">At the first start </w:t>
-      </w:r>
-      <w:r>
-        <w:t xml:space="preserve">of the program </w:t>
-      </w:r>
-      <w:r>
-        <w:t xml:space="preserve">after an update, </w:t>
-      </w:r>
-      <w:r>
-        <w:t xml:space="preserve">an option is shown </w:t>
-      </w:r>
-      <w:r>
-        <w:t>to see the 'Release notes'.</w:t>
-      </w:r>
-    </w:p>
-    <w:p>
-      <w:pPr>
-        <w:numPr>
-          <w:ilvl w:val="0"/>
-          <w:numId w:val="6"/>
-        </w:numPr>
-        <w:rPr>
-          <w:rFonts w:hint="eastAsia"/>
-        </w:rPr>
-      </w:pPr>
-      <w:r>
-        <w:t xml:space="preserve">Program settings split into user-dependent part and </w:t>
-      </w:r>
-      <w:r>
-        <w:t>computer</w:t>
-      </w:r>
-      <w:r>
-        <w:t xml:space="preserve">-dependent part. The old settings are migrated to the new settings files, then </w:t>
-      </w:r>
-      <w:r>
-        <w:t xml:space="preserve">the </w:t>
-      </w:r>
-      <w:r>
-        <w:t>old settings file is deleted.</w:t>
-      </w:r>
-    </w:p>
-    <w:p>
-      <w:pPr>
-        <w:numPr>
-          <w:ilvl w:val="0"/>
-          <w:numId w:val="6"/>
-        </w:numPr>
-        <w:rPr>
-          <w:rFonts w:hint="eastAsia"/>
-        </w:rPr>
-      </w:pPr>
-      <w:r>
-        <w:t xml:space="preserve">LocalOverrides.xml </w:t>
-      </w:r>
-      <w:r>
-        <w:t xml:space="preserve">file is automatically </w:t>
-      </w:r>
-      <w:r>
-        <w:t>moved from &lt;</w:t>
-      </w:r>
-      <w:proofErr w:type="spellStart"/>
-      <w:r>
-        <w:t>mydocuments</w:t>
-      </w:r>
-      <w:proofErr w:type="spellEnd"/>
-      <w:r>
-        <w:t>&gt;\ModbusControl to %</w:t>
-      </w:r>
-      <w:proofErr w:type="spellStart"/>
-      <w:r>
-        <w:t>AppData</w:t>
-      </w:r>
-      <w:proofErr w:type="spellEnd"/>
-      <w:r>
-        <w:t xml:space="preserve">%\Roaming\E.D.&amp;A\ModbusControl. Content from old is not migrated. Old </w:t>
-      </w:r>
-      <w:r>
-        <w:t>file</w:t>
-      </w:r>
-      <w:r>
-        <w:t xml:space="preserve"> is renamed with '.old' and moved to the </w:t>
-      </w:r>
-      <w:r>
-        <w:t xml:space="preserve">new </w:t>
-      </w:r>
-      <w:r>
-        <w:t>location. If overrides were used, the user will receive a notification.</w:t>
-      </w:r>
-    </w:p>
-    <w:p>
-      <w:pPr>
-        <w:numPr>
-          <w:ilvl w:val="0"/>
-          <w:numId w:val="6"/>
-        </w:numPr>
-        <w:rPr>
-          <w:rFonts w:hint="eastAsia"/>
-        </w:rPr>
-      </w:pPr>
-      <w:r>
-        <w:t>&lt;user&gt;\Documents\ModbusControl is no longer used.</w:t>
-      </w:r>
-    </w:p>
-    <w:p>
-      <w:pPr>
-        <w:pStyle w:val="Kop3"/>
-        <w:rPr>
-          <w:rFonts w:hint="eastAsia"/>
-        </w:rPr>
-      </w:pPr>
-      <w:r>
-        <w:t>Fixes</w:t>
-      </w:r>
-    </w:p>
-    <w:p>
-      <w:pPr>
-        <w:numPr>
-          <w:ilvl w:val="0"/>
-          <w:numId w:val="7"/>
-        </w:numPr>
-        <w:rPr>
-          <w:rFonts w:hint="eastAsia"/>
-        </w:rPr>
-      </w:pPr>
-      <w:r>
-        <w:t>The import/export dialogs now show '*. CSV' instead of '*. C</w:t>
-      </w:r>
-      <w:r>
-        <w:t>VS</w:t>
-      </w:r>
-      <w:r>
-        <w:t>'.</w:t>
-      </w:r>
-    </w:p>
-    <w:p>
-      <w:pPr>
-        <w:numPr>
-          <w:ilvl w:val="0"/>
-          <w:numId w:val="7"/>
-        </w:numPr>
-        <w:rPr>
-          <w:rFonts w:hint="eastAsia"/>
-        </w:rPr>
-      </w:pPr>
-      <w:r>
-        <w:t>Mbc file is now saved without BOM (</w:t>
-      </w:r>
-      <w:r>
-        <w:t>Unicode</w:t>
-      </w:r>
-      <w:r>
-        <w:t xml:space="preserve"> byte order mark).</w:t>
-      </w:r>
-    </w:p>
-    <w:p>
-      <w:pPr>
-        <w:numPr>
-          <w:ilvl w:val="0"/>
-          <w:numId w:val="7"/>
-        </w:numPr>
-        <w:rPr>
-          <w:rFonts w:hint="eastAsia"/>
-        </w:rPr>
-      </w:pPr>
-      <w:r>
-        <w:t xml:space="preserve">Better </w:t>
-      </w:r>
-      <w:r>
-        <w:t>handling</w:t>
-      </w:r>
-      <w:r>
-        <w:t xml:space="preserve"> if </w:t>
-      </w:r>
-      <w:r>
-        <w:t>a</w:t>
-      </w:r>
-      <w:r>
-        <w:t xml:space="preserve"> non-admin</w:t>
-      </w:r>
-      <w:r>
-        <w:t>istrator</w:t>
-      </w:r>
-      <w:r>
-        <w:t xml:space="preserve"> user logs </w:t>
-      </w:r>
-      <w:r>
-        <w:t xml:space="preserve">on </w:t>
-      </w:r>
-      <w:r>
-        <w:t>and uses ModbusControl.</w:t>
-      </w:r>
-    </w:p>
-    <w:p>
-      <w:pPr>
-        <w:pStyle w:val="Kop1"/>
-        <w:rPr>
-          <w:rFonts w:hint="eastAsia"/>
-        </w:rPr>
-      </w:pPr>
-      <w:r>
-        <w:lastRenderedPageBreak/>
-        <w:t>v2.0.11 -- 2019-11-18</w:t>
-      </w:r>
-    </w:p>
-    <w:p>
-      <w:pPr>
-        <w:pStyle w:val="Kop3"/>
-        <w:rPr>
-          <w:rFonts w:hint="eastAsia"/>
-        </w:rPr>
-      </w:pPr>
-      <w:r>
-        <w:t>Fixes</w:t>
-      </w:r>
-    </w:p>
-    <w:p>
-      <w:pPr>
-        <w:numPr>
-          <w:ilvl w:val="0"/>
-          <w:numId w:val="8"/>
-        </w:numPr>
-        <w:rPr>
-          <w:rFonts w:hint="eastAsia"/>
-        </w:rPr>
-      </w:pPr>
-      <w:r>
-        <w:t xml:space="preserve">Better handling if the USB/serial connection is lost. In the past </w:t>
-      </w:r>
-      <w:r>
-        <w:t xml:space="preserve">the </w:t>
-      </w:r>
-      <w:r>
-        <w:t xml:space="preserve">program </w:t>
-      </w:r>
-      <w:r>
-        <w:t>could stop responding</w:t>
-      </w:r>
-      <w:r>
-        <w:t>.</w:t>
-      </w:r>
-    </w:p>
-    <w:p>
-      <w:pPr>
-        <w:pStyle w:val="Kop1"/>
-        <w:rPr>
-          <w:rFonts w:hint="eastAsia"/>
-        </w:rPr>
-      </w:pPr>
-      <w:r>
-        <w:t>v2.0.10 -- 2019-03-11</w:t>
-      </w:r>
-    </w:p>
-    <w:p>
-      <w:pPr>
-        <w:pStyle w:val="Kop3"/>
-        <w:rPr>
-          <w:rFonts w:hint="eastAsia"/>
-        </w:rPr>
-      </w:pPr>
-      <w:r>
-        <w:t>Features</w:t>
-      </w:r>
-    </w:p>
-    <w:p>
-      <w:pPr>
-        <w:numPr>
-          <w:ilvl w:val="0"/>
-          <w:numId w:val="8"/>
-        </w:numPr>
-        <w:rPr>
-          <w:rFonts w:hint="eastAsia"/>
-        </w:rPr>
-      </w:pPr>
-      <w:r>
-        <w:t>Added display</w:t>
-      </w:r>
-      <w:r>
-        <w:t>ing</w:t>
-      </w:r>
-      <w:r>
-        <w:t xml:space="preserve"> of enum </w:t>
-      </w:r>
-      <w:r>
-        <w:t xml:space="preserve">values </w:t>
-      </w:r>
-      <w:r>
-        <w:t xml:space="preserve">in the value column. </w:t>
-      </w:r>
-    </w:p>
-    <w:p>
-      <w:pPr>
-        <w:pStyle w:val="Kop3"/>
-        <w:rPr>
-          <w:rFonts w:hint="eastAsia"/>
-        </w:rPr>
-      </w:pPr>
-      <w:r>
-        <w:t>Fixes</w:t>
-      </w:r>
-    </w:p>
-    <w:p>
-      <w:pPr>
-        <w:numPr>
-          <w:ilvl w:val="0"/>
-          <w:numId w:val="8"/>
-        </w:numPr>
-        <w:rPr>
-          <w:rFonts w:hint="eastAsia"/>
-        </w:rPr>
-      </w:pPr>
-      <w:r>
-        <w:t xml:space="preserve">Menu </w:t>
-      </w:r>
-      <w:r>
-        <w:t xml:space="preserve">item </w:t>
-      </w:r>
-      <w:r>
-        <w:t xml:space="preserve">"Edit project file" did not work </w:t>
-      </w:r>
-      <w:r>
-        <w:t xml:space="preserve">correctly </w:t>
-      </w:r>
-      <w:r>
-        <w:t>if there was a space in the path.</w:t>
-      </w:r>
-    </w:p>
-    <w:p>
-      <w:pPr>
-        <w:numPr>
-          <w:ilvl w:val="0"/>
-          <w:numId w:val="8"/>
-        </w:numPr>
-        <w:rPr>
-          <w:rFonts w:hint="eastAsia"/>
-        </w:rPr>
-      </w:pPr>
-      <w:r>
-        <w:t>Logger: Clear button did not clear number of logs in the status bar.</w:t>
-      </w:r>
-    </w:p>
-    <w:p>
-      <w:pPr>
-        <w:numPr>
-          <w:ilvl w:val="0"/>
-          <w:numId w:val="8"/>
-        </w:numPr>
-        <w:rPr>
-          <w:rFonts w:hint="eastAsia"/>
-        </w:rPr>
-      </w:pPr>
-      <w:r>
-        <w:t xml:space="preserve">Send Custom Modbus Command: allows tabs and CR/LF in the string. </w:t>
-      </w:r>
-      <w:r>
-        <w:t xml:space="preserve">Reports </w:t>
-      </w:r>
-      <w:r>
-        <w:t xml:space="preserve">error </w:t>
-      </w:r>
-      <w:r>
-        <w:t>for</w:t>
-      </w:r>
-      <w:r>
-        <w:t xml:space="preserve"> empty command string. </w:t>
-      </w:r>
-    </w:p>
-    <w:p>
-      <w:pPr>
-        <w:numPr>
-          <w:ilvl w:val="0"/>
-          <w:numId w:val="8"/>
-        </w:numPr>
-        <w:rPr>
-          <w:rFonts w:hint="eastAsia"/>
-        </w:rPr>
-      </w:pPr>
-      <w:r>
-        <w:t xml:space="preserve">Send Custom Modbus Command: </w:t>
-      </w:r>
-      <w:r>
-        <w:t>Reports</w:t>
-      </w:r>
-      <w:r>
-        <w:t xml:space="preserve"> error when command is too short, must be at least 2 bytes.</w:t>
-      </w:r>
-    </w:p>
-    <w:p>
-      <w:pPr>
-        <w:numPr>
-          <w:ilvl w:val="0"/>
-          <w:numId w:val="8"/>
-        </w:numPr>
-        <w:rPr>
-          <w:rFonts w:hint="eastAsia"/>
-        </w:rPr>
-      </w:pPr>
-      <w:r>
-        <w:t xml:space="preserve">Fix background </w:t>
-      </w:r>
-      <w:r>
-        <w:t>colour</w:t>
-      </w:r>
-      <w:r>
-        <w:t xml:space="preserve"> of registers.</w:t>
-      </w:r>
-    </w:p>
-    <w:p>
-      <w:pPr>
-        <w:pStyle w:val="Kop1"/>
-        <w:rPr>
-          <w:rFonts w:hint="eastAsia"/>
-        </w:rPr>
-      </w:pPr>
-      <w:r>
-        <w:t>v2.0.9 -- 2018-10-20</w:t>
-      </w:r>
-    </w:p>
-    <w:p>
-      <w:pPr>
-        <w:pStyle w:val="Kop3"/>
-        <w:rPr>
-          <w:rFonts w:hint="eastAsia"/>
-        </w:rPr>
-      </w:pPr>
-      <w:r>
-        <w:t>Features</w:t>
-      </w:r>
-    </w:p>
-    <w:p>
-      <w:pPr>
-        <w:numPr>
-          <w:ilvl w:val="0"/>
-          <w:numId w:val="9"/>
-        </w:numPr>
-        <w:rPr>
-          <w:rFonts w:hint="eastAsia"/>
-        </w:rPr>
-      </w:pPr>
-      <w:r>
-        <w:t>New option: "Move to next row on Enter".</w:t>
-      </w:r>
-    </w:p>
-    <w:p>
-      <w:pPr>
-        <w:numPr>
-          <w:ilvl w:val="0"/>
-          <w:numId w:val="9"/>
-        </w:numPr>
-        <w:rPr>
-          <w:rFonts w:hint="eastAsia"/>
-        </w:rPr>
-      </w:pPr>
-      <w:r>
-        <w:t xml:space="preserve">New option: "Auto-start edit mode on typing". </w:t>
-      </w:r>
-    </w:p>
-    <w:p>
-      <w:pPr>
-        <w:numPr>
-          <w:ilvl w:val="0"/>
-          <w:numId w:val="9"/>
-        </w:numPr>
-        <w:rPr>
-          <w:rFonts w:hint="eastAsia"/>
-        </w:rPr>
-      </w:pPr>
-      <w:r>
-        <w:t xml:space="preserve">New option: "Use custom editor". </w:t>
-      </w:r>
-    </w:p>
-    <w:p>
-      <w:pPr>
-        <w:numPr>
-          <w:ilvl w:val="0"/>
-          <w:numId w:val="9"/>
-        </w:numPr>
-        <w:rPr>
-          <w:rFonts w:hint="eastAsia"/>
-        </w:rPr>
-      </w:pPr>
-      <w:r>
-        <w:t>New option: "Ignore form size on project reload".</w:t>
-      </w:r>
-    </w:p>
-    <w:p>
-      <w:pPr>
-        <w:numPr>
-          <w:ilvl w:val="0"/>
-          <w:numId w:val="9"/>
-        </w:numPr>
-        <w:rPr>
-          <w:rFonts w:hint="eastAsia"/>
-        </w:rPr>
-      </w:pPr>
-      <w:r>
-        <w:t>Config</w:t>
-      </w:r>
-      <w:r>
-        <w:t>uration</w:t>
-      </w:r>
-      <w:r>
-        <w:t xml:space="preserve"> form now has an Apply button.</w:t>
-      </w:r>
-    </w:p>
-    <w:p>
-      <w:pPr>
-        <w:numPr>
-          <w:ilvl w:val="0"/>
-          <w:numId w:val="9"/>
-        </w:numPr>
-        <w:rPr>
-          <w:rFonts w:hint="eastAsia"/>
-        </w:rPr>
-      </w:pPr>
-      <w:r>
-        <w:t xml:space="preserve">Separate line-copy and value-copy </w:t>
-      </w:r>
-      <w:r>
-        <w:t xml:space="preserve">capability </w:t>
-      </w:r>
-      <w:r>
-        <w:t xml:space="preserve">in grid, </w:t>
-      </w:r>
-      <w:r>
-        <w:t>using</w:t>
-      </w:r>
-      <w:r>
-        <w:t xml:space="preserve"> control-C and context menu.</w:t>
-      </w:r>
-    </w:p>
-    <w:p>
-      <w:pPr>
-        <w:numPr>
-          <w:ilvl w:val="0"/>
-          <w:numId w:val="9"/>
-        </w:numPr>
-        <w:rPr>
-          <w:rFonts w:hint="eastAsia"/>
-        </w:rPr>
-      </w:pPr>
-      <w:r>
-        <w:t xml:space="preserve">The status bar now </w:t>
-      </w:r>
-      <w:r>
-        <w:t xml:space="preserve">has </w:t>
-      </w:r>
-      <w:r>
-        <w:t xml:space="preserve">blue </w:t>
-      </w:r>
-      <w:r>
-        <w:t xml:space="preserve">colour </w:t>
-      </w:r>
-      <w:r>
-        <w:t>if there is no connection or no polling is done.</w:t>
-      </w:r>
-    </w:p>
-    <w:p>
-      <w:pPr>
-        <w:numPr>
-          <w:ilvl w:val="0"/>
-          <w:numId w:val="9"/>
-        </w:numPr>
-        <w:rPr>
-          <w:rFonts w:hint="eastAsia"/>
-        </w:rPr>
-      </w:pPr>
-      <w:r>
-        <w:t xml:space="preserve">The status bar </w:t>
-      </w:r>
-      <w:r>
-        <w:t xml:space="preserve">now has red colour </w:t>
-      </w:r>
-      <w:r>
-        <w:t>for errors.</w:t>
-      </w:r>
-    </w:p>
-    <w:p>
-      <w:pPr>
-        <w:numPr>
-          <w:ilvl w:val="0"/>
-          <w:numId w:val="9"/>
-        </w:numPr>
-        <w:rPr>
-          <w:rFonts w:hint="eastAsia"/>
-        </w:rPr>
-      </w:pPr>
-      <w:r>
-        <w:t xml:space="preserve">Now </w:t>
-      </w:r>
-      <w:r>
-        <w:t>shows</w:t>
-      </w:r>
-      <w:r>
-        <w:t xml:space="preserve"> a warning in the "Save configuration to project file" and "Project configuration" screens if localoverrides </w:t>
-      </w:r>
-      <w:r>
-        <w:t>were</w:t>
-      </w:r>
-      <w:r>
-        <w:t xml:space="preserve"> used.</w:t>
-      </w:r>
-    </w:p>
-    <w:p>
-      <w:pPr>
-        <w:pStyle w:val="Kop3"/>
-        <w:rPr>
-          <w:rFonts w:hint="eastAsia"/>
-        </w:rPr>
-      </w:pPr>
-      <w:r>
-        <w:t>Fixes</w:t>
-      </w:r>
-    </w:p>
-    <w:p>
-      <w:pPr>
-        <w:numPr>
-          <w:ilvl w:val="0"/>
-          <w:numId w:val="10"/>
-        </w:numPr>
-        <w:rPr>
-          <w:rFonts w:hint="eastAsia"/>
-        </w:rPr>
-      </w:pPr>
-      <w:r>
-        <w:t xml:space="preserve">Notification </w:t>
-      </w:r>
-      <w:r>
-        <w:t>if Settings.xml could not be loaded at startup.</w:t>
-      </w:r>
-    </w:p>
-    <w:p>
-      <w:pPr>
-        <w:numPr>
-          <w:ilvl w:val="0"/>
-          <w:numId w:val="10"/>
-        </w:numPr>
-        <w:rPr>
-          <w:rFonts w:hint="eastAsia"/>
-        </w:rPr>
-      </w:pPr>
-      <w:r>
-        <w:t xml:space="preserve">Settings.xml </w:t>
-      </w:r>
-      <w:r>
-        <w:t xml:space="preserve">writing now </w:t>
-      </w:r>
-      <w:r>
-        <w:t>update</w:t>
-      </w:r>
-      <w:r>
-        <w:t>s</w:t>
-      </w:r>
-      <w:r>
-        <w:t>/insert</w:t>
-      </w:r>
-      <w:r>
-        <w:t>s</w:t>
-      </w:r>
-      <w:r>
-        <w:t xml:space="preserve"> </w:t>
-      </w:r>
-      <w:r>
-        <w:t>al</w:t>
-      </w:r>
-      <w:r>
-        <w:t xml:space="preserve">l tags in the </w:t>
-      </w:r>
-      <w:r>
-        <w:t xml:space="preserve">existing </w:t>
-      </w:r>
-      <w:r>
-        <w:t>file instead of writing a completely new file, so that any newer tags from a newer version remain.</w:t>
-      </w:r>
-    </w:p>
-    <w:p>
-      <w:pPr>
-        <w:numPr>
-          <w:ilvl w:val="0"/>
-          <w:numId w:val="10"/>
-        </w:numPr>
-        <w:rPr>
-          <w:rFonts w:hint="eastAsia"/>
-        </w:rPr>
-      </w:pPr>
-      <w:r>
-        <w:t>Project Configuration: Interframe-delay: now shows "0 (auto)" at setting 0.</w:t>
-      </w:r>
-    </w:p>
-    <w:p>
-      <w:pPr>
-        <w:numPr>
-          <w:ilvl w:val="0"/>
-          <w:numId w:val="10"/>
-        </w:numPr>
-        <w:rPr>
-          <w:rFonts w:hint="eastAsia"/>
-        </w:rPr>
-      </w:pPr>
-      <w:r>
-        <w:t xml:space="preserve">Local override project </w:t>
-      </w:r>
-      <w:r>
-        <w:t xml:space="preserve">is </w:t>
-      </w:r>
-      <w:r>
-        <w:t xml:space="preserve">no longer </w:t>
-      </w:r>
-      <w:r>
-        <w:t xml:space="preserve">required to have a </w:t>
-      </w:r>
-      <w:r>
-        <w:t>&lt;modbus&gt; element.</w:t>
-      </w:r>
-    </w:p>
-    <w:p>
-      <w:pPr>
-        <w:numPr>
-          <w:ilvl w:val="0"/>
-          <w:numId w:val="10"/>
-        </w:numPr>
-        <w:rPr>
-          <w:rFonts w:hint="eastAsia"/>
-        </w:rPr>
-      </w:pPr>
-      <w:r>
-        <w:t>Dialog forms can now be closed with the Enter key.</w:t>
-      </w:r>
-    </w:p>
-    <w:p>
-      <w:pPr>
-        <w:numPr>
-          <w:ilvl w:val="0"/>
-          <w:numId w:val="10"/>
-        </w:numPr>
-        <w:rPr>
-          <w:rFonts w:hint="eastAsia"/>
-        </w:rPr>
-      </w:pPr>
-      <w:r>
-        <w:t xml:space="preserve">The </w:t>
-      </w:r>
-      <w:r>
-        <w:t>checkboxes of the "Save configuration to project file" form</w:t>
-      </w:r>
-      <w:r>
-        <w:t xml:space="preserve"> are now cleared when loading a project.</w:t>
-      </w:r>
-    </w:p>
-    <w:p>
-      <w:pPr>
-        <w:numPr>
-          <w:ilvl w:val="0"/>
-          <w:numId w:val="10"/>
-        </w:numPr>
-        <w:rPr>
-          <w:rFonts w:hint="eastAsia"/>
-        </w:rPr>
-      </w:pPr>
-      <w:r>
-        <w:t xml:space="preserve">Buttons at the bottom of the forms now have </w:t>
-      </w:r>
-      <w:r>
-        <w:t>better spacing</w:t>
-      </w:r>
-      <w:r>
-        <w:t>.</w:t>
-      </w:r>
-    </w:p>
-    <w:p>
-      <w:pPr>
-        <w:pStyle w:val="Kop1"/>
-        <w:rPr>
-          <w:rFonts w:hint="eastAsia"/>
-        </w:rPr>
-      </w:pPr>
-      <w:r>
-        <w:t>v2.0.8 -- 2018-08-02</w:t>
-      </w:r>
-    </w:p>
-    <w:p>
-      <w:pPr>
-        <w:pStyle w:val="Kop3"/>
-        <w:rPr>
-          <w:rFonts w:hint="eastAsia"/>
-        </w:rPr>
-      </w:pPr>
-      <w:r>
-        <w:t>Features</w:t>
-      </w:r>
-    </w:p>
-    <w:p>
-      <w:pPr>
-        <w:numPr>
-          <w:ilvl w:val="0"/>
           <w:numId w:val="11"/>
         </w:numPr>
         <w:rPr>
@@ -2829,7 +3147,13 @@
         </w:rPr>
       </w:pPr>
       <w:r>
-        <w:t xml:space="preserve">Can save project configuration, bridge settings and form size in mbc file. </w:t>
+        <w:t xml:space="preserve">Can save project configuration, bridge settings and </w:t>
+      </w:r>
+      <w:r>
+        <w:t>window</w:t>
+      </w:r>
+      <w:r>
+        <w:t xml:space="preserve"> size in mbc file. </w:t>
       </w:r>
     </w:p>
     <w:p>
@@ -2843,7 +3167,6 @@
         </w:rPr>
       </w:pPr>
       <w:r>
-        <w:lastRenderedPageBreak/>
         <w:t xml:space="preserve">Communication </w:t>
       </w:r>
       <w:r>

</xml_diff>

<commit_message>
Fix: Changing a register value by selecting a new value from the enumeration list no longer worked. Release v2.0.19.
git-svn-id: http://visualsvn.edna.local/EDNA/ModbusControl/V2@4909 03c8d257-35a7-c645-9f01-50f27e98b9e6
</commit_message>
<xml_diff>
--- a/Manuals/ModbusControl - Release notes.docx
+++ b/Manuals/ModbusControl - Release notes.docx
@@ -35,6 +35,72 @@
         <w:rPr>
           <w:color w:val="auto"/>
         </w:rPr>
+        <w:t>1</w:t>
+      </w:r>
+      <w:r>
+        <w:rPr>
+          <w:color w:val="auto"/>
+        </w:rPr>
+        <w:t xml:space="preserve">9 </w:t>
+      </w:r>
+      <w:r>
+        <w:rPr>
+          <w:color w:val="auto"/>
+        </w:rPr>
+        <w:t>– 2025-</w:t>
+      </w:r>
+      <w:r>
+        <w:rPr>
+          <w:color w:val="auto"/>
+        </w:rPr>
+        <w:t>09-24</w:t>
+      </w:r>
+    </w:p>
+    <w:p>
+      <w:pPr>
+        <w:pStyle w:val="Kop3"/>
+        <w:numPr>
+          <w:ilvl w:val="0"/>
+          <w:numId w:val="0"/>
+        </w:numPr>
+        <w:ind w:left="431" w:hanging="431"/>
+        <w:rPr>
+          <w:rFonts w:hint="eastAsia"/>
+        </w:rPr>
+      </w:pPr>
+      <w:r>
+        <w:t>Fixes</w:t>
+      </w:r>
+    </w:p>
+    <w:p>
+      <w:pPr>
+        <w:numPr>
+          <w:ilvl w:val="0"/>
+          <w:numId w:val="4"/>
+        </w:numPr>
+        <w:rPr>
+          <w:rFonts w:hint="eastAsia"/>
+        </w:rPr>
+      </w:pPr>
+      <w:r>
+        <w:t>Changing a register value by selecting a new value from the enumeration list no longer worked.</w:t>
+      </w:r>
+    </w:p>
+    <w:p>
+      <w:pPr>
+        <w:pStyle w:val="Kop1"/>
+        <w:rPr>
+          <w:rFonts w:hint="eastAsia"/>
+          <w:color w:val="auto"/>
+        </w:rPr>
+      </w:pPr>
+      <w:r>
+        <w:t>v2.0.</w:t>
+      </w:r>
+      <w:r>
+        <w:rPr>
+          <w:color w:val="auto"/>
+        </w:rPr>
         <w:t>18 – 2025-</w:t>
       </w:r>
       <w:r>
@@ -707,6 +773,7 @@
         <w:t xml:space="preserve">Enter.  Or like: </w:t>
       </w:r>
       <w:r>
+        <w:lastRenderedPageBreak/>
         <w:t xml:space="preserve">start </w:t>
       </w:r>
       <w:r>
@@ -778,32 +845,806 @@
         </w:rPr>
       </w:pPr>
       <w:r>
+        <w:t>v2.0.</w:t>
+      </w:r>
+      <w:r>
+        <w:rPr>
+          <w:color w:val="auto"/>
+        </w:rPr>
+        <w:t>1</w:t>
+      </w:r>
+      <w:r>
+        <w:rPr>
+          <w:color w:val="auto"/>
+        </w:rPr>
+        <w:t>6</w:t>
+      </w:r>
+      <w:r>
+        <w:rPr>
+          <w:color w:val="auto"/>
+        </w:rPr>
+        <w:t xml:space="preserve"> – 2023-</w:t>
+      </w:r>
+      <w:r>
+        <w:rPr>
+          <w:color w:val="auto"/>
+        </w:rPr>
+        <w:t>12-27</w:t>
+      </w:r>
+    </w:p>
+    <w:p>
+      <w:pPr>
+        <w:pStyle w:val="Kop3"/>
+        <w:rPr>
+          <w:rFonts w:hint="eastAsia"/>
+        </w:rPr>
+      </w:pPr>
+      <w:r>
+        <w:t>Features</w:t>
+      </w:r>
+    </w:p>
+    <w:p>
+      <w:pPr>
+        <w:numPr>
+          <w:ilvl w:val="0"/>
+          <w:numId w:val="4"/>
+        </w:numPr>
+        <w:rPr>
+          <w:rFonts w:hint="eastAsia"/>
+        </w:rPr>
+      </w:pPr>
+      <w:r>
+        <w:t xml:space="preserve">Project configuration </w:t>
+      </w:r>
+      <w:r>
+        <w:t>window</w:t>
+      </w:r>
+      <w:r>
+        <w:t>:</w:t>
+      </w:r>
+      <w:r>
+        <w:t xml:space="preserve"> now shows </w:t>
+      </w:r>
+      <w:r>
+        <w:t xml:space="preserve">a warning icon </w:t>
+      </w:r>
+      <w:r>
+        <w:t>with</w:t>
+      </w:r>
+      <w:r>
+        <w:t xml:space="preserve"> each parameter that had a command line override, instead of one </w:t>
+      </w:r>
+      <w:r>
+        <w:t>general</w:t>
+      </w:r>
+      <w:r>
+        <w:t xml:space="preserve"> </w:t>
+      </w:r>
+      <w:r>
+        <w:t>warning</w:t>
+      </w:r>
+      <w:r>
+        <w:t>.</w:t>
+      </w:r>
+    </w:p>
+    <w:p>
+      <w:pPr>
+        <w:numPr>
+          <w:ilvl w:val="0"/>
+          <w:numId w:val="4"/>
+        </w:numPr>
+        <w:rPr>
+          <w:rFonts w:hint="eastAsia"/>
+        </w:rPr>
+      </w:pPr>
+      <w:r>
+        <w:t xml:space="preserve">Command line options can </w:t>
+      </w:r>
+      <w:r>
+        <w:t xml:space="preserve">now </w:t>
+      </w:r>
+      <w:r>
+        <w:t xml:space="preserve">start with – or /. </w:t>
+      </w:r>
+    </w:p>
+    <w:p>
+      <w:pPr>
+        <w:numPr>
+          <w:ilvl w:val="0"/>
+          <w:numId w:val="4"/>
+        </w:numPr>
+        <w:rPr>
+          <w:rFonts w:hint="eastAsia"/>
+        </w:rPr>
+      </w:pPr>
+      <w:r>
+        <w:t>Added</w:t>
+      </w:r>
+      <w:r>
+        <w:t xml:space="preserve"> more command line options. Use </w:t>
+      </w:r>
+      <w:r>
+        <w:t>-? -h -help /? /h or /help</w:t>
+      </w:r>
+      <w:r>
+        <w:t xml:space="preserve"> for help.</w:t>
+      </w:r>
+    </w:p>
+    <w:p>
+      <w:pPr>
+        <w:numPr>
+          <w:ilvl w:val="0"/>
+          <w:numId w:val="4"/>
+        </w:numPr>
+        <w:rPr>
+          <w:rFonts w:hint="eastAsia"/>
+        </w:rPr>
+      </w:pPr>
+      <w:r>
+        <w:t>Mbc file: &lt;</w:t>
+      </w:r>
+      <w:proofErr w:type="spellStart"/>
+      <w:r>
+        <w:t>exportorder</w:t>
+      </w:r>
+      <w:proofErr w:type="spellEnd"/>
+      <w:r>
+        <w:t>&gt; element added.</w:t>
+      </w:r>
+    </w:p>
+    <w:p>
+      <w:pPr>
+        <w:numPr>
+          <w:ilvl w:val="0"/>
+          <w:numId w:val="4"/>
+        </w:numPr>
+        <w:rPr>
+          <w:rFonts w:hint="eastAsia"/>
+        </w:rPr>
+      </w:pPr>
+      <w:r>
+        <w:t>C</w:t>
+      </w:r>
+      <w:r>
+        <w:t>ommand line import and export utilities ModbusImport.exe and ModbusExport.exe</w:t>
+      </w:r>
+      <w:r>
+        <w:t xml:space="preserve"> added</w:t>
+      </w:r>
+      <w:r>
+        <w:t>.</w:t>
+      </w:r>
+    </w:p>
+    <w:p>
+      <w:pPr>
+        <w:pStyle w:val="Kop3"/>
+        <w:numPr>
+          <w:ilvl w:val="0"/>
+          <w:numId w:val="0"/>
+        </w:numPr>
+        <w:ind w:left="431" w:hanging="431"/>
+        <w:rPr>
+          <w:rFonts w:hint="eastAsia"/>
+        </w:rPr>
+      </w:pPr>
+      <w:r>
+        <w:t>Fixes</w:t>
+      </w:r>
+    </w:p>
+    <w:p>
+      <w:pPr>
+        <w:numPr>
+          <w:ilvl w:val="0"/>
+          <w:numId w:val="4"/>
+        </w:numPr>
+        <w:rPr>
+          <w:rFonts w:hint="eastAsia"/>
+        </w:rPr>
+      </w:pPr>
+      <w:r>
+        <w:t xml:space="preserve">Release notes </w:t>
+      </w:r>
+      <w:r>
+        <w:t xml:space="preserve">are now </w:t>
+      </w:r>
+      <w:r>
+        <w:t>in English.</w:t>
+      </w:r>
+    </w:p>
+    <w:p>
+      <w:pPr>
+        <w:pStyle w:val="Lijstalinea"/>
+        <w:numPr>
+          <w:ilvl w:val="0"/>
+          <w:numId w:val="4"/>
+        </w:numPr>
+        <w:rPr>
+          <w:rFonts w:hint="eastAsia"/>
+        </w:rPr>
+      </w:pPr>
+      <w:r>
+        <w:t xml:space="preserve">Crash fixed: an internal buffer overflow in the communications code </w:t>
+      </w:r>
+      <w:r>
+        <w:t xml:space="preserve">sometimes </w:t>
+      </w:r>
+      <w:r>
+        <w:t xml:space="preserve">caused an application crash. </w:t>
+      </w:r>
+    </w:p>
+    <w:p>
+      <w:pPr>
+        <w:pStyle w:val="Lijstalinea"/>
+        <w:numPr>
+          <w:ilvl w:val="0"/>
+          <w:numId w:val="4"/>
+        </w:numPr>
+        <w:rPr>
+          <w:rFonts w:hint="eastAsia"/>
+        </w:rPr>
+      </w:pPr>
+      <w:proofErr w:type="spellStart"/>
+      <w:r>
+        <w:rPr>
+          <w:rFonts w:hint="eastAsia"/>
+        </w:rPr>
+        <w:t>WriteHoldingregisterFC</w:t>
+      </w:r>
+      <w:proofErr w:type="spellEnd"/>
+      <w:r>
+        <w:t xml:space="preserve"> </w:t>
+      </w:r>
+      <w:r>
+        <w:rPr>
+          <w:rFonts w:hint="eastAsia"/>
+        </w:rPr>
+        <w:t>=</w:t>
+      </w:r>
+      <w:r>
+        <w:t xml:space="preserve"> ‘</w:t>
+      </w:r>
+      <w:r>
+        <w:rPr>
+          <w:rFonts w:hint="eastAsia"/>
+        </w:rPr>
+        <w:t>alternate</w:t>
+      </w:r>
+      <w:r>
+        <w:t>’</w:t>
+      </w:r>
+      <w:r>
+        <w:t xml:space="preserve"> is dropped because it was con</w:t>
+      </w:r>
+      <w:r>
+        <w:t>fusing. It is automatically replaced by ‘auto’ if found in an mbc project file.</w:t>
+      </w:r>
+    </w:p>
+    <w:p>
+      <w:pPr>
+        <w:numPr>
+          <w:ilvl w:val="0"/>
+          <w:numId w:val="4"/>
+        </w:numPr>
+        <w:rPr>
+          <w:rFonts w:hint="eastAsia"/>
+        </w:rPr>
+      </w:pPr>
+      <w:r>
+        <w:t>Stop-on-error mechanism fix</w:t>
+      </w:r>
+      <w:r>
+        <w:t>ed</w:t>
+      </w:r>
+      <w:r>
+        <w:t>.</w:t>
+      </w:r>
+    </w:p>
+    <w:p>
+      <w:pPr>
+        <w:numPr>
+          <w:ilvl w:val="0"/>
+          <w:numId w:val="4"/>
+        </w:numPr>
+        <w:rPr>
+          <w:rFonts w:hint="eastAsia"/>
+        </w:rPr>
+      </w:pPr>
+      <w:r>
+        <w:t xml:space="preserve">Import now processes the </w:t>
+      </w:r>
+      <w:r>
+        <w:t>CSV</w:t>
+      </w:r>
+      <w:r>
+        <w:t xml:space="preserve"> file in top-down order. </w:t>
+      </w:r>
+      <w:r>
+        <w:t>E</w:t>
+      </w:r>
+      <w:r>
+        <w:t xml:space="preserve">arlier versions </w:t>
+      </w:r>
+      <w:r>
+        <w:t xml:space="preserve">first scanned the file for errors, </w:t>
+      </w:r>
+      <w:r>
+        <w:t>then started import which could report more errors.</w:t>
+      </w:r>
+    </w:p>
+    <w:p>
+      <w:pPr>
+        <w:numPr>
+          <w:ilvl w:val="0"/>
+          <w:numId w:val="4"/>
+        </w:numPr>
+        <w:rPr>
+          <w:rFonts w:hint="eastAsia"/>
+        </w:rPr>
+      </w:pPr>
+      <w:r>
+        <w:t>Import now also ignores lines that only have spaces and/or separators.</w:t>
+      </w:r>
+    </w:p>
+    <w:p>
+      <w:pPr>
+        <w:pStyle w:val="Kop1"/>
+        <w:rPr>
+          <w:rFonts w:hint="eastAsia"/>
+        </w:rPr>
+      </w:pPr>
+      <w:r>
+        <w:t>v2.0.15 – 2023-06-24</w:t>
+      </w:r>
+    </w:p>
+    <w:p>
+      <w:pPr>
+        <w:pStyle w:val="Kop3"/>
+        <w:numPr>
+          <w:ilvl w:val="0"/>
+          <w:numId w:val="0"/>
+        </w:numPr>
+        <w:ind w:left="680" w:hanging="431"/>
+        <w:rPr>
+          <w:rFonts w:hint="eastAsia"/>
+        </w:rPr>
+      </w:pPr>
+      <w:r>
+        <w:rPr>
+          <w:rFonts w:hint="eastAsia"/>
+        </w:rPr>
+        <w:t>Features</w:t>
+      </w:r>
+    </w:p>
+    <w:p>
+      <w:pPr>
+        <w:pStyle w:val="Lijstalinea"/>
+        <w:numPr>
+          <w:ilvl w:val="0"/>
+          <w:numId w:val="4"/>
+        </w:numPr>
+        <w:rPr>
+          <w:rFonts w:hint="eastAsia"/>
+        </w:rPr>
+      </w:pPr>
+      <w:r>
+        <w:rPr>
+          <w:rFonts w:hint="eastAsia"/>
+        </w:rPr>
+        <w:t xml:space="preserve">Enum registers editing now has a dropdown </w:t>
+      </w:r>
+      <w:proofErr w:type="spellStart"/>
+      <w:r>
+        <w:rPr>
+          <w:rFonts w:hint="eastAsia"/>
+        </w:rPr>
+        <w:t>combobox</w:t>
+      </w:r>
+      <w:proofErr w:type="spellEnd"/>
+      <w:r>
+        <w:rPr>
+          <w:rFonts w:hint="eastAsia"/>
+        </w:rPr>
+        <w:t xml:space="preserve"> with possible values.</w:t>
+      </w:r>
+    </w:p>
+    <w:p>
+      <w:pPr>
+        <w:pStyle w:val="Lijstalinea"/>
+        <w:numPr>
+          <w:ilvl w:val="0"/>
+          <w:numId w:val="4"/>
+        </w:numPr>
+        <w:rPr>
+          <w:rFonts w:hint="eastAsia"/>
+        </w:rPr>
+      </w:pPr>
+      <w:r>
+        <w:rPr>
+          <w:rFonts w:hint="eastAsia"/>
+        </w:rPr>
+        <w:t>Mbc file: Enum values now allow a cu</w:t>
+      </w:r>
+      <w:r>
+        <w:t>s</w:t>
+      </w:r>
+      <w:r>
+        <w:rPr>
+          <w:rFonts w:hint="eastAsia"/>
+        </w:rPr>
+        <w:t xml:space="preserve">tom &lt;else&gt; </w:t>
+      </w:r>
+      <w:r>
+        <w:t>text</w:t>
+      </w:r>
+      <w:r>
+        <w:rPr>
+          <w:rFonts w:hint="eastAsia"/>
+        </w:rPr>
+        <w:t xml:space="preserve"> that is shown if no value matches. </w:t>
+      </w:r>
+      <w:r>
+        <w:t>&lt;else&gt; text can be left empty to suppress the message.</w:t>
+      </w:r>
+    </w:p>
+    <w:p>
+      <w:pPr>
+        <w:pStyle w:val="Lijstalinea"/>
+        <w:numPr>
+          <w:ilvl w:val="0"/>
+          <w:numId w:val="4"/>
+        </w:numPr>
+        <w:rPr>
+          <w:rFonts w:hint="eastAsia"/>
+        </w:rPr>
+      </w:pPr>
+      <w:r>
+        <w:rPr>
+          <w:rFonts w:hint="eastAsia"/>
+        </w:rPr>
+        <w:t xml:space="preserve">You can now use </w:t>
+      </w:r>
+      <w:r>
+        <w:t xml:space="preserve">5 digits and 6 digits </w:t>
+      </w:r>
+      <w:r>
+        <w:rPr>
+          <w:rFonts w:hint="eastAsia"/>
+        </w:rPr>
+        <w:t>registers numbering scheme</w:t>
+      </w:r>
+      <w:r>
+        <w:t>,</w:t>
+      </w:r>
+      <w:r>
+        <w:rPr>
+          <w:rFonts w:hint="eastAsia"/>
+        </w:rPr>
+        <w:t xml:space="preserve"> 40001-49999 and 400001-465536</w:t>
+      </w:r>
+      <w:r>
+        <w:t xml:space="preserve">, or </w:t>
+      </w:r>
+      <w:r>
+        <w:rPr>
+          <w:rFonts w:hint="eastAsia"/>
+        </w:rPr>
+        <w:t>40000-49999 and 400000-465535</w:t>
+      </w:r>
+      <w:r>
+        <w:t xml:space="preserve">, </w:t>
+      </w:r>
+      <w:r>
+        <w:rPr>
+          <w:rFonts w:hint="eastAsia"/>
+        </w:rPr>
+        <w:t xml:space="preserve">at the same time. </w:t>
+      </w:r>
+    </w:p>
+    <w:p>
+      <w:pPr>
+        <w:pStyle w:val="Kop3"/>
+        <w:numPr>
+          <w:ilvl w:val="0"/>
+          <w:numId w:val="0"/>
+        </w:numPr>
+        <w:ind w:left="680" w:hanging="431"/>
+        <w:rPr>
+          <w:rFonts w:hint="eastAsia"/>
+        </w:rPr>
+      </w:pPr>
+      <w:r>
+        <w:rPr>
+          <w:rFonts w:hint="eastAsia"/>
+        </w:rPr>
+        <w:t>Fixes</w:t>
+      </w:r>
+    </w:p>
+    <w:p>
+      <w:pPr>
+        <w:pStyle w:val="Lijstalinea"/>
+        <w:numPr>
+          <w:ilvl w:val="0"/>
+          <w:numId w:val="4"/>
+        </w:numPr>
+        <w:rPr>
+          <w:rFonts w:hint="eastAsia"/>
+        </w:rPr>
+      </w:pPr>
+      <w:r>
+        <w:t xml:space="preserve">In </w:t>
+      </w:r>
+      <w:proofErr w:type="spellStart"/>
+      <w:r>
+        <w:t>Import_file</w:t>
+      </w:r>
+      <w:proofErr w:type="spellEnd"/>
+      <w:r>
+        <w:t xml:space="preserve"> and </w:t>
+      </w:r>
+      <w:proofErr w:type="spellStart"/>
+      <w:r>
+        <w:t>Import_compare</w:t>
+      </w:r>
+      <w:proofErr w:type="spellEnd"/>
+      <w:r>
+        <w:t xml:space="preserve">: writing/comparing a float32 </w:t>
+      </w:r>
+      <w:r>
+        <w:t xml:space="preserve">value </w:t>
+      </w:r>
+      <w:r>
+        <w:t>no longer worked.</w:t>
+      </w:r>
+    </w:p>
+    <w:p>
+      <w:pPr>
+        <w:pStyle w:val="Lijstalinea"/>
+        <w:numPr>
+          <w:ilvl w:val="0"/>
+          <w:numId w:val="4"/>
+        </w:numPr>
+        <w:rPr>
+          <w:rFonts w:hint="eastAsia"/>
+        </w:rPr>
+      </w:pPr>
+      <w:r>
+        <w:rPr>
+          <w:rFonts w:hint="eastAsia"/>
+        </w:rPr>
+        <w:t xml:space="preserve">Ascii32 register writing </w:t>
+      </w:r>
+      <w:r>
+        <w:t>fixed.</w:t>
+      </w:r>
+    </w:p>
+    <w:p>
+      <w:pPr>
+        <w:pStyle w:val="Lijstalinea"/>
+        <w:numPr>
+          <w:ilvl w:val="0"/>
+          <w:numId w:val="4"/>
+        </w:numPr>
+        <w:rPr>
+          <w:rFonts w:hint="eastAsia"/>
+        </w:rPr>
+      </w:pPr>
+      <w:r>
+        <w:rPr>
+          <w:rFonts w:hint="eastAsia"/>
+        </w:rPr>
+        <w:t xml:space="preserve">Resizing column width is now </w:t>
+      </w:r>
+      <w:r>
+        <w:t>global for all tabs</w:t>
+      </w:r>
+      <w:r>
+        <w:rPr>
+          <w:rFonts w:hint="eastAsia"/>
+        </w:rPr>
+        <w:t>.</w:t>
+      </w:r>
+    </w:p>
+    <w:p>
+      <w:pPr>
+        <w:pStyle w:val="Lijstalinea"/>
+        <w:numPr>
+          <w:ilvl w:val="0"/>
+          <w:numId w:val="4"/>
+        </w:numPr>
+        <w:rPr>
+          <w:rFonts w:hint="eastAsia"/>
+        </w:rPr>
+      </w:pPr>
+      <w:r>
+        <w:rPr>
+          <w:rFonts w:hint="eastAsia"/>
+        </w:rPr>
+        <w:t>Zoom</w:t>
+      </w:r>
+      <w:r>
+        <w:t>ing</w:t>
+      </w:r>
+      <w:r>
+        <w:rPr>
+          <w:rFonts w:hint="eastAsia"/>
+        </w:rPr>
+        <w:t xml:space="preserve"> now also adjusts the size of the column headers.</w:t>
+      </w:r>
+    </w:p>
+    <w:p>
+      <w:pPr>
+        <w:pStyle w:val="Lijstalinea"/>
+        <w:numPr>
+          <w:ilvl w:val="0"/>
+          <w:numId w:val="4"/>
+        </w:numPr>
+        <w:rPr>
+          <w:rFonts w:hint="eastAsia"/>
+        </w:rPr>
+      </w:pPr>
+      <w:r>
+        <w:rPr>
+          <w:rFonts w:hint="eastAsia"/>
+        </w:rPr>
+        <w:t>You can now close the [</w:t>
+      </w:r>
+      <w:proofErr w:type="spellStart"/>
+      <w:r>
+        <w:rPr>
+          <w:rFonts w:hint="eastAsia"/>
+        </w:rPr>
+        <w:t>Project_Configuration</w:t>
+      </w:r>
+      <w:proofErr w:type="spellEnd"/>
+      <w:r>
+        <w:rPr>
+          <w:rFonts w:hint="eastAsia"/>
+        </w:rPr>
+        <w:t>], [</w:t>
+      </w:r>
+      <w:proofErr w:type="spellStart"/>
+      <w:r>
+        <w:rPr>
+          <w:rFonts w:hint="eastAsia"/>
+        </w:rPr>
+        <w:t>Save_project_file</w:t>
+      </w:r>
+      <w:proofErr w:type="spellEnd"/>
+      <w:r>
+        <w:rPr>
+          <w:rFonts w:hint="eastAsia"/>
+        </w:rPr>
+        <w:t>] and [About] forms with the ESC button</w:t>
+      </w:r>
+      <w:r>
+        <w:t xml:space="preserve"> too</w:t>
+      </w:r>
+      <w:r>
+        <w:rPr>
+          <w:rFonts w:hint="eastAsia"/>
+        </w:rPr>
+        <w:t>.</w:t>
+      </w:r>
+    </w:p>
+    <w:p>
+      <w:pPr>
+        <w:pStyle w:val="Lijstalinea"/>
+        <w:numPr>
+          <w:ilvl w:val="0"/>
+          <w:numId w:val="4"/>
+        </w:numPr>
+        <w:rPr>
+          <w:rFonts w:hint="eastAsia"/>
+        </w:rPr>
+      </w:pPr>
+      <w:r>
+        <w:rPr>
+          <w:rFonts w:hint="eastAsia"/>
+        </w:rPr>
+        <w:t>The expand/collapse icons scale with zoom</w:t>
+      </w:r>
+      <w:r>
+        <w:t>ing</w:t>
+      </w:r>
+      <w:r>
+        <w:rPr>
+          <w:rFonts w:hint="eastAsia"/>
+        </w:rPr>
+        <w:t>.</w:t>
+      </w:r>
+    </w:p>
+    <w:p>
+      <w:pPr>
+        <w:pStyle w:val="Lijstalinea"/>
+        <w:numPr>
+          <w:ilvl w:val="0"/>
+          <w:numId w:val="4"/>
+        </w:numPr>
+        <w:rPr>
+          <w:rFonts w:hint="eastAsia"/>
+        </w:rPr>
+      </w:pPr>
+      <w:r>
+        <w:rPr>
+          <w:rFonts w:hint="eastAsia"/>
+        </w:rPr>
+        <w:t>If an error occurs when loading an mbc file, no auto-connect to the slave/server is done.</w:t>
+      </w:r>
+    </w:p>
+    <w:p>
+      <w:pPr>
+        <w:pStyle w:val="Lijstalinea"/>
+        <w:numPr>
+          <w:ilvl w:val="0"/>
+          <w:numId w:val="4"/>
+        </w:numPr>
+        <w:rPr>
+          <w:rFonts w:hint="eastAsia"/>
+        </w:rPr>
+      </w:pPr>
+      <w:r>
+        <w:rPr>
+          <w:rFonts w:hint="eastAsia"/>
+        </w:rPr>
+        <w:t xml:space="preserve">With </w:t>
+      </w:r>
+      <w:proofErr w:type="spellStart"/>
+      <w:r>
+        <w:rPr>
+          <w:rFonts w:hint="eastAsia"/>
+        </w:rPr>
+        <w:t>Import_file</w:t>
+      </w:r>
+      <w:proofErr w:type="spellEnd"/>
+      <w:r>
+        <w:rPr>
+          <w:rFonts w:hint="eastAsia"/>
+        </w:rPr>
+        <w:t xml:space="preserve"> and </w:t>
+      </w:r>
+      <w:proofErr w:type="spellStart"/>
+      <w:r>
+        <w:rPr>
+          <w:rFonts w:hint="eastAsia"/>
+        </w:rPr>
+        <w:t>Import_compare</w:t>
+      </w:r>
+      <w:proofErr w:type="spellEnd"/>
+      <w:r>
+        <w:rPr>
+          <w:rFonts w:hint="eastAsia"/>
+        </w:rPr>
+        <w:t>: writing/compar</w:t>
+      </w:r>
+      <w:r>
+        <w:t>ing</w:t>
+      </w:r>
+      <w:r>
+        <w:rPr>
+          <w:rFonts w:hint="eastAsia"/>
+        </w:rPr>
+        <w:t xml:space="preserve"> a float32 </w:t>
+      </w:r>
+      <w:r>
+        <w:t>is fixed</w:t>
+      </w:r>
+      <w:r>
+        <w:rPr>
+          <w:rFonts w:hint="eastAsia"/>
+        </w:rPr>
+        <w:t>.</w:t>
+      </w:r>
+    </w:p>
+    <w:p>
+      <w:pPr>
+        <w:pStyle w:val="Kop1"/>
+        <w:rPr>
+          <w:rFonts w:hint="eastAsia"/>
+        </w:rPr>
+      </w:pPr>
+      <w:r>
         <w:lastRenderedPageBreak/>
-        <w:t>v2.0.</w:t>
-      </w:r>
-      <w:r>
-        <w:rPr>
-          <w:color w:val="auto"/>
-        </w:rPr>
-        <w:t>1</w:t>
-      </w:r>
-      <w:r>
-        <w:rPr>
-          <w:color w:val="auto"/>
-        </w:rPr>
-        <w:t>6</w:t>
-      </w:r>
-      <w:r>
-        <w:rPr>
-          <w:color w:val="auto"/>
-        </w:rPr>
-        <w:t xml:space="preserve"> – 2023-</w:t>
-      </w:r>
-      <w:r>
-        <w:rPr>
-          <w:color w:val="auto"/>
-        </w:rPr>
-        <w:t>12-27</w:t>
+        <w:t>v2.0.14 -- 2022-11-08</w:t>
       </w:r>
     </w:p>
     <w:p>
@@ -828,35 +1669,151 @@
         </w:rPr>
       </w:pPr>
       <w:r>
-        <w:t xml:space="preserve">Project configuration </w:t>
+        <w:t xml:space="preserve">Added command line parameters. </w:t>
+      </w:r>
+      <w:r>
+        <w:t>These r</w:t>
+      </w:r>
+      <w:r>
+        <w:t xml:space="preserve">eplaces </w:t>
+      </w:r>
+      <w:r>
+        <w:t xml:space="preserve">the </w:t>
+      </w:r>
+      <w:r>
+        <w:t>LocalOverrides</w:t>
+      </w:r>
+      <w:r>
+        <w:t xml:space="preserve"> mechanism.</w:t>
+      </w:r>
+    </w:p>
+    <w:p>
+      <w:pPr>
+        <w:numPr>
+          <w:ilvl w:val="0"/>
+          <w:numId w:val="4"/>
+        </w:numPr>
+        <w:rPr>
+          <w:rFonts w:hint="eastAsia"/>
+        </w:rPr>
+      </w:pPr>
+      <w:r>
+        <w:t xml:space="preserve">LocalOverrides </w:t>
+      </w:r>
+      <w:r>
+        <w:t>mechanism removed.</w:t>
+      </w:r>
+    </w:p>
+    <w:p>
+      <w:pPr>
+        <w:numPr>
+          <w:ilvl w:val="0"/>
+          <w:numId w:val="4"/>
+        </w:numPr>
+        <w:rPr>
+          <w:rFonts w:hint="eastAsia"/>
+        </w:rPr>
+      </w:pPr>
+      <w:r>
+        <w:t>Save project file: the [Update XML to current version] checkbox is now enabled by default.</w:t>
+      </w:r>
+    </w:p>
+    <w:p>
+      <w:pPr>
+        <w:numPr>
+          <w:ilvl w:val="0"/>
+          <w:numId w:val="4"/>
+        </w:numPr>
+        <w:rPr>
+          <w:rFonts w:hint="eastAsia"/>
+        </w:rPr>
+      </w:pPr>
+      <w:r>
+        <w:t xml:space="preserve">Options </w:t>
       </w:r>
       <w:r>
         <w:t>window</w:t>
       </w:r>
       <w:r>
-        <w:t>:</w:t>
-      </w:r>
-      <w:r>
-        <w:t xml:space="preserve"> now shows </w:t>
-      </w:r>
-      <w:r>
-        <w:t xml:space="preserve">a warning icon </w:t>
-      </w:r>
-      <w:r>
-        <w:t>with</w:t>
-      </w:r>
-      <w:r>
-        <w:t xml:space="preserve"> each parameter that had a command line override, instead of one </w:t>
-      </w:r>
-      <w:r>
-        <w:t>general</w:t>
+        <w:t>: tooltips improved.</w:t>
+      </w:r>
+    </w:p>
+    <w:p>
+      <w:pPr>
+        <w:numPr>
+          <w:ilvl w:val="0"/>
+          <w:numId w:val="4"/>
+        </w:numPr>
+        <w:rPr>
+          <w:rFonts w:hint="eastAsia"/>
+        </w:rPr>
+      </w:pPr>
+      <w:r>
+        <w:t>Grid: Regist</w:t>
+      </w:r>
+      <w:r>
+        <w:t>er</w:t>
       </w:r>
       <w:r>
         <w:t xml:space="preserve"> </w:t>
       </w:r>
       <w:r>
-        <w:t>warning</w:t>
-      </w:r>
+        <w:t xml:space="preserve">column menu now has </w:t>
+      </w:r>
+      <w:r>
+        <w:t xml:space="preserve"> [</w:t>
+      </w:r>
+      <w:r>
+        <w:t>Expand all]</w:t>
+      </w:r>
+      <w:r>
+        <w:t xml:space="preserve"> and </w:t>
+      </w:r>
+      <w:r>
+        <w:t>[</w:t>
+      </w:r>
+      <w:r>
+        <w:t>Collapse all</w:t>
+      </w:r>
+      <w:r>
+        <w:t>].</w:t>
+      </w:r>
+    </w:p>
+    <w:p>
+      <w:pPr>
+        <w:numPr>
+          <w:ilvl w:val="0"/>
+          <w:numId w:val="4"/>
+        </w:numPr>
+        <w:rPr>
+          <w:rFonts w:hint="eastAsia"/>
+        </w:rPr>
+      </w:pPr>
+      <w:r>
+        <w:t>Mbc project file: &lt;</w:t>
+      </w:r>
+      <w:proofErr w:type="spellStart"/>
+      <w:r>
+        <w:t>longdescr</w:t>
+      </w:r>
+      <w:proofErr w:type="spellEnd"/>
+      <w:r>
+        <w:t xml:space="preserve">&gt; </w:t>
+      </w:r>
+      <w:r>
+        <w:t xml:space="preserve">element </w:t>
+      </w:r>
+      <w:r>
+        <w:t xml:space="preserve">added. </w:t>
+      </w:r>
+      <w:r>
+        <w:t xml:space="preserve">Adds a long multiline text that is show when the mouse is hoovered over the register </w:t>
+      </w:r>
+      <w:proofErr w:type="spellStart"/>
+      <w:r>
+        <w:t>decription</w:t>
+      </w:r>
+      <w:proofErr w:type="spellEnd"/>
       <w:r>
         <w:t>.</w:t>
       </w:r>
@@ -872,13 +1829,23 @@
         </w:rPr>
       </w:pPr>
       <w:r>
-        <w:t xml:space="preserve">Command line options can </w:t>
-      </w:r>
-      <w:r>
-        <w:t xml:space="preserve">now </w:t>
-      </w:r>
-      <w:r>
-        <w:t xml:space="preserve">start with – or /. </w:t>
+        <w:t>Mbc project file: &lt;include&gt; element added.</w:t>
+      </w:r>
+    </w:p>
+    <w:p>
+      <w:pPr>
+        <w:pStyle w:val="Kop3"/>
+        <w:numPr>
+          <w:ilvl w:val="0"/>
+          <w:numId w:val="0"/>
+        </w:numPr>
+        <w:ind w:left="680" w:hanging="431"/>
+        <w:rPr>
+          <w:rFonts w:hint="eastAsia"/>
+        </w:rPr>
+      </w:pPr>
+      <w:r>
+        <w:t>Fixes</w:t>
       </w:r>
     </w:p>
     <w:p>
@@ -892,16 +1859,10 @@
         </w:rPr>
       </w:pPr>
       <w:r>
-        <w:t>Added</w:t>
-      </w:r>
-      <w:r>
-        <w:t xml:space="preserve"> more command line options. Use </w:t>
-      </w:r>
-      <w:r>
-        <w:t>-? -h -help /? /h or /help</w:t>
-      </w:r>
-      <w:r>
-        <w:t xml:space="preserve"> for help.</w:t>
+        <w:t>[</w:t>
+      </w:r>
+      <w:r>
+        <w:t>Open project file location in Explorer] now works if you gave a filename without a path on the command line.</w:t>
       </w:r>
     </w:p>
     <w:p>
@@ -915,15 +1876,180 @@
         </w:rPr>
       </w:pPr>
       <w:r>
-        <w:t>Mbc file: &lt;</w:t>
+        <w:t xml:space="preserve">The temporary red </w:t>
+      </w:r>
+      <w:r>
+        <w:t>colouring</w:t>
+      </w:r>
+      <w:r>
+        <w:t xml:space="preserve"> of the value field after entering </w:t>
+      </w:r>
+      <w:r>
+        <w:t xml:space="preserve">an invalid value </w:t>
+      </w:r>
+      <w:r>
+        <w:t>has been improved.</w:t>
+      </w:r>
+    </w:p>
+    <w:p>
+      <w:pPr>
+        <w:numPr>
+          <w:ilvl w:val="0"/>
+          <w:numId w:val="4"/>
+        </w:numPr>
+        <w:rPr>
+          <w:rFonts w:hint="eastAsia"/>
+        </w:rPr>
+      </w:pPr>
+      <w:r>
+        <w:t>Edit</w:t>
+      </w:r>
+      <w:r>
+        <w:t xml:space="preserve"> enter/escape </w:t>
+      </w:r>
+      <w:r>
+        <w:t>handling is improved</w:t>
+      </w:r>
+      <w:r>
+        <w:t>.</w:t>
+      </w:r>
+    </w:p>
+    <w:p>
+      <w:pPr>
+        <w:numPr>
+          <w:ilvl w:val="0"/>
+          <w:numId w:val="4"/>
+        </w:numPr>
+        <w:rPr>
+          <w:rFonts w:hint="eastAsia"/>
+        </w:rPr>
+      </w:pPr>
+      <w:r>
+        <w:t xml:space="preserve">In the notification screen that the serial port could not be opened: the [Port] </w:t>
+      </w:r>
+      <w:r>
+        <w:t>combo box</w:t>
+      </w:r>
+      <w:r>
+        <w:t xml:space="preserve"> now automatically refreshes the list of serial ports.</w:t>
+      </w:r>
+    </w:p>
+    <w:p>
+      <w:pPr>
+        <w:pStyle w:val="Kop1"/>
+        <w:rPr>
+          <w:rFonts w:hint="eastAsia"/>
+        </w:rPr>
+      </w:pPr>
+      <w:r>
+        <w:t>v2.0.13 -- 2022-07-11</w:t>
+      </w:r>
+    </w:p>
+    <w:p>
+      <w:pPr>
+        <w:pStyle w:val="Kop3"/>
+        <w:rPr>
+          <w:rFonts w:hint="eastAsia"/>
+        </w:rPr>
+      </w:pPr>
+      <w:r>
+        <w:t>Features</w:t>
+      </w:r>
+    </w:p>
+    <w:p>
+      <w:pPr>
+        <w:numPr>
+          <w:ilvl w:val="0"/>
+          <w:numId w:val="4"/>
+        </w:numPr>
+        <w:rPr>
+          <w:rFonts w:hint="eastAsia"/>
+        </w:rPr>
+      </w:pPr>
+      <w:r>
+        <w:t xml:space="preserve">Added Find/Filter bar. </w:t>
+      </w:r>
+      <w:r>
+        <w:t>Open it using</w:t>
+      </w:r>
+      <w:r>
+        <w:t xml:space="preserve"> Control-F. There is also an option </w:t>
+      </w:r>
+      <w:r>
+        <w:t>“</w:t>
+      </w:r>
+      <w:r>
+        <w:t>Clear Find/Filter on tab change</w:t>
+      </w:r>
+      <w:r>
+        <w:t>”</w:t>
+      </w:r>
+      <w:r>
+        <w:t>.</w:t>
+      </w:r>
+    </w:p>
+    <w:p>
+      <w:pPr>
+        <w:numPr>
+          <w:ilvl w:val="0"/>
+          <w:numId w:val="4"/>
+        </w:numPr>
+        <w:rPr>
+          <w:rFonts w:hint="eastAsia"/>
+        </w:rPr>
+      </w:pPr>
+      <w:r>
+        <w:t>The properties of a register (</w:t>
       </w:r>
       <w:proofErr w:type="spellStart"/>
       <w:r>
-        <w:t>exportorder</w:t>
+        <w:t>rw</w:t>
       </w:r>
       <w:proofErr w:type="spellEnd"/>
       <w:r>
-        <w:t>&gt; element added.</w:t>
+        <w:t xml:space="preserve">, int32, ...) are now displayed in a separate </w:t>
+      </w:r>
+      <w:r>
+        <w:t>[</w:t>
+      </w:r>
+      <w:r>
+        <w:t>Properties</w:t>
+      </w:r>
+      <w:r>
+        <w:t>]</w:t>
+      </w:r>
+      <w:r>
+        <w:t xml:space="preserve"> column</w:t>
+      </w:r>
+      <w:r>
+        <w:t xml:space="preserve"> instead of being added to </w:t>
+      </w:r>
+      <w:r>
+        <w:t xml:space="preserve">the </w:t>
+      </w:r>
+      <w:r>
+        <w:t>[</w:t>
+      </w:r>
+      <w:r>
+        <w:t>Description</w:t>
+      </w:r>
+      <w:r>
+        <w:t>]</w:t>
+      </w:r>
+      <w:r>
+        <w:t xml:space="preserve"> column. </w:t>
+      </w:r>
+      <w:r>
+        <w:t>The [Properties]  column can be e</w:t>
+      </w:r>
+      <w:r>
+        <w:t>nable/disable</w:t>
+      </w:r>
+      <w:r>
+        <w:t>d</w:t>
+      </w:r>
+      <w:r>
+        <w:t xml:space="preserve"> in Options.</w:t>
       </w:r>
     </w:p>
     <w:p>
@@ -937,13 +2063,561 @@
         </w:rPr>
       </w:pPr>
       <w:r>
-        <w:t>C</w:t>
-      </w:r>
-      <w:r>
-        <w:t>ommand line import and export utilities ModbusImport.exe and ModbusExport.exe</w:t>
-      </w:r>
-      <w:r>
-        <w:t xml:space="preserve"> added</w:t>
+        <w:t>The Description text can now be multi-line</w:t>
+      </w:r>
+      <w:r>
+        <w:t>, i</w:t>
+      </w:r>
+      <w:r>
+        <w:t xml:space="preserve">f  the </w:t>
+      </w:r>
+      <w:r>
+        <w:t>“</w:t>
+      </w:r>
+      <w:r>
+        <w:t>Multiline rows with auto row size</w:t>
+      </w:r>
+      <w:r>
+        <w:t>”</w:t>
+      </w:r>
+      <w:r>
+        <w:t xml:space="preserve"> option </w:t>
+      </w:r>
+      <w:r>
+        <w:t>is enabled</w:t>
+      </w:r>
+      <w:r>
+        <w:t xml:space="preserve">. A </w:t>
+      </w:r>
+      <w:r>
+        <w:t xml:space="preserve">long </w:t>
+      </w:r>
+      <w:r>
+        <w:t xml:space="preserve">description </w:t>
+      </w:r>
+      <w:r>
+        <w:t>text is wrappe</w:t>
+      </w:r>
+      <w:r>
+        <w:t xml:space="preserve">d. </w:t>
+      </w:r>
+      <w:r>
+        <w:t>CR/LF</w:t>
+      </w:r>
+      <w:r>
+        <w:t xml:space="preserve">’s can be used in the description text. </w:t>
+      </w:r>
+      <w:r>
+        <w:t xml:space="preserve">The row height of the grid is automatically adjusted to the text. </w:t>
+      </w:r>
+    </w:p>
+    <w:p>
+      <w:pPr>
+        <w:numPr>
+          <w:ilvl w:val="0"/>
+          <w:numId w:val="4"/>
+        </w:numPr>
+        <w:rPr>
+          <w:rFonts w:hint="eastAsia"/>
+        </w:rPr>
+      </w:pPr>
+      <w:r>
+        <w:t>"Move to next row on Enter"</w:t>
+      </w:r>
+      <w:r>
+        <w:t xml:space="preserve"> option</w:t>
+      </w:r>
+      <w:r>
+        <w:t xml:space="preserve">: depending on this option, after entering a new value with the Enter key, the </w:t>
+      </w:r>
+      <w:r>
+        <w:t>cursor</w:t>
+      </w:r>
+      <w:r>
+        <w:t xml:space="preserve"> may or may not go to the next line. </w:t>
+      </w:r>
+      <w:r>
+        <w:t xml:space="preserve">Enter a value with </w:t>
+      </w:r>
+      <w:r>
+        <w:t>Control-Enter</w:t>
+      </w:r>
+      <w:r>
+        <w:t xml:space="preserve"> to get the</w:t>
+      </w:r>
+      <w:r>
+        <w:t xml:space="preserve"> opposite</w:t>
+      </w:r>
+      <w:r>
+        <w:t xml:space="preserve"> behaviour.</w:t>
+      </w:r>
+    </w:p>
+    <w:p>
+      <w:pPr>
+        <w:pStyle w:val="Kop3"/>
+        <w:numPr>
+          <w:ilvl w:val="0"/>
+          <w:numId w:val="0"/>
+        </w:numPr>
+        <w:ind w:left="680" w:hanging="431"/>
+        <w:rPr>
+          <w:rFonts w:hint="eastAsia"/>
+        </w:rPr>
+      </w:pPr>
+      <w:r>
+        <w:t>Fixes</w:t>
+      </w:r>
+    </w:p>
+    <w:p>
+      <w:pPr>
+        <w:numPr>
+          <w:ilvl w:val="0"/>
+          <w:numId w:val="5"/>
+        </w:numPr>
+        <w:rPr>
+          <w:rFonts w:hint="eastAsia"/>
+        </w:rPr>
+      </w:pPr>
+      <w:r>
+        <w:t xml:space="preserve">Control-0 for zoom reset now works globally on the </w:t>
+      </w:r>
+      <w:r>
+        <w:t>window</w:t>
+      </w:r>
+      <w:r>
+        <w:t>, not just when the focus is in the grid.</w:t>
+      </w:r>
+    </w:p>
+    <w:p>
+      <w:pPr>
+        <w:numPr>
+          <w:ilvl w:val="0"/>
+          <w:numId w:val="5"/>
+        </w:numPr>
+        <w:rPr>
+          <w:rFonts w:hint="eastAsia"/>
+        </w:rPr>
+      </w:pPr>
+      <w:r>
+        <w:t>R</w:t>
+      </w:r>
+      <w:r>
+        <w:t>ight-click</w:t>
+      </w:r>
+      <w:r>
+        <w:t>ing</w:t>
+      </w:r>
+      <w:r>
+        <w:t xml:space="preserve"> in the grid</w:t>
+      </w:r>
+      <w:r>
+        <w:t xml:space="preserve"> now moves the focus to that row, to </w:t>
+      </w:r>
+      <w:r>
+        <w:t>better see which row you are working on.</w:t>
+      </w:r>
+    </w:p>
+    <w:p>
+      <w:pPr>
+        <w:numPr>
+          <w:ilvl w:val="0"/>
+          <w:numId w:val="5"/>
+        </w:numPr>
+        <w:rPr>
+          <w:rFonts w:hint="eastAsia"/>
+        </w:rPr>
+      </w:pPr>
+      <w:r>
+        <w:t>Migrated</w:t>
+      </w:r>
+      <w:r>
+        <w:t xml:space="preserve"> to .NET framework 4.7.2.</w:t>
+      </w:r>
+    </w:p>
+    <w:p>
+      <w:pPr>
+        <w:pStyle w:val="Kop1"/>
+        <w:rPr>
+          <w:rFonts w:hint="eastAsia"/>
+        </w:rPr>
+      </w:pPr>
+      <w:r>
+        <w:t>v2.0.12 -- 2020-07-13</w:t>
+      </w:r>
+    </w:p>
+    <w:p>
+      <w:pPr>
+        <w:pStyle w:val="Kop3"/>
+        <w:rPr>
+          <w:rFonts w:hint="eastAsia"/>
+        </w:rPr>
+      </w:pPr>
+      <w:r>
+        <w:t>Features</w:t>
+      </w:r>
+    </w:p>
+    <w:p>
+      <w:pPr>
+        <w:numPr>
+          <w:ilvl w:val="0"/>
+          <w:numId w:val="6"/>
+        </w:numPr>
+        <w:rPr>
+          <w:rFonts w:hint="eastAsia"/>
+        </w:rPr>
+      </w:pPr>
+      <w:r>
+        <w:t>Added mbc project file validation with XSD schema</w:t>
+      </w:r>
+      <w:r>
+        <w:t xml:space="preserve"> file</w:t>
+      </w:r>
+      <w:r>
+        <w:t xml:space="preserve">. </w:t>
+      </w:r>
+      <w:r>
+        <w:t xml:space="preserve">Validation is optional. </w:t>
+      </w:r>
+      <w:r>
+        <w:t>The validation only allows lower-case XML tags</w:t>
+      </w:r>
+      <w:r>
+        <w:t>, a</w:t>
+      </w:r>
+      <w:r>
+        <w:t xml:space="preserve">nd only allows the XML elements that are supported in this version. The intention is that over time all mbc files will </w:t>
+      </w:r>
+      <w:r>
+        <w:t>migrate</w:t>
+      </w:r>
+      <w:r>
+        <w:t xml:space="preserve"> to meet the validation.</w:t>
+      </w:r>
+    </w:p>
+    <w:p>
+      <w:pPr>
+        <w:numPr>
+          <w:ilvl w:val="0"/>
+          <w:numId w:val="6"/>
+        </w:numPr>
+        <w:rPr>
+          <w:rFonts w:hint="eastAsia"/>
+        </w:rPr>
+      </w:pPr>
+      <w:r>
+        <w:lastRenderedPageBreak/>
+        <w:t>In</w:t>
+      </w:r>
+      <w:r>
+        <w:t xml:space="preserve"> </w:t>
+      </w:r>
+      <w:r>
+        <w:t xml:space="preserve">the </w:t>
+      </w:r>
+      <w:r>
+        <w:t xml:space="preserve">"Save project file" </w:t>
+      </w:r>
+      <w:r>
+        <w:t>window</w:t>
+      </w:r>
+      <w:r>
+        <w:t xml:space="preserve"> </w:t>
+      </w:r>
+      <w:r>
+        <w:t xml:space="preserve">you now have the option to update the XML with "Update XML to current version" so that it then passes the validation. </w:t>
+      </w:r>
+      <w:r>
+        <w:t>E</w:t>
+      </w:r>
+      <w:r>
+        <w:t>rrors must be corrected manually.</w:t>
+      </w:r>
+    </w:p>
+    <w:p>
+      <w:pPr>
+        <w:numPr>
+          <w:ilvl w:val="0"/>
+          <w:numId w:val="6"/>
+        </w:numPr>
+        <w:rPr>
+          <w:rFonts w:hint="eastAsia"/>
+        </w:rPr>
+      </w:pPr>
+      <w:r>
+        <w:t>In</w:t>
+      </w:r>
+      <w:r>
+        <w:t xml:space="preserve"> "Save project file" the project file is now saved with XML formatting.</w:t>
+      </w:r>
+    </w:p>
+    <w:p>
+      <w:pPr>
+        <w:numPr>
+          <w:ilvl w:val="0"/>
+          <w:numId w:val="6"/>
+        </w:numPr>
+        <w:rPr>
+          <w:rFonts w:hint="eastAsia"/>
+        </w:rPr>
+      </w:pPr>
+      <w:r>
+        <w:t xml:space="preserve">If you start ModbusControl by double-clicking an mbc file and the file points to a non-existent COM port, the error dialog "Error opening serial port </w:t>
+      </w:r>
+      <w:proofErr w:type="spellStart"/>
+      <w:r>
+        <w:t>COMx</w:t>
+      </w:r>
+      <w:proofErr w:type="spellEnd"/>
+      <w:r>
+        <w:t>" now appears after the ModbusControl program appears.</w:t>
+      </w:r>
+    </w:p>
+    <w:p>
+      <w:pPr>
+        <w:numPr>
+          <w:ilvl w:val="0"/>
+          <w:numId w:val="6"/>
+        </w:numPr>
+        <w:rPr>
+          <w:rFonts w:hint="eastAsia"/>
+        </w:rPr>
+      </w:pPr>
+      <w:r>
+        <w:t xml:space="preserve">At the first start </w:t>
+      </w:r>
+      <w:r>
+        <w:t xml:space="preserve">of the program </w:t>
+      </w:r>
+      <w:r>
+        <w:t xml:space="preserve">after an update, </w:t>
+      </w:r>
+      <w:r>
+        <w:t xml:space="preserve">an option is shown </w:t>
+      </w:r>
+      <w:r>
+        <w:t>to see the 'Release notes'.</w:t>
+      </w:r>
+    </w:p>
+    <w:p>
+      <w:pPr>
+        <w:numPr>
+          <w:ilvl w:val="0"/>
+          <w:numId w:val="6"/>
+        </w:numPr>
+        <w:rPr>
+          <w:rFonts w:hint="eastAsia"/>
+        </w:rPr>
+      </w:pPr>
+      <w:r>
+        <w:t xml:space="preserve">Program settings split into user-dependent part and </w:t>
+      </w:r>
+      <w:r>
+        <w:t>computer</w:t>
+      </w:r>
+      <w:r>
+        <w:t xml:space="preserve">-dependent part. The old settings are migrated to the new settings files, then </w:t>
+      </w:r>
+      <w:r>
+        <w:t xml:space="preserve">the </w:t>
+      </w:r>
+      <w:r>
+        <w:t>old settings file is deleted.</w:t>
+      </w:r>
+    </w:p>
+    <w:p>
+      <w:pPr>
+        <w:numPr>
+          <w:ilvl w:val="0"/>
+          <w:numId w:val="6"/>
+        </w:numPr>
+        <w:rPr>
+          <w:rFonts w:hint="eastAsia"/>
+        </w:rPr>
+      </w:pPr>
+      <w:r>
+        <w:t xml:space="preserve">LocalOverrides.xml </w:t>
+      </w:r>
+      <w:r>
+        <w:t xml:space="preserve">file is automatically </w:t>
+      </w:r>
+      <w:r>
+        <w:t>moved from &lt;</w:t>
+      </w:r>
+      <w:proofErr w:type="spellStart"/>
+      <w:r>
+        <w:t>mydocuments</w:t>
+      </w:r>
+      <w:proofErr w:type="spellEnd"/>
+      <w:r>
+        <w:t>&gt;\ModbusControl to %</w:t>
+      </w:r>
+      <w:proofErr w:type="spellStart"/>
+      <w:r>
+        <w:t>AppData</w:t>
+      </w:r>
+      <w:proofErr w:type="spellEnd"/>
+      <w:r>
+        <w:t xml:space="preserve">%\Roaming\E.D.&amp;A\ModbusControl. Content from old is not migrated. Old </w:t>
+      </w:r>
+      <w:r>
+        <w:t>file</w:t>
+      </w:r>
+      <w:r>
+        <w:t xml:space="preserve"> is renamed with '.old' and moved to the </w:t>
+      </w:r>
+      <w:r>
+        <w:t xml:space="preserve">new </w:t>
+      </w:r>
+      <w:r>
+        <w:t>location. If overrides were used, the user will receive a notification.</w:t>
+      </w:r>
+    </w:p>
+    <w:p>
+      <w:pPr>
+        <w:numPr>
+          <w:ilvl w:val="0"/>
+          <w:numId w:val="6"/>
+        </w:numPr>
+        <w:rPr>
+          <w:rFonts w:hint="eastAsia"/>
+        </w:rPr>
+      </w:pPr>
+      <w:r>
+        <w:t>&lt;user&gt;\Documents\ModbusControl is no longer used.</w:t>
+      </w:r>
+    </w:p>
+    <w:p>
+      <w:pPr>
+        <w:pStyle w:val="Kop3"/>
+        <w:rPr>
+          <w:rFonts w:hint="eastAsia"/>
+        </w:rPr>
+      </w:pPr>
+      <w:r>
+        <w:t>Fixes</w:t>
+      </w:r>
+    </w:p>
+    <w:p>
+      <w:pPr>
+        <w:numPr>
+          <w:ilvl w:val="0"/>
+          <w:numId w:val="7"/>
+        </w:numPr>
+        <w:rPr>
+          <w:rFonts w:hint="eastAsia"/>
+        </w:rPr>
+      </w:pPr>
+      <w:r>
+        <w:t>The import/export dialogs now show '*. CSV' instead of '*. C</w:t>
+      </w:r>
+      <w:r>
+        <w:t>VS</w:t>
+      </w:r>
+      <w:r>
+        <w:t>'.</w:t>
+      </w:r>
+    </w:p>
+    <w:p>
+      <w:pPr>
+        <w:numPr>
+          <w:ilvl w:val="0"/>
+          <w:numId w:val="7"/>
+        </w:numPr>
+        <w:rPr>
+          <w:rFonts w:hint="eastAsia"/>
+        </w:rPr>
+      </w:pPr>
+      <w:r>
+        <w:t>Mbc file is now saved without BOM (</w:t>
+      </w:r>
+      <w:r>
+        <w:t>Unicode</w:t>
+      </w:r>
+      <w:r>
+        <w:t xml:space="preserve"> byte order mark).</w:t>
+      </w:r>
+    </w:p>
+    <w:p>
+      <w:pPr>
+        <w:numPr>
+          <w:ilvl w:val="0"/>
+          <w:numId w:val="7"/>
+        </w:numPr>
+        <w:rPr>
+          <w:rFonts w:hint="eastAsia"/>
+        </w:rPr>
+      </w:pPr>
+      <w:r>
+        <w:t xml:space="preserve">Better </w:t>
+      </w:r>
+      <w:r>
+        <w:t>handling</w:t>
+      </w:r>
+      <w:r>
+        <w:t xml:space="preserve"> if </w:t>
+      </w:r>
+      <w:r>
+        <w:t>a</w:t>
+      </w:r>
+      <w:r>
+        <w:t xml:space="preserve"> non-admin</w:t>
+      </w:r>
+      <w:r>
+        <w:t>istrator</w:t>
+      </w:r>
+      <w:r>
+        <w:t xml:space="preserve"> user logs </w:t>
+      </w:r>
+      <w:r>
+        <w:t xml:space="preserve">on </w:t>
+      </w:r>
+      <w:r>
+        <w:t>and uses ModbusControl.</w:t>
+      </w:r>
+    </w:p>
+    <w:p>
+      <w:pPr>
+        <w:pStyle w:val="Kop1"/>
+        <w:rPr>
+          <w:rFonts w:hint="eastAsia"/>
+        </w:rPr>
+      </w:pPr>
+      <w:r>
+        <w:t>v2.0.11 -- 2019-11-18</w:t>
+      </w:r>
+    </w:p>
+    <w:p>
+      <w:pPr>
+        <w:pStyle w:val="Kop3"/>
+        <w:rPr>
+          <w:rFonts w:hint="eastAsia"/>
+        </w:rPr>
+      </w:pPr>
+      <w:r>
+        <w:t>Fixes</w:t>
+      </w:r>
+    </w:p>
+    <w:p>
+      <w:pPr>
+        <w:numPr>
+          <w:ilvl w:val="0"/>
+          <w:numId w:val="8"/>
+        </w:numPr>
+        <w:rPr>
+          <w:rFonts w:hint="eastAsia"/>
+        </w:rPr>
+      </w:pPr>
+      <w:r>
+        <w:t xml:space="preserve">Better handling if the USB/serial connection is lost. In the past </w:t>
+      </w:r>
+      <w:r>
+        <w:t xml:space="preserve">the </w:t>
+      </w:r>
+      <w:r>
+        <w:t xml:space="preserve">program </w:t>
+      </w:r>
+      <w:r>
+        <w:t>could stop responding</w:t>
       </w:r>
       <w:r>
         <w:t>.</w:t>
@@ -951,12 +2625,55 @@
     </w:p>
     <w:p>
       <w:pPr>
+        <w:pStyle w:val="Kop1"/>
+        <w:rPr>
+          <w:rFonts w:hint="eastAsia"/>
+        </w:rPr>
+      </w:pPr>
+      <w:r>
+        <w:t>v2.0.10 -- 2019-03-11</w:t>
+      </w:r>
+    </w:p>
+    <w:p>
+      <w:pPr>
         <w:pStyle w:val="Kop3"/>
-        <w:numPr>
-          <w:ilvl w:val="0"/>
-          <w:numId w:val="0"/>
-        </w:numPr>
-        <w:ind w:left="431" w:hanging="431"/>
+        <w:rPr>
+          <w:rFonts w:hint="eastAsia"/>
+        </w:rPr>
+      </w:pPr>
+      <w:r>
+        <w:t>Features</w:t>
+      </w:r>
+    </w:p>
+    <w:p>
+      <w:pPr>
+        <w:numPr>
+          <w:ilvl w:val="0"/>
+          <w:numId w:val="8"/>
+        </w:numPr>
+        <w:rPr>
+          <w:rFonts w:hint="eastAsia"/>
+        </w:rPr>
+      </w:pPr>
+      <w:r>
+        <w:t>Added display</w:t>
+      </w:r>
+      <w:r>
+        <w:t>ing</w:t>
+      </w:r>
+      <w:r>
+        <w:t xml:space="preserve"> of enum </w:t>
+      </w:r>
+      <w:r>
+        <w:t xml:space="preserve">values </w:t>
+      </w:r>
+      <w:r>
+        <w:t xml:space="preserve">in the value column. </w:t>
+      </w:r>
+    </w:p>
+    <w:p>
+      <w:pPr>
+        <w:pStyle w:val="Kop3"/>
         <w:rPr>
           <w:rFonts w:hint="eastAsia"/>
         </w:rPr>
@@ -969,1973 +2686,319 @@
       <w:pPr>
         <w:numPr>
           <w:ilvl w:val="0"/>
-          <w:numId w:val="4"/>
-        </w:numPr>
-        <w:rPr>
-          <w:rFonts w:hint="eastAsia"/>
-        </w:rPr>
-      </w:pPr>
-      <w:r>
-        <w:t xml:space="preserve">Release notes </w:t>
-      </w:r>
-      <w:r>
-        <w:t xml:space="preserve">are now </w:t>
-      </w:r>
-      <w:r>
-        <w:t>in English.</w:t>
-      </w:r>
-    </w:p>
-    <w:p>
-      <w:pPr>
-        <w:pStyle w:val="Lijstalinea"/>
-        <w:numPr>
-          <w:ilvl w:val="0"/>
-          <w:numId w:val="4"/>
-        </w:numPr>
-        <w:rPr>
-          <w:rFonts w:hint="eastAsia"/>
-        </w:rPr>
-      </w:pPr>
-      <w:r>
-        <w:t xml:space="preserve">Crash fixed: an internal buffer overflow in the communications code </w:t>
-      </w:r>
-      <w:r>
-        <w:t xml:space="preserve">sometimes </w:t>
-      </w:r>
-      <w:r>
-        <w:t xml:space="preserve">caused an application crash. </w:t>
-      </w:r>
-    </w:p>
-    <w:p>
-      <w:pPr>
-        <w:pStyle w:val="Lijstalinea"/>
-        <w:numPr>
-          <w:ilvl w:val="0"/>
-          <w:numId w:val="4"/>
-        </w:numPr>
-        <w:rPr>
-          <w:rFonts w:hint="eastAsia"/>
-        </w:rPr>
-      </w:pPr>
-      <w:proofErr w:type="spellStart"/>
-      <w:r>
-        <w:rPr>
-          <w:rFonts w:hint="eastAsia"/>
-        </w:rPr>
-        <w:t>WriteHoldingregisterFC</w:t>
-      </w:r>
-      <w:proofErr w:type="spellEnd"/>
+          <w:numId w:val="8"/>
+        </w:numPr>
+        <w:rPr>
+          <w:rFonts w:hint="eastAsia"/>
+        </w:rPr>
+      </w:pPr>
+      <w:r>
+        <w:t xml:space="preserve">Menu </w:t>
+      </w:r>
+      <w:r>
+        <w:t xml:space="preserve">item </w:t>
+      </w:r>
+      <w:r>
+        <w:t xml:space="preserve">"Edit project file" did not work </w:t>
+      </w:r>
+      <w:r>
+        <w:t xml:space="preserve">correctly </w:t>
+      </w:r>
+      <w:r>
+        <w:t>if there was a space in the path.</w:t>
+      </w:r>
+    </w:p>
+    <w:p>
+      <w:pPr>
+        <w:numPr>
+          <w:ilvl w:val="0"/>
+          <w:numId w:val="8"/>
+        </w:numPr>
+        <w:rPr>
+          <w:rFonts w:hint="eastAsia"/>
+        </w:rPr>
+      </w:pPr>
+      <w:r>
+        <w:t>Logger: Clear button did not clear number of logs in the status bar.</w:t>
+      </w:r>
+    </w:p>
+    <w:p>
+      <w:pPr>
+        <w:numPr>
+          <w:ilvl w:val="0"/>
+          <w:numId w:val="8"/>
+        </w:numPr>
+        <w:rPr>
+          <w:rFonts w:hint="eastAsia"/>
+        </w:rPr>
+      </w:pPr>
+      <w:r>
+        <w:t xml:space="preserve">Send Custom Modbus Command: allows tabs and CR/LF in the string. </w:t>
+      </w:r>
+      <w:r>
+        <w:t xml:space="preserve">Reports </w:t>
+      </w:r>
+      <w:r>
+        <w:t xml:space="preserve">error </w:t>
+      </w:r>
+      <w:r>
+        <w:t>for</w:t>
+      </w:r>
+      <w:r>
+        <w:t xml:space="preserve"> empty command string. </w:t>
+      </w:r>
+    </w:p>
+    <w:p>
+      <w:pPr>
+        <w:numPr>
+          <w:ilvl w:val="0"/>
+          <w:numId w:val="8"/>
+        </w:numPr>
+        <w:rPr>
+          <w:rFonts w:hint="eastAsia"/>
+        </w:rPr>
+      </w:pPr>
+      <w:r>
+        <w:t xml:space="preserve">Send Custom Modbus Command: </w:t>
+      </w:r>
+      <w:r>
+        <w:t>Reports</w:t>
+      </w:r>
+      <w:r>
+        <w:t xml:space="preserve"> error when command is too short, must be at least 2 bytes.</w:t>
+      </w:r>
+    </w:p>
+    <w:p>
+      <w:pPr>
+        <w:numPr>
+          <w:ilvl w:val="0"/>
+          <w:numId w:val="8"/>
+        </w:numPr>
+        <w:rPr>
+          <w:rFonts w:hint="eastAsia"/>
+        </w:rPr>
+      </w:pPr>
+      <w:r>
+        <w:t xml:space="preserve">Fix background </w:t>
+      </w:r>
+      <w:r>
+        <w:t>colour</w:t>
+      </w:r>
+      <w:r>
+        <w:t xml:space="preserve"> of registers.</w:t>
+      </w:r>
+    </w:p>
+    <w:p>
+      <w:pPr>
+        <w:pStyle w:val="Kop1"/>
+        <w:rPr>
+          <w:rFonts w:hint="eastAsia"/>
+        </w:rPr>
+      </w:pPr>
+      <w:r>
+        <w:t>v2.0.9 -- 2018-10-20</w:t>
+      </w:r>
+    </w:p>
+    <w:p>
+      <w:pPr>
+        <w:pStyle w:val="Kop3"/>
+        <w:rPr>
+          <w:rFonts w:hint="eastAsia"/>
+        </w:rPr>
+      </w:pPr>
+      <w:r>
+        <w:t>Features</w:t>
+      </w:r>
+    </w:p>
+    <w:p>
+      <w:pPr>
+        <w:numPr>
+          <w:ilvl w:val="0"/>
+          <w:numId w:val="9"/>
+        </w:numPr>
+        <w:rPr>
+          <w:rFonts w:hint="eastAsia"/>
+        </w:rPr>
+      </w:pPr>
+      <w:r>
+        <w:t>New option: "Move to next row on Enter".</w:t>
+      </w:r>
+    </w:p>
+    <w:p>
+      <w:pPr>
+        <w:numPr>
+          <w:ilvl w:val="0"/>
+          <w:numId w:val="9"/>
+        </w:numPr>
+        <w:rPr>
+          <w:rFonts w:hint="eastAsia"/>
+        </w:rPr>
+      </w:pPr>
+      <w:r>
+        <w:t xml:space="preserve">New option: "Auto-start edit mode on typing". </w:t>
+      </w:r>
+    </w:p>
+    <w:p>
+      <w:pPr>
+        <w:numPr>
+          <w:ilvl w:val="0"/>
+          <w:numId w:val="9"/>
+        </w:numPr>
+        <w:rPr>
+          <w:rFonts w:hint="eastAsia"/>
+        </w:rPr>
+      </w:pPr>
+      <w:r>
+        <w:t xml:space="preserve">New option: "Use custom editor". </w:t>
+      </w:r>
+    </w:p>
+    <w:p>
+      <w:pPr>
+        <w:numPr>
+          <w:ilvl w:val="0"/>
+          <w:numId w:val="9"/>
+        </w:numPr>
+        <w:rPr>
+          <w:rFonts w:hint="eastAsia"/>
+        </w:rPr>
+      </w:pPr>
+      <w:r>
+        <w:t>New option: "Ignore form size on project reload".</w:t>
+      </w:r>
+    </w:p>
+    <w:p>
+      <w:pPr>
+        <w:numPr>
+          <w:ilvl w:val="0"/>
+          <w:numId w:val="9"/>
+        </w:numPr>
+        <w:rPr>
+          <w:rFonts w:hint="eastAsia"/>
+        </w:rPr>
+      </w:pPr>
+      <w:r>
+        <w:t>Config</w:t>
+      </w:r>
+      <w:r>
+        <w:t>uration</w:t>
+      </w:r>
       <w:r>
         <w:t xml:space="preserve"> </w:t>
       </w:r>
       <w:r>
-        <w:rPr>
-          <w:rFonts w:hint="eastAsia"/>
-        </w:rPr>
-        <w:t>=</w:t>
-      </w:r>
-      <w:r>
-        <w:t xml:space="preserve"> ‘</w:t>
-      </w:r>
-      <w:r>
-        <w:rPr>
-          <w:rFonts w:hint="eastAsia"/>
-        </w:rPr>
-        <w:t>alternate</w:t>
-      </w:r>
-      <w:r>
-        <w:t>’</w:t>
-      </w:r>
-      <w:r>
-        <w:t xml:space="preserve"> is dropped because it was con</w:t>
-      </w:r>
-      <w:r>
-        <w:t>fusing. It is automatically replaced by ‘auto’ if found in an mbc project file.</w:t>
-      </w:r>
-    </w:p>
-    <w:p>
-      <w:pPr>
-        <w:numPr>
-          <w:ilvl w:val="0"/>
-          <w:numId w:val="4"/>
-        </w:numPr>
-        <w:rPr>
-          <w:rFonts w:hint="eastAsia"/>
-        </w:rPr>
-      </w:pPr>
-      <w:r>
-        <w:t>Stop-on-error mechanism fix</w:t>
-      </w:r>
-      <w:r>
-        <w:t>ed</w:t>
-      </w:r>
-      <w:r>
-        <w:t>.</w:t>
-      </w:r>
-    </w:p>
-    <w:p>
-      <w:pPr>
-        <w:numPr>
-          <w:ilvl w:val="0"/>
-          <w:numId w:val="4"/>
-        </w:numPr>
-        <w:rPr>
-          <w:rFonts w:hint="eastAsia"/>
-        </w:rPr>
-      </w:pPr>
-      <w:r>
-        <w:t xml:space="preserve">Import now processes the </w:t>
-      </w:r>
-      <w:r>
-        <w:t>CSV</w:t>
-      </w:r>
-      <w:r>
-        <w:t xml:space="preserve"> file in top-down order. </w:t>
-      </w:r>
-      <w:r>
-        <w:t>E</w:t>
-      </w:r>
-      <w:r>
-        <w:t xml:space="preserve">arlier versions </w:t>
-      </w:r>
-      <w:r>
-        <w:t xml:space="preserve">first scanned the file for errors, </w:t>
-      </w:r>
-      <w:r>
-        <w:t>then started import which could report more errors.</w:t>
-      </w:r>
-    </w:p>
-    <w:p>
-      <w:pPr>
-        <w:numPr>
-          <w:ilvl w:val="0"/>
-          <w:numId w:val="4"/>
-        </w:numPr>
-        <w:rPr>
-          <w:rFonts w:hint="eastAsia"/>
-        </w:rPr>
-      </w:pPr>
-      <w:r>
-        <w:t>Import now also ignores lines that only have spaces and/or separators.</w:t>
-      </w:r>
-    </w:p>
-    <w:p>
-      <w:pPr>
-        <w:pStyle w:val="Kop1"/>
-        <w:rPr>
-          <w:rFonts w:hint="eastAsia"/>
-        </w:rPr>
-      </w:pPr>
-      <w:r>
-        <w:t>v2.0.15 – 2023-06-24</w:t>
+        <w:t>window</w:t>
+      </w:r>
+      <w:r>
+        <w:t xml:space="preserve"> now has an Apply button.</w:t>
+      </w:r>
+    </w:p>
+    <w:p>
+      <w:pPr>
+        <w:numPr>
+          <w:ilvl w:val="0"/>
+          <w:numId w:val="9"/>
+        </w:numPr>
+        <w:rPr>
+          <w:rFonts w:hint="eastAsia"/>
+        </w:rPr>
+      </w:pPr>
+      <w:r>
+        <w:lastRenderedPageBreak/>
+        <w:t xml:space="preserve">Separate line-copy and value-copy </w:t>
+      </w:r>
+      <w:r>
+        <w:t xml:space="preserve">capability </w:t>
+      </w:r>
+      <w:r>
+        <w:t xml:space="preserve">in grid, </w:t>
+      </w:r>
+      <w:r>
+        <w:t>using</w:t>
+      </w:r>
+      <w:r>
+        <w:t xml:space="preserve"> control-C and context menu.</w:t>
+      </w:r>
+    </w:p>
+    <w:p>
+      <w:pPr>
+        <w:numPr>
+          <w:ilvl w:val="0"/>
+          <w:numId w:val="9"/>
+        </w:numPr>
+        <w:rPr>
+          <w:rFonts w:hint="eastAsia"/>
+        </w:rPr>
+      </w:pPr>
+      <w:r>
+        <w:t xml:space="preserve">The status bar now </w:t>
+      </w:r>
+      <w:r>
+        <w:t xml:space="preserve">has </w:t>
+      </w:r>
+      <w:r>
+        <w:t xml:space="preserve">blue </w:t>
+      </w:r>
+      <w:r>
+        <w:t xml:space="preserve">colour </w:t>
+      </w:r>
+      <w:r>
+        <w:t>if there is no connection or no polling is done.</w:t>
+      </w:r>
+    </w:p>
+    <w:p>
+      <w:pPr>
+        <w:numPr>
+          <w:ilvl w:val="0"/>
+          <w:numId w:val="9"/>
+        </w:numPr>
+        <w:rPr>
+          <w:rFonts w:hint="eastAsia"/>
+        </w:rPr>
+      </w:pPr>
+      <w:r>
+        <w:t xml:space="preserve">The status bar </w:t>
+      </w:r>
+      <w:r>
+        <w:t xml:space="preserve">now has red colour </w:t>
+      </w:r>
+      <w:r>
+        <w:t>for errors.</w:t>
+      </w:r>
+    </w:p>
+    <w:p>
+      <w:pPr>
+        <w:numPr>
+          <w:ilvl w:val="0"/>
+          <w:numId w:val="9"/>
+        </w:numPr>
+        <w:rPr>
+          <w:rFonts w:hint="eastAsia"/>
+        </w:rPr>
+      </w:pPr>
+      <w:r>
+        <w:t xml:space="preserve">Now </w:t>
+      </w:r>
+      <w:r>
+        <w:t>shows</w:t>
+      </w:r>
+      <w:r>
+        <w:t xml:space="preserve"> a warning in the "Save configuration to project file" and "Project configuration" screens if localoverrides </w:t>
+      </w:r>
+      <w:r>
+        <w:t>were</w:t>
+      </w:r>
+      <w:r>
+        <w:t xml:space="preserve"> used.</w:t>
       </w:r>
     </w:p>
     <w:p>
       <w:pPr>
         <w:pStyle w:val="Kop3"/>
-        <w:numPr>
-          <w:ilvl w:val="0"/>
-          <w:numId w:val="0"/>
-        </w:numPr>
-        <w:ind w:left="680" w:hanging="431"/>
-        <w:rPr>
-          <w:rFonts w:hint="eastAsia"/>
-        </w:rPr>
-      </w:pPr>
-      <w:r>
-        <w:rPr>
-          <w:rFonts w:hint="eastAsia"/>
-        </w:rPr>
-        <w:t>Features</w:t>
-      </w:r>
-    </w:p>
-    <w:p>
-      <w:pPr>
-        <w:pStyle w:val="Lijstalinea"/>
-        <w:numPr>
-          <w:ilvl w:val="0"/>
-          <w:numId w:val="4"/>
-        </w:numPr>
-        <w:rPr>
-          <w:rFonts w:hint="eastAsia"/>
-        </w:rPr>
-      </w:pPr>
-      <w:r>
-        <w:rPr>
-          <w:rFonts w:hint="eastAsia"/>
-        </w:rPr>
-        <w:t xml:space="preserve">Enum registers editing now has a dropdown </w:t>
-      </w:r>
-      <w:proofErr w:type="spellStart"/>
-      <w:r>
-        <w:rPr>
-          <w:rFonts w:hint="eastAsia"/>
-        </w:rPr>
-        <w:t>combobox</w:t>
-      </w:r>
-      <w:proofErr w:type="spellEnd"/>
-      <w:r>
-        <w:rPr>
-          <w:rFonts w:hint="eastAsia"/>
-        </w:rPr>
-        <w:t xml:space="preserve"> with possible values.</w:t>
-      </w:r>
-    </w:p>
-    <w:p>
-      <w:pPr>
-        <w:pStyle w:val="Lijstalinea"/>
-        <w:numPr>
-          <w:ilvl w:val="0"/>
-          <w:numId w:val="4"/>
-        </w:numPr>
-        <w:rPr>
-          <w:rFonts w:hint="eastAsia"/>
-        </w:rPr>
-      </w:pPr>
-      <w:r>
-        <w:rPr>
-          <w:rFonts w:hint="eastAsia"/>
-        </w:rPr>
-        <w:t>Mbc file: Enum values now allow a cu</w:t>
-      </w:r>
-      <w:r>
-        <w:t>s</w:t>
-      </w:r>
-      <w:r>
-        <w:rPr>
-          <w:rFonts w:hint="eastAsia"/>
-        </w:rPr>
-        <w:t xml:space="preserve">tom &lt;else&gt; </w:t>
-      </w:r>
-      <w:r>
-        <w:t>text</w:t>
-      </w:r>
-      <w:r>
-        <w:rPr>
-          <w:rFonts w:hint="eastAsia"/>
-        </w:rPr>
-        <w:t xml:space="preserve"> that is shown if no value matches. </w:t>
-      </w:r>
-      <w:r>
-        <w:t>&lt;else&gt; text can be left empty to suppress the message.</w:t>
-      </w:r>
-    </w:p>
-    <w:p>
-      <w:pPr>
-        <w:pStyle w:val="Lijstalinea"/>
-        <w:numPr>
-          <w:ilvl w:val="0"/>
-          <w:numId w:val="4"/>
-        </w:numPr>
-        <w:rPr>
-          <w:rFonts w:hint="eastAsia"/>
-        </w:rPr>
-      </w:pPr>
-      <w:r>
-        <w:rPr>
-          <w:rFonts w:hint="eastAsia"/>
-        </w:rPr>
-        <w:t xml:space="preserve">You can now use </w:t>
-      </w:r>
-      <w:r>
-        <w:t xml:space="preserve">5 digits and 6 digits </w:t>
-      </w:r>
-      <w:r>
-        <w:rPr>
-          <w:rFonts w:hint="eastAsia"/>
-        </w:rPr>
-        <w:t>registers numbering scheme</w:t>
-      </w:r>
-      <w:r>
-        <w:t>,</w:t>
-      </w:r>
-      <w:r>
-        <w:rPr>
-          <w:rFonts w:hint="eastAsia"/>
-        </w:rPr>
-        <w:t xml:space="preserve"> 40001-49999 and 400001-465536</w:t>
-      </w:r>
-      <w:r>
-        <w:t xml:space="preserve">, or </w:t>
-      </w:r>
-      <w:r>
-        <w:rPr>
-          <w:rFonts w:hint="eastAsia"/>
-        </w:rPr>
-        <w:t>40000-49999 and 400000-465535</w:t>
-      </w:r>
-      <w:r>
-        <w:t xml:space="preserve">, </w:t>
-      </w:r>
-      <w:r>
-        <w:rPr>
-          <w:rFonts w:hint="eastAsia"/>
-        </w:rPr>
-        <w:t xml:space="preserve">at the same time. </w:t>
-      </w:r>
-    </w:p>
-    <w:p>
-      <w:pPr>
-        <w:pStyle w:val="Kop3"/>
-        <w:numPr>
-          <w:ilvl w:val="0"/>
-          <w:numId w:val="0"/>
-        </w:numPr>
-        <w:ind w:left="680" w:hanging="431"/>
-        <w:rPr>
-          <w:rFonts w:hint="eastAsia"/>
-        </w:rPr>
-      </w:pPr>
-      <w:r>
-        <w:rPr>
-          <w:rFonts w:hint="eastAsia"/>
-        </w:rPr>
-        <w:t>Fixes</w:t>
-      </w:r>
-    </w:p>
-    <w:p>
-      <w:pPr>
-        <w:pStyle w:val="Lijstalinea"/>
-        <w:numPr>
-          <w:ilvl w:val="0"/>
-          <w:numId w:val="4"/>
-        </w:numPr>
-        <w:rPr>
-          <w:rFonts w:hint="eastAsia"/>
-        </w:rPr>
-      </w:pPr>
-      <w:r>
-        <w:t xml:space="preserve">In </w:t>
-      </w:r>
-      <w:proofErr w:type="spellStart"/>
-      <w:r>
-        <w:t>Import_file</w:t>
-      </w:r>
-      <w:proofErr w:type="spellEnd"/>
-      <w:r>
-        <w:t xml:space="preserve"> and </w:t>
-      </w:r>
-      <w:proofErr w:type="spellStart"/>
-      <w:r>
-        <w:t>Import_compare</w:t>
-      </w:r>
-      <w:proofErr w:type="spellEnd"/>
-      <w:r>
-        <w:t xml:space="preserve">: writing/comparing a float32 </w:t>
-      </w:r>
-      <w:r>
-        <w:t xml:space="preserve">value </w:t>
-      </w:r>
-      <w:r>
-        <w:t>no longer worked.</w:t>
-      </w:r>
-    </w:p>
-    <w:p>
-      <w:pPr>
-        <w:pStyle w:val="Lijstalinea"/>
-        <w:numPr>
-          <w:ilvl w:val="0"/>
-          <w:numId w:val="4"/>
-        </w:numPr>
-        <w:rPr>
-          <w:rFonts w:hint="eastAsia"/>
-        </w:rPr>
-      </w:pPr>
-      <w:r>
-        <w:rPr>
-          <w:rFonts w:hint="eastAsia"/>
-        </w:rPr>
-        <w:t xml:space="preserve">Ascii32 register writing </w:t>
-      </w:r>
-      <w:r>
-        <w:t>fixed.</w:t>
-      </w:r>
-    </w:p>
-    <w:p>
-      <w:pPr>
-        <w:pStyle w:val="Lijstalinea"/>
-        <w:numPr>
-          <w:ilvl w:val="0"/>
-          <w:numId w:val="4"/>
-        </w:numPr>
-        <w:rPr>
-          <w:rFonts w:hint="eastAsia"/>
-        </w:rPr>
-      </w:pPr>
-      <w:r>
-        <w:rPr>
-          <w:rFonts w:hint="eastAsia"/>
-        </w:rPr>
-        <w:t xml:space="preserve">Resizing column width is now </w:t>
-      </w:r>
-      <w:r>
-        <w:t>global for all tabs</w:t>
-      </w:r>
-      <w:r>
-        <w:rPr>
-          <w:rFonts w:hint="eastAsia"/>
-        </w:rPr>
-        <w:t>.</w:t>
-      </w:r>
-    </w:p>
-    <w:p>
-      <w:pPr>
-        <w:pStyle w:val="Lijstalinea"/>
-        <w:numPr>
-          <w:ilvl w:val="0"/>
-          <w:numId w:val="4"/>
-        </w:numPr>
-        <w:rPr>
-          <w:rFonts w:hint="eastAsia"/>
-        </w:rPr>
-      </w:pPr>
-      <w:r>
-        <w:rPr>
-          <w:rFonts w:hint="eastAsia"/>
-        </w:rPr>
-        <w:t>Zoom</w:t>
-      </w:r>
-      <w:r>
-        <w:t>ing</w:t>
-      </w:r>
-      <w:r>
-        <w:rPr>
-          <w:rFonts w:hint="eastAsia"/>
-        </w:rPr>
-        <w:t xml:space="preserve"> now also adjusts the size of the column headers.</w:t>
-      </w:r>
-    </w:p>
-    <w:p>
-      <w:pPr>
-        <w:pStyle w:val="Lijstalinea"/>
-        <w:numPr>
-          <w:ilvl w:val="0"/>
-          <w:numId w:val="4"/>
-        </w:numPr>
-        <w:rPr>
-          <w:rFonts w:hint="eastAsia"/>
-        </w:rPr>
-      </w:pPr>
-      <w:r>
-        <w:rPr>
-          <w:rFonts w:hint="eastAsia"/>
-        </w:rPr>
-        <w:t>You can now close the [</w:t>
-      </w:r>
-      <w:proofErr w:type="spellStart"/>
-      <w:r>
-        <w:rPr>
-          <w:rFonts w:hint="eastAsia"/>
-        </w:rPr>
-        <w:t>Project_Configuration</w:t>
-      </w:r>
-      <w:proofErr w:type="spellEnd"/>
-      <w:r>
-        <w:rPr>
-          <w:rFonts w:hint="eastAsia"/>
-        </w:rPr>
-        <w:t>], [</w:t>
-      </w:r>
-      <w:proofErr w:type="spellStart"/>
-      <w:r>
-        <w:rPr>
-          <w:rFonts w:hint="eastAsia"/>
-        </w:rPr>
-        <w:t>Save_project_file</w:t>
-      </w:r>
-      <w:proofErr w:type="spellEnd"/>
-      <w:r>
-        <w:rPr>
-          <w:rFonts w:hint="eastAsia"/>
-        </w:rPr>
-        <w:t>] and [About] forms with the ESC button</w:t>
-      </w:r>
-      <w:r>
-        <w:t xml:space="preserve"> too</w:t>
-      </w:r>
-      <w:r>
-        <w:rPr>
-          <w:rFonts w:hint="eastAsia"/>
-        </w:rPr>
-        <w:t>.</w:t>
-      </w:r>
-    </w:p>
-    <w:p>
-      <w:pPr>
-        <w:pStyle w:val="Lijstalinea"/>
-        <w:numPr>
-          <w:ilvl w:val="0"/>
-          <w:numId w:val="4"/>
-        </w:numPr>
-        <w:rPr>
-          <w:rFonts w:hint="eastAsia"/>
-        </w:rPr>
-      </w:pPr>
-      <w:r>
-        <w:rPr>
-          <w:rFonts w:hint="eastAsia"/>
-        </w:rPr>
-        <w:t>The expand/collapse icons scale with zoom</w:t>
-      </w:r>
-      <w:r>
-        <w:t>ing</w:t>
-      </w:r>
-      <w:r>
-        <w:rPr>
-          <w:rFonts w:hint="eastAsia"/>
-        </w:rPr>
-        <w:t>.</w:t>
-      </w:r>
-    </w:p>
-    <w:p>
-      <w:pPr>
-        <w:pStyle w:val="Lijstalinea"/>
-        <w:numPr>
-          <w:ilvl w:val="0"/>
-          <w:numId w:val="4"/>
-        </w:numPr>
-        <w:rPr>
-          <w:rFonts w:hint="eastAsia"/>
-        </w:rPr>
-      </w:pPr>
-      <w:r>
-        <w:rPr>
-          <w:rFonts w:hint="eastAsia"/>
-        </w:rPr>
-        <w:t>If an error occurs when loading an mbc file, no auto-connect to the slave/server is done.</w:t>
-      </w:r>
-    </w:p>
-    <w:p>
-      <w:pPr>
-        <w:pStyle w:val="Lijstalinea"/>
-        <w:numPr>
-          <w:ilvl w:val="0"/>
-          <w:numId w:val="4"/>
-        </w:numPr>
-        <w:rPr>
-          <w:rFonts w:hint="eastAsia"/>
-        </w:rPr>
-      </w:pPr>
-      <w:r>
-        <w:rPr>
-          <w:rFonts w:hint="eastAsia"/>
-        </w:rPr>
-        <w:t xml:space="preserve">With </w:t>
-      </w:r>
-      <w:proofErr w:type="spellStart"/>
-      <w:r>
-        <w:rPr>
-          <w:rFonts w:hint="eastAsia"/>
-        </w:rPr>
-        <w:t>Import_file</w:t>
-      </w:r>
-      <w:proofErr w:type="spellEnd"/>
-      <w:r>
-        <w:rPr>
-          <w:rFonts w:hint="eastAsia"/>
-        </w:rPr>
-        <w:t xml:space="preserve"> and </w:t>
-      </w:r>
-      <w:proofErr w:type="spellStart"/>
-      <w:r>
-        <w:rPr>
-          <w:rFonts w:hint="eastAsia"/>
-        </w:rPr>
-        <w:t>Import_compare</w:t>
-      </w:r>
-      <w:proofErr w:type="spellEnd"/>
-      <w:r>
-        <w:rPr>
-          <w:rFonts w:hint="eastAsia"/>
-        </w:rPr>
-        <w:t>: writing/compar</w:t>
-      </w:r>
-      <w:r>
-        <w:t>ing</w:t>
-      </w:r>
-      <w:r>
-        <w:rPr>
-          <w:rFonts w:hint="eastAsia"/>
-        </w:rPr>
-        <w:t xml:space="preserve"> a float32 </w:t>
-      </w:r>
-      <w:r>
-        <w:t>is fixed</w:t>
-      </w:r>
-      <w:r>
-        <w:rPr>
-          <w:rFonts w:hint="eastAsia"/>
-        </w:rPr>
-        <w:t>.</w:t>
-      </w:r>
-    </w:p>
-    <w:p>
-      <w:pPr>
-        <w:pStyle w:val="Kop1"/>
-        <w:rPr>
-          <w:rFonts w:hint="eastAsia"/>
-        </w:rPr>
-      </w:pPr>
-      <w:r>
-        <w:t>v2.0.14 -- 2022-11-08</w:t>
-      </w:r>
-    </w:p>
-    <w:p>
-      <w:pPr>
-        <w:pStyle w:val="Kop3"/>
-        <w:rPr>
-          <w:rFonts w:hint="eastAsia"/>
-        </w:rPr>
-      </w:pPr>
-      <w:r>
-        <w:t>Features</w:t>
-      </w:r>
-    </w:p>
-    <w:p>
-      <w:pPr>
-        <w:numPr>
-          <w:ilvl w:val="0"/>
-          <w:numId w:val="4"/>
-        </w:numPr>
-        <w:rPr>
-          <w:rFonts w:hint="eastAsia"/>
-        </w:rPr>
-      </w:pPr>
-      <w:r>
-        <w:t xml:space="preserve">Added command line parameters. </w:t>
-      </w:r>
-      <w:r>
-        <w:t>These r</w:t>
-      </w:r>
-      <w:r>
-        <w:t xml:space="preserve">eplaces </w:t>
-      </w:r>
-      <w:r>
-        <w:t xml:space="preserve">the </w:t>
-      </w:r>
-      <w:r>
-        <w:t>LocalOverrides</w:t>
-      </w:r>
-      <w:r>
-        <w:t xml:space="preserve"> mechanism.</w:t>
-      </w:r>
-    </w:p>
-    <w:p>
-      <w:pPr>
-        <w:numPr>
-          <w:ilvl w:val="0"/>
-          <w:numId w:val="4"/>
-        </w:numPr>
-        <w:rPr>
-          <w:rFonts w:hint="eastAsia"/>
-        </w:rPr>
-      </w:pPr>
-      <w:r>
-        <w:t xml:space="preserve">LocalOverrides </w:t>
-      </w:r>
-      <w:r>
-        <w:t>mechanism removed.</w:t>
-      </w:r>
-    </w:p>
-    <w:p>
-      <w:pPr>
-        <w:numPr>
-          <w:ilvl w:val="0"/>
-          <w:numId w:val="4"/>
-        </w:numPr>
-        <w:rPr>
-          <w:rFonts w:hint="eastAsia"/>
-        </w:rPr>
-      </w:pPr>
-      <w:r>
-        <w:t>Save project file: the [Update XML to current version] checkbox is now enabled by default.</w:t>
-      </w:r>
-    </w:p>
-    <w:p>
-      <w:pPr>
-        <w:numPr>
-          <w:ilvl w:val="0"/>
-          <w:numId w:val="4"/>
-        </w:numPr>
-        <w:rPr>
-          <w:rFonts w:hint="eastAsia"/>
-        </w:rPr>
-      </w:pPr>
-      <w:r>
-        <w:lastRenderedPageBreak/>
-        <w:t xml:space="preserve">Options </w:t>
-      </w:r>
-      <w:r>
-        <w:t>window</w:t>
-      </w:r>
-      <w:r>
-        <w:t>: tooltips improved.</w:t>
-      </w:r>
-    </w:p>
-    <w:p>
-      <w:pPr>
-        <w:numPr>
-          <w:ilvl w:val="0"/>
-          <w:numId w:val="4"/>
-        </w:numPr>
-        <w:rPr>
-          <w:rFonts w:hint="eastAsia"/>
-        </w:rPr>
-      </w:pPr>
-      <w:r>
-        <w:t>Grid: Regist</w:t>
-      </w:r>
-      <w:r>
-        <w:t>er</w:t>
-      </w:r>
-      <w:r>
-        <w:t xml:space="preserve"> </w:t>
-      </w:r>
-      <w:r>
-        <w:t xml:space="preserve">column menu now has </w:t>
-      </w:r>
-      <w:r>
-        <w:t xml:space="preserve"> [</w:t>
-      </w:r>
-      <w:r>
-        <w:t>Expand all]</w:t>
-      </w:r>
-      <w:r>
-        <w:t xml:space="preserve"> and </w:t>
-      </w:r>
-      <w:r>
-        <w:t>[</w:t>
-      </w:r>
-      <w:r>
-        <w:t>Collapse all</w:t>
-      </w:r>
-      <w:r>
-        <w:t>].</w:t>
-      </w:r>
-    </w:p>
-    <w:p>
-      <w:pPr>
-        <w:numPr>
-          <w:ilvl w:val="0"/>
-          <w:numId w:val="4"/>
-        </w:numPr>
-        <w:rPr>
-          <w:rFonts w:hint="eastAsia"/>
-        </w:rPr>
-      </w:pPr>
-      <w:r>
-        <w:t>Mbc project file: &lt;</w:t>
-      </w:r>
-      <w:proofErr w:type="spellStart"/>
-      <w:r>
-        <w:t>longdescr</w:t>
-      </w:r>
-      <w:proofErr w:type="spellEnd"/>
-      <w:r>
-        <w:t xml:space="preserve">&gt; </w:t>
-      </w:r>
-      <w:r>
-        <w:t xml:space="preserve">element </w:t>
-      </w:r>
-      <w:r>
-        <w:t xml:space="preserve">added. </w:t>
-      </w:r>
-      <w:r>
-        <w:t xml:space="preserve">Adds a long multiline text that is show when the mouse is hoovered over the register </w:t>
-      </w:r>
-      <w:proofErr w:type="spellStart"/>
-      <w:r>
-        <w:t>decription</w:t>
-      </w:r>
-      <w:proofErr w:type="spellEnd"/>
-      <w:r>
-        <w:t>.</w:t>
-      </w:r>
-    </w:p>
-    <w:p>
-      <w:pPr>
-        <w:numPr>
-          <w:ilvl w:val="0"/>
-          <w:numId w:val="4"/>
-        </w:numPr>
-        <w:rPr>
-          <w:rFonts w:hint="eastAsia"/>
-        </w:rPr>
-      </w:pPr>
-      <w:r>
-        <w:t>Mbc project file: &lt;include&gt; element added.</w:t>
-      </w:r>
-    </w:p>
-    <w:p>
-      <w:pPr>
-        <w:pStyle w:val="Kop3"/>
-        <w:numPr>
-          <w:ilvl w:val="0"/>
-          <w:numId w:val="0"/>
-        </w:numPr>
-        <w:ind w:left="680" w:hanging="431"/>
-        <w:rPr>
-          <w:rFonts w:hint="eastAsia"/>
-        </w:rPr>
-      </w:pPr>
-      <w:r>
-        <w:t>Fixes</w:t>
-      </w:r>
-    </w:p>
-    <w:p>
-      <w:pPr>
-        <w:numPr>
-          <w:ilvl w:val="0"/>
-          <w:numId w:val="4"/>
-        </w:numPr>
-        <w:rPr>
-          <w:rFonts w:hint="eastAsia"/>
-        </w:rPr>
-      </w:pPr>
-      <w:r>
-        <w:t>[</w:t>
-      </w:r>
-      <w:r>
-        <w:t>Open project file location in Explorer] now works if you gave a filename without a path on the command line.</w:t>
-      </w:r>
-    </w:p>
-    <w:p>
-      <w:pPr>
-        <w:numPr>
-          <w:ilvl w:val="0"/>
-          <w:numId w:val="4"/>
-        </w:numPr>
-        <w:rPr>
-          <w:rFonts w:hint="eastAsia"/>
-        </w:rPr>
-      </w:pPr>
-      <w:r>
-        <w:t xml:space="preserve">The temporary red </w:t>
-      </w:r>
-      <w:r>
-        <w:t>colouring</w:t>
-      </w:r>
-      <w:r>
-        <w:t xml:space="preserve"> of the value field after entering </w:t>
-      </w:r>
-      <w:r>
-        <w:t xml:space="preserve">an invalid value </w:t>
-      </w:r>
-      <w:r>
-        <w:t>has been improved.</w:t>
-      </w:r>
-    </w:p>
-    <w:p>
-      <w:pPr>
-        <w:numPr>
-          <w:ilvl w:val="0"/>
-          <w:numId w:val="4"/>
-        </w:numPr>
-        <w:rPr>
-          <w:rFonts w:hint="eastAsia"/>
-        </w:rPr>
-      </w:pPr>
-      <w:r>
-        <w:t>Edit</w:t>
-      </w:r>
-      <w:r>
-        <w:t xml:space="preserve"> enter/escape </w:t>
-      </w:r>
-      <w:r>
-        <w:t>handling is improved</w:t>
-      </w:r>
-      <w:r>
-        <w:t>.</w:t>
-      </w:r>
-    </w:p>
-    <w:p>
-      <w:pPr>
-        <w:numPr>
-          <w:ilvl w:val="0"/>
-          <w:numId w:val="4"/>
-        </w:numPr>
-        <w:rPr>
-          <w:rFonts w:hint="eastAsia"/>
-        </w:rPr>
-      </w:pPr>
-      <w:r>
-        <w:t xml:space="preserve">In the notification screen that the serial port could not be opened: the [Port] </w:t>
-      </w:r>
-      <w:r>
-        <w:t>combo box</w:t>
-      </w:r>
-      <w:r>
-        <w:t xml:space="preserve"> now automatically refreshes the list of serial ports.</w:t>
-      </w:r>
-    </w:p>
-    <w:p>
-      <w:pPr>
-        <w:pStyle w:val="Kop1"/>
-        <w:rPr>
-          <w:rFonts w:hint="eastAsia"/>
-        </w:rPr>
-      </w:pPr>
-      <w:r>
-        <w:t>v2.0.13 -- 2022-07-11</w:t>
-      </w:r>
-    </w:p>
-    <w:p>
-      <w:pPr>
-        <w:pStyle w:val="Kop3"/>
-        <w:rPr>
-          <w:rFonts w:hint="eastAsia"/>
-        </w:rPr>
-      </w:pPr>
-      <w:r>
-        <w:t>Features</w:t>
-      </w:r>
-    </w:p>
-    <w:p>
-      <w:pPr>
-        <w:numPr>
-          <w:ilvl w:val="0"/>
-          <w:numId w:val="4"/>
-        </w:numPr>
-        <w:rPr>
-          <w:rFonts w:hint="eastAsia"/>
-        </w:rPr>
-      </w:pPr>
-      <w:r>
-        <w:t xml:space="preserve">Added Find/Filter bar. </w:t>
-      </w:r>
-      <w:r>
-        <w:t>Open it using</w:t>
-      </w:r>
-      <w:r>
-        <w:t xml:space="preserve"> Control-F. There is also an option </w:t>
-      </w:r>
-      <w:r>
-        <w:t>“</w:t>
-      </w:r>
-      <w:r>
-        <w:t>Clear Find/Filter on tab change</w:t>
-      </w:r>
-      <w:r>
-        <w:t>”</w:t>
-      </w:r>
-      <w:r>
-        <w:t>.</w:t>
-      </w:r>
-    </w:p>
-    <w:p>
-      <w:pPr>
-        <w:numPr>
-          <w:ilvl w:val="0"/>
-          <w:numId w:val="4"/>
-        </w:numPr>
-        <w:rPr>
-          <w:rFonts w:hint="eastAsia"/>
-        </w:rPr>
-      </w:pPr>
-      <w:r>
-        <w:t>The properties of a register (</w:t>
-      </w:r>
-      <w:proofErr w:type="spellStart"/>
-      <w:r>
-        <w:t>rw</w:t>
-      </w:r>
-      <w:proofErr w:type="spellEnd"/>
-      <w:r>
-        <w:t xml:space="preserve">, int32, ...) are now displayed in a separate </w:t>
-      </w:r>
-      <w:r>
-        <w:t>[</w:t>
-      </w:r>
-      <w:r>
-        <w:t>Properties</w:t>
-      </w:r>
-      <w:r>
-        <w:t>]</w:t>
-      </w:r>
-      <w:r>
-        <w:t xml:space="preserve"> column</w:t>
-      </w:r>
-      <w:r>
-        <w:t xml:space="preserve"> instead of being added to </w:t>
-      </w:r>
-      <w:r>
-        <w:t xml:space="preserve">the </w:t>
-      </w:r>
-      <w:r>
-        <w:t>[</w:t>
-      </w:r>
-      <w:r>
-        <w:t>Description</w:t>
-      </w:r>
-      <w:r>
-        <w:t>]</w:t>
-      </w:r>
-      <w:r>
-        <w:t xml:space="preserve"> column. </w:t>
-      </w:r>
-      <w:r>
-        <w:t>The [Properties]  column can be e</w:t>
-      </w:r>
-      <w:r>
-        <w:t>nable/disable</w:t>
-      </w:r>
-      <w:r>
-        <w:t>d</w:t>
-      </w:r>
-      <w:r>
-        <w:t xml:space="preserve"> in Options.</w:t>
-      </w:r>
-    </w:p>
-    <w:p>
-      <w:pPr>
-        <w:numPr>
-          <w:ilvl w:val="0"/>
-          <w:numId w:val="4"/>
-        </w:numPr>
-        <w:rPr>
-          <w:rFonts w:hint="eastAsia"/>
-        </w:rPr>
-      </w:pPr>
-      <w:r>
-        <w:t>The Description text can now be multi-line</w:t>
-      </w:r>
-      <w:r>
-        <w:t>, i</w:t>
-      </w:r>
-      <w:r>
-        <w:t xml:space="preserve">f  the </w:t>
-      </w:r>
-      <w:r>
-        <w:t>“</w:t>
-      </w:r>
-      <w:r>
-        <w:t>Multiline rows with auto row size</w:t>
-      </w:r>
-      <w:r>
-        <w:t>”</w:t>
-      </w:r>
-      <w:r>
-        <w:t xml:space="preserve"> option </w:t>
-      </w:r>
-      <w:r>
-        <w:t>is enabled</w:t>
-      </w:r>
-      <w:r>
-        <w:t xml:space="preserve">. A </w:t>
-      </w:r>
-      <w:r>
-        <w:t xml:space="preserve">long </w:t>
-      </w:r>
-      <w:r>
-        <w:t xml:space="preserve">description </w:t>
-      </w:r>
-      <w:r>
-        <w:t>text is wrappe</w:t>
-      </w:r>
-      <w:r>
-        <w:t xml:space="preserve">d. </w:t>
-      </w:r>
-      <w:r>
-        <w:t>CR/LF</w:t>
-      </w:r>
-      <w:r>
-        <w:t xml:space="preserve">’s can be used in the description text. </w:t>
-      </w:r>
-      <w:r>
-        <w:t xml:space="preserve">The row height of the grid is automatically adjusted to the text. </w:t>
-      </w:r>
-    </w:p>
-    <w:p>
-      <w:pPr>
-        <w:numPr>
-          <w:ilvl w:val="0"/>
-          <w:numId w:val="4"/>
-        </w:numPr>
-        <w:rPr>
-          <w:rFonts w:hint="eastAsia"/>
-        </w:rPr>
-      </w:pPr>
-      <w:r>
-        <w:t>"Move to next row on Enter"</w:t>
-      </w:r>
-      <w:r>
-        <w:t xml:space="preserve"> option</w:t>
-      </w:r>
-      <w:r>
-        <w:t xml:space="preserve">: depending on this option, after entering a new value with the Enter key, the </w:t>
-      </w:r>
-      <w:r>
-        <w:t>cursor</w:t>
-      </w:r>
-      <w:r>
-        <w:t xml:space="preserve"> may or may not go to the next line. </w:t>
-      </w:r>
-      <w:r>
-        <w:t xml:space="preserve">Enter a value with </w:t>
-      </w:r>
-      <w:r>
-        <w:t>Control-Enter</w:t>
-      </w:r>
-      <w:r>
-        <w:t xml:space="preserve"> to get the</w:t>
-      </w:r>
-      <w:r>
-        <w:t xml:space="preserve"> opposite</w:t>
-      </w:r>
-      <w:r>
-        <w:t xml:space="preserve"> behaviour.</w:t>
-      </w:r>
-    </w:p>
-    <w:p>
-      <w:pPr>
-        <w:pStyle w:val="Kop3"/>
-        <w:numPr>
-          <w:ilvl w:val="0"/>
-          <w:numId w:val="0"/>
-        </w:numPr>
-        <w:ind w:left="680" w:hanging="431"/>
-        <w:rPr>
-          <w:rFonts w:hint="eastAsia"/>
-        </w:rPr>
-      </w:pPr>
-      <w:r>
-        <w:t>Fixes</w:t>
-      </w:r>
-    </w:p>
-    <w:p>
-      <w:pPr>
-        <w:numPr>
-          <w:ilvl w:val="0"/>
-          <w:numId w:val="5"/>
-        </w:numPr>
-        <w:rPr>
-          <w:rFonts w:hint="eastAsia"/>
-        </w:rPr>
-      </w:pPr>
-      <w:r>
-        <w:t xml:space="preserve">Control-0 for zoom reset now works globally on the </w:t>
-      </w:r>
-      <w:r>
-        <w:t>window</w:t>
-      </w:r>
-      <w:r>
-        <w:t>, not just when the focus is in the grid.</w:t>
-      </w:r>
-    </w:p>
-    <w:p>
-      <w:pPr>
-        <w:numPr>
-          <w:ilvl w:val="0"/>
-          <w:numId w:val="5"/>
-        </w:numPr>
-        <w:rPr>
-          <w:rFonts w:hint="eastAsia"/>
-        </w:rPr>
-      </w:pPr>
-      <w:r>
-        <w:t>R</w:t>
-      </w:r>
-      <w:r>
-        <w:t>ight-click</w:t>
-      </w:r>
-      <w:r>
-        <w:t>ing</w:t>
-      </w:r>
-      <w:r>
-        <w:t xml:space="preserve"> in the grid</w:t>
-      </w:r>
-      <w:r>
-        <w:t xml:space="preserve"> now moves the focus to that row, to </w:t>
-      </w:r>
-      <w:r>
-        <w:t>better see which row you are working on.</w:t>
-      </w:r>
-    </w:p>
-    <w:p>
-      <w:pPr>
-        <w:numPr>
-          <w:ilvl w:val="0"/>
-          <w:numId w:val="5"/>
-        </w:numPr>
-        <w:rPr>
-          <w:rFonts w:hint="eastAsia"/>
-        </w:rPr>
-      </w:pPr>
-      <w:r>
-        <w:t>Migrated</w:t>
-      </w:r>
-      <w:r>
-        <w:t xml:space="preserve"> to .NET framework 4.7.2.</w:t>
-      </w:r>
-    </w:p>
-    <w:p>
-      <w:pPr>
-        <w:pStyle w:val="Kop1"/>
-        <w:rPr>
-          <w:rFonts w:hint="eastAsia"/>
-        </w:rPr>
-      </w:pPr>
-      <w:r>
-        <w:t>v2.0.12 -- 2020-07-13</w:t>
-      </w:r>
-    </w:p>
-    <w:p>
-      <w:pPr>
-        <w:pStyle w:val="Kop3"/>
-        <w:rPr>
-          <w:rFonts w:hint="eastAsia"/>
-        </w:rPr>
-      </w:pPr>
-      <w:r>
-        <w:t>Features</w:t>
-      </w:r>
-    </w:p>
-    <w:p>
-      <w:pPr>
-        <w:numPr>
-          <w:ilvl w:val="0"/>
-          <w:numId w:val="6"/>
-        </w:numPr>
-        <w:rPr>
-          <w:rFonts w:hint="eastAsia"/>
-        </w:rPr>
-      </w:pPr>
-      <w:r>
-        <w:t>Added mbc project file validation with XSD schema</w:t>
-      </w:r>
-      <w:r>
-        <w:t xml:space="preserve"> file</w:t>
-      </w:r>
-      <w:r>
-        <w:t xml:space="preserve">. </w:t>
-      </w:r>
-      <w:r>
-        <w:t xml:space="preserve">Validation is optional. </w:t>
-      </w:r>
-      <w:r>
-        <w:t>The validation only allows lower-case XML tags</w:t>
-      </w:r>
-      <w:r>
-        <w:t>, a</w:t>
-      </w:r>
-      <w:r>
-        <w:t xml:space="preserve">nd only allows the XML elements that are supported in this version. The intention is that over time all mbc files will </w:t>
-      </w:r>
-      <w:r>
-        <w:t>migrate</w:t>
-      </w:r>
-      <w:r>
-        <w:t xml:space="preserve"> to meet the validation.</w:t>
-      </w:r>
-    </w:p>
-    <w:p>
-      <w:pPr>
-        <w:numPr>
-          <w:ilvl w:val="0"/>
-          <w:numId w:val="6"/>
-        </w:numPr>
-        <w:rPr>
-          <w:rFonts w:hint="eastAsia"/>
-        </w:rPr>
-      </w:pPr>
-      <w:r>
-        <w:t>In</w:t>
-      </w:r>
-      <w:r>
-        <w:t xml:space="preserve"> </w:t>
-      </w:r>
-      <w:r>
-        <w:t xml:space="preserve">the </w:t>
-      </w:r>
-      <w:r>
-        <w:t xml:space="preserve">"Save project file" </w:t>
-      </w:r>
-      <w:r>
-        <w:t>window</w:t>
-      </w:r>
-      <w:r>
-        <w:t xml:space="preserve"> </w:t>
-      </w:r>
-      <w:r>
-        <w:t xml:space="preserve">you now have the option to update the XML with "Update XML to current version" so that it then passes the validation. </w:t>
-      </w:r>
-      <w:r>
-        <w:t>E</w:t>
-      </w:r>
-      <w:r>
-        <w:t>rrors must be corrected manually.</w:t>
-      </w:r>
-    </w:p>
-    <w:p>
-      <w:pPr>
-        <w:numPr>
-          <w:ilvl w:val="0"/>
-          <w:numId w:val="6"/>
-        </w:numPr>
-        <w:rPr>
-          <w:rFonts w:hint="eastAsia"/>
-        </w:rPr>
-      </w:pPr>
-      <w:r>
-        <w:t>In</w:t>
-      </w:r>
-      <w:r>
-        <w:t xml:space="preserve"> "Save project file" the project file is now saved with XML formatting.</w:t>
-      </w:r>
-    </w:p>
-    <w:p>
-      <w:pPr>
-        <w:numPr>
-          <w:ilvl w:val="0"/>
-          <w:numId w:val="6"/>
-        </w:numPr>
-        <w:rPr>
-          <w:rFonts w:hint="eastAsia"/>
-        </w:rPr>
-      </w:pPr>
-      <w:r>
-        <w:t xml:space="preserve">If you start ModbusControl by double-clicking an mbc file and the file points to a non-existent COM port, the error dialog "Error opening serial port </w:t>
-      </w:r>
-      <w:proofErr w:type="spellStart"/>
-      <w:r>
-        <w:t>COMx</w:t>
-      </w:r>
-      <w:proofErr w:type="spellEnd"/>
-      <w:r>
-        <w:t xml:space="preserve">" now appears after </w:t>
-      </w:r>
-      <w:r>
-        <w:lastRenderedPageBreak/>
-        <w:t>the ModbusControl program appears.</w:t>
-      </w:r>
-    </w:p>
-    <w:p>
-      <w:pPr>
-        <w:numPr>
-          <w:ilvl w:val="0"/>
-          <w:numId w:val="6"/>
-        </w:numPr>
-        <w:rPr>
-          <w:rFonts w:hint="eastAsia"/>
-        </w:rPr>
-      </w:pPr>
-      <w:r>
-        <w:t xml:space="preserve">At the first start </w:t>
-      </w:r>
-      <w:r>
-        <w:t xml:space="preserve">of the program </w:t>
-      </w:r>
-      <w:r>
-        <w:t xml:space="preserve">after an update, </w:t>
-      </w:r>
-      <w:r>
-        <w:t xml:space="preserve">an option is shown </w:t>
-      </w:r>
-      <w:r>
-        <w:t>to see the 'Release notes'.</w:t>
-      </w:r>
-    </w:p>
-    <w:p>
-      <w:pPr>
-        <w:numPr>
-          <w:ilvl w:val="0"/>
-          <w:numId w:val="6"/>
-        </w:numPr>
-        <w:rPr>
-          <w:rFonts w:hint="eastAsia"/>
-        </w:rPr>
-      </w:pPr>
-      <w:r>
-        <w:t xml:space="preserve">Program settings split into user-dependent part and </w:t>
-      </w:r>
-      <w:r>
-        <w:t>computer</w:t>
-      </w:r>
-      <w:r>
-        <w:t xml:space="preserve">-dependent part. The old settings are migrated to the new settings files, then </w:t>
-      </w:r>
-      <w:r>
-        <w:t xml:space="preserve">the </w:t>
-      </w:r>
-      <w:r>
-        <w:t>old settings file is deleted.</w:t>
-      </w:r>
-    </w:p>
-    <w:p>
-      <w:pPr>
-        <w:numPr>
-          <w:ilvl w:val="0"/>
-          <w:numId w:val="6"/>
-        </w:numPr>
-        <w:rPr>
-          <w:rFonts w:hint="eastAsia"/>
-        </w:rPr>
-      </w:pPr>
-      <w:r>
-        <w:t xml:space="preserve">LocalOverrides.xml </w:t>
-      </w:r>
-      <w:r>
-        <w:t xml:space="preserve">file is automatically </w:t>
-      </w:r>
-      <w:r>
-        <w:t>moved from &lt;</w:t>
-      </w:r>
-      <w:proofErr w:type="spellStart"/>
-      <w:r>
-        <w:t>mydocuments</w:t>
-      </w:r>
-      <w:proofErr w:type="spellEnd"/>
-      <w:r>
-        <w:t>&gt;\ModbusControl to %</w:t>
-      </w:r>
-      <w:proofErr w:type="spellStart"/>
-      <w:r>
-        <w:t>AppData</w:t>
-      </w:r>
-      <w:proofErr w:type="spellEnd"/>
-      <w:r>
-        <w:t xml:space="preserve">%\Roaming\E.D.&amp;A\ModbusControl. Content from old is not migrated. Old </w:t>
-      </w:r>
-      <w:r>
-        <w:t>file</w:t>
-      </w:r>
-      <w:r>
-        <w:t xml:space="preserve"> is renamed with '.old' and moved to the </w:t>
-      </w:r>
-      <w:r>
-        <w:t xml:space="preserve">new </w:t>
-      </w:r>
-      <w:r>
-        <w:t>location. If overrides were used, the user will receive a notification.</w:t>
-      </w:r>
-    </w:p>
-    <w:p>
-      <w:pPr>
-        <w:numPr>
-          <w:ilvl w:val="0"/>
-          <w:numId w:val="6"/>
-        </w:numPr>
-        <w:rPr>
-          <w:rFonts w:hint="eastAsia"/>
-        </w:rPr>
-      </w:pPr>
-      <w:r>
-        <w:t>&lt;user&gt;\Documents\ModbusControl is no longer used.</w:t>
-      </w:r>
-    </w:p>
-    <w:p>
-      <w:pPr>
-        <w:pStyle w:val="Kop3"/>
-        <w:rPr>
-          <w:rFonts w:hint="eastAsia"/>
-        </w:rPr>
-      </w:pPr>
-      <w:r>
-        <w:t>Fixes</w:t>
-      </w:r>
-    </w:p>
-    <w:p>
-      <w:pPr>
-        <w:numPr>
-          <w:ilvl w:val="0"/>
-          <w:numId w:val="7"/>
-        </w:numPr>
-        <w:rPr>
-          <w:rFonts w:hint="eastAsia"/>
-        </w:rPr>
-      </w:pPr>
-      <w:r>
-        <w:t>The import/export dialogs now show '*. CSV' instead of '*. C</w:t>
-      </w:r>
-      <w:r>
-        <w:t>VS</w:t>
-      </w:r>
-      <w:r>
-        <w:t>'.</w:t>
-      </w:r>
-    </w:p>
-    <w:p>
-      <w:pPr>
-        <w:numPr>
-          <w:ilvl w:val="0"/>
-          <w:numId w:val="7"/>
-        </w:numPr>
-        <w:rPr>
-          <w:rFonts w:hint="eastAsia"/>
-        </w:rPr>
-      </w:pPr>
-      <w:r>
-        <w:t>Mbc file is now saved without BOM (</w:t>
-      </w:r>
-      <w:r>
-        <w:t>Unicode</w:t>
-      </w:r>
-      <w:r>
-        <w:t xml:space="preserve"> byte order mark).</w:t>
-      </w:r>
-    </w:p>
-    <w:p>
-      <w:pPr>
-        <w:numPr>
-          <w:ilvl w:val="0"/>
-          <w:numId w:val="7"/>
-        </w:numPr>
-        <w:rPr>
-          <w:rFonts w:hint="eastAsia"/>
-        </w:rPr>
-      </w:pPr>
-      <w:r>
-        <w:t xml:space="preserve">Better </w:t>
-      </w:r>
-      <w:r>
-        <w:t>handling</w:t>
-      </w:r>
-      <w:r>
-        <w:t xml:space="preserve"> if </w:t>
-      </w:r>
-      <w:r>
-        <w:t>a</w:t>
-      </w:r>
-      <w:r>
-        <w:t xml:space="preserve"> non-admin</w:t>
-      </w:r>
-      <w:r>
-        <w:t>istrator</w:t>
-      </w:r>
-      <w:r>
-        <w:t xml:space="preserve"> user logs </w:t>
-      </w:r>
-      <w:r>
-        <w:t xml:space="preserve">on </w:t>
-      </w:r>
-      <w:r>
-        <w:t>and uses ModbusControl.</w:t>
-      </w:r>
-    </w:p>
-    <w:p>
-      <w:pPr>
-        <w:pStyle w:val="Kop1"/>
-        <w:rPr>
-          <w:rFonts w:hint="eastAsia"/>
-        </w:rPr>
-      </w:pPr>
-      <w:r>
-        <w:t>v2.0.11 -- 2019-11-18</w:t>
-      </w:r>
-    </w:p>
-    <w:p>
-      <w:pPr>
-        <w:pStyle w:val="Kop3"/>
-        <w:rPr>
-          <w:rFonts w:hint="eastAsia"/>
-        </w:rPr>
-      </w:pPr>
-      <w:r>
-        <w:t>Fixes</w:t>
-      </w:r>
-    </w:p>
-    <w:p>
-      <w:pPr>
-        <w:numPr>
-          <w:ilvl w:val="0"/>
-          <w:numId w:val="8"/>
-        </w:numPr>
-        <w:rPr>
-          <w:rFonts w:hint="eastAsia"/>
-        </w:rPr>
-      </w:pPr>
-      <w:r>
-        <w:t xml:space="preserve">Better handling if the USB/serial connection is lost. In the past </w:t>
-      </w:r>
-      <w:r>
-        <w:t xml:space="preserve">the </w:t>
-      </w:r>
-      <w:r>
-        <w:t xml:space="preserve">program </w:t>
-      </w:r>
-      <w:r>
-        <w:t>could stop responding</w:t>
-      </w:r>
-      <w:r>
-        <w:t>.</w:t>
-      </w:r>
-    </w:p>
-    <w:p>
-      <w:pPr>
-        <w:pStyle w:val="Kop1"/>
-        <w:rPr>
-          <w:rFonts w:hint="eastAsia"/>
-        </w:rPr>
-      </w:pPr>
-      <w:r>
-        <w:t>v2.0.10 -- 2019-03-11</w:t>
-      </w:r>
-    </w:p>
-    <w:p>
-      <w:pPr>
-        <w:pStyle w:val="Kop3"/>
-        <w:rPr>
-          <w:rFonts w:hint="eastAsia"/>
-        </w:rPr>
-      </w:pPr>
-      <w:r>
-        <w:t>Features</w:t>
-      </w:r>
-    </w:p>
-    <w:p>
-      <w:pPr>
-        <w:numPr>
-          <w:ilvl w:val="0"/>
-          <w:numId w:val="8"/>
-        </w:numPr>
-        <w:rPr>
-          <w:rFonts w:hint="eastAsia"/>
-        </w:rPr>
-      </w:pPr>
-      <w:r>
-        <w:t>Added display</w:t>
-      </w:r>
-      <w:r>
-        <w:t>ing</w:t>
-      </w:r>
-      <w:r>
-        <w:t xml:space="preserve"> of enum </w:t>
-      </w:r>
-      <w:r>
-        <w:t xml:space="preserve">values </w:t>
-      </w:r>
-      <w:r>
-        <w:t xml:space="preserve">in the value column. </w:t>
-      </w:r>
-    </w:p>
-    <w:p>
-      <w:pPr>
-        <w:pStyle w:val="Kop3"/>
-        <w:rPr>
-          <w:rFonts w:hint="eastAsia"/>
-        </w:rPr>
-      </w:pPr>
-      <w:r>
-        <w:t>Fixes</w:t>
-      </w:r>
-    </w:p>
-    <w:p>
-      <w:pPr>
-        <w:numPr>
-          <w:ilvl w:val="0"/>
-          <w:numId w:val="8"/>
-        </w:numPr>
-        <w:rPr>
-          <w:rFonts w:hint="eastAsia"/>
-        </w:rPr>
-      </w:pPr>
-      <w:r>
-        <w:t xml:space="preserve">Menu </w:t>
-      </w:r>
-      <w:r>
-        <w:t xml:space="preserve">item </w:t>
-      </w:r>
-      <w:r>
-        <w:t xml:space="preserve">"Edit project file" did not work </w:t>
-      </w:r>
-      <w:r>
-        <w:t xml:space="preserve">correctly </w:t>
-      </w:r>
-      <w:r>
-        <w:t>if there was a space in the path.</w:t>
-      </w:r>
-    </w:p>
-    <w:p>
-      <w:pPr>
-        <w:numPr>
-          <w:ilvl w:val="0"/>
-          <w:numId w:val="8"/>
-        </w:numPr>
-        <w:rPr>
-          <w:rFonts w:hint="eastAsia"/>
-        </w:rPr>
-      </w:pPr>
-      <w:r>
-        <w:t>Logger: Clear button did not clear number of logs in the status bar.</w:t>
-      </w:r>
-    </w:p>
-    <w:p>
-      <w:pPr>
-        <w:numPr>
-          <w:ilvl w:val="0"/>
-          <w:numId w:val="8"/>
-        </w:numPr>
-        <w:rPr>
-          <w:rFonts w:hint="eastAsia"/>
-        </w:rPr>
-      </w:pPr>
-      <w:r>
-        <w:t xml:space="preserve">Send Custom Modbus Command: allows tabs and CR/LF in the string. </w:t>
-      </w:r>
-      <w:r>
-        <w:t xml:space="preserve">Reports </w:t>
-      </w:r>
-      <w:r>
-        <w:t xml:space="preserve">error </w:t>
-      </w:r>
-      <w:r>
-        <w:t>for</w:t>
-      </w:r>
-      <w:r>
-        <w:t xml:space="preserve"> empty command string. </w:t>
-      </w:r>
-    </w:p>
-    <w:p>
-      <w:pPr>
-        <w:numPr>
-          <w:ilvl w:val="0"/>
-          <w:numId w:val="8"/>
-        </w:numPr>
-        <w:rPr>
-          <w:rFonts w:hint="eastAsia"/>
-        </w:rPr>
-      </w:pPr>
-      <w:r>
-        <w:t xml:space="preserve">Send Custom Modbus Command: </w:t>
-      </w:r>
-      <w:r>
-        <w:t>Reports</w:t>
-      </w:r>
-      <w:r>
-        <w:t xml:space="preserve"> error when command is too short, must be at least 2 bytes.</w:t>
-      </w:r>
-    </w:p>
-    <w:p>
-      <w:pPr>
-        <w:numPr>
-          <w:ilvl w:val="0"/>
-          <w:numId w:val="8"/>
-        </w:numPr>
-        <w:rPr>
-          <w:rFonts w:hint="eastAsia"/>
-        </w:rPr>
-      </w:pPr>
-      <w:r>
-        <w:t xml:space="preserve">Fix background </w:t>
-      </w:r>
-      <w:r>
-        <w:t>colour</w:t>
-      </w:r>
-      <w:r>
-        <w:t xml:space="preserve"> of registers.</w:t>
-      </w:r>
-    </w:p>
-    <w:p>
-      <w:pPr>
-        <w:pStyle w:val="Kop1"/>
-        <w:rPr>
-          <w:rFonts w:hint="eastAsia"/>
-        </w:rPr>
-      </w:pPr>
-      <w:r>
-        <w:t>v2.0.9 -- 2018-10-20</w:t>
-      </w:r>
-    </w:p>
-    <w:p>
-      <w:pPr>
-        <w:pStyle w:val="Kop3"/>
-        <w:rPr>
-          <w:rFonts w:hint="eastAsia"/>
-        </w:rPr>
-      </w:pPr>
-      <w:r>
-        <w:t>Features</w:t>
-      </w:r>
-    </w:p>
-    <w:p>
-      <w:pPr>
-        <w:numPr>
-          <w:ilvl w:val="0"/>
-          <w:numId w:val="9"/>
-        </w:numPr>
-        <w:rPr>
-          <w:rFonts w:hint="eastAsia"/>
-        </w:rPr>
-      </w:pPr>
-      <w:r>
-        <w:t>New option: "Move to next row on Enter".</w:t>
-      </w:r>
-    </w:p>
-    <w:p>
-      <w:pPr>
-        <w:numPr>
-          <w:ilvl w:val="0"/>
-          <w:numId w:val="9"/>
-        </w:numPr>
-        <w:rPr>
-          <w:rFonts w:hint="eastAsia"/>
-        </w:rPr>
-      </w:pPr>
-      <w:r>
-        <w:t xml:space="preserve">New option: "Auto-start edit mode on typing". </w:t>
-      </w:r>
-    </w:p>
-    <w:p>
-      <w:pPr>
-        <w:numPr>
-          <w:ilvl w:val="0"/>
-          <w:numId w:val="9"/>
-        </w:numPr>
-        <w:rPr>
-          <w:rFonts w:hint="eastAsia"/>
-        </w:rPr>
-      </w:pPr>
-      <w:r>
-        <w:t xml:space="preserve">New option: "Use custom editor". </w:t>
-      </w:r>
-    </w:p>
-    <w:p>
-      <w:pPr>
-        <w:numPr>
-          <w:ilvl w:val="0"/>
-          <w:numId w:val="9"/>
-        </w:numPr>
-        <w:rPr>
-          <w:rFonts w:hint="eastAsia"/>
-        </w:rPr>
-      </w:pPr>
-      <w:r>
-        <w:t>New option: "Ignore form size on project reload".</w:t>
-      </w:r>
-    </w:p>
-    <w:p>
-      <w:pPr>
-        <w:numPr>
-          <w:ilvl w:val="0"/>
-          <w:numId w:val="9"/>
-        </w:numPr>
-        <w:rPr>
-          <w:rFonts w:hint="eastAsia"/>
-        </w:rPr>
-      </w:pPr>
-      <w:r>
-        <w:t>Config</w:t>
-      </w:r>
-      <w:r>
-        <w:t>uration</w:t>
-      </w:r>
-      <w:r>
-        <w:t xml:space="preserve"> </w:t>
-      </w:r>
-      <w:r>
-        <w:t>window</w:t>
-      </w:r>
-      <w:r>
-        <w:t xml:space="preserve"> now has an Apply button.</w:t>
-      </w:r>
-    </w:p>
-    <w:p>
-      <w:pPr>
-        <w:numPr>
-          <w:ilvl w:val="0"/>
-          <w:numId w:val="9"/>
-        </w:numPr>
-        <w:rPr>
-          <w:rFonts w:hint="eastAsia"/>
-        </w:rPr>
-      </w:pPr>
-      <w:r>
-        <w:t xml:space="preserve">Separate line-copy and value-copy </w:t>
-      </w:r>
-      <w:r>
-        <w:t xml:space="preserve">capability </w:t>
-      </w:r>
-      <w:r>
-        <w:t xml:space="preserve">in grid, </w:t>
-      </w:r>
-      <w:r>
-        <w:t>using</w:t>
-      </w:r>
-      <w:r>
-        <w:t xml:space="preserve"> control-C and context menu.</w:t>
-      </w:r>
-    </w:p>
-    <w:p>
-      <w:pPr>
-        <w:numPr>
-          <w:ilvl w:val="0"/>
-          <w:numId w:val="9"/>
-        </w:numPr>
-        <w:rPr>
-          <w:rFonts w:hint="eastAsia"/>
-        </w:rPr>
-      </w:pPr>
-      <w:r>
-        <w:t xml:space="preserve">The status bar now </w:t>
-      </w:r>
-      <w:r>
-        <w:t xml:space="preserve">has </w:t>
-      </w:r>
-      <w:r>
-        <w:t xml:space="preserve">blue </w:t>
-      </w:r>
-      <w:r>
-        <w:t xml:space="preserve">colour </w:t>
-      </w:r>
-      <w:r>
-        <w:t>if there is no connection or no polling is done.</w:t>
-      </w:r>
-    </w:p>
-    <w:p>
-      <w:pPr>
-        <w:numPr>
-          <w:ilvl w:val="0"/>
-          <w:numId w:val="9"/>
-        </w:numPr>
-        <w:rPr>
-          <w:rFonts w:hint="eastAsia"/>
-        </w:rPr>
-      </w:pPr>
-      <w:r>
-        <w:t xml:space="preserve">The status bar </w:t>
-      </w:r>
-      <w:r>
-        <w:t xml:space="preserve">now has red colour </w:t>
-      </w:r>
-      <w:r>
-        <w:t>for errors.</w:t>
-      </w:r>
-    </w:p>
-    <w:p>
-      <w:pPr>
-        <w:numPr>
-          <w:ilvl w:val="0"/>
-          <w:numId w:val="9"/>
-        </w:numPr>
-        <w:rPr>
-          <w:rFonts w:hint="eastAsia"/>
-        </w:rPr>
-      </w:pPr>
-      <w:r>
-        <w:t xml:space="preserve">Now </w:t>
-      </w:r>
-      <w:r>
-        <w:t>shows</w:t>
-      </w:r>
-      <w:r>
-        <w:t xml:space="preserve"> a warning in the "Save configuration to project file" and "Project configuration" screens if localoverrides </w:t>
-      </w:r>
-      <w:r>
-        <w:t>were</w:t>
-      </w:r>
-      <w:r>
-        <w:t xml:space="preserve"> used.</w:t>
-      </w:r>
-    </w:p>
-    <w:p>
-      <w:pPr>
-        <w:pStyle w:val="Kop3"/>
-        <w:rPr>
-          <w:rFonts w:hint="eastAsia"/>
-        </w:rPr>
-      </w:pPr>
-      <w:r>
-        <w:lastRenderedPageBreak/>
+        <w:rPr>
+          <w:rFonts w:hint="eastAsia"/>
+        </w:rPr>
+      </w:pPr>
+      <w:r>
         <w:t>Fixes</w:t>
       </w:r>
     </w:p>

</xml_diff>

<commit_message>
Disable DataGridView copying content on control-C, otherwise pressing control-C while editing the value copies the whole row content instead of the value string only. User manual on more clear on the "run as 64-bit application" after the "Prefer 32-bit" build option is turned off.
git-svn-id: http://visualsvn.edna.local/EDNA/ModbusControl/V2@4923 03c8d257-35a7-c645-9f01-50f27e98b9e6
</commit_message>
<xml_diff>
--- a/Manuals/ModbusControl - Release notes.docx
+++ b/Manuals/ModbusControl - Release notes.docx
@@ -35,13 +35,25 @@
         <w:rPr>
           <w:color w:val="auto"/>
         </w:rPr>
-        <w:t xml:space="preserve">21 – </w:t>
+        <w:t>2</w:t>
       </w:r>
       <w:r>
         <w:rPr>
           <w:color w:val="auto"/>
         </w:rPr>
-        <w:t>2026-02-13</w:t>
+        <w:t>2</w:t>
+      </w:r>
+      <w:r>
+        <w:rPr>
+          <w:color w:val="auto"/>
+        </w:rPr>
+        <w:t xml:space="preserve"> – </w:t>
+      </w:r>
+      <w:r>
+        <w:rPr>
+          <w:color w:val="auto"/>
+        </w:rPr>
+        <w:t>?????????</w:t>
       </w:r>
     </w:p>
     <w:p>
@@ -68,16 +80,23 @@
         </w:rPr>
       </w:pPr>
       <w:r>
-        <w:t>Added support for string forma</w:t>
-      </w:r>
-      <w:r>
-        <w:t>t</w:t>
-      </w:r>
-      <w:r>
-        <w:t xml:space="preserve"> (up to 150 registers or 300 bytes) with multiple encodings</w:t>
-      </w:r>
-      <w:r>
-        <w:t xml:space="preserve">. </w:t>
+        <w:t>?????</w:t>
+      </w:r>
+    </w:p>
+    <w:p>
+      <w:pPr>
+        <w:pStyle w:val="Kop3"/>
+        <w:numPr>
+          <w:ilvl w:val="0"/>
+          <w:numId w:val="0"/>
+        </w:numPr>
+        <w:ind w:left="431" w:hanging="431"/>
+        <w:rPr>
+          <w:rFonts w:hint="eastAsia"/>
+        </w:rPr>
+      </w:pPr>
+      <w:r>
+        <w:t>Fixes</w:t>
       </w:r>
     </w:p>
     <w:p>
@@ -88,28 +107,34 @@
           <w:numId w:val="4"/>
         </w:numPr>
         <w:spacing w:after="60"/>
-        <w:rPr>
-          <w:rFonts w:hint="eastAsia"/>
-        </w:rPr>
-      </w:pPr>
-      <w:r>
-        <w:t>ModbusExport</w:t>
-      </w:r>
-      <w:r>
-        <w:t xml:space="preserve">: </w:t>
-      </w:r>
-      <w:r>
-        <w:t xml:space="preserve">Now supports strings and includes a </w:t>
+        <w:ind w:left="1037" w:hanging="357"/>
+        <w:contextualSpacing w:val="0"/>
+        <w:rPr>
+          <w:rFonts w:hint="eastAsia"/>
+        </w:rPr>
+      </w:pPr>
+      <w:r>
+        <w:t xml:space="preserve">Pressing </w:t>
+      </w:r>
+      <w:r>
+        <w:rPr>
+          <w:b/>
+          <w:bCs/>
+        </w:rPr>
+        <w:t>Ctrl + C</w:t>
+      </w:r>
+      <w:r>
+        <w:t xml:space="preserve"> in the grid after selecting a cell in the </w:t>
       </w:r>
       <w:r>
         <w:rPr>
           <w:i/>
           <w:iCs/>
         </w:rPr>
-        <w:t>Continue on error</w:t>
-      </w:r>
-      <w:r>
-        <w:t xml:space="preserve"> option.</w:t>
+        <w:t>Value</w:t>
+      </w:r>
+      <w:r>
+        <w:t xml:space="preserve"> column now copies only the value string instead of the entire row. Likewise, when copying while editing a value, only the value itself is copied.</w:t>
       </w:r>
     </w:p>
     <w:p>
@@ -120,12 +145,147 @@
           <w:numId w:val="4"/>
         </w:numPr>
         <w:spacing w:after="60"/>
-        <w:rPr>
-          <w:rFonts w:hint="eastAsia"/>
-        </w:rPr>
-      </w:pPr>
-      <w:r>
-        <w:t xml:space="preserve">ModbusImport: </w:t>
+        <w:ind w:left="1037" w:hanging="357"/>
+        <w:contextualSpacing w:val="0"/>
+      </w:pPr>
+      <w:r>
+        <w:t>The installer now install</w:t>
+      </w:r>
+      <w:r>
+        <w:t>s</w:t>
+      </w:r>
+      <w:r>
+        <w:t xml:space="preserve"> this application in “</w:t>
+      </w:r>
+      <w:r>
+        <w:rPr>
+          <w:rFonts w:hint="eastAsia"/>
+        </w:rPr>
+        <w:t xml:space="preserve">C:\Program Files\ModbusControl" </w:t>
+      </w:r>
+      <w:r>
+        <w:t xml:space="preserve">directory instead of in </w:t>
+      </w:r>
+      <w:r>
+        <w:rPr>
+          <w:rFonts w:hint="eastAsia"/>
+        </w:rPr>
+        <w:t>"C:\Program Files (x86)\E.D.&amp;A\ModbusControl"</w:t>
+      </w:r>
+      <w:r>
+        <w:t>.</w:t>
+      </w:r>
+    </w:p>
+    <w:p>
+      <w:pPr>
+        <w:pStyle w:val="Lijstalinea"/>
+        <w:numPr>
+          <w:ilvl w:val="0"/>
+          <w:numId w:val="4"/>
+        </w:numPr>
+        <w:spacing w:after="60"/>
+        <w:ind w:left="1037" w:hanging="357"/>
+        <w:contextualSpacing w:val="0"/>
+        <w:rPr>
+          <w:rFonts w:hint="eastAsia"/>
+        </w:rPr>
+      </w:pPr>
+      <w:r>
+        <w:t xml:space="preserve">The Updater: </w:t>
+      </w:r>
+      <w:r>
+        <w:t>Resolved an issue with Admin</w:t>
+      </w:r>
+      <w:r>
+        <w:noBreakHyphen/>
+        <w:t>by</w:t>
+      </w:r>
+      <w:r>
+        <w:noBreakHyphen/>
+        <w:t>Request that caused a warning indicating that the Updater application was in use during the update.</w:t>
+      </w:r>
+    </w:p>
+    <w:p>
+      <w:pPr>
+        <w:pStyle w:val="Kop1"/>
+        <w:rPr>
+          <w:rFonts w:hint="eastAsia"/>
+          <w:color w:val="auto"/>
+        </w:rPr>
+      </w:pPr>
+      <w:r>
+        <w:t>v2.0.</w:t>
+      </w:r>
+      <w:r>
+        <w:rPr>
+          <w:color w:val="auto"/>
+        </w:rPr>
+        <w:t xml:space="preserve">21 – </w:t>
+      </w:r>
+      <w:r>
+        <w:rPr>
+          <w:color w:val="auto"/>
+        </w:rPr>
+        <w:t>2026-02-13</w:t>
+      </w:r>
+    </w:p>
+    <w:p>
+      <w:pPr>
+        <w:pStyle w:val="Kop3"/>
+        <w:rPr>
+          <w:rFonts w:hint="eastAsia"/>
+        </w:rPr>
+      </w:pPr>
+      <w:r>
+        <w:t>Features</w:t>
+      </w:r>
+    </w:p>
+    <w:p>
+      <w:pPr>
+        <w:pStyle w:val="Lijstalinea"/>
+        <w:numPr>
+          <w:ilvl w:val="0"/>
+          <w:numId w:val="4"/>
+        </w:numPr>
+        <w:spacing w:after="60"/>
+        <w:ind w:left="1037" w:hanging="357"/>
+        <w:contextualSpacing w:val="0"/>
+        <w:rPr>
+          <w:rFonts w:hint="eastAsia"/>
+        </w:rPr>
+      </w:pPr>
+      <w:r>
+        <w:t>Added support for string forma</w:t>
+      </w:r>
+      <w:r>
+        <w:t>t</w:t>
+      </w:r>
+      <w:r>
+        <w:t xml:space="preserve"> (up to 150 registers or 300 bytes) with multiple encodings</w:t>
+      </w:r>
+      <w:r>
+        <w:t xml:space="preserve">. </w:t>
+      </w:r>
+    </w:p>
+    <w:p>
+      <w:pPr>
+        <w:pStyle w:val="Lijstalinea"/>
+        <w:numPr>
+          <w:ilvl w:val="0"/>
+          <w:numId w:val="4"/>
+        </w:numPr>
+        <w:spacing w:after="60"/>
+        <w:ind w:left="1037" w:hanging="357"/>
+        <w:contextualSpacing w:val="0"/>
+        <w:rPr>
+          <w:rFonts w:hint="eastAsia"/>
+        </w:rPr>
+      </w:pPr>
+      <w:r>
+        <w:t>ModbusExport</w:t>
+      </w:r>
+      <w:r>
+        <w:t xml:space="preserve">: </w:t>
       </w:r>
       <w:r>
         <w:t xml:space="preserve">Now supports strings and includes a </w:t>
@@ -143,6 +303,37 @@
     </w:p>
     <w:p>
       <w:pPr>
+        <w:pStyle w:val="Lijstalinea"/>
+        <w:numPr>
+          <w:ilvl w:val="0"/>
+          <w:numId w:val="4"/>
+        </w:numPr>
+        <w:spacing w:after="60"/>
+        <w:ind w:left="1037" w:hanging="357"/>
+        <w:contextualSpacing w:val="0"/>
+        <w:rPr>
+          <w:rFonts w:hint="eastAsia"/>
+        </w:rPr>
+      </w:pPr>
+      <w:r>
+        <w:t xml:space="preserve">ModbusImport: </w:t>
+      </w:r>
+      <w:r>
+        <w:t xml:space="preserve">Now supports strings and includes a </w:t>
+      </w:r>
+      <w:r>
+        <w:rPr>
+          <w:i/>
+          <w:iCs/>
+        </w:rPr>
+        <w:t>Continue on error</w:t>
+      </w:r>
+      <w:r>
+        <w:t xml:space="preserve"> option.</w:t>
+      </w:r>
+    </w:p>
+    <w:p>
+      <w:pPr>
         <w:pStyle w:val="Kop3"/>
         <w:numPr>
           <w:ilvl w:val="0"/>
@@ -165,6 +356,34 @@
           <w:numId w:val="4"/>
         </w:numPr>
         <w:spacing w:after="60"/>
+        <w:ind w:left="1037" w:hanging="357"/>
+        <w:contextualSpacing w:val="0"/>
+        <w:rPr>
+          <w:rFonts w:hint="eastAsia"/>
+        </w:rPr>
+      </w:pPr>
+      <w:r>
+        <w:t>T</w:t>
+      </w:r>
+      <w:r>
+        <w:rPr>
+          <w:rFonts w:hint="eastAsia"/>
+        </w:rPr>
+        <w:t>h</w:t>
+      </w:r>
+      <w:r>
+        <w:t>e XSD validation schema now accepts uint32 enum values from 2,147,483,648 to 4,294,967,295.</w:t>
+      </w:r>
+    </w:p>
+    <w:p>
+      <w:pPr>
+        <w:pStyle w:val="Lijstalinea"/>
+        <w:numPr>
+          <w:ilvl w:val="0"/>
+          <w:numId w:val="4"/>
+        </w:numPr>
+        <w:spacing w:after="60"/>
+        <w:contextualSpacing w:val="0"/>
         <w:rPr>
           <w:rFonts w:hint="eastAsia"/>
         </w:rPr>
@@ -184,6 +403,8 @@
           <w:numId w:val="4"/>
         </w:numPr>
         <w:spacing w:after="60"/>
+        <w:ind w:left="1037" w:hanging="357"/>
+        <w:contextualSpacing w:val="0"/>
         <w:rPr>
           <w:rFonts w:hint="eastAsia"/>
         </w:rPr>
@@ -197,7 +418,40 @@
     </w:p>
     <w:p>
       <w:pPr>
-        <w:pStyle w:val="Lijstalinea"/>
+        <w:pStyle w:val="Kop1"/>
+        <w:rPr>
+          <w:rFonts w:hint="eastAsia"/>
+          <w:color w:val="auto"/>
+        </w:rPr>
+      </w:pPr>
+      <w:r>
+        <w:t>v2.0.</w:t>
+      </w:r>
+      <w:r>
+        <w:rPr>
+          <w:color w:val="auto"/>
+        </w:rPr>
+        <w:t>20 – 2025-10-11</w:t>
+      </w:r>
+    </w:p>
+    <w:p>
+      <w:pPr>
+        <w:pStyle w:val="Kop3"/>
+        <w:numPr>
+          <w:ilvl w:val="0"/>
+          <w:numId w:val="0"/>
+        </w:numPr>
+        <w:ind w:left="431" w:hanging="431"/>
+        <w:rPr>
+          <w:rFonts w:hint="eastAsia"/>
+        </w:rPr>
+      </w:pPr>
+      <w:r>
+        <w:t>Fixes</w:t>
+      </w:r>
+    </w:p>
+    <w:p>
+      <w:pPr>
         <w:numPr>
           <w:ilvl w:val="0"/>
           <w:numId w:val="4"/>
@@ -208,16 +462,7 @@
         </w:rPr>
       </w:pPr>
       <w:r>
-        <w:t>T</w:t>
-      </w:r>
-      <w:r>
-        <w:rPr>
-          <w:rFonts w:hint="eastAsia"/>
-        </w:rPr>
-        <w:t>h</w:t>
-      </w:r>
-      <w:r>
-        <w:t>e XSD validation schema now accepts uint32 enum values from 2,147,483,648 to 4,294,967,295.</w:t>
+        <w:t>Editing a register or bitfield value in the grid sometimes caused the old value to be written to the target instead of the new one.</w:t>
       </w:r>
     </w:p>
     <w:p>
@@ -235,7 +480,25 @@
         <w:rPr>
           <w:color w:val="auto"/>
         </w:rPr>
-        <w:t>20 – 2025-10-11</w:t>
+        <w:t>1</w:t>
+      </w:r>
+      <w:r>
+        <w:rPr>
+          <w:color w:val="auto"/>
+        </w:rPr>
+        <w:t xml:space="preserve">9 </w:t>
+      </w:r>
+      <w:r>
+        <w:rPr>
+          <w:color w:val="auto"/>
+        </w:rPr>
+        <w:t>– 2025-</w:t>
+      </w:r>
+      <w:r>
+        <w:rPr>
+          <w:color w:val="auto"/>
+        </w:rPr>
+        <w:t>09-24</w:t>
       </w:r>
     </w:p>
     <w:p>
@@ -266,7 +529,7 @@
         </w:rPr>
       </w:pPr>
       <w:r>
-        <w:t>Editing a register or bitfield value in the grid sometimes caused the old value to be written to the target instead of the new one.</w:t>
+        <w:t>Changing a register value by selecting a new value from the enumeration list no longer worked; this has been corrected.</w:t>
       </w:r>
     </w:p>
     <w:p>
@@ -278,73 +541,7 @@
         </w:rPr>
       </w:pPr>
       <w:r>
-        <w:t>v2.0.</w:t>
-      </w:r>
-      <w:r>
-        <w:rPr>
-          <w:color w:val="auto"/>
-        </w:rPr>
-        <w:t>1</w:t>
-      </w:r>
-      <w:r>
-        <w:rPr>
-          <w:color w:val="auto"/>
-        </w:rPr>
-        <w:t xml:space="preserve">9 </w:t>
-      </w:r>
-      <w:r>
-        <w:rPr>
-          <w:color w:val="auto"/>
-        </w:rPr>
-        <w:t>– 2025-</w:t>
-      </w:r>
-      <w:r>
-        <w:rPr>
-          <w:color w:val="auto"/>
-        </w:rPr>
-        <w:t>09-24</w:t>
-      </w:r>
-    </w:p>
-    <w:p>
-      <w:pPr>
-        <w:pStyle w:val="Kop3"/>
-        <w:numPr>
-          <w:ilvl w:val="0"/>
-          <w:numId w:val="0"/>
-        </w:numPr>
-        <w:ind w:left="431" w:hanging="431"/>
-        <w:rPr>
-          <w:rFonts w:hint="eastAsia"/>
-        </w:rPr>
-      </w:pPr>
-      <w:r>
-        <w:t>Fixes</w:t>
-      </w:r>
-    </w:p>
-    <w:p>
-      <w:pPr>
-        <w:numPr>
-          <w:ilvl w:val="0"/>
-          <w:numId w:val="4"/>
-        </w:numPr>
-        <w:spacing w:after="60"/>
-        <w:rPr>
-          <w:rFonts w:hint="eastAsia"/>
-        </w:rPr>
-      </w:pPr>
-      <w:r>
-        <w:t>Changing a register value by selecting a new value from the enumeration list no longer worked; this has been corrected.</w:t>
-      </w:r>
-    </w:p>
-    <w:p>
-      <w:pPr>
-        <w:pStyle w:val="Kop1"/>
-        <w:rPr>
-          <w:rFonts w:hint="eastAsia"/>
-          <w:color w:val="auto"/>
-        </w:rPr>
-      </w:pPr>
-      <w:r>
+        <w:lastRenderedPageBreak/>
         <w:t>v2.0.</w:t>
       </w:r>
       <w:r>
@@ -821,7 +1018,6 @@
         </w:rPr>
       </w:pPr>
       <w:r>
-        <w:lastRenderedPageBreak/>
         <w:t>v2.0.</w:t>
       </w:r>
       <w:r>
@@ -1105,12 +1301,14 @@
         <w:br/>
         <w:t>-</w:t>
       </w:r>
+      <w:proofErr w:type="spellStart"/>
       <w:r>
         <w:rPr>
           <w:rFonts w:hint="eastAsia"/>
         </w:rPr>
         <w:t>continueonerror</w:t>
       </w:r>
+      <w:proofErr w:type="spellEnd"/>
       <w:r>
         <w:t xml:space="preserve"> options.</w:t>
       </w:r>
@@ -1235,7 +1433,15 @@
         </w:rPr>
       </w:pPr>
       <w:r>
-        <w:t xml:space="preserve">When editing an enum value one could cause an exception with key sequences like: numlock on, </w:t>
+        <w:t xml:space="preserve">When editing an enum value one could cause an exception with key sequences like: </w:t>
+      </w:r>
+      <w:proofErr w:type="spellStart"/>
+      <w:r>
+        <w:t>numlock</w:t>
+      </w:r>
+      <w:proofErr w:type="spellEnd"/>
+      <w:r>
+        <w:t xml:space="preserve"> on, </w:t>
       </w:r>
       <w:r>
         <w:t>start</w:t>
@@ -1247,7 +1453,15 @@
         <w:t xml:space="preserve">press </w:t>
       </w:r>
       <w:r>
-        <w:t xml:space="preserve">backspace to erase all, numlock off, </w:t>
+        <w:t xml:space="preserve">backspace to erase all, </w:t>
+      </w:r>
+      <w:proofErr w:type="spellStart"/>
+      <w:r>
+        <w:t>numlock</w:t>
+      </w:r>
+      <w:proofErr w:type="spellEnd"/>
+      <w:r>
+        <w:t xml:space="preserve"> off, </w:t>
       </w:r>
       <w:r>
         <w:t xml:space="preserve">press </w:t>
@@ -1292,7 +1506,10 @@
         <w:t xml:space="preserve">ModbusImport.exe </w:t>
       </w:r>
       <w:r>
-        <w:t>end</w:t>
+        <w:t>a</w:t>
+      </w:r>
+      <w:r>
+        <w:t>nd</w:t>
       </w:r>
       <w:r>
         <w:rPr>
@@ -1301,22 +1518,16 @@
         <w:t xml:space="preserve"> ModbusExport.exe </w:t>
       </w:r>
       <w:r>
-        <w:t>now have the</w:t>
-      </w:r>
-      <w:r>
-        <w:rPr>
-          <w:rFonts w:hint="eastAsia"/>
-        </w:rPr>
-        <w:t xml:space="preserve"> "Prefer 32-bit" </w:t>
-      </w:r>
-      <w:r>
-        <w:t xml:space="preserve">build </w:t>
-      </w:r>
-      <w:r>
-        <w:t>o</w:t>
-      </w:r>
-      <w:r>
-        <w:t>ption disabled.</w:t>
+        <w:t xml:space="preserve">now </w:t>
+      </w:r>
+      <w:r>
+        <w:t>run as 64-bit application</w:t>
+      </w:r>
+      <w:r>
+        <w:t>s</w:t>
+      </w:r>
+      <w:r>
+        <w:t>.</w:t>
       </w:r>
     </w:p>
     <w:p>
@@ -1396,7 +1607,11 @@
         <w:t>with</w:t>
       </w:r>
       <w:r>
-        <w:t xml:space="preserve"> each parameter that had a command line override, instead of one </w:t>
+        <w:t xml:space="preserve"> each parameter that had a </w:t>
+      </w:r>
+      <w:r>
+        <w:lastRenderedPageBreak/>
+        <w:t xml:space="preserve">command line override, instead of one </w:t>
       </w:r>
       <w:r>
         <w:t>general</w:t>
@@ -1468,7 +1683,15 @@
         </w:rPr>
       </w:pPr>
       <w:r>
-        <w:t>Mbc file: &lt;exportorder&gt; element added.</w:t>
+        <w:t>Mbc file: &lt;</w:t>
+      </w:r>
+      <w:proofErr w:type="spellStart"/>
+      <w:r>
+        <w:t>exportorder</w:t>
+      </w:r>
+      <w:proofErr w:type="spellEnd"/>
+      <w:r>
+        <w:t>&gt; element added.</w:t>
       </w:r>
     </w:p>
     <w:p>
@@ -1567,12 +1790,14 @@
           <w:rFonts w:hint="eastAsia"/>
         </w:rPr>
       </w:pPr>
+      <w:proofErr w:type="spellStart"/>
       <w:r>
         <w:rPr>
           <w:rFonts w:hint="eastAsia"/>
         </w:rPr>
         <w:t>WriteHoldingregisterFC</w:t>
       </w:r>
+      <w:proofErr w:type="spellEnd"/>
       <w:r>
         <w:t xml:space="preserve"> </w:t>
       </w:r>
@@ -1727,7 +1952,21 @@
         <w:rPr>
           <w:rFonts w:hint="eastAsia"/>
         </w:rPr>
-        <w:t>Enum registers editing now has a dropdown combobox with possible values.</w:t>
+        <w:t xml:space="preserve">Enum registers editing now has a dropdown </w:t>
+      </w:r>
+      <w:proofErr w:type="spellStart"/>
+      <w:r>
+        <w:rPr>
+          <w:rFonts w:hint="eastAsia"/>
+        </w:rPr>
+        <w:t>combobox</w:t>
+      </w:r>
+      <w:proofErr w:type="spellEnd"/>
+      <w:r>
+        <w:rPr>
+          <w:rFonts w:hint="eastAsia"/>
+        </w:rPr>
+        <w:t xml:space="preserve"> with possible values.</w:t>
       </w:r>
     </w:p>
     <w:p>
@@ -1858,7 +2097,15 @@
         </w:rPr>
       </w:pPr>
       <w:r>
-        <w:t xml:space="preserve">In Import_file and Import_compare: writing/comparing a float32 </w:t>
+        <w:t xml:space="preserve">In Import_file and </w:t>
+      </w:r>
+      <w:proofErr w:type="spellStart"/>
+      <w:r>
+        <w:t>Import_compare</w:t>
+      </w:r>
+      <w:proofErr w:type="spellEnd"/>
+      <w:r>
+        <w:t xml:space="preserve">: writing/comparing a float32 </w:t>
       </w:r>
       <w:r>
         <w:t xml:space="preserve">value </w:t>
@@ -1961,7 +2208,35 @@
         <w:rPr>
           <w:rFonts w:hint="eastAsia"/>
         </w:rPr>
-        <w:t xml:space="preserve">You can now close the [Project_Configuration], [Save_project_file] and [About] </w:t>
+        <w:t>You can now close the [</w:t>
+      </w:r>
+      <w:proofErr w:type="spellStart"/>
+      <w:r>
+        <w:rPr>
+          <w:rFonts w:hint="eastAsia"/>
+        </w:rPr>
+        <w:t>Project_Configuration</w:t>
+      </w:r>
+      <w:proofErr w:type="spellEnd"/>
+      <w:r>
+        <w:rPr>
+          <w:rFonts w:hint="eastAsia"/>
+        </w:rPr>
+        <w:t>], [</w:t>
+      </w:r>
+      <w:proofErr w:type="spellStart"/>
+      <w:r>
+        <w:rPr>
+          <w:rFonts w:hint="eastAsia"/>
+        </w:rPr>
+        <w:t>Save_project_file</w:t>
+      </w:r>
+      <w:proofErr w:type="spellEnd"/>
+      <w:r>
+        <w:rPr>
+          <w:rFonts w:hint="eastAsia"/>
+        </w:rPr>
+        <w:t xml:space="preserve">] and [About] </w:t>
       </w:r>
       <w:r>
         <w:t>windows</w:t>
@@ -2045,7 +2320,21 @@
         <w:rPr>
           <w:rFonts w:hint="eastAsia"/>
         </w:rPr>
-        <w:t>With Import_file and Import_compare: writing/compar</w:t>
+        <w:t xml:space="preserve">With Import_file and </w:t>
+      </w:r>
+      <w:proofErr w:type="spellStart"/>
+      <w:r>
+        <w:rPr>
+          <w:rFonts w:hint="eastAsia"/>
+        </w:rPr>
+        <w:t>Import_compare</w:t>
+      </w:r>
+      <w:proofErr w:type="spellEnd"/>
+      <w:r>
+        <w:rPr>
+          <w:rFonts w:hint="eastAsia"/>
+        </w:rPr>
+        <w:t>: writing/compar</w:t>
       </w:r>
       <w:r>
         <w:t>ing</w:t>
@@ -2237,7 +2526,16 @@
         </w:rPr>
       </w:pPr>
       <w:r>
-        <w:t xml:space="preserve">Mbc project file: &lt;longdescr&gt; </w:t>
+        <w:lastRenderedPageBreak/>
+        <w:t>Mbc project file: &lt;</w:t>
+      </w:r>
+      <w:proofErr w:type="spellStart"/>
+      <w:r>
+        <w:t>longdescr</w:t>
+      </w:r>
+      <w:proofErr w:type="spellEnd"/>
+      <w:r>
+        <w:t xml:space="preserve">&gt; </w:t>
       </w:r>
       <w:r>
         <w:t xml:space="preserve">element </w:t>
@@ -2246,8 +2544,13 @@
         <w:t xml:space="preserve">added. </w:t>
       </w:r>
       <w:r>
-        <w:t>Adds a long multiline text that is show when the mouse is hoovered over the register decription</w:t>
-      </w:r>
+        <w:t xml:space="preserve">Adds a long multiline text that is show when the mouse is hoovered over the register </w:t>
+      </w:r>
+      <w:proofErr w:type="spellStart"/>
+      <w:r>
+        <w:t>decription</w:t>
+      </w:r>
+      <w:proofErr w:type="spellEnd"/>
       <w:r>
         <w:t>.</w:t>
       </w:r>
@@ -2452,8 +2755,15 @@
         </w:rPr>
       </w:pPr>
       <w:r>
-        <w:lastRenderedPageBreak/>
-        <w:t xml:space="preserve">The properties of a register (rw, int32, ...) are now displayed in a separate </w:t>
+        <w:t>The properties of a register (</w:t>
+      </w:r>
+      <w:proofErr w:type="spellStart"/>
+      <w:r>
+        <w:t>rw</w:t>
+      </w:r>
+      <w:proofErr w:type="spellEnd"/>
+      <w:r>
+        <w:t xml:space="preserve">, int32, ...) are now displayed in a separate </w:t>
       </w:r>
       <w:r>
         <w:t>[</w:t>
@@ -2645,9 +2955,6 @@
           <w:numId w:val="5"/>
         </w:numPr>
         <w:spacing w:after="60"/>
-        <w:rPr>
-          <w:rFonts w:hint="eastAsia"/>
-        </w:rPr>
       </w:pPr>
       <w:r>
         <w:t>R</w:t>
@@ -2666,6 +2973,21 @@
       </w:r>
       <w:r>
         <w:t>better see which row you are working on.</w:t>
+      </w:r>
+    </w:p>
+    <w:p>
+      <w:pPr>
+        <w:numPr>
+          <w:ilvl w:val="0"/>
+          <w:numId w:val="5"/>
+        </w:numPr>
+        <w:spacing w:after="60"/>
+        <w:rPr>
+          <w:rFonts w:hint="eastAsia"/>
+        </w:rPr>
+      </w:pPr>
+      <w:r>
+        <w:t>ModbusControl now runs as a 64-bit application.</w:t>
       </w:r>
     </w:p>
     <w:p>
@@ -2827,7 +3149,19 @@
         </w:rPr>
       </w:pPr>
       <w:r>
-        <w:t>If you start ModbusControl by double-clicking an mbc file and the file points to a non-existent COM port, the error dialog "Error opening serial port COMx" now appears after the ModbusControl program appears.</w:t>
+        <w:t>If you start ModbusControl by double-clicking an mbc file and the file points to a non-</w:t>
+      </w:r>
+      <w:r>
+        <w:lastRenderedPageBreak/>
+        <w:t xml:space="preserve">existent COM port, the error dialog "Error opening serial port </w:t>
+      </w:r>
+      <w:proofErr w:type="spellStart"/>
+      <w:r>
+        <w:t>COMx</w:t>
+      </w:r>
+      <w:proofErr w:type="spellEnd"/>
+      <w:r>
+        <w:t>" now appears after the ModbusControl program appears.</w:t>
       </w:r>
     </w:p>
     <w:p>
@@ -2902,7 +3236,23 @@
         <w:t xml:space="preserve">file is automatically </w:t>
       </w:r>
       <w:r>
-        <w:t xml:space="preserve">moved from &lt;mydocuments&gt;\ModbusControl to %AppData%\Roaming\E.D.&amp;A\ModbusControl. Content from old is not migrated. Old </w:t>
+        <w:t>moved from &lt;</w:t>
+      </w:r>
+      <w:proofErr w:type="spellStart"/>
+      <w:r>
+        <w:t>mydocuments</w:t>
+      </w:r>
+      <w:proofErr w:type="spellEnd"/>
+      <w:r>
+        <w:t>&gt;\ModbusControl to %</w:t>
+      </w:r>
+      <w:proofErr w:type="spellStart"/>
+      <w:r>
+        <w:t>AppData</w:t>
+      </w:r>
+      <w:proofErr w:type="spellEnd"/>
+      <w:r>
+        <w:t xml:space="preserve">%\Roaming\E.D.&amp;A\ModbusControl. Content from old is not migrated. Old </w:t>
       </w:r>
       <w:r>
         <w:t>file</w:t>
@@ -3475,6 +3825,7 @@
         </w:rPr>
       </w:pPr>
       <w:r>
+        <w:lastRenderedPageBreak/>
         <w:t xml:space="preserve">Now </w:t>
       </w:r>
       <w:r>
@@ -3912,8 +4263,13 @@
           <w:rFonts w:hint="eastAsia"/>
         </w:rPr>
       </w:pPr>
-      <w:r>
-        <w:t>WriteHoldingregFunctionCode now also supports 'auto'.</w:t>
+      <w:proofErr w:type="spellStart"/>
+      <w:r>
+        <w:t>WriteHoldingregFunctionCode</w:t>
+      </w:r>
+      <w:proofErr w:type="spellEnd"/>
+      <w:r>
+        <w:t xml:space="preserve"> now also supports 'auto'.</w:t>
       </w:r>
     </w:p>
     <w:p>
@@ -4523,7 +4879,7 @@
   <w:abstractNum w:abstractNumId="3" w15:restartNumberingAfterBreak="0">
     <w:nsid w:val="053C7476"/>
     <w:multiLevelType w:val="hybridMultilevel"/>
-    <w:tmpl w:val="0AEA2878"/>
+    <w:tmpl w:val="E3E8CEA6"/>
     <w:lvl w:ilvl="0" w:tplc="08130001">
       <w:start w:val="1"/>
       <w:numFmt w:val="bullet"/>
@@ -5990,6 +6346,118 @@
     </w:lvl>
   </w:abstractNum>
   <w:abstractNum w:abstractNumId="16" w15:restartNumberingAfterBreak="0">
+    <w:nsid w:val="438507EF"/>
+    <w:multiLevelType w:val="hybridMultilevel"/>
+    <w:tmpl w:val="D6A2BF18"/>
+    <w:lvl w:ilvl="0" w:tplc="36F0E154">
+      <w:numFmt w:val="bullet"/>
+      <w:lvlText w:val=""/>
+      <w:lvlJc w:val="left"/>
+      <w:pPr>
+        <w:ind w:left="720" w:hanging="360"/>
+      </w:pPr>
+      <w:rPr>
+        <w:rFonts w:ascii="Wingdings" w:eastAsiaTheme="minorHAnsi" w:hAnsi="Wingdings" w:cstheme="minorBidi" w:hint="default"/>
+      </w:rPr>
+    </w:lvl>
+    <w:lvl w:ilvl="1" w:tplc="08130003" w:tentative="1">
+      <w:start w:val="1"/>
+      <w:numFmt w:val="bullet"/>
+      <w:lvlText w:val="o"/>
+      <w:lvlJc w:val="left"/>
+      <w:pPr>
+        <w:ind w:left="1440" w:hanging="360"/>
+      </w:pPr>
+      <w:rPr>
+        <w:rFonts w:ascii="Courier New" w:hAnsi="Courier New" w:cs="Courier New" w:hint="default"/>
+      </w:rPr>
+    </w:lvl>
+    <w:lvl w:ilvl="2" w:tplc="08130005" w:tentative="1">
+      <w:start w:val="1"/>
+      <w:numFmt w:val="bullet"/>
+      <w:lvlText w:val=""/>
+      <w:lvlJc w:val="left"/>
+      <w:pPr>
+        <w:ind w:left="2160" w:hanging="360"/>
+      </w:pPr>
+      <w:rPr>
+        <w:rFonts w:ascii="Wingdings" w:hAnsi="Wingdings" w:hint="default"/>
+      </w:rPr>
+    </w:lvl>
+    <w:lvl w:ilvl="3" w:tplc="08130001" w:tentative="1">
+      <w:start w:val="1"/>
+      <w:numFmt w:val="bullet"/>
+      <w:lvlText w:val=""/>
+      <w:lvlJc w:val="left"/>
+      <w:pPr>
+        <w:ind w:left="2880" w:hanging="360"/>
+      </w:pPr>
+      <w:rPr>
+        <w:rFonts w:ascii="Symbol" w:hAnsi="Symbol" w:hint="default"/>
+      </w:rPr>
+    </w:lvl>
+    <w:lvl w:ilvl="4" w:tplc="08130003" w:tentative="1">
+      <w:start w:val="1"/>
+      <w:numFmt w:val="bullet"/>
+      <w:lvlText w:val="o"/>
+      <w:lvlJc w:val="left"/>
+      <w:pPr>
+        <w:ind w:left="3600" w:hanging="360"/>
+      </w:pPr>
+      <w:rPr>
+        <w:rFonts w:ascii="Courier New" w:hAnsi="Courier New" w:cs="Courier New" w:hint="default"/>
+      </w:rPr>
+    </w:lvl>
+    <w:lvl w:ilvl="5" w:tplc="08130005" w:tentative="1">
+      <w:start w:val="1"/>
+      <w:numFmt w:val="bullet"/>
+      <w:lvlText w:val=""/>
+      <w:lvlJc w:val="left"/>
+      <w:pPr>
+        <w:ind w:left="4320" w:hanging="360"/>
+      </w:pPr>
+      <w:rPr>
+        <w:rFonts w:ascii="Wingdings" w:hAnsi="Wingdings" w:hint="default"/>
+      </w:rPr>
+    </w:lvl>
+    <w:lvl w:ilvl="6" w:tplc="08130001" w:tentative="1">
+      <w:start w:val="1"/>
+      <w:numFmt w:val="bullet"/>
+      <w:lvlText w:val=""/>
+      <w:lvlJc w:val="left"/>
+      <w:pPr>
+        <w:ind w:left="5040" w:hanging="360"/>
+      </w:pPr>
+      <w:rPr>
+        <w:rFonts w:ascii="Symbol" w:hAnsi="Symbol" w:hint="default"/>
+      </w:rPr>
+    </w:lvl>
+    <w:lvl w:ilvl="7" w:tplc="08130003" w:tentative="1">
+      <w:start w:val="1"/>
+      <w:numFmt w:val="bullet"/>
+      <w:lvlText w:val="o"/>
+      <w:lvlJc w:val="left"/>
+      <w:pPr>
+        <w:ind w:left="5760" w:hanging="360"/>
+      </w:pPr>
+      <w:rPr>
+        <w:rFonts w:ascii="Courier New" w:hAnsi="Courier New" w:cs="Courier New" w:hint="default"/>
+      </w:rPr>
+    </w:lvl>
+    <w:lvl w:ilvl="8" w:tplc="08130005" w:tentative="1">
+      <w:start w:val="1"/>
+      <w:numFmt w:val="bullet"/>
+      <w:lvlText w:val=""/>
+      <w:lvlJc w:val="left"/>
+      <w:pPr>
+        <w:ind w:left="6480" w:hanging="360"/>
+      </w:pPr>
+      <w:rPr>
+        <w:rFonts w:ascii="Wingdings" w:hAnsi="Wingdings" w:hint="default"/>
+      </w:rPr>
+    </w:lvl>
+  </w:abstractNum>
+  <w:abstractNum w:abstractNumId="17" w15:restartNumberingAfterBreak="0">
     <w:nsid w:val="459F1CE5"/>
     <w:multiLevelType w:val="multilevel"/>
     <w:tmpl w:val="775A42D6"/>
@@ -6102,7 +6570,7 @@
       </w:pPr>
     </w:lvl>
   </w:abstractNum>
-  <w:abstractNum w:abstractNumId="17" w15:restartNumberingAfterBreak="0">
+  <w:abstractNum w:abstractNumId="18" w15:restartNumberingAfterBreak="0">
     <w:nsid w:val="4B820286"/>
     <w:multiLevelType w:val="hybridMultilevel"/>
     <w:tmpl w:val="1324B054"/>
@@ -6215,7 +6683,7 @@
       </w:rPr>
     </w:lvl>
   </w:abstractNum>
-  <w:abstractNum w:abstractNumId="18" w15:restartNumberingAfterBreak="0">
+  <w:abstractNum w:abstractNumId="19" w15:restartNumberingAfterBreak="0">
     <w:nsid w:val="4DAB5132"/>
     <w:multiLevelType w:val="hybridMultilevel"/>
     <w:tmpl w:val="C95C6250"/>
@@ -6328,7 +6796,7 @@
       </w:rPr>
     </w:lvl>
   </w:abstractNum>
-  <w:abstractNum w:abstractNumId="19" w15:restartNumberingAfterBreak="0">
+  <w:abstractNum w:abstractNumId="20" w15:restartNumberingAfterBreak="0">
     <w:nsid w:val="50FD3E19"/>
     <w:multiLevelType w:val="hybridMultilevel"/>
     <w:tmpl w:val="47EEFE78"/>
@@ -6441,7 +6909,7 @@
       </w:rPr>
     </w:lvl>
   </w:abstractNum>
-  <w:abstractNum w:abstractNumId="20" w15:restartNumberingAfterBreak="0">
+  <w:abstractNum w:abstractNumId="21" w15:restartNumberingAfterBreak="0">
     <w:nsid w:val="53A40602"/>
     <w:multiLevelType w:val="multilevel"/>
     <w:tmpl w:val="60DEAE1A"/>
@@ -6554,7 +7022,7 @@
       </w:pPr>
     </w:lvl>
   </w:abstractNum>
-  <w:abstractNum w:abstractNumId="21" w15:restartNumberingAfterBreak="0">
+  <w:abstractNum w:abstractNumId="22" w15:restartNumberingAfterBreak="0">
     <w:nsid w:val="5A94222A"/>
     <w:multiLevelType w:val="hybridMultilevel"/>
     <w:tmpl w:val="B1FA5430"/>
@@ -6667,7 +7135,7 @@
       </w:rPr>
     </w:lvl>
   </w:abstractNum>
-  <w:abstractNum w:abstractNumId="22" w15:restartNumberingAfterBreak="0">
+  <w:abstractNum w:abstractNumId="23" w15:restartNumberingAfterBreak="0">
     <w:nsid w:val="647F23D0"/>
     <w:multiLevelType w:val="hybridMultilevel"/>
     <w:tmpl w:val="1B0841BE"/>
@@ -6780,7 +7248,7 @@
       </w:rPr>
     </w:lvl>
   </w:abstractNum>
-  <w:abstractNum w:abstractNumId="23" w15:restartNumberingAfterBreak="0">
+  <w:abstractNum w:abstractNumId="24" w15:restartNumberingAfterBreak="0">
     <w:nsid w:val="6AA20832"/>
     <w:multiLevelType w:val="hybridMultilevel"/>
     <w:tmpl w:val="30EE7E26"/>
@@ -6893,7 +7361,7 @@
       </w:rPr>
     </w:lvl>
   </w:abstractNum>
-  <w:abstractNum w:abstractNumId="24" w15:restartNumberingAfterBreak="0">
+  <w:abstractNum w:abstractNumId="25" w15:restartNumberingAfterBreak="0">
     <w:nsid w:val="6CCB7390"/>
     <w:multiLevelType w:val="multilevel"/>
     <w:tmpl w:val="6AB4E778"/>
@@ -7006,7 +7474,7 @@
       </w:pPr>
     </w:lvl>
   </w:abstractNum>
-  <w:abstractNum w:abstractNumId="25" w15:restartNumberingAfterBreak="0">
+  <w:abstractNum w:abstractNumId="26" w15:restartNumberingAfterBreak="0">
     <w:nsid w:val="6D8607B7"/>
     <w:multiLevelType w:val="hybridMultilevel"/>
     <w:tmpl w:val="58DC4C56"/>
@@ -7135,13 +7603,13 @@
     <w:abstractNumId w:val="10"/>
   </w:num>
   <w:num w:numId="6" w16cid:durableId="1755054948">
-    <w:abstractNumId w:val="17"/>
+    <w:abstractNumId w:val="18"/>
   </w:num>
   <w:num w:numId="7" w16cid:durableId="1495103662">
-    <w:abstractNumId w:val="25"/>
+    <w:abstractNumId w:val="26"/>
   </w:num>
   <w:num w:numId="8" w16cid:durableId="1462646248">
-    <w:abstractNumId w:val="18"/>
+    <w:abstractNumId w:val="19"/>
   </w:num>
   <w:num w:numId="9" w16cid:durableId="983697945">
     <w:abstractNumId w:val="5"/>
@@ -7150,16 +7618,16 @@
     <w:abstractNumId w:val="9"/>
   </w:num>
   <w:num w:numId="11" w16cid:durableId="1320037534">
-    <w:abstractNumId w:val="22"/>
+    <w:abstractNumId w:val="23"/>
   </w:num>
   <w:num w:numId="12" w16cid:durableId="872156676">
-    <w:abstractNumId w:val="19"/>
+    <w:abstractNumId w:val="20"/>
   </w:num>
   <w:num w:numId="13" w16cid:durableId="1717775439">
     <w:abstractNumId w:val="4"/>
   </w:num>
   <w:num w:numId="14" w16cid:durableId="74326497">
-    <w:abstractNumId w:val="21"/>
+    <w:abstractNumId w:val="22"/>
   </w:num>
   <w:num w:numId="15" w16cid:durableId="1591430736">
     <w:abstractNumId w:val="11"/>
@@ -7219,10 +7687,10 @@
     <w:abstractNumId w:val="0"/>
   </w:num>
   <w:num w:numId="25" w16cid:durableId="1189492468">
-    <w:abstractNumId w:val="24"/>
+    <w:abstractNumId w:val="25"/>
   </w:num>
   <w:num w:numId="26" w16cid:durableId="1756589439">
-    <w:abstractNumId w:val="24"/>
+    <w:abstractNumId w:val="25"/>
     <w:lvlOverride w:ilvl="0">
       <w:startOverride w:val="1"/>
     </w:lvlOverride>
@@ -7252,10 +7720,10 @@
     </w:lvlOverride>
   </w:num>
   <w:num w:numId="27" w16cid:durableId="1196121013">
-    <w:abstractNumId w:val="20"/>
+    <w:abstractNumId w:val="21"/>
   </w:num>
   <w:num w:numId="28" w16cid:durableId="1800300798">
-    <w:abstractNumId w:val="20"/>
+    <w:abstractNumId w:val="21"/>
     <w:lvlOverride w:ilvl="0">
       <w:startOverride w:val="1"/>
     </w:lvlOverride>
@@ -7285,10 +7753,10 @@
     </w:lvlOverride>
   </w:num>
   <w:num w:numId="29" w16cid:durableId="839546102">
-    <w:abstractNumId w:val="16"/>
+    <w:abstractNumId w:val="17"/>
   </w:num>
   <w:num w:numId="30" w16cid:durableId="1203514801">
-    <w:abstractNumId w:val="16"/>
+    <w:abstractNumId w:val="17"/>
     <w:lvlOverride w:ilvl="0">
       <w:startOverride w:val="1"/>
     </w:lvlOverride>
@@ -7318,10 +7786,13 @@
     </w:lvlOverride>
   </w:num>
   <w:num w:numId="31" w16cid:durableId="1179849848">
-    <w:abstractNumId w:val="23"/>
+    <w:abstractNumId w:val="24"/>
   </w:num>
   <w:num w:numId="32" w16cid:durableId="2059432574">
     <w:abstractNumId w:val="7"/>
+  </w:num>
+  <w:num w:numId="33" w16cid:durableId="980235527">
+    <w:abstractNumId w:val="16"/>
   </w:num>
 </w:numbering>
 </file>

</xml_diff>

<commit_message>
When an invalid value is entered in the grid, the error message now stays visible longer instead of disappearing on the next poll.
git-svn-id: http://visualsvn.edna.local/EDNA/ModbusControl/V2@4924 03c8d257-35a7-c645-9f01-50f27e98b9e6
</commit_message>
<xml_diff>
--- a/Manuals/ModbusControl - Release notes.docx
+++ b/Manuals/ModbusControl - Release notes.docx
@@ -109,9 +109,6 @@
         <w:spacing w:after="60"/>
         <w:ind w:left="1037" w:hanging="357"/>
         <w:contextualSpacing w:val="0"/>
-        <w:rPr>
-          <w:rFonts w:hint="eastAsia"/>
-        </w:rPr>
       </w:pPr>
       <w:r>
         <w:t xml:space="preserve">Pressing </w:t>
@@ -134,7 +131,59 @@
         <w:t>Value</w:t>
       </w:r>
       <w:r>
-        <w:t xml:space="preserve"> column now copies only the value string instead of the entire row. Likewise, when copying while editing a value, only the value itself is copied.</w:t>
+        <w:t xml:space="preserve"> column now copies only the value string </w:t>
+      </w:r>
+      <w:r>
+        <w:t xml:space="preserve">to the clipboard </w:t>
+      </w:r>
+      <w:r>
+        <w:t xml:space="preserve">instead of </w:t>
+      </w:r>
+      <w:r>
+        <w:t>all</w:t>
+      </w:r>
+      <w:r>
+        <w:t xml:space="preserve"> row</w:t>
+      </w:r>
+      <w:r>
+        <w:t xml:space="preserve"> data</w:t>
+      </w:r>
+      <w:r>
+        <w:t xml:space="preserve">. </w:t>
+      </w:r>
+      <w:r>
+        <w:t>T</w:t>
+      </w:r>
+      <w:r>
+        <w:rPr>
+          <w:rFonts w:hint="eastAsia"/>
+        </w:rPr>
+        <w:t>h</w:t>
+      </w:r>
+      <w:r>
+        <w:t>e same applies</w:t>
+      </w:r>
+      <w:r>
+        <w:t xml:space="preserve"> when </w:t>
+      </w:r>
+      <w:r>
+        <w:t>p</w:t>
+      </w:r>
+      <w:r>
+        <w:t xml:space="preserve">ressing </w:t>
+      </w:r>
+      <w:r>
+        <w:rPr>
+          <w:b/>
+          <w:bCs/>
+        </w:rPr>
+        <w:t>Ctrl + C</w:t>
+      </w:r>
+      <w:r>
+        <w:t xml:space="preserve"> </w:t>
+      </w:r>
+      <w:r>
+        <w:t>while editing a value.</w:t>
       </w:r>
     </w:p>
     <w:p>
@@ -149,31 +198,13 @@
         <w:contextualSpacing w:val="0"/>
       </w:pPr>
       <w:r>
-        <w:t>The installer now install</w:t>
-      </w:r>
-      <w:r>
-        <w:t>s</w:t>
-      </w:r>
-      <w:r>
-        <w:t xml:space="preserve"> this application in “</w:t>
-      </w:r>
-      <w:r>
-        <w:rPr>
-          <w:rFonts w:hint="eastAsia"/>
-        </w:rPr>
-        <w:t xml:space="preserve">C:\Program Files\ModbusControl" </w:t>
-      </w:r>
-      <w:r>
-        <w:t xml:space="preserve">directory instead of in </w:t>
-      </w:r>
-      <w:r>
-        <w:rPr>
-          <w:rFonts w:hint="eastAsia"/>
-        </w:rPr>
-        <w:t>"C:\Program Files (x86)\E.D.&amp;A\ModbusControl"</w:t>
-      </w:r>
-      <w:r>
-        <w:t>.</w:t>
+        <w:t xml:space="preserve">When an invalid value is entered in the grid, the error message now remains visible longer and </w:t>
+      </w:r>
+      <w:r>
+        <w:t xml:space="preserve">does not </w:t>
+      </w:r>
+      <w:r>
+        <w:t>disappear on the next poll.</w:t>
       </w:r>
     </w:p>
     <w:p>
@@ -191,7 +222,70 @@
         </w:rPr>
       </w:pPr>
       <w:r>
-        <w:t xml:space="preserve">The Updater: </w:t>
+        <w:t>The installer now install</w:t>
+      </w:r>
+      <w:r>
+        <w:t>s</w:t>
+      </w:r>
+      <w:r>
+        <w:t xml:space="preserve"> this application in </w:t>
+      </w:r>
+      <w:r>
+        <w:t>the “</w:t>
+      </w:r>
+      <w:r>
+        <w:rPr>
+          <w:rFonts w:hint="eastAsia"/>
+        </w:rPr>
+        <w:t>C:\Program Files\ModbusControl</w:t>
+      </w:r>
+      <w:r>
+        <w:t>”</w:t>
+      </w:r>
+      <w:r>
+        <w:rPr>
+          <w:rFonts w:hint="eastAsia"/>
+        </w:rPr>
+        <w:t xml:space="preserve"> </w:t>
+      </w:r>
+      <w:r>
+        <w:t xml:space="preserve">directory instead of in </w:t>
+      </w:r>
+      <w:r>
+        <w:t>“</w:t>
+      </w:r>
+      <w:r>
+        <w:rPr>
+          <w:rFonts w:hint="eastAsia"/>
+        </w:rPr>
+        <w:t>C:\Program Files (x86)\E.D.&amp;A\ModbusControl</w:t>
+      </w:r>
+      <w:r>
+        <w:t xml:space="preserve">”, </w:t>
+      </w:r>
+      <w:r>
+        <w:t>reflecting that the application is a 64‑bit process.</w:t>
+      </w:r>
+    </w:p>
+    <w:p>
+      <w:pPr>
+        <w:pStyle w:val="Lijstalinea"/>
+        <w:numPr>
+          <w:ilvl w:val="0"/>
+          <w:numId w:val="4"/>
+        </w:numPr>
+        <w:spacing w:after="60"/>
+        <w:ind w:left="1037" w:hanging="357"/>
+        <w:contextualSpacing w:val="0"/>
+        <w:rPr>
+          <w:rFonts w:hint="eastAsia"/>
+        </w:rPr>
+      </w:pPr>
+      <w:r>
+        <w:t>U</w:t>
+      </w:r>
+      <w:r>
+        <w:t xml:space="preserve">pdater: </w:t>
       </w:r>
       <w:r>
         <w:t>Resolved an issue with Admin</w:t>
@@ -202,7 +296,16 @@
       </w:r>
       <w:r>
         <w:noBreakHyphen/>
-        <w:t>Request that caused a warning indicating that the Updater application was in use during the update.</w:t>
+        <w:t xml:space="preserve">Request that </w:t>
+      </w:r>
+      <w:r>
+        <w:t xml:space="preserve">prevented the Updater process from stopping before the update, which resulted in a warning that the </w:t>
+      </w:r>
+      <w:r>
+        <w:t>Updater file</w:t>
+      </w:r>
+      <w:r>
+        <w:t xml:space="preserve"> was still in use.</w:t>
       </w:r>
     </w:p>
     <w:p>
@@ -1521,13 +1624,7 @@
         <w:t xml:space="preserve">now </w:t>
       </w:r>
       <w:r>
-        <w:t>run as 64-bit application</w:t>
-      </w:r>
-      <w:r>
-        <w:t>s</w:t>
-      </w:r>
-      <w:r>
-        <w:t>.</w:t>
+        <w:t>run as 64-bit applications.</w:t>
       </w:r>
     </w:p>
     <w:p>
@@ -1764,6 +1861,8 @@
           <w:numId w:val="4"/>
         </w:numPr>
         <w:spacing w:after="60"/>
+        <w:ind w:left="1037" w:hanging="357"/>
+        <w:contextualSpacing w:val="0"/>
         <w:rPr>
           <w:rFonts w:hint="eastAsia"/>
         </w:rPr>
@@ -2955,6 +3054,9 @@
           <w:numId w:val="5"/>
         </w:numPr>
         <w:spacing w:after="60"/>
+        <w:rPr>
+          <w:rFonts w:hint="eastAsia"/>
+        </w:rPr>
       </w:pPr>
       <w:r>
         <w:t>R</w:t>
@@ -8267,7 +8369,6 @@
   <w:style w:type="character" w:default="1" w:styleId="Standaardalinea-lettertype">
     <w:name w:val="Default Paragraph Font"/>
     <w:uiPriority w:val="1"/>
-    <w:semiHidden/>
     <w:unhideWhenUsed/>
   </w:style>
   <w:style w:type="table" w:default="1" w:styleId="Standaardtabel">

</xml_diff>

<commit_message>
Manuals updated. Installer: now sets an icon ModbusControl app in the Windows control panel. Release v2.0.22.
git-svn-id: http://visualsvn.edna.local/EDNA/ModbusControl/V2@4925 03c8d257-35a7-c645-9f01-50f27e98b9e6
</commit_message>
<xml_diff>
--- a/Manuals/ModbusControl - Release notes.docx
+++ b/Manuals/ModbusControl - Release notes.docx
@@ -53,34 +53,7 @@
         <w:rPr>
           <w:color w:val="auto"/>
         </w:rPr>
-        <w:t>?????????</w:t>
-      </w:r>
-    </w:p>
-    <w:p>
-      <w:pPr>
-        <w:pStyle w:val="Kop3"/>
-        <w:rPr>
-          <w:rFonts w:hint="eastAsia"/>
-        </w:rPr>
-      </w:pPr>
-      <w:r>
-        <w:t>Features</w:t>
-      </w:r>
-    </w:p>
-    <w:p>
-      <w:pPr>
-        <w:pStyle w:val="Lijstalinea"/>
-        <w:numPr>
-          <w:ilvl w:val="0"/>
-          <w:numId w:val="4"/>
-        </w:numPr>
-        <w:spacing w:after="60"/>
-        <w:rPr>
-          <w:rFonts w:hint="eastAsia"/>
-        </w:rPr>
-      </w:pPr>
-      <w:r>
-        <w:t>?????</w:t>
+        <w:t>2026-02-27</w:t>
       </w:r>
     </w:p>
     <w:p>
@@ -109,6 +82,9 @@
         <w:spacing w:after="60"/>
         <w:ind w:left="1037" w:hanging="357"/>
         <w:contextualSpacing w:val="0"/>
+        <w:rPr>
+          <w:rFonts w:hint="eastAsia"/>
+        </w:rPr>
       </w:pPr>
       <w:r>
         <w:t xml:space="preserve">Pressing </w:t>
@@ -196,6 +172,9 @@
         <w:spacing w:after="60"/>
         <w:ind w:left="1037" w:hanging="357"/>
         <w:contextualSpacing w:val="0"/>
+        <w:rPr>
+          <w:rFonts w:hint="eastAsia"/>
+        </w:rPr>
       </w:pPr>
       <w:r>
         <w:t xml:space="preserve">When an invalid value is entered in the grid, the error message now remains visible longer and </w:t>
@@ -222,7 +201,10 @@
         </w:rPr>
       </w:pPr>
       <w:r>
-        <w:t>The installer now install</w:t>
+        <w:t xml:space="preserve">Installer: </w:t>
+      </w:r>
+      <w:r>
+        <w:t>now install</w:t>
       </w:r>
       <w:r>
         <w:t>s</w:t>
@@ -236,6 +218,8 @@
       <w:r>
         <w:rPr>
           <w:rFonts w:hint="eastAsia"/>
+          <w:i/>
+          <w:iCs/>
         </w:rPr>
         <w:t>C:\Program Files\ModbusControl</w:t>
       </w:r>
@@ -257,6 +241,8 @@
       <w:r>
         <w:rPr>
           <w:rFonts w:hint="eastAsia"/>
+          <w:i/>
+          <w:iCs/>
         </w:rPr>
         <w:t>C:\Program Files (x86)\E.D.&amp;A\ModbusControl</w:t>
       </w:r>
@@ -305,7 +291,10 @@
         <w:t>Updater file</w:t>
       </w:r>
       <w:r>
-        <w:t xml:space="preserve"> was still in use.</w:t>
+        <w:t xml:space="preserve"> was still in use</w:t>
+      </w:r>
+      <w:r>
+        <w:t xml:space="preserve"> during the update.</w:t>
       </w:r>
     </w:p>
     <w:p>
@@ -1404,14 +1393,12 @@
         <w:br/>
         <w:t>-</w:t>
       </w:r>
-      <w:proofErr w:type="spellStart"/>
       <w:r>
         <w:rPr>
           <w:rFonts w:hint="eastAsia"/>
         </w:rPr>
         <w:t>continueonerror</w:t>
       </w:r>
-      <w:proofErr w:type="spellEnd"/>
       <w:r>
         <w:t xml:space="preserve"> options.</w:t>
       </w:r>
@@ -1536,15 +1523,7 @@
         </w:rPr>
       </w:pPr>
       <w:r>
-        <w:t xml:space="preserve">When editing an enum value one could cause an exception with key sequences like: </w:t>
-      </w:r>
-      <w:proofErr w:type="spellStart"/>
-      <w:r>
-        <w:t>numlock</w:t>
-      </w:r>
-      <w:proofErr w:type="spellEnd"/>
-      <w:r>
-        <w:t xml:space="preserve"> on, </w:t>
+        <w:t xml:space="preserve">When editing an enum value one could cause an exception with key sequences like: numlock on, </w:t>
       </w:r>
       <w:r>
         <w:t>start</w:t>
@@ -1556,15 +1535,7 @@
         <w:t xml:space="preserve">press </w:t>
       </w:r>
       <w:r>
-        <w:t xml:space="preserve">backspace to erase all, </w:t>
-      </w:r>
-      <w:proofErr w:type="spellStart"/>
-      <w:r>
-        <w:t>numlock</w:t>
-      </w:r>
-      <w:proofErr w:type="spellEnd"/>
-      <w:r>
-        <w:t xml:space="preserve"> off, </w:t>
+        <w:t xml:space="preserve">backspace to erase all, numlock off, </w:t>
       </w:r>
       <w:r>
         <w:t xml:space="preserve">press </w:t>
@@ -1780,15 +1751,7 @@
         </w:rPr>
       </w:pPr>
       <w:r>
-        <w:t>Mbc file: &lt;</w:t>
-      </w:r>
-      <w:proofErr w:type="spellStart"/>
-      <w:r>
-        <w:t>exportorder</w:t>
-      </w:r>
-      <w:proofErr w:type="spellEnd"/>
-      <w:r>
-        <w:t>&gt; element added.</w:t>
+        <w:t>Mbc file: &lt;exportorder&gt; element added.</w:t>
       </w:r>
     </w:p>
     <w:p>
@@ -1889,14 +1852,12 @@
           <w:rFonts w:hint="eastAsia"/>
         </w:rPr>
       </w:pPr>
-      <w:proofErr w:type="spellStart"/>
       <w:r>
         <w:rPr>
           <w:rFonts w:hint="eastAsia"/>
         </w:rPr>
         <w:t>WriteHoldingregisterFC</w:t>
       </w:r>
-      <w:proofErr w:type="spellEnd"/>
       <w:r>
         <w:t xml:space="preserve"> </w:t>
       </w:r>
@@ -2051,21 +2012,7 @@
         <w:rPr>
           <w:rFonts w:hint="eastAsia"/>
         </w:rPr>
-        <w:t xml:space="preserve">Enum registers editing now has a dropdown </w:t>
-      </w:r>
-      <w:proofErr w:type="spellStart"/>
-      <w:r>
-        <w:rPr>
-          <w:rFonts w:hint="eastAsia"/>
-        </w:rPr>
-        <w:t>combobox</w:t>
-      </w:r>
-      <w:proofErr w:type="spellEnd"/>
-      <w:r>
-        <w:rPr>
-          <w:rFonts w:hint="eastAsia"/>
-        </w:rPr>
-        <w:t xml:space="preserve"> with possible values.</w:t>
+        <w:t>Enum registers editing now has a dropdown combobox with possible values.</w:t>
       </w:r>
     </w:p>
     <w:p>
@@ -2196,15 +2143,7 @@
         </w:rPr>
       </w:pPr>
       <w:r>
-        <w:t xml:space="preserve">In Import_file and </w:t>
-      </w:r>
-      <w:proofErr w:type="spellStart"/>
-      <w:r>
-        <w:t>Import_compare</w:t>
-      </w:r>
-      <w:proofErr w:type="spellEnd"/>
-      <w:r>
-        <w:t xml:space="preserve">: writing/comparing a float32 </w:t>
+        <w:t xml:space="preserve">In Import_file and Import_compare: writing/comparing a float32 </w:t>
       </w:r>
       <w:r>
         <w:t xml:space="preserve">value </w:t>
@@ -2307,35 +2246,7 @@
         <w:rPr>
           <w:rFonts w:hint="eastAsia"/>
         </w:rPr>
-        <w:t>You can now close the [</w:t>
-      </w:r>
-      <w:proofErr w:type="spellStart"/>
-      <w:r>
-        <w:rPr>
-          <w:rFonts w:hint="eastAsia"/>
-        </w:rPr>
-        <w:t>Project_Configuration</w:t>
-      </w:r>
-      <w:proofErr w:type="spellEnd"/>
-      <w:r>
-        <w:rPr>
-          <w:rFonts w:hint="eastAsia"/>
-        </w:rPr>
-        <w:t>], [</w:t>
-      </w:r>
-      <w:proofErr w:type="spellStart"/>
-      <w:r>
-        <w:rPr>
-          <w:rFonts w:hint="eastAsia"/>
-        </w:rPr>
-        <w:t>Save_project_file</w:t>
-      </w:r>
-      <w:proofErr w:type="spellEnd"/>
-      <w:r>
-        <w:rPr>
-          <w:rFonts w:hint="eastAsia"/>
-        </w:rPr>
-        <w:t xml:space="preserve">] and [About] </w:t>
+        <w:t xml:space="preserve">You can now close the [Project_Configuration], [Save_project_file] and [About] </w:t>
       </w:r>
       <w:r>
         <w:t>windows</w:t>
@@ -2419,21 +2330,7 @@
         <w:rPr>
           <w:rFonts w:hint="eastAsia"/>
         </w:rPr>
-        <w:t xml:space="preserve">With Import_file and </w:t>
-      </w:r>
-      <w:proofErr w:type="spellStart"/>
-      <w:r>
-        <w:rPr>
-          <w:rFonts w:hint="eastAsia"/>
-        </w:rPr>
-        <w:t>Import_compare</w:t>
-      </w:r>
-      <w:proofErr w:type="spellEnd"/>
-      <w:r>
-        <w:rPr>
-          <w:rFonts w:hint="eastAsia"/>
-        </w:rPr>
-        <w:t>: writing/compar</w:t>
+        <w:t>With Import_file and Import_compare: writing/compar</w:t>
       </w:r>
       <w:r>
         <w:t>ing</w:t>
@@ -2626,15 +2523,7 @@
       </w:pPr>
       <w:r>
         <w:lastRenderedPageBreak/>
-        <w:t>Mbc project file: &lt;</w:t>
-      </w:r>
-      <w:proofErr w:type="spellStart"/>
-      <w:r>
-        <w:t>longdescr</w:t>
-      </w:r>
-      <w:proofErr w:type="spellEnd"/>
-      <w:r>
-        <w:t xml:space="preserve">&gt; </w:t>
+        <w:t xml:space="preserve">Mbc project file: &lt;longdescr&gt; </w:t>
       </w:r>
       <w:r>
         <w:t xml:space="preserve">element </w:t>
@@ -2643,13 +2532,8 @@
         <w:t xml:space="preserve">added. </w:t>
       </w:r>
       <w:r>
-        <w:t xml:space="preserve">Adds a long multiline text that is show when the mouse is hoovered over the register </w:t>
-      </w:r>
-      <w:proofErr w:type="spellStart"/>
-      <w:r>
-        <w:t>decription</w:t>
-      </w:r>
-      <w:proofErr w:type="spellEnd"/>
+        <w:t>Adds a long multiline text that is show when the mouse is hoovered over the register decription</w:t>
+      </w:r>
       <w:r>
         <w:t>.</w:t>
       </w:r>
@@ -2854,15 +2738,7 @@
         </w:rPr>
       </w:pPr>
       <w:r>
-        <w:t>The properties of a register (</w:t>
-      </w:r>
-      <w:proofErr w:type="spellStart"/>
-      <w:r>
-        <w:t>rw</w:t>
-      </w:r>
-      <w:proofErr w:type="spellEnd"/>
-      <w:r>
-        <w:t xml:space="preserve">, int32, ...) are now displayed in a separate </w:t>
+        <w:t xml:space="preserve">The properties of a register (rw, int32, ...) are now displayed in a separate </w:t>
       </w:r>
       <w:r>
         <w:t>[</w:t>
@@ -3255,15 +3131,7 @@
       </w:r>
       <w:r>
         <w:lastRenderedPageBreak/>
-        <w:t xml:space="preserve">existent COM port, the error dialog "Error opening serial port </w:t>
-      </w:r>
-      <w:proofErr w:type="spellStart"/>
-      <w:r>
-        <w:t>COMx</w:t>
-      </w:r>
-      <w:proofErr w:type="spellEnd"/>
-      <w:r>
-        <w:t>" now appears after the ModbusControl program appears.</w:t>
+        <w:t>existent COM port, the error dialog "Error opening serial port COMx" now appears after the ModbusControl program appears.</w:t>
       </w:r>
     </w:p>
     <w:p>
@@ -3338,23 +3206,7 @@
         <w:t xml:space="preserve">file is automatically </w:t>
       </w:r>
       <w:r>
-        <w:t>moved from &lt;</w:t>
-      </w:r>
-      <w:proofErr w:type="spellStart"/>
-      <w:r>
-        <w:t>mydocuments</w:t>
-      </w:r>
-      <w:proofErr w:type="spellEnd"/>
-      <w:r>
-        <w:t>&gt;\ModbusControl to %</w:t>
-      </w:r>
-      <w:proofErr w:type="spellStart"/>
-      <w:r>
-        <w:t>AppData</w:t>
-      </w:r>
-      <w:proofErr w:type="spellEnd"/>
-      <w:r>
-        <w:t xml:space="preserve">%\Roaming\E.D.&amp;A\ModbusControl. Content from old is not migrated. Old </w:t>
+        <w:t xml:space="preserve">moved from &lt;mydocuments&gt;\ModbusControl to %AppData%\Roaming\E.D.&amp;A\ModbusControl. Content from old is not migrated. Old </w:t>
       </w:r>
       <w:r>
         <w:t>file</w:t>
@@ -4365,13 +4217,8 @@
           <w:rFonts w:hint="eastAsia"/>
         </w:rPr>
       </w:pPr>
-      <w:proofErr w:type="spellStart"/>
-      <w:r>
-        <w:t>WriteHoldingregFunctionCode</w:t>
-      </w:r>
-      <w:proofErr w:type="spellEnd"/>
-      <w:r>
-        <w:t xml:space="preserve"> now also supports 'auto'.</w:t>
+      <w:r>
+        <w:t>WriteHoldingregFunctionCode now also supports 'auto'.</w:t>
       </w:r>
     </w:p>
     <w:p>
@@ -8369,6 +8216,7 @@
   <w:style w:type="character" w:default="1" w:styleId="Standaardalinea-lettertype">
     <w:name w:val="Default Paragraph Font"/>
     <w:uiPriority w:val="1"/>
+    <w:semiHidden/>
     <w:unhideWhenUsed/>
   </w:style>
   <w:style w:type="table" w:default="1" w:styleId="Standaardtabel">

</xml_diff>

<commit_message>
Logging: with standard DataGridView in virtual mode instead of dependency on SourceGrid.dll. Now quickly takes a snapshot of the logging when copying to clipboard or CSV file. When copying to clipboard or CSV file, a header with the fields is added. Default logging settings are now with LogReads and LogWrites on.
git-svn-id: http://visualsvn.edna.local/EDNA/ModbusControl/V2@4926 03c8d257-35a7-c645-9f01-50f27e98b9e6
</commit_message>
<xml_diff>
--- a/Manuals/ModbusControl - Release notes.docx
+++ b/Manuals/ModbusControl - Release notes.docx
@@ -35,25 +35,7 @@
         <w:rPr>
           <w:color w:val="auto"/>
         </w:rPr>
-        <w:t>2</w:t>
-      </w:r>
-      <w:r>
-        <w:rPr>
-          <w:color w:val="auto"/>
-        </w:rPr>
-        <w:t>2</w:t>
-      </w:r>
-      <w:r>
-        <w:rPr>
-          <w:color w:val="auto"/>
-        </w:rPr>
-        <w:t xml:space="preserve"> – </w:t>
-      </w:r>
-      <w:r>
-        <w:rPr>
-          <w:color w:val="auto"/>
-        </w:rPr>
-        <w:t>2026-02-27</w:t>
+        <w:t>23</w:t>
       </w:r>
     </w:p>
     <w:p>
@@ -82,6 +64,104 @@
         <w:spacing w:after="60"/>
         <w:ind w:left="1037" w:hanging="357"/>
         <w:contextualSpacing w:val="0"/>
+      </w:pPr>
+      <w:proofErr w:type="spellStart"/>
+      <w:r>
+        <w:t>Logging</w:t>
+      </w:r>
+      <w:r>
+        <w:t>Refactored</w:t>
+      </w:r>
+      <w:proofErr w:type="spellEnd"/>
+      <w:r>
+        <w:t xml:space="preserve"> the Logger screen to eliminate its dependency on </w:t>
+      </w:r>
+      <w:proofErr w:type="spellStart"/>
+      <w:r>
+        <w:t>SourceGrid</w:t>
+      </w:r>
+      <w:proofErr w:type="spellEnd"/>
+      <w:r>
+        <w:t xml:space="preserve"> component.</w:t>
+      </w:r>
+    </w:p>
+    <w:p>
+      <w:pPr>
+        <w:pStyle w:val="Lijstalinea"/>
+        <w:numPr>
+          <w:ilvl w:val="0"/>
+          <w:numId w:val="4"/>
+        </w:numPr>
+        <w:spacing w:after="60"/>
+        <w:ind w:left="1037" w:hanging="357"/>
+        <w:contextualSpacing w:val="0"/>
+        <w:rPr>
+          <w:rFonts w:hint="eastAsia"/>
+        </w:rPr>
+      </w:pPr>
+    </w:p>
+    <w:p>
+      <w:pPr>
+        <w:pStyle w:val="Kop1"/>
+        <w:rPr>
+          <w:rFonts w:hint="eastAsia"/>
+          <w:color w:val="auto"/>
+        </w:rPr>
+      </w:pPr>
+      <w:r>
+        <w:t>v2.0.</w:t>
+      </w:r>
+      <w:r>
+        <w:rPr>
+          <w:color w:val="auto"/>
+        </w:rPr>
+        <w:t>2</w:t>
+      </w:r>
+      <w:r>
+        <w:rPr>
+          <w:color w:val="auto"/>
+        </w:rPr>
+        <w:t>2</w:t>
+      </w:r>
+      <w:r>
+        <w:rPr>
+          <w:color w:val="auto"/>
+        </w:rPr>
+        <w:t xml:space="preserve"> – </w:t>
+      </w:r>
+      <w:r>
+        <w:rPr>
+          <w:color w:val="auto"/>
+        </w:rPr>
+        <w:t>2026-02-27</w:t>
+      </w:r>
+    </w:p>
+    <w:p>
+      <w:pPr>
+        <w:pStyle w:val="Kop3"/>
+        <w:numPr>
+          <w:ilvl w:val="0"/>
+          <w:numId w:val="0"/>
+        </w:numPr>
+        <w:ind w:left="431" w:hanging="431"/>
+        <w:rPr>
+          <w:rFonts w:hint="eastAsia"/>
+        </w:rPr>
+      </w:pPr>
+      <w:r>
+        <w:t>Fixes</w:t>
+      </w:r>
+    </w:p>
+    <w:p>
+      <w:pPr>
+        <w:pStyle w:val="Lijstalinea"/>
+        <w:numPr>
+          <w:ilvl w:val="0"/>
+          <w:numId w:val="4"/>
+        </w:numPr>
+        <w:spacing w:after="60"/>
+        <w:ind w:left="1037" w:hanging="357"/>
+        <w:contextualSpacing w:val="0"/>
         <w:rPr>
           <w:rFonts w:hint="eastAsia"/>
         </w:rPr>
@@ -566,6 +646,7 @@
         </w:rPr>
       </w:pPr>
       <w:r>
+        <w:lastRenderedPageBreak/>
         <w:t>v2.0.</w:t>
       </w:r>
       <w:r>
@@ -633,7 +714,6 @@
         </w:rPr>
       </w:pPr>
       <w:r>
-        <w:lastRenderedPageBreak/>
         <w:t>v2.0.</w:t>
       </w:r>
       <w:r>
@@ -1393,12 +1473,14 @@
         <w:br/>
         <w:t>-</w:t>
       </w:r>
+      <w:proofErr w:type="spellStart"/>
       <w:r>
         <w:rPr>
           <w:rFonts w:hint="eastAsia"/>
         </w:rPr>
         <w:t>continueonerror</w:t>
       </w:r>
+      <w:proofErr w:type="spellEnd"/>
       <w:r>
         <w:t xml:space="preserve"> options.</w:t>
       </w:r>
@@ -1523,7 +1605,15 @@
         </w:rPr>
       </w:pPr>
       <w:r>
-        <w:t xml:space="preserve">When editing an enum value one could cause an exception with key sequences like: numlock on, </w:t>
+        <w:t xml:space="preserve">When editing an enum value one could cause an exception with key sequences like: </w:t>
+      </w:r>
+      <w:proofErr w:type="spellStart"/>
+      <w:r>
+        <w:t>numlock</w:t>
+      </w:r>
+      <w:proofErr w:type="spellEnd"/>
+      <w:r>
+        <w:t xml:space="preserve"> on, </w:t>
       </w:r>
       <w:r>
         <w:t>start</w:t>
@@ -1535,7 +1625,15 @@
         <w:t xml:space="preserve">press </w:t>
       </w:r>
       <w:r>
-        <w:t xml:space="preserve">backspace to erase all, numlock off, </w:t>
+        <w:t xml:space="preserve">backspace to erase all, </w:t>
+      </w:r>
+      <w:proofErr w:type="spellStart"/>
+      <w:r>
+        <w:t>numlock</w:t>
+      </w:r>
+      <w:proofErr w:type="spellEnd"/>
+      <w:r>
+        <w:t xml:space="preserve"> off, </w:t>
       </w:r>
       <w:r>
         <w:t xml:space="preserve">press </w:t>
@@ -1577,6 +1675,7 @@
         <w:rPr>
           <w:rFonts w:hint="eastAsia"/>
         </w:rPr>
+        <w:lastRenderedPageBreak/>
         <w:t xml:space="preserve">ModbusImport.exe </w:t>
       </w:r>
       <w:r>
@@ -1675,11 +1774,7 @@
         <w:t>with</w:t>
       </w:r>
       <w:r>
-        <w:t xml:space="preserve"> each parameter that had a </w:t>
-      </w:r>
-      <w:r>
-        <w:lastRenderedPageBreak/>
-        <w:t xml:space="preserve">command line override, instead of one </w:t>
+        <w:t xml:space="preserve"> each parameter that had a command line override, instead of one </w:t>
       </w:r>
       <w:r>
         <w:t>general</w:t>
@@ -1751,7 +1846,15 @@
         </w:rPr>
       </w:pPr>
       <w:r>
-        <w:t>Mbc file: &lt;exportorder&gt; element added.</w:t>
+        <w:t>Mbc file: &lt;</w:t>
+      </w:r>
+      <w:proofErr w:type="spellStart"/>
+      <w:r>
+        <w:t>exportorder</w:t>
+      </w:r>
+      <w:proofErr w:type="spellEnd"/>
+      <w:r>
+        <w:t>&gt; element added.</w:t>
       </w:r>
     </w:p>
     <w:p>
@@ -1852,12 +1955,14 @@
           <w:rFonts w:hint="eastAsia"/>
         </w:rPr>
       </w:pPr>
+      <w:proofErr w:type="spellStart"/>
       <w:r>
         <w:rPr>
           <w:rFonts w:hint="eastAsia"/>
         </w:rPr>
         <w:t>WriteHoldingregisterFC</w:t>
       </w:r>
+      <w:proofErr w:type="spellEnd"/>
       <w:r>
         <w:t xml:space="preserve"> </w:t>
       </w:r>
@@ -2012,7 +2117,21 @@
         <w:rPr>
           <w:rFonts w:hint="eastAsia"/>
         </w:rPr>
-        <w:t>Enum registers editing now has a dropdown combobox with possible values.</w:t>
+        <w:t xml:space="preserve">Enum registers editing now has a dropdown </w:t>
+      </w:r>
+      <w:proofErr w:type="spellStart"/>
+      <w:r>
+        <w:rPr>
+          <w:rFonts w:hint="eastAsia"/>
+        </w:rPr>
+        <w:t>combobox</w:t>
+      </w:r>
+      <w:proofErr w:type="spellEnd"/>
+      <w:r>
+        <w:rPr>
+          <w:rFonts w:hint="eastAsia"/>
+        </w:rPr>
+        <w:t xml:space="preserve"> with possible values.</w:t>
       </w:r>
     </w:p>
     <w:p>
@@ -2143,7 +2262,15 @@
         </w:rPr>
       </w:pPr>
       <w:r>
-        <w:t xml:space="preserve">In Import_file and Import_compare: writing/comparing a float32 </w:t>
+        <w:t xml:space="preserve">In Import_file and </w:t>
+      </w:r>
+      <w:proofErr w:type="spellStart"/>
+      <w:r>
+        <w:t>Import_compare</w:t>
+      </w:r>
+      <w:proofErr w:type="spellEnd"/>
+      <w:r>
+        <w:t xml:space="preserve">: writing/comparing a float32 </w:t>
       </w:r>
       <w:r>
         <w:t xml:space="preserve">value </w:t>
@@ -2246,7 +2373,35 @@
         <w:rPr>
           <w:rFonts w:hint="eastAsia"/>
         </w:rPr>
-        <w:t xml:space="preserve">You can now close the [Project_Configuration], [Save_project_file] and [About] </w:t>
+        <w:t>You can now close the [</w:t>
+      </w:r>
+      <w:proofErr w:type="spellStart"/>
+      <w:r>
+        <w:rPr>
+          <w:rFonts w:hint="eastAsia"/>
+        </w:rPr>
+        <w:t>Project_Configuration</w:t>
+      </w:r>
+      <w:proofErr w:type="spellEnd"/>
+      <w:r>
+        <w:rPr>
+          <w:rFonts w:hint="eastAsia"/>
+        </w:rPr>
+        <w:t>], [</w:t>
+      </w:r>
+      <w:proofErr w:type="spellStart"/>
+      <w:r>
+        <w:rPr>
+          <w:rFonts w:hint="eastAsia"/>
+        </w:rPr>
+        <w:t>Save_project_file</w:t>
+      </w:r>
+      <w:proofErr w:type="spellEnd"/>
+      <w:r>
+        <w:rPr>
+          <w:rFonts w:hint="eastAsia"/>
+        </w:rPr>
+        <w:t xml:space="preserve">] and [About] </w:t>
       </w:r>
       <w:r>
         <w:t>windows</w:t>
@@ -2330,7 +2485,21 @@
         <w:rPr>
           <w:rFonts w:hint="eastAsia"/>
         </w:rPr>
-        <w:t>With Import_file and Import_compare: writing/compar</w:t>
+        <w:t xml:space="preserve">With Import_file and </w:t>
+      </w:r>
+      <w:proofErr w:type="spellStart"/>
+      <w:r>
+        <w:rPr>
+          <w:rFonts w:hint="eastAsia"/>
+        </w:rPr>
+        <w:t>Import_compare</w:t>
+      </w:r>
+      <w:proofErr w:type="spellEnd"/>
+      <w:r>
+        <w:rPr>
+          <w:rFonts w:hint="eastAsia"/>
+        </w:rPr>
+        <w:t>: writing/compar</w:t>
       </w:r>
       <w:r>
         <w:t>ing</w:t>
@@ -2426,6 +2595,7 @@
         </w:rPr>
       </w:pPr>
       <w:r>
+        <w:lastRenderedPageBreak/>
         <w:t xml:space="preserve">LocalOverrides </w:t>
       </w:r>
       <w:r>
@@ -2522,8 +2692,15 @@
         </w:rPr>
       </w:pPr>
       <w:r>
-        <w:lastRenderedPageBreak/>
-        <w:t xml:space="preserve">Mbc project file: &lt;longdescr&gt; </w:t>
+        <w:t>Mbc project file: &lt;</w:t>
+      </w:r>
+      <w:proofErr w:type="spellStart"/>
+      <w:r>
+        <w:t>longdescr</w:t>
+      </w:r>
+      <w:proofErr w:type="spellEnd"/>
+      <w:r>
+        <w:t xml:space="preserve">&gt; </w:t>
       </w:r>
       <w:r>
         <w:t xml:space="preserve">element </w:t>
@@ -2532,8 +2709,13 @@
         <w:t xml:space="preserve">added. </w:t>
       </w:r>
       <w:r>
-        <w:t>Adds a long multiline text that is show when the mouse is hoovered over the register decription</w:t>
-      </w:r>
+        <w:t xml:space="preserve">Adds a long multiline text that is show when the mouse is hoovered over the register </w:t>
+      </w:r>
+      <w:proofErr w:type="spellStart"/>
+      <w:r>
+        <w:t>decription</w:t>
+      </w:r>
+      <w:proofErr w:type="spellEnd"/>
       <w:r>
         <w:t>.</w:t>
       </w:r>
@@ -2738,7 +2920,15 @@
         </w:rPr>
       </w:pPr>
       <w:r>
-        <w:t xml:space="preserve">The properties of a register (rw, int32, ...) are now displayed in a separate </w:t>
+        <w:t>The properties of a register (</w:t>
+      </w:r>
+      <w:proofErr w:type="spellStart"/>
+      <w:r>
+        <w:t>rw</w:t>
+      </w:r>
+      <w:proofErr w:type="spellEnd"/>
+      <w:r>
+        <w:t xml:space="preserve">, int32, ...) are now displayed in a separate </w:t>
       </w:r>
       <w:r>
         <w:t>[</w:t>
@@ -3070,6 +3260,7 @@
         </w:rPr>
       </w:pPr>
       <w:r>
+        <w:lastRenderedPageBreak/>
         <w:t>In</w:t>
       </w:r>
       <w:r>
@@ -3127,11 +3318,15 @@
         </w:rPr>
       </w:pPr>
       <w:r>
-        <w:t>If you start ModbusControl by double-clicking an mbc file and the file points to a non-</w:t>
-      </w:r>
-      <w:r>
-        <w:lastRenderedPageBreak/>
-        <w:t>existent COM port, the error dialog "Error opening serial port COMx" now appears after the ModbusControl program appears.</w:t>
+        <w:t xml:space="preserve">If you start ModbusControl by double-clicking an mbc file and the file points to a non-existent COM port, the error dialog "Error opening serial port </w:t>
+      </w:r>
+      <w:proofErr w:type="spellStart"/>
+      <w:r>
+        <w:t>COMx</w:t>
+      </w:r>
+      <w:proofErr w:type="spellEnd"/>
+      <w:r>
+        <w:t>" now appears after the ModbusControl program appears.</w:t>
       </w:r>
     </w:p>
     <w:p>
@@ -3206,7 +3401,23 @@
         <w:t xml:space="preserve">file is automatically </w:t>
       </w:r>
       <w:r>
-        <w:t xml:space="preserve">moved from &lt;mydocuments&gt;\ModbusControl to %AppData%\Roaming\E.D.&amp;A\ModbusControl. Content from old is not migrated. Old </w:t>
+        <w:t>moved from &lt;</w:t>
+      </w:r>
+      <w:proofErr w:type="spellStart"/>
+      <w:r>
+        <w:t>mydocuments</w:t>
+      </w:r>
+      <w:proofErr w:type="spellEnd"/>
+      <w:r>
+        <w:t>&gt;\ModbusControl to %</w:t>
+      </w:r>
+      <w:proofErr w:type="spellStart"/>
+      <w:r>
+        <w:t>AppData</w:t>
+      </w:r>
+      <w:proofErr w:type="spellEnd"/>
+      <w:r>
+        <w:t xml:space="preserve">%\Roaming\E.D.&amp;A\ModbusControl. Content from old is not migrated. Old </w:t>
       </w:r>
       <w:r>
         <w:t>file</w:t>
@@ -3662,6 +3873,7 @@
         </w:rPr>
       </w:pPr>
       <w:r>
+        <w:lastRenderedPageBreak/>
         <w:t>New option: "Ignore form size on project reload".</w:t>
       </w:r>
     </w:p>
@@ -3779,7 +3991,6 @@
         </w:rPr>
       </w:pPr>
       <w:r>
-        <w:lastRenderedPageBreak/>
         <w:t xml:space="preserve">Now </w:t>
       </w:r>
       <w:r>
@@ -4217,8 +4428,13 @@
           <w:rFonts w:hint="eastAsia"/>
         </w:rPr>
       </w:pPr>
-      <w:r>
-        <w:t>WriteHoldingregFunctionCode now also supports 'auto'.</w:t>
+      <w:proofErr w:type="spellStart"/>
+      <w:r>
+        <w:t>WriteHoldingregFunctionCode</w:t>
+      </w:r>
+      <w:proofErr w:type="spellEnd"/>
+      <w:r>
+        <w:t xml:space="preserve"> now also supports 'auto'.</w:t>
       </w:r>
     </w:p>
     <w:p>
@@ -8216,7 +8432,6 @@
   <w:style w:type="character" w:default="1" w:styleId="Standaardalinea-lettertype">
     <w:name w:val="Default Paragraph Font"/>
     <w:uiPriority w:val="1"/>
-    <w:semiHidden/>
     <w:unhideWhenUsed/>
   </w:style>
   <w:style w:type="table" w:default="1" w:styleId="Standaardtabel">

</xml_diff>

<commit_message>
Settings files moved from “AppData\Roaming\E.D.&A\ModbusControl” to “AppData\Roaming\ModbusControl”, and from “ProgramData\E.D.&A\ModbusControl” to “ProgramData\ModbusControl”. Settings files moved on startup.
git-svn-id: http://visualsvn.edna.local/EDNA/ModbusControl/V2@4927 03c8d257-35a7-c645-9f01-50f27e98b9e6
</commit_message>
<xml_diff>
--- a/Manuals/ModbusControl - Release notes.docx
+++ b/Manuals/ModbusControl - Release notes.docx
@@ -64,25 +64,172 @@
         <w:spacing w:after="60"/>
         <w:ind w:left="1037" w:hanging="357"/>
         <w:contextualSpacing w:val="0"/>
-      </w:pPr>
+        <w:rPr>
+          <w:rFonts w:hint="eastAsia"/>
+        </w:rPr>
+      </w:pPr>
+      <w:r>
+        <w:t>Logging</w:t>
+      </w:r>
+      <w:r>
+        <w:t xml:space="preserve">: </w:t>
+      </w:r>
+      <w:r>
+        <w:t>Refactored the Logg</w:t>
+      </w:r>
+      <w:r>
+        <w:t>ing</w:t>
+      </w:r>
+      <w:r>
+        <w:t xml:space="preserve"> screen to eliminate its dependency on </w:t>
+      </w:r>
+      <w:r>
+        <w:t xml:space="preserve">external </w:t>
+      </w:r>
+      <w:r>
+        <w:t>component.</w:t>
+      </w:r>
+    </w:p>
+    <w:p>
+      <w:pPr>
+        <w:pStyle w:val="Lijstalinea"/>
+        <w:numPr>
+          <w:ilvl w:val="0"/>
+          <w:numId w:val="4"/>
+        </w:numPr>
+        <w:spacing w:after="60"/>
+        <w:ind w:left="1037" w:hanging="357"/>
+      </w:pPr>
+      <w:r>
+        <w:t>Settings file</w:t>
+      </w:r>
+      <w:r>
+        <w:t>s</w:t>
+      </w:r>
+      <w:r>
+        <w:t xml:space="preserve"> </w:t>
+      </w:r>
+      <w:r>
+        <w:t xml:space="preserve">were </w:t>
+      </w:r>
+      <w:r>
+        <w:t xml:space="preserve">moved </w:t>
+      </w:r>
+      <w:r>
+        <w:t>from “</w:t>
+      </w:r>
       <w:proofErr w:type="spellStart"/>
       <w:r>
-        <w:t>Logging</w:t>
-      </w:r>
-      <w:r>
-        <w:t>Refactored</w:t>
+        <w:t>AppData</w:t>
       </w:r>
       <w:proofErr w:type="spellEnd"/>
       <w:r>
-        <w:t xml:space="preserve"> the Logger screen to eliminate its dependency on </w:t>
+        <w:t>\Roaming\E.D.&amp;A\ModbusControl</w:t>
+      </w:r>
+      <w:r>
+        <w:t>” to “</w:t>
       </w:r>
       <w:proofErr w:type="spellStart"/>
       <w:r>
-        <w:t>SourceGrid</w:t>
+        <w:t>AppData</w:t>
       </w:r>
       <w:proofErr w:type="spellEnd"/>
       <w:r>
-        <w:t xml:space="preserve"> component.</w:t>
+        <w:t>\Roaming\ModbusControl</w:t>
+      </w:r>
+      <w:r>
+        <w:t>”, and from “</w:t>
+      </w:r>
+      <w:proofErr w:type="spellStart"/>
+      <w:r>
+        <w:t>ProgramData</w:t>
+      </w:r>
+      <w:proofErr w:type="spellEnd"/>
+      <w:r>
+        <w:t>\E.D.&amp;A\ModbusControl</w:t>
+      </w:r>
+      <w:r>
+        <w:t>” to “</w:t>
+      </w:r>
+      <w:proofErr w:type="spellStart"/>
+      <w:r>
+        <w:t>ProgramData</w:t>
+      </w:r>
+      <w:proofErr w:type="spellEnd"/>
+      <w:r>
+        <w:t>\ModbusControl</w:t>
+      </w:r>
+      <w:r>
+        <w:t xml:space="preserve">”. </w:t>
+      </w:r>
+      <w:r>
+        <w:t>All settings migrate automatically.</w:t>
+      </w:r>
+    </w:p>
+    <w:p>
+      <w:pPr>
+        <w:pStyle w:val="Lijstalinea"/>
+        <w:numPr>
+          <w:ilvl w:val="0"/>
+          <w:numId w:val="4"/>
+        </w:numPr>
+        <w:spacing w:after="60"/>
+        <w:ind w:left="1037" w:hanging="357"/>
+        <w:rPr>
+          <w:rFonts w:hint="eastAsia"/>
+        </w:rPr>
+      </w:pPr>
+    </w:p>
+    <w:p>
+      <w:pPr>
+        <w:pStyle w:val="Kop1"/>
+        <w:rPr>
+          <w:rFonts w:hint="eastAsia"/>
+          <w:color w:val="auto"/>
+        </w:rPr>
+      </w:pPr>
+      <w:r>
+        <w:t>v2.0.</w:t>
+      </w:r>
+      <w:r>
+        <w:rPr>
+          <w:color w:val="auto"/>
+        </w:rPr>
+        <w:t>2</w:t>
+      </w:r>
+      <w:r>
+        <w:rPr>
+          <w:color w:val="auto"/>
+        </w:rPr>
+        <w:t>2</w:t>
+      </w:r>
+      <w:r>
+        <w:rPr>
+          <w:color w:val="auto"/>
+        </w:rPr>
+        <w:t xml:space="preserve"> – </w:t>
+      </w:r>
+      <w:r>
+        <w:rPr>
+          <w:color w:val="auto"/>
+        </w:rPr>
+        <w:t>2026-02-27</w:t>
+      </w:r>
+    </w:p>
+    <w:p>
+      <w:pPr>
+        <w:pStyle w:val="Kop3"/>
+        <w:numPr>
+          <w:ilvl w:val="0"/>
+          <w:numId w:val="0"/>
+        </w:numPr>
+        <w:ind w:left="431" w:hanging="431"/>
+        <w:rPr>
+          <w:rFonts w:hint="eastAsia"/>
+        </w:rPr>
+      </w:pPr>
+      <w:r>
+        <w:t>Fixes</w:t>
       </w:r>
     </w:p>
     <w:p>
@@ -99,57 +246,80 @@
           <w:rFonts w:hint="eastAsia"/>
         </w:rPr>
       </w:pPr>
-    </w:p>
-    <w:p>
-      <w:pPr>
-        <w:pStyle w:val="Kop1"/>
-        <w:rPr>
-          <w:rFonts w:hint="eastAsia"/>
-          <w:color w:val="auto"/>
-        </w:rPr>
-      </w:pPr>
-      <w:r>
-        <w:t>v2.0.</w:t>
-      </w:r>
-      <w:r>
-        <w:rPr>
-          <w:color w:val="auto"/>
-        </w:rPr>
-        <w:t>2</w:t>
-      </w:r>
-      <w:r>
-        <w:rPr>
-          <w:color w:val="auto"/>
-        </w:rPr>
-        <w:t>2</w:t>
-      </w:r>
-      <w:r>
-        <w:rPr>
-          <w:color w:val="auto"/>
-        </w:rPr>
-        <w:t xml:space="preserve"> – </w:t>
-      </w:r>
-      <w:r>
-        <w:rPr>
-          <w:color w:val="auto"/>
-        </w:rPr>
-        <w:t>2026-02-27</w:t>
-      </w:r>
-    </w:p>
-    <w:p>
-      <w:pPr>
-        <w:pStyle w:val="Kop3"/>
-        <w:numPr>
-          <w:ilvl w:val="0"/>
-          <w:numId w:val="0"/>
-        </w:numPr>
-        <w:ind w:left="431" w:hanging="431"/>
-        <w:rPr>
-          <w:rFonts w:hint="eastAsia"/>
-        </w:rPr>
-      </w:pPr>
-      <w:r>
-        <w:t>Fixes</w:t>
+      <w:r>
+        <w:t xml:space="preserve">Pressing </w:t>
+      </w:r>
+      <w:r>
+        <w:rPr>
+          <w:b/>
+          <w:bCs/>
+        </w:rPr>
+        <w:t>Ctrl + C</w:t>
+      </w:r>
+      <w:r>
+        <w:t xml:space="preserve"> in the grid after selecting a cell in the </w:t>
+      </w:r>
+      <w:r>
+        <w:rPr>
+          <w:i/>
+          <w:iCs/>
+        </w:rPr>
+        <w:t>Value</w:t>
+      </w:r>
+      <w:r>
+        <w:t xml:space="preserve"> column now copies only the value string </w:t>
+      </w:r>
+      <w:r>
+        <w:t xml:space="preserve">to the clipboard </w:t>
+      </w:r>
+      <w:r>
+        <w:t xml:space="preserve">instead of </w:t>
+      </w:r>
+      <w:r>
+        <w:t>all</w:t>
+      </w:r>
+      <w:r>
+        <w:t xml:space="preserve"> row</w:t>
+      </w:r>
+      <w:r>
+        <w:t xml:space="preserve"> data</w:t>
+      </w:r>
+      <w:r>
+        <w:t xml:space="preserve">. </w:t>
+      </w:r>
+      <w:r>
+        <w:t>T</w:t>
+      </w:r>
+      <w:r>
+        <w:rPr>
+          <w:rFonts w:hint="eastAsia"/>
+        </w:rPr>
+        <w:t>h</w:t>
+      </w:r>
+      <w:r>
+        <w:t>e same applies</w:t>
+      </w:r>
+      <w:r>
+        <w:t xml:space="preserve"> when </w:t>
+      </w:r>
+      <w:r>
+        <w:t>p</w:t>
+      </w:r>
+      <w:r>
+        <w:t xml:space="preserve">ressing </w:t>
+      </w:r>
+      <w:r>
+        <w:rPr>
+          <w:b/>
+          <w:bCs/>
+        </w:rPr>
+        <w:t>Ctrl + C</w:t>
+      </w:r>
+      <w:r>
+        <w:t xml:space="preserve"> </w:t>
+      </w:r>
+      <w:r>
+        <w:t>while editing a value.</w:t>
       </w:r>
     </w:p>
     <w:p>
@@ -167,79 +337,80 @@
         </w:rPr>
       </w:pPr>
       <w:r>
-        <w:t xml:space="preserve">Pressing </w:t>
-      </w:r>
-      <w:r>
-        <w:rPr>
-          <w:b/>
-          <w:bCs/>
-        </w:rPr>
-        <w:t>Ctrl + C</w:t>
-      </w:r>
-      <w:r>
-        <w:t xml:space="preserve"> in the grid after selecting a cell in the </w:t>
-      </w:r>
-      <w:r>
-        <w:rPr>
+        <w:t xml:space="preserve">When an invalid value is entered in the grid, the error message now remains visible longer and </w:t>
+      </w:r>
+      <w:r>
+        <w:t xml:space="preserve">does not </w:t>
+      </w:r>
+      <w:r>
+        <w:t>disappear on the next poll.</w:t>
+      </w:r>
+    </w:p>
+    <w:p>
+      <w:pPr>
+        <w:pStyle w:val="Lijstalinea"/>
+        <w:numPr>
+          <w:ilvl w:val="0"/>
+          <w:numId w:val="4"/>
+        </w:numPr>
+        <w:spacing w:after="60"/>
+        <w:ind w:left="1037" w:hanging="357"/>
+        <w:contextualSpacing w:val="0"/>
+        <w:rPr>
+          <w:rFonts w:hint="eastAsia"/>
+        </w:rPr>
+      </w:pPr>
+      <w:r>
+        <w:t xml:space="preserve">Installer: </w:t>
+      </w:r>
+      <w:r>
+        <w:t>now install</w:t>
+      </w:r>
+      <w:r>
+        <w:t>s</w:t>
+      </w:r>
+      <w:r>
+        <w:t xml:space="preserve"> this application in </w:t>
+      </w:r>
+      <w:r>
+        <w:t>the “</w:t>
+      </w:r>
+      <w:r>
+        <w:rPr>
+          <w:rFonts w:hint="eastAsia"/>
           <w:i/>
           <w:iCs/>
         </w:rPr>
-        <w:t>Value</w:t>
-      </w:r>
-      <w:r>
-        <w:t xml:space="preserve"> column now copies only the value string </w:t>
-      </w:r>
-      <w:r>
-        <w:t xml:space="preserve">to the clipboard </w:t>
-      </w:r>
-      <w:r>
-        <w:t xml:space="preserve">instead of </w:t>
-      </w:r>
-      <w:r>
-        <w:t>all</w:t>
-      </w:r>
-      <w:r>
-        <w:t xml:space="preserve"> row</w:t>
-      </w:r>
-      <w:r>
-        <w:t xml:space="preserve"> data</w:t>
-      </w:r>
-      <w:r>
-        <w:t xml:space="preserve">. </w:t>
-      </w:r>
-      <w:r>
-        <w:t>T</w:t>
-      </w:r>
-      <w:r>
-        <w:rPr>
-          <w:rFonts w:hint="eastAsia"/>
-        </w:rPr>
-        <w:t>h</w:t>
-      </w:r>
-      <w:r>
-        <w:t>e same applies</w:t>
-      </w:r>
-      <w:r>
-        <w:t xml:space="preserve"> when </w:t>
-      </w:r>
-      <w:r>
-        <w:t>p</w:t>
-      </w:r>
-      <w:r>
-        <w:t xml:space="preserve">ressing </w:t>
-      </w:r>
-      <w:r>
-        <w:rPr>
-          <w:b/>
-          <w:bCs/>
-        </w:rPr>
-        <w:t>Ctrl + C</w:t>
-      </w:r>
-      <w:r>
+        <w:t>C:\Program Files\ModbusControl</w:t>
+      </w:r>
+      <w:r>
+        <w:t>”</w:t>
+      </w:r>
+      <w:r>
+        <w:rPr>
+          <w:rFonts w:hint="eastAsia"/>
+        </w:rPr>
         <w:t xml:space="preserve"> </w:t>
       </w:r>
       <w:r>
-        <w:t>while editing a value.</w:t>
+        <w:t xml:space="preserve">directory instead of in </w:t>
+      </w:r>
+      <w:r>
+        <w:t>“</w:t>
+      </w:r>
+      <w:r>
+        <w:rPr>
+          <w:rFonts w:hint="eastAsia"/>
+          <w:i/>
+          <w:iCs/>
+        </w:rPr>
+        <w:t>C:\Program Files (x86)\E.D.&amp;A\ModbusControl</w:t>
+      </w:r>
+      <w:r>
+        <w:t xml:space="preserve">”, </w:t>
+      </w:r>
+      <w:r>
+        <w:t>reflecting that the application is a 64‑bit process.</w:t>
       </w:r>
     </w:p>
     <w:p>
@@ -257,13 +428,68 @@
         </w:rPr>
       </w:pPr>
       <w:r>
-        <w:t xml:space="preserve">When an invalid value is entered in the grid, the error message now remains visible longer and </w:t>
-      </w:r>
-      <w:r>
-        <w:t xml:space="preserve">does not </w:t>
-      </w:r>
-      <w:r>
-        <w:t>disappear on the next poll.</w:t>
+        <w:t>U</w:t>
+      </w:r>
+      <w:r>
+        <w:t xml:space="preserve">pdater: </w:t>
+      </w:r>
+      <w:r>
+        <w:t>Resolved an issue with Admin</w:t>
+      </w:r>
+      <w:r>
+        <w:noBreakHyphen/>
+        <w:t>by</w:t>
+      </w:r>
+      <w:r>
+        <w:noBreakHyphen/>
+        <w:t xml:space="preserve">Request that </w:t>
+      </w:r>
+      <w:r>
+        <w:t xml:space="preserve">prevented the Updater process from stopping before the update, which resulted in a warning that the </w:t>
+      </w:r>
+      <w:r>
+        <w:t>Updater file</w:t>
+      </w:r>
+      <w:r>
+        <w:t xml:space="preserve"> was still in use</w:t>
+      </w:r>
+      <w:r>
+        <w:t xml:space="preserve"> during the update.</w:t>
+      </w:r>
+    </w:p>
+    <w:p>
+      <w:pPr>
+        <w:pStyle w:val="Kop1"/>
+        <w:rPr>
+          <w:rFonts w:hint="eastAsia"/>
+          <w:color w:val="auto"/>
+        </w:rPr>
+      </w:pPr>
+      <w:r>
+        <w:t>v2.0.</w:t>
+      </w:r>
+      <w:r>
+        <w:rPr>
+          <w:color w:val="auto"/>
+        </w:rPr>
+        <w:t xml:space="preserve">21 – </w:t>
+      </w:r>
+      <w:r>
+        <w:rPr>
+          <w:color w:val="auto"/>
+        </w:rPr>
+        <w:t>2026-02-13</w:t>
+      </w:r>
+    </w:p>
+    <w:p>
+      <w:pPr>
+        <w:pStyle w:val="Kop3"/>
+        <w:rPr>
+          <w:rFonts w:hint="eastAsia"/>
+        </w:rPr>
+      </w:pPr>
+      <w:r>
+        <w:t>Features</w:t>
       </w:r>
     </w:p>
     <w:p>
@@ -281,56 +507,97 @@
         </w:rPr>
       </w:pPr>
       <w:r>
-        <w:t xml:space="preserve">Installer: </w:t>
-      </w:r>
-      <w:r>
-        <w:t>now install</w:t>
-      </w:r>
-      <w:r>
-        <w:t>s</w:t>
-      </w:r>
-      <w:r>
-        <w:t xml:space="preserve"> this application in </w:t>
-      </w:r>
-      <w:r>
-        <w:t>the “</w:t>
-      </w:r>
-      <w:r>
-        <w:rPr>
-          <w:rFonts w:hint="eastAsia"/>
+        <w:t>Added support for string forma</w:t>
+      </w:r>
+      <w:r>
+        <w:t>t</w:t>
+      </w:r>
+      <w:r>
+        <w:t xml:space="preserve"> (up to 150 registers or 300 bytes) with multiple encodings</w:t>
+      </w:r>
+      <w:r>
+        <w:t xml:space="preserve">. </w:t>
+      </w:r>
+    </w:p>
+    <w:p>
+      <w:pPr>
+        <w:pStyle w:val="Lijstalinea"/>
+        <w:numPr>
+          <w:ilvl w:val="0"/>
+          <w:numId w:val="4"/>
+        </w:numPr>
+        <w:spacing w:after="60"/>
+        <w:ind w:left="1037" w:hanging="357"/>
+        <w:contextualSpacing w:val="0"/>
+        <w:rPr>
+          <w:rFonts w:hint="eastAsia"/>
+        </w:rPr>
+      </w:pPr>
+      <w:r>
+        <w:t>ModbusExport</w:t>
+      </w:r>
+      <w:r>
+        <w:t xml:space="preserve">: </w:t>
+      </w:r>
+      <w:r>
+        <w:t xml:space="preserve">Now supports strings and includes a </w:t>
+      </w:r>
+      <w:r>
+        <w:rPr>
           <w:i/>
           <w:iCs/>
         </w:rPr>
-        <w:t>C:\Program Files\ModbusControl</w:t>
-      </w:r>
-      <w:r>
-        <w:t>”</w:t>
-      </w:r>
-      <w:r>
-        <w:rPr>
-          <w:rFonts w:hint="eastAsia"/>
-        </w:rPr>
-        <w:t xml:space="preserve"> </w:t>
-      </w:r>
-      <w:r>
-        <w:t xml:space="preserve">directory instead of in </w:t>
-      </w:r>
-      <w:r>
-        <w:t>“</w:t>
-      </w:r>
-      <w:r>
-        <w:rPr>
-          <w:rFonts w:hint="eastAsia"/>
+        <w:t>Continue on error</w:t>
+      </w:r>
+      <w:r>
+        <w:t xml:space="preserve"> option.</w:t>
+      </w:r>
+    </w:p>
+    <w:p>
+      <w:pPr>
+        <w:pStyle w:val="Lijstalinea"/>
+        <w:numPr>
+          <w:ilvl w:val="0"/>
+          <w:numId w:val="4"/>
+        </w:numPr>
+        <w:spacing w:after="60"/>
+        <w:ind w:left="1037" w:hanging="357"/>
+        <w:contextualSpacing w:val="0"/>
+        <w:rPr>
+          <w:rFonts w:hint="eastAsia"/>
+        </w:rPr>
+      </w:pPr>
+      <w:r>
+        <w:t xml:space="preserve">ModbusImport: </w:t>
+      </w:r>
+      <w:r>
+        <w:t xml:space="preserve">Now supports strings and includes a </w:t>
+      </w:r>
+      <w:r>
+        <w:rPr>
           <w:i/>
           <w:iCs/>
         </w:rPr>
-        <w:t>C:\Program Files (x86)\E.D.&amp;A\ModbusControl</w:t>
-      </w:r>
-      <w:r>
-        <w:t xml:space="preserve">”, </w:t>
-      </w:r>
-      <w:r>
-        <w:t>reflecting that the application is a 64‑bit process.</w:t>
+        <w:t>Continue on error</w:t>
+      </w:r>
+      <w:r>
+        <w:t xml:space="preserve"> option.</w:t>
+      </w:r>
+    </w:p>
+    <w:p>
+      <w:pPr>
+        <w:pStyle w:val="Kop3"/>
+        <w:numPr>
+          <w:ilvl w:val="0"/>
+          <w:numId w:val="0"/>
+        </w:numPr>
+        <w:ind w:left="431" w:hanging="431"/>
+        <w:rPr>
+          <w:rFonts w:hint="eastAsia"/>
+        </w:rPr>
+      </w:pPr>
+      <w:r>
+        <w:t>Fixes</w:t>
       </w:r>
     </w:p>
     <w:p>
@@ -348,68 +615,36 @@
         </w:rPr>
       </w:pPr>
       <w:r>
-        <w:t>U</w:t>
-      </w:r>
-      <w:r>
-        <w:t xml:space="preserve">pdater: </w:t>
-      </w:r>
-      <w:r>
-        <w:t>Resolved an issue with Admin</w:t>
-      </w:r>
-      <w:r>
-        <w:noBreakHyphen/>
-        <w:t>by</w:t>
-      </w:r>
-      <w:r>
-        <w:noBreakHyphen/>
-        <w:t xml:space="preserve">Request that </w:t>
-      </w:r>
-      <w:r>
-        <w:t xml:space="preserve">prevented the Updater process from stopping before the update, which resulted in a warning that the </w:t>
-      </w:r>
-      <w:r>
-        <w:t>Updater file</w:t>
-      </w:r>
-      <w:r>
-        <w:t xml:space="preserve"> was still in use</w:t>
-      </w:r>
-      <w:r>
-        <w:t xml:space="preserve"> during the update.</w:t>
-      </w:r>
-    </w:p>
-    <w:p>
-      <w:pPr>
-        <w:pStyle w:val="Kop1"/>
-        <w:rPr>
-          <w:rFonts w:hint="eastAsia"/>
-          <w:color w:val="auto"/>
-        </w:rPr>
-      </w:pPr>
-      <w:r>
-        <w:t>v2.0.</w:t>
-      </w:r>
-      <w:r>
-        <w:rPr>
-          <w:color w:val="auto"/>
-        </w:rPr>
-        <w:t xml:space="preserve">21 – </w:t>
-      </w:r>
-      <w:r>
-        <w:rPr>
-          <w:color w:val="auto"/>
-        </w:rPr>
-        <w:t>2026-02-13</w:t>
-      </w:r>
-    </w:p>
-    <w:p>
-      <w:pPr>
-        <w:pStyle w:val="Kop3"/>
-        <w:rPr>
-          <w:rFonts w:hint="eastAsia"/>
-        </w:rPr>
-      </w:pPr>
-      <w:r>
-        <w:t>Features</w:t>
+        <w:t>T</w:t>
+      </w:r>
+      <w:r>
+        <w:rPr>
+          <w:rFonts w:hint="eastAsia"/>
+        </w:rPr>
+        <w:t>h</w:t>
+      </w:r>
+      <w:r>
+        <w:t>e XSD validation schema now accepts uint32 enum values from 2,147,483,648 to 4,294,967,295.</w:t>
+      </w:r>
+    </w:p>
+    <w:p>
+      <w:pPr>
+        <w:pStyle w:val="Lijstalinea"/>
+        <w:numPr>
+          <w:ilvl w:val="0"/>
+          <w:numId w:val="4"/>
+        </w:numPr>
+        <w:spacing w:after="60"/>
+        <w:contextualSpacing w:val="0"/>
+        <w:rPr>
+          <w:rFonts w:hint="eastAsia"/>
+        </w:rPr>
+      </w:pPr>
+      <w:r>
+        <w:t xml:space="preserve">ModbusExport: </w:t>
+      </w:r>
+      <w:r>
+        <w:t>You can now paste a filename or path into the filename field.</w:t>
       </w:r>
     </w:p>
     <w:p>
@@ -427,165 +662,63 @@
         </w:rPr>
       </w:pPr>
       <w:r>
-        <w:t>Added support for string forma</w:t>
-      </w:r>
-      <w:r>
-        <w:t>t</w:t>
-      </w:r>
-      <w:r>
-        <w:t xml:space="preserve"> (up to 150 registers or 300 bytes) with multiple encodings</w:t>
-      </w:r>
-      <w:r>
-        <w:t xml:space="preserve">. </w:t>
-      </w:r>
-    </w:p>
-    <w:p>
-      <w:pPr>
-        <w:pStyle w:val="Lijstalinea"/>
+        <w:t xml:space="preserve">ModbusImport: </w:t>
+      </w:r>
+      <w:r>
+        <w:t>You can now paste a filename or path into the filename field.</w:t>
+      </w:r>
+    </w:p>
+    <w:p>
+      <w:pPr>
+        <w:pStyle w:val="Kop1"/>
+        <w:rPr>
+          <w:rFonts w:hint="eastAsia"/>
+          <w:color w:val="auto"/>
+        </w:rPr>
+      </w:pPr>
+      <w:r>
+        <w:t>v2.0.</w:t>
+      </w:r>
+      <w:r>
+        <w:rPr>
+          <w:color w:val="auto"/>
+        </w:rPr>
+        <w:t>20 – 2025-10-11</w:t>
+      </w:r>
+    </w:p>
+    <w:p>
+      <w:pPr>
+        <w:pStyle w:val="Kop3"/>
+        <w:numPr>
+          <w:ilvl w:val="0"/>
+          <w:numId w:val="0"/>
+        </w:numPr>
+        <w:ind w:left="431" w:hanging="431"/>
+        <w:rPr>
+          <w:rFonts w:hint="eastAsia"/>
+        </w:rPr>
+      </w:pPr>
+      <w:r>
+        <w:t>Fixes</w:t>
+      </w:r>
+    </w:p>
+    <w:p>
+      <w:pPr>
         <w:numPr>
           <w:ilvl w:val="0"/>
           <w:numId w:val="4"/>
         </w:numPr>
         <w:spacing w:after="60"/>
-        <w:ind w:left="1037" w:hanging="357"/>
-        <w:contextualSpacing w:val="0"/>
-        <w:rPr>
-          <w:rFonts w:hint="eastAsia"/>
-        </w:rPr>
-      </w:pPr>
-      <w:r>
-        <w:t>ModbusExport</w:t>
-      </w:r>
-      <w:r>
-        <w:t xml:space="preserve">: </w:t>
-      </w:r>
-      <w:r>
-        <w:t xml:space="preserve">Now supports strings and includes a </w:t>
-      </w:r>
-      <w:r>
-        <w:rPr>
-          <w:i/>
-          <w:iCs/>
-        </w:rPr>
-        <w:t>Continue on error</w:t>
-      </w:r>
-      <w:r>
-        <w:t xml:space="preserve"> option.</w:t>
-      </w:r>
-    </w:p>
-    <w:p>
-      <w:pPr>
-        <w:pStyle w:val="Lijstalinea"/>
-        <w:numPr>
-          <w:ilvl w:val="0"/>
-          <w:numId w:val="4"/>
-        </w:numPr>
-        <w:spacing w:after="60"/>
-        <w:ind w:left="1037" w:hanging="357"/>
-        <w:contextualSpacing w:val="0"/>
-        <w:rPr>
-          <w:rFonts w:hint="eastAsia"/>
-        </w:rPr>
-      </w:pPr>
-      <w:r>
-        <w:t xml:space="preserve">ModbusImport: </w:t>
-      </w:r>
-      <w:r>
-        <w:t xml:space="preserve">Now supports strings and includes a </w:t>
-      </w:r>
-      <w:r>
-        <w:rPr>
-          <w:i/>
-          <w:iCs/>
-        </w:rPr>
-        <w:t>Continue on error</w:t>
-      </w:r>
-      <w:r>
-        <w:t xml:space="preserve"> option.</w:t>
-      </w:r>
-    </w:p>
-    <w:p>
-      <w:pPr>
-        <w:pStyle w:val="Kop3"/>
-        <w:numPr>
-          <w:ilvl w:val="0"/>
-          <w:numId w:val="0"/>
-        </w:numPr>
-        <w:ind w:left="431" w:hanging="431"/>
-        <w:rPr>
-          <w:rFonts w:hint="eastAsia"/>
-        </w:rPr>
-      </w:pPr>
-      <w:r>
-        <w:t>Fixes</w:t>
-      </w:r>
-    </w:p>
-    <w:p>
-      <w:pPr>
-        <w:pStyle w:val="Lijstalinea"/>
-        <w:numPr>
-          <w:ilvl w:val="0"/>
-          <w:numId w:val="4"/>
-        </w:numPr>
-        <w:spacing w:after="60"/>
-        <w:ind w:left="1037" w:hanging="357"/>
-        <w:contextualSpacing w:val="0"/>
-        <w:rPr>
-          <w:rFonts w:hint="eastAsia"/>
-        </w:rPr>
-      </w:pPr>
-      <w:r>
-        <w:t>T</w:t>
-      </w:r>
-      <w:r>
-        <w:rPr>
-          <w:rFonts w:hint="eastAsia"/>
-        </w:rPr>
-        <w:t>h</w:t>
-      </w:r>
-      <w:r>
-        <w:t>e XSD validation schema now accepts uint32 enum values from 2,147,483,648 to 4,294,967,295.</w:t>
-      </w:r>
-    </w:p>
-    <w:p>
-      <w:pPr>
-        <w:pStyle w:val="Lijstalinea"/>
-        <w:numPr>
-          <w:ilvl w:val="0"/>
-          <w:numId w:val="4"/>
-        </w:numPr>
-        <w:spacing w:after="60"/>
-        <w:contextualSpacing w:val="0"/>
-        <w:rPr>
-          <w:rFonts w:hint="eastAsia"/>
-        </w:rPr>
-      </w:pPr>
-      <w:r>
-        <w:t xml:space="preserve">ModbusExport: </w:t>
-      </w:r>
-      <w:r>
-        <w:t>You can now paste a filename or path into the filename field.</w:t>
-      </w:r>
-    </w:p>
-    <w:p>
-      <w:pPr>
-        <w:pStyle w:val="Lijstalinea"/>
-        <w:numPr>
-          <w:ilvl w:val="0"/>
-          <w:numId w:val="4"/>
-        </w:numPr>
-        <w:spacing w:after="60"/>
-        <w:ind w:left="1037" w:hanging="357"/>
-        <w:contextualSpacing w:val="0"/>
-        <w:rPr>
-          <w:rFonts w:hint="eastAsia"/>
-        </w:rPr>
-      </w:pPr>
-      <w:r>
-        <w:t xml:space="preserve">ModbusImport: </w:t>
-      </w:r>
-      <w:r>
-        <w:t>You can now paste a filename or path into the filename field.</w:t>
+        <w:rPr>
+          <w:rFonts w:hint="eastAsia"/>
+        </w:rPr>
+      </w:pPr>
+      <w:r>
+        <w:t xml:space="preserve">Editing a register or bitfield value in the grid sometimes caused the old value to be </w:t>
+      </w:r>
+      <w:r>
+        <w:lastRenderedPageBreak/>
+        <w:t>written to the target instead of the new one.</w:t>
       </w:r>
     </w:p>
     <w:p>
@@ -597,56 +730,6 @@
         </w:rPr>
       </w:pPr>
       <w:r>
-        <w:t>v2.0.</w:t>
-      </w:r>
-      <w:r>
-        <w:rPr>
-          <w:color w:val="auto"/>
-        </w:rPr>
-        <w:t>20 – 2025-10-11</w:t>
-      </w:r>
-    </w:p>
-    <w:p>
-      <w:pPr>
-        <w:pStyle w:val="Kop3"/>
-        <w:numPr>
-          <w:ilvl w:val="0"/>
-          <w:numId w:val="0"/>
-        </w:numPr>
-        <w:ind w:left="431" w:hanging="431"/>
-        <w:rPr>
-          <w:rFonts w:hint="eastAsia"/>
-        </w:rPr>
-      </w:pPr>
-      <w:r>
-        <w:t>Fixes</w:t>
-      </w:r>
-    </w:p>
-    <w:p>
-      <w:pPr>
-        <w:numPr>
-          <w:ilvl w:val="0"/>
-          <w:numId w:val="4"/>
-        </w:numPr>
-        <w:spacing w:after="60"/>
-        <w:rPr>
-          <w:rFonts w:hint="eastAsia"/>
-        </w:rPr>
-      </w:pPr>
-      <w:r>
-        <w:t>Editing a register or bitfield value in the grid sometimes caused the old value to be written to the target instead of the new one.</w:t>
-      </w:r>
-    </w:p>
-    <w:p>
-      <w:pPr>
-        <w:pStyle w:val="Kop1"/>
-        <w:rPr>
-          <w:rFonts w:hint="eastAsia"/>
-          <w:color w:val="auto"/>
-        </w:rPr>
-      </w:pPr>
-      <w:r>
-        <w:lastRenderedPageBreak/>
         <w:t>v2.0.</w:t>
       </w:r>
       <w:r>
@@ -1609,6 +1692,7 @@
       </w:r>
       <w:proofErr w:type="spellStart"/>
       <w:r>
+        <w:lastRenderedPageBreak/>
         <w:t>numlock</w:t>
       </w:r>
       <w:proofErr w:type="spellEnd"/>
@@ -1675,7 +1759,6 @@
         <w:rPr>
           <w:rFonts w:hint="eastAsia"/>
         </w:rPr>
-        <w:lastRenderedPageBreak/>
         <w:t xml:space="preserve">ModbusImport.exe </w:t>
       </w:r>
       <w:r>
@@ -2595,7 +2678,6 @@
         </w:rPr>
       </w:pPr>
       <w:r>
-        <w:lastRenderedPageBreak/>
         <w:t xml:space="preserve">LocalOverrides </w:t>
       </w:r>
       <w:r>
@@ -3260,7 +3342,6 @@
         </w:rPr>
       </w:pPr>
       <w:r>
-        <w:lastRenderedPageBreak/>
         <w:t>In</w:t>
       </w:r>
       <w:r>
@@ -3873,7 +3954,6 @@
         </w:rPr>
       </w:pPr>
       <w:r>
-        <w:lastRenderedPageBreak/>
         <w:t>New option: "Ignore form size on project reload".</w:t>
       </w:r>
     </w:p>

</xml_diff>

<commit_message>
Updated README.md and Release notes docx.
</commit_message>
<xml_diff>
--- a/Manuals/ModbusControl - Release notes.docx
+++ b/Manuals/ModbusControl - Release notes.docx
@@ -19,6 +19,226 @@
           <w:lang w:val="en-GB"/>
         </w:rPr>
         <w:t>ModbusControl – Release notes</w:t>
+      </w:r>
+    </w:p>
+    <w:p>
+      <w:pPr>
+        <w:pStyle w:val="Heading1"/>
+        <w:numPr>
+          <w:ilvl w:val="0"/>
+          <w:numId w:val="1"/>
+        </w:numPr>
+        <w:ind w:hanging="431" w:left="431"/>
+        <w:rPr>
+          <w:lang w:val="en-GB"/>
+        </w:rPr>
+      </w:pPr>
+      <w:r>
+        <w:rPr>
+          <w:lang w:val="en-GB"/>
+        </w:rPr>
+        <w:t xml:space="preserve">v3.0.1 </w:t>
+      </w:r>
+      <w:r>
+        <w:rPr>
+          <w:color w:val="auto"/>
+          <w:lang w:val="en-GB"/>
+        </w:rPr>
+        <w:t>– 2026-09-28</w:t>
+      </w:r>
+    </w:p>
+    <w:p>
+      <w:pPr>
+        <w:pStyle w:val="Heading3"/>
+        <w:numPr>
+          <w:ilvl w:val="2"/>
+          <w:numId w:val="1"/>
+        </w:numPr>
+        <w:rPr>
+          <w:lang w:val="en-GB"/>
+        </w:rPr>
+      </w:pPr>
+      <w:r>
+        <w:rPr>
+          <w:lang w:val="en-GB"/>
+        </w:rPr>
+        <w:t>Features</w:t>
+      </w:r>
+    </w:p>
+    <w:p>
+      <w:pPr>
+        <w:pStyle w:val="Normal"/>
+        <w:widowControl/>
+        <w:numPr>
+          <w:ilvl w:val="0"/>
+          <w:numId w:val="2"/>
+        </w:numPr>
+        <w:suppressAutoHyphens w:val="true"/>
+        <w:spacing w:lineRule="auto" w:line="240" w:before="0" w:after="57"/>
+        <w:ind w:hanging="357" w:left="1037"/>
+        <w:jc w:val="left"/>
+        <w:rPr>
+          <w:rFonts w:eastAsia="Calibri" w:cs=""/>
+          <w:kern w:val="0"/>
+          <w:sz w:val="24"/>
+          <w:szCs w:val="24"/>
+          <w:lang w:val="en-GB" w:eastAsia="en-US" w:bidi="ar-SA"/>
+        </w:rPr>
+      </w:pPr>
+      <w:r>
+        <w:rPr>
+          <w:rFonts w:eastAsia="Calibri" w:cs=""/>
+          <w:kern w:val="0"/>
+          <w:sz w:val="24"/>
+          <w:szCs w:val="24"/>
+          <w:lang w:val="en-GB" w:eastAsia="en-US" w:bidi="ar-SA"/>
+        </w:rPr>
+        <w:t xml:space="preserve">Migrated to .NET (CORE) 9. To implement decent Windows scaling behaviour and because .NET Framework development has ended. </w:t>
+      </w:r>
+    </w:p>
+    <w:p>
+      <w:pPr>
+        <w:pStyle w:val="Normal"/>
+        <w:widowControl/>
+        <w:numPr>
+          <w:ilvl w:val="0"/>
+          <w:numId w:val="2"/>
+        </w:numPr>
+        <w:suppressAutoHyphens w:val="true"/>
+        <w:spacing w:lineRule="auto" w:line="240" w:before="0" w:after="57"/>
+        <w:ind w:hanging="357" w:left="1037"/>
+        <w:jc w:val="left"/>
+        <w:rPr>
+          <w:rFonts w:eastAsia="Calibri" w:cs=""/>
+          <w:kern w:val="0"/>
+          <w:sz w:val="24"/>
+          <w:szCs w:val="24"/>
+          <w:lang w:val="en-GB" w:eastAsia="en-US" w:bidi="ar-SA"/>
+        </w:rPr>
+      </w:pPr>
+      <w:r>
+        <w:rPr>
+          <w:rFonts w:eastAsia="Calibri" w:cs=""/>
+          <w:kern w:val="0"/>
+          <w:sz w:val="24"/>
+          <w:szCs w:val="24"/>
+          <w:lang w:val="en-GB" w:eastAsia="en-US" w:bidi="ar-SA"/>
+        </w:rPr>
+        <w:t xml:space="preserve">Using Self-contained deploy, </w:t>
+      </w:r>
+      <w:r>
+        <w:rPr>
+          <w:rFonts w:eastAsia="Calibri" w:cs=""/>
+          <w:kern w:val="0"/>
+          <w:sz w:val="24"/>
+          <w:szCs w:val="24"/>
+          <w:lang w:val="en-GB" w:eastAsia="en-US" w:bidi="ar-SA"/>
+        </w:rPr>
+        <w:t>meaning no .NET core 9 framework has to be installed.</w:t>
+      </w:r>
+    </w:p>
+    <w:p>
+      <w:pPr>
+        <w:pStyle w:val="Normal"/>
+        <w:widowControl/>
+        <w:numPr>
+          <w:ilvl w:val="0"/>
+          <w:numId w:val="2"/>
+        </w:numPr>
+        <w:suppressAutoHyphens w:val="true"/>
+        <w:spacing w:lineRule="auto" w:line="240" w:before="0" w:after="57"/>
+        <w:ind w:hanging="357" w:left="1037"/>
+        <w:jc w:val="left"/>
+        <w:rPr>
+          <w:rFonts w:eastAsia="Calibri" w:cs=""/>
+          <w:kern w:val="0"/>
+          <w:sz w:val="24"/>
+          <w:szCs w:val="24"/>
+          <w:lang w:val="en-GB" w:eastAsia="en-US" w:bidi="ar-SA"/>
+        </w:rPr>
+      </w:pPr>
+      <w:r>
+        <w:rPr>
+          <w:rFonts w:eastAsia="Calibri" w:cs=""/>
+          <w:kern w:val="0"/>
+          <w:sz w:val="24"/>
+          <w:szCs w:val="24"/>
+          <w:lang w:val="en-GB" w:eastAsia="en-US" w:bidi="ar-SA"/>
+        </w:rPr>
+        <w:t xml:space="preserve">Redesigned auto-scaling behaviour to use "PerMonitorV2" scaling. </w:t>
+      </w:r>
+    </w:p>
+    <w:p>
+      <w:pPr>
+        <w:pStyle w:val="Normal"/>
+        <w:widowControl/>
+        <w:numPr>
+          <w:ilvl w:val="0"/>
+          <w:numId w:val="2"/>
+        </w:numPr>
+        <w:suppressAutoHyphens w:val="true"/>
+        <w:spacing w:lineRule="auto" w:line="240" w:before="0" w:after="57"/>
+        <w:ind w:hanging="357" w:left="1037"/>
+        <w:jc w:val="left"/>
+        <w:rPr>
+          <w:rFonts w:eastAsia="Calibri" w:cs=""/>
+          <w:kern w:val="0"/>
+          <w:sz w:val="24"/>
+          <w:szCs w:val="24"/>
+          <w:lang w:val="en-GB" w:eastAsia="en-US" w:bidi="ar-SA"/>
+        </w:rPr>
+      </w:pPr>
+      <w:r>
+        <w:rPr>
+          <w:rFonts w:eastAsia="Calibri" w:cs=""/>
+          <w:kern w:val="0"/>
+          <w:sz w:val="24"/>
+          <w:szCs w:val="24"/>
+          <w:lang w:val="en-GB" w:eastAsia="en-US" w:bidi="ar-SA"/>
+        </w:rPr>
+        <w:t>CustomQueriesForm now supports zooming.</w:t>
+      </w:r>
+    </w:p>
+    <w:p>
+      <w:pPr>
+        <w:pStyle w:val="ListParagraph"/>
+        <w:spacing w:before="0" w:after="57"/>
+        <w:ind w:hanging="0" w:left="0"/>
+        <w:contextualSpacing w:val="false"/>
+        <w:rPr>
+          <w:b/>
+          <w:bCs/>
+          <w:lang w:val="en-GB"/>
+        </w:rPr>
+      </w:pPr>
+      <w:r>
+        <w:rPr>
+          <w:b/>
+          <w:bCs/>
+          <w:lang w:val="en-GB"/>
+        </w:rPr>
+        <w:t>Fixes</w:t>
+      </w:r>
+    </w:p>
+    <w:p>
+      <w:pPr>
+        <w:pStyle w:val="Normal"/>
+        <w:numPr>
+          <w:ilvl w:val="0"/>
+          <w:numId w:val="2"/>
+        </w:numPr>
+        <w:spacing w:before="0" w:after="57"/>
+        <w:ind w:hanging="357" w:left="1037"/>
+        <w:rPr/>
+      </w:pPr>
+      <w:r>
+        <w:rPr>
+          <w:rStyle w:val="Strong"/>
+          <w:b w:val="false"/>
+          <w:bCs w:val="false"/>
+          <w:lang w:val="en-GB"/>
+        </w:rPr>
+        <w:t>Redesigned auto-scaling behaviour, which had significant issues in the previous version.</w:t>
       </w:r>
     </w:p>
     <w:p>
@@ -6118,7 +6338,7 @@
   </w:style>
   <w:style w:type="paragraph" w:styleId="Heading1">
     <w:name w:val="heading 1"/>
-    <w:basedOn w:val="Kop"/>
+    <w:basedOn w:val="Kopuser"/>
     <w:next w:val="BodyText"/>
     <w:qFormat/>
     <w:rsid w:val="00fc5f78"/>
@@ -6140,7 +6360,7 @@
   </w:style>
   <w:style w:type="paragraph" w:styleId="Heading2">
     <w:name w:val="heading 2"/>
-    <w:basedOn w:val="Kop"/>
+    <w:basedOn w:val="Kopuser"/>
     <w:next w:val="BodyText"/>
     <w:qFormat/>
     <w:pPr>
@@ -6159,7 +6379,7 @@
   </w:style>
   <w:style w:type="paragraph" w:styleId="Heading3">
     <w:name w:val="heading 3"/>
-    <w:basedOn w:val="Kop"/>
+    <w:basedOn w:val="Kopuser"/>
     <w:next w:val="BodyText"/>
     <w:qFormat/>
     <w:pPr>
@@ -6511,8 +6731,8 @@
       <w:u w:val="single"/>
     </w:rPr>
   </w:style>
-  <w:style w:type="character" w:styleId="Opsommingstekens" w:customStyle="1">
-    <w:name w:val="Opsommingstekens"/>
+  <w:style w:type="character" w:styleId="Opsommingstekensuser" w:customStyle="1">
+    <w:name w:val="Opsommingstekens (user)"/>
     <w:qFormat/>
     <w:rPr>
       <w:rFonts w:ascii="OpenSymbol" w:hAnsi="OpenSymbol" w:eastAsia="OpenSymbol" w:cs="OpenSymbol"/>
@@ -6551,22 +6771,73 @@
       <w:iCs/>
     </w:rPr>
   </w:style>
-  <w:style w:type="character" w:styleId="Opsommingstekensuser">
-    <w:name w:val="Opsommingstekens (user)"/>
+  <w:style w:type="character" w:styleId="Opsommingstekens">
+    <w:name w:val="Opsommingstekens"/>
     <w:qFormat/>
     <w:rPr>
       <w:rFonts w:ascii="OpenSymbol" w:hAnsi="OpenSymbol" w:eastAsia="OpenSymbol" w:cs="OpenSymbol"/>
     </w:rPr>
   </w:style>
-  <w:style w:type="character" w:styleId="Brontekstuser">
-    <w:name w:val="Brontekst (user)"/>
+  <w:style w:type="character" w:styleId="Brontekst">
+    <w:name w:val="Brontekst"/>
     <w:qFormat/>
     <w:rPr>
       <w:rFonts w:ascii="Liberation Mono" w:hAnsi="Liberation Mono" w:eastAsia="Liberation Mono" w:cs="Liberation Mono"/>
     </w:rPr>
   </w:style>
-  <w:style w:type="paragraph" w:styleId="Kop" w:customStyle="1">
+  <w:style w:type="paragraph" w:styleId="Kop">
     <w:name w:val="Kop"/>
+    <w:basedOn w:val="Normal"/>
+    <w:next w:val="BodyText"/>
+    <w:qFormat/>
+    <w:pPr>
+      <w:keepNext w:val="true"/>
+      <w:spacing w:before="240" w:after="120"/>
+    </w:pPr>
+    <w:rPr>
+      <w:rFonts w:ascii="Liberation Sans" w:hAnsi="Liberation Sans" w:eastAsia="Microsoft YaHei" w:cs="Arial"/>
+      <w:sz w:val="28"/>
+      <w:szCs w:val="28"/>
+    </w:rPr>
+  </w:style>
+  <w:style w:type="paragraph" w:styleId="BodyText">
+    <w:name w:val="Body Text"/>
+    <w:basedOn w:val="Normal"/>
+    <w:pPr>
+      <w:spacing w:lineRule="auto" w:line="288" w:before="0" w:after="140"/>
+    </w:pPr>
+    <w:rPr/>
+  </w:style>
+  <w:style w:type="paragraph" w:styleId="List">
+    <w:name w:val="List"/>
+    <w:basedOn w:val="BodyText"/>
+    <w:pPr/>
+    <w:rPr/>
+  </w:style>
+  <w:style w:type="paragraph" w:styleId="Caption">
+    <w:name w:val="caption"/>
+    <w:basedOn w:val="Normal"/>
+    <w:qFormat/>
+    <w:pPr>
+      <w:suppressLineNumbers/>
+      <w:spacing w:before="120" w:after="120"/>
+    </w:pPr>
+    <w:rPr>
+      <w:i/>
+      <w:iCs/>
+    </w:rPr>
+  </w:style>
+  <w:style w:type="paragraph" w:styleId="Index" w:customStyle="1">
+    <w:name w:val="Index"/>
+    <w:basedOn w:val="Normal"/>
+    <w:qFormat/>
+    <w:pPr>
+      <w:suppressLineNumbers/>
+    </w:pPr>
+    <w:rPr/>
+  </w:style>
+  <w:style w:type="paragraph" w:styleId="Kopuser" w:customStyle="1">
+    <w:name w:val="Kop (user)"/>
     <w:basedOn w:val="Normal"/>
     <w:next w:val="BodyText"/>
     <w:qFormat/>
@@ -6580,59 +6851,8 @@
       <w:szCs w:val="28"/>
     </w:rPr>
   </w:style>
-  <w:style w:type="paragraph" w:styleId="BodyText">
-    <w:name w:val="Body Text"/>
-    <w:basedOn w:val="Normal"/>
-    <w:pPr>
-      <w:spacing w:lineRule="auto" w:line="288" w:before="0" w:after="140"/>
-    </w:pPr>
-    <w:rPr/>
-  </w:style>
-  <w:style w:type="paragraph" w:styleId="List">
-    <w:name w:val="List"/>
-    <w:basedOn w:val="BodyText"/>
-    <w:pPr/>
-    <w:rPr/>
-  </w:style>
-  <w:style w:type="paragraph" w:styleId="Caption">
-    <w:name w:val="caption"/>
-    <w:basedOn w:val="Normal"/>
-    <w:qFormat/>
-    <w:pPr>
-      <w:suppressLineNumbers/>
-      <w:spacing w:before="120" w:after="120"/>
-    </w:pPr>
-    <w:rPr>
-      <w:i/>
-      <w:iCs/>
-    </w:rPr>
-  </w:style>
-  <w:style w:type="paragraph" w:styleId="Index" w:customStyle="1">
-    <w:name w:val="Index"/>
-    <w:basedOn w:val="Normal"/>
-    <w:qFormat/>
-    <w:pPr>
-      <w:suppressLineNumbers/>
-    </w:pPr>
-    <w:rPr/>
-  </w:style>
-  <w:style w:type="paragraph" w:styleId="Kopuser">
-    <w:name w:val="Kop (user)"/>
-    <w:basedOn w:val="Normal"/>
-    <w:next w:val="BodyText"/>
-    <w:qFormat/>
-    <w:pPr>
-      <w:keepNext w:val="true"/>
-      <w:spacing w:before="240" w:after="120"/>
-    </w:pPr>
-    <w:rPr>
-      <w:rFonts w:ascii="Liberation Sans" w:hAnsi="Liberation Sans" w:eastAsia="Microsoft YaHei" w:cs="Arial"/>
-      <w:sz w:val="28"/>
-      <w:szCs w:val="28"/>
-    </w:rPr>
-  </w:style>
-  <w:style w:type="paragraph" w:styleId="Citaten" w:customStyle="1">
-    <w:name w:val="Citaten"/>
+  <w:style w:type="paragraph" w:styleId="Citatenuser" w:customStyle="1">
+    <w:name w:val="Citaten (user)"/>
     <w:basedOn w:val="Normal"/>
     <w:qFormat/>
     <w:pPr>
@@ -6643,7 +6863,7 @@
   </w:style>
   <w:style w:type="paragraph" w:styleId="Title">
     <w:name w:val="Title"/>
-    <w:basedOn w:val="Kop"/>
+    <w:basedOn w:val="Kopuser"/>
     <w:next w:val="BodyText"/>
     <w:qFormat/>
     <w:pPr>
@@ -6658,7 +6878,7 @@
   </w:style>
   <w:style w:type="paragraph" w:styleId="Subtitle">
     <w:name w:val="Subtitle"/>
-    <w:basedOn w:val="Kop"/>
+    <w:basedOn w:val="Kopuser"/>
     <w:next w:val="BodyText"/>
     <w:qFormat/>
     <w:pPr>
@@ -6684,15 +6904,15 @@
     </w:pPr>
     <w:rPr/>
   </w:style>
+  <w:style w:type="paragraph" w:styleId="Koptekstenvoettekst">
+    <w:name w:val="Koptekst en voettekst"/>
+    <w:basedOn w:val="Normal"/>
+    <w:qFormat/>
+    <w:pPr/>
+    <w:rPr/>
+  </w:style>
   <w:style w:type="paragraph" w:styleId="Koptekstenvoettekstuser">
     <w:name w:val="Koptekst en voettekst (user)"/>
-    <w:basedOn w:val="Normal"/>
-    <w:qFormat/>
-    <w:pPr/>
-    <w:rPr/>
-  </w:style>
-  <w:style w:type="paragraph" w:styleId="Koptekstenvoettekst">
-    <w:name w:val="Koptekst en voettekst"/>
     <w:basedOn w:val="Normal"/>
     <w:qFormat/>
     <w:pPr/>
@@ -6743,8 +6963,8 @@
       <w:lang w:val="nl-BE" w:eastAsia="nl-BE"/>
     </w:rPr>
   </w:style>
-  <w:style w:type="paragraph" w:styleId="Inhoudtabeluser">
-    <w:name w:val="Inhoud tabel (user)"/>
+  <w:style w:type="paragraph" w:styleId="Inhoudtabel">
+    <w:name w:val="Inhoud tabel"/>
     <w:basedOn w:val="Normal"/>
     <w:qFormat/>
     <w:pPr>
@@ -6761,9 +6981,9 @@
       <w:lang w:val="en-GB" w:eastAsia="zh-CN" w:bidi="hi-IN"/>
     </w:rPr>
   </w:style>
-  <w:style w:type="paragraph" w:styleId="Tabelkopuser">
-    <w:name w:val="Tabelkop (user)"/>
-    <w:basedOn w:val="Inhoudtabeluser"/>
+  <w:style w:type="paragraph" w:styleId="Tabelkop">
+    <w:name w:val="Tabelkop"/>
+    <w:basedOn w:val="Inhoudtabel"/>
     <w:qFormat/>
     <w:pPr>
       <w:suppressLineNumbers/>
@@ -6774,8 +6994,8 @@
       <w:bCs/>
     </w:rPr>
   </w:style>
-  <w:style w:type="numbering" w:styleId="Geenlijstuser" w:default="1">
-    <w:name w:val="Geen lijst (user)"/>
+  <w:style w:type="numbering" w:styleId="Geenlijst" w:default="1">
+    <w:name w:val="Geen lijst"/>
     <w:uiPriority w:val="99"/>
     <w:semiHidden/>
     <w:unhideWhenUsed/>

</xml_diff>

<commit_message>
Updated version number, manuals and installer for release v3.0.2.
</commit_message>
<xml_diff>
--- a/Manuals/ModbusControl - Release notes.docx
+++ b/Manuals/ModbusControl - Release notes.docx
@@ -37,32 +37,98 @@
         <w:rPr>
           <w:lang w:val="en-GB"/>
         </w:rPr>
-        <w:t xml:space="preserve">v3.0.1 </w:t>
+        <w:t>v3.0.</w:t>
+      </w:r>
+      <w:r>
+        <w:rPr>
+          <w:lang w:val="en-GB"/>
+        </w:rPr>
+        <w:t xml:space="preserve">2 </w:t>
       </w:r>
       <w:r>
         <w:rPr>
           <w:color w:val="auto"/>
           <w:lang w:val="en-GB"/>
         </w:rPr>
-        <w:t>– 2026-09-28</w:t>
-      </w:r>
-    </w:p>
-    <w:p>
-      <w:pPr>
-        <w:pStyle w:val="Heading3"/>
-        <w:numPr>
-          <w:ilvl w:val="2"/>
-          <w:numId w:val="1"/>
-        </w:numPr>
-        <w:rPr>
-          <w:lang w:val="en-GB"/>
-        </w:rPr>
-      </w:pPr>
-      <w:r>
-        <w:rPr>
-          <w:lang w:val="en-GB"/>
+        <w:t>– 2026-</w:t>
+      </w:r>
+      <w:r>
+        <w:rPr>
+          <w:color w:val="auto"/>
+          <w:lang w:val="en-GB"/>
+        </w:rPr>
+        <w:t>10-08</w:t>
+      </w:r>
+    </w:p>
+    <w:p>
+      <w:pPr>
+        <w:pStyle w:val="ListParagraph"/>
+        <w:widowControl w:val="false"/>
+        <w:suppressAutoHyphens w:val="true"/>
+        <w:bidi w:val="0"/>
+        <w:spacing w:before="0" w:after="57"/>
+        <w:ind w:hanging="0" w:left="0"/>
+        <w:contextualSpacing w:val="false"/>
+        <w:jc w:val="left"/>
+        <w:rPr>
+          <w:rFonts w:ascii="Liberation Sans" w:hAnsi="Liberation Sans" w:eastAsia="SimSun" w:cs="Mangal"/>
+          <w:b/>
+          <w:bCs/>
+          <w:color w:val="00000A"/>
+          <w:kern w:val="2"/>
+          <w:sz w:val="20"/>
+          <w:szCs w:val="20"/>
+          <w:lang w:val="en-GB" w:eastAsia="zh-CN" w:bidi="ar-SA"/>
+        </w:rPr>
+      </w:pPr>
+      <w:r>
+        <w:rPr>
+          <w:rFonts w:eastAsia="SimSun" w:cs="Mangal" w:ascii="Liberation Sans" w:hAnsi="Liberation Sans"/>
+          <w:b/>
+          <w:bCs/>
+          <w:color w:val="00000A"/>
+          <w:kern w:val="2"/>
+          <w:sz w:val="20"/>
+          <w:szCs w:val="20"/>
+          <w:lang w:val="en-GB" w:eastAsia="zh-CN" w:bidi="ar-SA"/>
         </w:rPr>
         <w:t>Features</w:t>
+      </w:r>
+    </w:p>
+    <w:p>
+      <w:pPr>
+        <w:pStyle w:val="Normal"/>
+        <w:numPr>
+          <w:ilvl w:val="0"/>
+          <w:numId w:val="2"/>
+        </w:numPr>
+        <w:spacing w:before="0" w:after="57"/>
+        <w:ind w:hanging="357" w:left="1037"/>
+        <w:rPr/>
+      </w:pPr>
+      <w:r>
+        <w:rPr>
+          <w:rStyle w:val="Strong"/>
+          <w:b w:val="false"/>
+          <w:bCs w:val="false"/>
+        </w:rPr>
+        <w:t xml:space="preserve">Redesigned auto-scaling to use true per-monitor </w:t>
+      </w:r>
+      <w:r>
+        <w:rPr>
+          <w:rStyle w:val="Strong"/>
+          <w:b w:val="false"/>
+          <w:bCs w:val="false"/>
+        </w:rPr>
+        <w:t xml:space="preserve">Windows </w:t>
+      </w:r>
+      <w:r>
+        <w:rPr>
+          <w:rStyle w:val="Strong"/>
+          <w:b w:val="false"/>
+          <w:bCs w:val="false"/>
+        </w:rPr>
+        <w:t>DPI scaling.</w:t>
       </w:r>
     </w:p>
     <w:p>
@@ -93,227 +159,7 @@
           <w:szCs w:val="24"/>
           <w:lang w:val="en-GB" w:eastAsia="en-US" w:bidi="ar-SA"/>
         </w:rPr>
-        <w:t xml:space="preserve">Migrated to .NET (CORE) 9. To implement decent Windows scaling behaviour and because .NET Framework development has ended. </w:t>
-      </w:r>
-    </w:p>
-    <w:p>
-      <w:pPr>
-        <w:pStyle w:val="Normal"/>
-        <w:widowControl/>
-        <w:numPr>
-          <w:ilvl w:val="0"/>
-          <w:numId w:val="2"/>
-        </w:numPr>
-        <w:suppressAutoHyphens w:val="true"/>
-        <w:spacing w:lineRule="auto" w:line="240" w:before="0" w:after="57"/>
-        <w:ind w:hanging="357" w:left="1037"/>
-        <w:jc w:val="left"/>
-        <w:rPr>
-          <w:rFonts w:eastAsia="Calibri" w:cs=""/>
-          <w:kern w:val="0"/>
-          <w:sz w:val="24"/>
-          <w:szCs w:val="24"/>
-          <w:lang w:val="en-GB" w:eastAsia="en-US" w:bidi="ar-SA"/>
-        </w:rPr>
-      </w:pPr>
-      <w:r>
-        <w:rPr>
-          <w:rFonts w:eastAsia="Calibri" w:cs=""/>
-          <w:kern w:val="0"/>
-          <w:sz w:val="24"/>
-          <w:szCs w:val="24"/>
-          <w:lang w:val="en-GB" w:eastAsia="en-US" w:bidi="ar-SA"/>
-        </w:rPr>
-        <w:t xml:space="preserve">Using Self-contained deploy, </w:t>
-      </w:r>
-      <w:r>
-        <w:rPr>
-          <w:rFonts w:eastAsia="Calibri" w:cs=""/>
-          <w:kern w:val="0"/>
-          <w:sz w:val="24"/>
-          <w:szCs w:val="24"/>
-          <w:lang w:val="en-GB" w:eastAsia="en-US" w:bidi="ar-SA"/>
-        </w:rPr>
-        <w:t>meaning no .NET core 9 framework has to be installed.</w:t>
-      </w:r>
-    </w:p>
-    <w:p>
-      <w:pPr>
-        <w:pStyle w:val="Normal"/>
-        <w:widowControl/>
-        <w:numPr>
-          <w:ilvl w:val="0"/>
-          <w:numId w:val="2"/>
-        </w:numPr>
-        <w:suppressAutoHyphens w:val="true"/>
-        <w:spacing w:lineRule="auto" w:line="240" w:before="0" w:after="57"/>
-        <w:ind w:hanging="357" w:left="1037"/>
-        <w:jc w:val="left"/>
-        <w:rPr>
-          <w:rFonts w:eastAsia="Calibri" w:cs=""/>
-          <w:kern w:val="0"/>
-          <w:sz w:val="24"/>
-          <w:szCs w:val="24"/>
-          <w:lang w:val="en-GB" w:eastAsia="en-US" w:bidi="ar-SA"/>
-        </w:rPr>
-      </w:pPr>
-      <w:r>
-        <w:rPr>
-          <w:rFonts w:eastAsia="Calibri" w:cs=""/>
-          <w:kern w:val="0"/>
-          <w:sz w:val="24"/>
-          <w:szCs w:val="24"/>
-          <w:lang w:val="en-GB" w:eastAsia="en-US" w:bidi="ar-SA"/>
-        </w:rPr>
-        <w:t xml:space="preserve">Redesigned auto-scaling behaviour to use "PerMonitorV2" scaling. </w:t>
-      </w:r>
-    </w:p>
-    <w:p>
-      <w:pPr>
-        <w:pStyle w:val="Normal"/>
-        <w:widowControl/>
-        <w:numPr>
-          <w:ilvl w:val="0"/>
-          <w:numId w:val="2"/>
-        </w:numPr>
-        <w:suppressAutoHyphens w:val="true"/>
-        <w:spacing w:lineRule="auto" w:line="240" w:before="0" w:after="57"/>
-        <w:ind w:hanging="357" w:left="1037"/>
-        <w:jc w:val="left"/>
-        <w:rPr>
-          <w:rFonts w:eastAsia="Calibri" w:cs=""/>
-          <w:kern w:val="0"/>
-          <w:sz w:val="24"/>
-          <w:szCs w:val="24"/>
-          <w:lang w:val="en-GB" w:eastAsia="en-US" w:bidi="ar-SA"/>
-        </w:rPr>
-      </w:pPr>
-      <w:r>
-        <w:rPr>
-          <w:rFonts w:eastAsia="Calibri" w:cs=""/>
-          <w:kern w:val="0"/>
-          <w:sz w:val="24"/>
-          <w:szCs w:val="24"/>
-          <w:lang w:val="en-GB" w:eastAsia="en-US" w:bidi="ar-SA"/>
-        </w:rPr>
-        <w:t>CustomQueriesForm now supports zooming.</w:t>
-      </w:r>
-    </w:p>
-    <w:p>
-      <w:pPr>
-        <w:pStyle w:val="ListParagraph"/>
-        <w:spacing w:before="0" w:after="57"/>
-        <w:ind w:hanging="0" w:left="0"/>
-        <w:contextualSpacing w:val="false"/>
-        <w:rPr>
-          <w:b/>
-          <w:bCs/>
-          <w:lang w:val="en-GB"/>
-        </w:rPr>
-      </w:pPr>
-      <w:r>
-        <w:rPr>
-          <w:b/>
-          <w:bCs/>
-          <w:lang w:val="en-GB"/>
-        </w:rPr>
-        <w:t>Fixes</w:t>
-      </w:r>
-    </w:p>
-    <w:p>
-      <w:pPr>
-        <w:pStyle w:val="Normal"/>
-        <w:numPr>
-          <w:ilvl w:val="0"/>
-          <w:numId w:val="2"/>
-        </w:numPr>
-        <w:spacing w:before="0" w:after="57"/>
-        <w:ind w:hanging="357" w:left="1037"/>
-        <w:rPr/>
-      </w:pPr>
-      <w:r>
-        <w:rPr>
-          <w:rStyle w:val="Strong"/>
-          <w:b w:val="false"/>
-          <w:bCs w:val="false"/>
-          <w:lang w:val="en-GB"/>
-        </w:rPr>
-        <w:t>Redesigned auto-scaling behaviour, which had significant issues in the previous version.</w:t>
-      </w:r>
-    </w:p>
-    <w:p>
-      <w:pPr>
-        <w:pStyle w:val="Heading1"/>
-        <w:numPr>
-          <w:ilvl w:val="0"/>
-          <w:numId w:val="1"/>
-        </w:numPr>
-        <w:ind w:hanging="431" w:left="431"/>
-        <w:rPr>
-          <w:lang w:val="en-GB"/>
-        </w:rPr>
-      </w:pPr>
-      <w:r>
-        <w:rPr>
-          <w:lang w:val="en-GB"/>
-        </w:rPr>
-        <w:t>v2.0.</w:t>
-      </w:r>
-      <w:r>
-        <w:rPr>
-          <w:color w:val="auto"/>
-          <w:lang w:val="en-GB"/>
-        </w:rPr>
-        <w:t>24 – 2026-05-07</w:t>
-      </w:r>
-    </w:p>
-    <w:p>
-      <w:pPr>
-        <w:pStyle w:val="Heading3"/>
-        <w:numPr>
-          <w:ilvl w:val="2"/>
-          <w:numId w:val="1"/>
-        </w:numPr>
-        <w:rPr>
-          <w:lang w:val="en-GB"/>
-        </w:rPr>
-      </w:pPr>
-      <w:r>
-        <w:rPr>
-          <w:lang w:val="en-GB"/>
-        </w:rPr>
-        <w:t>Features</w:t>
-      </w:r>
-    </w:p>
-    <w:p>
-      <w:pPr>
-        <w:pStyle w:val="Normal"/>
-        <w:widowControl/>
-        <w:numPr>
-          <w:ilvl w:val="0"/>
-          <w:numId w:val="2"/>
-        </w:numPr>
-        <w:suppressAutoHyphens w:val="true"/>
-        <w:spacing w:lineRule="auto" w:line="240" w:before="0" w:after="57"/>
-        <w:ind w:hanging="357" w:left="1037"/>
-        <w:jc w:val="left"/>
-        <w:rPr>
-          <w:rFonts w:eastAsia="Calibri" w:cs=""/>
-          <w:kern w:val="0"/>
-          <w:sz w:val="24"/>
-          <w:szCs w:val="24"/>
-          <w:lang w:val="en-GB" w:eastAsia="en-US" w:bidi="ar-SA"/>
-        </w:rPr>
-      </w:pPr>
-      <w:r>
-        <w:rPr>
-          <w:rFonts w:eastAsia="Calibri" w:cs=""/>
-          <w:kern w:val="0"/>
-          <w:sz w:val="24"/>
-          <w:szCs w:val="24"/>
-          <w:lang w:val="en-GB" w:eastAsia="en-US" w:bidi="ar-SA"/>
-        </w:rPr>
-        <w:t xml:space="preserve">The Find/Filter function now supports </w:t>
+        <w:t xml:space="preserve">The </w:t>
       </w:r>
       <w:r>
         <w:rPr>
@@ -325,7 +171,7 @@
           <w:szCs w:val="24"/>
           <w:lang w:val="en-GB" w:eastAsia="en-US" w:bidi="ar-SA"/>
         </w:rPr>
-        <w:t>regular expressions</w:t>
+        <w:t xml:space="preserve">Custom Modbus Queries </w:t>
       </w:r>
       <w:r>
         <w:rPr>
@@ -335,7 +181,741 @@
           <w:szCs w:val="24"/>
           <w:lang w:val="en-GB" w:eastAsia="en-US" w:bidi="ar-SA"/>
         </w:rPr>
-        <w:t xml:space="preserve">, allowing more flexible search and filter patterns. </w:t>
+        <w:t>window now supports zooming.</w:t>
+      </w:r>
+    </w:p>
+    <w:p>
+      <w:pPr>
+        <w:pStyle w:val="ListParagraph"/>
+        <w:widowControl w:val="false"/>
+        <w:numPr>
+          <w:ilvl w:val="0"/>
+          <w:numId w:val="0"/>
+        </w:numPr>
+        <w:suppressAutoHyphens w:val="true"/>
+        <w:bidi w:val="0"/>
+        <w:spacing w:before="0" w:after="57"/>
+        <w:ind w:hanging="0" w:left="0"/>
+        <w:contextualSpacing w:val="false"/>
+        <w:jc w:val="left"/>
+        <w:rPr>
+          <w:rFonts w:ascii="Liberation Sans" w:hAnsi="Liberation Sans" w:eastAsia="SimSun" w:cs="Mangal"/>
+          <w:b/>
+          <w:bCs/>
+          <w:color w:val="00000A"/>
+          <w:kern w:val="2"/>
+          <w:sz w:val="20"/>
+          <w:szCs w:val="20"/>
+          <w:lang w:val="en-GB" w:eastAsia="zh-CN" w:bidi="ar-SA"/>
+        </w:rPr>
+      </w:pPr>
+      <w:r>
+        <w:rPr>
+          <w:rFonts w:eastAsia="SimSun" w:cs="Mangal" w:ascii="Liberation Sans" w:hAnsi="Liberation Sans"/>
+          <w:b/>
+          <w:bCs/>
+          <w:color w:val="00000A"/>
+          <w:kern w:val="2"/>
+          <w:sz w:val="20"/>
+          <w:szCs w:val="20"/>
+          <w:lang w:val="en-GB" w:eastAsia="zh-CN" w:bidi="ar-SA"/>
+        </w:rPr>
+        <w:t>Changes</w:t>
+      </w:r>
+    </w:p>
+    <w:p>
+      <w:pPr>
+        <w:pStyle w:val="Normal"/>
+        <w:numPr>
+          <w:ilvl w:val="0"/>
+          <w:numId w:val="2"/>
+        </w:numPr>
+        <w:spacing w:before="0" w:after="57"/>
+        <w:ind w:hanging="357" w:left="1037"/>
+        <w:rPr/>
+      </w:pPr>
+      <w:r>
+        <w:rPr>
+          <w:rStyle w:val="Strong"/>
+          <w:rFonts w:eastAsia="Calibri" w:cs=""/>
+          <w:b w:val="false"/>
+          <w:bCs w:val="false"/>
+          <w:kern w:val="0"/>
+          <w:sz w:val="24"/>
+          <w:szCs w:val="24"/>
+          <w:lang w:val="en-GB" w:eastAsia="en-US" w:bidi="ar-SA"/>
+        </w:rPr>
+        <w:t xml:space="preserve">Migrated to .NET </w:t>
+      </w:r>
+      <w:r>
+        <w:rPr>
+          <w:rStyle w:val="Strong"/>
+          <w:rFonts w:eastAsia="Calibri" w:cs=""/>
+          <w:b w:val="false"/>
+          <w:bCs w:val="false"/>
+          <w:kern w:val="0"/>
+          <w:sz w:val="24"/>
+          <w:szCs w:val="24"/>
+          <w:lang w:val="en-GB" w:eastAsia="en-US" w:bidi="ar-SA"/>
+        </w:rPr>
+        <w:t xml:space="preserve">(CORE) </w:t>
+      </w:r>
+      <w:r>
+        <w:rPr>
+          <w:rStyle w:val="Strong"/>
+          <w:rFonts w:eastAsia="Calibri" w:cs=""/>
+          <w:b w:val="false"/>
+          <w:bCs w:val="false"/>
+          <w:kern w:val="0"/>
+          <w:sz w:val="24"/>
+          <w:szCs w:val="24"/>
+          <w:lang w:val="en-GB" w:eastAsia="en-US" w:bidi="ar-SA"/>
+        </w:rPr>
+        <w:t xml:space="preserve">9 because .NET Framework is no longer being developed. This </w:t>
+      </w:r>
+      <w:r>
+        <w:rPr>
+          <w:rStyle w:val="Strong"/>
+          <w:rFonts w:eastAsia="Calibri" w:cs=""/>
+          <w:b w:val="false"/>
+          <w:bCs w:val="false"/>
+          <w:kern w:val="0"/>
+          <w:sz w:val="24"/>
+          <w:szCs w:val="24"/>
+          <w:lang w:val="en-GB" w:eastAsia="en-US" w:bidi="ar-SA"/>
+        </w:rPr>
+        <w:t xml:space="preserve">also </w:t>
+      </w:r>
+      <w:r>
+        <w:rPr>
+          <w:rStyle w:val="Strong"/>
+          <w:rFonts w:eastAsia="Calibri" w:cs=""/>
+          <w:b w:val="false"/>
+          <w:bCs w:val="false"/>
+          <w:kern w:val="0"/>
+          <w:sz w:val="24"/>
+          <w:szCs w:val="24"/>
+          <w:lang w:val="en-GB" w:eastAsia="en-US" w:bidi="ar-SA"/>
+        </w:rPr>
+        <w:t xml:space="preserve">enables correct Windows scaling behaviour. The application is self-contained, so no .NET runtime needs to be installed. </w:t>
+      </w:r>
+    </w:p>
+    <w:p>
+      <w:pPr>
+        <w:pStyle w:val="Normal"/>
+        <w:numPr>
+          <w:ilvl w:val="0"/>
+          <w:numId w:val="2"/>
+        </w:numPr>
+        <w:spacing w:before="0" w:after="57"/>
+        <w:ind w:hanging="357" w:left="1037"/>
+        <w:rPr/>
+      </w:pPr>
+      <w:r>
+        <w:rPr>
+          <w:rStyle w:val="Strong"/>
+          <w:rFonts w:eastAsia="Calibri" w:cs=""/>
+          <w:b w:val="false"/>
+          <w:bCs w:val="false"/>
+          <w:kern w:val="0"/>
+          <w:sz w:val="24"/>
+          <w:szCs w:val="24"/>
+          <w:lang w:val="en-GB" w:eastAsia="en-US" w:bidi="ar-SA"/>
+        </w:rPr>
+        <w:t xml:space="preserve">.NET 9 requires Windows 10 (1607+) or newer, so this drops support for Windows 7/8/8.1. </w:t>
+      </w:r>
+    </w:p>
+    <w:p>
+      <w:pPr>
+        <w:pStyle w:val="Normal"/>
+        <w:numPr>
+          <w:ilvl w:val="0"/>
+          <w:numId w:val="2"/>
+        </w:numPr>
+        <w:spacing w:before="0" w:after="57"/>
+        <w:ind w:hanging="357" w:left="1037"/>
+        <w:rPr/>
+      </w:pPr>
+      <w:r>
+        <w:rPr>
+          <w:rStyle w:val="Strong"/>
+          <w:rFonts w:eastAsia="Calibri" w:cs=""/>
+          <w:b w:val="false"/>
+          <w:bCs w:val="false"/>
+          <w:kern w:val="0"/>
+          <w:sz w:val="24"/>
+          <w:szCs w:val="24"/>
+          <w:lang w:val="en-GB" w:eastAsia="en-US" w:bidi="ar-SA"/>
+        </w:rPr>
+        <w:t>The installer now displays the license text (GPLv3).</w:t>
+      </w:r>
+    </w:p>
+    <w:p>
+      <w:pPr>
+        <w:pStyle w:val="ListParagraph"/>
+        <w:widowControl w:val="false"/>
+        <w:suppressAutoHyphens w:val="true"/>
+        <w:bidi w:val="0"/>
+        <w:spacing w:before="0" w:after="57"/>
+        <w:ind w:hanging="0" w:left="0"/>
+        <w:contextualSpacing w:val="false"/>
+        <w:jc w:val="left"/>
+        <w:rPr>
+          <w:rFonts w:ascii="Liberation Sans" w:hAnsi="Liberation Sans" w:eastAsia="SimSun" w:cs="Mangal"/>
+          <w:b/>
+          <w:bCs/>
+          <w:color w:val="00000A"/>
+          <w:kern w:val="2"/>
+          <w:sz w:val="20"/>
+          <w:szCs w:val="20"/>
+          <w:lang w:val="en-GB" w:eastAsia="zh-CN" w:bidi="ar-SA"/>
+        </w:rPr>
+      </w:pPr>
+      <w:r>
+        <w:rPr>
+          <w:rFonts w:eastAsia="SimSun" w:cs="Mangal" w:ascii="Liberation Sans" w:hAnsi="Liberation Sans"/>
+          <w:b/>
+          <w:bCs/>
+          <w:color w:val="00000A"/>
+          <w:kern w:val="2"/>
+          <w:sz w:val="20"/>
+          <w:szCs w:val="20"/>
+          <w:lang w:val="en-GB" w:eastAsia="zh-CN" w:bidi="ar-SA"/>
+        </w:rPr>
+        <w:t>Fixes</w:t>
+      </w:r>
+    </w:p>
+    <w:p>
+      <w:pPr>
+        <w:pStyle w:val="Normal"/>
+        <w:numPr>
+          <w:ilvl w:val="0"/>
+          <w:numId w:val="2"/>
+        </w:numPr>
+        <w:spacing w:before="0" w:after="57"/>
+        <w:ind w:hanging="357" w:left="1037"/>
+        <w:rPr/>
+      </w:pPr>
+      <w:r>
+        <w:rPr>
+          <w:rStyle w:val="Strong"/>
+          <w:rFonts w:eastAsia="Calibri" w:cs=""/>
+          <w:b w:val="false"/>
+          <w:bCs w:val="false"/>
+          <w:kern w:val="0"/>
+          <w:sz w:val="24"/>
+          <w:szCs w:val="24"/>
+          <w:lang w:val="en-GB" w:eastAsia="en-US" w:bidi="ar-SA"/>
+        </w:rPr>
+        <w:t>The redesigned auto-scaling fixes</w:t>
+      </w:r>
+      <w:r>
+        <w:rPr>
+          <w:rStyle w:val="Strong"/>
+          <w:rFonts w:eastAsia="Calibri" w:cs=""/>
+          <w:b w:val="false"/>
+          <w:bCs w:val="false"/>
+          <w:kern w:val="0"/>
+          <w:sz w:val="24"/>
+          <w:szCs w:val="24"/>
+          <w:lang w:val="en-GB" w:eastAsia="en-US" w:bidi="ar-SA"/>
+        </w:rPr>
+        <w:t xml:space="preserve"> blurry </w:t>
+      </w:r>
+      <w:r>
+        <w:rPr>
+          <w:rStyle w:val="Strong"/>
+          <w:rFonts w:eastAsia="Calibri" w:cs=""/>
+          <w:b w:val="false"/>
+          <w:bCs w:val="false"/>
+          <w:kern w:val="0"/>
+          <w:sz w:val="24"/>
+          <w:szCs w:val="24"/>
+          <w:lang w:val="en-GB" w:eastAsia="en-US" w:bidi="ar-SA"/>
+        </w:rPr>
+        <w:t xml:space="preserve">text, overlapping text </w:t>
+      </w:r>
+      <w:r>
+        <w:rPr>
+          <w:rStyle w:val="Strong"/>
+          <w:rFonts w:eastAsia="Calibri" w:cs=""/>
+          <w:b w:val="false"/>
+          <w:bCs w:val="false"/>
+          <w:kern w:val="0"/>
+          <w:sz w:val="24"/>
+          <w:szCs w:val="24"/>
+          <w:lang w:val="en-GB" w:eastAsia="en-US" w:bidi="ar-SA"/>
+        </w:rPr>
+        <w:t>and</w:t>
+      </w:r>
+      <w:r>
+        <w:rPr>
+          <w:rStyle w:val="Strong"/>
+          <w:rFonts w:eastAsia="Calibri" w:cs=""/>
+          <w:b w:val="false"/>
+          <w:bCs w:val="false"/>
+          <w:kern w:val="0"/>
+          <w:sz w:val="24"/>
+          <w:szCs w:val="24"/>
+          <w:lang w:val="en-GB" w:eastAsia="en-US" w:bidi="ar-SA"/>
+        </w:rPr>
+        <w:t xml:space="preserve"> mis-sized UI </w:t>
+      </w:r>
+      <w:r>
+        <w:rPr>
+          <w:rStyle w:val="Strong"/>
+          <w:rFonts w:eastAsia="Calibri" w:cs=""/>
+          <w:b w:val="false"/>
+          <w:bCs w:val="false"/>
+          <w:kern w:val="0"/>
+          <w:sz w:val="24"/>
+          <w:szCs w:val="24"/>
+          <w:lang w:val="en-GB" w:eastAsia="en-US" w:bidi="ar-SA"/>
+        </w:rPr>
+        <w:t xml:space="preserve">controls </w:t>
+      </w:r>
+      <w:r>
+        <w:rPr>
+          <w:rStyle w:val="Strong"/>
+          <w:rFonts w:eastAsia="Calibri" w:cs=""/>
+          <w:b w:val="false"/>
+          <w:bCs w:val="false"/>
+          <w:kern w:val="0"/>
+          <w:sz w:val="24"/>
+          <w:szCs w:val="24"/>
+          <w:lang w:val="en-GB" w:eastAsia="en-US" w:bidi="ar-SA"/>
+        </w:rPr>
+        <w:t xml:space="preserve">on multi-monitor setups. </w:t>
+      </w:r>
+    </w:p>
+    <w:p>
+      <w:pPr>
+        <w:pStyle w:val="Normal"/>
+        <w:numPr>
+          <w:ilvl w:val="0"/>
+          <w:numId w:val="2"/>
+        </w:numPr>
+        <w:spacing w:before="0" w:after="57"/>
+        <w:ind w:hanging="357" w:left="1037"/>
+        <w:rPr/>
+      </w:pPr>
+      <w:r>
+        <w:rPr>
+          <w:rStyle w:val="Strong"/>
+          <w:b w:val="false"/>
+          <w:bCs w:val="false"/>
+          <w:lang w:val="en-GB"/>
+        </w:rPr>
+        <w:t>New windows now open centered on the screen, because centering on the parent window is unreliable in .NET 9.</w:t>
+      </w:r>
+    </w:p>
+    <w:p>
+      <w:pPr>
+        <w:pStyle w:val="Normal"/>
+        <w:numPr>
+          <w:ilvl w:val="0"/>
+          <w:numId w:val="2"/>
+        </w:numPr>
+        <w:spacing w:before="0" w:after="57"/>
+        <w:ind w:hanging="357" w:left="1037"/>
+        <w:rPr/>
+      </w:pPr>
+      <w:r>
+        <w:rPr>
+          <w:rStyle w:val="Strong"/>
+          <w:b w:val="false"/>
+          <w:bCs w:val="false"/>
+          <w:lang w:val="en-GB"/>
+        </w:rPr>
+        <w:t xml:space="preserve">Project </w:t>
+      </w:r>
+      <w:r>
+        <w:rPr>
+          <w:rStyle w:val="Strong"/>
+          <w:b w:val="false"/>
+          <w:bCs w:val="false"/>
+          <w:lang w:val="en-GB"/>
+        </w:rPr>
+        <w:t>C</w:t>
+      </w:r>
+      <w:r>
+        <w:rPr>
+          <w:rStyle w:val="Strong"/>
+          <w:b w:val="false"/>
+          <w:bCs w:val="false"/>
+          <w:lang w:val="en-GB"/>
+        </w:rPr>
+        <w:t>onfiguration window</w:t>
+      </w:r>
+      <w:r>
+        <w:rPr>
+          <w:rStyle w:val="Strong"/>
+          <w:b w:val="false"/>
+          <w:bCs w:val="false"/>
+          <w:lang w:val="en-GB"/>
+        </w:rPr>
+        <w:t xml:space="preserve">: fixed the warning panel for command-line overrides, which wasn’t displaying. </w:t>
+      </w:r>
+      <w:r>
+        <w:rPr>
+          <w:rStyle w:val="Strong"/>
+          <w:b w:val="false"/>
+          <w:bCs w:val="false"/>
+          <w:lang w:val="en-GB"/>
+        </w:rPr>
+        <w:t>I</w:t>
+      </w:r>
+      <w:r>
+        <w:rPr>
+          <w:rStyle w:val="Strong"/>
+          <w:b w:val="false"/>
+          <w:bCs w:val="false"/>
+          <w:lang w:val="en-GB"/>
+        </w:rPr>
+        <w:t xml:space="preserve">mproved the override-warning and register numbering scheme tooltips. </w:t>
+      </w:r>
+    </w:p>
+    <w:p>
+      <w:pPr>
+        <w:pStyle w:val="Normal"/>
+        <w:numPr>
+          <w:ilvl w:val="0"/>
+          <w:numId w:val="2"/>
+        </w:numPr>
+        <w:spacing w:before="0" w:after="57"/>
+        <w:ind w:hanging="357" w:left="1037"/>
+        <w:rPr/>
+      </w:pPr>
+      <w:r>
+        <w:rPr>
+          <w:rStyle w:val="Strong"/>
+          <w:b w:val="false"/>
+          <w:bCs w:val="false"/>
+          <w:lang w:val="en-GB"/>
+        </w:rPr>
+        <w:t>Improve</w:t>
+      </w:r>
+      <w:r>
+        <w:rPr>
+          <w:rStyle w:val="Strong"/>
+          <w:b w:val="false"/>
+          <w:bCs w:val="false"/>
+          <w:lang w:val="en-GB"/>
+        </w:rPr>
+        <w:t>d</w:t>
+      </w:r>
+      <w:r>
+        <w:rPr>
+          <w:rStyle w:val="Strong"/>
+          <w:b w:val="false"/>
+          <w:bCs w:val="false"/>
+          <w:lang w:val="en-GB"/>
+        </w:rPr>
+        <w:t xml:space="preserve"> texts and tooltips in </w:t>
+      </w:r>
+      <w:r>
+        <w:rPr>
+          <w:rStyle w:val="Strong"/>
+          <w:b w:val="false"/>
+          <w:bCs w:val="false"/>
+          <w:lang w:val="en-GB"/>
+        </w:rPr>
+        <w:t>the</w:t>
+      </w:r>
+      <w:r>
+        <w:rPr>
+          <w:rStyle w:val="Strong"/>
+          <w:b w:val="false"/>
+          <w:bCs w:val="false"/>
+          <w:lang w:val="en-GB"/>
+        </w:rPr>
+        <w:t xml:space="preserve"> </w:t>
+      </w:r>
+      <w:r>
+        <w:rPr>
+          <w:rStyle w:val="Strong"/>
+          <w:b w:val="false"/>
+          <w:bCs w:val="false"/>
+          <w:i/>
+          <w:iCs/>
+          <w:lang w:val="en-GB"/>
+        </w:rPr>
+        <w:t>Save Project File</w:t>
+      </w:r>
+      <w:r>
+        <w:rPr>
+          <w:rStyle w:val="Strong"/>
+          <w:b w:val="false"/>
+          <w:bCs w:val="false"/>
+          <w:lang w:val="en-GB"/>
+        </w:rPr>
+        <w:t xml:space="preserve"> </w:t>
+      </w:r>
+      <w:r>
+        <w:rPr>
+          <w:rStyle w:val="Strong"/>
+          <w:b w:val="false"/>
+          <w:bCs w:val="false"/>
+          <w:lang w:val="en-GB"/>
+        </w:rPr>
+        <w:t xml:space="preserve">and </w:t>
+      </w:r>
+      <w:r>
+        <w:rPr>
+          <w:rStyle w:val="Strong"/>
+          <w:b w:val="false"/>
+          <w:bCs w:val="false"/>
+          <w:i/>
+          <w:iCs/>
+          <w:lang w:val="en-GB"/>
+        </w:rPr>
+        <w:t>Options</w:t>
+      </w:r>
+      <w:r>
+        <w:rPr>
+          <w:rStyle w:val="Strong"/>
+          <w:b w:val="false"/>
+          <w:bCs w:val="false"/>
+          <w:lang w:val="en-GB"/>
+        </w:rPr>
+        <w:t xml:space="preserve"> </w:t>
+      </w:r>
+      <w:r>
+        <w:rPr>
+          <w:rStyle w:val="Strong"/>
+          <w:b w:val="false"/>
+          <w:bCs w:val="false"/>
+          <w:lang w:val="en-GB"/>
+        </w:rPr>
+        <w:t>window</w:t>
+      </w:r>
+      <w:r>
+        <w:rPr>
+          <w:rStyle w:val="Strong"/>
+          <w:b w:val="false"/>
+          <w:bCs w:val="false"/>
+          <w:lang w:val="en-GB"/>
+        </w:rPr>
+        <w:t>s</w:t>
+      </w:r>
+      <w:r>
+        <w:rPr>
+          <w:rStyle w:val="Strong"/>
+          <w:b w:val="false"/>
+          <w:bCs w:val="false"/>
+          <w:lang w:val="en-GB"/>
+        </w:rPr>
+        <w:t xml:space="preserve">. </w:t>
+      </w:r>
+    </w:p>
+    <w:p>
+      <w:pPr>
+        <w:pStyle w:val="Normal"/>
+        <w:numPr>
+          <w:ilvl w:val="0"/>
+          <w:numId w:val="2"/>
+        </w:numPr>
+        <w:spacing w:before="0" w:after="57"/>
+        <w:ind w:hanging="357" w:left="1037"/>
+        <w:rPr/>
+      </w:pPr>
+      <w:r>
+        <w:rPr>
+          <w:rStyle w:val="Strong"/>
+          <w:b w:val="false"/>
+          <w:bCs w:val="false"/>
+          <w:lang w:val="en-GB"/>
+        </w:rPr>
+        <w:t xml:space="preserve">The </w:t>
+      </w:r>
+      <w:r>
+        <w:rPr>
+          <w:rStyle w:val="Strong"/>
+          <w:b w:val="false"/>
+          <w:bCs w:val="false"/>
+          <w:i/>
+          <w:iCs/>
+          <w:lang w:val="en-GB"/>
+        </w:rPr>
+        <w:t>About</w:t>
+      </w:r>
+      <w:r>
+        <w:rPr>
+          <w:rStyle w:val="Strong"/>
+          <w:b w:val="false"/>
+          <w:bCs w:val="false"/>
+          <w:lang w:val="en-GB"/>
+        </w:rPr>
+        <w:t xml:space="preserve"> </w:t>
+      </w:r>
+      <w:r>
+        <w:rPr>
+          <w:rStyle w:val="Strong"/>
+          <w:b w:val="false"/>
+          <w:bCs w:val="false"/>
+          <w:lang w:val="en-GB"/>
+        </w:rPr>
+        <w:t xml:space="preserve">window now </w:t>
+      </w:r>
+      <w:r>
+        <w:rPr>
+          <w:rStyle w:val="Strong"/>
+          <w:b w:val="false"/>
+          <w:bCs w:val="false"/>
+          <w:lang w:val="en-GB"/>
+        </w:rPr>
+        <w:t xml:space="preserve">shows </w:t>
+      </w:r>
+      <w:r>
+        <w:rPr>
+          <w:rStyle w:val="Strong"/>
+          <w:b w:val="false"/>
+          <w:bCs w:val="false"/>
+          <w:lang w:val="en-GB"/>
+        </w:rPr>
+        <w:t xml:space="preserve">the </w:t>
+      </w:r>
+      <w:r>
+        <w:rPr>
+          <w:rStyle w:val="Strong"/>
+          <w:b w:val="false"/>
+          <w:bCs w:val="false"/>
+          <w:lang w:val="en-GB"/>
+        </w:rPr>
+        <w:t xml:space="preserve">main </w:t>
+      </w:r>
+      <w:r>
+        <w:rPr>
+          <w:rStyle w:val="Strong"/>
+          <w:b w:val="false"/>
+          <w:bCs w:val="false"/>
+          <w:lang w:val="en-GB"/>
+        </w:rPr>
+        <w:t>window’</w:t>
+      </w:r>
+      <w:r>
+        <w:rPr>
+          <w:rStyle w:val="Strong"/>
+          <w:b w:val="false"/>
+          <w:bCs w:val="false"/>
+          <w:lang w:val="en-GB"/>
+        </w:rPr>
+        <w:t xml:space="preserve">s </w:t>
+      </w:r>
+      <w:r>
+        <w:rPr>
+          <w:rStyle w:val="Strong"/>
+          <w:b w:val="false"/>
+          <w:bCs w:val="false"/>
+          <w:lang w:val="en-GB"/>
+        </w:rPr>
+        <w:t xml:space="preserve">DPI with </w:t>
+      </w:r>
+      <w:r>
+        <w:rPr>
+          <w:rStyle w:val="Strong"/>
+          <w:b w:val="false"/>
+          <w:bCs w:val="false"/>
+          <w:lang w:val="en-GB"/>
+        </w:rPr>
+        <w:t>its</w:t>
+      </w:r>
+      <w:r>
+        <w:rPr>
+          <w:rStyle w:val="Strong"/>
+          <w:b w:val="false"/>
+          <w:bCs w:val="false"/>
+          <w:lang w:val="en-GB"/>
+        </w:rPr>
+        <w:t xml:space="preserve"> </w:t>
+      </w:r>
+      <w:r>
+        <w:rPr>
+          <w:rStyle w:val="Strong"/>
+          <w:b w:val="false"/>
+          <w:bCs w:val="false"/>
+          <w:lang w:val="en-GB"/>
+        </w:rPr>
+        <w:t>s</w:t>
+      </w:r>
+      <w:r>
+        <w:rPr>
+          <w:rStyle w:val="Strong"/>
+          <w:b w:val="false"/>
+          <w:bCs w:val="false"/>
+          <w:lang w:val="en-GB"/>
+        </w:rPr>
+        <w:t>ize</w:t>
+      </w:r>
+      <w:r>
+        <w:rPr>
+          <w:rStyle w:val="Strong"/>
+          <w:b w:val="false"/>
+          <w:bCs w:val="false"/>
+          <w:lang w:val="en-GB"/>
+        </w:rPr>
+        <w:t>, credits the creator/maintainer, and links to the LICENSE file (GPLv3).</w:t>
+      </w:r>
+    </w:p>
+    <w:p>
+      <w:pPr>
+        <w:pStyle w:val="Heading1"/>
+        <w:numPr>
+          <w:ilvl w:val="0"/>
+          <w:numId w:val="1"/>
+        </w:numPr>
+        <w:ind w:hanging="431" w:left="431"/>
+        <w:rPr>
+          <w:lang w:val="en-GB"/>
+        </w:rPr>
+      </w:pPr>
+      <w:r>
+        <w:rPr>
+          <w:lang w:val="en-GB"/>
+        </w:rPr>
+        <w:t>v2.0.</w:t>
+      </w:r>
+      <w:r>
+        <w:rPr>
+          <w:color w:val="auto"/>
+          <w:lang w:val="en-GB"/>
+        </w:rPr>
+        <w:t>24 – 2026-05-07</w:t>
+      </w:r>
+    </w:p>
+    <w:p>
+      <w:pPr>
+        <w:pStyle w:val="ListParagraph"/>
+        <w:widowControl w:val="false"/>
+        <w:suppressAutoHyphens w:val="true"/>
+        <w:bidi w:val="0"/>
+        <w:spacing w:before="0" w:after="57"/>
+        <w:ind w:hanging="0" w:left="0"/>
+        <w:contextualSpacing w:val="false"/>
+        <w:jc w:val="left"/>
+        <w:rPr>
+          <w:rFonts w:ascii="Liberation Sans" w:hAnsi="Liberation Sans" w:eastAsia="SimSun" w:cs="Mangal"/>
+          <w:b/>
+          <w:bCs/>
+          <w:color w:val="00000A"/>
+          <w:kern w:val="2"/>
+          <w:sz w:val="20"/>
+          <w:szCs w:val="20"/>
+          <w:lang w:val="en-GB" w:eastAsia="zh-CN" w:bidi="ar-SA"/>
+        </w:rPr>
+      </w:pPr>
+      <w:r>
+        <w:rPr>
+          <w:rFonts w:eastAsia="SimSun" w:cs="Mangal" w:ascii="Liberation Sans" w:hAnsi="Liberation Sans"/>
+          <w:b/>
+          <w:bCs/>
+          <w:color w:val="00000A"/>
+          <w:kern w:val="2"/>
+          <w:sz w:val="20"/>
+          <w:szCs w:val="20"/>
+          <w:lang w:val="en-GB" w:eastAsia="zh-CN" w:bidi="ar-SA"/>
+        </w:rPr>
+        <w:t>Features</w:t>
       </w:r>
     </w:p>
     <w:p>
@@ -366,6 +946,59 @@
           <w:szCs w:val="24"/>
           <w:lang w:val="en-GB" w:eastAsia="en-US" w:bidi="ar-SA"/>
         </w:rPr>
+        <w:t xml:space="preserve">The Find/Filter function now supports </w:t>
+      </w:r>
+      <w:r>
+        <w:rPr>
+          <w:rFonts w:eastAsia="Calibri" w:cs=""/>
+          <w:i/>
+          <w:iCs/>
+          <w:kern w:val="0"/>
+          <w:sz w:val="24"/>
+          <w:szCs w:val="24"/>
+          <w:lang w:val="en-GB" w:eastAsia="en-US" w:bidi="ar-SA"/>
+        </w:rPr>
+        <w:t>regular expressions</w:t>
+      </w:r>
+      <w:r>
+        <w:rPr>
+          <w:rFonts w:eastAsia="Calibri" w:cs=""/>
+          <w:kern w:val="0"/>
+          <w:sz w:val="24"/>
+          <w:szCs w:val="24"/>
+          <w:lang w:val="en-GB" w:eastAsia="en-US" w:bidi="ar-SA"/>
+        </w:rPr>
+        <w:t xml:space="preserve">, allowing more flexible search and filter patterns. </w:t>
+      </w:r>
+    </w:p>
+    <w:p>
+      <w:pPr>
+        <w:pStyle w:val="Normal"/>
+        <w:widowControl/>
+        <w:numPr>
+          <w:ilvl w:val="0"/>
+          <w:numId w:val="2"/>
+        </w:numPr>
+        <w:suppressAutoHyphens w:val="true"/>
+        <w:spacing w:lineRule="auto" w:line="240" w:before="0" w:after="57"/>
+        <w:ind w:hanging="357" w:left="1037"/>
+        <w:jc w:val="left"/>
+        <w:rPr>
+          <w:rFonts w:eastAsia="Calibri" w:cs=""/>
+          <w:kern w:val="0"/>
+          <w:sz w:val="24"/>
+          <w:szCs w:val="24"/>
+          <w:lang w:val="en-GB" w:eastAsia="en-US" w:bidi="ar-SA"/>
+        </w:rPr>
+      </w:pPr>
+      <w:r>
+        <w:rPr>
+          <w:rFonts w:eastAsia="Calibri" w:cs=""/>
+          <w:kern w:val="0"/>
+          <w:sz w:val="24"/>
+          <w:szCs w:val="24"/>
+          <w:lang w:val="en-GB" w:eastAsia="en-US" w:bidi="ar-SA"/>
+        </w:rPr>
         <w:t xml:space="preserve">When an mbc project file fails to load, the program now suggests that a newer version of the software may be required. </w:t>
       </w:r>
     </w:p>
@@ -376,15 +1009,18 @@
         <w:ind w:hanging="0" w:left="0"/>
         <w:contextualSpacing w:val="false"/>
         <w:rPr>
+          <w:rFonts w:ascii="Liberation Sans" w:hAnsi="Liberation Sans"/>
+          <w:sz w:val="20"/>
+          <w:szCs w:val="20"/>
+        </w:rPr>
+      </w:pPr>
+      <w:r>
+        <w:rPr>
+          <w:rFonts w:ascii="Liberation Sans" w:hAnsi="Liberation Sans"/>
           <w:b/>
           <w:bCs/>
-          <w:lang w:val="en-GB"/>
-        </w:rPr>
-      </w:pPr>
-      <w:r>
-        <w:rPr>
-          <w:b/>
-          <w:bCs/>
+          <w:sz w:val="20"/>
+          <w:szCs w:val="20"/>
           <w:lang w:val="en-GB"/>
         </w:rPr>
         <w:t>Fixes</w:t>
@@ -519,7 +1155,7 @@
           <w:b w:val="false"/>
           <w:bCs w:val="false"/>
         </w:rPr>
-        <w:t>Project configuration screen: now displays the register numbering scheme more clearly, such as [</w:t>
+        <w:t xml:space="preserve">Project configuration screen: now displays the register numbering scheme more clearly, such as </w:t>
       </w:r>
       <w:r>
         <w:rPr>
@@ -529,7 +1165,7 @@
           <w:i/>
           <w:iCs/>
         </w:rPr>
-        <w:t>40001-49999] or [40001-49999 + 400001-465536]</w:t>
+        <w:t>[40001-49999] or [40001-49999 + 400001-465536]</w:t>
       </w:r>
       <w:r>
         <w:rPr>
@@ -6338,7 +6974,7 @@
   </w:style>
   <w:style w:type="paragraph" w:styleId="Heading1">
     <w:name w:val="heading 1"/>
-    <w:basedOn w:val="Kopuser"/>
+    <w:basedOn w:val="Kop"/>
     <w:next w:val="BodyText"/>
     <w:qFormat/>
     <w:rsid w:val="00fc5f78"/>
@@ -6360,7 +6996,7 @@
   </w:style>
   <w:style w:type="paragraph" w:styleId="Heading2">
     <w:name w:val="heading 2"/>
-    <w:basedOn w:val="Kopuser"/>
+    <w:basedOn w:val="Kop"/>
     <w:next w:val="BodyText"/>
     <w:qFormat/>
     <w:pPr>
@@ -6379,7 +7015,7 @@
   </w:style>
   <w:style w:type="paragraph" w:styleId="Heading3">
     <w:name w:val="heading 3"/>
-    <w:basedOn w:val="Kopuser"/>
+    <w:basedOn w:val="Kop"/>
     <w:next w:val="BodyText"/>
     <w:qFormat/>
     <w:pPr>
@@ -6731,8 +7367,8 @@
       <w:u w:val="single"/>
     </w:rPr>
   </w:style>
-  <w:style w:type="character" w:styleId="Opsommingstekensuser" w:customStyle="1">
-    <w:name w:val="Opsommingstekens (user)"/>
+  <w:style w:type="character" w:styleId="Opsommingstekens" w:customStyle="1">
+    <w:name w:val="Opsommingstekens"/>
     <w:qFormat/>
     <w:rPr>
       <w:rFonts w:ascii="OpenSymbol" w:hAnsi="OpenSymbol" w:eastAsia="OpenSymbol" w:cs="OpenSymbol"/>
@@ -6771,22 +7407,73 @@
       <w:iCs/>
     </w:rPr>
   </w:style>
-  <w:style w:type="character" w:styleId="Opsommingstekens">
-    <w:name w:val="Opsommingstekens"/>
+  <w:style w:type="character" w:styleId="Opsommingstekensuser">
+    <w:name w:val="Opsommingstekens (user)"/>
     <w:qFormat/>
     <w:rPr>
       <w:rFonts w:ascii="OpenSymbol" w:hAnsi="OpenSymbol" w:eastAsia="OpenSymbol" w:cs="OpenSymbol"/>
     </w:rPr>
   </w:style>
-  <w:style w:type="character" w:styleId="Brontekst">
-    <w:name w:val="Brontekst"/>
+  <w:style w:type="character" w:styleId="Brontekstuser">
+    <w:name w:val="Brontekst (user)"/>
     <w:qFormat/>
     <w:rPr>
       <w:rFonts w:ascii="Liberation Mono" w:hAnsi="Liberation Mono" w:eastAsia="Liberation Mono" w:cs="Liberation Mono"/>
     </w:rPr>
   </w:style>
-  <w:style w:type="paragraph" w:styleId="Kop">
+  <w:style w:type="paragraph" w:styleId="Kop" w:customStyle="1">
     <w:name w:val="Kop"/>
+    <w:basedOn w:val="Normal"/>
+    <w:next w:val="BodyText"/>
+    <w:qFormat/>
+    <w:pPr>
+      <w:keepNext w:val="true"/>
+      <w:spacing w:before="240" w:after="120"/>
+    </w:pPr>
+    <w:rPr>
+      <w:rFonts w:ascii="Liberation Sans" w:hAnsi="Liberation Sans" w:eastAsia="Microsoft YaHei"/>
+      <w:sz w:val="28"/>
+      <w:szCs w:val="28"/>
+    </w:rPr>
+  </w:style>
+  <w:style w:type="paragraph" w:styleId="BodyText">
+    <w:name w:val="Body Text"/>
+    <w:basedOn w:val="Normal"/>
+    <w:pPr>
+      <w:spacing w:lineRule="auto" w:line="288" w:before="0" w:after="140"/>
+    </w:pPr>
+    <w:rPr/>
+  </w:style>
+  <w:style w:type="paragraph" w:styleId="List">
+    <w:name w:val="List"/>
+    <w:basedOn w:val="BodyText"/>
+    <w:pPr/>
+    <w:rPr/>
+  </w:style>
+  <w:style w:type="paragraph" w:styleId="Caption">
+    <w:name w:val="caption"/>
+    <w:basedOn w:val="Normal"/>
+    <w:qFormat/>
+    <w:pPr>
+      <w:suppressLineNumbers/>
+      <w:spacing w:before="120" w:after="120"/>
+    </w:pPr>
+    <w:rPr>
+      <w:i/>
+      <w:iCs/>
+    </w:rPr>
+  </w:style>
+  <w:style w:type="paragraph" w:styleId="Index" w:customStyle="1">
+    <w:name w:val="Index"/>
+    <w:basedOn w:val="Normal"/>
+    <w:qFormat/>
+    <w:pPr>
+      <w:suppressLineNumbers/>
+    </w:pPr>
+    <w:rPr/>
+  </w:style>
+  <w:style w:type="paragraph" w:styleId="Kopuser">
+    <w:name w:val="Kop (user)"/>
     <w:basedOn w:val="Normal"/>
     <w:next w:val="BodyText"/>
     <w:qFormat/>
@@ -6800,59 +7487,8 @@
       <w:szCs w:val="28"/>
     </w:rPr>
   </w:style>
-  <w:style w:type="paragraph" w:styleId="BodyText">
-    <w:name w:val="Body Text"/>
-    <w:basedOn w:val="Normal"/>
-    <w:pPr>
-      <w:spacing w:lineRule="auto" w:line="288" w:before="0" w:after="140"/>
-    </w:pPr>
-    <w:rPr/>
-  </w:style>
-  <w:style w:type="paragraph" w:styleId="List">
-    <w:name w:val="List"/>
-    <w:basedOn w:val="BodyText"/>
-    <w:pPr/>
-    <w:rPr/>
-  </w:style>
-  <w:style w:type="paragraph" w:styleId="Caption">
-    <w:name w:val="caption"/>
-    <w:basedOn w:val="Normal"/>
-    <w:qFormat/>
-    <w:pPr>
-      <w:suppressLineNumbers/>
-      <w:spacing w:before="120" w:after="120"/>
-    </w:pPr>
-    <w:rPr>
-      <w:i/>
-      <w:iCs/>
-    </w:rPr>
-  </w:style>
-  <w:style w:type="paragraph" w:styleId="Index" w:customStyle="1">
-    <w:name w:val="Index"/>
-    <w:basedOn w:val="Normal"/>
-    <w:qFormat/>
-    <w:pPr>
-      <w:suppressLineNumbers/>
-    </w:pPr>
-    <w:rPr/>
-  </w:style>
-  <w:style w:type="paragraph" w:styleId="Kopuser" w:customStyle="1">
-    <w:name w:val="Kop (user)"/>
-    <w:basedOn w:val="Normal"/>
-    <w:next w:val="BodyText"/>
-    <w:qFormat/>
-    <w:pPr>
-      <w:keepNext w:val="true"/>
-      <w:spacing w:before="240" w:after="120"/>
-    </w:pPr>
-    <w:rPr>
-      <w:rFonts w:ascii="Liberation Sans" w:hAnsi="Liberation Sans" w:eastAsia="Microsoft YaHei"/>
-      <w:sz w:val="28"/>
-      <w:szCs w:val="28"/>
-    </w:rPr>
-  </w:style>
-  <w:style w:type="paragraph" w:styleId="Citatenuser" w:customStyle="1">
-    <w:name w:val="Citaten (user)"/>
+  <w:style w:type="paragraph" w:styleId="Citaten" w:customStyle="1">
+    <w:name w:val="Citaten"/>
     <w:basedOn w:val="Normal"/>
     <w:qFormat/>
     <w:pPr>
@@ -6863,7 +7499,7 @@
   </w:style>
   <w:style w:type="paragraph" w:styleId="Title">
     <w:name w:val="Title"/>
-    <w:basedOn w:val="Kopuser"/>
+    <w:basedOn w:val="Kop"/>
     <w:next w:val="BodyText"/>
     <w:qFormat/>
     <w:pPr>
@@ -6878,7 +7514,7 @@
   </w:style>
   <w:style w:type="paragraph" w:styleId="Subtitle">
     <w:name w:val="Subtitle"/>
-    <w:basedOn w:val="Kopuser"/>
+    <w:basedOn w:val="Kop"/>
     <w:next w:val="BodyText"/>
     <w:qFormat/>
     <w:pPr>
@@ -6904,15 +7540,15 @@
     </w:pPr>
     <w:rPr/>
   </w:style>
-  <w:style w:type="paragraph" w:styleId="Koptekstenvoettekst">
-    <w:name w:val="Koptekst en voettekst"/>
+  <w:style w:type="paragraph" w:styleId="Koptekstenvoettekstuser">
+    <w:name w:val="Koptekst en voettekst (user)"/>
     <w:basedOn w:val="Normal"/>
     <w:qFormat/>
     <w:pPr/>
     <w:rPr/>
   </w:style>
-  <w:style w:type="paragraph" w:styleId="Koptekstenvoettekstuser">
-    <w:name w:val="Koptekst en voettekst (user)"/>
+  <w:style w:type="paragraph" w:styleId="Koptekstenvoettekst">
+    <w:name w:val="Koptekst en voettekst"/>
     <w:basedOn w:val="Normal"/>
     <w:qFormat/>
     <w:pPr/>
@@ -6963,8 +7599,8 @@
       <w:lang w:val="nl-BE" w:eastAsia="nl-BE"/>
     </w:rPr>
   </w:style>
-  <w:style w:type="paragraph" w:styleId="Inhoudtabel">
-    <w:name w:val="Inhoud tabel"/>
+  <w:style w:type="paragraph" w:styleId="Inhoudtabeluser">
+    <w:name w:val="Inhoud tabel (user)"/>
     <w:basedOn w:val="Normal"/>
     <w:qFormat/>
     <w:pPr>
@@ -6981,9 +7617,9 @@
       <w:lang w:val="en-GB" w:eastAsia="zh-CN" w:bidi="hi-IN"/>
     </w:rPr>
   </w:style>
-  <w:style w:type="paragraph" w:styleId="Tabelkop">
-    <w:name w:val="Tabelkop"/>
-    <w:basedOn w:val="Inhoudtabel"/>
+  <w:style w:type="paragraph" w:styleId="Tabelkopuser">
+    <w:name w:val="Tabelkop (user)"/>
+    <w:basedOn w:val="Inhoudtabeluser"/>
     <w:qFormat/>
     <w:pPr>
       <w:suppressLineNumbers/>
@@ -6994,8 +7630,8 @@
       <w:bCs/>
     </w:rPr>
   </w:style>
-  <w:style w:type="numbering" w:styleId="Geenlijst" w:default="1">
-    <w:name w:val="Geen lijst"/>
+  <w:style w:type="numbering" w:styleId="Geenlijstuser" w:default="1">
+    <w:name w:val="Geen lijst (user)"/>
     <w:uiPriority w:val="99"/>
     <w:semiHidden/>
     <w:unhideWhenUsed/>

</xml_diff>